<commit_message>
11/05/2025 - 00:31 h
</commit_message>
<xml_diff>
--- a/Maria de Nazaré e a disposição em servir/Maria de Nazaré e a disposição em servir.docx
+++ b/Maria de Nazaré e a disposição em servir/Maria de Nazaré e a disposição em servir.docx
@@ -705,47 +705,186 @@
           <w:szCs w:val="36"/>
           <w:lang w:val="en-US" w:eastAsia="zh-CN" w:bidi="hi-IN"/>
         </w:rPr>
-        <w:t>Pois se o Cristo, com sua elevação espiritual que foge completamente à nossa capacidade de compreensão, tornou-se o filho amado que Maria aceitou receber, o filho que ela concebeu, acolheu, educou e acompanhou durante toda a vida até os momentos derradeiros no calvário,  então o quê podemos  dizer da grandeza espiritual de Maria?</w:t>
-      </w:r>
-    </w:p>
-    <w:p>
-      <w:pPr>
-        <w:pStyle w:val="Normal"/>
-        <w:jc w:val="both"/>
-        <w:rPr>
-          <w:rFonts w:ascii="Garamond" w:hAnsi="Garamond"/>
-          <w:sz w:val="36"/>
-          <w:szCs w:val="36"/>
-        </w:rPr>
-      </w:pPr>
-      <w:r>
-        <w:rPr>
-          <w:rFonts w:ascii="Garamond" w:hAnsi="Garamond"/>
-          <w:sz w:val="36"/>
-          <w:szCs w:val="36"/>
-        </w:rPr>
-      </w:r>
-    </w:p>
-    <w:p>
-      <w:pPr>
-        <w:pStyle w:val="Normal"/>
-        <w:jc w:val="both"/>
-        <w:rPr>
-          <w:rFonts w:ascii="Garamond" w:hAnsi="Garamond"/>
-          <w:sz w:val="36"/>
-          <w:szCs w:val="36"/>
-        </w:rPr>
-      </w:pPr>
-      <w:r>
-        <w:rPr>
-          <w:rFonts w:eastAsia="Arial" w:cs="Arial" w:ascii="Garamond" w:hAnsi="Garamond"/>
-          <w:color w:val="auto"/>
-          <w:kern w:val="0"/>
-          <w:sz w:val="36"/>
-          <w:szCs w:val="36"/>
-          <w:lang w:val="en-US" w:eastAsia="zh-CN" w:bidi="hi-IN"/>
-        </w:rPr>
-        <w:t xml:space="preserve">No Novo Testamento encontramos  17 passagens - alguns estudiosos dizem que são 19  - nas quais Maria de Nazaré é mencionada e somente em outras 4 passagens evangélicas nós temos registradas as falas de Maria. </w:t>
+        <w:t>Pois se o Cristo, cuja dimensão espiritual foge completamente à nossa compreensão, tornou-se o filho amado que Maria aceitou receber, o filho que ela concebeu, acolheu, educou e acompanhou durante toda a vida até os momentos derradeiros no calvário,  então o quê podemos  dizer da dimensão espiritual de Maria?</w:t>
+      </w:r>
+    </w:p>
+    <w:p>
+      <w:pPr>
+        <w:pStyle w:val="Normal"/>
+        <w:jc w:val="both"/>
+        <w:rPr>
+          <w:rFonts w:ascii="Garamond" w:hAnsi="Garamond"/>
+          <w:sz w:val="36"/>
+          <w:szCs w:val="36"/>
+        </w:rPr>
+      </w:pPr>
+      <w:r>
+        <w:rPr>
+          <w:rFonts w:ascii="Garamond" w:hAnsi="Garamond"/>
+          <w:sz w:val="36"/>
+          <w:szCs w:val="36"/>
+        </w:rPr>
+      </w:r>
+    </w:p>
+    <w:p>
+      <w:pPr>
+        <w:pStyle w:val="Normal"/>
+        <w:jc w:val="both"/>
+        <w:rPr>
+          <w:rFonts w:ascii="Garamond" w:hAnsi="Garamond"/>
+          <w:sz w:val="36"/>
+          <w:szCs w:val="36"/>
+        </w:rPr>
+      </w:pPr>
+      <w:r>
+        <w:rPr>
+          <w:rFonts w:eastAsia="Arial" w:cs="Arial" w:ascii="Garamond" w:hAnsi="Garamond"/>
+          <w:color w:val="auto"/>
+          <w:kern w:val="0"/>
+          <w:sz w:val="36"/>
+          <w:szCs w:val="36"/>
+          <w:lang w:val="en-US" w:eastAsia="zh-CN" w:bidi="hi-IN"/>
+        </w:rPr>
+        <w:t xml:space="preserve">Vocês sabiam que Maria de Nazaré é mencionada cerca de 40 vezes no Alcorão, a bíblia sagrada do Islã, a religião dos mulçumanos? E que ela é considerada a maior de todas as mulheres no Islã sendo a única </w:t>
+      </w:r>
+      <w:r>
+        <w:rPr>
+          <w:rFonts w:eastAsia="Arial" w:cs="Arial" w:ascii="Garamond" w:hAnsi="Garamond"/>
+          <w:color w:val="auto"/>
+          <w:kern w:val="0"/>
+          <w:sz w:val="36"/>
+          <w:szCs w:val="36"/>
+          <w:lang w:val="en-US" w:eastAsia="zh-CN" w:bidi="hi-IN"/>
+        </w:rPr>
+        <w:t>cujo nome consta</w:t>
+      </w:r>
+      <w:r>
+        <w:rPr>
+          <w:rFonts w:eastAsia="Arial" w:cs="Arial" w:ascii="Garamond" w:hAnsi="Garamond"/>
+          <w:color w:val="auto"/>
+          <w:kern w:val="0"/>
+          <w:sz w:val="36"/>
+          <w:szCs w:val="36"/>
+          <w:lang w:val="en-US" w:eastAsia="zh-CN" w:bidi="hi-IN"/>
+        </w:rPr>
+        <w:t xml:space="preserve"> no Alcorão?</w:t>
+      </w:r>
+    </w:p>
+    <w:p>
+      <w:pPr>
+        <w:pStyle w:val="Normal"/>
+        <w:jc w:val="both"/>
+        <w:rPr>
+          <w:rFonts w:ascii="Garamond" w:hAnsi="Garamond"/>
+          <w:sz w:val="36"/>
+          <w:szCs w:val="36"/>
+        </w:rPr>
+      </w:pPr>
+      <w:r>
+        <w:rPr>
+          <w:rFonts w:ascii="Garamond" w:hAnsi="Garamond"/>
+          <w:sz w:val="36"/>
+          <w:szCs w:val="36"/>
+        </w:rPr>
+      </w:r>
+    </w:p>
+    <w:p>
+      <w:pPr>
+        <w:pStyle w:val="Normal"/>
+        <w:jc w:val="both"/>
+        <w:rPr>
+          <w:rFonts w:ascii="Garamond" w:hAnsi="Garamond"/>
+          <w:sz w:val="36"/>
+          <w:szCs w:val="36"/>
+        </w:rPr>
+      </w:pPr>
+      <w:r>
+        <w:rPr>
+          <w:rFonts w:ascii="Garamond" w:hAnsi="Garamond"/>
+          <w:sz w:val="36"/>
+          <w:szCs w:val="36"/>
+        </w:rPr>
+        <w:t>O Alcorão tem uma surata (capítulo) dedicada a ela, chamada "Surata Maryam" (19), que conta a história da anunciação, gravidez e nascimento de Jesus.</w:t>
+      </w:r>
+      <w:r>
+        <w:rPr>
+          <w:rFonts w:ascii="Garamond" w:hAnsi="Garamond"/>
+          <w:sz w:val="36"/>
+          <w:szCs w:val="36"/>
+        </w:rPr>
+        <w:t xml:space="preserve"> </w:t>
+      </w:r>
+      <w:r>
+        <w:rPr>
+          <w:rFonts w:ascii="Garamond" w:hAnsi="Garamond"/>
+          <w:sz w:val="36"/>
+          <w:szCs w:val="36"/>
+        </w:rPr>
+        <w:t>A tradição islâmica também a descreve como "Imaculada" e como uma mulher pura e santa.</w:t>
+      </w:r>
+    </w:p>
+    <w:p>
+      <w:pPr>
+        <w:pStyle w:val="Normal"/>
+        <w:jc w:val="both"/>
+        <w:rPr>
+          <w:rFonts w:ascii="Garamond" w:hAnsi="Garamond"/>
+          <w:sz w:val="36"/>
+          <w:szCs w:val="36"/>
+        </w:rPr>
+      </w:pPr>
+      <w:r>
+        <w:rPr>
+          <w:rFonts w:ascii="Garamond" w:hAnsi="Garamond"/>
+          <w:sz w:val="36"/>
+          <w:szCs w:val="36"/>
+        </w:rPr>
+      </w:r>
+    </w:p>
+    <w:p>
+      <w:pPr>
+        <w:pStyle w:val="Normal"/>
+        <w:jc w:val="both"/>
+        <w:rPr>
+          <w:rFonts w:ascii="Garamond" w:hAnsi="Garamond"/>
+          <w:sz w:val="36"/>
+          <w:szCs w:val="36"/>
+        </w:rPr>
+      </w:pPr>
+      <w:r>
+        <w:rPr>
+          <w:rFonts w:eastAsia="Arial" w:cs="Arial" w:ascii="Garamond" w:hAnsi="Garamond"/>
+          <w:color w:val="auto"/>
+          <w:kern w:val="0"/>
+          <w:sz w:val="36"/>
+          <w:szCs w:val="36"/>
+          <w:lang w:val="en-US" w:eastAsia="zh-CN" w:bidi="hi-IN"/>
+        </w:rPr>
+        <w:t>Curiosamente</w:t>
+      </w:r>
+      <w:r>
+        <w:rPr>
+          <w:rFonts w:ascii="Garamond" w:hAnsi="Garamond"/>
+          <w:sz w:val="36"/>
+          <w:szCs w:val="36"/>
+        </w:rPr>
+        <w:t xml:space="preserve"> Maria é mencionada mais vezes no </w:t>
+      </w:r>
+      <w:r>
+        <w:rPr>
+          <w:rFonts w:ascii="Garamond" w:hAnsi="Garamond"/>
+          <w:sz w:val="36"/>
+          <w:szCs w:val="36"/>
+        </w:rPr>
+        <w:t xml:space="preserve">Alcorão </w:t>
+      </w:r>
+      <w:r>
+        <w:rPr>
+          <w:rFonts w:ascii="Garamond" w:hAnsi="Garamond"/>
+          <w:sz w:val="36"/>
+          <w:szCs w:val="36"/>
+        </w:rPr>
+        <w:t>do que no Novo Testamento.</w:t>
       </w:r>
     </w:p>
     <w:p>
@@ -945,7 +1084,120 @@
           <w:szCs w:val="36"/>
           <w:lang w:val="en-US" w:eastAsia="zh-CN" w:bidi="hi-IN"/>
         </w:rPr>
-        <w:t>Vamos agora analisar algumas das passagens evangélicas que trazem a figura de Maria, refletindo na maneira como ela se dispôs a servir no bem e também em como podemos nos inspirar nesses exemplos para nosso próprio crescimento e evolução espiritual.</w:t>
+        <w:t>Já que o nosso tema hoje é a disposição de Maria em servir, v</w:t>
+      </w:r>
+      <w:r>
+        <w:rPr>
+          <w:rFonts w:eastAsia="Arial" w:cs="Arial" w:ascii="Garamond" w:hAnsi="Garamond"/>
+          <w:color w:val="auto"/>
+          <w:kern w:val="0"/>
+          <w:sz w:val="36"/>
+          <w:szCs w:val="36"/>
+          <w:lang w:val="en-US" w:eastAsia="zh-CN" w:bidi="hi-IN"/>
+        </w:rPr>
+        <w:t xml:space="preserve">amos analisar algumas  passagens evangélicas que trazem </w:t>
+      </w:r>
+      <w:r>
+        <w:rPr>
+          <w:rFonts w:eastAsia="Arial" w:cs="Arial" w:ascii="Garamond" w:hAnsi="Garamond"/>
+          <w:color w:val="auto"/>
+          <w:kern w:val="0"/>
+          <w:sz w:val="36"/>
+          <w:szCs w:val="36"/>
+          <w:lang w:val="en-US" w:eastAsia="zh-CN" w:bidi="hi-IN"/>
+        </w:rPr>
+        <w:t>su</w:t>
+      </w:r>
+      <w:r>
+        <w:rPr>
+          <w:rFonts w:eastAsia="Arial" w:cs="Arial" w:ascii="Garamond" w:hAnsi="Garamond"/>
+          <w:color w:val="auto"/>
+          <w:kern w:val="0"/>
+          <w:sz w:val="36"/>
+          <w:szCs w:val="36"/>
+          <w:lang w:val="en-US" w:eastAsia="zh-CN" w:bidi="hi-IN"/>
+        </w:rPr>
+        <w:t>a figura, refletindo na maneira como ela se dispôs a servir no bem</w:t>
+      </w:r>
+      <w:r>
+        <w:rPr>
+          <w:rFonts w:eastAsia="Arial" w:cs="Arial" w:ascii="Garamond" w:hAnsi="Garamond"/>
+          <w:color w:val="auto"/>
+          <w:kern w:val="0"/>
+          <w:sz w:val="36"/>
+          <w:szCs w:val="36"/>
+          <w:lang w:val="en-US" w:eastAsia="zh-CN" w:bidi="hi-IN"/>
+        </w:rPr>
+        <w:t>.</w:t>
+      </w:r>
+    </w:p>
+    <w:p>
+      <w:pPr>
+        <w:pStyle w:val="Normal"/>
+        <w:jc w:val="both"/>
+        <w:rPr>
+          <w:rFonts w:ascii="Garamond" w:hAnsi="Garamond"/>
+          <w:sz w:val="36"/>
+          <w:szCs w:val="36"/>
+        </w:rPr>
+      </w:pPr>
+      <w:r>
+        <w:rPr/>
+      </w:r>
+    </w:p>
+    <w:p>
+      <w:pPr>
+        <w:pStyle w:val="Normal"/>
+        <w:jc w:val="both"/>
+        <w:rPr>
+          <w:rFonts w:ascii="Garamond" w:hAnsi="Garamond"/>
+          <w:sz w:val="36"/>
+          <w:szCs w:val="36"/>
+        </w:rPr>
+      </w:pPr>
+      <w:r>
+        <w:rPr>
+          <w:rFonts w:eastAsia="Arial" w:cs="Arial" w:ascii="Garamond" w:hAnsi="Garamond"/>
+          <w:color w:val="auto"/>
+          <w:kern w:val="0"/>
+          <w:sz w:val="36"/>
+          <w:szCs w:val="36"/>
+          <w:lang w:val="en-US" w:eastAsia="zh-CN" w:bidi="hi-IN"/>
+        </w:rPr>
+        <w:t>Vamos ver</w:t>
+      </w:r>
+      <w:r>
+        <w:rPr>
+          <w:rFonts w:eastAsia="Arial" w:cs="Arial" w:ascii="Garamond" w:hAnsi="Garamond"/>
+          <w:color w:val="auto"/>
+          <w:kern w:val="0"/>
+          <w:sz w:val="36"/>
+          <w:szCs w:val="36"/>
+          <w:lang w:val="en-US" w:eastAsia="zh-CN" w:bidi="hi-IN"/>
+        </w:rPr>
+        <w:t xml:space="preserve"> também como podemos nos inspirar nesses exemplos para </w:t>
+      </w:r>
+      <w:r>
+        <w:rPr>
+          <w:rFonts w:eastAsia="Arial" w:cs="Arial" w:ascii="Garamond" w:hAnsi="Garamond"/>
+          <w:color w:val="auto"/>
+          <w:kern w:val="0"/>
+          <w:sz w:val="36"/>
+          <w:szCs w:val="36"/>
+          <w:lang w:val="en-US" w:eastAsia="zh-CN" w:bidi="hi-IN"/>
+        </w:rPr>
+        <w:t xml:space="preserve">o </w:t>
+      </w:r>
+      <w:r>
+        <w:rPr>
+          <w:rFonts w:eastAsia="Arial" w:cs="Arial" w:ascii="Garamond" w:hAnsi="Garamond"/>
+          <w:color w:val="auto"/>
+          <w:kern w:val="0"/>
+          <w:sz w:val="36"/>
+          <w:szCs w:val="36"/>
+          <w:lang w:val="en-US" w:eastAsia="zh-CN" w:bidi="hi-IN"/>
+        </w:rPr>
+        <w:t>nosso próprio crescimento e evolução espiritual.</w:t>
       </w:r>
     </w:p>
     <w:p>
@@ -1156,44 +1408,63 @@
           <w:sz w:val="36"/>
           <w:szCs w:val="36"/>
         </w:rPr>
-        <w:t xml:space="preserve"> uma saudação gloriosa, mas Maria não se envaidece com ela. Pelo contrário: demonstrando humildade, ela se perturba, se questiona, se coloca em dúvida. Maria não se considera digna ou especial, mesmo quando o anjo a chama de "agraciada". Ela se considera pequena diante dos propósitos divinos.</w:t>
-      </w:r>
-    </w:p>
-    <w:p>
-      <w:pPr>
-        <w:pStyle w:val="Normal"/>
-        <w:jc w:val="both"/>
-        <w:rPr>
-          <w:rFonts w:ascii="Garamond" w:hAnsi="Garamond"/>
-          <w:sz w:val="36"/>
-          <w:szCs w:val="36"/>
-        </w:rPr>
-      </w:pPr>
-      <w:r>
-        <w:rPr>
-          <w:rFonts w:ascii="Garamond" w:hAnsi="Garamond"/>
-          <w:sz w:val="36"/>
-          <w:szCs w:val="36"/>
-        </w:rPr>
-      </w:r>
-    </w:p>
-    <w:p>
-      <w:pPr>
-        <w:pStyle w:val="Normal"/>
-        <w:jc w:val="both"/>
-        <w:rPr>
-          <w:rFonts w:ascii="Garamond" w:hAnsi="Garamond"/>
-          <w:sz w:val="36"/>
-          <w:szCs w:val="36"/>
-        </w:rPr>
-      </w:pPr>
-      <w:r>
-        <w:rPr>
-          <w:rFonts w:ascii="Garamond" w:hAnsi="Garamond"/>
-          <w:sz w:val="36"/>
-          <w:szCs w:val="36"/>
-        </w:rPr>
-        <w:t xml:space="preserve">A segunda virtude de Maria está justamente em aceitar os propósitos </w:t>
+        <w:t xml:space="preserve"> uma saudação gloriosa, mas Maria não se envaidece. Pelo contrário: demonstrando humildade, ela se perturba, se questiona, se coloca em dúvida. Maria não se considera digna ou especial, mesmo quando o anjo a chama de "agraciada". Ela se considera pequena diante dos propósitos divinos.</w:t>
+      </w:r>
+    </w:p>
+    <w:p>
+      <w:pPr>
+        <w:pStyle w:val="Normal"/>
+        <w:jc w:val="both"/>
+        <w:rPr>
+          <w:rFonts w:ascii="Garamond" w:hAnsi="Garamond"/>
+          <w:sz w:val="36"/>
+          <w:szCs w:val="36"/>
+        </w:rPr>
+      </w:pPr>
+      <w:r>
+        <w:rPr>
+          <w:rFonts w:ascii="Garamond" w:hAnsi="Garamond"/>
+          <w:sz w:val="36"/>
+          <w:szCs w:val="36"/>
+        </w:rPr>
+      </w:r>
+    </w:p>
+    <w:p>
+      <w:pPr>
+        <w:pStyle w:val="Normal"/>
+        <w:jc w:val="both"/>
+        <w:rPr>
+          <w:rFonts w:ascii="Garamond" w:hAnsi="Garamond"/>
+          <w:sz w:val="36"/>
+          <w:szCs w:val="36"/>
+        </w:rPr>
+      </w:pPr>
+      <w:r>
+        <w:rPr>
+          <w:rFonts w:ascii="Garamond" w:hAnsi="Garamond"/>
+          <w:sz w:val="36"/>
+          <w:szCs w:val="36"/>
+        </w:rPr>
+        <w:t xml:space="preserve">A segunda virtude de Maria está justamente em aceitar </w:t>
+      </w:r>
+      <w:r>
+        <w:rPr>
+          <w:rFonts w:eastAsia="Arial" w:cs="Arial" w:ascii="Garamond" w:hAnsi="Garamond"/>
+          <w:color w:val="auto"/>
+          <w:kern w:val="0"/>
+          <w:sz w:val="36"/>
+          <w:szCs w:val="36"/>
+          <w:lang w:val="en-US" w:eastAsia="zh-CN" w:bidi="hi-IN"/>
+        </w:rPr>
+        <w:t>a missão</w:t>
+      </w:r>
+      <w:r>
+        <w:rPr>
+          <w:rFonts w:ascii="Garamond" w:hAnsi="Garamond"/>
+          <w:sz w:val="36"/>
+          <w:szCs w:val="36"/>
+        </w:rPr>
+        <w:t xml:space="preserve"> </w:t>
       </w:r>
       <w:r>
         <w:rPr>
@@ -1212,45 +1483,86 @@
           <w:sz w:val="36"/>
           <w:szCs w:val="36"/>
         </w:rPr>
-        <w:t xml:space="preserve"> para ela, mesmo não se achando digna deles. </w:t>
-      </w:r>
-    </w:p>
-    <w:p>
-      <w:pPr>
-        <w:pStyle w:val="Normal"/>
-        <w:jc w:val="both"/>
-        <w:rPr>
-          <w:rFonts w:ascii="Garamond" w:hAnsi="Garamond"/>
-          <w:sz w:val="36"/>
-          <w:szCs w:val="36"/>
-        </w:rPr>
-      </w:pPr>
-      <w:r>
-        <w:rPr>
-          <w:rFonts w:ascii="Garamond" w:hAnsi="Garamond"/>
-          <w:sz w:val="36"/>
-          <w:szCs w:val="36"/>
-        </w:rPr>
-      </w:r>
-    </w:p>
-    <w:p>
-      <w:pPr>
-        <w:pStyle w:val="Normal"/>
-        <w:jc w:val="both"/>
-        <w:rPr>
-          <w:rFonts w:ascii="Garamond" w:hAnsi="Garamond"/>
-          <w:sz w:val="36"/>
-          <w:szCs w:val="36"/>
-        </w:rPr>
-      </w:pPr>
-      <w:r>
-        <w:rPr>
-          <w:rFonts w:ascii="Garamond" w:hAnsi="Garamond"/>
-          <w:sz w:val="36"/>
-          <w:szCs w:val="36"/>
-        </w:rPr>
-        <w:t xml:space="preserve">A partir do momento que Maria compreende a mensagem levada pelo anjo Gabriel, ela se coloca voluntariamente na condição de submissão e serviço. </w:t>
-      </w:r>
+        <w:t xml:space="preserve"> para ela, mesmo não se achando digna d</w:t>
+      </w:r>
+      <w:r>
+        <w:rPr>
+          <w:rFonts w:ascii="Garamond" w:hAnsi="Garamond"/>
+          <w:sz w:val="36"/>
+          <w:szCs w:val="36"/>
+        </w:rPr>
+        <w:t>aquela missão</w:t>
+      </w:r>
+      <w:r>
+        <w:rPr>
+          <w:rFonts w:ascii="Garamond" w:hAnsi="Garamond"/>
+          <w:sz w:val="36"/>
+          <w:szCs w:val="36"/>
+        </w:rPr>
+        <w:t xml:space="preserve">. </w:t>
+      </w:r>
+    </w:p>
+    <w:p>
+      <w:pPr>
+        <w:pStyle w:val="Normal"/>
+        <w:jc w:val="both"/>
+        <w:rPr>
+          <w:rFonts w:ascii="Garamond" w:hAnsi="Garamond"/>
+          <w:sz w:val="36"/>
+          <w:szCs w:val="36"/>
+        </w:rPr>
+      </w:pPr>
+      <w:r>
+        <w:rPr>
+          <w:rFonts w:ascii="Garamond" w:hAnsi="Garamond"/>
+          <w:sz w:val="36"/>
+          <w:szCs w:val="36"/>
+        </w:rPr>
+      </w:r>
+    </w:p>
+    <w:p>
+      <w:pPr>
+        <w:pStyle w:val="Normal"/>
+        <w:jc w:val="both"/>
+        <w:rPr>
+          <w:rFonts w:ascii="Garamond" w:hAnsi="Garamond"/>
+          <w:sz w:val="36"/>
+          <w:szCs w:val="36"/>
+        </w:rPr>
+      </w:pPr>
+      <w:r>
+        <w:rPr>
+          <w:rFonts w:ascii="Garamond" w:hAnsi="Garamond"/>
+          <w:sz w:val="36"/>
+          <w:szCs w:val="36"/>
+        </w:rPr>
+        <w:t>A partir do momento que Maria compreende a mensagem levada pelo anjo Gabriel, ela se coloca voluntariamente na condição de submissão e serviço.</w:t>
+      </w:r>
+    </w:p>
+    <w:p>
+      <w:pPr>
+        <w:pStyle w:val="Normal"/>
+        <w:jc w:val="both"/>
+        <w:rPr>
+          <w:rFonts w:ascii="Garamond" w:hAnsi="Garamond"/>
+          <w:sz w:val="36"/>
+          <w:szCs w:val="36"/>
+        </w:rPr>
+      </w:pPr>
+      <w:r>
+        <w:rPr/>
+      </w:r>
+    </w:p>
+    <w:p>
+      <w:pPr>
+        <w:pStyle w:val="Normal"/>
+        <w:jc w:val="both"/>
+        <w:rPr>
+          <w:rFonts w:ascii="Garamond" w:hAnsi="Garamond"/>
+          <w:sz w:val="36"/>
+          <w:szCs w:val="36"/>
+        </w:rPr>
+      </w:pPr>
       <w:r>
         <w:rPr>
           <w:rFonts w:eastAsia="Arial" w:cs="Arial" w:ascii="Garamond" w:hAnsi="Garamond"/>
@@ -1320,173 +1632,222 @@
       </w:pPr>
       <w:r>
         <w:rPr>
-          <w:rFonts w:ascii="Garamond" w:hAnsi="Garamond"/>
-          <w:sz w:val="36"/>
-          <w:szCs w:val="36"/>
-        </w:rPr>
-        <w:t xml:space="preserve">Vejam, Maria não foi </w:t>
-      </w:r>
-      <w:r>
-        <w:rPr>
-          <w:rFonts w:eastAsia="Arial" w:cs="Arial" w:ascii="Garamond" w:hAnsi="Garamond"/>
-          <w:color w:val="auto"/>
-          <w:kern w:val="0"/>
-          <w:sz w:val="36"/>
-          <w:szCs w:val="36"/>
-          <w:lang w:val="en-US" w:eastAsia="zh-CN" w:bidi="hi-IN"/>
-        </w:rPr>
-        <w:t>obrigada</w:t>
-      </w:r>
-      <w:r>
-        <w:rPr>
-          <w:rFonts w:ascii="Garamond" w:hAnsi="Garamond"/>
-          <w:sz w:val="36"/>
-          <w:szCs w:val="36"/>
-        </w:rPr>
-        <w:t xml:space="preserve"> a aceitar. A proposta do anjo exigia sua resposta — e, fazendo uso de sua liberdade de escolha, ela consente mesmo diante de uma missão que envolvia risco, sofrimento e incerteza. Isso revela uma obediência madura, não passiva, mas ativa: ela escolhe colocar a vontade de Deus acima da sua própria vontade.</w:t>
-      </w:r>
-    </w:p>
-    <w:p>
-      <w:pPr>
-        <w:pStyle w:val="Normal"/>
-        <w:jc w:val="both"/>
-        <w:rPr>
-          <w:rFonts w:ascii="Garamond" w:hAnsi="Garamond"/>
-          <w:sz w:val="36"/>
-          <w:szCs w:val="36"/>
-        </w:rPr>
-      </w:pPr>
-      <w:r>
-        <w:rPr>
-          <w:rFonts w:ascii="Garamond" w:hAnsi="Garamond"/>
-          <w:sz w:val="36"/>
-          <w:szCs w:val="36"/>
-        </w:rPr>
-      </w:r>
-    </w:p>
-    <w:p>
-      <w:pPr>
-        <w:pStyle w:val="Normal"/>
-        <w:jc w:val="both"/>
-        <w:rPr>
-          <w:rFonts w:ascii="Garamond" w:hAnsi="Garamond"/>
-          <w:sz w:val="36"/>
-          <w:szCs w:val="36"/>
-        </w:rPr>
-      </w:pPr>
-      <w:r>
-        <w:rPr>
-          <w:rFonts w:ascii="Garamond" w:hAnsi="Garamond"/>
-          <w:sz w:val="36"/>
-          <w:szCs w:val="36"/>
-        </w:rPr>
-        <w:t xml:space="preserve">Interessante nós observarmos que a obediência </w:t>
-      </w:r>
-      <w:r>
-        <w:rPr>
-          <w:rFonts w:eastAsia="Arial" w:cs="Arial" w:ascii="Garamond" w:hAnsi="Garamond"/>
-          <w:color w:val="auto"/>
-          <w:kern w:val="0"/>
-          <w:sz w:val="36"/>
-          <w:szCs w:val="36"/>
-          <w:lang w:val="en-US" w:eastAsia="zh-CN" w:bidi="hi-IN"/>
-        </w:rPr>
-        <w:t>que Maria demonstra nessa passagem</w:t>
-      </w:r>
-      <w:r>
-        <w:rPr>
-          <w:rFonts w:ascii="Garamond" w:hAnsi="Garamond"/>
-          <w:sz w:val="36"/>
-          <w:szCs w:val="36"/>
-        </w:rPr>
-        <w:t>, permanecerá ao longo de sua vida. Será assim no nascimento de Jesus em condições precárias, na fuga para o Egito, na vida simples em Nazaré, e de maneira muito especial no silêncio e na dor ao pé da cruz, como veremos mais adiante.</w:t>
-      </w:r>
-    </w:p>
-    <w:p>
-      <w:pPr>
-        <w:pStyle w:val="Normal"/>
-        <w:jc w:val="both"/>
-        <w:rPr>
-          <w:rFonts w:ascii="Garamond" w:hAnsi="Garamond"/>
-          <w:sz w:val="36"/>
-          <w:szCs w:val="36"/>
-        </w:rPr>
-      </w:pPr>
-      <w:r>
-        <w:rPr>
-          <w:rFonts w:ascii="Garamond" w:hAnsi="Garamond"/>
-          <w:sz w:val="36"/>
-          <w:szCs w:val="36"/>
-        </w:rPr>
-      </w:r>
-    </w:p>
-    <w:p>
-      <w:pPr>
-        <w:pStyle w:val="Normal"/>
-        <w:jc w:val="both"/>
-        <w:rPr>
-          <w:rFonts w:ascii="Garamond" w:hAnsi="Garamond"/>
-          <w:sz w:val="36"/>
-          <w:szCs w:val="36"/>
-        </w:rPr>
-      </w:pPr>
-      <w:r>
-        <w:rPr>
-          <w:rFonts w:eastAsia="Arial" w:cs="Arial" w:ascii="Garamond" w:hAnsi="Garamond"/>
-          <w:color w:val="auto"/>
-          <w:kern w:val="0"/>
-          <w:sz w:val="36"/>
-          <w:szCs w:val="36"/>
-          <w:lang w:val="en-US" w:eastAsia="zh-CN" w:bidi="hi-IN"/>
-        </w:rPr>
-        <w:t>E como podemos trazer para nossas vidas esses exemplos dados por Maria</w:t>
-      </w:r>
-      <w:r>
-        <w:rPr>
-          <w:rFonts w:ascii="Garamond" w:hAnsi="Garamond"/>
-          <w:sz w:val="36"/>
-          <w:szCs w:val="36"/>
-        </w:rPr>
-        <w:t xml:space="preserve">? Em primeiro lugar, procurando ser humildes. A humildade é uma virtude </w:t>
-      </w:r>
-      <w:r>
-        <w:rPr>
-          <w:rFonts w:eastAsia="Arial" w:cs="Arial" w:ascii="Garamond" w:hAnsi="Garamond"/>
-          <w:color w:val="auto"/>
-          <w:kern w:val="0"/>
-          <w:sz w:val="36"/>
-          <w:szCs w:val="36"/>
-          <w:lang w:val="en-US" w:eastAsia="zh-CN" w:bidi="hi-IN"/>
-        </w:rPr>
-        <w:t>que precisamos</w:t>
-      </w:r>
-      <w:r>
-        <w:rPr>
-          <w:rFonts w:ascii="Garamond" w:hAnsi="Garamond"/>
-          <w:sz w:val="36"/>
-          <w:szCs w:val="36"/>
-        </w:rPr>
-        <w:t xml:space="preserve"> conquistar, desenvolver e praticar em todos os momentos de nossas vidas</w:t>
-      </w:r>
-      <w:r>
-        <w:rPr>
-          <w:rFonts w:eastAsia="Arial" w:cs="Arial" w:ascii="Garamond" w:hAnsi="Garamond"/>
-          <w:color w:val="auto"/>
-          <w:kern w:val="0"/>
-          <w:sz w:val="36"/>
-          <w:szCs w:val="36"/>
-          <w:lang w:val="en-US" w:eastAsia="zh-CN" w:bidi="hi-IN"/>
+          <w:rFonts w:eastAsia="Arial" w:cs="Arial" w:ascii="Garamond" w:hAnsi="Garamond"/>
+          <w:color w:val="auto"/>
+          <w:kern w:val="0"/>
+          <w:sz w:val="36"/>
+          <w:szCs w:val="36"/>
+          <w:lang w:val="en-US" w:eastAsia="zh-CN" w:bidi="hi-IN"/>
+        </w:rPr>
+        <w:t xml:space="preserve">Aceita a </w:t>
+      </w:r>
+      <w:r>
+        <w:rPr>
+          <w:rFonts w:ascii="Garamond" w:hAnsi="Garamond"/>
+          <w:sz w:val="36"/>
+          <w:szCs w:val="36"/>
+        </w:rPr>
+        <w:t>missão</w:t>
+      </w:r>
+      <w:r>
+        <w:rPr>
+          <w:rFonts w:ascii="Garamond" w:hAnsi="Garamond"/>
+          <w:sz w:val="36"/>
+          <w:szCs w:val="36"/>
+        </w:rPr>
+        <w:t>, mesmo sabendo dos riscos, sofrimentos e incertezas a que estaria submetida. Ela</w:t>
+      </w:r>
+      <w:r>
+        <w:rPr>
+          <w:rFonts w:ascii="Garamond" w:hAnsi="Garamond"/>
+          <w:sz w:val="36"/>
+          <w:szCs w:val="36"/>
+        </w:rPr>
+        <w:t xml:space="preserve"> revela uma obediência madura</w:t>
+      </w:r>
+      <w:r>
+        <w:rPr>
+          <w:rFonts w:eastAsia="Arial" w:cs="Arial" w:ascii="Garamond" w:hAnsi="Garamond"/>
+          <w:color w:val="auto"/>
+          <w:kern w:val="0"/>
+          <w:sz w:val="36"/>
+          <w:szCs w:val="36"/>
+          <w:lang w:val="en-US" w:eastAsia="zh-CN" w:bidi="hi-IN"/>
+        </w:rPr>
+        <w:t xml:space="preserve"> e</w:t>
+      </w:r>
+      <w:r>
+        <w:rPr>
+          <w:rFonts w:ascii="Garamond" w:hAnsi="Garamond"/>
+          <w:sz w:val="36"/>
+          <w:szCs w:val="36"/>
+        </w:rPr>
+        <w:t xml:space="preserve"> ativa: escolhe colocar a vontade de Deus acima da sua própria vontade.</w:t>
+      </w:r>
+    </w:p>
+    <w:p>
+      <w:pPr>
+        <w:pStyle w:val="Normal"/>
+        <w:jc w:val="both"/>
+        <w:rPr>
+          <w:rFonts w:ascii="Garamond" w:hAnsi="Garamond"/>
+          <w:sz w:val="36"/>
+          <w:szCs w:val="36"/>
+        </w:rPr>
+      </w:pPr>
+      <w:r>
+        <w:rPr>
+          <w:rFonts w:ascii="Garamond" w:hAnsi="Garamond"/>
+          <w:sz w:val="36"/>
+          <w:szCs w:val="36"/>
+        </w:rPr>
+      </w:r>
+    </w:p>
+    <w:p>
+      <w:pPr>
+        <w:pStyle w:val="Normal"/>
+        <w:jc w:val="both"/>
+        <w:rPr>
+          <w:rFonts w:ascii="Garamond" w:hAnsi="Garamond"/>
+          <w:sz w:val="36"/>
+          <w:szCs w:val="36"/>
+        </w:rPr>
+      </w:pPr>
+      <w:r>
+        <w:rPr>
+          <w:rFonts w:eastAsia="Arial" w:cs="Arial" w:ascii="Garamond" w:hAnsi="Garamond"/>
+          <w:color w:val="auto"/>
+          <w:kern w:val="0"/>
+          <w:sz w:val="36"/>
+          <w:szCs w:val="36"/>
+          <w:lang w:val="en-US" w:eastAsia="zh-CN" w:bidi="hi-IN"/>
+        </w:rPr>
+        <w:t xml:space="preserve">Essa obediência estará presente ao longo de toda a vida de Maria. </w:t>
+      </w:r>
+      <w:r>
+        <w:rPr>
+          <w:rFonts w:ascii="Garamond" w:hAnsi="Garamond"/>
+          <w:sz w:val="36"/>
+          <w:szCs w:val="36"/>
+        </w:rPr>
+        <w:t xml:space="preserve"> Será assim no nascimento de Jesus em condições precárias, na fuga para o Egito, na vida simples em Nazaré, e de maneira muito especial no silêncio e na dor ao pé da cruz.</w:t>
+      </w:r>
+    </w:p>
+    <w:p>
+      <w:pPr>
+        <w:pStyle w:val="Normal"/>
+        <w:jc w:val="both"/>
+        <w:rPr>
+          <w:rFonts w:ascii="Garamond" w:hAnsi="Garamond"/>
+          <w:sz w:val="36"/>
+          <w:szCs w:val="36"/>
+        </w:rPr>
+      </w:pPr>
+      <w:r>
+        <w:rPr>
+          <w:rFonts w:ascii="Garamond" w:hAnsi="Garamond"/>
+          <w:sz w:val="36"/>
+          <w:szCs w:val="36"/>
+        </w:rPr>
+      </w:r>
+    </w:p>
+    <w:p>
+      <w:pPr>
+        <w:pStyle w:val="Normal"/>
+        <w:jc w:val="both"/>
+        <w:rPr>
+          <w:rFonts w:ascii="Garamond" w:hAnsi="Garamond"/>
+          <w:sz w:val="36"/>
+          <w:szCs w:val="36"/>
+        </w:rPr>
+      </w:pPr>
+      <w:r>
+        <w:rPr>
+          <w:rFonts w:eastAsia="Arial" w:cs="Arial" w:ascii="Garamond" w:hAnsi="Garamond"/>
+          <w:color w:val="auto"/>
+          <w:kern w:val="0"/>
+          <w:sz w:val="36"/>
+          <w:szCs w:val="36"/>
+          <w:lang w:val="en-US" w:eastAsia="zh-CN" w:bidi="hi-IN"/>
+        </w:rPr>
+        <w:t xml:space="preserve">De que maneira </w:t>
+      </w:r>
+      <w:r>
+        <w:rPr>
+          <w:rFonts w:eastAsia="Arial" w:cs="Arial" w:ascii="Garamond" w:hAnsi="Garamond"/>
+          <w:color w:val="auto"/>
+          <w:kern w:val="0"/>
+          <w:sz w:val="36"/>
+          <w:szCs w:val="36"/>
+          <w:lang w:val="en-US" w:eastAsia="zh-CN" w:bidi="hi-IN"/>
+        </w:rPr>
+        <w:t xml:space="preserve">podemos trazer </w:t>
+      </w:r>
+      <w:r>
+        <w:rPr>
+          <w:rFonts w:eastAsia="Arial" w:cs="Arial" w:ascii="Garamond" w:hAnsi="Garamond"/>
+          <w:color w:val="auto"/>
+          <w:kern w:val="0"/>
+          <w:sz w:val="36"/>
+          <w:szCs w:val="36"/>
+          <w:lang w:val="en-US" w:eastAsia="zh-CN" w:bidi="hi-IN"/>
+        </w:rPr>
+        <w:t xml:space="preserve">os exemplos de Maria </w:t>
+      </w:r>
+      <w:r>
+        <w:rPr>
+          <w:rFonts w:eastAsia="Arial" w:cs="Arial" w:ascii="Garamond" w:hAnsi="Garamond"/>
+          <w:color w:val="auto"/>
+          <w:kern w:val="0"/>
+          <w:sz w:val="36"/>
+          <w:szCs w:val="36"/>
+          <w:lang w:val="en-US" w:eastAsia="zh-CN" w:bidi="hi-IN"/>
+        </w:rPr>
+        <w:t>para nossas vidas</w:t>
+      </w:r>
+      <w:r>
+        <w:rPr>
+          <w:rFonts w:ascii="Garamond" w:hAnsi="Garamond"/>
+          <w:sz w:val="36"/>
+          <w:szCs w:val="36"/>
+        </w:rPr>
+        <w:t xml:space="preserve">? Em primeiro lugar, procurando ser humildes. </w:t>
+      </w:r>
+      <w:r>
+        <w:rPr>
+          <w:rFonts w:ascii="Garamond" w:hAnsi="Garamond"/>
+          <w:sz w:val="36"/>
+          <w:szCs w:val="36"/>
+        </w:rPr>
+        <w:t>A h</w:t>
+      </w:r>
+      <w:r>
+        <w:rPr>
+          <w:rFonts w:ascii="Garamond" w:hAnsi="Garamond"/>
+          <w:sz w:val="36"/>
+          <w:szCs w:val="36"/>
+        </w:rPr>
+        <w:t xml:space="preserve">umildade é uma virtude que se constrói com o tempo, unindo compreensão, vivência e prática em todos os momentos da </w:t>
+      </w:r>
+      <w:r>
+        <w:rPr>
+          <w:rFonts w:eastAsia="Arial" w:cs="Arial" w:ascii="Garamond" w:hAnsi="Garamond"/>
+          <w:color w:val="auto"/>
+          <w:kern w:val="0"/>
+          <w:sz w:val="36"/>
+          <w:szCs w:val="36"/>
+          <w:lang w:val="en-US" w:eastAsia="zh-CN" w:bidi="hi-IN"/>
+        </w:rPr>
+        <w:t>vida</w:t>
+      </w:r>
+      <w:r>
+        <w:rPr>
+          <w:rFonts w:ascii="Garamond" w:hAnsi="Garamond"/>
+          <w:sz w:val="36"/>
+          <w:szCs w:val="36"/>
         </w:rPr>
         <w:t>.</w:t>
       </w:r>
-      <w:r>
-        <w:rPr>
-          <w:rFonts w:ascii="Garamond" w:hAnsi="Garamond"/>
-          <w:sz w:val="36"/>
-          <w:szCs w:val="36"/>
-        </w:rPr>
-        <w:t xml:space="preserve"> </w:t>
-      </w:r>
     </w:p>
     <w:p>
       <w:pPr>
@@ -1539,7 +1900,67 @@
           <w:sz w:val="36"/>
           <w:szCs w:val="36"/>
         </w:rPr>
-        <w:t xml:space="preserve"> As sandálias representam a humildade — um calçado simples, que nos prepara para caminhar, aceitando os caminhos como são. Já os tapetes vermelhos simbolizam os nossos caprichos, o desejo de conforto, reconhecimento e facilidades. </w:t>
+        <w:t xml:space="preserve"> As sandálias representam a humildade — um calçado simples, que nos prepara para caminhar</w:t>
+      </w:r>
+      <w:r>
+        <w:rPr>
+          <w:rFonts w:eastAsia="Arial" w:cs="Arial" w:ascii="Garamond" w:hAnsi="Garamond"/>
+          <w:color w:val="auto"/>
+          <w:kern w:val="0"/>
+          <w:sz w:val="36"/>
+          <w:szCs w:val="36"/>
+          <w:lang w:val="en-US" w:eastAsia="zh-CN" w:bidi="hi-IN"/>
+        </w:rPr>
+        <w:t xml:space="preserve"> sobre qualquer terreno,</w:t>
+      </w:r>
+      <w:r>
+        <w:rPr>
+          <w:rFonts w:ascii="Garamond" w:hAnsi="Garamond"/>
+          <w:sz w:val="36"/>
+          <w:szCs w:val="36"/>
+        </w:rPr>
+        <w:t xml:space="preserve"> principalmente os mais difíceis e áridos.</w:t>
+      </w:r>
+    </w:p>
+    <w:p>
+      <w:pPr>
+        <w:pStyle w:val="Normal"/>
+        <w:jc w:val="both"/>
+        <w:rPr>
+          <w:rFonts w:ascii="Garamond" w:hAnsi="Garamond"/>
+          <w:sz w:val="36"/>
+          <w:szCs w:val="36"/>
+        </w:rPr>
+      </w:pPr>
+      <w:r>
+        <w:rPr/>
+      </w:r>
+    </w:p>
+    <w:p>
+      <w:pPr>
+        <w:pStyle w:val="Normal"/>
+        <w:jc w:val="both"/>
+        <w:rPr>
+          <w:rFonts w:ascii="Garamond" w:hAnsi="Garamond"/>
+          <w:sz w:val="36"/>
+          <w:szCs w:val="36"/>
+        </w:rPr>
+      </w:pPr>
+      <w:r>
+        <w:rPr>
+          <w:rFonts w:ascii="Garamond" w:hAnsi="Garamond"/>
+          <w:sz w:val="36"/>
+          <w:szCs w:val="36"/>
+        </w:rPr>
+        <w:t xml:space="preserve">Em contrapartida, </w:t>
+      </w:r>
+      <w:r>
+        <w:rPr>
+          <w:rFonts w:ascii="Garamond" w:hAnsi="Garamond"/>
+          <w:sz w:val="36"/>
+          <w:szCs w:val="36"/>
+        </w:rPr>
+        <w:t xml:space="preserve">os tapetes vermelhos simbolizam os nossos caprichos, o desejo de conforto, reconhecimento e facilidades. </w:t>
       </w:r>
     </w:p>
     <w:p>
@@ -1724,7 +2145,45 @@
           <w:sz w:val="36"/>
           <w:szCs w:val="36"/>
         </w:rPr>
-        <w:t>Precisamos refletir profundamente sobre isso. Deus só deseja o melhor para nós. Se nos mantivermos obedientes aos desígnios d'Ele, realizando de boa vontade o trabalho que nos cabe, aí sim estaremos construindo nossa estrada para a felicidade.</w:t>
+        <w:t xml:space="preserve">Se nos mantivermos obedientes aos desígnios </w:t>
+      </w:r>
+      <w:r>
+        <w:rPr>
+          <w:rFonts w:eastAsia="Arial" w:cs="Arial" w:ascii="Garamond" w:hAnsi="Garamond"/>
+          <w:color w:val="auto"/>
+          <w:kern w:val="0"/>
+          <w:sz w:val="36"/>
+          <w:szCs w:val="36"/>
+          <w:lang w:val="en-US" w:eastAsia="zh-CN" w:bidi="hi-IN"/>
+        </w:rPr>
+        <w:t>de Deus</w:t>
+      </w:r>
+      <w:r>
+        <w:rPr>
+          <w:rFonts w:ascii="Garamond" w:hAnsi="Garamond"/>
+          <w:sz w:val="36"/>
+          <w:szCs w:val="36"/>
+        </w:rPr>
+        <w:t xml:space="preserve">, realizando de boa vontade o trabalho que nos cabe,  estaremos construindo </w:t>
+      </w:r>
+      <w:r>
+        <w:rPr>
+          <w:rFonts w:eastAsia="Arial" w:cs="Arial" w:ascii="Garamond" w:hAnsi="Garamond"/>
+          <w:color w:val="auto"/>
+          <w:kern w:val="0"/>
+          <w:sz w:val="36"/>
+          <w:szCs w:val="36"/>
+          <w:lang w:val="en-US" w:eastAsia="zh-CN" w:bidi="hi-IN"/>
+        </w:rPr>
+        <w:t>o caminho</w:t>
+      </w:r>
+      <w:r>
+        <w:rPr>
+          <w:rFonts w:ascii="Garamond" w:hAnsi="Garamond"/>
+          <w:sz w:val="36"/>
+          <w:szCs w:val="36"/>
+        </w:rPr>
+        <w:t xml:space="preserve"> para a felicidade.</w:t>
       </w:r>
     </w:p>
     <w:p>
@@ -1849,7 +2308,23 @@
           <w:sz w:val="36"/>
           <w:szCs w:val="36"/>
         </w:rPr>
-        <w:t>Nota: A diferença entre “Isabel” e “Elisabet” nas versões do Evangelho se deve a variações de tradução e transliteração do nome original ao longo dos séculos, conforme o texto bíblico foi passado do hebraico ao grego, depois ao latim e, por fim, aos idiomas modernos.</w:t>
+        <w:t>Nota</w:t>
+      </w:r>
+      <w:r>
+        <w:rPr>
+          <w:rFonts w:ascii="Garamond" w:hAnsi="Garamond"/>
+          <w:sz w:val="36"/>
+          <w:szCs w:val="36"/>
+        </w:rPr>
+        <w:t xml:space="preserve"> [ ver se vale a pena manter essa nota] </w:t>
+      </w:r>
+      <w:r>
+        <w:rPr>
+          <w:rFonts w:ascii="Garamond" w:hAnsi="Garamond"/>
+          <w:sz w:val="36"/>
+          <w:szCs w:val="36"/>
+        </w:rPr>
+        <w:t>: A diferença entre “Isabel” e “Elisabet” nas versões do Evangelho se deve a variações de tradução e transliteração do nome original ao longo dos séculos, conforme o texto bíblico foi passado do hebraico ao grego, depois ao latim e, por fim, aos idiomas modernos.</w:t>
       </w:r>
     </w:p>
     <w:p>
@@ -2002,11 +2477,190 @@
       </w:pPr>
       <w:r>
         <w:rPr>
-          <w:rFonts w:ascii="Garamond" w:hAnsi="Garamond"/>
-          <w:sz w:val="36"/>
-          <w:szCs w:val="36"/>
-        </w:rPr>
-        <w:t xml:space="preserve">Na visita a </w:t>
+          <w:rFonts w:eastAsia="Arial" w:cs="Arial" w:ascii="Garamond" w:hAnsi="Garamond"/>
+          <w:color w:val="auto"/>
+          <w:kern w:val="0"/>
+          <w:sz w:val="36"/>
+          <w:szCs w:val="36"/>
+          <w:lang w:val="en-US" w:eastAsia="zh-CN" w:bidi="hi-IN"/>
+        </w:rPr>
+        <w:t xml:space="preserve">Nessa passagem </w:t>
+      </w:r>
+      <w:r>
+        <w:rPr>
+          <w:rFonts w:ascii="Garamond" w:hAnsi="Garamond"/>
+          <w:sz w:val="36"/>
+          <w:szCs w:val="36"/>
+        </w:rPr>
+        <w:t>Maria nos dá exemplos</w:t>
+      </w:r>
+      <w:r>
+        <w:rPr>
+          <w:rFonts w:ascii="Garamond" w:hAnsi="Garamond"/>
+          <w:sz w:val="36"/>
+          <w:szCs w:val="36"/>
+        </w:rPr>
+        <w:t>, novamente,</w:t>
+      </w:r>
+      <w:r>
+        <w:rPr>
+          <w:rFonts w:ascii="Garamond" w:hAnsi="Garamond"/>
+          <w:sz w:val="36"/>
+          <w:szCs w:val="36"/>
+        </w:rPr>
+        <w:t xml:space="preserve"> de humildade, prontidão generosa e presença consoladora.  Ao saber da gravidez da prima já idosa, ela não hesita: parte apressadamente pelas montanhas da Judeia, mostrando que a verdadeira caridade é pronta, sensível e ativa. </w:t>
+      </w:r>
+    </w:p>
+    <w:p>
+      <w:pPr>
+        <w:pStyle w:val="Normal"/>
+        <w:jc w:val="both"/>
+        <w:rPr>
+          <w:rFonts w:ascii="Garamond" w:hAnsi="Garamond"/>
+          <w:sz w:val="36"/>
+          <w:szCs w:val="36"/>
+        </w:rPr>
+      </w:pPr>
+      <w:r>
+        <w:rPr>
+          <w:rFonts w:ascii="Garamond" w:hAnsi="Garamond"/>
+          <w:sz w:val="36"/>
+          <w:szCs w:val="36"/>
+        </w:rPr>
+      </w:r>
+    </w:p>
+    <w:p>
+      <w:pPr>
+        <w:pStyle w:val="Normal"/>
+        <w:jc w:val="both"/>
+        <w:rPr>
+          <w:rFonts w:ascii="Garamond" w:hAnsi="Garamond"/>
+          <w:sz w:val="36"/>
+          <w:szCs w:val="36"/>
+        </w:rPr>
+      </w:pPr>
+      <w:r>
+        <w:rPr>
+          <w:rFonts w:eastAsia="Arial" w:cs="Arial" w:ascii="Garamond" w:hAnsi="Garamond"/>
+          <w:color w:val="auto"/>
+          <w:kern w:val="0"/>
+          <w:sz w:val="36"/>
+          <w:szCs w:val="36"/>
+          <w:lang w:val="en-US" w:eastAsia="zh-CN" w:bidi="hi-IN"/>
+        </w:rPr>
+        <w:t>M</w:t>
+      </w:r>
+      <w:r>
+        <w:rPr>
+          <w:rFonts w:ascii="Garamond" w:hAnsi="Garamond"/>
+          <w:sz w:val="36"/>
+          <w:szCs w:val="36"/>
+        </w:rPr>
+        <w:t xml:space="preserve">esmo carregando no ventre o Cristo de Deus, </w:t>
+      </w:r>
+      <w:r>
+        <w:rPr>
+          <w:rFonts w:eastAsia="Arial" w:cs="Arial" w:ascii="Garamond" w:hAnsi="Garamond"/>
+          <w:color w:val="auto"/>
+          <w:kern w:val="0"/>
+          <w:sz w:val="36"/>
+          <w:szCs w:val="36"/>
+          <w:lang w:val="en-US" w:eastAsia="zh-CN" w:bidi="hi-IN"/>
+        </w:rPr>
+        <w:t>Maria</w:t>
+      </w:r>
+      <w:r>
+        <w:rPr>
+          <w:rFonts w:ascii="Garamond" w:hAnsi="Garamond"/>
+          <w:sz w:val="36"/>
+          <w:szCs w:val="36"/>
+        </w:rPr>
+        <w:t xml:space="preserve"> não se coloca </w:t>
+      </w:r>
+      <w:r>
+        <w:rPr>
+          <w:rFonts w:eastAsia="Arial" w:cs="Arial" w:ascii="Garamond" w:hAnsi="Garamond"/>
+          <w:color w:val="auto"/>
+          <w:kern w:val="0"/>
+          <w:sz w:val="36"/>
+          <w:szCs w:val="36"/>
+          <w:lang w:val="en-US" w:eastAsia="zh-CN" w:bidi="hi-IN"/>
+        </w:rPr>
+        <w:t>em posição de destaque e</w:t>
+      </w:r>
+      <w:r>
+        <w:rPr>
+          <w:rFonts w:ascii="Garamond" w:hAnsi="Garamond"/>
+          <w:sz w:val="36"/>
+          <w:szCs w:val="36"/>
+        </w:rPr>
+        <w:t xml:space="preserve"> vai ao encontro d</w:t>
+      </w:r>
+      <w:r>
+        <w:rPr>
+          <w:rFonts w:eastAsia="Arial" w:cs="Arial" w:ascii="Garamond" w:hAnsi="Garamond"/>
+          <w:color w:val="auto"/>
+          <w:kern w:val="0"/>
+          <w:sz w:val="36"/>
+          <w:szCs w:val="36"/>
+          <w:lang w:val="en-US" w:eastAsia="zh-CN" w:bidi="hi-IN"/>
+        </w:rPr>
+        <w:t>e Elisabet</w:t>
+      </w:r>
+      <w:r>
+        <w:rPr>
+          <w:rFonts w:ascii="Garamond" w:hAnsi="Garamond"/>
+          <w:sz w:val="36"/>
+          <w:szCs w:val="36"/>
+        </w:rPr>
+        <w:t xml:space="preserve">. Permanece ali por cerca de três meses, servindo não apenas com gestos, mas também com sua presença amorosa, com o consolo de sua escuta e a partilha do cotidiano. </w:t>
+      </w:r>
+    </w:p>
+    <w:p>
+      <w:pPr>
+        <w:pStyle w:val="Normal"/>
+        <w:jc w:val="both"/>
+        <w:rPr>
+          <w:rFonts w:ascii="Garamond" w:hAnsi="Garamond"/>
+          <w:sz w:val="36"/>
+          <w:szCs w:val="36"/>
+        </w:rPr>
+      </w:pPr>
+      <w:r>
+        <w:rPr/>
+      </w:r>
+    </w:p>
+    <w:p>
+      <w:pPr>
+        <w:pStyle w:val="Normal"/>
+        <w:jc w:val="both"/>
+        <w:rPr>
+          <w:rFonts w:ascii="Garamond" w:hAnsi="Garamond"/>
+          <w:sz w:val="36"/>
+          <w:szCs w:val="36"/>
+        </w:rPr>
+      </w:pPr>
+      <w:r>
+        <w:rPr/>
+      </w:r>
+    </w:p>
+    <w:p>
+      <w:pPr>
+        <w:pStyle w:val="Normal"/>
+        <w:jc w:val="both"/>
+        <w:rPr>
+          <w:rFonts w:ascii="Garamond" w:hAnsi="Garamond"/>
+          <w:sz w:val="36"/>
+          <w:szCs w:val="36"/>
+        </w:rPr>
+      </w:pPr>
+      <w:r>
+        <w:rPr>
+          <w:rFonts w:ascii="Garamond" w:hAnsi="Garamond"/>
+          <w:sz w:val="36"/>
+          <w:szCs w:val="36"/>
+        </w:rPr>
+        <w:t xml:space="preserve">O Evangelho não diz exatamente onde Maria morava, nem onde ficava a casa de Zacarias e </w:t>
       </w:r>
       <w:r>
         <w:rPr>
@@ -2025,138 +2679,7 @@
           <w:sz w:val="36"/>
           <w:szCs w:val="36"/>
         </w:rPr>
-        <w:t xml:space="preserve">, Maria nos dá exemplos de humildade, prontidão generosa e presença consoladora.  Ao saber da gravidez da prima já idosa, ela não hesita: parte apressadamente pelas montanhas da Judeia, mostrando que a verdadeira caridade é pronta, sensível e ativa. </w:t>
-      </w:r>
-    </w:p>
-    <w:p>
-      <w:pPr>
-        <w:pStyle w:val="Normal"/>
-        <w:jc w:val="both"/>
-        <w:rPr>
-          <w:rFonts w:ascii="Garamond" w:hAnsi="Garamond"/>
-          <w:sz w:val="36"/>
-          <w:szCs w:val="36"/>
-        </w:rPr>
-      </w:pPr>
-      <w:r>
-        <w:rPr>
-          <w:rFonts w:ascii="Garamond" w:hAnsi="Garamond"/>
-          <w:sz w:val="36"/>
-          <w:szCs w:val="36"/>
-        </w:rPr>
-      </w:r>
-    </w:p>
-    <w:p>
-      <w:pPr>
-        <w:pStyle w:val="Normal"/>
-        <w:jc w:val="both"/>
-        <w:rPr>
-          <w:rFonts w:ascii="Garamond" w:hAnsi="Garamond"/>
-          <w:sz w:val="36"/>
-          <w:szCs w:val="36"/>
-        </w:rPr>
-      </w:pPr>
-      <w:r>
-        <w:rPr>
-          <w:rFonts w:ascii="Garamond" w:hAnsi="Garamond"/>
-          <w:sz w:val="36"/>
-          <w:szCs w:val="36"/>
-        </w:rPr>
-        <w:t xml:space="preserve">Novamente Maria demonstra humildade: mesmo carregando no ventre o Cristo de Deus, </w:t>
-      </w:r>
-      <w:r>
-        <w:rPr>
-          <w:rFonts w:eastAsia="Arial" w:cs="Arial" w:ascii="Garamond" w:hAnsi="Garamond"/>
-          <w:color w:val="auto"/>
-          <w:kern w:val="0"/>
-          <w:sz w:val="36"/>
-          <w:szCs w:val="36"/>
-          <w:lang w:val="en-US" w:eastAsia="zh-CN" w:bidi="hi-IN"/>
-        </w:rPr>
-        <w:t>ela</w:t>
-      </w:r>
-      <w:r>
-        <w:rPr>
-          <w:rFonts w:ascii="Garamond" w:hAnsi="Garamond"/>
-          <w:sz w:val="36"/>
-          <w:szCs w:val="36"/>
-        </w:rPr>
-        <w:t xml:space="preserve"> não se coloca </w:t>
-      </w:r>
-      <w:r>
-        <w:rPr>
-          <w:rFonts w:eastAsia="Arial" w:cs="Arial" w:ascii="Garamond" w:hAnsi="Garamond"/>
-          <w:color w:val="auto"/>
-          <w:kern w:val="0"/>
-          <w:sz w:val="36"/>
-          <w:szCs w:val="36"/>
-          <w:lang w:val="en-US" w:eastAsia="zh-CN" w:bidi="hi-IN"/>
-        </w:rPr>
-        <w:t>em posição de destaque e</w:t>
-      </w:r>
-      <w:r>
-        <w:rPr>
-          <w:rFonts w:ascii="Garamond" w:hAnsi="Garamond"/>
-          <w:sz w:val="36"/>
-          <w:szCs w:val="36"/>
-        </w:rPr>
-        <w:t xml:space="preserve"> vai ao encontro d</w:t>
-      </w:r>
-      <w:r>
-        <w:rPr>
-          <w:rFonts w:eastAsia="Arial" w:cs="Arial" w:ascii="Garamond" w:hAnsi="Garamond"/>
-          <w:color w:val="auto"/>
-          <w:kern w:val="0"/>
-          <w:sz w:val="36"/>
-          <w:szCs w:val="36"/>
-          <w:lang w:val="en-US" w:eastAsia="zh-CN" w:bidi="hi-IN"/>
-        </w:rPr>
-        <w:t>e Elisabet</w:t>
-      </w:r>
-      <w:r>
-        <w:rPr>
-          <w:rFonts w:ascii="Garamond" w:hAnsi="Garamond"/>
-          <w:sz w:val="36"/>
-          <w:szCs w:val="36"/>
-        </w:rPr>
-        <w:t xml:space="preserve">. Permanece ali por cerca de três meses, servindo não apenas com gestos, mas também com sua presença amorosa, com o consolo de sua escuta e a partilha do cotidiano. </w:t>
-      </w:r>
-    </w:p>
-    <w:p>
-      <w:pPr>
-        <w:pStyle w:val="Normal"/>
-        <w:jc w:val="both"/>
-        <w:rPr>
-          <w:rFonts w:ascii="Garamond" w:hAnsi="Garamond"/>
-          <w:sz w:val="36"/>
-          <w:szCs w:val="36"/>
-        </w:rPr>
-      </w:pPr>
-      <w:r>
-        <w:rPr>
-          <w:rFonts w:ascii="Garamond" w:hAnsi="Garamond"/>
-          <w:sz w:val="36"/>
-          <w:szCs w:val="36"/>
-        </w:rPr>
-      </w:r>
-    </w:p>
-    <w:p>
-      <w:pPr>
-        <w:pStyle w:val="Normal"/>
-        <w:jc w:val="both"/>
-        <w:rPr>
-          <w:rFonts w:ascii="Garamond" w:hAnsi="Garamond"/>
-          <w:sz w:val="36"/>
-          <w:szCs w:val="36"/>
-        </w:rPr>
-      </w:pPr>
-      <w:r>
-        <w:rPr>
-          <w:rFonts w:ascii="Garamond" w:hAnsi="Garamond"/>
-          <w:sz w:val="36"/>
-          <w:szCs w:val="36"/>
-        </w:rPr>
-        <w:t xml:space="preserve">O Evangelho não diz exatamente onde Maria morava, nem onde ficava a casa de Zacarias e </w:t>
+        <w:t xml:space="preserve"> — mas de acordo com estudos históricos, acredita-se que Maria morava em Nazaré, na região da Galileia (norte de Israel) e Zacarias e </w:t>
       </w:r>
       <w:r>
         <w:rPr>
@@ -2175,63 +2698,71 @@
           <w:sz w:val="36"/>
           <w:szCs w:val="36"/>
         </w:rPr>
-        <w:t xml:space="preserve"> — mas de acordo com estudos históricos, acredita-se que Maria morava em Nazaré, na região da Galileia (norte de Israel) e Zacarias e </w:t>
-      </w:r>
-      <w:r>
-        <w:rPr>
-          <w:rFonts w:eastAsia="Arial" w:cs="Arial" w:ascii="Garamond" w:hAnsi="Garamond"/>
-          <w:color w:val="auto"/>
-          <w:kern w:val="0"/>
-          <w:sz w:val="36"/>
-          <w:szCs w:val="36"/>
-          <w:lang w:val="en-US" w:eastAsia="zh-CN" w:bidi="hi-IN"/>
-        </w:rPr>
-        <w:t>Elisabet</w:t>
-      </w:r>
-      <w:r>
-        <w:rPr>
-          <w:rFonts w:ascii="Garamond" w:hAnsi="Garamond"/>
-          <w:sz w:val="36"/>
-          <w:szCs w:val="36"/>
-        </w:rPr>
-        <w:t xml:space="preserve"> moravam em uma região montanhosa da Judeia, no sul do país, perto de Jerusalém. Provavelmente é a atual Ain Karim.</w:t>
-      </w:r>
-    </w:p>
-    <w:p>
-      <w:pPr>
-        <w:pStyle w:val="Normal"/>
-        <w:jc w:val="both"/>
-        <w:rPr>
-          <w:rFonts w:ascii="Garamond" w:hAnsi="Garamond"/>
-          <w:sz w:val="36"/>
-          <w:szCs w:val="36"/>
-        </w:rPr>
-      </w:pPr>
-      <w:r>
-        <w:rPr>
-          <w:rFonts w:ascii="Garamond" w:hAnsi="Garamond"/>
-          <w:sz w:val="36"/>
-          <w:szCs w:val="36"/>
-        </w:rPr>
-      </w:r>
-    </w:p>
-    <w:p>
-      <w:pPr>
-        <w:pStyle w:val="Normal"/>
-        <w:jc w:val="both"/>
-        <w:rPr>
-          <w:rFonts w:ascii="Garamond" w:hAnsi="Garamond"/>
-          <w:sz w:val="36"/>
-          <w:szCs w:val="36"/>
-        </w:rPr>
-      </w:pPr>
-      <w:r>
-        <w:rPr>
-          <w:rFonts w:ascii="Garamond" w:hAnsi="Garamond"/>
-          <w:sz w:val="36"/>
-          <w:szCs w:val="36"/>
-        </w:rPr>
-        <w:t>Assim, tomando-se como referência essas informações, estima-se que de Nazaré a Ain Karim, a distância aproximada seria de 130 km a 150 km.</w:t>
+        <w:t xml:space="preserve"> moravam em uma região montanhosa da Judeia, no sul do país, perto de Jerusalém. Provavelmente é </w:t>
+      </w:r>
+      <w:r>
+        <w:rPr>
+          <w:rFonts w:ascii="Garamond" w:hAnsi="Garamond"/>
+          <w:sz w:val="36"/>
+          <w:szCs w:val="36"/>
+        </w:rPr>
+        <w:t>onde se encontra hoje a cidade de</w:t>
+      </w:r>
+      <w:r>
+        <w:rPr>
+          <w:rFonts w:ascii="Garamond" w:hAnsi="Garamond"/>
+          <w:sz w:val="36"/>
+          <w:szCs w:val="36"/>
+        </w:rPr>
+        <w:t xml:space="preserve"> Ain Karim.</w:t>
+      </w:r>
+    </w:p>
+    <w:p>
+      <w:pPr>
+        <w:pStyle w:val="Normal"/>
+        <w:jc w:val="both"/>
+        <w:rPr>
+          <w:rFonts w:ascii="Garamond" w:hAnsi="Garamond"/>
+          <w:sz w:val="36"/>
+          <w:szCs w:val="36"/>
+        </w:rPr>
+      </w:pPr>
+      <w:r>
+        <w:rPr>
+          <w:rFonts w:ascii="Garamond" w:hAnsi="Garamond"/>
+          <w:sz w:val="36"/>
+          <w:szCs w:val="36"/>
+        </w:rPr>
+      </w:r>
+    </w:p>
+    <w:p>
+      <w:pPr>
+        <w:pStyle w:val="Normal"/>
+        <w:jc w:val="both"/>
+        <w:rPr>
+          <w:rFonts w:ascii="Garamond" w:hAnsi="Garamond"/>
+          <w:sz w:val="36"/>
+          <w:szCs w:val="36"/>
+        </w:rPr>
+      </w:pPr>
+      <w:r>
+        <w:rPr>
+          <w:rFonts w:eastAsia="Arial" w:cs="Arial" w:ascii="Garamond" w:hAnsi="Garamond"/>
+          <w:color w:val="auto"/>
+          <w:kern w:val="0"/>
+          <w:sz w:val="36"/>
+          <w:szCs w:val="36"/>
+          <w:lang w:val="en-US" w:eastAsia="zh-CN" w:bidi="hi-IN"/>
+        </w:rPr>
+        <w:t xml:space="preserve">Então, </w:t>
+      </w:r>
+      <w:r>
+        <w:rPr>
+          <w:rFonts w:ascii="Garamond" w:hAnsi="Garamond"/>
+          <w:sz w:val="36"/>
+          <w:szCs w:val="36"/>
+        </w:rPr>
+        <w:t>estima-se que de Nazaré a Ain Karim, a distância aproximada seria de 130 km a 150 km.</w:t>
       </w:r>
     </w:p>
     <w:p>
@@ -2480,124 +3011,66 @@
           <w:sz w:val="36"/>
           <w:szCs w:val="36"/>
         </w:rPr>
-        <w:t>Ou seja, foi uma viagem extremamente difícil — e o fato de ter sido feita "apressadamente", demonstra toda a coragem, o amor ao próximo e o espírito de serviço de Maria!</w:t>
-      </w:r>
-    </w:p>
-    <w:p>
-      <w:pPr>
-        <w:pStyle w:val="Normal"/>
-        <w:jc w:val="both"/>
-        <w:rPr>
-          <w:rFonts w:ascii="Garamond" w:hAnsi="Garamond"/>
-          <w:sz w:val="36"/>
-          <w:szCs w:val="36"/>
-        </w:rPr>
-      </w:pPr>
-      <w:r>
-        <w:rPr>
-          <w:rFonts w:ascii="Garamond" w:hAnsi="Garamond"/>
-          <w:sz w:val="36"/>
-          <w:szCs w:val="36"/>
-        </w:rPr>
-      </w:r>
-    </w:p>
-    <w:p>
-      <w:pPr>
-        <w:pStyle w:val="Normal"/>
-        <w:jc w:val="both"/>
-        <w:rPr>
-          <w:rFonts w:ascii="Garamond" w:hAnsi="Garamond"/>
-          <w:sz w:val="36"/>
-          <w:szCs w:val="36"/>
-        </w:rPr>
-      </w:pPr>
-      <w:r>
-        <w:rPr>
-          <w:rFonts w:ascii="Garamond" w:hAnsi="Garamond"/>
-          <w:sz w:val="36"/>
-          <w:szCs w:val="36"/>
-        </w:rPr>
-        <w:t>O esforço e sacrifício de Maria podem ser vistos como uma prefiguração de tudo que ela viveria depois como discípula de Jesus: sempre disponível, sempre servindo.</w:t>
-      </w:r>
-    </w:p>
-    <w:p>
-      <w:pPr>
-        <w:pStyle w:val="Normal"/>
-        <w:jc w:val="both"/>
-        <w:rPr>
-          <w:rFonts w:ascii="Garamond" w:hAnsi="Garamond"/>
-          <w:sz w:val="36"/>
-          <w:szCs w:val="36"/>
-        </w:rPr>
-      </w:pPr>
-      <w:r>
-        <w:rPr>
-          <w:rFonts w:ascii="Garamond" w:hAnsi="Garamond"/>
-          <w:sz w:val="36"/>
-          <w:szCs w:val="36"/>
-        </w:rPr>
-      </w:r>
-    </w:p>
-    <w:p>
-      <w:pPr>
-        <w:pStyle w:val="Normal"/>
-        <w:jc w:val="both"/>
-        <w:rPr>
-          <w:rFonts w:ascii="Garamond" w:hAnsi="Garamond"/>
-          <w:sz w:val="36"/>
-          <w:szCs w:val="36"/>
-        </w:rPr>
-      </w:pPr>
-      <w:r>
-        <w:rPr>
-          <w:rFonts w:eastAsia="Arial" w:cs="Arial" w:ascii="Garamond" w:hAnsi="Garamond"/>
-          <w:color w:val="auto"/>
-          <w:kern w:val="0"/>
-          <w:sz w:val="36"/>
-          <w:szCs w:val="36"/>
-          <w:lang w:val="en-US" w:eastAsia="zh-CN" w:bidi="hi-IN"/>
-        </w:rPr>
-        <w:t>Mais uma vez Maria demonstra humildade: apesar de carregar no ventre o Cristo de Deus, não se coloca acima da prima; coloca-se na mesma condição de Elisabet e vai visitá-la.</w:t>
-      </w:r>
-    </w:p>
-    <w:p>
-      <w:pPr>
-        <w:pStyle w:val="Normal"/>
-        <w:jc w:val="both"/>
-        <w:rPr>
-          <w:rFonts w:ascii="Garamond" w:hAnsi="Garamond"/>
-          <w:sz w:val="36"/>
-          <w:szCs w:val="36"/>
-        </w:rPr>
-      </w:pPr>
-      <w:r>
-        <w:rPr>
-          <w:rFonts w:ascii="Garamond" w:hAnsi="Garamond"/>
-          <w:sz w:val="36"/>
-          <w:szCs w:val="36"/>
-        </w:rPr>
-      </w:r>
-    </w:p>
-    <w:p>
-      <w:pPr>
-        <w:pStyle w:val="Normal"/>
-        <w:jc w:val="both"/>
-        <w:rPr>
-          <w:rFonts w:ascii="Garamond" w:hAnsi="Garamond"/>
-          <w:sz w:val="36"/>
-          <w:szCs w:val="36"/>
-        </w:rPr>
-      </w:pPr>
-      <w:r>
-        <w:rPr>
-          <w:rFonts w:eastAsia="Arial" w:cs="Arial" w:ascii="Garamond" w:hAnsi="Garamond"/>
-          <w:color w:val="auto"/>
-          <w:kern w:val="0"/>
-          <w:sz w:val="36"/>
-          <w:szCs w:val="36"/>
-          <w:lang w:val="en-US" w:eastAsia="zh-CN" w:bidi="hi-IN"/>
-        </w:rPr>
-        <w:t>Será que essa tem sido nossa postura? Conseguimos  abdicar de nossas conquistas materiais e espirituais que, verdade seja dita, são ainda muito pequenas, para nos colocarmos a serviço dos outros ou o orgulho ainda fala mais alto dentro de nós?</w:t>
+        <w:t xml:space="preserve">Como podemos ver, a viagem até a residência de Elisabet e Zacarias exigiu um enorme esforço e sacrifício de Maria, um prenúncio </w:t>
+      </w:r>
+      <w:r>
+        <w:rPr>
+          <w:rFonts w:ascii="Garamond" w:hAnsi="Garamond"/>
+          <w:sz w:val="36"/>
+          <w:szCs w:val="36"/>
+        </w:rPr>
+        <w:t>de tudo que ela viveria depois como discípula de Jesus: sempre disponível, sempre servindo.</w:t>
+      </w:r>
+    </w:p>
+    <w:p>
+      <w:pPr>
+        <w:pStyle w:val="Normal"/>
+        <w:jc w:val="both"/>
+        <w:rPr>
+          <w:rFonts w:ascii="Garamond" w:hAnsi="Garamond"/>
+          <w:sz w:val="36"/>
+          <w:szCs w:val="36"/>
+        </w:rPr>
+      </w:pPr>
+      <w:r>
+        <w:rPr>
+          <w:rFonts w:ascii="Garamond" w:hAnsi="Garamond"/>
+          <w:sz w:val="36"/>
+          <w:szCs w:val="36"/>
+        </w:rPr>
+      </w:r>
+    </w:p>
+    <w:p>
+      <w:pPr>
+        <w:pStyle w:val="Normal"/>
+        <w:jc w:val="both"/>
+        <w:rPr>
+          <w:rFonts w:ascii="Garamond" w:hAnsi="Garamond"/>
+          <w:sz w:val="36"/>
+          <w:szCs w:val="36"/>
+        </w:rPr>
+      </w:pPr>
+      <w:r>
+        <w:rPr>
+          <w:rFonts w:eastAsia="Arial" w:cs="Arial" w:ascii="Garamond" w:hAnsi="Garamond"/>
+          <w:color w:val="auto"/>
+          <w:kern w:val="0"/>
+          <w:sz w:val="36"/>
+          <w:szCs w:val="36"/>
+          <w:lang w:val="en-US" w:eastAsia="zh-CN" w:bidi="hi-IN"/>
+        </w:rPr>
+        <w:t>Nesse sentido, qual tem sido nossa postura diante da vida</w:t>
+      </w:r>
+      <w:r>
+        <w:rPr>
+          <w:rFonts w:eastAsia="Arial" w:cs="Arial" w:ascii="Garamond" w:hAnsi="Garamond"/>
+          <w:color w:val="auto"/>
+          <w:kern w:val="0"/>
+          <w:sz w:val="36"/>
+          <w:szCs w:val="36"/>
+          <w:lang w:val="en-US" w:eastAsia="zh-CN" w:bidi="hi-IN"/>
+        </w:rPr>
+        <w:t>? Conseguimos  abdicar de nossas conquistas materiais e espirituais que, verdade seja dita, são ainda muito pequenas, para nos colocarmos a serviço dos outros ou o orgulho ainda fala mais alto dentro de nós?</w:t>
       </w:r>
     </w:p>
     <w:p>
@@ -2652,24 +3125,6 @@
       </w:pPr>
       <w:r>
         <w:rPr>
-          <w:rFonts w:ascii="Garamond" w:hAnsi="Garamond"/>
-          <w:sz w:val="36"/>
-          <w:szCs w:val="36"/>
-        </w:rPr>
-      </w:r>
-    </w:p>
-    <w:p>
-      <w:pPr>
-        <w:pStyle w:val="Normal"/>
-        <w:jc w:val="both"/>
-        <w:rPr>
-          <w:rFonts w:ascii="Garamond" w:hAnsi="Garamond"/>
-          <w:sz w:val="36"/>
-          <w:szCs w:val="36"/>
-        </w:rPr>
-      </w:pPr>
-      <w:r>
-        <w:rPr>
           <w:rFonts w:eastAsia="Arial" w:cs="Arial" w:ascii="Garamond" w:hAnsi="Garamond"/>
           <w:color w:val="auto"/>
           <w:kern w:val="0"/>
@@ -2717,100 +3172,161 @@
           <w:szCs w:val="36"/>
           <w:lang w:val="en-US" w:eastAsia="zh-CN" w:bidi="hi-IN"/>
         </w:rPr>
-        <w:t>Nós, Espíritas, somos particularmente vulneráveis a esse tipo de erro. Como a Doutrina Espírita lança uma luz enorme em nossas vidas, é comum nós nos considerarmos melhores que os outros só porque temos mais conhecimento.</w:t>
-      </w:r>
-    </w:p>
-    <w:p>
-      <w:pPr>
-        <w:pStyle w:val="Normal"/>
-        <w:jc w:val="both"/>
-        <w:rPr>
-          <w:rFonts w:ascii="Garamond" w:hAnsi="Garamond"/>
-          <w:sz w:val="36"/>
-          <w:szCs w:val="36"/>
-        </w:rPr>
-      </w:pPr>
-      <w:r>
-        <w:rPr>
-          <w:rFonts w:ascii="Garamond" w:hAnsi="Garamond"/>
-          <w:sz w:val="36"/>
-          <w:szCs w:val="36"/>
-        </w:rPr>
-      </w:r>
-    </w:p>
-    <w:p>
-      <w:pPr>
-        <w:pStyle w:val="Normal"/>
-        <w:jc w:val="both"/>
-        <w:rPr>
-          <w:rFonts w:ascii="Garamond" w:hAnsi="Garamond"/>
-          <w:sz w:val="36"/>
-          <w:szCs w:val="36"/>
-        </w:rPr>
-      </w:pPr>
-      <w:r>
-        <w:rPr>
-          <w:rFonts w:ascii="Garamond" w:hAnsi="Garamond"/>
-          <w:sz w:val="36"/>
-          <w:szCs w:val="36"/>
-        </w:rPr>
-        <w:t xml:space="preserve">Com relação à empatia e sensibilidade, Maria compreende a situação de Isabel e se coloca à disposição sem </w:t>
-      </w:r>
-      <w:r>
-        <w:rPr>
-          <w:rFonts w:eastAsia="Arial" w:cs="Arial" w:ascii="Garamond" w:hAnsi="Garamond"/>
-          <w:color w:val="auto"/>
-          <w:kern w:val="0"/>
-          <w:sz w:val="36"/>
-          <w:szCs w:val="36"/>
-          <w:lang w:val="en-US" w:eastAsia="zh-CN" w:bidi="hi-IN"/>
-        </w:rPr>
-        <w:t>ter sido</w:t>
-      </w:r>
-      <w:r>
-        <w:rPr>
-          <w:rFonts w:ascii="Garamond" w:hAnsi="Garamond"/>
-          <w:sz w:val="36"/>
-          <w:szCs w:val="36"/>
-        </w:rPr>
-        <w:t xml:space="preserve"> chamada. Ela demonstra a empatia ativa: não apenas se solidariza, mas se move para estar presente e apoiar.</w:t>
-      </w:r>
-    </w:p>
-    <w:p>
-      <w:pPr>
-        <w:pStyle w:val="Normal"/>
-        <w:jc w:val="both"/>
-        <w:rPr>
-          <w:rFonts w:ascii="Garamond" w:hAnsi="Garamond"/>
-          <w:sz w:val="36"/>
-          <w:szCs w:val="36"/>
-        </w:rPr>
-      </w:pPr>
-      <w:r>
-        <w:rPr>
-          <w:rFonts w:ascii="Garamond" w:hAnsi="Garamond"/>
-          <w:sz w:val="36"/>
-          <w:szCs w:val="36"/>
-        </w:rPr>
-      </w:r>
-    </w:p>
-    <w:p>
-      <w:pPr>
-        <w:pStyle w:val="Normal"/>
-        <w:jc w:val="both"/>
-        <w:rPr>
-          <w:rFonts w:ascii="Garamond" w:hAnsi="Garamond"/>
-          <w:sz w:val="36"/>
-          <w:szCs w:val="36"/>
-        </w:rPr>
-      </w:pPr>
-      <w:r>
-        <w:rPr>
-          <w:rFonts w:ascii="Garamond" w:hAnsi="Garamond"/>
-          <w:sz w:val="36"/>
-          <w:szCs w:val="36"/>
-        </w:rPr>
-        <w:t xml:space="preserve">Nos dias de hoje há muito sofrimento na sociedade, mas há também muita gente pronta para </w:t>
+        <w:t xml:space="preserve">Nós, Espíritas, somos particularmente vulneráveis a esse tipo de erro. Como a Doutrina Espírita lança uma luz enorme em nossas vidas, é </w:t>
+      </w:r>
+      <w:r>
+        <w:rPr>
+          <w:rFonts w:eastAsia="Arial" w:cs="Arial" w:ascii="Garamond" w:hAnsi="Garamond"/>
+          <w:color w:val="auto"/>
+          <w:kern w:val="0"/>
+          <w:sz w:val="36"/>
+          <w:szCs w:val="36"/>
+          <w:lang w:val="en-US" w:eastAsia="zh-CN" w:bidi="hi-IN"/>
+        </w:rPr>
+        <w:t xml:space="preserve">muito </w:t>
+      </w:r>
+      <w:r>
+        <w:rPr>
+          <w:rFonts w:eastAsia="Arial" w:cs="Arial" w:ascii="Garamond" w:hAnsi="Garamond"/>
+          <w:color w:val="auto"/>
+          <w:kern w:val="0"/>
+          <w:sz w:val="36"/>
+          <w:szCs w:val="36"/>
+          <w:lang w:val="en-US" w:eastAsia="zh-CN" w:bidi="hi-IN"/>
+        </w:rPr>
+        <w:t xml:space="preserve">comum nós </w:t>
+      </w:r>
+      <w:r>
+        <w:rPr>
+          <w:rFonts w:eastAsia="Arial" w:cs="Arial" w:ascii="Garamond" w:hAnsi="Garamond"/>
+          <w:color w:val="auto"/>
+          <w:kern w:val="0"/>
+          <w:sz w:val="36"/>
+          <w:szCs w:val="36"/>
+          <w:lang w:val="en-US" w:eastAsia="zh-CN" w:bidi="hi-IN"/>
+        </w:rPr>
+        <w:t>criticarmos os outros por erros que, há bem pouco tempo, nós mesmos cometíamos.</w:t>
+      </w:r>
+    </w:p>
+    <w:p>
+      <w:pPr>
+        <w:pStyle w:val="Normal"/>
+        <w:jc w:val="both"/>
+        <w:rPr>
+          <w:rFonts w:ascii="Garamond" w:hAnsi="Garamond"/>
+          <w:sz w:val="36"/>
+          <w:szCs w:val="36"/>
+        </w:rPr>
+      </w:pPr>
+      <w:r>
+        <w:rPr/>
+      </w:r>
+    </w:p>
+    <w:p>
+      <w:pPr>
+        <w:pStyle w:val="Normal"/>
+        <w:jc w:val="both"/>
+        <w:rPr>
+          <w:rFonts w:ascii="Garamond" w:hAnsi="Garamond"/>
+          <w:sz w:val="36"/>
+          <w:szCs w:val="36"/>
+        </w:rPr>
+      </w:pPr>
+      <w:r>
+        <w:rPr>
+          <w:rFonts w:ascii="Garamond" w:hAnsi="Garamond"/>
+          <w:sz w:val="36"/>
+          <w:szCs w:val="36"/>
+        </w:rPr>
+        <w:t>E c</w:t>
+      </w:r>
+      <w:r>
+        <w:rPr>
+          <w:rFonts w:ascii="Garamond" w:hAnsi="Garamond"/>
+          <w:sz w:val="36"/>
+          <w:szCs w:val="36"/>
+        </w:rPr>
+        <w:t>om relação à empatia e sensibilidade</w:t>
+      </w:r>
+      <w:r>
+        <w:rPr>
+          <w:rFonts w:ascii="Garamond" w:hAnsi="Garamond"/>
+          <w:sz w:val="36"/>
+          <w:szCs w:val="36"/>
+        </w:rPr>
+        <w:t xml:space="preserve"> demonstradas por Maria? </w:t>
+      </w:r>
+      <w:r>
+        <w:rPr>
+          <w:rFonts w:eastAsia="Arial" w:cs="Arial" w:ascii="Garamond" w:hAnsi="Garamond"/>
+          <w:color w:val="auto"/>
+          <w:kern w:val="0"/>
+          <w:sz w:val="36"/>
+          <w:szCs w:val="36"/>
+          <w:lang w:val="en-US" w:eastAsia="zh-CN" w:bidi="hi-IN"/>
+        </w:rPr>
+        <w:t>T</w:t>
+      </w:r>
+      <w:r>
+        <w:rPr>
+          <w:rFonts w:ascii="Garamond" w:hAnsi="Garamond"/>
+          <w:sz w:val="36"/>
+          <w:szCs w:val="36"/>
+        </w:rPr>
+        <w:t xml:space="preserve">emos sido empáticos? Diante da dor do próximo, demonstramos boa vontade para acolher, compreender e consolar? </w:t>
+      </w:r>
+    </w:p>
+    <w:p>
+      <w:pPr>
+        <w:pStyle w:val="Normal"/>
+        <w:jc w:val="both"/>
+        <w:rPr>
+          <w:rFonts w:ascii="Garamond" w:hAnsi="Garamond"/>
+          <w:sz w:val="36"/>
+          <w:szCs w:val="36"/>
+        </w:rPr>
+      </w:pPr>
+      <w:r>
+        <w:rPr>
+          <w:rFonts w:ascii="Garamond" w:hAnsi="Garamond"/>
+          <w:sz w:val="36"/>
+          <w:szCs w:val="36"/>
+        </w:rPr>
+      </w:r>
+    </w:p>
+    <w:p>
+      <w:pPr>
+        <w:pStyle w:val="Normal"/>
+        <w:jc w:val="both"/>
+        <w:rPr>
+          <w:rFonts w:ascii="Garamond" w:hAnsi="Garamond"/>
+          <w:sz w:val="36"/>
+          <w:szCs w:val="36"/>
+        </w:rPr>
+      </w:pPr>
+      <w:r>
+        <w:rPr>
+          <w:rFonts w:ascii="Garamond" w:hAnsi="Garamond"/>
+          <w:sz w:val="36"/>
+          <w:szCs w:val="36"/>
+        </w:rPr>
+        <w:t>Nos dias de hoje há muito sofrimento na sociedade</w:t>
+      </w:r>
+      <w:r>
+        <w:rPr>
+          <w:rFonts w:ascii="Garamond" w:hAnsi="Garamond"/>
+          <w:sz w:val="36"/>
+          <w:szCs w:val="36"/>
+        </w:rPr>
+        <w:t xml:space="preserve"> e infelizmente existe também muita predisposição das pessoas</w:t>
+      </w:r>
+      <w:r>
+        <w:rPr>
+          <w:rFonts w:ascii="Garamond" w:hAnsi="Garamond"/>
+          <w:sz w:val="36"/>
+          <w:szCs w:val="36"/>
+        </w:rPr>
+        <w:t xml:space="preserve"> para </w:t>
       </w:r>
       <w:r>
         <w:rPr>
@@ -2866,100 +3382,34 @@
           <w:sz w:val="36"/>
           <w:szCs w:val="36"/>
         </w:rPr>
-        <w:t xml:space="preserve">Será que nós temos sido empáticos? Diante da dor do próximo, demonstramos boa vontade para acolher, compreender e consolar? </w:t>
-      </w:r>
-    </w:p>
-    <w:p>
-      <w:pPr>
-        <w:pStyle w:val="Normal"/>
-        <w:jc w:val="both"/>
-        <w:rPr>
-          <w:rFonts w:ascii="Garamond" w:hAnsi="Garamond"/>
-          <w:sz w:val="36"/>
-          <w:szCs w:val="36"/>
-        </w:rPr>
-      </w:pPr>
-      <w:r>
-        <w:rPr>
-          <w:rFonts w:ascii="Garamond" w:hAnsi="Garamond"/>
-          <w:sz w:val="36"/>
-          <w:szCs w:val="36"/>
-        </w:rPr>
-      </w:r>
-    </w:p>
-    <w:p>
-      <w:pPr>
-        <w:pStyle w:val="Normal"/>
-        <w:jc w:val="both"/>
-        <w:rPr>
-          <w:rFonts w:ascii="Garamond" w:hAnsi="Garamond"/>
-          <w:sz w:val="36"/>
-          <w:szCs w:val="36"/>
-        </w:rPr>
-      </w:pPr>
-      <w:r>
-        <w:rPr>
-          <w:rFonts w:ascii="Garamond" w:hAnsi="Garamond"/>
-          <w:sz w:val="36"/>
-          <w:szCs w:val="36"/>
-        </w:rPr>
-        <w:t>Kardec já nos disse: fora da caridade não há salvação. Colocarmo-nos no lugar do outro para compreender suas dificuldades, ainda que nós mesmos estejamos com problemas a despeito de nossas próprias dificuldades também é uma forma de caridade.</w:t>
-      </w:r>
-    </w:p>
-    <w:p>
-      <w:pPr>
-        <w:pStyle w:val="Normal"/>
-        <w:jc w:val="both"/>
-        <w:rPr>
-          <w:rFonts w:ascii="Garamond" w:hAnsi="Garamond"/>
-          <w:sz w:val="36"/>
-          <w:szCs w:val="36"/>
-        </w:rPr>
-      </w:pPr>
-      <w:r>
-        <w:rPr>
-          <w:rFonts w:ascii="Garamond" w:hAnsi="Garamond"/>
-          <w:sz w:val="36"/>
-          <w:szCs w:val="36"/>
-        </w:rPr>
-      </w:r>
-    </w:p>
-    <w:p>
-      <w:pPr>
-        <w:pStyle w:val="Normal"/>
-        <w:jc w:val="both"/>
-        <w:rPr>
-          <w:rFonts w:ascii="Garamond" w:hAnsi="Garamond"/>
-          <w:sz w:val="36"/>
-          <w:szCs w:val="36"/>
-        </w:rPr>
-      </w:pPr>
-      <w:r>
-        <w:rPr>
-          <w:rFonts w:ascii="Garamond" w:hAnsi="Garamond"/>
-          <w:sz w:val="36"/>
-          <w:szCs w:val="36"/>
-        </w:rPr>
-        <w:t xml:space="preserve">Procuremos sempre auxiliar e servir, ainda que nós mesmos </w:t>
-      </w:r>
-      <w:r>
-        <w:rPr>
-          <w:rFonts w:eastAsia="Arial" w:cs="Arial" w:ascii="Garamond" w:hAnsi="Garamond"/>
-          <w:color w:val="auto"/>
-          <w:kern w:val="0"/>
-          <w:sz w:val="36"/>
-          <w:szCs w:val="36"/>
-          <w:lang w:val="en-US" w:eastAsia="zh-CN" w:bidi="hi-IN"/>
-        </w:rPr>
-        <w:t>estejamos passando por dificuldades</w:t>
-      </w:r>
-      <w:r>
-        <w:rPr>
-          <w:rFonts w:ascii="Garamond" w:hAnsi="Garamond"/>
-          <w:sz w:val="36"/>
-          <w:szCs w:val="36"/>
-        </w:rPr>
-        <w:t>. Muitas vezes, na compreensão e no auxílio ao próximo, encontramos forças para solucionar nossos próprios problemas.</w:t>
+        <w:t xml:space="preserve">Kardec já nos disse: fora da caridade não há salvação. Colocarmo-nos no lugar do outro para compreender </w:t>
+      </w:r>
+      <w:r>
+        <w:rPr>
+          <w:rFonts w:ascii="Garamond" w:hAnsi="Garamond"/>
+          <w:sz w:val="36"/>
+          <w:szCs w:val="36"/>
+        </w:rPr>
+        <w:t xml:space="preserve">e, principalmente, ajudar também é uma forma de caridade, </w:t>
+      </w:r>
+      <w:r>
+        <w:rPr>
+          <w:rFonts w:eastAsia="Arial" w:cs="Arial" w:ascii="Garamond" w:hAnsi="Garamond"/>
+          <w:color w:val="auto"/>
+          <w:kern w:val="0"/>
+          <w:sz w:val="36"/>
+          <w:szCs w:val="36"/>
+          <w:lang w:val="en-US" w:eastAsia="zh-CN" w:bidi="hi-IN"/>
+        </w:rPr>
+        <w:t xml:space="preserve">mesmo que para isso </w:t>
+      </w:r>
+      <w:r>
+        <w:rPr>
+          <w:rFonts w:ascii="Garamond" w:hAnsi="Garamond"/>
+          <w:sz w:val="36"/>
+          <w:szCs w:val="36"/>
+        </w:rPr>
+        <w:t>precisemos esquecer momentaneamente de nossos próprios problemas.</w:t>
       </w:r>
     </w:p>
     <w:p>
@@ -3084,15 +3534,7 @@
           <w:sz w:val="36"/>
           <w:szCs w:val="36"/>
         </w:rPr>
-        <w:t xml:space="preserve">Nessa passagem destacamos a fé ou, se preferirem, </w:t>
-      </w:r>
-      <w:r>
-        <w:rPr>
-          <w:rFonts w:ascii="Garamond" w:hAnsi="Garamond"/>
-          <w:sz w:val="36"/>
-          <w:szCs w:val="36"/>
-        </w:rPr>
-        <w:t xml:space="preserve"> a confiança que </w:t>
+        <w:t xml:space="preserve">Nessa passagem destacamos a fé ou, se preferirem,  a confiança que </w:t>
       </w:r>
       <w:r>
         <w:rPr>
@@ -3399,51 +3841,7 @@
           <w:szCs w:val="36"/>
           <w:lang w:val="en-US" w:eastAsia="zh-CN" w:bidi="hi-IN"/>
         </w:rPr>
-        <w:t xml:space="preserve">E vejam: Maria orienta os servidores a seguirem as instruções de Jesus antes mesmo de saber </w:t>
-      </w:r>
-      <w:r>
-        <w:rPr>
-          <w:rFonts w:eastAsia="Arial" w:cs="Arial" w:ascii="Garamond" w:hAnsi="Garamond"/>
-          <w:color w:val="auto"/>
-          <w:kern w:val="0"/>
-          <w:sz w:val="36"/>
-          <w:szCs w:val="36"/>
-          <w:lang w:val="en-US" w:eastAsia="zh-CN" w:bidi="hi-IN"/>
-        </w:rPr>
-        <w:t>o que Ele faria</w:t>
-      </w:r>
-      <w:r>
-        <w:rPr>
-          <w:rFonts w:eastAsia="Arial" w:cs="Arial" w:ascii="Garamond" w:hAnsi="Garamond"/>
-          <w:color w:val="auto"/>
-          <w:kern w:val="0"/>
-          <w:sz w:val="36"/>
-          <w:szCs w:val="36"/>
-          <w:lang w:val="en-US" w:eastAsia="zh-CN" w:bidi="hi-IN"/>
-        </w:rPr>
-        <w:t xml:space="preserve">. Ela tinha plena confiança </w:t>
-      </w:r>
-      <w:r>
-        <w:rPr>
-          <w:rFonts w:eastAsia="Arial" w:cs="Arial" w:ascii="Garamond" w:hAnsi="Garamond"/>
-          <w:color w:val="auto"/>
-          <w:kern w:val="0"/>
-          <w:sz w:val="36"/>
-          <w:szCs w:val="36"/>
-          <w:lang w:val="en-US" w:eastAsia="zh-CN" w:bidi="hi-IN"/>
-        </w:rPr>
-        <w:t>no filho</w:t>
-      </w:r>
-      <w:r>
-        <w:rPr>
-          <w:rFonts w:eastAsia="Arial" w:cs="Arial" w:ascii="Garamond" w:hAnsi="Garamond"/>
-          <w:color w:val="auto"/>
-          <w:kern w:val="0"/>
-          <w:sz w:val="36"/>
-          <w:szCs w:val="36"/>
-          <w:lang w:val="en-US" w:eastAsia="zh-CN" w:bidi="hi-IN"/>
-        </w:rPr>
-        <w:t>. Não sabia como mas tinha certeza de que Ele resolveria o problema.</w:t>
+        <w:t>E vejam: Maria orienta os servidores a seguirem as instruções de Jesus antes mesmo de saber o que Ele faria. Ela tinha plena confiança no filho. Não sabia como mas tinha certeza de que Ele resolveria o problema.</w:t>
       </w:r>
     </w:p>
     <w:p>
@@ -3485,18 +3883,7 @@
           <w:szCs w:val="36"/>
           <w:lang w:val="en-US" w:eastAsia="zh-CN" w:bidi="hi-IN"/>
         </w:rPr>
-        <w:t xml:space="preserve">E quanto a nós? </w:t>
-      </w:r>
-      <w:r>
-        <w:rPr>
-          <w:rFonts w:eastAsia="Arial" w:cs="Arial" w:ascii="Garamond" w:hAnsi="Garamond"/>
-          <w:color w:val="auto"/>
-          <w:kern w:val="0"/>
-          <w:sz w:val="36"/>
-          <w:szCs w:val="36"/>
-          <w:lang w:val="en-US" w:eastAsia="zh-CN" w:bidi="hi-IN"/>
-        </w:rPr>
-        <w:t>Sabemos de fato ouvir, obedecer e confiar em Jesus? Se fizemos um exame de consciência verdadeiro veremos que ainda não. É algo que precisamos exercitar muito ainda.</w:t>
+        <w:t>E quanto a nós? Sabemos de fato ouvir, obedecer e confiar em Jesus? Se fizermos um exame de consciência verdadeiro veremos que ainda não. É algo que precisamos exercitar muito ainda.</w:t>
       </w:r>
     </w:p>
     <w:p>
@@ -3555,7 +3942,56 @@
         </w:rPr>
       </w:pPr>
       <w:r>
+        <w:rPr>
+          <w:rFonts w:eastAsia="Arial" w:cs="Arial" w:ascii="Garamond" w:hAnsi="Garamond"/>
+          <w:color w:val="auto"/>
+          <w:kern w:val="0"/>
+          <w:sz w:val="36"/>
+          <w:szCs w:val="36"/>
+          <w:lang w:val="en-US" w:eastAsia="zh-CN" w:bidi="hi-IN"/>
+        </w:rPr>
+      </w:r>
+    </w:p>
+    <w:p>
+      <w:pPr>
+        <w:pStyle w:val="Normal"/>
+        <w:jc w:val="both"/>
         <w:rPr/>
+      </w:pPr>
+      <w:r>
+        <w:rPr>
+          <w:rFonts w:eastAsia="Arial" w:cs="Arial" w:ascii="Garamond" w:hAnsi="Garamond"/>
+          <w:color w:val="auto"/>
+          <w:kern w:val="0"/>
+          <w:sz w:val="36"/>
+          <w:szCs w:val="36"/>
+          <w:lang w:val="en-US" w:eastAsia="zh-CN" w:bidi="hi-IN"/>
+        </w:rPr>
+        <w:t>Qual será nosso grau de confiança em Jesus hoje, depois de tudo o que temos aprendido, principalmente sob a luz da Doutrina Espírita?</w:t>
+      </w:r>
+    </w:p>
+    <w:p>
+      <w:pPr>
+        <w:pStyle w:val="Normal"/>
+        <w:jc w:val="both"/>
+        <w:rPr>
+          <w:rFonts w:ascii="Garamond" w:hAnsi="Garamond" w:eastAsia="Arial" w:cs="Arial"/>
+          <w:color w:val="auto"/>
+          <w:kern w:val="0"/>
+          <w:sz w:val="36"/>
+          <w:szCs w:val="36"/>
+          <w:lang w:val="en-US" w:eastAsia="zh-CN" w:bidi="hi-IN"/>
+        </w:rPr>
+      </w:pPr>
+      <w:r>
+        <w:rPr>
+          <w:rFonts w:eastAsia="Arial" w:cs="Arial" w:ascii="Garamond" w:hAnsi="Garamond"/>
+          <w:color w:val="auto"/>
+          <w:kern w:val="0"/>
+          <w:sz w:val="36"/>
+          <w:szCs w:val="36"/>
+          <w:lang w:val="en-US" w:eastAsia="zh-CN" w:bidi="hi-IN"/>
+        </w:rPr>
       </w:r>
     </w:p>
     <w:p>
@@ -3573,7 +4009,18 @@
           <w:szCs w:val="36"/>
           <w:lang w:val="en-US" w:eastAsia="zh-CN" w:bidi="hi-IN"/>
         </w:rPr>
-        <w:t>Qual será nosso grau de confiança em Jesus hoje, depois de tudo o que temos aprendido com o Mestre, principalmente sob a luz da Doutrina Espírita?</w:t>
+        <w:t>Somos</w:t>
+      </w:r>
+      <w:r>
+        <w:rPr>
+          <w:rFonts w:eastAsia="Arial" w:cs="Arial" w:ascii="Garamond" w:hAnsi="Garamond"/>
+          <w:color w:val="auto"/>
+          <w:kern w:val="0"/>
+          <w:sz w:val="36"/>
+          <w:szCs w:val="36"/>
+          <w:lang w:val="en-US" w:eastAsia="zh-CN" w:bidi="hi-IN"/>
+        </w:rPr>
+        <w:t xml:space="preserve"> servidores fiéis que fazem o que o Mestre nos recomenda tendo a certeza de que o resultado será o melhor? Certamente que ainda não.</w:t>
       </w:r>
     </w:p>
     <w:p>
@@ -3590,7 +4037,56 @@
         </w:rPr>
       </w:pPr>
       <w:r>
+        <w:rPr>
+          <w:rFonts w:eastAsia="Arial" w:cs="Arial" w:ascii="Garamond" w:hAnsi="Garamond"/>
+          <w:color w:val="auto"/>
+          <w:kern w:val="0"/>
+          <w:sz w:val="36"/>
+          <w:szCs w:val="36"/>
+          <w:lang w:val="en-US" w:eastAsia="zh-CN" w:bidi="hi-IN"/>
+        </w:rPr>
+      </w:r>
+    </w:p>
+    <w:p>
+      <w:pPr>
+        <w:pStyle w:val="Normal"/>
+        <w:jc w:val="both"/>
         <w:rPr/>
+      </w:pPr>
+      <w:r>
+        <w:rPr>
+          <w:rFonts w:eastAsia="Arial" w:cs="Arial" w:ascii="Garamond" w:hAnsi="Garamond"/>
+          <w:color w:val="auto"/>
+          <w:kern w:val="0"/>
+          <w:sz w:val="36"/>
+          <w:szCs w:val="36"/>
+          <w:lang w:val="en-US" w:eastAsia="zh-CN" w:bidi="hi-IN"/>
+        </w:rPr>
+        <w:t>Vamos dar um exemplo simples: muitos de nós já colocamos na urna ou no livro de irradiação aqui da FEIG nomes de familiares ou amigos queridos que estavam enfermos.</w:t>
+      </w:r>
+    </w:p>
+    <w:p>
+      <w:pPr>
+        <w:pStyle w:val="Normal"/>
+        <w:jc w:val="both"/>
+        <w:rPr>
+          <w:rFonts w:ascii="Garamond" w:hAnsi="Garamond" w:eastAsia="Arial" w:cs="Arial"/>
+          <w:color w:val="auto"/>
+          <w:kern w:val="0"/>
+          <w:sz w:val="36"/>
+          <w:szCs w:val="36"/>
+          <w:lang w:val="en-US" w:eastAsia="zh-CN" w:bidi="hi-IN"/>
+        </w:rPr>
+      </w:pPr>
+      <w:r>
+        <w:rPr>
+          <w:rFonts w:eastAsia="Arial" w:cs="Arial" w:ascii="Garamond" w:hAnsi="Garamond"/>
+          <w:color w:val="auto"/>
+          <w:kern w:val="0"/>
+          <w:sz w:val="36"/>
+          <w:szCs w:val="36"/>
+          <w:lang w:val="en-US" w:eastAsia="zh-CN" w:bidi="hi-IN"/>
+        </w:rPr>
       </w:r>
     </w:p>
     <w:p>
@@ -3608,7 +4104,161 @@
           <w:szCs w:val="36"/>
           <w:lang w:val="en-US" w:eastAsia="zh-CN" w:bidi="hi-IN"/>
         </w:rPr>
-        <w:t>Já somos os servidores fiéis que fazem o que o Mestre nos recomenda tendo a certeza de que o resultado será o melhor? Certamente que ainda não.</w:t>
+        <w:t xml:space="preserve">Nós fazemos isso na incerteza do que acontecerá. Mas a incerteza não é nosso </w:t>
+      </w:r>
+      <w:r>
+        <w:rPr>
+          <w:rFonts w:eastAsia="Arial" w:cs="Arial" w:ascii="Garamond" w:hAnsi="Garamond"/>
+          <w:color w:val="auto"/>
+          <w:kern w:val="0"/>
+          <w:sz w:val="36"/>
+          <w:szCs w:val="36"/>
+          <w:lang w:val="en-US" w:eastAsia="zh-CN" w:bidi="hi-IN"/>
+        </w:rPr>
+        <w:t xml:space="preserve">maior </w:t>
+      </w:r>
+      <w:r>
+        <w:rPr>
+          <w:rFonts w:eastAsia="Arial" w:cs="Arial" w:ascii="Garamond" w:hAnsi="Garamond"/>
+          <w:color w:val="auto"/>
+          <w:kern w:val="0"/>
+          <w:sz w:val="36"/>
+          <w:szCs w:val="36"/>
+          <w:lang w:val="en-US" w:eastAsia="zh-CN" w:bidi="hi-IN"/>
+        </w:rPr>
+        <w:t>problema.</w:t>
+      </w:r>
+      <w:r>
+        <w:rPr>
+          <w:rFonts w:eastAsia="Arial" w:cs="Arial" w:ascii="Garamond" w:hAnsi="Garamond"/>
+          <w:color w:val="auto"/>
+          <w:kern w:val="0"/>
+          <w:sz w:val="36"/>
+          <w:szCs w:val="36"/>
+          <w:lang w:val="en-US" w:eastAsia="zh-CN" w:bidi="hi-IN"/>
+        </w:rPr>
+        <w:t xml:space="preserve"> </w:t>
+      </w:r>
+      <w:r>
+        <w:rPr>
+          <w:rFonts w:eastAsia="Arial" w:cs="Arial" w:ascii="Garamond" w:hAnsi="Garamond"/>
+          <w:color w:val="auto"/>
+          <w:kern w:val="0"/>
+          <w:sz w:val="36"/>
+          <w:szCs w:val="36"/>
+          <w:lang w:val="en-US" w:eastAsia="zh-CN" w:bidi="hi-IN"/>
+        </w:rPr>
+        <w:t>Afinal de contas</w:t>
+      </w:r>
+      <w:r>
+        <w:rPr>
+          <w:rFonts w:eastAsia="Arial" w:cs="Arial" w:ascii="Garamond" w:hAnsi="Garamond"/>
+          <w:color w:val="auto"/>
+          <w:kern w:val="0"/>
+          <w:sz w:val="36"/>
+          <w:szCs w:val="36"/>
+          <w:lang w:val="en-US" w:eastAsia="zh-CN" w:bidi="hi-IN"/>
+        </w:rPr>
+        <w:t>,</w:t>
+      </w:r>
+      <w:r>
+        <w:rPr>
+          <w:rFonts w:eastAsia="Arial" w:cs="Arial" w:ascii="Garamond" w:hAnsi="Garamond"/>
+          <w:color w:val="auto"/>
+          <w:kern w:val="0"/>
+          <w:sz w:val="36"/>
+          <w:szCs w:val="36"/>
+          <w:lang w:val="en-US" w:eastAsia="zh-CN" w:bidi="hi-IN"/>
+        </w:rPr>
+        <w:t xml:space="preserve"> </w:t>
+      </w:r>
+      <w:r>
+        <w:rPr>
+          <w:rFonts w:eastAsia="Arial" w:cs="Arial" w:ascii="Garamond" w:hAnsi="Garamond"/>
+          <w:color w:val="auto"/>
+          <w:kern w:val="0"/>
+          <w:sz w:val="36"/>
+          <w:szCs w:val="36"/>
+          <w:lang w:val="en-US" w:eastAsia="zh-CN" w:bidi="hi-IN"/>
+        </w:rPr>
+        <w:t xml:space="preserve">não há como sabermos </w:t>
+      </w:r>
+      <w:r>
+        <w:rPr>
+          <w:rFonts w:eastAsia="Arial" w:cs="Arial" w:ascii="Garamond" w:hAnsi="Garamond"/>
+          <w:color w:val="auto"/>
+          <w:kern w:val="0"/>
+          <w:sz w:val="36"/>
+          <w:szCs w:val="36"/>
+          <w:lang w:val="en-US" w:eastAsia="zh-CN" w:bidi="hi-IN"/>
+        </w:rPr>
+        <w:t xml:space="preserve">de antemão se a pessoa será curada ou não.  Nosso grande problema é que não confiamos plenamente </w:t>
+      </w:r>
+      <w:r>
+        <w:rPr>
+          <w:rFonts w:eastAsia="Arial" w:cs="Arial" w:ascii="Garamond" w:hAnsi="Garamond"/>
+          <w:color w:val="auto"/>
+          <w:kern w:val="0"/>
+          <w:sz w:val="36"/>
+          <w:szCs w:val="36"/>
+          <w:lang w:val="en-US" w:eastAsia="zh-CN" w:bidi="hi-IN"/>
+        </w:rPr>
+        <w:t>na resposta que</w:t>
+      </w:r>
+      <w:r>
+        <w:rPr>
+          <w:rFonts w:eastAsia="Arial" w:cs="Arial" w:ascii="Garamond" w:hAnsi="Garamond"/>
+          <w:color w:val="auto"/>
+          <w:kern w:val="0"/>
+          <w:sz w:val="36"/>
+          <w:szCs w:val="36"/>
+          <w:lang w:val="en-US" w:eastAsia="zh-CN" w:bidi="hi-IN"/>
+        </w:rPr>
+        <w:t xml:space="preserve"> Jesus </w:t>
+      </w:r>
+      <w:r>
+        <w:rPr>
+          <w:rFonts w:eastAsia="Arial" w:cs="Arial" w:ascii="Garamond" w:hAnsi="Garamond"/>
+          <w:color w:val="auto"/>
+          <w:kern w:val="0"/>
+          <w:sz w:val="36"/>
+          <w:szCs w:val="36"/>
+          <w:lang w:val="en-US" w:eastAsia="zh-CN" w:bidi="hi-IN"/>
+        </w:rPr>
+        <w:t>d</w:t>
+      </w:r>
+      <w:r>
+        <w:rPr>
+          <w:rFonts w:eastAsia="Arial" w:cs="Arial" w:ascii="Garamond" w:hAnsi="Garamond"/>
+          <w:color w:val="auto"/>
+          <w:kern w:val="0"/>
+          <w:sz w:val="36"/>
+          <w:szCs w:val="36"/>
+          <w:lang w:val="en-US" w:eastAsia="zh-CN" w:bidi="hi-IN"/>
+        </w:rPr>
+        <w:t xml:space="preserve">ará </w:t>
+      </w:r>
+      <w:r>
+        <w:rPr>
+          <w:rFonts w:eastAsia="Arial" w:cs="Arial" w:ascii="Garamond" w:hAnsi="Garamond"/>
+          <w:color w:val="auto"/>
+          <w:kern w:val="0"/>
+          <w:sz w:val="36"/>
+          <w:szCs w:val="36"/>
+          <w:lang w:val="en-US" w:eastAsia="zh-CN" w:bidi="hi-IN"/>
+        </w:rPr>
+        <w:t>ao pedido de ajuda que fizemos</w:t>
+      </w:r>
+      <w:r>
+        <w:rPr>
+          <w:rFonts w:eastAsia="Arial" w:cs="Arial" w:ascii="Garamond" w:hAnsi="Garamond"/>
+          <w:color w:val="auto"/>
+          <w:kern w:val="0"/>
+          <w:sz w:val="36"/>
+          <w:szCs w:val="36"/>
+          <w:lang w:val="en-US" w:eastAsia="zh-CN" w:bidi="hi-IN"/>
+        </w:rPr>
+        <w:t xml:space="preserve">. </w:t>
       </w:r>
     </w:p>
     <w:p>
@@ -3625,7 +4275,122 @@
         </w:rPr>
       </w:pPr>
       <w:r>
+        <w:rPr>
+          <w:rFonts w:eastAsia="Arial" w:cs="Arial" w:ascii="Garamond" w:hAnsi="Garamond"/>
+          <w:color w:val="auto"/>
+          <w:kern w:val="0"/>
+          <w:sz w:val="36"/>
+          <w:szCs w:val="36"/>
+          <w:lang w:val="en-US" w:eastAsia="zh-CN" w:bidi="hi-IN"/>
+        </w:rPr>
+      </w:r>
+    </w:p>
+    <w:p>
+      <w:pPr>
+        <w:pStyle w:val="Normal"/>
+        <w:jc w:val="both"/>
         <w:rPr/>
+      </w:pPr>
+      <w:r>
+        <w:rPr>
+          <w:rFonts w:eastAsia="Arial" w:cs="Arial" w:ascii="Garamond" w:hAnsi="Garamond"/>
+          <w:color w:val="auto"/>
+          <w:kern w:val="0"/>
+          <w:sz w:val="36"/>
+          <w:szCs w:val="36"/>
+          <w:lang w:val="en-US" w:eastAsia="zh-CN" w:bidi="hi-IN"/>
+        </w:rPr>
+        <w:t xml:space="preserve">No fundo o meu desejo é que Jesus permita que a pessoa seja curada: se for assim então eu confio plenamente </w:t>
+      </w:r>
+      <w:r>
+        <w:rPr>
+          <w:rFonts w:eastAsia="Arial" w:cs="Arial" w:ascii="Garamond" w:hAnsi="Garamond"/>
+          <w:color w:val="auto"/>
+          <w:kern w:val="0"/>
+          <w:sz w:val="36"/>
+          <w:szCs w:val="36"/>
+          <w:lang w:val="en-US" w:eastAsia="zh-CN" w:bidi="hi-IN"/>
+        </w:rPr>
+        <w:t>n'Ele</w:t>
+      </w:r>
+      <w:r>
+        <w:rPr>
+          <w:rFonts w:eastAsia="Arial" w:cs="Arial" w:ascii="Garamond" w:hAnsi="Garamond"/>
+          <w:color w:val="auto"/>
+          <w:kern w:val="0"/>
+          <w:sz w:val="36"/>
+          <w:szCs w:val="36"/>
+          <w:lang w:val="en-US" w:eastAsia="zh-CN" w:bidi="hi-IN"/>
+        </w:rPr>
+        <w:t>. Mas</w:t>
+      </w:r>
+      <w:r>
+        <w:rPr>
+          <w:rFonts w:eastAsia="Arial" w:cs="Arial" w:ascii="Garamond" w:hAnsi="Garamond"/>
+          <w:color w:val="auto"/>
+          <w:kern w:val="0"/>
+          <w:sz w:val="36"/>
+          <w:szCs w:val="36"/>
+          <w:lang w:val="en-US" w:eastAsia="zh-CN" w:bidi="hi-IN"/>
+        </w:rPr>
+        <w:t xml:space="preserve">, </w:t>
+      </w:r>
+      <w:r>
+        <w:rPr>
+          <w:rFonts w:eastAsia="Arial" w:cs="Arial" w:ascii="Garamond" w:hAnsi="Garamond"/>
+          <w:color w:val="auto"/>
+          <w:kern w:val="0"/>
+          <w:sz w:val="36"/>
+          <w:szCs w:val="36"/>
+          <w:lang w:val="en-US" w:eastAsia="zh-CN" w:bidi="hi-IN"/>
+        </w:rPr>
+        <w:t>se a doença persistir, se agravar ou se a pessoa vier a desencarnar</w:t>
+      </w:r>
+      <w:r>
+        <w:rPr>
+          <w:rFonts w:eastAsia="Arial" w:cs="Arial" w:ascii="Garamond" w:hAnsi="Garamond"/>
+          <w:color w:val="auto"/>
+          <w:kern w:val="0"/>
+          <w:sz w:val="36"/>
+          <w:szCs w:val="36"/>
+          <w:lang w:val="en-US" w:eastAsia="zh-CN" w:bidi="hi-IN"/>
+        </w:rPr>
+        <w:t xml:space="preserve">, </w:t>
+      </w:r>
+      <w:r>
+        <w:rPr>
+          <w:rFonts w:eastAsia="Arial" w:cs="Arial" w:ascii="Garamond" w:hAnsi="Garamond"/>
+          <w:color w:val="auto"/>
+          <w:kern w:val="0"/>
+          <w:sz w:val="36"/>
+          <w:szCs w:val="36"/>
+          <w:lang w:val="en-US" w:eastAsia="zh-CN" w:bidi="hi-IN"/>
+        </w:rPr>
+        <w:t xml:space="preserve">minha confiança fica abalada. </w:t>
+      </w:r>
+    </w:p>
+    <w:p>
+      <w:pPr>
+        <w:pStyle w:val="Normal"/>
+        <w:jc w:val="both"/>
+        <w:rPr>
+          <w:rFonts w:ascii="Garamond" w:hAnsi="Garamond" w:eastAsia="Arial" w:cs="Arial"/>
+          <w:color w:val="auto"/>
+          <w:kern w:val="0"/>
+          <w:sz w:val="36"/>
+          <w:szCs w:val="36"/>
+          <w:lang w:val="en-US" w:eastAsia="zh-CN" w:bidi="hi-IN"/>
+        </w:rPr>
+      </w:pPr>
+      <w:r>
+        <w:rPr>
+          <w:rFonts w:eastAsia="Arial" w:cs="Arial" w:ascii="Garamond" w:hAnsi="Garamond"/>
+          <w:color w:val="auto"/>
+          <w:kern w:val="0"/>
+          <w:sz w:val="36"/>
+          <w:szCs w:val="36"/>
+          <w:lang w:val="en-US" w:eastAsia="zh-CN" w:bidi="hi-IN"/>
+        </w:rPr>
       </w:r>
     </w:p>
     <w:p>
@@ -3643,156 +4408,18 @@
           <w:szCs w:val="36"/>
           <w:lang w:val="en-US" w:eastAsia="zh-CN" w:bidi="hi-IN"/>
         </w:rPr>
-        <w:t>Vamos dar um exemplo simples: muitos de nós já colocamos na urna ou no livro de irradiação aqui da FEIG nomes de familiares ou amigos queridos que estavam enfermos.</w:t>
-      </w:r>
-    </w:p>
-    <w:p>
-      <w:pPr>
-        <w:pStyle w:val="Normal"/>
-        <w:jc w:val="both"/>
-        <w:rPr>
-          <w:rFonts w:ascii="Garamond" w:hAnsi="Garamond" w:eastAsia="Arial" w:cs="Arial"/>
-          <w:color w:val="auto"/>
-          <w:kern w:val="0"/>
-          <w:sz w:val="36"/>
-          <w:szCs w:val="36"/>
-          <w:lang w:val="en-US" w:eastAsia="zh-CN" w:bidi="hi-IN"/>
-        </w:rPr>
-      </w:pPr>
-      <w:r>
-        <w:rPr/>
-      </w:r>
-    </w:p>
-    <w:p>
-      <w:pPr>
-        <w:pStyle w:val="Normal"/>
-        <w:jc w:val="both"/>
-        <w:rPr/>
-      </w:pPr>
-      <w:r>
-        <w:rPr>
-          <w:rFonts w:eastAsia="Arial" w:cs="Arial" w:ascii="Garamond" w:hAnsi="Garamond"/>
-          <w:color w:val="auto"/>
-          <w:kern w:val="0"/>
-          <w:sz w:val="36"/>
-          <w:szCs w:val="36"/>
-          <w:lang w:val="en-US" w:eastAsia="zh-CN" w:bidi="hi-IN"/>
-        </w:rPr>
-        <w:t xml:space="preserve">Nós fazemos isso na incerteza do que acontecerá. Afinal de contas não sabemos de antemão se a pessoa será curada ou não. Mas a incerteza não é nosso problema. Nosso grande problema é que não confiamos plenamente no que Jesus fará a respeito da saúde daquele familiar ou amigo. </w:t>
-      </w:r>
-    </w:p>
-    <w:p>
-      <w:pPr>
-        <w:pStyle w:val="Normal"/>
-        <w:jc w:val="both"/>
-        <w:rPr>
-          <w:rFonts w:ascii="Garamond" w:hAnsi="Garamond" w:eastAsia="Arial" w:cs="Arial"/>
-          <w:color w:val="auto"/>
-          <w:kern w:val="0"/>
-          <w:sz w:val="36"/>
-          <w:szCs w:val="36"/>
-          <w:lang w:val="en-US" w:eastAsia="zh-CN" w:bidi="hi-IN"/>
-        </w:rPr>
-      </w:pPr>
-      <w:r>
-        <w:rPr/>
-      </w:r>
-    </w:p>
-    <w:p>
-      <w:pPr>
-        <w:pStyle w:val="Normal"/>
-        <w:jc w:val="both"/>
-        <w:rPr/>
-      </w:pPr>
-      <w:r>
-        <w:rPr>
-          <w:rFonts w:eastAsia="Arial" w:cs="Arial" w:ascii="Garamond" w:hAnsi="Garamond"/>
-          <w:color w:val="auto"/>
-          <w:kern w:val="0"/>
-          <w:sz w:val="36"/>
-          <w:szCs w:val="36"/>
-          <w:lang w:val="en-US" w:eastAsia="zh-CN" w:bidi="hi-IN"/>
-        </w:rPr>
-        <w:t xml:space="preserve">No fundo o meu desejo é que Jesus permita que a pessoa seja curada: se for assim então eu confio plenamente em Jesus. Mas e se a doença persistir, se agravar ou se a pessoa vier a desencarnar? Aí minha confiança fica abalada. </w:t>
-      </w:r>
-    </w:p>
-    <w:p>
-      <w:pPr>
-        <w:pStyle w:val="Normal"/>
-        <w:jc w:val="both"/>
-        <w:rPr>
-          <w:rFonts w:ascii="Garamond" w:hAnsi="Garamond" w:eastAsia="Arial" w:cs="Arial"/>
-          <w:color w:val="auto"/>
-          <w:kern w:val="0"/>
-          <w:sz w:val="36"/>
-          <w:szCs w:val="36"/>
-          <w:lang w:val="en-US" w:eastAsia="zh-CN" w:bidi="hi-IN"/>
-        </w:rPr>
-      </w:pPr>
-      <w:r>
-        <w:rPr/>
-      </w:r>
-    </w:p>
-    <w:p>
-      <w:pPr>
-        <w:pStyle w:val="Normal"/>
-        <w:jc w:val="both"/>
-        <w:rPr/>
-      </w:pPr>
-      <w:r>
-        <w:rPr>
-          <w:rFonts w:eastAsia="Arial" w:cs="Arial" w:ascii="Garamond" w:hAnsi="Garamond"/>
-          <w:color w:val="auto"/>
-          <w:kern w:val="0"/>
-          <w:sz w:val="36"/>
-          <w:szCs w:val="36"/>
-          <w:lang w:val="en-US" w:eastAsia="zh-CN" w:bidi="hi-IN"/>
-        </w:rPr>
-        <w:t>No nosso atual estágio evolutivo, o</w:t>
-      </w:r>
-      <w:r>
-        <w:rPr>
-          <w:rFonts w:eastAsia="Arial" w:cs="Arial" w:ascii="Garamond" w:hAnsi="Garamond"/>
-          <w:color w:val="auto"/>
-          <w:kern w:val="0"/>
-          <w:sz w:val="36"/>
-          <w:szCs w:val="36"/>
-          <w:lang w:val="en-US" w:eastAsia="zh-CN" w:bidi="hi-IN"/>
-        </w:rPr>
-        <w:t xml:space="preserve">bedecer e confiar em Jesus ainda é um aprendizado em construção. </w:t>
-      </w:r>
-      <w:r>
-        <w:rPr>
-          <w:rFonts w:eastAsia="Arial" w:cs="Arial" w:ascii="Garamond" w:hAnsi="Garamond"/>
-          <w:color w:val="auto"/>
-          <w:kern w:val="0"/>
-          <w:sz w:val="36"/>
-          <w:szCs w:val="36"/>
-          <w:lang w:val="en-US" w:eastAsia="zh-CN" w:bidi="hi-IN"/>
-        </w:rPr>
-        <w:t xml:space="preserve">Um trabalho </w:t>
-      </w:r>
-      <w:r>
-        <w:rPr>
-          <w:rFonts w:eastAsia="Arial" w:cs="Arial" w:ascii="Garamond" w:hAnsi="Garamond"/>
-          <w:color w:val="auto"/>
-          <w:kern w:val="0"/>
-          <w:sz w:val="36"/>
-          <w:szCs w:val="36"/>
-          <w:lang w:val="en-US" w:eastAsia="zh-CN" w:bidi="hi-IN"/>
-        </w:rPr>
-        <w:t>que exige esforço, vigilância e fé constantes</w:t>
-      </w:r>
-      <w:r>
-        <w:rPr>
-          <w:rFonts w:eastAsia="Arial" w:cs="Arial" w:ascii="Garamond" w:hAnsi="Garamond"/>
-          <w:color w:val="auto"/>
-          <w:kern w:val="0"/>
-          <w:sz w:val="36"/>
-          <w:szCs w:val="36"/>
-          <w:lang w:val="en-US" w:eastAsia="zh-CN" w:bidi="hi-IN"/>
-        </w:rPr>
-        <w:t>. Um trabalho longo que, se ainda não se iniciou, precisa começar hoje.</w:t>
+        <w:t>No nosso atual estágio evolutivo, obedecer e confiar em Jesus ainda é um aprendizado em construção. Um trabalho que exige esforço, vigilância e fé constantes. Um trabalho longo que, se ainda não se iniciou, precisa começar hoje.</w:t>
+      </w:r>
+      <w:r>
+        <w:rPr>
+          <w:rFonts w:eastAsia="Arial" w:cs="Arial" w:ascii="Garamond" w:hAnsi="Garamond"/>
+          <w:color w:val="auto"/>
+          <w:kern w:val="0"/>
+          <w:sz w:val="36"/>
+          <w:szCs w:val="36"/>
+          <w:lang w:val="en-US" w:eastAsia="zh-CN" w:bidi="hi-IN"/>
+        </w:rPr>
+        <w:t xml:space="preserve"> &lt;&lt;&lt; Reescrever esse parágrafo &gt;&gt;&gt;</w:t>
       </w:r>
     </w:p>
     <w:p>

</xml_diff>

<commit_message>
11/05/2025 - 21:52 h
</commit_message>
<xml_diff>
--- a/Maria de Nazaré e a disposição em servir/Maria de Nazaré e a disposição em servir.docx
+++ b/Maria de Nazaré e a disposição em servir/Maria de Nazaré e a disposição em servir.docx
@@ -745,82 +745,44 @@
           <w:szCs w:val="36"/>
           <w:lang w:val="en-US" w:eastAsia="zh-CN" w:bidi="hi-IN"/>
         </w:rPr>
-        <w:t xml:space="preserve">Vocês sabiam que Maria de Nazaré é mencionada cerca de 40 vezes no Alcorão, a bíblia sagrada do Islã, a religião dos mulçumanos? E que ela é considerada a maior de todas as mulheres no Islã sendo a única </w:t>
-      </w:r>
-      <w:r>
-        <w:rPr>
-          <w:rFonts w:eastAsia="Arial" w:cs="Arial" w:ascii="Garamond" w:hAnsi="Garamond"/>
-          <w:color w:val="auto"/>
-          <w:kern w:val="0"/>
-          <w:sz w:val="36"/>
-          <w:szCs w:val="36"/>
-          <w:lang w:val="en-US" w:eastAsia="zh-CN" w:bidi="hi-IN"/>
-        </w:rPr>
-        <w:t>cujo nome consta</w:t>
-      </w:r>
-      <w:r>
-        <w:rPr>
-          <w:rFonts w:eastAsia="Arial" w:cs="Arial" w:ascii="Garamond" w:hAnsi="Garamond"/>
-          <w:color w:val="auto"/>
-          <w:kern w:val="0"/>
-          <w:sz w:val="36"/>
-          <w:szCs w:val="36"/>
-          <w:lang w:val="en-US" w:eastAsia="zh-CN" w:bidi="hi-IN"/>
-        </w:rPr>
-        <w:t xml:space="preserve"> no Alcorão?</w:t>
-      </w:r>
-    </w:p>
-    <w:p>
-      <w:pPr>
-        <w:pStyle w:val="Normal"/>
-        <w:jc w:val="both"/>
-        <w:rPr>
-          <w:rFonts w:ascii="Garamond" w:hAnsi="Garamond"/>
-          <w:sz w:val="36"/>
-          <w:szCs w:val="36"/>
-        </w:rPr>
-      </w:pPr>
-      <w:r>
-        <w:rPr>
-          <w:rFonts w:ascii="Garamond" w:hAnsi="Garamond"/>
-          <w:sz w:val="36"/>
-          <w:szCs w:val="36"/>
-        </w:rPr>
-      </w:r>
-    </w:p>
-    <w:p>
-      <w:pPr>
-        <w:pStyle w:val="Normal"/>
-        <w:jc w:val="both"/>
-        <w:rPr>
-          <w:rFonts w:ascii="Garamond" w:hAnsi="Garamond"/>
-          <w:sz w:val="36"/>
-          <w:szCs w:val="36"/>
-        </w:rPr>
-      </w:pPr>
-      <w:r>
-        <w:rPr>
-          <w:rFonts w:ascii="Garamond" w:hAnsi="Garamond"/>
-          <w:sz w:val="36"/>
-          <w:szCs w:val="36"/>
-        </w:rPr>
-        <w:t>O Alcorão tem uma surata (capítulo) dedicada a ela, chamada "Surata Maryam" (19), que conta a história da anunciação, gravidez e nascimento de Jesus.</w:t>
-      </w:r>
-      <w:r>
-        <w:rPr>
-          <w:rFonts w:ascii="Garamond" w:hAnsi="Garamond"/>
-          <w:sz w:val="36"/>
-          <w:szCs w:val="36"/>
-        </w:rPr>
-        <w:t xml:space="preserve"> </w:t>
-      </w:r>
-      <w:r>
-        <w:rPr>
-          <w:rFonts w:ascii="Garamond" w:hAnsi="Garamond"/>
-          <w:sz w:val="36"/>
-          <w:szCs w:val="36"/>
-        </w:rPr>
-        <w:t>A tradição islâmica também a descreve como "Imaculada" e como uma mulher pura e santa.</w:t>
+        <w:t>Vocês sabiam que Maria de Nazaré é mencionada cerca de 40 vezes no Alcorão, a bíblia sagrada do Islã, a religião dos mulçumanos? E que ela é considerada a maior de todas as mulheres no Islã sendo a única cujo nome consta no Alcorão?</w:t>
+      </w:r>
+    </w:p>
+    <w:p>
+      <w:pPr>
+        <w:pStyle w:val="Normal"/>
+        <w:jc w:val="both"/>
+        <w:rPr>
+          <w:rFonts w:ascii="Garamond" w:hAnsi="Garamond"/>
+          <w:sz w:val="36"/>
+          <w:szCs w:val="36"/>
+        </w:rPr>
+      </w:pPr>
+      <w:r>
+        <w:rPr>
+          <w:rFonts w:ascii="Garamond" w:hAnsi="Garamond"/>
+          <w:sz w:val="36"/>
+          <w:szCs w:val="36"/>
+        </w:rPr>
+      </w:r>
+    </w:p>
+    <w:p>
+      <w:pPr>
+        <w:pStyle w:val="Normal"/>
+        <w:jc w:val="both"/>
+        <w:rPr>
+          <w:rFonts w:ascii="Garamond" w:hAnsi="Garamond"/>
+          <w:sz w:val="36"/>
+          <w:szCs w:val="36"/>
+        </w:rPr>
+      </w:pPr>
+      <w:r>
+        <w:rPr>
+          <w:rFonts w:ascii="Garamond" w:hAnsi="Garamond"/>
+          <w:sz w:val="36"/>
+          <w:szCs w:val="36"/>
+        </w:rPr>
+        <w:t>O Alcorão tem uma surata (capítulo) dedicada a ela, chamada "Surata Maryam" (19), que conta a história da anunciação, gravidez e nascimento de Jesus. A tradição islâmica também a descreve como "Imaculada" e como uma mulher pura e santa.</w:t>
       </w:r>
     </w:p>
     <w:p>
@@ -868,23 +830,7 @@
           <w:sz w:val="36"/>
           <w:szCs w:val="36"/>
         </w:rPr>
-        <w:t xml:space="preserve"> Maria é mencionada mais vezes no </w:t>
-      </w:r>
-      <w:r>
-        <w:rPr>
-          <w:rFonts w:ascii="Garamond" w:hAnsi="Garamond"/>
-          <w:sz w:val="36"/>
-          <w:szCs w:val="36"/>
-        </w:rPr>
-        <w:t xml:space="preserve">Alcorão </w:t>
-      </w:r>
-      <w:r>
-        <w:rPr>
-          <w:rFonts w:ascii="Garamond" w:hAnsi="Garamond"/>
-          <w:sz w:val="36"/>
-          <w:szCs w:val="36"/>
-        </w:rPr>
-        <w:t>do que no Novo Testamento.</w:t>
+        <w:t xml:space="preserve"> Maria é mencionada mais vezes no Alcorão do que no Novo Testamento.</w:t>
       </w:r>
     </w:p>
     <w:p>
@@ -1084,120 +1030,47 @@
           <w:szCs w:val="36"/>
           <w:lang w:val="en-US" w:eastAsia="zh-CN" w:bidi="hi-IN"/>
         </w:rPr>
-        <w:t>Já que o nosso tema hoje é a disposição de Maria em servir, v</w:t>
-      </w:r>
-      <w:r>
-        <w:rPr>
-          <w:rFonts w:eastAsia="Arial" w:cs="Arial" w:ascii="Garamond" w:hAnsi="Garamond"/>
-          <w:color w:val="auto"/>
-          <w:kern w:val="0"/>
-          <w:sz w:val="36"/>
-          <w:szCs w:val="36"/>
-          <w:lang w:val="en-US" w:eastAsia="zh-CN" w:bidi="hi-IN"/>
-        </w:rPr>
-        <w:t xml:space="preserve">amos analisar algumas  passagens evangélicas que trazem </w:t>
-      </w:r>
-      <w:r>
-        <w:rPr>
-          <w:rFonts w:eastAsia="Arial" w:cs="Arial" w:ascii="Garamond" w:hAnsi="Garamond"/>
-          <w:color w:val="auto"/>
-          <w:kern w:val="0"/>
-          <w:sz w:val="36"/>
-          <w:szCs w:val="36"/>
-          <w:lang w:val="en-US" w:eastAsia="zh-CN" w:bidi="hi-IN"/>
-        </w:rPr>
-        <w:t>su</w:t>
-      </w:r>
-      <w:r>
-        <w:rPr>
-          <w:rFonts w:eastAsia="Arial" w:cs="Arial" w:ascii="Garamond" w:hAnsi="Garamond"/>
-          <w:color w:val="auto"/>
-          <w:kern w:val="0"/>
-          <w:sz w:val="36"/>
-          <w:szCs w:val="36"/>
-          <w:lang w:val="en-US" w:eastAsia="zh-CN" w:bidi="hi-IN"/>
-        </w:rPr>
-        <w:t>a figura, refletindo na maneira como ela se dispôs a servir no bem</w:t>
-      </w:r>
-      <w:r>
-        <w:rPr>
-          <w:rFonts w:eastAsia="Arial" w:cs="Arial" w:ascii="Garamond" w:hAnsi="Garamond"/>
-          <w:color w:val="auto"/>
-          <w:kern w:val="0"/>
-          <w:sz w:val="36"/>
-          <w:szCs w:val="36"/>
-          <w:lang w:val="en-US" w:eastAsia="zh-CN" w:bidi="hi-IN"/>
-        </w:rPr>
-        <w:t>.</w:t>
-      </w:r>
-    </w:p>
-    <w:p>
-      <w:pPr>
-        <w:pStyle w:val="Normal"/>
-        <w:jc w:val="both"/>
-        <w:rPr>
-          <w:rFonts w:ascii="Garamond" w:hAnsi="Garamond"/>
-          <w:sz w:val="36"/>
-          <w:szCs w:val="36"/>
-        </w:rPr>
-      </w:pPr>
-      <w:r>
-        <w:rPr/>
-      </w:r>
-    </w:p>
-    <w:p>
-      <w:pPr>
-        <w:pStyle w:val="Normal"/>
-        <w:jc w:val="both"/>
-        <w:rPr>
-          <w:rFonts w:ascii="Garamond" w:hAnsi="Garamond"/>
-          <w:sz w:val="36"/>
-          <w:szCs w:val="36"/>
-        </w:rPr>
-      </w:pPr>
-      <w:r>
-        <w:rPr>
-          <w:rFonts w:eastAsia="Arial" w:cs="Arial" w:ascii="Garamond" w:hAnsi="Garamond"/>
-          <w:color w:val="auto"/>
-          <w:kern w:val="0"/>
-          <w:sz w:val="36"/>
-          <w:szCs w:val="36"/>
-          <w:lang w:val="en-US" w:eastAsia="zh-CN" w:bidi="hi-IN"/>
-        </w:rPr>
-        <w:t>Vamos ver</w:t>
-      </w:r>
-      <w:r>
-        <w:rPr>
-          <w:rFonts w:eastAsia="Arial" w:cs="Arial" w:ascii="Garamond" w:hAnsi="Garamond"/>
-          <w:color w:val="auto"/>
-          <w:kern w:val="0"/>
-          <w:sz w:val="36"/>
-          <w:szCs w:val="36"/>
-          <w:lang w:val="en-US" w:eastAsia="zh-CN" w:bidi="hi-IN"/>
-        </w:rPr>
-        <w:t xml:space="preserve"> também como podemos nos inspirar nesses exemplos para </w:t>
-      </w:r>
-      <w:r>
-        <w:rPr>
-          <w:rFonts w:eastAsia="Arial" w:cs="Arial" w:ascii="Garamond" w:hAnsi="Garamond"/>
-          <w:color w:val="auto"/>
-          <w:kern w:val="0"/>
-          <w:sz w:val="36"/>
-          <w:szCs w:val="36"/>
-          <w:lang w:val="en-US" w:eastAsia="zh-CN" w:bidi="hi-IN"/>
-        </w:rPr>
-        <w:t xml:space="preserve">o </w:t>
-      </w:r>
-      <w:r>
-        <w:rPr>
-          <w:rFonts w:eastAsia="Arial" w:cs="Arial" w:ascii="Garamond" w:hAnsi="Garamond"/>
-          <w:color w:val="auto"/>
-          <w:kern w:val="0"/>
-          <w:sz w:val="36"/>
-          <w:szCs w:val="36"/>
-          <w:lang w:val="en-US" w:eastAsia="zh-CN" w:bidi="hi-IN"/>
-        </w:rPr>
-        <w:t>nosso próprio crescimento e evolução espiritual.</w:t>
+        <w:t>Já que o nosso tema hoje é a disposição de Maria em servir, vamos analisar algumas  passagens evangélicas que trazem sua figura, refletindo na maneira como ela se dispôs a servir no bem.</w:t>
+      </w:r>
+    </w:p>
+    <w:p>
+      <w:pPr>
+        <w:pStyle w:val="Normal"/>
+        <w:jc w:val="both"/>
+        <w:rPr>
+          <w:rFonts w:ascii="Garamond" w:hAnsi="Garamond"/>
+          <w:sz w:val="36"/>
+          <w:szCs w:val="36"/>
+        </w:rPr>
+      </w:pPr>
+      <w:r>
+        <w:rPr>
+          <w:rFonts w:ascii="Garamond" w:hAnsi="Garamond"/>
+          <w:sz w:val="36"/>
+          <w:szCs w:val="36"/>
+        </w:rPr>
+      </w:r>
+    </w:p>
+    <w:p>
+      <w:pPr>
+        <w:pStyle w:val="Normal"/>
+        <w:jc w:val="both"/>
+        <w:rPr>
+          <w:rFonts w:ascii="Garamond" w:hAnsi="Garamond"/>
+          <w:sz w:val="36"/>
+          <w:szCs w:val="36"/>
+        </w:rPr>
+      </w:pPr>
+      <w:r>
+        <w:rPr>
+          <w:rFonts w:eastAsia="Arial" w:cs="Arial" w:ascii="Garamond" w:hAnsi="Garamond"/>
+          <w:color w:val="auto"/>
+          <w:kern w:val="0"/>
+          <w:sz w:val="36"/>
+          <w:szCs w:val="36"/>
+          <w:lang w:val="en-US" w:eastAsia="zh-CN" w:bidi="hi-IN"/>
+        </w:rPr>
+        <w:t>Vamos ver também como podemos nos inspirar nesses exemplos para o nosso próprio crescimento e evolução espiritual.</w:t>
       </w:r>
     </w:p>
     <w:p>
@@ -1483,23 +1356,7 @@
           <w:sz w:val="36"/>
           <w:szCs w:val="36"/>
         </w:rPr>
-        <w:t xml:space="preserve"> para ela, mesmo não se achando digna d</w:t>
-      </w:r>
-      <w:r>
-        <w:rPr>
-          <w:rFonts w:ascii="Garamond" w:hAnsi="Garamond"/>
-          <w:sz w:val="36"/>
-          <w:szCs w:val="36"/>
-        </w:rPr>
-        <w:t>aquela missão</w:t>
-      </w:r>
-      <w:r>
-        <w:rPr>
-          <w:rFonts w:ascii="Garamond" w:hAnsi="Garamond"/>
-          <w:sz w:val="36"/>
-          <w:szCs w:val="36"/>
-        </w:rPr>
-        <w:t xml:space="preserve">. </w:t>
+        <w:t xml:space="preserve"> para ela, mesmo não se achando digna daquela missão. </w:t>
       </w:r>
     </w:p>
     <w:p>
@@ -1550,7 +1407,11 @@
         </w:rPr>
       </w:pPr>
       <w:r>
-        <w:rPr/>
+        <w:rPr>
+          <w:rFonts w:ascii="Garamond" w:hAnsi="Garamond"/>
+          <w:sz w:val="36"/>
+          <w:szCs w:val="36"/>
+        </w:rPr>
       </w:r>
     </w:p>
     <w:p>
@@ -1647,23 +1508,7 @@
           <w:sz w:val="36"/>
           <w:szCs w:val="36"/>
         </w:rPr>
-        <w:t>missão</w:t>
-      </w:r>
-      <w:r>
-        <w:rPr>
-          <w:rFonts w:ascii="Garamond" w:hAnsi="Garamond"/>
-          <w:sz w:val="36"/>
-          <w:szCs w:val="36"/>
-        </w:rPr>
-        <w:t>, mesmo sabendo dos riscos, sofrimentos e incertezas a que estaria submetida. Ela</w:t>
-      </w:r>
-      <w:r>
-        <w:rPr>
-          <w:rFonts w:ascii="Garamond" w:hAnsi="Garamond"/>
-          <w:sz w:val="36"/>
-          <w:szCs w:val="36"/>
-        </w:rPr>
-        <w:t xml:space="preserve"> revela uma obediência madura</w:t>
+        <w:t>missão, mesmo sabendo dos riscos, sofrimentos e incertezas a que estaria submetida. Ela revela uma obediência madura</w:t>
       </w:r>
       <w:r>
         <w:rPr>
@@ -1770,64 +1615,15 @@
           <w:szCs w:val="36"/>
           <w:lang w:val="en-US" w:eastAsia="zh-CN" w:bidi="hi-IN"/>
         </w:rPr>
-        <w:t xml:space="preserve">De que maneira </w:t>
-      </w:r>
-      <w:r>
-        <w:rPr>
-          <w:rFonts w:eastAsia="Arial" w:cs="Arial" w:ascii="Garamond" w:hAnsi="Garamond"/>
-          <w:color w:val="auto"/>
-          <w:kern w:val="0"/>
-          <w:sz w:val="36"/>
-          <w:szCs w:val="36"/>
-          <w:lang w:val="en-US" w:eastAsia="zh-CN" w:bidi="hi-IN"/>
-        </w:rPr>
-        <w:t xml:space="preserve">podemos trazer </w:t>
-      </w:r>
-      <w:r>
-        <w:rPr>
-          <w:rFonts w:eastAsia="Arial" w:cs="Arial" w:ascii="Garamond" w:hAnsi="Garamond"/>
-          <w:color w:val="auto"/>
-          <w:kern w:val="0"/>
-          <w:sz w:val="36"/>
-          <w:szCs w:val="36"/>
-          <w:lang w:val="en-US" w:eastAsia="zh-CN" w:bidi="hi-IN"/>
-        </w:rPr>
-        <w:t xml:space="preserve">os exemplos de Maria </w:t>
-      </w:r>
-      <w:r>
-        <w:rPr>
-          <w:rFonts w:eastAsia="Arial" w:cs="Arial" w:ascii="Garamond" w:hAnsi="Garamond"/>
-          <w:color w:val="auto"/>
-          <w:kern w:val="0"/>
-          <w:sz w:val="36"/>
-          <w:szCs w:val="36"/>
-          <w:lang w:val="en-US" w:eastAsia="zh-CN" w:bidi="hi-IN"/>
-        </w:rPr>
-        <w:t>para nossas vidas</w:t>
-      </w:r>
-      <w:r>
-        <w:rPr>
-          <w:rFonts w:ascii="Garamond" w:hAnsi="Garamond"/>
-          <w:sz w:val="36"/>
-          <w:szCs w:val="36"/>
-        </w:rPr>
-        <w:t xml:space="preserve">? Em primeiro lugar, procurando ser humildes. </w:t>
-      </w:r>
-      <w:r>
-        <w:rPr>
-          <w:rFonts w:ascii="Garamond" w:hAnsi="Garamond"/>
-          <w:sz w:val="36"/>
-          <w:szCs w:val="36"/>
-        </w:rPr>
-        <w:t>A h</w:t>
-      </w:r>
-      <w:r>
-        <w:rPr>
-          <w:rFonts w:ascii="Garamond" w:hAnsi="Garamond"/>
-          <w:sz w:val="36"/>
-          <w:szCs w:val="36"/>
-        </w:rPr>
-        <w:t xml:space="preserve">umildade é uma virtude que se constrói com o tempo, unindo compreensão, vivência e prática em todos os momentos da </w:t>
+        <w:t>De que maneira podemos trazer os exemplos de Maria para nossas vidas</w:t>
+      </w:r>
+      <w:r>
+        <w:rPr>
+          <w:rFonts w:ascii="Garamond" w:hAnsi="Garamond"/>
+          <w:sz w:val="36"/>
+          <w:szCs w:val="36"/>
+        </w:rPr>
+        <w:t xml:space="preserve">? Em primeiro lugar, procurando ser humildes. A humildade é uma virtude que se constrói com o tempo, unindo compreensão, vivência e prática em todos os momentos da </w:t>
       </w:r>
       <w:r>
         <w:rPr>
@@ -1933,34 +1729,30 @@
         </w:rPr>
       </w:pPr>
       <w:r>
-        <w:rPr/>
-      </w:r>
-    </w:p>
-    <w:p>
-      <w:pPr>
-        <w:pStyle w:val="Normal"/>
-        <w:jc w:val="both"/>
-        <w:rPr>
-          <w:rFonts w:ascii="Garamond" w:hAnsi="Garamond"/>
-          <w:sz w:val="36"/>
-          <w:szCs w:val="36"/>
-        </w:rPr>
-      </w:pPr>
-      <w:r>
-        <w:rPr>
-          <w:rFonts w:ascii="Garamond" w:hAnsi="Garamond"/>
-          <w:sz w:val="36"/>
-          <w:szCs w:val="36"/>
-        </w:rPr>
-        <w:t xml:space="preserve">Em contrapartida, </w:t>
-      </w:r>
-      <w:r>
-        <w:rPr>
-          <w:rFonts w:ascii="Garamond" w:hAnsi="Garamond"/>
-          <w:sz w:val="36"/>
-          <w:szCs w:val="36"/>
-        </w:rPr>
-        <w:t xml:space="preserve">os tapetes vermelhos simbolizam os nossos caprichos, o desejo de conforto, reconhecimento e facilidades. </w:t>
+        <w:rPr>
+          <w:rFonts w:ascii="Garamond" w:hAnsi="Garamond"/>
+          <w:sz w:val="36"/>
+          <w:szCs w:val="36"/>
+        </w:rPr>
+      </w:r>
+    </w:p>
+    <w:p>
+      <w:pPr>
+        <w:pStyle w:val="Normal"/>
+        <w:jc w:val="both"/>
+        <w:rPr>
+          <w:rFonts w:ascii="Garamond" w:hAnsi="Garamond"/>
+          <w:sz w:val="36"/>
+          <w:szCs w:val="36"/>
+        </w:rPr>
+      </w:pPr>
+      <w:r>
+        <w:rPr>
+          <w:rFonts w:ascii="Garamond" w:hAnsi="Garamond"/>
+          <w:sz w:val="36"/>
+          <w:szCs w:val="36"/>
+        </w:rPr>
+        <w:t xml:space="preserve">Em contrapartida, os tapetes vermelhos simbolizam os nossos caprichos, o desejo de conforto, reconhecimento e facilidades. </w:t>
       </w:r>
     </w:p>
     <w:p>
@@ -2308,23 +2100,7 @@
           <w:sz w:val="36"/>
           <w:szCs w:val="36"/>
         </w:rPr>
-        <w:t>Nota</w:t>
-      </w:r>
-      <w:r>
-        <w:rPr>
-          <w:rFonts w:ascii="Garamond" w:hAnsi="Garamond"/>
-          <w:sz w:val="36"/>
-          <w:szCs w:val="36"/>
-        </w:rPr>
-        <w:t xml:space="preserve"> [ ver se vale a pena manter essa nota] </w:t>
-      </w:r>
-      <w:r>
-        <w:rPr>
-          <w:rFonts w:ascii="Garamond" w:hAnsi="Garamond"/>
-          <w:sz w:val="36"/>
-          <w:szCs w:val="36"/>
-        </w:rPr>
-        <w:t>: A diferença entre “Isabel” e “Elisabet” nas versões do Evangelho se deve a variações de tradução e transliteração do nome original ao longo dos séculos, conforme o texto bíblico foi passado do hebraico ao grego, depois ao latim e, por fim, aos idiomas modernos.</w:t>
+        <w:t>Nota [ ver se vale a pena manter essa nota] : A diferença entre “Isabel” e “Elisabet” nas versões do Evangelho se deve a variações de tradução e transliteração do nome original ao longo dos séculos, conforme o texto bíblico foi passado do hebraico ao grego, depois ao latim e, por fim, aos idiomas modernos.</w:t>
       </w:r>
     </w:p>
     <w:p>
@@ -2492,23 +2268,7 @@
           <w:sz w:val="36"/>
           <w:szCs w:val="36"/>
         </w:rPr>
-        <w:t>Maria nos dá exemplos</w:t>
-      </w:r>
-      <w:r>
-        <w:rPr>
-          <w:rFonts w:ascii="Garamond" w:hAnsi="Garamond"/>
-          <w:sz w:val="36"/>
-          <w:szCs w:val="36"/>
-        </w:rPr>
-        <w:t>, novamente,</w:t>
-      </w:r>
-      <w:r>
-        <w:rPr>
-          <w:rFonts w:ascii="Garamond" w:hAnsi="Garamond"/>
-          <w:sz w:val="36"/>
-          <w:szCs w:val="36"/>
-        </w:rPr>
-        <w:t xml:space="preserve"> de humildade, prontidão generosa e presença consoladora.  Ao saber da gravidez da prima já idosa, ela não hesita: parte apressadamente pelas montanhas da Judeia, mostrando que a verdadeira caridade é pronta, sensível e ativa. </w:t>
+        <w:t xml:space="preserve">Maria nos dá exemplos, novamente, de humildade, prontidão generosa e presença consoladora.  Ao saber da gravidez da prima já idosa, ela não hesita: parte apressadamente pelas montanhas da Judeia, mostrando que a verdadeira caridade é pronta, sensível e ativa. </w:t>
       </w:r>
     </w:p>
     <w:p>
@@ -2627,21 +2387,29 @@
         </w:rPr>
       </w:pPr>
       <w:r>
-        <w:rPr/>
-      </w:r>
-    </w:p>
-    <w:p>
-      <w:pPr>
-        <w:pStyle w:val="Normal"/>
-        <w:jc w:val="both"/>
-        <w:rPr>
-          <w:rFonts w:ascii="Garamond" w:hAnsi="Garamond"/>
-          <w:sz w:val="36"/>
-          <w:szCs w:val="36"/>
-        </w:rPr>
-      </w:pPr>
-      <w:r>
-        <w:rPr/>
+        <w:rPr>
+          <w:rFonts w:ascii="Garamond" w:hAnsi="Garamond"/>
+          <w:sz w:val="36"/>
+          <w:szCs w:val="36"/>
+        </w:rPr>
+      </w:r>
+    </w:p>
+    <w:p>
+      <w:pPr>
+        <w:pStyle w:val="Normal"/>
+        <w:jc w:val="both"/>
+        <w:rPr>
+          <w:rFonts w:ascii="Garamond" w:hAnsi="Garamond"/>
+          <w:sz w:val="36"/>
+          <w:szCs w:val="36"/>
+        </w:rPr>
+      </w:pPr>
+      <w:r>
+        <w:rPr>
+          <w:rFonts w:ascii="Garamond" w:hAnsi="Garamond"/>
+          <w:sz w:val="36"/>
+          <w:szCs w:val="36"/>
+        </w:rPr>
       </w:r>
     </w:p>
     <w:p>
@@ -2698,23 +2466,7 @@
           <w:sz w:val="36"/>
           <w:szCs w:val="36"/>
         </w:rPr>
-        <w:t xml:space="preserve"> moravam em uma região montanhosa da Judeia, no sul do país, perto de Jerusalém. Provavelmente é </w:t>
-      </w:r>
-      <w:r>
-        <w:rPr>
-          <w:rFonts w:ascii="Garamond" w:hAnsi="Garamond"/>
-          <w:sz w:val="36"/>
-          <w:szCs w:val="36"/>
-        </w:rPr>
-        <w:t>onde se encontra hoje a cidade de</w:t>
-      </w:r>
-      <w:r>
-        <w:rPr>
-          <w:rFonts w:ascii="Garamond" w:hAnsi="Garamond"/>
-          <w:sz w:val="36"/>
-          <w:szCs w:val="36"/>
-        </w:rPr>
-        <w:t xml:space="preserve"> Ain Karim.</w:t>
+        <w:t xml:space="preserve"> moravam em uma região montanhosa da Judeia, no sul do país, perto de Jerusalém. Provavelmente é onde se encontra hoje a cidade de Ain Karim.</w:t>
       </w:r>
     </w:p>
     <w:p>
@@ -3011,66 +2763,47 @@
           <w:sz w:val="36"/>
           <w:szCs w:val="36"/>
         </w:rPr>
-        <w:t xml:space="preserve">Como podemos ver, a viagem até a residência de Elisabet e Zacarias exigiu um enorme esforço e sacrifício de Maria, um prenúncio </w:t>
-      </w:r>
-      <w:r>
-        <w:rPr>
-          <w:rFonts w:ascii="Garamond" w:hAnsi="Garamond"/>
-          <w:sz w:val="36"/>
-          <w:szCs w:val="36"/>
-        </w:rPr>
-        <w:t>de tudo que ela viveria depois como discípula de Jesus: sempre disponível, sempre servindo.</w:t>
-      </w:r>
-    </w:p>
-    <w:p>
-      <w:pPr>
-        <w:pStyle w:val="Normal"/>
-        <w:jc w:val="both"/>
-        <w:rPr>
-          <w:rFonts w:ascii="Garamond" w:hAnsi="Garamond"/>
-          <w:sz w:val="36"/>
-          <w:szCs w:val="36"/>
-        </w:rPr>
-      </w:pPr>
-      <w:r>
-        <w:rPr>
-          <w:rFonts w:ascii="Garamond" w:hAnsi="Garamond"/>
-          <w:sz w:val="36"/>
-          <w:szCs w:val="36"/>
-        </w:rPr>
-      </w:r>
-    </w:p>
-    <w:p>
-      <w:pPr>
-        <w:pStyle w:val="Normal"/>
-        <w:jc w:val="both"/>
-        <w:rPr>
-          <w:rFonts w:ascii="Garamond" w:hAnsi="Garamond"/>
-          <w:sz w:val="36"/>
-          <w:szCs w:val="36"/>
-        </w:rPr>
-      </w:pPr>
-      <w:r>
-        <w:rPr>
-          <w:rFonts w:eastAsia="Arial" w:cs="Arial" w:ascii="Garamond" w:hAnsi="Garamond"/>
-          <w:color w:val="auto"/>
-          <w:kern w:val="0"/>
-          <w:sz w:val="36"/>
-          <w:szCs w:val="36"/>
-          <w:lang w:val="en-US" w:eastAsia="zh-CN" w:bidi="hi-IN"/>
-        </w:rPr>
-        <w:t>Nesse sentido, qual tem sido nossa postura diante da vida</w:t>
-      </w:r>
-      <w:r>
-        <w:rPr>
-          <w:rFonts w:eastAsia="Arial" w:cs="Arial" w:ascii="Garamond" w:hAnsi="Garamond"/>
-          <w:color w:val="auto"/>
-          <w:kern w:val="0"/>
-          <w:sz w:val="36"/>
-          <w:szCs w:val="36"/>
-          <w:lang w:val="en-US" w:eastAsia="zh-CN" w:bidi="hi-IN"/>
-        </w:rPr>
-        <w:t>? Conseguimos  abdicar de nossas conquistas materiais e espirituais que, verdade seja dita, são ainda muito pequenas, para nos colocarmos a serviço dos outros ou o orgulho ainda fala mais alto dentro de nós?</w:t>
+        <w:t>Como podemos ver, a viagem até a residência de Elisabet e Zacarias exigiu um enorme esforço e sacrifício de Maria, um prenúncio de tudo que ela viveria depois como discípula de Jesus: sempre disponível, sempre servindo.</w:t>
+      </w:r>
+    </w:p>
+    <w:p>
+      <w:pPr>
+        <w:pStyle w:val="Normal"/>
+        <w:jc w:val="both"/>
+        <w:rPr>
+          <w:rFonts w:ascii="Garamond" w:hAnsi="Garamond"/>
+          <w:sz w:val="36"/>
+          <w:szCs w:val="36"/>
+        </w:rPr>
+      </w:pPr>
+      <w:r>
+        <w:rPr>
+          <w:rFonts w:ascii="Garamond" w:hAnsi="Garamond"/>
+          <w:sz w:val="36"/>
+          <w:szCs w:val="36"/>
+        </w:rPr>
+      </w:r>
+    </w:p>
+    <w:p>
+      <w:pPr>
+        <w:pStyle w:val="Normal"/>
+        <w:jc w:val="both"/>
+        <w:rPr>
+          <w:rFonts w:ascii="Garamond" w:hAnsi="Garamond"/>
+          <w:sz w:val="36"/>
+          <w:szCs w:val="36"/>
+        </w:rPr>
+      </w:pPr>
+      <w:r>
+        <w:rPr>
+          <w:rFonts w:eastAsia="Arial" w:cs="Arial" w:ascii="Garamond" w:hAnsi="Garamond"/>
+          <w:color w:val="auto"/>
+          <w:kern w:val="0"/>
+          <w:sz w:val="36"/>
+          <w:szCs w:val="36"/>
+          <w:lang w:val="en-US" w:eastAsia="zh-CN" w:bidi="hi-IN"/>
+        </w:rPr>
+        <w:t>Nesse sentido, qual tem sido nossa postura diante da vida? Conseguimos  abdicar de nossas conquistas materiais e espirituais que, verdade seja dita, são ainda muito pequenas, para nos colocarmos a serviço dos outros ou o orgulho ainda fala mais alto dentro de nós?</w:t>
       </w:r>
     </w:p>
     <w:p>
@@ -3172,89 +2905,44 @@
           <w:szCs w:val="36"/>
           <w:lang w:val="en-US" w:eastAsia="zh-CN" w:bidi="hi-IN"/>
         </w:rPr>
-        <w:t xml:space="preserve">Nós, Espíritas, somos particularmente vulneráveis a esse tipo de erro. Como a Doutrina Espírita lança uma luz enorme em nossas vidas, é </w:t>
-      </w:r>
-      <w:r>
-        <w:rPr>
-          <w:rFonts w:eastAsia="Arial" w:cs="Arial" w:ascii="Garamond" w:hAnsi="Garamond"/>
-          <w:color w:val="auto"/>
-          <w:kern w:val="0"/>
-          <w:sz w:val="36"/>
-          <w:szCs w:val="36"/>
-          <w:lang w:val="en-US" w:eastAsia="zh-CN" w:bidi="hi-IN"/>
-        </w:rPr>
-        <w:t xml:space="preserve">muito </w:t>
-      </w:r>
-      <w:r>
-        <w:rPr>
-          <w:rFonts w:eastAsia="Arial" w:cs="Arial" w:ascii="Garamond" w:hAnsi="Garamond"/>
-          <w:color w:val="auto"/>
-          <w:kern w:val="0"/>
-          <w:sz w:val="36"/>
-          <w:szCs w:val="36"/>
-          <w:lang w:val="en-US" w:eastAsia="zh-CN" w:bidi="hi-IN"/>
-        </w:rPr>
-        <w:t xml:space="preserve">comum nós </w:t>
-      </w:r>
-      <w:r>
-        <w:rPr>
-          <w:rFonts w:eastAsia="Arial" w:cs="Arial" w:ascii="Garamond" w:hAnsi="Garamond"/>
-          <w:color w:val="auto"/>
-          <w:kern w:val="0"/>
-          <w:sz w:val="36"/>
-          <w:szCs w:val="36"/>
-          <w:lang w:val="en-US" w:eastAsia="zh-CN" w:bidi="hi-IN"/>
-        </w:rPr>
-        <w:t>criticarmos os outros por erros que, há bem pouco tempo, nós mesmos cometíamos.</w:t>
-      </w:r>
-    </w:p>
-    <w:p>
-      <w:pPr>
-        <w:pStyle w:val="Normal"/>
-        <w:jc w:val="both"/>
-        <w:rPr>
-          <w:rFonts w:ascii="Garamond" w:hAnsi="Garamond"/>
-          <w:sz w:val="36"/>
-          <w:szCs w:val="36"/>
-        </w:rPr>
-      </w:pPr>
-      <w:r>
-        <w:rPr/>
-      </w:r>
-    </w:p>
-    <w:p>
-      <w:pPr>
-        <w:pStyle w:val="Normal"/>
-        <w:jc w:val="both"/>
-        <w:rPr>
-          <w:rFonts w:ascii="Garamond" w:hAnsi="Garamond"/>
-          <w:sz w:val="36"/>
-          <w:szCs w:val="36"/>
-        </w:rPr>
-      </w:pPr>
-      <w:r>
-        <w:rPr>
-          <w:rFonts w:ascii="Garamond" w:hAnsi="Garamond"/>
-          <w:sz w:val="36"/>
-          <w:szCs w:val="36"/>
-        </w:rPr>
-        <w:t>E c</w:t>
-      </w:r>
-      <w:r>
-        <w:rPr>
-          <w:rFonts w:ascii="Garamond" w:hAnsi="Garamond"/>
-          <w:sz w:val="36"/>
-          <w:szCs w:val="36"/>
-        </w:rPr>
-        <w:t>om relação à empatia e sensibilidade</w:t>
-      </w:r>
-      <w:r>
-        <w:rPr>
-          <w:rFonts w:ascii="Garamond" w:hAnsi="Garamond"/>
-          <w:sz w:val="36"/>
-          <w:szCs w:val="36"/>
-        </w:rPr>
-        <w:t xml:space="preserve"> demonstradas por Maria? </w:t>
+        <w:t>Nós, Espíritas, somos particularmente vulneráveis a esse tipo de erro. Como a Doutrina Espírita lança uma luz enorme em nossas vidas, é muito comum nós criticarmos os outros por erros que, há bem pouco tempo, nós mesmos cometíamos.</w:t>
+      </w:r>
+    </w:p>
+    <w:p>
+      <w:pPr>
+        <w:pStyle w:val="Normal"/>
+        <w:jc w:val="both"/>
+        <w:rPr>
+          <w:rFonts w:ascii="Garamond" w:hAnsi="Garamond"/>
+          <w:sz w:val="36"/>
+          <w:szCs w:val="36"/>
+        </w:rPr>
+      </w:pPr>
+      <w:r>
+        <w:rPr>
+          <w:rFonts w:ascii="Garamond" w:hAnsi="Garamond"/>
+          <w:sz w:val="36"/>
+          <w:szCs w:val="36"/>
+        </w:rPr>
+      </w:r>
+    </w:p>
+    <w:p>
+      <w:pPr>
+        <w:pStyle w:val="Normal"/>
+        <w:jc w:val="both"/>
+        <w:rPr>
+          <w:rFonts w:ascii="Garamond" w:hAnsi="Garamond"/>
+          <w:sz w:val="36"/>
+          <w:szCs w:val="36"/>
+        </w:rPr>
+      </w:pPr>
+      <w:r>
+        <w:rPr>
+          <w:rFonts w:ascii="Garamond" w:hAnsi="Garamond"/>
+          <w:sz w:val="36"/>
+          <w:szCs w:val="36"/>
+        </w:rPr>
+        <w:t xml:space="preserve">E com relação à empatia e sensibilidade demonstradas por Maria? </w:t>
       </w:r>
       <w:r>
         <w:rPr>
@@ -3310,23 +2998,7 @@
           <w:sz w:val="36"/>
           <w:szCs w:val="36"/>
         </w:rPr>
-        <w:t>Nos dias de hoje há muito sofrimento na sociedade</w:t>
-      </w:r>
-      <w:r>
-        <w:rPr>
-          <w:rFonts w:ascii="Garamond" w:hAnsi="Garamond"/>
-          <w:sz w:val="36"/>
-          <w:szCs w:val="36"/>
-        </w:rPr>
-        <w:t xml:space="preserve"> e infelizmente existe também muita predisposição das pessoas</w:t>
-      </w:r>
-      <w:r>
-        <w:rPr>
-          <w:rFonts w:ascii="Garamond" w:hAnsi="Garamond"/>
-          <w:sz w:val="36"/>
-          <w:szCs w:val="36"/>
-        </w:rPr>
-        <w:t xml:space="preserve"> para </w:t>
+        <w:t xml:space="preserve">Nos dias de hoje há muito sofrimento na sociedade e infelizmente existe também muita predisposição das pessoas para </w:t>
       </w:r>
       <w:r>
         <w:rPr>
@@ -3382,15 +3054,7 @@
           <w:sz w:val="36"/>
           <w:szCs w:val="36"/>
         </w:rPr>
-        <w:t xml:space="preserve">Kardec já nos disse: fora da caridade não há salvação. Colocarmo-nos no lugar do outro para compreender </w:t>
-      </w:r>
-      <w:r>
-        <w:rPr>
-          <w:rFonts w:ascii="Garamond" w:hAnsi="Garamond"/>
-          <w:sz w:val="36"/>
-          <w:szCs w:val="36"/>
-        </w:rPr>
-        <w:t xml:space="preserve">e, principalmente, ajudar também é uma forma de caridade, </w:t>
+        <w:t xml:space="preserve">Kardec já nos disse: fora da caridade não há salvação. Colocarmo-nos no lugar do outro para compreender e, principalmente, ajudar também é uma forma de caridade, </w:t>
       </w:r>
       <w:r>
         <w:rPr>
@@ -4009,18 +3673,7 @@
           <w:szCs w:val="36"/>
           <w:lang w:val="en-US" w:eastAsia="zh-CN" w:bidi="hi-IN"/>
         </w:rPr>
-        <w:t>Somos</w:t>
-      </w:r>
-      <w:r>
-        <w:rPr>
-          <w:rFonts w:eastAsia="Arial" w:cs="Arial" w:ascii="Garamond" w:hAnsi="Garamond"/>
-          <w:color w:val="auto"/>
-          <w:kern w:val="0"/>
-          <w:sz w:val="36"/>
-          <w:szCs w:val="36"/>
-          <w:lang w:val="en-US" w:eastAsia="zh-CN" w:bidi="hi-IN"/>
-        </w:rPr>
-        <w:t xml:space="preserve"> servidores fiéis que fazem o que o Mestre nos recomenda tendo a certeza de que o resultado será o melhor? Certamente que ainda não.</w:t>
+        <w:t>Somos servidores fiéis que fazem o que o Mestre nos recomenda tendo a certeza de que o resultado será o melhor? Certamente que ainda não.</w:t>
       </w:r>
     </w:p>
     <w:p>
@@ -4104,51 +3757,49 @@
           <w:szCs w:val="36"/>
           <w:lang w:val="en-US" w:eastAsia="zh-CN" w:bidi="hi-IN"/>
         </w:rPr>
-        <w:t xml:space="preserve">Nós fazemos isso na incerteza do que acontecerá. Mas a incerteza não é nosso </w:t>
-      </w:r>
-      <w:r>
-        <w:rPr>
-          <w:rFonts w:eastAsia="Arial" w:cs="Arial" w:ascii="Garamond" w:hAnsi="Garamond"/>
-          <w:color w:val="auto"/>
-          <w:kern w:val="0"/>
-          <w:sz w:val="36"/>
-          <w:szCs w:val="36"/>
-          <w:lang w:val="en-US" w:eastAsia="zh-CN" w:bidi="hi-IN"/>
-        </w:rPr>
-        <w:t xml:space="preserve">maior </w:t>
-      </w:r>
-      <w:r>
-        <w:rPr>
-          <w:rFonts w:eastAsia="Arial" w:cs="Arial" w:ascii="Garamond" w:hAnsi="Garamond"/>
-          <w:color w:val="auto"/>
-          <w:kern w:val="0"/>
-          <w:sz w:val="36"/>
-          <w:szCs w:val="36"/>
-          <w:lang w:val="en-US" w:eastAsia="zh-CN" w:bidi="hi-IN"/>
-        </w:rPr>
-        <w:t>problema.</w:t>
-      </w:r>
-      <w:r>
-        <w:rPr>
-          <w:rFonts w:eastAsia="Arial" w:cs="Arial" w:ascii="Garamond" w:hAnsi="Garamond"/>
-          <w:color w:val="auto"/>
-          <w:kern w:val="0"/>
-          <w:sz w:val="36"/>
-          <w:szCs w:val="36"/>
-          <w:lang w:val="en-US" w:eastAsia="zh-CN" w:bidi="hi-IN"/>
-        </w:rPr>
-        <w:t xml:space="preserve"> </w:t>
-      </w:r>
-      <w:r>
-        <w:rPr>
-          <w:rFonts w:eastAsia="Arial" w:cs="Arial" w:ascii="Garamond" w:hAnsi="Garamond"/>
-          <w:color w:val="auto"/>
-          <w:kern w:val="0"/>
-          <w:sz w:val="36"/>
-          <w:szCs w:val="36"/>
-          <w:lang w:val="en-US" w:eastAsia="zh-CN" w:bidi="hi-IN"/>
-        </w:rPr>
-        <w:t>Afinal de contas</w:t>
+        <w:t xml:space="preserve">Nós fazemos isso na incerteza do que acontecerá. Mas a incerteza não é nosso maior problema. Afinal de contas, não há como sabermos de antemão se a pessoa será curada ou não.  Nosso grande problema é que não confiamos plenamente na resposta que Jesus dará ao pedido de ajuda que fizemos. </w:t>
+      </w:r>
+    </w:p>
+    <w:p>
+      <w:pPr>
+        <w:pStyle w:val="Normal"/>
+        <w:jc w:val="both"/>
+        <w:rPr>
+          <w:rFonts w:ascii="Garamond" w:hAnsi="Garamond" w:eastAsia="Arial" w:cs="Arial"/>
+          <w:color w:val="auto"/>
+          <w:kern w:val="0"/>
+          <w:sz w:val="36"/>
+          <w:szCs w:val="36"/>
+          <w:lang w:val="en-US" w:eastAsia="zh-CN" w:bidi="hi-IN"/>
+        </w:rPr>
+      </w:pPr>
+      <w:r>
+        <w:rPr>
+          <w:rFonts w:eastAsia="Arial" w:cs="Arial" w:ascii="Garamond" w:hAnsi="Garamond"/>
+          <w:color w:val="auto"/>
+          <w:kern w:val="0"/>
+          <w:sz w:val="36"/>
+          <w:szCs w:val="36"/>
+          <w:lang w:val="en-US" w:eastAsia="zh-CN" w:bidi="hi-IN"/>
+        </w:rPr>
+      </w:r>
+    </w:p>
+    <w:p>
+      <w:pPr>
+        <w:pStyle w:val="Normal"/>
+        <w:jc w:val="both"/>
+        <w:rPr/>
+      </w:pPr>
+      <w:r>
+        <w:rPr>
+          <w:rFonts w:eastAsia="Arial" w:cs="Arial" w:ascii="Garamond" w:hAnsi="Garamond"/>
+          <w:color w:val="auto"/>
+          <w:kern w:val="0"/>
+          <w:sz w:val="36"/>
+          <w:szCs w:val="36"/>
+          <w:lang w:val="en-US" w:eastAsia="zh-CN" w:bidi="hi-IN"/>
+        </w:rPr>
+        <w:t>No fundo o meu desejo é que Jesus permita que a pessoa seja curada: se for assim</w:t>
       </w:r>
       <w:r>
         <w:rPr>
@@ -4170,95 +3821,7 @@
           <w:szCs w:val="36"/>
           <w:lang w:val="en-US" w:eastAsia="zh-CN" w:bidi="hi-IN"/>
         </w:rPr>
-        <w:t xml:space="preserve"> </w:t>
-      </w:r>
-      <w:r>
-        <w:rPr>
-          <w:rFonts w:eastAsia="Arial" w:cs="Arial" w:ascii="Garamond" w:hAnsi="Garamond"/>
-          <w:color w:val="auto"/>
-          <w:kern w:val="0"/>
-          <w:sz w:val="36"/>
-          <w:szCs w:val="36"/>
-          <w:lang w:val="en-US" w:eastAsia="zh-CN" w:bidi="hi-IN"/>
-        </w:rPr>
-        <w:t xml:space="preserve">não há como sabermos </w:t>
-      </w:r>
-      <w:r>
-        <w:rPr>
-          <w:rFonts w:eastAsia="Arial" w:cs="Arial" w:ascii="Garamond" w:hAnsi="Garamond"/>
-          <w:color w:val="auto"/>
-          <w:kern w:val="0"/>
-          <w:sz w:val="36"/>
-          <w:szCs w:val="36"/>
-          <w:lang w:val="en-US" w:eastAsia="zh-CN" w:bidi="hi-IN"/>
-        </w:rPr>
-        <w:t xml:space="preserve">de antemão se a pessoa será curada ou não.  Nosso grande problema é que não confiamos plenamente </w:t>
-      </w:r>
-      <w:r>
-        <w:rPr>
-          <w:rFonts w:eastAsia="Arial" w:cs="Arial" w:ascii="Garamond" w:hAnsi="Garamond"/>
-          <w:color w:val="auto"/>
-          <w:kern w:val="0"/>
-          <w:sz w:val="36"/>
-          <w:szCs w:val="36"/>
-          <w:lang w:val="en-US" w:eastAsia="zh-CN" w:bidi="hi-IN"/>
-        </w:rPr>
-        <w:t>na resposta que</w:t>
-      </w:r>
-      <w:r>
-        <w:rPr>
-          <w:rFonts w:eastAsia="Arial" w:cs="Arial" w:ascii="Garamond" w:hAnsi="Garamond"/>
-          <w:color w:val="auto"/>
-          <w:kern w:val="0"/>
-          <w:sz w:val="36"/>
-          <w:szCs w:val="36"/>
-          <w:lang w:val="en-US" w:eastAsia="zh-CN" w:bidi="hi-IN"/>
-        </w:rPr>
-        <w:t xml:space="preserve"> Jesus </w:t>
-      </w:r>
-      <w:r>
-        <w:rPr>
-          <w:rFonts w:eastAsia="Arial" w:cs="Arial" w:ascii="Garamond" w:hAnsi="Garamond"/>
-          <w:color w:val="auto"/>
-          <w:kern w:val="0"/>
-          <w:sz w:val="36"/>
-          <w:szCs w:val="36"/>
-          <w:lang w:val="en-US" w:eastAsia="zh-CN" w:bidi="hi-IN"/>
-        </w:rPr>
-        <w:t>d</w:t>
-      </w:r>
-      <w:r>
-        <w:rPr>
-          <w:rFonts w:eastAsia="Arial" w:cs="Arial" w:ascii="Garamond" w:hAnsi="Garamond"/>
-          <w:color w:val="auto"/>
-          <w:kern w:val="0"/>
-          <w:sz w:val="36"/>
-          <w:szCs w:val="36"/>
-          <w:lang w:val="en-US" w:eastAsia="zh-CN" w:bidi="hi-IN"/>
-        </w:rPr>
-        <w:t xml:space="preserve">ará </w:t>
-      </w:r>
-      <w:r>
-        <w:rPr>
-          <w:rFonts w:eastAsia="Arial" w:cs="Arial" w:ascii="Garamond" w:hAnsi="Garamond"/>
-          <w:color w:val="auto"/>
-          <w:kern w:val="0"/>
-          <w:sz w:val="36"/>
-          <w:szCs w:val="36"/>
-          <w:lang w:val="en-US" w:eastAsia="zh-CN" w:bidi="hi-IN"/>
-        </w:rPr>
-        <w:t>ao pedido de ajuda que fizemos</w:t>
-      </w:r>
-      <w:r>
-        <w:rPr>
-          <w:rFonts w:eastAsia="Arial" w:cs="Arial" w:ascii="Garamond" w:hAnsi="Garamond"/>
-          <w:color w:val="auto"/>
-          <w:kern w:val="0"/>
-          <w:sz w:val="36"/>
-          <w:szCs w:val="36"/>
-          <w:lang w:val="en-US" w:eastAsia="zh-CN" w:bidi="hi-IN"/>
-        </w:rPr>
-        <w:t xml:space="preserve">. </w:t>
+        <w:t xml:space="preserve"> então eu confio plenamente n'Ele. Mas, se a doença persistir, se agravar ou se a pessoa vier a desencarnar, minha confiança fica abalada. </w:t>
       </w:r>
     </w:p>
     <w:p>
@@ -4300,73 +3863,18 @@
           <w:szCs w:val="36"/>
           <w:lang w:val="en-US" w:eastAsia="zh-CN" w:bidi="hi-IN"/>
         </w:rPr>
-        <w:t xml:space="preserve">No fundo o meu desejo é que Jesus permita que a pessoa seja curada: se for assim então eu confio plenamente </w:t>
-      </w:r>
-      <w:r>
-        <w:rPr>
-          <w:rFonts w:eastAsia="Arial" w:cs="Arial" w:ascii="Garamond" w:hAnsi="Garamond"/>
-          <w:color w:val="auto"/>
-          <w:kern w:val="0"/>
-          <w:sz w:val="36"/>
-          <w:szCs w:val="36"/>
-          <w:lang w:val="en-US" w:eastAsia="zh-CN" w:bidi="hi-IN"/>
-        </w:rPr>
-        <w:t>n'Ele</w:t>
-      </w:r>
-      <w:r>
-        <w:rPr>
-          <w:rFonts w:eastAsia="Arial" w:cs="Arial" w:ascii="Garamond" w:hAnsi="Garamond"/>
-          <w:color w:val="auto"/>
-          <w:kern w:val="0"/>
-          <w:sz w:val="36"/>
-          <w:szCs w:val="36"/>
-          <w:lang w:val="en-US" w:eastAsia="zh-CN" w:bidi="hi-IN"/>
-        </w:rPr>
-        <w:t>. Mas</w:t>
-      </w:r>
-      <w:r>
-        <w:rPr>
-          <w:rFonts w:eastAsia="Arial" w:cs="Arial" w:ascii="Garamond" w:hAnsi="Garamond"/>
-          <w:color w:val="auto"/>
-          <w:kern w:val="0"/>
-          <w:sz w:val="36"/>
-          <w:szCs w:val="36"/>
-          <w:lang w:val="en-US" w:eastAsia="zh-CN" w:bidi="hi-IN"/>
-        </w:rPr>
-        <w:t xml:space="preserve">, </w:t>
-      </w:r>
-      <w:r>
-        <w:rPr>
-          <w:rFonts w:eastAsia="Arial" w:cs="Arial" w:ascii="Garamond" w:hAnsi="Garamond"/>
-          <w:color w:val="auto"/>
-          <w:kern w:val="0"/>
-          <w:sz w:val="36"/>
-          <w:szCs w:val="36"/>
-          <w:lang w:val="en-US" w:eastAsia="zh-CN" w:bidi="hi-IN"/>
-        </w:rPr>
-        <w:t>se a doença persistir, se agravar ou se a pessoa vier a desencarnar</w:t>
-      </w:r>
-      <w:r>
-        <w:rPr>
-          <w:rFonts w:eastAsia="Arial" w:cs="Arial" w:ascii="Garamond" w:hAnsi="Garamond"/>
-          <w:color w:val="auto"/>
-          <w:kern w:val="0"/>
-          <w:sz w:val="36"/>
-          <w:szCs w:val="36"/>
-          <w:lang w:val="en-US" w:eastAsia="zh-CN" w:bidi="hi-IN"/>
-        </w:rPr>
-        <w:t xml:space="preserve">, </w:t>
-      </w:r>
-      <w:r>
-        <w:rPr>
-          <w:rFonts w:eastAsia="Arial" w:cs="Arial" w:ascii="Garamond" w:hAnsi="Garamond"/>
-          <w:color w:val="auto"/>
-          <w:kern w:val="0"/>
-          <w:sz w:val="36"/>
-          <w:szCs w:val="36"/>
-          <w:lang w:val="en-US" w:eastAsia="zh-CN" w:bidi="hi-IN"/>
-        </w:rPr>
-        <w:t xml:space="preserve">minha confiança fica abalada. </w:t>
+        <w:t>Precisamos compreender que a</w:t>
+      </w:r>
+      <w:r>
+        <w:rPr>
+          <w:rFonts w:eastAsia="Arial" w:cs="Arial" w:ascii="Garamond" w:hAnsi="Garamond"/>
+          <w:color w:val="auto"/>
+          <w:kern w:val="0"/>
+          <w:sz w:val="36"/>
+          <w:szCs w:val="36"/>
+          <w:lang w:val="en-US" w:eastAsia="zh-CN" w:bidi="hi-IN"/>
+        </w:rPr>
+        <w:t xml:space="preserve"> Terra é para nós, lar, oficina de trabalho, hospital de almas e escola. Jesus é nosso Mestre e guia. Portanto, tudo que nos acontece  tem como objetivo nos educar. </w:t>
       </w:r>
     </w:p>
     <w:p>
@@ -4383,43 +3891,7 @@
         </w:rPr>
       </w:pPr>
       <w:r>
-        <w:rPr>
-          <w:rFonts w:eastAsia="Arial" w:cs="Arial" w:ascii="Garamond" w:hAnsi="Garamond"/>
-          <w:color w:val="auto"/>
-          <w:kern w:val="0"/>
-          <w:sz w:val="36"/>
-          <w:szCs w:val="36"/>
-          <w:lang w:val="en-US" w:eastAsia="zh-CN" w:bidi="hi-IN"/>
-        </w:rPr>
-      </w:r>
-    </w:p>
-    <w:p>
-      <w:pPr>
-        <w:pStyle w:val="Normal"/>
-        <w:jc w:val="both"/>
         <w:rPr/>
-      </w:pPr>
-      <w:r>
-        <w:rPr>
-          <w:rFonts w:eastAsia="Arial" w:cs="Arial" w:ascii="Garamond" w:hAnsi="Garamond"/>
-          <w:color w:val="auto"/>
-          <w:kern w:val="0"/>
-          <w:sz w:val="36"/>
-          <w:szCs w:val="36"/>
-          <w:lang w:val="en-US" w:eastAsia="zh-CN" w:bidi="hi-IN"/>
-        </w:rPr>
-        <w:t>No nosso atual estágio evolutivo, obedecer e confiar em Jesus ainda é um aprendizado em construção. Um trabalho que exige esforço, vigilância e fé constantes. Um trabalho longo que, se ainda não se iniciou, precisa começar hoje.</w:t>
-      </w:r>
-      <w:r>
-        <w:rPr>
-          <w:rFonts w:eastAsia="Arial" w:cs="Arial" w:ascii="Garamond" w:hAnsi="Garamond"/>
-          <w:color w:val="auto"/>
-          <w:kern w:val="0"/>
-          <w:sz w:val="36"/>
-          <w:szCs w:val="36"/>
-          <w:lang w:val="en-US" w:eastAsia="zh-CN" w:bidi="hi-IN"/>
-        </w:rPr>
-        <w:t xml:space="preserve"> &lt;&lt;&lt; Reescrever esse parágrafo &gt;&gt;&gt;</w:t>
       </w:r>
     </w:p>
     <w:p>
@@ -4444,6 +3916,7 @@
           <w:szCs w:val="36"/>
           <w:lang w:val="en-US" w:eastAsia="zh-CN" w:bidi="hi-IN"/>
         </w:rPr>
+        <w:t>Reconhecendo nossa condição de alunos, devemos seguir aprendendo e trabalhando com Jesus e para Jesus, confiando sempre que tudo aquilo que fazemos hoje, por mais simples que seja, nos encontrará com justiça no futuro.</w:t>
       </w:r>
     </w:p>
     <w:p>
@@ -4492,7 +3965,20 @@
           <w:szCs w:val="36"/>
           <w:lang w:val="en-US" w:eastAsia="zh-CN" w:bidi="hi-IN"/>
         </w:rPr>
-        <w:t xml:space="preserve">Maria aos pés da cruz - </w:t>
+        <w:t>Martírio e Crucificação</w:t>
+      </w:r>
+      <w:r>
+        <w:rPr>
+          <w:rFonts w:eastAsia="Arial" w:cs="Arial" w:ascii="Garamond" w:hAnsi="Garamond"/>
+          <w:b/>
+          <w:bCs/>
+          <w:color w:val="C9211E"/>
+          <w:kern w:val="0"/>
+          <w:sz w:val="36"/>
+          <w:szCs w:val="36"/>
+          <w:lang w:val="en-US" w:eastAsia="zh-CN" w:bidi="hi-IN"/>
+        </w:rPr>
+        <w:t xml:space="preserve"> - </w:t>
       </w:r>
       <w:r>
         <w:rPr>
@@ -4507,49 +3993,117 @@
           <w:szCs w:val="36"/>
           <w:lang w:val="en-US" w:eastAsia="zh-CN" w:bidi="hi-IN"/>
         </w:rPr>
-        <w:t>João 19:25-27</w:t>
-      </w:r>
-    </w:p>
-    <w:p>
-      <w:pPr>
-        <w:pStyle w:val="Normal"/>
-        <w:jc w:val="both"/>
-        <w:rPr>
-          <w:rFonts w:ascii="Garamond" w:hAnsi="Garamond"/>
-          <w:sz w:val="36"/>
-          <w:szCs w:val="36"/>
-        </w:rPr>
-      </w:pPr>
-      <w:r>
-        <w:rPr>
-          <w:rFonts w:ascii="Garamond" w:hAnsi="Garamond"/>
-          <w:sz w:val="36"/>
-          <w:szCs w:val="36"/>
-        </w:rPr>
-      </w:r>
-    </w:p>
-    <w:p>
-      <w:pPr>
-        <w:pStyle w:val="Normal"/>
-        <w:jc w:val="both"/>
-        <w:rPr>
-          <w:rFonts w:ascii="Garamond" w:hAnsi="Garamond"/>
-          <w:sz w:val="36"/>
-          <w:szCs w:val="36"/>
-        </w:rPr>
-      </w:pPr>
-      <w:r>
-        <w:rPr>
-          <w:rFonts w:eastAsia="Arial" w:cs="Arial" w:ascii="Garamond" w:hAnsi="Garamond"/>
+        <w:t>João 19:</w:t>
+      </w:r>
+      <w:r>
+        <w:rPr>
+          <w:rFonts w:eastAsia="Arial" w:cs="Arial" w:ascii="Garamond" w:hAnsi="Garamond"/>
+          <w:b/>
+          <w:bCs/>
           <w:i w:val="false"/>
           <w:iCs w:val="false"/>
-          <w:color w:val="auto"/>
-          <w:kern w:val="0"/>
-          <w:sz w:val="36"/>
-          <w:szCs w:val="36"/>
-          <w:lang w:val="en-US" w:eastAsia="zh-CN" w:bidi="hi-IN"/>
-        </w:rPr>
-        <w:t>Todo o texto desse tópico ainda está em forma de esboço e precisa ser refinado / desenvolvido.</w:t>
+          <w:color w:val="C9211E"/>
+          <w:kern w:val="0"/>
+          <w:sz w:val="36"/>
+          <w:szCs w:val="36"/>
+          <w:lang w:val="en-US" w:eastAsia="zh-CN" w:bidi="hi-IN"/>
+        </w:rPr>
+        <w:t>17</w:t>
+      </w:r>
+      <w:r>
+        <w:rPr>
+          <w:rFonts w:eastAsia="Arial" w:cs="Arial" w:ascii="Garamond" w:hAnsi="Garamond"/>
+          <w:b/>
+          <w:bCs/>
+          <w:i w:val="false"/>
+          <w:iCs w:val="false"/>
+          <w:color w:val="C9211E"/>
+          <w:kern w:val="0"/>
+          <w:sz w:val="36"/>
+          <w:szCs w:val="36"/>
+          <w:lang w:val="en-US" w:eastAsia="zh-CN" w:bidi="hi-IN"/>
+        </w:rPr>
+        <w:t>-27</w:t>
+      </w:r>
+    </w:p>
+    <w:p>
+      <w:pPr>
+        <w:pStyle w:val="Normal"/>
+        <w:jc w:val="both"/>
+        <w:rPr>
+          <w:rFonts w:ascii="Garamond" w:hAnsi="Garamond"/>
+          <w:sz w:val="36"/>
+          <w:szCs w:val="36"/>
+        </w:rPr>
+      </w:pPr>
+      <w:r>
+        <w:rPr>
+          <w:rFonts w:ascii="Garamond" w:hAnsi="Garamond"/>
+          <w:sz w:val="36"/>
+          <w:szCs w:val="36"/>
+        </w:rPr>
+      </w:r>
+    </w:p>
+    <w:p>
+      <w:pPr>
+        <w:pStyle w:val="Normal"/>
+        <w:jc w:val="both"/>
+        <w:rPr>
+          <w:rFonts w:ascii="Garamond" w:hAnsi="Garamond"/>
+          <w:sz w:val="36"/>
+          <w:szCs w:val="36"/>
+        </w:rPr>
+      </w:pPr>
+      <w:r>
+        <w:rPr>
+          <w:rFonts w:eastAsia="Arial" w:cs="Arial" w:ascii="Garamond" w:hAnsi="Garamond"/>
+          <w:i w:val="false"/>
+          <w:iCs w:val="false"/>
+          <w:color w:val="auto"/>
+          <w:kern w:val="0"/>
+          <w:sz w:val="36"/>
+          <w:szCs w:val="36"/>
+          <w:lang w:val="en-US" w:eastAsia="zh-CN" w:bidi="hi-IN"/>
+        </w:rPr>
+        <w:t>Essa passagem é de uma riqueza espiritual enorme.</w:t>
+      </w:r>
+    </w:p>
+    <w:p>
+      <w:pPr>
+        <w:pStyle w:val="Normal"/>
+        <w:jc w:val="both"/>
+        <w:rPr>
+          <w:rFonts w:ascii="Garamond" w:hAnsi="Garamond"/>
+          <w:sz w:val="36"/>
+          <w:szCs w:val="36"/>
+        </w:rPr>
+      </w:pPr>
+      <w:r>
+        <w:rPr/>
+      </w:r>
+    </w:p>
+    <w:p>
+      <w:pPr>
+        <w:pStyle w:val="Normal"/>
+        <w:jc w:val="both"/>
+        <w:rPr>
+          <w:rFonts w:ascii="Garamond" w:hAnsi="Garamond"/>
+          <w:sz w:val="36"/>
+          <w:szCs w:val="36"/>
+        </w:rPr>
+      </w:pPr>
+      <w:r>
+        <w:rPr>
+          <w:rFonts w:eastAsia="Arial" w:cs="Arial" w:ascii="Garamond" w:hAnsi="Garamond"/>
+          <w:i w:val="false"/>
+          <w:iCs w:val="false"/>
+          <w:color w:val="auto"/>
+          <w:kern w:val="0"/>
+          <w:sz w:val="36"/>
+          <w:szCs w:val="36"/>
+          <w:lang w:val="en-US" w:eastAsia="zh-CN" w:bidi="hi-IN"/>
+        </w:rPr>
+        <w:t>Primeiro, porque é nela que Jesus entrega João como filho a Maria, e Maria como mãe a João. Nos instantes derradeiros de Sua vida física, o Mestre eleva Maria à condição de mãe de toda a humanidade e nos ensina que o amor verdadeiro procede não apenas dos laços consanguíneos, mas, sim, da nossa herança divina.</w:t>
       </w:r>
     </w:p>
     <w:p>
@@ -4589,34 +4143,8 @@
           <w:shd w:fill="auto" w:val="clear"/>
           <w:lang w:val="en-US" w:eastAsia="zh-CN" w:bidi="hi-IN"/>
         </w:rPr>
-        <w:t>O ápice da submissão de Maria às vontades de Deus é a crucificação de Jesus. Maria presencia todos os sofrimentos do filho sem se revoltar contra Deus. Honrando o compromisso assumido quando o anjo Gabriel anunciou que ela seria a mãe de Jesus, Maria, apesar da dor lancinante ao presenciar os sofrimentos de Jesus no calvário, permanece resignada, compreendendo como ninguém que aquela era a vontade de Deus.</w:t>
-      </w:r>
-    </w:p>
-    <w:p>
-      <w:pPr>
-        <w:pStyle w:val="Normal"/>
-        <w:jc w:val="both"/>
-        <w:rPr>
-          <w:sz w:val="36"/>
-          <w:szCs w:val="36"/>
-        </w:rPr>
-      </w:pPr>
-      <w:r>
-        <w:rPr>
-          <w:sz w:val="36"/>
-          <w:szCs w:val="36"/>
-        </w:rPr>
-      </w:r>
-    </w:p>
-    <w:p>
-      <w:pPr>
-        <w:pStyle w:val="Normal"/>
-        <w:jc w:val="both"/>
-        <w:rPr>
-          <w:sz w:val="36"/>
-          <w:szCs w:val="36"/>
-        </w:rPr>
-      </w:pPr>
+        <w:t>Mas nesses versículos nós encontramos também, aquele que talvez seja o maior ato de</w:t>
+      </w:r>
       <w:r>
         <w:rPr>
           <w:rFonts w:eastAsia="Times New Roman" w:cs="Times New Roman" w:ascii="Garamond" w:hAnsi="Garamond"/>
@@ -4627,42 +4155,157 @@
           <w:shd w:fill="auto" w:val="clear"/>
           <w:lang w:val="en-US" w:eastAsia="zh-CN" w:bidi="hi-IN"/>
         </w:rPr>
-        <w:t>Na crucificação de Jesus, apesar de toda sua dor de mãe, Maria segue com Jesus até o derradeiro momento em que a vida física expira. É um exemplo enorme de amor e dedicação, um exemplo que ficou como um valioso ensinamento à toda humanidade (desenvolver essa ideia).</w:t>
-      </w:r>
-    </w:p>
-    <w:p>
-      <w:pPr>
-        <w:pStyle w:val="Normal"/>
-        <w:jc w:val="both"/>
-        <w:rPr>
-          <w:sz w:val="36"/>
-          <w:szCs w:val="36"/>
-        </w:rPr>
-      </w:pPr>
-      <w:r>
-        <w:rPr>
-          <w:sz w:val="36"/>
-          <w:szCs w:val="36"/>
-        </w:rPr>
-      </w:r>
-    </w:p>
-    <w:p>
-      <w:pPr>
-        <w:pStyle w:val="Normal"/>
-        <w:jc w:val="both"/>
-        <w:rPr>
-          <w:rFonts w:ascii="Garamond" w:hAnsi="Garamond"/>
-          <w:sz w:val="36"/>
-          <w:szCs w:val="36"/>
-        </w:rPr>
-      </w:pPr>
-      <w:r>
-        <w:rPr>
-          <w:rFonts w:eastAsia="Arial" w:cs="Arial" w:ascii="Garamond" w:hAnsi="Garamond"/>
-          <w:color w:val="auto"/>
-          <w:kern w:val="0"/>
-          <w:sz w:val="36"/>
-          <w:szCs w:val="36"/>
+        <w:t xml:space="preserve"> submissão de Maria às vontades de Deus</w:t>
+      </w:r>
+      <w:r>
+        <w:rPr>
+          <w:rFonts w:eastAsia="Times New Roman" w:cs="Times New Roman" w:ascii="Garamond" w:hAnsi="Garamond"/>
+          <w:color w:val="000000"/>
+          <w:kern w:val="0"/>
+          <w:sz w:val="36"/>
+          <w:szCs w:val="36"/>
+          <w:shd w:fill="auto" w:val="clear"/>
+          <w:lang w:val="en-US" w:eastAsia="zh-CN" w:bidi="hi-IN"/>
+        </w:rPr>
+        <w:t>. Ela presencia todos os sofrimentos, as ofensas, o escárnio, o desprezo, o ultraje cometidos contra o filho amado, o filho justo, que amou e abençoou incondicionalmente todos aqueles que cruzaram o Seu caminho.</w:t>
+      </w:r>
+    </w:p>
+    <w:p>
+      <w:pPr>
+        <w:pStyle w:val="Normal"/>
+        <w:jc w:val="both"/>
+        <w:rPr>
+          <w:sz w:val="36"/>
+          <w:szCs w:val="36"/>
+        </w:rPr>
+      </w:pPr>
+      <w:r>
+        <w:rPr/>
+      </w:r>
+    </w:p>
+    <w:p>
+      <w:pPr>
+        <w:pStyle w:val="Normal"/>
+        <w:jc w:val="both"/>
+        <w:rPr>
+          <w:sz w:val="36"/>
+          <w:szCs w:val="36"/>
+        </w:rPr>
+      </w:pPr>
+      <w:r>
+        <w:rPr>
+          <w:rFonts w:eastAsia="Times New Roman" w:cs="Times New Roman" w:ascii="Garamond" w:hAnsi="Garamond"/>
+          <w:color w:val="000000"/>
+          <w:kern w:val="0"/>
+          <w:sz w:val="36"/>
+          <w:szCs w:val="36"/>
+          <w:shd w:fill="auto" w:val="clear"/>
+          <w:lang w:val="en-US" w:eastAsia="zh-CN" w:bidi="hi-IN"/>
+        </w:rPr>
+        <w:t xml:space="preserve">Jesus, o Espírito puro, perfeito, o único que  não precisava experimentar nenhum dos sofrimentos humanos porque não tinha erros, não tinha pecados, viveu ali as dores físicas e morais do homem comum, o homem a quem Ele veio salvar através de seus exemplos e ensinamentos. </w:t>
+      </w:r>
+    </w:p>
+    <w:p>
+      <w:pPr>
+        <w:pStyle w:val="Normal"/>
+        <w:jc w:val="both"/>
+        <w:rPr>
+          <w:sz w:val="36"/>
+          <w:szCs w:val="36"/>
+        </w:rPr>
+      </w:pPr>
+      <w:r>
+        <w:rPr/>
+      </w:r>
+    </w:p>
+    <w:p>
+      <w:pPr>
+        <w:pStyle w:val="Normal"/>
+        <w:jc w:val="both"/>
+        <w:rPr>
+          <w:sz w:val="36"/>
+          <w:szCs w:val="36"/>
+        </w:rPr>
+      </w:pPr>
+      <w:r>
+        <w:rPr>
+          <w:rFonts w:eastAsia="Times New Roman" w:cs="Times New Roman" w:ascii="Garamond" w:hAnsi="Garamond"/>
+          <w:color w:val="000000"/>
+          <w:kern w:val="0"/>
+          <w:sz w:val="36"/>
+          <w:szCs w:val="36"/>
+          <w:shd w:fill="auto" w:val="clear"/>
+          <w:lang w:val="en-US" w:eastAsia="zh-CN" w:bidi="hi-IN"/>
+        </w:rPr>
+        <w:t>Mas Jesus sabia que tudo aqui era necessário para que se cumprisse a missão que o Pai atribuiu a ele.</w:t>
+      </w:r>
+    </w:p>
+    <w:p>
+      <w:pPr>
+        <w:pStyle w:val="Normal"/>
+        <w:jc w:val="both"/>
+        <w:rPr>
+          <w:sz w:val="36"/>
+          <w:szCs w:val="36"/>
+        </w:rPr>
+      </w:pPr>
+      <w:r>
+        <w:rPr/>
+      </w:r>
+    </w:p>
+    <w:p>
+      <w:pPr>
+        <w:pStyle w:val="Normal"/>
+        <w:jc w:val="both"/>
+        <w:rPr>
+          <w:sz w:val="36"/>
+          <w:szCs w:val="36"/>
+        </w:rPr>
+      </w:pPr>
+      <w:r>
+        <w:rPr>
+          <w:rFonts w:eastAsia="Times New Roman" w:cs="Times New Roman" w:ascii="Garamond" w:hAnsi="Garamond"/>
+          <w:color w:val="000000"/>
+          <w:kern w:val="0"/>
+          <w:sz w:val="36"/>
+          <w:szCs w:val="36"/>
+          <w:shd w:fill="auto" w:val="clear"/>
+          <w:lang w:val="en-US" w:eastAsia="zh-CN" w:bidi="hi-IN"/>
+        </w:rPr>
+        <w:t xml:space="preserve">Maria, que havia se entregado ao compromisso de receber o Messias prometido como seu próprio filho, também compreende que aquela era a vontade de Deus. Então ela não se revolta e nem renuncia ao compromisso assumido. </w:t>
+      </w:r>
+    </w:p>
+    <w:p>
+      <w:pPr>
+        <w:pStyle w:val="Normal"/>
+        <w:jc w:val="both"/>
+        <w:rPr>
+          <w:sz w:val="36"/>
+          <w:szCs w:val="36"/>
+        </w:rPr>
+      </w:pPr>
+      <w:r>
+        <w:rPr/>
+      </w:r>
+    </w:p>
+    <w:p>
+      <w:pPr>
+        <w:pStyle w:val="Normal"/>
+        <w:jc w:val="both"/>
+        <w:rPr>
+          <w:rFonts w:ascii="Garamond" w:hAnsi="Garamond"/>
+          <w:sz w:val="36"/>
+          <w:szCs w:val="36"/>
+        </w:rPr>
+      </w:pPr>
+      <w:r>
+        <w:rPr>
+          <w:rFonts w:eastAsia="Arial" w:cs="Arial" w:ascii="Garamond" w:hAnsi="Garamond"/>
+          <w:color w:val="000000"/>
+          <w:kern w:val="0"/>
+          <w:sz w:val="36"/>
+          <w:szCs w:val="36"/>
+          <w:shd w:fill="auto" w:val="clear"/>
           <w:lang w:val="en-US" w:eastAsia="zh-CN" w:bidi="hi-IN"/>
         </w:rPr>
         <w:t xml:space="preserve">No momento mais doloroso do ministério de Jesus, Maria permanece de pé, junto à cruz. Ela não tenta fugir, não protesta, não se revolta. Apenas permanece junto ao filho amado, injustamente crucificado. </w:t>
@@ -4679,146 +4322,31 @@
         </w:rPr>
       </w:pPr>
       <w:r>
-        <w:rPr>
-          <w:rFonts w:ascii="Garamond" w:hAnsi="Garamond"/>
-          <w:sz w:val="36"/>
-          <w:szCs w:val="36"/>
-        </w:rPr>
-      </w:r>
-    </w:p>
-    <w:p>
-      <w:pPr>
-        <w:pStyle w:val="Normal"/>
-        <w:jc w:val="both"/>
-        <w:rPr>
-          <w:rFonts w:ascii="Garamond" w:hAnsi="Garamond"/>
-          <w:sz w:val="36"/>
-          <w:szCs w:val="36"/>
-        </w:rPr>
-      </w:pPr>
-      <w:r>
-        <w:rPr>
-          <w:rFonts w:eastAsia="Arial" w:cs="Arial" w:ascii="Garamond" w:hAnsi="Garamond"/>
-          <w:color w:val="auto"/>
-          <w:kern w:val="0"/>
-          <w:sz w:val="36"/>
-          <w:szCs w:val="36"/>
-          <w:lang w:val="en-US" w:eastAsia="zh-CN" w:bidi="hi-IN"/>
-        </w:rPr>
-        <w:t>Humberto de Campos, na obra Boa Nova, psicografia de Chico Xavier, no capítulo 30, cujo título é Maria, nos dá detalhes sobre o sofrimento e as reflexões de Maria ao pé da cruz. Durante todo o tempo em que Maria ali permaneceu, mergulhada em suas reflexões, suas únicas palavras foram</w:t>
-      </w:r>
-    </w:p>
-    <w:p>
-      <w:pPr>
-        <w:pStyle w:val="Normal"/>
-        <w:jc w:val="both"/>
-        <w:rPr>
-          <w:rFonts w:ascii="Garamond" w:hAnsi="Garamond"/>
-          <w:sz w:val="36"/>
-          <w:szCs w:val="36"/>
-        </w:rPr>
-      </w:pPr>
-      <w:r>
-        <w:rPr>
-          <w:rFonts w:ascii="Garamond" w:hAnsi="Garamond"/>
-          <w:sz w:val="36"/>
-          <w:szCs w:val="36"/>
-        </w:rPr>
-      </w:r>
-    </w:p>
-    <w:p>
-      <w:pPr>
-        <w:pStyle w:val="Normal"/>
-        <w:ind w:left="720" w:hanging="0"/>
-        <w:jc w:val="both"/>
-        <w:rPr>
-          <w:i/>
-          <w:i/>
-          <w:iCs/>
-        </w:rPr>
-      </w:pPr>
-      <w:r>
-        <w:rPr>
-          <w:rFonts w:eastAsia="Arial" w:cs="Arial" w:ascii="Garamond" w:hAnsi="Garamond"/>
-          <w:i/>
-          <w:iCs/>
-          <w:color w:val="auto"/>
-          <w:kern w:val="0"/>
-          <w:sz w:val="36"/>
-          <w:szCs w:val="36"/>
-          <w:lang w:val="en-US" w:eastAsia="zh-CN" w:bidi="hi-IN"/>
-        </w:rPr>
-        <w:t>Meu filho! Meu amado filho!</w:t>
-      </w:r>
-    </w:p>
-    <w:p>
-      <w:pPr>
-        <w:pStyle w:val="Normal"/>
-        <w:jc w:val="both"/>
-        <w:rPr>
-          <w:rFonts w:ascii="Garamond" w:hAnsi="Garamond"/>
-          <w:sz w:val="36"/>
-          <w:szCs w:val="36"/>
-        </w:rPr>
-      </w:pPr>
-      <w:r>
-        <w:rPr>
-          <w:rFonts w:ascii="Garamond" w:hAnsi="Garamond"/>
-          <w:sz w:val="36"/>
-          <w:szCs w:val="36"/>
-        </w:rPr>
-      </w:r>
-    </w:p>
-    <w:p>
-      <w:pPr>
-        <w:pStyle w:val="Normal"/>
-        <w:jc w:val="both"/>
-        <w:rPr>
-          <w:rFonts w:ascii="Garamond" w:hAnsi="Garamond"/>
-          <w:sz w:val="36"/>
-          <w:szCs w:val="36"/>
-        </w:rPr>
-      </w:pPr>
-      <w:r>
-        <w:rPr>
-          <w:rFonts w:eastAsia="Arial" w:cs="Arial" w:ascii="Garamond" w:hAnsi="Garamond"/>
-          <w:color w:val="000000"/>
-          <w:kern w:val="0"/>
-          <w:sz w:val="36"/>
-          <w:szCs w:val="36"/>
-          <w:shd w:fill="auto" w:val="clear"/>
-          <w:lang w:val="en-US" w:eastAsia="zh-CN" w:bidi="hi-IN"/>
-        </w:rPr>
-        <w:t xml:space="preserve">O que fica evidente nessa passagem evangélica é  a fidelidade silenciosa, porém firme, de Maria. Ao lado do Filho crucificado, ela revela uma coragem que nasce da fé e do amor profundo, mesmo em meio à dor. </w:t>
-      </w:r>
-    </w:p>
-    <w:p>
-      <w:pPr>
-        <w:pStyle w:val="Normal"/>
-        <w:jc w:val="both"/>
-        <w:rPr>
-          <w:rFonts w:ascii="Garamond" w:hAnsi="Garamond"/>
-          <w:sz w:val="36"/>
-          <w:szCs w:val="36"/>
-        </w:rPr>
-      </w:pPr>
-      <w:r>
-        <w:rPr>
-          <w:rFonts w:ascii="Garamond" w:hAnsi="Garamond"/>
-          <w:sz w:val="36"/>
-          <w:szCs w:val="36"/>
-        </w:rPr>
-      </w:r>
-    </w:p>
-    <w:p>
-      <w:pPr>
-        <w:pStyle w:val="Normal"/>
-        <w:jc w:val="both"/>
-        <w:rPr>
-          <w:sz w:val="36"/>
-          <w:szCs w:val="36"/>
-        </w:rPr>
-      </w:pPr>
+        <w:rPr/>
+      </w:r>
+    </w:p>
+    <w:p>
+      <w:pPr>
+        <w:pStyle w:val="Normal"/>
+        <w:jc w:val="both"/>
+        <w:rPr>
+          <w:rFonts w:ascii="Garamond" w:hAnsi="Garamond"/>
+          <w:sz w:val="36"/>
+          <w:szCs w:val="36"/>
+        </w:rPr>
+      </w:pPr>
+      <w:r>
+        <w:rPr>
+          <w:rFonts w:eastAsia="Arial" w:cs="Arial" w:ascii="Garamond" w:hAnsi="Garamond"/>
+          <w:color w:val="000000"/>
+          <w:kern w:val="0"/>
+          <w:sz w:val="36"/>
+          <w:szCs w:val="36"/>
+          <w:shd w:fill="auto" w:val="clear"/>
+          <w:lang w:val="en-US" w:eastAsia="zh-CN" w:bidi="hi-IN"/>
+        </w:rPr>
+        <w:t xml:space="preserve">Também </w:t>
+      </w:r>
       <w:r>
         <w:rPr>
           <w:rFonts w:eastAsia="Times New Roman" w:cs="Times New Roman" w:ascii="Garamond" w:hAnsi="Garamond"/>
@@ -4829,57 +4357,1466 @@
           <w:shd w:fill="auto" w:val="clear"/>
           <w:lang w:val="en-US" w:eastAsia="zh-CN" w:bidi="hi-IN"/>
         </w:rPr>
-        <w:t xml:space="preserve">Aqui Maria nos dá um belíssimo exemplo de como servir na dor. </w:t>
-      </w:r>
-      <w:r>
-        <w:rPr>
-          <w:rFonts w:eastAsia="Arial" w:cs="Arial" w:ascii="Garamond" w:hAnsi="Garamond"/>
-          <w:color w:val="000000"/>
-          <w:kern w:val="0"/>
-          <w:sz w:val="36"/>
-          <w:szCs w:val="36"/>
-          <w:shd w:fill="auto" w:val="clear"/>
-          <w:lang w:val="en-US" w:eastAsia="zh-CN" w:bidi="hi-IN"/>
-        </w:rPr>
-        <w:t>Ela permanece ao lado de Jesus até o último instante, suportando com coragem e resignação.</w:t>
-      </w:r>
-    </w:p>
-    <w:p>
-      <w:pPr>
-        <w:pStyle w:val="Normal"/>
-        <w:jc w:val="both"/>
-        <w:rPr>
-          <w:sz w:val="36"/>
-          <w:szCs w:val="36"/>
-        </w:rPr>
-      </w:pPr>
-      <w:r>
-        <w:rPr>
-          <w:sz w:val="36"/>
-          <w:szCs w:val="36"/>
-        </w:rPr>
-      </w:r>
-    </w:p>
-    <w:p>
-      <w:pPr>
-        <w:pStyle w:val="Normal"/>
-        <w:jc w:val="both"/>
-        <w:rPr>
-          <w:sz w:val="36"/>
-          <w:szCs w:val="36"/>
-        </w:rPr>
-      </w:pPr>
-      <w:r>
-        <w:rPr>
-          <w:rFonts w:eastAsia="Arial" w:cs="Arial" w:ascii="Garamond" w:hAnsi="Garamond"/>
-          <w:color w:val="000000"/>
-          <w:kern w:val="0"/>
-          <w:sz w:val="36"/>
-          <w:szCs w:val="36"/>
-          <w:shd w:fill="auto" w:val="clear"/>
-          <w:lang w:val="en-US" w:eastAsia="zh-CN" w:bidi="hi-IN"/>
-        </w:rPr>
-        <w:t>Ela não serviu apenas nos momentos de glória, mas principalmente no sacrifício.</w:t>
+        <w:t>não condena nem amaldioça nenhum dos algozes de Jesus, nem os poderosos que o condenaram, nem os soldados que o crucificaram e muito menos os ingratos que foram amparados por Jesus, mas que o abandonaram naquele momento tão doloroso.</w:t>
+      </w:r>
+    </w:p>
+    <w:p>
+      <w:pPr>
+        <w:pStyle w:val="Normal"/>
+        <w:jc w:val="both"/>
+        <w:rPr>
+          <w:rFonts w:ascii="Garamond" w:hAnsi="Garamond"/>
+          <w:sz w:val="36"/>
+          <w:szCs w:val="36"/>
+        </w:rPr>
+      </w:pPr>
+      <w:r>
+        <w:rPr/>
+      </w:r>
+    </w:p>
+    <w:p>
+      <w:pPr>
+        <w:pStyle w:val="Normal"/>
+        <w:jc w:val="both"/>
+        <w:rPr>
+          <w:sz w:val="36"/>
+          <w:szCs w:val="36"/>
+        </w:rPr>
+      </w:pPr>
+      <w:r>
+        <w:rPr>
+          <w:rFonts w:eastAsia="Times New Roman" w:cs="Times New Roman" w:ascii="Garamond" w:hAnsi="Garamond"/>
+          <w:color w:val="000000"/>
+          <w:kern w:val="0"/>
+          <w:sz w:val="36"/>
+          <w:szCs w:val="36"/>
+          <w:shd w:fill="auto" w:val="clear"/>
+          <w:lang w:val="en-US" w:eastAsia="zh-CN" w:bidi="hi-IN"/>
+        </w:rPr>
+        <w:t>&lt;&lt;&lt; O texto abaixo tem que ser usado como parágrafo de ligação entre o fim desse tópico e o início do próximo.</w:t>
+      </w:r>
+    </w:p>
+    <w:p>
+      <w:pPr>
+        <w:pStyle w:val="Normal"/>
+        <w:jc w:val="both"/>
+        <w:rPr>
+          <w:sz w:val="36"/>
+          <w:szCs w:val="36"/>
+        </w:rPr>
+      </w:pPr>
+      <w:r>
+        <w:rPr/>
+      </w:r>
+    </w:p>
+    <w:p>
+      <w:pPr>
+        <w:pStyle w:val="Normal"/>
+        <w:jc w:val="both"/>
+        <w:rPr>
+          <w:sz w:val="36"/>
+          <w:szCs w:val="36"/>
+        </w:rPr>
+      </w:pPr>
+      <w:r>
+        <w:rPr>
+          <w:rFonts w:eastAsia="Times New Roman" w:cs="Times New Roman" w:ascii="Garamond" w:hAnsi="Garamond"/>
+          <w:color w:val="000000"/>
+          <w:kern w:val="0"/>
+          <w:sz w:val="36"/>
+          <w:szCs w:val="36"/>
+          <w:shd w:fill="auto" w:val="clear"/>
+          <w:lang w:val="en-US" w:eastAsia="zh-CN" w:bidi="hi-IN"/>
+        </w:rPr>
+        <w:t>Apesar de tudo isso, após a morte de Jesus, Maria não hesita em trabalhar pelo bem de todos. Ela poderia ter escolhido nada fazer pelos mais necessitados. Afinal de contas, o próprio povo condenou e executou seu filho inocente. Mas, a despeito disso, Maria manteve sua promessa feita desde o anúncio de que seria mãe do Messias: 'faça-se em mim segundo a tua palavra'.</w:t>
+      </w:r>
+    </w:p>
+    <w:p>
+      <w:pPr>
+        <w:pStyle w:val="Normal"/>
+        <w:jc w:val="both"/>
+        <w:rPr>
+          <w:sz w:val="36"/>
+          <w:szCs w:val="36"/>
+        </w:rPr>
+      </w:pPr>
+      <w:r>
+        <w:rPr/>
+      </w:r>
+    </w:p>
+    <w:p>
+      <w:pPr>
+        <w:pStyle w:val="Normal"/>
+        <w:jc w:val="both"/>
+        <w:rPr>
+          <w:sz w:val="36"/>
+          <w:szCs w:val="36"/>
+        </w:rPr>
+      </w:pPr>
+      <w:r>
+        <w:rPr/>
+      </w:r>
+    </w:p>
+    <w:p>
+      <w:pPr>
+        <w:pStyle w:val="Normal"/>
+        <w:jc w:val="both"/>
+        <w:rPr>
+          <w:sz w:val="36"/>
+          <w:szCs w:val="36"/>
+        </w:rPr>
+      </w:pPr>
+      <w:r>
+        <w:rPr/>
+      </w:r>
+    </w:p>
+    <w:p>
+      <w:pPr>
+        <w:pStyle w:val="Normal"/>
+        <w:jc w:val="both"/>
+        <w:rPr>
+          <w:sz w:val="36"/>
+          <w:szCs w:val="36"/>
+        </w:rPr>
+      </w:pPr>
+      <w:r>
+        <w:rPr>
+          <w:rFonts w:eastAsia="Times New Roman" w:cs="Times New Roman" w:ascii="Garamond" w:hAnsi="Garamond"/>
+          <w:color w:val="000000"/>
+          <w:kern w:val="0"/>
+          <w:sz w:val="36"/>
+          <w:szCs w:val="36"/>
+          <w:shd w:fill="auto" w:val="clear"/>
+          <w:lang w:val="en-US" w:eastAsia="zh-CN" w:bidi="hi-IN"/>
+        </w:rPr>
+        <w:t xml:space="preserve">&gt;&gt;&gt; </w:t>
+      </w:r>
+    </w:p>
+    <w:p>
+      <w:pPr>
+        <w:pStyle w:val="Normal"/>
+        <w:jc w:val="both"/>
+        <w:rPr>
+          <w:sz w:val="36"/>
+          <w:szCs w:val="36"/>
+        </w:rPr>
+      </w:pPr>
+      <w:r>
+        <w:rPr/>
+      </w:r>
+    </w:p>
+    <w:p>
+      <w:pPr>
+        <w:pStyle w:val="Normal"/>
+        <w:jc w:val="both"/>
+        <w:rPr>
+          <w:sz w:val="36"/>
+          <w:szCs w:val="36"/>
+        </w:rPr>
+      </w:pPr>
+      <w:r>
+        <w:rPr/>
+      </w:r>
+    </w:p>
+    <w:p>
+      <w:pPr>
+        <w:pStyle w:val="Normal"/>
+        <w:jc w:val="both"/>
+        <w:rPr>
+          <w:sz w:val="36"/>
+          <w:szCs w:val="36"/>
+        </w:rPr>
+      </w:pPr>
+      <w:r>
+        <w:rPr>
+          <w:rFonts w:eastAsia="Times New Roman" w:cs="Times New Roman" w:ascii="Garamond" w:hAnsi="Garamond"/>
+          <w:color w:val="000000"/>
+          <w:kern w:val="0"/>
+          <w:sz w:val="36"/>
+          <w:szCs w:val="36"/>
+          <w:shd w:fill="auto" w:val="clear"/>
+          <w:lang w:val="en-US" w:eastAsia="zh-CN" w:bidi="hi-IN"/>
+        </w:rPr>
+        <w:t>&lt;&lt;&lt;</w:t>
+      </w:r>
+    </w:p>
+    <w:p>
+      <w:pPr>
+        <w:pStyle w:val="Normal"/>
+        <w:jc w:val="both"/>
+        <w:rPr>
+          <w:sz w:val="36"/>
+          <w:szCs w:val="36"/>
+        </w:rPr>
+      </w:pPr>
+      <w:r>
+        <w:rPr>
+          <w:rFonts w:eastAsia="Times New Roman" w:cs="Times New Roman" w:ascii="Garamond" w:hAnsi="Garamond"/>
+          <w:color w:val="000000"/>
+          <w:kern w:val="0"/>
+          <w:sz w:val="36"/>
+          <w:szCs w:val="36"/>
+          <w:shd w:fill="auto" w:val="clear"/>
+          <w:lang w:val="en-US" w:eastAsia="zh-CN" w:bidi="hi-IN"/>
+        </w:rPr>
+        <w:t>Trazer os exemplos de Maria para nossas vidas: a resignação naqueles momentos em que, apesar de nossos esforços, das nossas orações, alguém amado passa por dificuldades sem que nada possamos fazer. Resta-nos compartilhar a dor, silenciosamente, aceitando sem revoltas que a vontade de Deus está se cumprindo.</w:t>
+      </w:r>
+    </w:p>
+    <w:p>
+      <w:pPr>
+        <w:pStyle w:val="Normal"/>
+        <w:jc w:val="both"/>
+        <w:rPr>
+          <w:sz w:val="36"/>
+          <w:szCs w:val="36"/>
+        </w:rPr>
+      </w:pPr>
+      <w:r>
+        <w:rPr/>
+      </w:r>
+    </w:p>
+    <w:p>
+      <w:pPr>
+        <w:pStyle w:val="Normal"/>
+        <w:jc w:val="both"/>
+        <w:rPr>
+          <w:sz w:val="36"/>
+          <w:szCs w:val="36"/>
+        </w:rPr>
+      </w:pPr>
+      <w:r>
+        <w:rPr>
+          <w:rFonts w:eastAsia="Times New Roman" w:cs="Times New Roman" w:ascii="Garamond" w:hAnsi="Garamond"/>
+          <w:color w:val="000000"/>
+          <w:kern w:val="0"/>
+          <w:sz w:val="36"/>
+          <w:szCs w:val="36"/>
+          <w:shd w:fill="auto" w:val="clear"/>
+          <w:lang w:val="en-US" w:eastAsia="zh-CN" w:bidi="hi-IN"/>
+        </w:rPr>
+        <w:t>Citar também o silêncio.</w:t>
+      </w:r>
+    </w:p>
+    <w:p>
+      <w:pPr>
+        <w:pStyle w:val="Normal"/>
+        <w:jc w:val="both"/>
+        <w:rPr>
+          <w:sz w:val="36"/>
+          <w:szCs w:val="36"/>
+        </w:rPr>
+      </w:pPr>
+      <w:r>
+        <w:rPr>
+          <w:rFonts w:eastAsia="Times New Roman" w:cs="Times New Roman" w:ascii="Garamond" w:hAnsi="Garamond"/>
+          <w:color w:val="000000"/>
+          <w:kern w:val="0"/>
+          <w:sz w:val="36"/>
+          <w:szCs w:val="36"/>
+          <w:shd w:fill="auto" w:val="clear"/>
+          <w:lang w:val="en-US" w:eastAsia="zh-CN" w:bidi="hi-IN"/>
+        </w:rPr>
+        <w:t>&gt;&gt;&gt;</w:t>
+      </w:r>
+    </w:p>
+    <w:p>
+      <w:pPr>
+        <w:pStyle w:val="Normal"/>
+        <w:jc w:val="both"/>
+        <w:rPr>
+          <w:sz w:val="36"/>
+          <w:szCs w:val="36"/>
+        </w:rPr>
+      </w:pPr>
+      <w:r>
+        <w:rPr/>
+      </w:r>
+    </w:p>
+    <w:p>
+      <w:pPr>
+        <w:pStyle w:val="Normal"/>
+        <w:jc w:val="both"/>
+        <w:rPr>
+          <w:sz w:val="36"/>
+          <w:szCs w:val="36"/>
+        </w:rPr>
+      </w:pPr>
+      <w:r>
+        <w:rPr>
+          <w:rFonts w:eastAsia="Arial" w:cs="Arial" w:ascii="Garamond" w:hAnsi="Garamond"/>
+          <w:color w:val="000000"/>
+          <w:kern w:val="0"/>
+          <w:sz w:val="36"/>
+          <w:szCs w:val="36"/>
+          <w:shd w:fill="auto" w:val="clear"/>
+          <w:lang w:val="en-US" w:eastAsia="zh-CN" w:bidi="hi-IN"/>
+        </w:rPr>
+        <w:t>&lt;&lt;&lt;</w:t>
+      </w:r>
+    </w:p>
+    <w:p>
+      <w:pPr>
+        <w:pStyle w:val="Normal"/>
+        <w:jc w:val="both"/>
+        <w:rPr>
+          <w:sz w:val="36"/>
+          <w:szCs w:val="36"/>
+        </w:rPr>
+      </w:pPr>
+      <w:r>
+        <w:rPr>
+          <w:rFonts w:eastAsia="Arial" w:cs="Arial" w:ascii="Garamond" w:hAnsi="Garamond"/>
+          <w:color w:val="000000"/>
+          <w:kern w:val="0"/>
+          <w:sz w:val="36"/>
+          <w:szCs w:val="36"/>
+          <w:shd w:fill="auto" w:val="clear"/>
+          <w:lang w:val="en-US" w:eastAsia="zh-CN" w:bidi="hi-IN"/>
+        </w:rPr>
+        <w:t>No trecho de **João 19:17-27**, que narra a crucificação de Jesus e a presença de Maria ao pé da cruz, podemos identificar com profundidade diversas virtudes que ela manifesta com notável grandeza espiritual. Aqui estão as principais:</w:t>
+      </w:r>
+    </w:p>
+    <w:p>
+      <w:pPr>
+        <w:pStyle w:val="Normal"/>
+        <w:jc w:val="both"/>
+        <w:rPr>
+          <w:sz w:val="36"/>
+          <w:szCs w:val="36"/>
+        </w:rPr>
+      </w:pPr>
+      <w:r>
+        <w:rPr/>
+      </w:r>
+    </w:p>
+    <w:p>
+      <w:pPr>
+        <w:pStyle w:val="Normal"/>
+        <w:jc w:val="both"/>
+        <w:rPr>
+          <w:sz w:val="36"/>
+          <w:szCs w:val="36"/>
+        </w:rPr>
+      </w:pPr>
+      <w:r>
+        <w:rPr>
+          <w:rFonts w:eastAsia="Arial" w:cs="Arial" w:ascii="Garamond" w:hAnsi="Garamond"/>
+          <w:color w:val="000000"/>
+          <w:kern w:val="0"/>
+          <w:sz w:val="36"/>
+          <w:szCs w:val="36"/>
+          <w:shd w:fill="auto" w:val="clear"/>
+          <w:lang w:val="en-US" w:eastAsia="zh-CN" w:bidi="hi-IN"/>
+        </w:rPr>
+        <w:t>---</w:t>
+      </w:r>
+    </w:p>
+    <w:p>
+      <w:pPr>
+        <w:pStyle w:val="Normal"/>
+        <w:jc w:val="both"/>
+        <w:rPr>
+          <w:sz w:val="36"/>
+          <w:szCs w:val="36"/>
+        </w:rPr>
+      </w:pPr>
+      <w:r>
+        <w:rPr/>
+      </w:r>
+    </w:p>
+    <w:p>
+      <w:pPr>
+        <w:pStyle w:val="Normal"/>
+        <w:jc w:val="both"/>
+        <w:rPr>
+          <w:sz w:val="36"/>
+          <w:szCs w:val="36"/>
+        </w:rPr>
+      </w:pPr>
+      <w:r>
+        <w:rPr>
+          <w:rFonts w:eastAsia="Arial" w:cs="Arial" w:ascii="Garamond" w:hAnsi="Garamond"/>
+          <w:color w:val="000000"/>
+          <w:kern w:val="0"/>
+          <w:sz w:val="36"/>
+          <w:szCs w:val="36"/>
+          <w:shd w:fill="auto" w:val="clear"/>
+          <w:lang w:val="en-US" w:eastAsia="zh-CN" w:bidi="hi-IN"/>
+        </w:rPr>
+        <w:t>### ✨ 1. **Coragem**</w:t>
+      </w:r>
+    </w:p>
+    <w:p>
+      <w:pPr>
+        <w:pStyle w:val="Normal"/>
+        <w:jc w:val="both"/>
+        <w:rPr>
+          <w:sz w:val="36"/>
+          <w:szCs w:val="36"/>
+        </w:rPr>
+      </w:pPr>
+      <w:r>
+        <w:rPr/>
+      </w:r>
+    </w:p>
+    <w:p>
+      <w:pPr>
+        <w:pStyle w:val="Normal"/>
+        <w:jc w:val="both"/>
+        <w:rPr>
+          <w:sz w:val="36"/>
+          <w:szCs w:val="36"/>
+        </w:rPr>
+      </w:pPr>
+      <w:r>
+        <w:rPr>
+          <w:rFonts w:eastAsia="Arial" w:cs="Arial" w:ascii="Garamond" w:hAnsi="Garamond"/>
+          <w:color w:val="000000"/>
+          <w:kern w:val="0"/>
+          <w:sz w:val="36"/>
+          <w:szCs w:val="36"/>
+          <w:shd w:fill="auto" w:val="clear"/>
+          <w:lang w:val="en-US" w:eastAsia="zh-CN" w:bidi="hi-IN"/>
+        </w:rPr>
+        <w:t>Mesmo diante de uma cena brutal e humilhante, Maria **não se esconde**. Ela permanece ao lado do Filho, diante da violência e do ódio público, enfrentando o perigo, a dor e a exposição. Sua coragem não é impulsiva, mas silenciosa, sustentada pela fé e pelo amor.</w:t>
+      </w:r>
+    </w:p>
+    <w:p>
+      <w:pPr>
+        <w:pStyle w:val="Normal"/>
+        <w:jc w:val="both"/>
+        <w:rPr>
+          <w:sz w:val="36"/>
+          <w:szCs w:val="36"/>
+        </w:rPr>
+      </w:pPr>
+      <w:r>
+        <w:rPr/>
+      </w:r>
+    </w:p>
+    <w:p>
+      <w:pPr>
+        <w:pStyle w:val="Normal"/>
+        <w:jc w:val="both"/>
+        <w:rPr>
+          <w:sz w:val="36"/>
+          <w:szCs w:val="36"/>
+        </w:rPr>
+      </w:pPr>
+      <w:r>
+        <w:rPr>
+          <w:rFonts w:eastAsia="Arial" w:cs="Arial" w:ascii="Garamond" w:hAnsi="Garamond"/>
+          <w:color w:val="000000"/>
+          <w:kern w:val="0"/>
+          <w:sz w:val="36"/>
+          <w:szCs w:val="36"/>
+          <w:shd w:fill="auto" w:val="clear"/>
+          <w:lang w:val="en-US" w:eastAsia="zh-CN" w:bidi="hi-IN"/>
+        </w:rPr>
+        <w:t>&gt; ➤ *"Junto à cruz de Jesus estavam sua mãe..."* (João 19:25)</w:t>
+      </w:r>
+    </w:p>
+    <w:p>
+      <w:pPr>
+        <w:pStyle w:val="Normal"/>
+        <w:jc w:val="both"/>
+        <w:rPr>
+          <w:sz w:val="36"/>
+          <w:szCs w:val="36"/>
+        </w:rPr>
+      </w:pPr>
+      <w:r>
+        <w:rPr/>
+      </w:r>
+    </w:p>
+    <w:p>
+      <w:pPr>
+        <w:pStyle w:val="Normal"/>
+        <w:jc w:val="both"/>
+        <w:rPr>
+          <w:sz w:val="36"/>
+          <w:szCs w:val="36"/>
+        </w:rPr>
+      </w:pPr>
+      <w:r>
+        <w:rPr>
+          <w:rFonts w:eastAsia="Arial" w:cs="Arial" w:ascii="Garamond" w:hAnsi="Garamond"/>
+          <w:color w:val="000000"/>
+          <w:kern w:val="0"/>
+          <w:sz w:val="36"/>
+          <w:szCs w:val="36"/>
+          <w:shd w:fill="auto" w:val="clear"/>
+          <w:lang w:val="en-US" w:eastAsia="zh-CN" w:bidi="hi-IN"/>
+        </w:rPr>
+        <w:t>---</w:t>
+      </w:r>
+    </w:p>
+    <w:p>
+      <w:pPr>
+        <w:pStyle w:val="Normal"/>
+        <w:jc w:val="both"/>
+        <w:rPr>
+          <w:sz w:val="36"/>
+          <w:szCs w:val="36"/>
+        </w:rPr>
+      </w:pPr>
+      <w:r>
+        <w:rPr/>
+      </w:r>
+    </w:p>
+    <w:p>
+      <w:pPr>
+        <w:pStyle w:val="Normal"/>
+        <w:jc w:val="both"/>
+        <w:rPr>
+          <w:sz w:val="36"/>
+          <w:szCs w:val="36"/>
+        </w:rPr>
+      </w:pPr>
+      <w:r>
+        <w:rPr>
+          <w:rFonts w:eastAsia="Arial" w:cs="Arial" w:ascii="Garamond" w:hAnsi="Garamond"/>
+          <w:color w:val="000000"/>
+          <w:kern w:val="0"/>
+          <w:sz w:val="36"/>
+          <w:szCs w:val="36"/>
+          <w:shd w:fill="auto" w:val="clear"/>
+          <w:lang w:val="en-US" w:eastAsia="zh-CN" w:bidi="hi-IN"/>
+        </w:rPr>
+        <w:t>### ✨ 2. **Fidelidade**</w:t>
+      </w:r>
+    </w:p>
+    <w:p>
+      <w:pPr>
+        <w:pStyle w:val="Normal"/>
+        <w:jc w:val="both"/>
+        <w:rPr>
+          <w:sz w:val="36"/>
+          <w:szCs w:val="36"/>
+        </w:rPr>
+      </w:pPr>
+      <w:r>
+        <w:rPr/>
+      </w:r>
+    </w:p>
+    <w:p>
+      <w:pPr>
+        <w:pStyle w:val="Normal"/>
+        <w:jc w:val="both"/>
+        <w:rPr>
+          <w:sz w:val="36"/>
+          <w:szCs w:val="36"/>
+        </w:rPr>
+      </w:pPr>
+      <w:r>
+        <w:rPr>
+          <w:rFonts w:eastAsia="Arial" w:cs="Arial" w:ascii="Garamond" w:hAnsi="Garamond"/>
+          <w:color w:val="000000"/>
+          <w:kern w:val="0"/>
+          <w:sz w:val="36"/>
+          <w:szCs w:val="36"/>
+          <w:shd w:fill="auto" w:val="clear"/>
+          <w:lang w:val="en-US" w:eastAsia="zh-CN" w:bidi="hi-IN"/>
+        </w:rPr>
+        <w:t>Maria permanece **fiel até o fim**, como poucas pessoas conseguiram. Não apenas fiel a Jesus enquanto Filho, mas fiel à missão divina que ela aceitou desde a anunciação: ser instrumento do amor de Deus.</w:t>
+      </w:r>
+    </w:p>
+    <w:p>
+      <w:pPr>
+        <w:pStyle w:val="Normal"/>
+        <w:jc w:val="both"/>
+        <w:rPr>
+          <w:sz w:val="36"/>
+          <w:szCs w:val="36"/>
+        </w:rPr>
+      </w:pPr>
+      <w:r>
+        <w:rPr/>
+      </w:r>
+    </w:p>
+    <w:p>
+      <w:pPr>
+        <w:pStyle w:val="Normal"/>
+        <w:jc w:val="both"/>
+        <w:rPr>
+          <w:sz w:val="36"/>
+          <w:szCs w:val="36"/>
+        </w:rPr>
+      </w:pPr>
+      <w:r>
+        <w:rPr>
+          <w:rFonts w:eastAsia="Arial" w:cs="Arial" w:ascii="Garamond" w:hAnsi="Garamond"/>
+          <w:color w:val="000000"/>
+          <w:kern w:val="0"/>
+          <w:sz w:val="36"/>
+          <w:szCs w:val="36"/>
+          <w:shd w:fill="auto" w:val="clear"/>
+          <w:lang w:val="en-US" w:eastAsia="zh-CN" w:bidi="hi-IN"/>
+        </w:rPr>
+        <w:t>---</w:t>
+      </w:r>
+    </w:p>
+    <w:p>
+      <w:pPr>
+        <w:pStyle w:val="Normal"/>
+        <w:jc w:val="both"/>
+        <w:rPr>
+          <w:sz w:val="36"/>
+          <w:szCs w:val="36"/>
+        </w:rPr>
+      </w:pPr>
+      <w:r>
+        <w:rPr/>
+      </w:r>
+    </w:p>
+    <w:p>
+      <w:pPr>
+        <w:pStyle w:val="Normal"/>
+        <w:jc w:val="both"/>
+        <w:rPr>
+          <w:sz w:val="36"/>
+          <w:szCs w:val="36"/>
+        </w:rPr>
+      </w:pPr>
+      <w:r>
+        <w:rPr>
+          <w:rFonts w:eastAsia="Arial" w:cs="Arial" w:ascii="Garamond" w:hAnsi="Garamond"/>
+          <w:color w:val="000000"/>
+          <w:kern w:val="0"/>
+          <w:sz w:val="36"/>
+          <w:szCs w:val="36"/>
+          <w:shd w:fill="auto" w:val="clear"/>
+          <w:lang w:val="en-US" w:eastAsia="zh-CN" w:bidi="hi-IN"/>
+        </w:rPr>
+        <w:t>### ✨ 3. **Renúncia**</w:t>
+      </w:r>
+    </w:p>
+    <w:p>
+      <w:pPr>
+        <w:pStyle w:val="Normal"/>
+        <w:jc w:val="both"/>
+        <w:rPr>
+          <w:sz w:val="36"/>
+          <w:szCs w:val="36"/>
+        </w:rPr>
+      </w:pPr>
+      <w:r>
+        <w:rPr/>
+      </w:r>
+    </w:p>
+    <w:p>
+      <w:pPr>
+        <w:pStyle w:val="Normal"/>
+        <w:jc w:val="both"/>
+        <w:rPr>
+          <w:sz w:val="36"/>
+          <w:szCs w:val="36"/>
+        </w:rPr>
+      </w:pPr>
+      <w:r>
+        <w:rPr>
+          <w:rFonts w:eastAsia="Arial" w:cs="Arial" w:ascii="Garamond" w:hAnsi="Garamond"/>
+          <w:color w:val="000000"/>
+          <w:kern w:val="0"/>
+          <w:sz w:val="36"/>
+          <w:szCs w:val="36"/>
+          <w:shd w:fill="auto" w:val="clear"/>
+          <w:lang w:val="en-US" w:eastAsia="zh-CN" w:bidi="hi-IN"/>
+        </w:rPr>
+        <w:t>Ver um filho padecer injustamente e, ainda assim, **não se revoltar** contra a vontade divina exige imensa renúncia. Maria, silenciosa, entrega mais uma vez Jesus a Deus, com a mesma disposição com que O acolheu em Belém.</w:t>
+      </w:r>
+    </w:p>
+    <w:p>
+      <w:pPr>
+        <w:pStyle w:val="Normal"/>
+        <w:jc w:val="both"/>
+        <w:rPr>
+          <w:sz w:val="36"/>
+          <w:szCs w:val="36"/>
+        </w:rPr>
+      </w:pPr>
+      <w:r>
+        <w:rPr/>
+      </w:r>
+    </w:p>
+    <w:p>
+      <w:pPr>
+        <w:pStyle w:val="Normal"/>
+        <w:jc w:val="both"/>
+        <w:rPr>
+          <w:sz w:val="36"/>
+          <w:szCs w:val="36"/>
+        </w:rPr>
+      </w:pPr>
+      <w:r>
+        <w:rPr>
+          <w:rFonts w:eastAsia="Arial" w:cs="Arial" w:ascii="Garamond" w:hAnsi="Garamond"/>
+          <w:color w:val="000000"/>
+          <w:kern w:val="0"/>
+          <w:sz w:val="36"/>
+          <w:szCs w:val="36"/>
+          <w:shd w:fill="auto" w:val="clear"/>
+          <w:lang w:val="en-US" w:eastAsia="zh-CN" w:bidi="hi-IN"/>
+        </w:rPr>
+        <w:t>---</w:t>
+      </w:r>
+    </w:p>
+    <w:p>
+      <w:pPr>
+        <w:pStyle w:val="Normal"/>
+        <w:jc w:val="both"/>
+        <w:rPr>
+          <w:sz w:val="36"/>
+          <w:szCs w:val="36"/>
+        </w:rPr>
+      </w:pPr>
+      <w:r>
+        <w:rPr/>
+      </w:r>
+    </w:p>
+    <w:p>
+      <w:pPr>
+        <w:pStyle w:val="Normal"/>
+        <w:jc w:val="both"/>
+        <w:rPr>
+          <w:sz w:val="36"/>
+          <w:szCs w:val="36"/>
+        </w:rPr>
+      </w:pPr>
+      <w:r>
+        <w:rPr>
+          <w:rFonts w:eastAsia="Arial" w:cs="Arial" w:ascii="Garamond" w:hAnsi="Garamond"/>
+          <w:color w:val="000000"/>
+          <w:kern w:val="0"/>
+          <w:sz w:val="36"/>
+          <w:szCs w:val="36"/>
+          <w:shd w:fill="auto" w:val="clear"/>
+          <w:lang w:val="en-US" w:eastAsia="zh-CN" w:bidi="hi-IN"/>
+        </w:rPr>
+        <w:t>### ✨ 4. **Silêncio Amoroso**</w:t>
+      </w:r>
+    </w:p>
+    <w:p>
+      <w:pPr>
+        <w:pStyle w:val="Normal"/>
+        <w:jc w:val="both"/>
+        <w:rPr>
+          <w:sz w:val="36"/>
+          <w:szCs w:val="36"/>
+        </w:rPr>
+      </w:pPr>
+      <w:r>
+        <w:rPr/>
+      </w:r>
+    </w:p>
+    <w:p>
+      <w:pPr>
+        <w:pStyle w:val="Normal"/>
+        <w:jc w:val="both"/>
+        <w:rPr>
+          <w:sz w:val="36"/>
+          <w:szCs w:val="36"/>
+        </w:rPr>
+      </w:pPr>
+      <w:r>
+        <w:rPr>
+          <w:rFonts w:eastAsia="Arial" w:cs="Arial" w:ascii="Garamond" w:hAnsi="Garamond"/>
+          <w:color w:val="000000"/>
+          <w:kern w:val="0"/>
+          <w:sz w:val="36"/>
+          <w:szCs w:val="36"/>
+          <w:shd w:fill="auto" w:val="clear"/>
+          <w:lang w:val="en-US" w:eastAsia="zh-CN" w:bidi="hi-IN"/>
+        </w:rPr>
+        <w:t>Maria **não diz nenhuma palavra** no relato da crucificação — e esse silêncio é cheio de significado. É o silêncio de quem compreende que há dores que não se explicam, apenas se acolhem. Um silêncio que respeita o mistério da vontade divina.</w:t>
+      </w:r>
+    </w:p>
+    <w:p>
+      <w:pPr>
+        <w:pStyle w:val="Normal"/>
+        <w:jc w:val="both"/>
+        <w:rPr>
+          <w:sz w:val="36"/>
+          <w:szCs w:val="36"/>
+        </w:rPr>
+      </w:pPr>
+      <w:r>
+        <w:rPr/>
+      </w:r>
+    </w:p>
+    <w:p>
+      <w:pPr>
+        <w:pStyle w:val="Normal"/>
+        <w:jc w:val="both"/>
+        <w:rPr>
+          <w:sz w:val="36"/>
+          <w:szCs w:val="36"/>
+        </w:rPr>
+      </w:pPr>
+      <w:r>
+        <w:rPr>
+          <w:rFonts w:eastAsia="Arial" w:cs="Arial" w:ascii="Garamond" w:hAnsi="Garamond"/>
+          <w:color w:val="000000"/>
+          <w:kern w:val="0"/>
+          <w:sz w:val="36"/>
+          <w:szCs w:val="36"/>
+          <w:shd w:fill="auto" w:val="clear"/>
+          <w:lang w:val="en-US" w:eastAsia="zh-CN" w:bidi="hi-IN"/>
+        </w:rPr>
+        <w:t>---</w:t>
+      </w:r>
+    </w:p>
+    <w:p>
+      <w:pPr>
+        <w:pStyle w:val="Normal"/>
+        <w:jc w:val="both"/>
+        <w:rPr>
+          <w:sz w:val="36"/>
+          <w:szCs w:val="36"/>
+        </w:rPr>
+      </w:pPr>
+      <w:r>
+        <w:rPr/>
+      </w:r>
+    </w:p>
+    <w:p>
+      <w:pPr>
+        <w:pStyle w:val="Normal"/>
+        <w:jc w:val="both"/>
+        <w:rPr>
+          <w:sz w:val="36"/>
+          <w:szCs w:val="36"/>
+        </w:rPr>
+      </w:pPr>
+      <w:r>
+        <w:rPr>
+          <w:rFonts w:eastAsia="Arial" w:cs="Arial" w:ascii="Garamond" w:hAnsi="Garamond"/>
+          <w:color w:val="000000"/>
+          <w:kern w:val="0"/>
+          <w:sz w:val="36"/>
+          <w:szCs w:val="36"/>
+          <w:shd w:fill="auto" w:val="clear"/>
+          <w:lang w:val="en-US" w:eastAsia="zh-CN" w:bidi="hi-IN"/>
+        </w:rPr>
+        <w:t>### ✨ 5. **Compaixão e entrega**</w:t>
+      </w:r>
+    </w:p>
+    <w:p>
+      <w:pPr>
+        <w:pStyle w:val="Normal"/>
+        <w:jc w:val="both"/>
+        <w:rPr>
+          <w:sz w:val="36"/>
+          <w:szCs w:val="36"/>
+        </w:rPr>
+      </w:pPr>
+      <w:r>
+        <w:rPr/>
+      </w:r>
+    </w:p>
+    <w:p>
+      <w:pPr>
+        <w:pStyle w:val="Normal"/>
+        <w:jc w:val="both"/>
+        <w:rPr>
+          <w:sz w:val="36"/>
+          <w:szCs w:val="36"/>
+        </w:rPr>
+      </w:pPr>
+      <w:r>
+        <w:rPr>
+          <w:rFonts w:eastAsia="Arial" w:cs="Arial" w:ascii="Garamond" w:hAnsi="Garamond"/>
+          <w:color w:val="000000"/>
+          <w:kern w:val="0"/>
+          <w:sz w:val="36"/>
+          <w:szCs w:val="36"/>
+          <w:shd w:fill="auto" w:val="clear"/>
+          <w:lang w:val="en-US" w:eastAsia="zh-CN" w:bidi="hi-IN"/>
+        </w:rPr>
+        <w:t>Ao aceitar João como filho, Maria **alarga seu coração**. Mesmo dilacerada pela dor, ela **não se fecha em si mesma**, mas continua a servir. Jesus a convida a **abraçar a humanidade**, e ela aceita.</w:t>
+      </w:r>
+    </w:p>
+    <w:p>
+      <w:pPr>
+        <w:pStyle w:val="Normal"/>
+        <w:jc w:val="both"/>
+        <w:rPr>
+          <w:sz w:val="36"/>
+          <w:szCs w:val="36"/>
+        </w:rPr>
+      </w:pPr>
+      <w:r>
+        <w:rPr/>
+      </w:r>
+    </w:p>
+    <w:p>
+      <w:pPr>
+        <w:pStyle w:val="Normal"/>
+        <w:jc w:val="both"/>
+        <w:rPr>
+          <w:sz w:val="36"/>
+          <w:szCs w:val="36"/>
+        </w:rPr>
+      </w:pPr>
+      <w:r>
+        <w:rPr>
+          <w:rFonts w:eastAsia="Arial" w:cs="Arial" w:ascii="Garamond" w:hAnsi="Garamond"/>
+          <w:color w:val="000000"/>
+          <w:kern w:val="0"/>
+          <w:sz w:val="36"/>
+          <w:szCs w:val="36"/>
+          <w:shd w:fill="auto" w:val="clear"/>
+          <w:lang w:val="en-US" w:eastAsia="zh-CN" w:bidi="hi-IN"/>
+        </w:rPr>
+        <w:t>&gt; ➤ *"Mulher, eis aí teu filho... Eis aí tua mãe."* (João 19:26-27)</w:t>
+      </w:r>
+    </w:p>
+    <w:p>
+      <w:pPr>
+        <w:pStyle w:val="Normal"/>
+        <w:jc w:val="both"/>
+        <w:rPr>
+          <w:sz w:val="36"/>
+          <w:szCs w:val="36"/>
+        </w:rPr>
+      </w:pPr>
+      <w:r>
+        <w:rPr/>
+      </w:r>
+    </w:p>
+    <w:p>
+      <w:pPr>
+        <w:pStyle w:val="Normal"/>
+        <w:jc w:val="both"/>
+        <w:rPr>
+          <w:sz w:val="36"/>
+          <w:szCs w:val="36"/>
+        </w:rPr>
+      </w:pPr>
+      <w:r>
+        <w:rPr>
+          <w:rFonts w:eastAsia="Arial" w:cs="Arial" w:ascii="Garamond" w:hAnsi="Garamond"/>
+          <w:color w:val="000000"/>
+          <w:kern w:val="0"/>
+          <w:sz w:val="36"/>
+          <w:szCs w:val="36"/>
+          <w:shd w:fill="auto" w:val="clear"/>
+          <w:lang w:val="en-US" w:eastAsia="zh-CN" w:bidi="hi-IN"/>
+        </w:rPr>
+        <w:t>---</w:t>
+      </w:r>
+    </w:p>
+    <w:p>
+      <w:pPr>
+        <w:pStyle w:val="Normal"/>
+        <w:jc w:val="both"/>
+        <w:rPr>
+          <w:sz w:val="36"/>
+          <w:szCs w:val="36"/>
+        </w:rPr>
+      </w:pPr>
+      <w:r>
+        <w:rPr/>
+      </w:r>
+    </w:p>
+    <w:p>
+      <w:pPr>
+        <w:pStyle w:val="Normal"/>
+        <w:jc w:val="both"/>
+        <w:rPr>
+          <w:sz w:val="36"/>
+          <w:szCs w:val="36"/>
+        </w:rPr>
+      </w:pPr>
+      <w:r>
+        <w:rPr>
+          <w:rFonts w:eastAsia="Arial" w:cs="Arial" w:ascii="Garamond" w:hAnsi="Garamond"/>
+          <w:color w:val="000000"/>
+          <w:kern w:val="0"/>
+          <w:sz w:val="36"/>
+          <w:szCs w:val="36"/>
+          <w:shd w:fill="auto" w:val="clear"/>
+          <w:lang w:val="en-US" w:eastAsia="zh-CN" w:bidi="hi-IN"/>
+        </w:rPr>
+        <w:t>### ✨ 6. **Disposição em servir — mesmo na dor**</w:t>
+      </w:r>
+    </w:p>
+    <w:p>
+      <w:pPr>
+        <w:pStyle w:val="Normal"/>
+        <w:jc w:val="both"/>
+        <w:rPr>
+          <w:sz w:val="36"/>
+          <w:szCs w:val="36"/>
+        </w:rPr>
+      </w:pPr>
+      <w:r>
+        <w:rPr/>
+      </w:r>
+    </w:p>
+    <w:p>
+      <w:pPr>
+        <w:pStyle w:val="Normal"/>
+        <w:jc w:val="both"/>
+        <w:rPr>
+          <w:sz w:val="36"/>
+          <w:szCs w:val="36"/>
+        </w:rPr>
+      </w:pPr>
+      <w:r>
+        <w:rPr>
+          <w:rFonts w:eastAsia="Arial" w:cs="Arial" w:ascii="Garamond" w:hAnsi="Garamond"/>
+          <w:color w:val="000000"/>
+          <w:kern w:val="0"/>
+          <w:sz w:val="36"/>
+          <w:szCs w:val="36"/>
+          <w:shd w:fill="auto" w:val="clear"/>
+          <w:lang w:val="en-US" w:eastAsia="zh-CN" w:bidi="hi-IN"/>
+        </w:rPr>
+        <w:t>Esse é o ponto central da sua palestra. A crucificação seria o momento mais justificável para se recolher na dor. Mas não: ali, **Maria recebe uma nova missão** — ser mãe espiritual de todos. E ela **aceita**, em silêncio, como serva do Senhor.</w:t>
+      </w:r>
+    </w:p>
+    <w:p>
+      <w:pPr>
+        <w:pStyle w:val="Normal"/>
+        <w:jc w:val="both"/>
+        <w:rPr>
+          <w:sz w:val="36"/>
+          <w:szCs w:val="36"/>
+        </w:rPr>
+      </w:pPr>
+      <w:r>
+        <w:rPr/>
+      </w:r>
+    </w:p>
+    <w:p>
+      <w:pPr>
+        <w:pStyle w:val="Normal"/>
+        <w:jc w:val="both"/>
+        <w:rPr>
+          <w:sz w:val="36"/>
+          <w:szCs w:val="36"/>
+        </w:rPr>
+      </w:pPr>
+      <w:r>
+        <w:rPr>
+          <w:rFonts w:eastAsia="Arial" w:cs="Arial" w:ascii="Garamond" w:hAnsi="Garamond"/>
+          <w:color w:val="000000"/>
+          <w:kern w:val="0"/>
+          <w:sz w:val="36"/>
+          <w:szCs w:val="36"/>
+          <w:shd w:fill="auto" w:val="clear"/>
+          <w:lang w:val="en-US" w:eastAsia="zh-CN" w:bidi="hi-IN"/>
+        </w:rPr>
+        <w:t>---</w:t>
+      </w:r>
+    </w:p>
+    <w:p>
+      <w:pPr>
+        <w:pStyle w:val="Normal"/>
+        <w:jc w:val="both"/>
+        <w:rPr>
+          <w:sz w:val="36"/>
+          <w:szCs w:val="36"/>
+        </w:rPr>
+      </w:pPr>
+      <w:r>
+        <w:rPr/>
+      </w:r>
+    </w:p>
+    <w:p>
+      <w:pPr>
+        <w:pStyle w:val="Normal"/>
+        <w:jc w:val="both"/>
+        <w:rPr>
+          <w:sz w:val="36"/>
+          <w:szCs w:val="36"/>
+        </w:rPr>
+      </w:pPr>
+      <w:r>
+        <w:rPr>
+          <w:rFonts w:eastAsia="Arial" w:cs="Arial" w:ascii="Garamond" w:hAnsi="Garamond"/>
+          <w:color w:val="000000"/>
+          <w:kern w:val="0"/>
+          <w:sz w:val="36"/>
+          <w:szCs w:val="36"/>
+          <w:shd w:fill="auto" w:val="clear"/>
+          <w:lang w:val="en-US" w:eastAsia="zh-CN" w:bidi="hi-IN"/>
+        </w:rPr>
+        <w:t>Se desejar, posso transformar essas virtudes em uma estrutura breve para leitura ou exibição em sua palestra. Deseja isso?</w:t>
+      </w:r>
+    </w:p>
+    <w:p>
+      <w:pPr>
+        <w:pStyle w:val="Normal"/>
+        <w:jc w:val="both"/>
+        <w:rPr>
+          <w:sz w:val="36"/>
+          <w:szCs w:val="36"/>
+        </w:rPr>
+      </w:pPr>
+      <w:r>
+        <w:rPr>
+          <w:rFonts w:eastAsia="Arial" w:cs="Arial" w:ascii="Garamond" w:hAnsi="Garamond"/>
+          <w:color w:val="000000"/>
+          <w:kern w:val="0"/>
+          <w:sz w:val="36"/>
+          <w:szCs w:val="36"/>
+          <w:shd w:fill="auto" w:val="clear"/>
+          <w:lang w:val="en-US" w:eastAsia="zh-CN" w:bidi="hi-IN"/>
+        </w:rPr>
+        <w:t>&gt;&gt;&gt;</w:t>
+      </w:r>
+    </w:p>
+    <w:p>
+      <w:pPr>
+        <w:pStyle w:val="Normal"/>
+        <w:jc w:val="both"/>
+        <w:rPr>
+          <w:sz w:val="36"/>
+          <w:szCs w:val="36"/>
+        </w:rPr>
+      </w:pPr>
+      <w:r>
+        <w:rPr/>
+      </w:r>
+    </w:p>
+    <w:p>
+      <w:pPr>
+        <w:pStyle w:val="Normal"/>
+        <w:jc w:val="both"/>
+        <w:rPr>
+          <w:sz w:val="36"/>
+          <w:szCs w:val="36"/>
+        </w:rPr>
+      </w:pPr>
+      <w:r>
+        <w:rPr>
+          <w:rFonts w:eastAsia="Arial" w:cs="Arial" w:ascii="Garamond" w:hAnsi="Garamond"/>
+          <w:color w:val="000000"/>
+          <w:kern w:val="0"/>
+          <w:sz w:val="36"/>
+          <w:szCs w:val="36"/>
+          <w:shd w:fill="auto" w:val="clear"/>
+          <w:lang w:val="en-US" w:eastAsia="zh-CN" w:bidi="hi-IN"/>
+        </w:rPr>
+        <w:t>&lt;&lt;&lt;</w:t>
+      </w:r>
+    </w:p>
+    <w:p>
+      <w:pPr>
+        <w:pStyle w:val="Normal"/>
+        <w:jc w:val="both"/>
+        <w:rPr>
+          <w:sz w:val="36"/>
+          <w:szCs w:val="36"/>
+        </w:rPr>
+      </w:pPr>
+      <w:r>
+        <w:rPr>
+          <w:rFonts w:eastAsia="Arial" w:cs="Arial" w:ascii="Garamond" w:hAnsi="Garamond"/>
+          <w:color w:val="000000"/>
+          <w:kern w:val="0"/>
+          <w:sz w:val="36"/>
+          <w:szCs w:val="36"/>
+          <w:shd w:fill="auto" w:val="clear"/>
+          <w:lang w:val="en-US" w:eastAsia="zh-CN" w:bidi="hi-IN"/>
+        </w:rPr>
+        <w:t>Texto gerado pelo ChatGPT, VERSÃO 1</w:t>
+      </w:r>
+    </w:p>
+    <w:p>
+      <w:pPr>
+        <w:pStyle w:val="Normal"/>
+        <w:jc w:val="both"/>
+        <w:rPr>
+          <w:sz w:val="36"/>
+          <w:szCs w:val="36"/>
+        </w:rPr>
+      </w:pPr>
+      <w:r>
+        <w:rPr/>
+      </w:r>
+    </w:p>
+    <w:p>
+      <w:pPr>
+        <w:pStyle w:val="Normal"/>
+        <w:jc w:val="both"/>
+        <w:rPr>
+          <w:sz w:val="36"/>
+          <w:szCs w:val="36"/>
+        </w:rPr>
+      </w:pPr>
+      <w:r>
+        <w:rPr>
+          <w:rFonts w:eastAsia="Arial" w:cs="Arial" w:ascii="Garamond" w:hAnsi="Garamond"/>
+          <w:color w:val="000000"/>
+          <w:kern w:val="0"/>
+          <w:sz w:val="36"/>
+          <w:szCs w:val="36"/>
+          <w:shd w:fill="auto" w:val="clear"/>
+          <w:lang w:val="en-US" w:eastAsia="zh-CN" w:bidi="hi-IN"/>
+        </w:rPr>
+        <w:t>Ao pé da cruz, Maria nos oferece um dos testemunhos mais profundos de amor, fidelidade e entrega silenciosa já registrados. Diante do sofrimento indescritível do Filho, ela não se esconde, não se desespera, não reclama. Permanece. Sua presença é firme, serena, profundamente corajosa. Entre soldados, insultos e o peso da tragédia, Maria demonstra a virtude de quem sabe que o amor verdadeiro não recua diante da dor.</w:t>
+      </w:r>
+    </w:p>
+    <w:p>
+      <w:pPr>
+        <w:pStyle w:val="Normal"/>
+        <w:jc w:val="both"/>
+        <w:rPr>
+          <w:sz w:val="36"/>
+          <w:szCs w:val="36"/>
+        </w:rPr>
+      </w:pPr>
+      <w:r>
+        <w:rPr/>
+      </w:r>
+    </w:p>
+    <w:p>
+      <w:pPr>
+        <w:pStyle w:val="Normal"/>
+        <w:jc w:val="both"/>
+        <w:rPr>
+          <w:sz w:val="36"/>
+          <w:szCs w:val="36"/>
+        </w:rPr>
+      </w:pPr>
+      <w:r>
+        <w:rPr>
+          <w:rFonts w:eastAsia="Arial" w:cs="Arial" w:ascii="Garamond" w:hAnsi="Garamond"/>
+          <w:color w:val="000000"/>
+          <w:kern w:val="0"/>
+          <w:sz w:val="36"/>
+          <w:szCs w:val="36"/>
+          <w:shd w:fill="auto" w:val="clear"/>
+          <w:lang w:val="en-US" w:eastAsia="zh-CN" w:bidi="hi-IN"/>
+        </w:rPr>
+        <w:t>Em silêncio, ela acolhe o cumprimento das palavras do anjo anunciador e reafirma sua fidelidade à vontade divina. Se em Belém ela O recebeu nos braços, agora, no Calvário, ela O entrega de volta ao Pai — com a mesma humildade, com o mesmo espírito de serviço. Sua renúncia não é apenas materna, é espiritual. É uma entrega amorosa que transcende os laços consanguíneos.</w:t>
+      </w:r>
+    </w:p>
+    <w:p>
+      <w:pPr>
+        <w:pStyle w:val="Normal"/>
+        <w:jc w:val="both"/>
+        <w:rPr>
+          <w:sz w:val="36"/>
+          <w:szCs w:val="36"/>
+        </w:rPr>
+      </w:pPr>
+      <w:r>
+        <w:rPr/>
+      </w:r>
+    </w:p>
+    <w:p>
+      <w:pPr>
+        <w:pStyle w:val="Normal"/>
+        <w:jc w:val="both"/>
+        <w:rPr>
+          <w:sz w:val="36"/>
+          <w:szCs w:val="36"/>
+        </w:rPr>
+      </w:pPr>
+      <w:r>
+        <w:rPr>
+          <w:rFonts w:eastAsia="Arial" w:cs="Arial" w:ascii="Garamond" w:hAnsi="Garamond"/>
+          <w:color w:val="000000"/>
+          <w:kern w:val="0"/>
+          <w:sz w:val="36"/>
+          <w:szCs w:val="36"/>
+          <w:shd w:fill="auto" w:val="clear"/>
+          <w:lang w:val="en-US" w:eastAsia="zh-CN" w:bidi="hi-IN"/>
+        </w:rPr>
+        <w:t>No momento em que Jesus lhe confia João como filho, Maria não recusa a nova missão. Mesmo ferida pela dor, ela acolhe, compreende e continua a servir. A maternidade espiritual que ali se inicia é um convite silencioso, mas eterno, para que todos nós nos deixemos envolver por esse amor que consola, sustenta e guia. Maria serve, mesmo no martírio, porque sua disposição em servir não depende das circunstâncias: é expressão de sua alma.</w:t>
+      </w:r>
+    </w:p>
+    <w:p>
+      <w:pPr>
+        <w:pStyle w:val="Normal"/>
+        <w:jc w:val="both"/>
+        <w:rPr>
+          <w:sz w:val="36"/>
+          <w:szCs w:val="36"/>
+        </w:rPr>
+      </w:pPr>
+      <w:r>
+        <w:rPr/>
+      </w:r>
+    </w:p>
+    <w:p>
+      <w:pPr>
+        <w:pStyle w:val="Normal"/>
+        <w:jc w:val="both"/>
+        <w:rPr>
+          <w:sz w:val="36"/>
+          <w:szCs w:val="36"/>
+        </w:rPr>
+      </w:pPr>
+      <w:r>
+        <w:rPr>
+          <w:rFonts w:eastAsia="Arial" w:cs="Arial" w:ascii="Garamond" w:hAnsi="Garamond"/>
+          <w:color w:val="000000"/>
+          <w:kern w:val="0"/>
+          <w:sz w:val="36"/>
+          <w:szCs w:val="36"/>
+          <w:shd w:fill="auto" w:val="clear"/>
+          <w:lang w:val="en-US" w:eastAsia="zh-CN" w:bidi="hi-IN"/>
+        </w:rPr>
+        <w:t>Texto gerado pelo ChatGPT, VERSÃO 2 (mais formal)</w:t>
+      </w:r>
+    </w:p>
+    <w:p>
+      <w:pPr>
+        <w:pStyle w:val="Normal"/>
+        <w:jc w:val="both"/>
+        <w:rPr>
+          <w:sz w:val="36"/>
+          <w:szCs w:val="36"/>
+        </w:rPr>
+      </w:pPr>
+      <w:r>
+        <w:rPr>
+          <w:rFonts w:eastAsia="Arial" w:cs="Arial" w:ascii="Garamond" w:hAnsi="Garamond"/>
+          <w:color w:val="000000"/>
+          <w:kern w:val="0"/>
+          <w:sz w:val="36"/>
+          <w:szCs w:val="36"/>
+          <w:shd w:fill="auto" w:val="clear"/>
+          <w:lang w:val="en-US" w:eastAsia="zh-CN" w:bidi="hi-IN"/>
+        </w:rPr>
+        <w:t>À sombra da cruz, Maria de Nazaré revela-se em toda a grandeza de sua alma. Diante do suplício de seu Filho, ela se mantém de pé, em silêncio, sustentando com dignidade e firmeza o peso de uma dor inimaginável. Não se ausenta nem se desespera; sua fidelidade a Deus e a Jesus permanece intacta, mesmo nas circunstâncias mais adversas. Sua presença, discreta e constante, simboliza uma fé madura, cultivada na renúncia e na abnegação.</w:t>
+      </w:r>
+    </w:p>
+    <w:p>
+      <w:pPr>
+        <w:pStyle w:val="Normal"/>
+        <w:jc w:val="both"/>
+        <w:rPr>
+          <w:sz w:val="36"/>
+          <w:szCs w:val="36"/>
+        </w:rPr>
+      </w:pPr>
+      <w:r>
+        <w:rPr/>
+      </w:r>
+    </w:p>
+    <w:p>
+      <w:pPr>
+        <w:pStyle w:val="Normal"/>
+        <w:jc w:val="both"/>
+        <w:rPr>
+          <w:sz w:val="36"/>
+          <w:szCs w:val="36"/>
+        </w:rPr>
+      </w:pPr>
+      <w:r>
+        <w:rPr>
+          <w:rFonts w:eastAsia="Arial" w:cs="Arial" w:ascii="Garamond" w:hAnsi="Garamond"/>
+          <w:color w:val="000000"/>
+          <w:kern w:val="0"/>
+          <w:sz w:val="36"/>
+          <w:szCs w:val="36"/>
+          <w:shd w:fill="auto" w:val="clear"/>
+          <w:lang w:val="en-US" w:eastAsia="zh-CN" w:bidi="hi-IN"/>
+        </w:rPr>
+        <w:t>Maria não apenas presencia o cumprimento das promessas divinas anunciadas desde a concepção de Jesus, como também reafirma, por sua atitude, a disposição de continuar servindo aos desígnios do Alto. Se no início da missão materna ela acolheu o Verbo com humildade, no Calvário ela o devolve ao Pai com igual submissão. Tal gesto representa não apenas a dor de uma mãe, mas o testemunho de uma serva que compreende, profundamente, o valor da obediência à vontade divina.</w:t>
+      </w:r>
+    </w:p>
+    <w:p>
+      <w:pPr>
+        <w:pStyle w:val="Normal"/>
+        <w:jc w:val="both"/>
+        <w:rPr>
+          <w:sz w:val="36"/>
+          <w:szCs w:val="36"/>
+        </w:rPr>
+      </w:pPr>
+      <w:r>
+        <w:rPr/>
+      </w:r>
+    </w:p>
+    <w:p>
+      <w:pPr>
+        <w:pStyle w:val="Normal"/>
+        <w:jc w:val="both"/>
+        <w:rPr>
+          <w:sz w:val="36"/>
+          <w:szCs w:val="36"/>
+        </w:rPr>
+      </w:pPr>
+      <w:r>
+        <w:rPr>
+          <w:rFonts w:eastAsia="Arial" w:cs="Arial" w:ascii="Garamond" w:hAnsi="Garamond"/>
+          <w:color w:val="000000"/>
+          <w:kern w:val="0"/>
+          <w:sz w:val="36"/>
+          <w:szCs w:val="36"/>
+          <w:shd w:fill="auto" w:val="clear"/>
+          <w:lang w:val="en-US" w:eastAsia="zh-CN" w:bidi="hi-IN"/>
+        </w:rPr>
+        <w:t>Ao confiar-lhe João como filho, Jesus estende a maternidade de Maria à humanidade inteira. E ela, mesmo dilacerada pela dor, não recusa a nova incumbência. Seu silêncio torna-se eloquente: ensina-nos que o verdadeiro serviço ao bem não se interrompe diante do sofrimento, mas nele encontra nova expressão. Maria continua a servir, porque o serviço, para ela, é expressão natural do amor.</w:t>
+      </w:r>
+    </w:p>
+    <w:p>
+      <w:pPr>
+        <w:pStyle w:val="Normal"/>
+        <w:jc w:val="both"/>
+        <w:rPr>
+          <w:sz w:val="36"/>
+          <w:szCs w:val="36"/>
+        </w:rPr>
+      </w:pPr>
+      <w:r>
+        <w:rPr/>
+      </w:r>
+    </w:p>
+    <w:p>
+      <w:pPr>
+        <w:pStyle w:val="Normal"/>
+        <w:jc w:val="both"/>
+        <w:rPr>
+          <w:sz w:val="36"/>
+          <w:szCs w:val="36"/>
+        </w:rPr>
+      </w:pPr>
+      <w:r>
+        <w:rPr/>
+      </w:r>
+    </w:p>
+    <w:p>
+      <w:pPr>
+        <w:pStyle w:val="Normal"/>
+        <w:jc w:val="both"/>
+        <w:rPr>
+          <w:sz w:val="36"/>
+          <w:szCs w:val="36"/>
+        </w:rPr>
+      </w:pPr>
+      <w:r>
+        <w:rPr>
+          <w:rFonts w:eastAsia="Arial" w:cs="Arial" w:ascii="Garamond" w:hAnsi="Garamond"/>
+          <w:color w:val="000000"/>
+          <w:kern w:val="0"/>
+          <w:sz w:val="36"/>
+          <w:szCs w:val="36"/>
+          <w:shd w:fill="auto" w:val="clear"/>
+          <w:lang w:val="en-US" w:eastAsia="zh-CN" w:bidi="hi-IN"/>
+        </w:rPr>
+        <w:t>&gt;&gt;&gt;</w:t>
+      </w:r>
+    </w:p>
+    <w:p>
+      <w:pPr>
+        <w:pStyle w:val="Normal"/>
+        <w:jc w:val="both"/>
+        <w:rPr>
+          <w:rFonts w:ascii="Garamond" w:hAnsi="Garamond"/>
+          <w:sz w:val="36"/>
+          <w:szCs w:val="36"/>
+        </w:rPr>
+      </w:pPr>
+      <w:r>
+        <w:rPr/>
       </w:r>
     </w:p>
     <w:p>
@@ -5085,7 +6022,7 @@
         <w:bCs/>
         <w:rFonts w:ascii="Garamond" w:hAnsi="Garamond"/>
       </w:rPr>
-      <w:t>21</w:t>
+      <w:t>28</w:t>
     </w:r>
     <w:r>
       <w:rPr>

</xml_diff>

<commit_message>
12/05/2025 - 22:04 h
</commit_message>
<xml_diff>
--- a/Maria de Nazaré e a disposição em servir/Maria de Nazaré e a disposição em servir.docx
+++ b/Maria de Nazaré e a disposição em servir/Maria de Nazaré e a disposição em servir.docx
@@ -3799,29 +3799,7 @@
           <w:szCs w:val="36"/>
           <w:lang w:val="en-US" w:eastAsia="zh-CN" w:bidi="hi-IN"/>
         </w:rPr>
-        <w:t>No fundo o meu desejo é que Jesus permita que a pessoa seja curada: se for assim</w:t>
-      </w:r>
-      <w:r>
-        <w:rPr>
-          <w:rFonts w:eastAsia="Arial" w:cs="Arial" w:ascii="Garamond" w:hAnsi="Garamond"/>
-          <w:color w:val="auto"/>
-          <w:kern w:val="0"/>
-          <w:sz w:val="36"/>
-          <w:szCs w:val="36"/>
-          <w:lang w:val="en-US" w:eastAsia="zh-CN" w:bidi="hi-IN"/>
-        </w:rPr>
-        <w:t>,</w:t>
-      </w:r>
-      <w:r>
-        <w:rPr>
-          <w:rFonts w:eastAsia="Arial" w:cs="Arial" w:ascii="Garamond" w:hAnsi="Garamond"/>
-          <w:color w:val="auto"/>
-          <w:kern w:val="0"/>
-          <w:sz w:val="36"/>
-          <w:szCs w:val="36"/>
-          <w:lang w:val="en-US" w:eastAsia="zh-CN" w:bidi="hi-IN"/>
-        </w:rPr>
-        <w:t xml:space="preserve"> então eu confio plenamente n'Ele. Mas, se a doença persistir, se agravar ou se a pessoa vier a desencarnar, minha confiança fica abalada. </w:t>
+        <w:t xml:space="preserve">No fundo o meu desejo é que Jesus permita que a pessoa seja curada: se for assim, então eu confio plenamente n'Ele. Mas, se a doença persistir, se agravar ou se a pessoa vier a desencarnar, minha confiança fica abalada. </w:t>
       </w:r>
     </w:p>
     <w:p>
@@ -3863,18 +3841,7 @@
           <w:szCs w:val="36"/>
           <w:lang w:val="en-US" w:eastAsia="zh-CN" w:bidi="hi-IN"/>
         </w:rPr>
-        <w:t>Precisamos compreender que a</w:t>
-      </w:r>
-      <w:r>
-        <w:rPr>
-          <w:rFonts w:eastAsia="Arial" w:cs="Arial" w:ascii="Garamond" w:hAnsi="Garamond"/>
-          <w:color w:val="auto"/>
-          <w:kern w:val="0"/>
-          <w:sz w:val="36"/>
-          <w:szCs w:val="36"/>
-          <w:lang w:val="en-US" w:eastAsia="zh-CN" w:bidi="hi-IN"/>
-        </w:rPr>
-        <w:t xml:space="preserve"> Terra é para nós, lar, oficina de trabalho, hospital de almas e escola. Jesus é nosso Mestre e guia. Portanto, tudo que nos acontece  tem como objetivo nos educar. </w:t>
+        <w:t xml:space="preserve">Precisamos compreender que a Terra é para nós, lar, oficina de trabalho, hospital de almas e escola. Jesus é nosso Mestre e guia. Portanto, tudo que nos acontece  tem como objetivo nos educar. </w:t>
       </w:r>
     </w:p>
     <w:p>
@@ -3891,7 +3858,14 @@
         </w:rPr>
       </w:pPr>
       <w:r>
-        <w:rPr/>
+        <w:rPr>
+          <w:rFonts w:eastAsia="Arial" w:cs="Arial" w:ascii="Garamond" w:hAnsi="Garamond"/>
+          <w:color w:val="auto"/>
+          <w:kern w:val="0"/>
+          <w:sz w:val="36"/>
+          <w:szCs w:val="36"/>
+          <w:lang w:val="en-US" w:eastAsia="zh-CN" w:bidi="hi-IN"/>
+        </w:rPr>
       </w:r>
     </w:p>
     <w:p>
@@ -3965,20 +3939,7 @@
           <w:szCs w:val="36"/>
           <w:lang w:val="en-US" w:eastAsia="zh-CN" w:bidi="hi-IN"/>
         </w:rPr>
-        <w:t>Martírio e Crucificação</w:t>
-      </w:r>
-      <w:r>
-        <w:rPr>
-          <w:rFonts w:eastAsia="Arial" w:cs="Arial" w:ascii="Garamond" w:hAnsi="Garamond"/>
-          <w:b/>
-          <w:bCs/>
-          <w:color w:val="C9211E"/>
-          <w:kern w:val="0"/>
-          <w:sz w:val="36"/>
-          <w:szCs w:val="36"/>
-          <w:lang w:val="en-US" w:eastAsia="zh-CN" w:bidi="hi-IN"/>
-        </w:rPr>
-        <w:t xml:space="preserve"> - </w:t>
+        <w:t xml:space="preserve">Martírio e Crucificação - </w:t>
       </w:r>
       <w:r>
         <w:rPr>
@@ -3993,67 +3954,63 @@
           <w:szCs w:val="36"/>
           <w:lang w:val="en-US" w:eastAsia="zh-CN" w:bidi="hi-IN"/>
         </w:rPr>
-        <w:t>João 19:</w:t>
-      </w:r>
-      <w:r>
-        <w:rPr>
-          <w:rFonts w:eastAsia="Arial" w:cs="Arial" w:ascii="Garamond" w:hAnsi="Garamond"/>
-          <w:b/>
-          <w:bCs/>
+        <w:t>João 19:17-27</w:t>
+      </w:r>
+    </w:p>
+    <w:p>
+      <w:pPr>
+        <w:pStyle w:val="Normal"/>
+        <w:jc w:val="both"/>
+        <w:rPr>
+          <w:rFonts w:ascii="Garamond" w:hAnsi="Garamond"/>
+          <w:sz w:val="36"/>
+          <w:szCs w:val="36"/>
+        </w:rPr>
+      </w:pPr>
+      <w:r>
+        <w:rPr>
+          <w:rFonts w:ascii="Garamond" w:hAnsi="Garamond"/>
+          <w:sz w:val="36"/>
+          <w:szCs w:val="36"/>
+        </w:rPr>
+      </w:r>
+    </w:p>
+    <w:p>
+      <w:pPr>
+        <w:pStyle w:val="Normal"/>
+        <w:jc w:val="both"/>
+        <w:rPr>
+          <w:rFonts w:ascii="Garamond" w:hAnsi="Garamond"/>
+          <w:sz w:val="36"/>
+          <w:szCs w:val="36"/>
+        </w:rPr>
+      </w:pPr>
+      <w:r>
+        <w:rPr>
+          <w:rFonts w:eastAsia="Arial" w:cs="Arial" w:ascii="Garamond" w:hAnsi="Garamond"/>
           <w:i w:val="false"/>
           <w:iCs w:val="false"/>
-          <w:color w:val="C9211E"/>
-          <w:kern w:val="0"/>
-          <w:sz w:val="36"/>
-          <w:szCs w:val="36"/>
-          <w:lang w:val="en-US" w:eastAsia="zh-CN" w:bidi="hi-IN"/>
-        </w:rPr>
-        <w:t>17</w:t>
-      </w:r>
-      <w:r>
-        <w:rPr>
-          <w:rFonts w:eastAsia="Arial" w:cs="Arial" w:ascii="Garamond" w:hAnsi="Garamond"/>
-          <w:b/>
-          <w:bCs/>
+          <w:color w:val="auto"/>
+          <w:kern w:val="0"/>
+          <w:sz w:val="36"/>
+          <w:szCs w:val="36"/>
+          <w:lang w:val="en-US" w:eastAsia="zh-CN" w:bidi="hi-IN"/>
+        </w:rPr>
+        <w:t xml:space="preserve">Essa passagem é de uma </w:t>
+      </w:r>
+      <w:r>
+        <w:rPr>
+          <w:rFonts w:eastAsia="Arial" w:cs="Arial" w:ascii="Garamond" w:hAnsi="Garamond"/>
           <w:i w:val="false"/>
           <w:iCs w:val="false"/>
-          <w:color w:val="C9211E"/>
-          <w:kern w:val="0"/>
-          <w:sz w:val="36"/>
-          <w:szCs w:val="36"/>
-          <w:lang w:val="en-US" w:eastAsia="zh-CN" w:bidi="hi-IN"/>
-        </w:rPr>
-        <w:t>-27</w:t>
-      </w:r>
-    </w:p>
-    <w:p>
-      <w:pPr>
-        <w:pStyle w:val="Normal"/>
-        <w:jc w:val="both"/>
-        <w:rPr>
-          <w:rFonts w:ascii="Garamond" w:hAnsi="Garamond"/>
-          <w:sz w:val="36"/>
-          <w:szCs w:val="36"/>
-        </w:rPr>
-      </w:pPr>
-      <w:r>
-        <w:rPr>
-          <w:rFonts w:ascii="Garamond" w:hAnsi="Garamond"/>
-          <w:sz w:val="36"/>
-          <w:szCs w:val="36"/>
-        </w:rPr>
-      </w:r>
-    </w:p>
-    <w:p>
-      <w:pPr>
-        <w:pStyle w:val="Normal"/>
-        <w:jc w:val="both"/>
-        <w:rPr>
-          <w:rFonts w:ascii="Garamond" w:hAnsi="Garamond"/>
-          <w:sz w:val="36"/>
-          <w:szCs w:val="36"/>
-        </w:rPr>
-      </w:pPr>
+          <w:color w:val="auto"/>
+          <w:kern w:val="0"/>
+          <w:sz w:val="36"/>
+          <w:szCs w:val="36"/>
+          <w:lang w:val="en-US" w:eastAsia="zh-CN" w:bidi="hi-IN"/>
+        </w:rPr>
+        <w:t xml:space="preserve">beleza e </w:t>
+      </w:r>
       <w:r>
         <w:rPr>
           <w:rFonts w:eastAsia="Arial" w:cs="Arial" w:ascii="Garamond" w:hAnsi="Garamond"/>
@@ -4065,33 +4022,8 @@
           <w:szCs w:val="36"/>
           <w:lang w:val="en-US" w:eastAsia="zh-CN" w:bidi="hi-IN"/>
         </w:rPr>
-        <w:t>Essa passagem é de uma riqueza espiritual enorme.</w:t>
-      </w:r>
-    </w:p>
-    <w:p>
-      <w:pPr>
-        <w:pStyle w:val="Normal"/>
-        <w:jc w:val="both"/>
-        <w:rPr>
-          <w:rFonts w:ascii="Garamond" w:hAnsi="Garamond"/>
-          <w:sz w:val="36"/>
-          <w:szCs w:val="36"/>
-        </w:rPr>
-      </w:pPr>
-      <w:r>
-        <w:rPr/>
-      </w:r>
-    </w:p>
-    <w:p>
-      <w:pPr>
-        <w:pStyle w:val="Normal"/>
-        <w:jc w:val="both"/>
-        <w:rPr>
-          <w:rFonts w:ascii="Garamond" w:hAnsi="Garamond"/>
-          <w:sz w:val="36"/>
-          <w:szCs w:val="36"/>
-        </w:rPr>
-      </w:pPr>
+        <w:t>riqueza espiritual enorme</w:t>
+      </w:r>
       <w:r>
         <w:rPr>
           <w:rFonts w:eastAsia="Arial" w:cs="Arial" w:ascii="Garamond" w:hAnsi="Garamond"/>
@@ -4103,32 +4035,29 @@
           <w:szCs w:val="36"/>
           <w:lang w:val="en-US" w:eastAsia="zh-CN" w:bidi="hi-IN"/>
         </w:rPr>
-        <w:t>Primeiro, porque é nela que Jesus entrega João como filho a Maria, e Maria como mãe a João. Nos instantes derradeiros de Sua vida física, o Mestre eleva Maria à condição de mãe de toda a humanidade e nos ensina que o amor verdadeiro procede não apenas dos laços consanguíneos, mas, sim, da nossa herança divina.</w:t>
-      </w:r>
-    </w:p>
-    <w:p>
-      <w:pPr>
-        <w:pStyle w:val="Normal"/>
-        <w:jc w:val="both"/>
-        <w:rPr>
-          <w:rFonts w:ascii="Garamond" w:hAnsi="Garamond"/>
-          <w:sz w:val="36"/>
-          <w:szCs w:val="36"/>
-        </w:rPr>
-      </w:pPr>
-      <w:r>
-        <w:rPr>
-          <w:rFonts w:ascii="Garamond" w:hAnsi="Garamond"/>
-          <w:sz w:val="36"/>
-          <w:szCs w:val="36"/>
-        </w:rPr>
-      </w:r>
-    </w:p>
-    <w:p>
-      <w:pPr>
-        <w:pStyle w:val="Normal"/>
-        <w:jc w:val="both"/>
-        <w:rPr>
+        <w:t>s.</w:t>
+      </w:r>
+    </w:p>
+    <w:p>
+      <w:pPr>
+        <w:pStyle w:val="Normal"/>
+        <w:jc w:val="both"/>
+        <w:rPr>
+          <w:rFonts w:ascii="Garamond" w:hAnsi="Garamond"/>
+          <w:sz w:val="36"/>
+          <w:szCs w:val="36"/>
+        </w:rPr>
+      </w:pPr>
+      <w:r>
+        <w:rPr/>
+      </w:r>
+    </w:p>
+    <w:p>
+      <w:pPr>
+        <w:pStyle w:val="Normal"/>
+        <w:jc w:val="both"/>
+        <w:rPr>
+          <w:rFonts w:ascii="Garamond" w:hAnsi="Garamond"/>
           <w:sz w:val="36"/>
           <w:szCs w:val="36"/>
         </w:rPr>
@@ -4143,8 +4072,33 @@
           <w:shd w:fill="auto" w:val="clear"/>
           <w:lang w:val="en-US" w:eastAsia="zh-CN" w:bidi="hi-IN"/>
         </w:rPr>
-        <w:t>Mas nesses versículos nós encontramos também, aquele que talvez seja o maior ato de</w:t>
-      </w:r>
+        <w:t xml:space="preserve">Ao pé da cruz, Maria nos oferece um dos testemunhos mais profundos de amor, fidelidade e entrega silenciosa já registrados. Diante do sofrimento indescritível do Filho, ela não se esconde, não se desespera, não reclama. Permanece. Sua presença é firme, serena, profundamente corajosa. </w:t>
+      </w:r>
+    </w:p>
+    <w:p>
+      <w:pPr>
+        <w:pStyle w:val="Normal"/>
+        <w:jc w:val="both"/>
+        <w:rPr>
+          <w:rFonts w:ascii="Garamond" w:hAnsi="Garamond"/>
+          <w:sz w:val="36"/>
+          <w:szCs w:val="36"/>
+        </w:rPr>
+      </w:pPr>
+      <w:r>
+        <w:rPr/>
+      </w:r>
+    </w:p>
+    <w:p>
+      <w:pPr>
+        <w:pStyle w:val="Normal"/>
+        <w:jc w:val="both"/>
+        <w:rPr>
+          <w:rFonts w:ascii="Garamond" w:hAnsi="Garamond"/>
+          <w:sz w:val="36"/>
+          <w:szCs w:val="36"/>
+        </w:rPr>
+      </w:pPr>
       <w:r>
         <w:rPr>
           <w:rFonts w:eastAsia="Times New Roman" w:cs="Times New Roman" w:ascii="Garamond" w:hAnsi="Garamond"/>
@@ -4155,7 +4109,7 @@
           <w:shd w:fill="auto" w:val="clear"/>
           <w:lang w:val="en-US" w:eastAsia="zh-CN" w:bidi="hi-IN"/>
         </w:rPr>
-        <w:t xml:space="preserve"> submissão de Maria às vontades de Deus</w:t>
+        <w:t xml:space="preserve">Não condena nem amaldioça os algozes de Jesus, nem os poderosos que o condenaram, nem os soldados que o crucificaram e muito menos os ingratos que foram amparados por </w:t>
       </w:r>
       <w:r>
         <w:rPr>
@@ -4167,31 +4121,8 @@
           <w:shd w:fill="auto" w:val="clear"/>
           <w:lang w:val="en-US" w:eastAsia="zh-CN" w:bidi="hi-IN"/>
         </w:rPr>
-        <w:t>. Ela presencia todos os sofrimentos, as ofensas, o escárnio, o desprezo, o ultraje cometidos contra o filho amado, o filho justo, que amou e abençoou incondicionalmente todos aqueles que cruzaram o Seu caminho.</w:t>
-      </w:r>
-    </w:p>
-    <w:p>
-      <w:pPr>
-        <w:pStyle w:val="Normal"/>
-        <w:jc w:val="both"/>
-        <w:rPr>
-          <w:sz w:val="36"/>
-          <w:szCs w:val="36"/>
-        </w:rPr>
-      </w:pPr>
-      <w:r>
-        <w:rPr/>
-      </w:r>
-    </w:p>
-    <w:p>
-      <w:pPr>
-        <w:pStyle w:val="Normal"/>
-        <w:jc w:val="both"/>
-        <w:rPr>
-          <w:sz w:val="36"/>
-          <w:szCs w:val="36"/>
-        </w:rPr>
-      </w:pPr>
+        <w:t>Ele</w:t>
+      </w:r>
       <w:r>
         <w:rPr>
           <w:rFonts w:eastAsia="Times New Roman" w:cs="Times New Roman" w:ascii="Garamond" w:hAnsi="Garamond"/>
@@ -4202,14 +4133,15 @@
           <w:shd w:fill="auto" w:val="clear"/>
           <w:lang w:val="en-US" w:eastAsia="zh-CN" w:bidi="hi-IN"/>
         </w:rPr>
-        <w:t xml:space="preserve">Jesus, o Espírito puro, perfeito, o único que  não precisava experimentar nenhum dos sofrimentos humanos porque não tinha erros, não tinha pecados, viveu ali as dores físicas e morais do homem comum, o homem a quem Ele veio salvar através de seus exemplos e ensinamentos. </w:t>
-      </w:r>
-    </w:p>
-    <w:p>
-      <w:pPr>
-        <w:pStyle w:val="Normal"/>
-        <w:jc w:val="both"/>
-        <w:rPr>
+        <w:t>, mas que O abandonaram naquele momento tão doloroso. Em meio ao peso da tragédia, Maria demonstra a virtude de quem sabe que o amor verdadeiro não recua diante da dor.</w:t>
+      </w:r>
+    </w:p>
+    <w:p>
+      <w:pPr>
+        <w:pStyle w:val="Normal"/>
+        <w:jc w:val="both"/>
+        <w:rPr>
+          <w:rFonts w:ascii="Garamond" w:hAnsi="Garamond"/>
           <w:sz w:val="36"/>
           <w:szCs w:val="36"/>
         </w:rPr>
@@ -4223,6 +4155,7 @@
         <w:pStyle w:val="Normal"/>
         <w:jc w:val="both"/>
         <w:rPr>
+          <w:rFonts w:ascii="Garamond" w:hAnsi="Garamond"/>
           <w:sz w:val="36"/>
           <w:szCs w:val="36"/>
         </w:rPr>
@@ -4237,14 +4170,15 @@
           <w:shd w:fill="auto" w:val="clear"/>
           <w:lang w:val="en-US" w:eastAsia="zh-CN" w:bidi="hi-IN"/>
         </w:rPr>
-        <w:t>Mas Jesus sabia que tudo aqui era necessário para que se cumprisse a missão que o Pai atribuiu a ele.</w:t>
-      </w:r>
-    </w:p>
-    <w:p>
-      <w:pPr>
-        <w:pStyle w:val="Normal"/>
-        <w:jc w:val="both"/>
-        <w:rPr>
+        <w:t>Em silêncio, ela acolhe o cumprimento das palavras do anjo anunciador e reafirma sua fidelidade à vontade divina. Se em Belém ela recebeu Jesus nos braços, agora, no Calvário, ela O entrega de volta ao Pai — com a mesma humildade, com o mesmo espírito de serviço. Sua renúncia não é apenas materna, é espiritual. É uma entrega amorosa que transcende os laços consanguíneos.</w:t>
+      </w:r>
+    </w:p>
+    <w:p>
+      <w:pPr>
+        <w:pStyle w:val="Normal"/>
+        <w:jc w:val="both"/>
+        <w:rPr>
+          <w:rFonts w:ascii="Garamond" w:hAnsi="Garamond"/>
           <w:sz w:val="36"/>
           <w:szCs w:val="36"/>
         </w:rPr>
@@ -4258,6 +4192,7 @@
         <w:pStyle w:val="Normal"/>
         <w:jc w:val="both"/>
         <w:rPr>
+          <w:rFonts w:ascii="Garamond" w:hAnsi="Garamond"/>
           <w:sz w:val="36"/>
           <w:szCs w:val="36"/>
         </w:rPr>
@@ -4272,1537 +4207,296 @@
           <w:shd w:fill="auto" w:val="clear"/>
           <w:lang w:val="en-US" w:eastAsia="zh-CN" w:bidi="hi-IN"/>
         </w:rPr>
-        <w:t xml:space="preserve">Maria, que havia se entregado ao compromisso de receber o Messias prometido como seu próprio filho, também compreende que aquela era a vontade de Deus. Então ela não se revolta e nem renuncia ao compromisso assumido. </w:t>
-      </w:r>
-    </w:p>
-    <w:p>
-      <w:pPr>
-        <w:pStyle w:val="Normal"/>
-        <w:jc w:val="both"/>
-        <w:rPr>
-          <w:sz w:val="36"/>
-          <w:szCs w:val="36"/>
-        </w:rPr>
-      </w:pPr>
-      <w:r>
-        <w:rPr/>
-      </w:r>
-    </w:p>
-    <w:p>
-      <w:pPr>
-        <w:pStyle w:val="Normal"/>
-        <w:jc w:val="both"/>
-        <w:rPr>
-          <w:rFonts w:ascii="Garamond" w:hAnsi="Garamond"/>
-          <w:sz w:val="36"/>
-          <w:szCs w:val="36"/>
-        </w:rPr>
-      </w:pPr>
-      <w:r>
-        <w:rPr>
-          <w:rFonts w:eastAsia="Arial" w:cs="Arial" w:ascii="Garamond" w:hAnsi="Garamond"/>
-          <w:color w:val="000000"/>
-          <w:kern w:val="0"/>
-          <w:sz w:val="36"/>
-          <w:szCs w:val="36"/>
-          <w:shd w:fill="auto" w:val="clear"/>
-          <w:lang w:val="en-US" w:eastAsia="zh-CN" w:bidi="hi-IN"/>
-        </w:rPr>
-        <w:t xml:space="preserve">No momento mais doloroso do ministério de Jesus, Maria permanece de pé, junto à cruz. Ela não tenta fugir, não protesta, não se revolta. Apenas permanece junto ao filho amado, injustamente crucificado. </w:t>
-      </w:r>
-    </w:p>
-    <w:p>
-      <w:pPr>
-        <w:pStyle w:val="Normal"/>
-        <w:jc w:val="both"/>
-        <w:rPr>
-          <w:rFonts w:ascii="Garamond" w:hAnsi="Garamond"/>
-          <w:sz w:val="36"/>
-          <w:szCs w:val="36"/>
-        </w:rPr>
-      </w:pPr>
-      <w:r>
-        <w:rPr/>
-      </w:r>
-    </w:p>
-    <w:p>
-      <w:pPr>
-        <w:pStyle w:val="Normal"/>
-        <w:jc w:val="both"/>
-        <w:rPr>
-          <w:rFonts w:ascii="Garamond" w:hAnsi="Garamond"/>
-          <w:sz w:val="36"/>
-          <w:szCs w:val="36"/>
-        </w:rPr>
-      </w:pPr>
-      <w:r>
-        <w:rPr>
-          <w:rFonts w:eastAsia="Arial" w:cs="Arial" w:ascii="Garamond" w:hAnsi="Garamond"/>
-          <w:color w:val="000000"/>
-          <w:kern w:val="0"/>
-          <w:sz w:val="36"/>
-          <w:szCs w:val="36"/>
-          <w:shd w:fill="auto" w:val="clear"/>
-          <w:lang w:val="en-US" w:eastAsia="zh-CN" w:bidi="hi-IN"/>
-        </w:rPr>
-        <w:t xml:space="preserve">Também </w:t>
-      </w:r>
-      <w:r>
-        <w:rPr>
-          <w:rFonts w:eastAsia="Times New Roman" w:cs="Times New Roman" w:ascii="Garamond" w:hAnsi="Garamond"/>
-          <w:color w:val="000000"/>
-          <w:kern w:val="0"/>
-          <w:sz w:val="36"/>
-          <w:szCs w:val="36"/>
-          <w:shd w:fill="auto" w:val="clear"/>
-          <w:lang w:val="en-US" w:eastAsia="zh-CN" w:bidi="hi-IN"/>
-        </w:rPr>
-        <w:t>não condena nem amaldioça nenhum dos algozes de Jesus, nem os poderosos que o condenaram, nem os soldados que o crucificaram e muito menos os ingratos que foram amparados por Jesus, mas que o abandonaram naquele momento tão doloroso.</w:t>
-      </w:r>
-    </w:p>
-    <w:p>
-      <w:pPr>
-        <w:pStyle w:val="Normal"/>
-        <w:jc w:val="both"/>
-        <w:rPr>
-          <w:rFonts w:ascii="Garamond" w:hAnsi="Garamond"/>
-          <w:sz w:val="36"/>
-          <w:szCs w:val="36"/>
-        </w:rPr>
-      </w:pPr>
-      <w:r>
-        <w:rPr/>
-      </w:r>
-    </w:p>
-    <w:p>
-      <w:pPr>
-        <w:pStyle w:val="Normal"/>
-        <w:jc w:val="both"/>
-        <w:rPr>
-          <w:sz w:val="36"/>
-          <w:szCs w:val="36"/>
-        </w:rPr>
-      </w:pPr>
-      <w:r>
-        <w:rPr>
-          <w:rFonts w:eastAsia="Times New Roman" w:cs="Times New Roman" w:ascii="Garamond" w:hAnsi="Garamond"/>
-          <w:color w:val="000000"/>
-          <w:kern w:val="0"/>
-          <w:sz w:val="36"/>
-          <w:szCs w:val="36"/>
-          <w:shd w:fill="auto" w:val="clear"/>
-          <w:lang w:val="en-US" w:eastAsia="zh-CN" w:bidi="hi-IN"/>
-        </w:rPr>
-        <w:t>&lt;&lt;&lt; O texto abaixo tem que ser usado como parágrafo de ligação entre o fim desse tópico e o início do próximo.</w:t>
-      </w:r>
-    </w:p>
-    <w:p>
-      <w:pPr>
-        <w:pStyle w:val="Normal"/>
-        <w:jc w:val="both"/>
-        <w:rPr>
-          <w:sz w:val="36"/>
-          <w:szCs w:val="36"/>
-        </w:rPr>
-      </w:pPr>
-      <w:r>
-        <w:rPr/>
-      </w:r>
-    </w:p>
-    <w:p>
-      <w:pPr>
-        <w:pStyle w:val="Normal"/>
-        <w:jc w:val="both"/>
-        <w:rPr>
-          <w:sz w:val="36"/>
-          <w:szCs w:val="36"/>
-        </w:rPr>
-      </w:pPr>
-      <w:r>
-        <w:rPr>
-          <w:rFonts w:eastAsia="Times New Roman" w:cs="Times New Roman" w:ascii="Garamond" w:hAnsi="Garamond"/>
-          <w:color w:val="000000"/>
-          <w:kern w:val="0"/>
-          <w:sz w:val="36"/>
-          <w:szCs w:val="36"/>
-          <w:shd w:fill="auto" w:val="clear"/>
-          <w:lang w:val="en-US" w:eastAsia="zh-CN" w:bidi="hi-IN"/>
-        </w:rPr>
-        <w:t>Apesar de tudo isso, após a morte de Jesus, Maria não hesita em trabalhar pelo bem de todos. Ela poderia ter escolhido nada fazer pelos mais necessitados. Afinal de contas, o próprio povo condenou e executou seu filho inocente. Mas, a despeito disso, Maria manteve sua promessa feita desde o anúncio de que seria mãe do Messias: 'faça-se em mim segundo a tua palavra'.</w:t>
-      </w:r>
-    </w:p>
-    <w:p>
-      <w:pPr>
-        <w:pStyle w:val="Normal"/>
-        <w:jc w:val="both"/>
-        <w:rPr>
-          <w:sz w:val="36"/>
-          <w:szCs w:val="36"/>
-        </w:rPr>
-      </w:pPr>
-      <w:r>
-        <w:rPr/>
-      </w:r>
-    </w:p>
-    <w:p>
-      <w:pPr>
-        <w:pStyle w:val="Normal"/>
-        <w:jc w:val="both"/>
-        <w:rPr>
-          <w:sz w:val="36"/>
-          <w:szCs w:val="36"/>
-        </w:rPr>
-      </w:pPr>
-      <w:r>
-        <w:rPr/>
-      </w:r>
-    </w:p>
-    <w:p>
-      <w:pPr>
-        <w:pStyle w:val="Normal"/>
-        <w:jc w:val="both"/>
-        <w:rPr>
-          <w:sz w:val="36"/>
-          <w:szCs w:val="36"/>
-        </w:rPr>
-      </w:pPr>
-      <w:r>
-        <w:rPr/>
-      </w:r>
-    </w:p>
-    <w:p>
-      <w:pPr>
-        <w:pStyle w:val="Normal"/>
-        <w:jc w:val="both"/>
-        <w:rPr>
-          <w:sz w:val="36"/>
-          <w:szCs w:val="36"/>
-        </w:rPr>
-      </w:pPr>
-      <w:r>
-        <w:rPr>
-          <w:rFonts w:eastAsia="Times New Roman" w:cs="Times New Roman" w:ascii="Garamond" w:hAnsi="Garamond"/>
-          <w:color w:val="000000"/>
-          <w:kern w:val="0"/>
-          <w:sz w:val="36"/>
-          <w:szCs w:val="36"/>
-          <w:shd w:fill="auto" w:val="clear"/>
-          <w:lang w:val="en-US" w:eastAsia="zh-CN" w:bidi="hi-IN"/>
-        </w:rPr>
-        <w:t xml:space="preserve">&gt;&gt;&gt; </w:t>
-      </w:r>
-    </w:p>
-    <w:p>
-      <w:pPr>
-        <w:pStyle w:val="Normal"/>
-        <w:jc w:val="both"/>
-        <w:rPr>
-          <w:sz w:val="36"/>
-          <w:szCs w:val="36"/>
-        </w:rPr>
-      </w:pPr>
-      <w:r>
-        <w:rPr/>
-      </w:r>
-    </w:p>
-    <w:p>
-      <w:pPr>
-        <w:pStyle w:val="Normal"/>
-        <w:jc w:val="both"/>
-        <w:rPr>
-          <w:sz w:val="36"/>
-          <w:szCs w:val="36"/>
-        </w:rPr>
-      </w:pPr>
-      <w:r>
-        <w:rPr/>
-      </w:r>
-    </w:p>
-    <w:p>
-      <w:pPr>
-        <w:pStyle w:val="Normal"/>
-        <w:jc w:val="both"/>
-        <w:rPr>
-          <w:sz w:val="36"/>
-          <w:szCs w:val="36"/>
-        </w:rPr>
-      </w:pPr>
-      <w:r>
-        <w:rPr>
-          <w:rFonts w:eastAsia="Times New Roman" w:cs="Times New Roman" w:ascii="Garamond" w:hAnsi="Garamond"/>
-          <w:color w:val="000000"/>
-          <w:kern w:val="0"/>
-          <w:sz w:val="36"/>
-          <w:szCs w:val="36"/>
-          <w:shd w:fill="auto" w:val="clear"/>
-          <w:lang w:val="en-US" w:eastAsia="zh-CN" w:bidi="hi-IN"/>
-        </w:rPr>
-        <w:t>&lt;&lt;&lt;</w:t>
-      </w:r>
-    </w:p>
-    <w:p>
-      <w:pPr>
-        <w:pStyle w:val="Normal"/>
-        <w:jc w:val="both"/>
-        <w:rPr>
-          <w:sz w:val="36"/>
-          <w:szCs w:val="36"/>
-        </w:rPr>
-      </w:pPr>
-      <w:r>
-        <w:rPr>
-          <w:rFonts w:eastAsia="Times New Roman" w:cs="Times New Roman" w:ascii="Garamond" w:hAnsi="Garamond"/>
-          <w:color w:val="000000"/>
-          <w:kern w:val="0"/>
-          <w:sz w:val="36"/>
-          <w:szCs w:val="36"/>
-          <w:shd w:fill="auto" w:val="clear"/>
-          <w:lang w:val="en-US" w:eastAsia="zh-CN" w:bidi="hi-IN"/>
-        </w:rPr>
-        <w:t>Trazer os exemplos de Maria para nossas vidas: a resignação naqueles momentos em que, apesar de nossos esforços, das nossas orações, alguém amado passa por dificuldades sem que nada possamos fazer. Resta-nos compartilhar a dor, silenciosamente, aceitando sem revoltas que a vontade de Deus está se cumprindo.</w:t>
-      </w:r>
-    </w:p>
-    <w:p>
-      <w:pPr>
-        <w:pStyle w:val="Normal"/>
-        <w:jc w:val="both"/>
-        <w:rPr>
-          <w:sz w:val="36"/>
-          <w:szCs w:val="36"/>
-        </w:rPr>
-      </w:pPr>
-      <w:r>
-        <w:rPr/>
-      </w:r>
-    </w:p>
-    <w:p>
-      <w:pPr>
-        <w:pStyle w:val="Normal"/>
-        <w:jc w:val="both"/>
-        <w:rPr>
-          <w:sz w:val="36"/>
-          <w:szCs w:val="36"/>
-        </w:rPr>
-      </w:pPr>
-      <w:r>
-        <w:rPr>
-          <w:rFonts w:eastAsia="Times New Roman" w:cs="Times New Roman" w:ascii="Garamond" w:hAnsi="Garamond"/>
-          <w:color w:val="000000"/>
-          <w:kern w:val="0"/>
-          <w:sz w:val="36"/>
-          <w:szCs w:val="36"/>
-          <w:shd w:fill="auto" w:val="clear"/>
-          <w:lang w:val="en-US" w:eastAsia="zh-CN" w:bidi="hi-IN"/>
-        </w:rPr>
-        <w:t>Citar também o silêncio.</w:t>
-      </w:r>
-    </w:p>
-    <w:p>
-      <w:pPr>
-        <w:pStyle w:val="Normal"/>
-        <w:jc w:val="both"/>
-        <w:rPr>
-          <w:sz w:val="36"/>
-          <w:szCs w:val="36"/>
-        </w:rPr>
-      </w:pPr>
-      <w:r>
-        <w:rPr>
-          <w:rFonts w:eastAsia="Times New Roman" w:cs="Times New Roman" w:ascii="Garamond" w:hAnsi="Garamond"/>
-          <w:color w:val="000000"/>
-          <w:kern w:val="0"/>
-          <w:sz w:val="36"/>
-          <w:szCs w:val="36"/>
-          <w:shd w:fill="auto" w:val="clear"/>
-          <w:lang w:val="en-US" w:eastAsia="zh-CN" w:bidi="hi-IN"/>
-        </w:rPr>
-        <w:t>&gt;&gt;&gt;</w:t>
-      </w:r>
-    </w:p>
-    <w:p>
-      <w:pPr>
-        <w:pStyle w:val="Normal"/>
-        <w:jc w:val="both"/>
-        <w:rPr>
-          <w:sz w:val="36"/>
-          <w:szCs w:val="36"/>
-        </w:rPr>
-      </w:pPr>
-      <w:r>
-        <w:rPr/>
-      </w:r>
-    </w:p>
-    <w:p>
-      <w:pPr>
-        <w:pStyle w:val="Normal"/>
-        <w:jc w:val="both"/>
-        <w:rPr>
-          <w:sz w:val="36"/>
-          <w:szCs w:val="36"/>
-        </w:rPr>
-      </w:pPr>
-      <w:r>
-        <w:rPr>
-          <w:rFonts w:eastAsia="Arial" w:cs="Arial" w:ascii="Garamond" w:hAnsi="Garamond"/>
-          <w:color w:val="000000"/>
-          <w:kern w:val="0"/>
-          <w:sz w:val="36"/>
-          <w:szCs w:val="36"/>
-          <w:shd w:fill="auto" w:val="clear"/>
-          <w:lang w:val="en-US" w:eastAsia="zh-CN" w:bidi="hi-IN"/>
-        </w:rPr>
-        <w:t>&lt;&lt;&lt;</w:t>
-      </w:r>
-    </w:p>
-    <w:p>
-      <w:pPr>
-        <w:pStyle w:val="Normal"/>
-        <w:jc w:val="both"/>
-        <w:rPr>
-          <w:sz w:val="36"/>
-          <w:szCs w:val="36"/>
-        </w:rPr>
-      </w:pPr>
-      <w:r>
-        <w:rPr>
-          <w:rFonts w:eastAsia="Arial" w:cs="Arial" w:ascii="Garamond" w:hAnsi="Garamond"/>
-          <w:color w:val="000000"/>
-          <w:kern w:val="0"/>
-          <w:sz w:val="36"/>
-          <w:szCs w:val="36"/>
-          <w:shd w:fill="auto" w:val="clear"/>
-          <w:lang w:val="en-US" w:eastAsia="zh-CN" w:bidi="hi-IN"/>
-        </w:rPr>
-        <w:t>No trecho de **João 19:17-27**, que narra a crucificação de Jesus e a presença de Maria ao pé da cruz, podemos identificar com profundidade diversas virtudes que ela manifesta com notável grandeza espiritual. Aqui estão as principais:</w:t>
-      </w:r>
-    </w:p>
-    <w:p>
-      <w:pPr>
-        <w:pStyle w:val="Normal"/>
-        <w:jc w:val="both"/>
-        <w:rPr>
-          <w:sz w:val="36"/>
-          <w:szCs w:val="36"/>
-        </w:rPr>
-      </w:pPr>
-      <w:r>
-        <w:rPr/>
-      </w:r>
-    </w:p>
-    <w:p>
-      <w:pPr>
-        <w:pStyle w:val="Normal"/>
-        <w:jc w:val="both"/>
-        <w:rPr>
-          <w:sz w:val="36"/>
-          <w:szCs w:val="36"/>
-        </w:rPr>
-      </w:pPr>
-      <w:r>
-        <w:rPr>
-          <w:rFonts w:eastAsia="Arial" w:cs="Arial" w:ascii="Garamond" w:hAnsi="Garamond"/>
-          <w:color w:val="000000"/>
-          <w:kern w:val="0"/>
-          <w:sz w:val="36"/>
-          <w:szCs w:val="36"/>
-          <w:shd w:fill="auto" w:val="clear"/>
-          <w:lang w:val="en-US" w:eastAsia="zh-CN" w:bidi="hi-IN"/>
-        </w:rPr>
-        <w:t>---</w:t>
-      </w:r>
-    </w:p>
-    <w:p>
-      <w:pPr>
-        <w:pStyle w:val="Normal"/>
-        <w:jc w:val="both"/>
-        <w:rPr>
-          <w:sz w:val="36"/>
-          <w:szCs w:val="36"/>
-        </w:rPr>
-      </w:pPr>
-      <w:r>
-        <w:rPr/>
-      </w:r>
-    </w:p>
-    <w:p>
-      <w:pPr>
-        <w:pStyle w:val="Normal"/>
-        <w:jc w:val="both"/>
-        <w:rPr>
-          <w:sz w:val="36"/>
-          <w:szCs w:val="36"/>
-        </w:rPr>
-      </w:pPr>
-      <w:r>
-        <w:rPr>
-          <w:rFonts w:eastAsia="Arial" w:cs="Arial" w:ascii="Garamond" w:hAnsi="Garamond"/>
-          <w:color w:val="000000"/>
-          <w:kern w:val="0"/>
-          <w:sz w:val="36"/>
-          <w:szCs w:val="36"/>
-          <w:shd w:fill="auto" w:val="clear"/>
-          <w:lang w:val="en-US" w:eastAsia="zh-CN" w:bidi="hi-IN"/>
-        </w:rPr>
-        <w:t>### ✨ 1. **Coragem**</w:t>
-      </w:r>
-    </w:p>
-    <w:p>
-      <w:pPr>
-        <w:pStyle w:val="Normal"/>
-        <w:jc w:val="both"/>
-        <w:rPr>
-          <w:sz w:val="36"/>
-          <w:szCs w:val="36"/>
-        </w:rPr>
-      </w:pPr>
-      <w:r>
-        <w:rPr/>
-      </w:r>
-    </w:p>
-    <w:p>
-      <w:pPr>
-        <w:pStyle w:val="Normal"/>
-        <w:jc w:val="both"/>
-        <w:rPr>
-          <w:sz w:val="36"/>
-          <w:szCs w:val="36"/>
-        </w:rPr>
-      </w:pPr>
-      <w:r>
-        <w:rPr>
-          <w:rFonts w:eastAsia="Arial" w:cs="Arial" w:ascii="Garamond" w:hAnsi="Garamond"/>
-          <w:color w:val="000000"/>
-          <w:kern w:val="0"/>
-          <w:sz w:val="36"/>
-          <w:szCs w:val="36"/>
-          <w:shd w:fill="auto" w:val="clear"/>
-          <w:lang w:val="en-US" w:eastAsia="zh-CN" w:bidi="hi-IN"/>
-        </w:rPr>
-        <w:t>Mesmo diante de uma cena brutal e humilhante, Maria **não se esconde**. Ela permanece ao lado do Filho, diante da violência e do ódio público, enfrentando o perigo, a dor e a exposição. Sua coragem não é impulsiva, mas silenciosa, sustentada pela fé e pelo amor.</w:t>
-      </w:r>
-    </w:p>
-    <w:p>
-      <w:pPr>
-        <w:pStyle w:val="Normal"/>
-        <w:jc w:val="both"/>
-        <w:rPr>
-          <w:sz w:val="36"/>
-          <w:szCs w:val="36"/>
-        </w:rPr>
-      </w:pPr>
-      <w:r>
-        <w:rPr/>
-      </w:r>
-    </w:p>
-    <w:p>
-      <w:pPr>
-        <w:pStyle w:val="Normal"/>
-        <w:jc w:val="both"/>
-        <w:rPr>
-          <w:sz w:val="36"/>
-          <w:szCs w:val="36"/>
-        </w:rPr>
-      </w:pPr>
-      <w:r>
-        <w:rPr>
-          <w:rFonts w:eastAsia="Arial" w:cs="Arial" w:ascii="Garamond" w:hAnsi="Garamond"/>
-          <w:color w:val="000000"/>
-          <w:kern w:val="0"/>
-          <w:sz w:val="36"/>
-          <w:szCs w:val="36"/>
-          <w:shd w:fill="auto" w:val="clear"/>
-          <w:lang w:val="en-US" w:eastAsia="zh-CN" w:bidi="hi-IN"/>
-        </w:rPr>
-        <w:t>&gt; ➤ *"Junto à cruz de Jesus estavam sua mãe..."* (João 19:25)</w:t>
-      </w:r>
-    </w:p>
-    <w:p>
-      <w:pPr>
-        <w:pStyle w:val="Normal"/>
-        <w:jc w:val="both"/>
-        <w:rPr>
-          <w:sz w:val="36"/>
-          <w:szCs w:val="36"/>
-        </w:rPr>
-      </w:pPr>
-      <w:r>
-        <w:rPr/>
-      </w:r>
-    </w:p>
-    <w:p>
-      <w:pPr>
-        <w:pStyle w:val="Normal"/>
-        <w:jc w:val="both"/>
-        <w:rPr>
-          <w:sz w:val="36"/>
-          <w:szCs w:val="36"/>
-        </w:rPr>
-      </w:pPr>
-      <w:r>
-        <w:rPr>
-          <w:rFonts w:eastAsia="Arial" w:cs="Arial" w:ascii="Garamond" w:hAnsi="Garamond"/>
-          <w:color w:val="000000"/>
-          <w:kern w:val="0"/>
-          <w:sz w:val="36"/>
-          <w:szCs w:val="36"/>
-          <w:shd w:fill="auto" w:val="clear"/>
-          <w:lang w:val="en-US" w:eastAsia="zh-CN" w:bidi="hi-IN"/>
-        </w:rPr>
-        <w:t>---</w:t>
-      </w:r>
-    </w:p>
-    <w:p>
-      <w:pPr>
-        <w:pStyle w:val="Normal"/>
-        <w:jc w:val="both"/>
-        <w:rPr>
-          <w:sz w:val="36"/>
-          <w:szCs w:val="36"/>
-        </w:rPr>
-      </w:pPr>
-      <w:r>
-        <w:rPr/>
-      </w:r>
-    </w:p>
-    <w:p>
-      <w:pPr>
-        <w:pStyle w:val="Normal"/>
-        <w:jc w:val="both"/>
-        <w:rPr>
-          <w:sz w:val="36"/>
-          <w:szCs w:val="36"/>
-        </w:rPr>
-      </w:pPr>
-      <w:r>
-        <w:rPr>
-          <w:rFonts w:eastAsia="Arial" w:cs="Arial" w:ascii="Garamond" w:hAnsi="Garamond"/>
-          <w:color w:val="000000"/>
-          <w:kern w:val="0"/>
-          <w:sz w:val="36"/>
-          <w:szCs w:val="36"/>
-          <w:shd w:fill="auto" w:val="clear"/>
-          <w:lang w:val="en-US" w:eastAsia="zh-CN" w:bidi="hi-IN"/>
-        </w:rPr>
-        <w:t>### ✨ 2. **Fidelidade**</w:t>
-      </w:r>
-    </w:p>
-    <w:p>
-      <w:pPr>
-        <w:pStyle w:val="Normal"/>
-        <w:jc w:val="both"/>
-        <w:rPr>
-          <w:sz w:val="36"/>
-          <w:szCs w:val="36"/>
-        </w:rPr>
-      </w:pPr>
-      <w:r>
-        <w:rPr/>
-      </w:r>
-    </w:p>
-    <w:p>
-      <w:pPr>
-        <w:pStyle w:val="Normal"/>
-        <w:jc w:val="both"/>
-        <w:rPr>
-          <w:sz w:val="36"/>
-          <w:szCs w:val="36"/>
-        </w:rPr>
-      </w:pPr>
-      <w:r>
-        <w:rPr>
-          <w:rFonts w:eastAsia="Arial" w:cs="Arial" w:ascii="Garamond" w:hAnsi="Garamond"/>
-          <w:color w:val="000000"/>
-          <w:kern w:val="0"/>
-          <w:sz w:val="36"/>
-          <w:szCs w:val="36"/>
-          <w:shd w:fill="auto" w:val="clear"/>
-          <w:lang w:val="en-US" w:eastAsia="zh-CN" w:bidi="hi-IN"/>
-        </w:rPr>
-        <w:t>Maria permanece **fiel até o fim**, como poucas pessoas conseguiram. Não apenas fiel a Jesus enquanto Filho, mas fiel à missão divina que ela aceitou desde a anunciação: ser instrumento do amor de Deus.</w:t>
-      </w:r>
-    </w:p>
-    <w:p>
-      <w:pPr>
-        <w:pStyle w:val="Normal"/>
-        <w:jc w:val="both"/>
-        <w:rPr>
-          <w:sz w:val="36"/>
-          <w:szCs w:val="36"/>
-        </w:rPr>
-      </w:pPr>
-      <w:r>
-        <w:rPr/>
-      </w:r>
-    </w:p>
-    <w:p>
-      <w:pPr>
-        <w:pStyle w:val="Normal"/>
-        <w:jc w:val="both"/>
-        <w:rPr>
-          <w:sz w:val="36"/>
-          <w:szCs w:val="36"/>
-        </w:rPr>
-      </w:pPr>
-      <w:r>
-        <w:rPr>
-          <w:rFonts w:eastAsia="Arial" w:cs="Arial" w:ascii="Garamond" w:hAnsi="Garamond"/>
-          <w:color w:val="000000"/>
-          <w:kern w:val="0"/>
-          <w:sz w:val="36"/>
-          <w:szCs w:val="36"/>
-          <w:shd w:fill="auto" w:val="clear"/>
-          <w:lang w:val="en-US" w:eastAsia="zh-CN" w:bidi="hi-IN"/>
-        </w:rPr>
-        <w:t>---</w:t>
-      </w:r>
-    </w:p>
-    <w:p>
-      <w:pPr>
-        <w:pStyle w:val="Normal"/>
-        <w:jc w:val="both"/>
-        <w:rPr>
-          <w:sz w:val="36"/>
-          <w:szCs w:val="36"/>
-        </w:rPr>
-      </w:pPr>
-      <w:r>
-        <w:rPr/>
-      </w:r>
-    </w:p>
-    <w:p>
-      <w:pPr>
-        <w:pStyle w:val="Normal"/>
-        <w:jc w:val="both"/>
-        <w:rPr>
-          <w:sz w:val="36"/>
-          <w:szCs w:val="36"/>
-        </w:rPr>
-      </w:pPr>
-      <w:r>
-        <w:rPr>
-          <w:rFonts w:eastAsia="Arial" w:cs="Arial" w:ascii="Garamond" w:hAnsi="Garamond"/>
-          <w:color w:val="000000"/>
-          <w:kern w:val="0"/>
-          <w:sz w:val="36"/>
-          <w:szCs w:val="36"/>
-          <w:shd w:fill="auto" w:val="clear"/>
-          <w:lang w:val="en-US" w:eastAsia="zh-CN" w:bidi="hi-IN"/>
-        </w:rPr>
-        <w:t>### ✨ 3. **Renúncia**</w:t>
-      </w:r>
-    </w:p>
-    <w:p>
-      <w:pPr>
-        <w:pStyle w:val="Normal"/>
-        <w:jc w:val="both"/>
-        <w:rPr>
-          <w:sz w:val="36"/>
-          <w:szCs w:val="36"/>
-        </w:rPr>
-      </w:pPr>
-      <w:r>
-        <w:rPr/>
-      </w:r>
-    </w:p>
-    <w:p>
-      <w:pPr>
-        <w:pStyle w:val="Normal"/>
-        <w:jc w:val="both"/>
-        <w:rPr>
-          <w:sz w:val="36"/>
-          <w:szCs w:val="36"/>
-        </w:rPr>
-      </w:pPr>
-      <w:r>
-        <w:rPr>
-          <w:rFonts w:eastAsia="Arial" w:cs="Arial" w:ascii="Garamond" w:hAnsi="Garamond"/>
-          <w:color w:val="000000"/>
-          <w:kern w:val="0"/>
-          <w:sz w:val="36"/>
-          <w:szCs w:val="36"/>
-          <w:shd w:fill="auto" w:val="clear"/>
-          <w:lang w:val="en-US" w:eastAsia="zh-CN" w:bidi="hi-IN"/>
-        </w:rPr>
-        <w:t>Ver um filho padecer injustamente e, ainda assim, **não se revoltar** contra a vontade divina exige imensa renúncia. Maria, silenciosa, entrega mais uma vez Jesus a Deus, com a mesma disposição com que O acolheu em Belém.</w:t>
-      </w:r>
-    </w:p>
-    <w:p>
-      <w:pPr>
-        <w:pStyle w:val="Normal"/>
-        <w:jc w:val="both"/>
-        <w:rPr>
-          <w:sz w:val="36"/>
-          <w:szCs w:val="36"/>
-        </w:rPr>
-      </w:pPr>
-      <w:r>
-        <w:rPr/>
-      </w:r>
-    </w:p>
-    <w:p>
-      <w:pPr>
-        <w:pStyle w:val="Normal"/>
-        <w:jc w:val="both"/>
-        <w:rPr>
-          <w:sz w:val="36"/>
-          <w:szCs w:val="36"/>
-        </w:rPr>
-      </w:pPr>
-      <w:r>
-        <w:rPr>
-          <w:rFonts w:eastAsia="Arial" w:cs="Arial" w:ascii="Garamond" w:hAnsi="Garamond"/>
-          <w:color w:val="000000"/>
-          <w:kern w:val="0"/>
-          <w:sz w:val="36"/>
-          <w:szCs w:val="36"/>
-          <w:shd w:fill="auto" w:val="clear"/>
-          <w:lang w:val="en-US" w:eastAsia="zh-CN" w:bidi="hi-IN"/>
-        </w:rPr>
-        <w:t>---</w:t>
-      </w:r>
-    </w:p>
-    <w:p>
-      <w:pPr>
-        <w:pStyle w:val="Normal"/>
-        <w:jc w:val="both"/>
-        <w:rPr>
-          <w:sz w:val="36"/>
-          <w:szCs w:val="36"/>
-        </w:rPr>
-      </w:pPr>
-      <w:r>
-        <w:rPr/>
-      </w:r>
-    </w:p>
-    <w:p>
-      <w:pPr>
-        <w:pStyle w:val="Normal"/>
-        <w:jc w:val="both"/>
-        <w:rPr>
-          <w:sz w:val="36"/>
-          <w:szCs w:val="36"/>
-        </w:rPr>
-      </w:pPr>
-      <w:r>
-        <w:rPr>
-          <w:rFonts w:eastAsia="Arial" w:cs="Arial" w:ascii="Garamond" w:hAnsi="Garamond"/>
-          <w:color w:val="000000"/>
-          <w:kern w:val="0"/>
-          <w:sz w:val="36"/>
-          <w:szCs w:val="36"/>
-          <w:shd w:fill="auto" w:val="clear"/>
-          <w:lang w:val="en-US" w:eastAsia="zh-CN" w:bidi="hi-IN"/>
-        </w:rPr>
-        <w:t>### ✨ 4. **Silêncio Amoroso**</w:t>
-      </w:r>
-    </w:p>
-    <w:p>
-      <w:pPr>
-        <w:pStyle w:val="Normal"/>
-        <w:jc w:val="both"/>
-        <w:rPr>
-          <w:sz w:val="36"/>
-          <w:szCs w:val="36"/>
-        </w:rPr>
-      </w:pPr>
-      <w:r>
-        <w:rPr/>
-      </w:r>
-    </w:p>
-    <w:p>
-      <w:pPr>
-        <w:pStyle w:val="Normal"/>
-        <w:jc w:val="both"/>
-        <w:rPr>
-          <w:sz w:val="36"/>
-          <w:szCs w:val="36"/>
-        </w:rPr>
-      </w:pPr>
-      <w:r>
-        <w:rPr>
-          <w:rFonts w:eastAsia="Arial" w:cs="Arial" w:ascii="Garamond" w:hAnsi="Garamond"/>
-          <w:color w:val="000000"/>
-          <w:kern w:val="0"/>
-          <w:sz w:val="36"/>
-          <w:szCs w:val="36"/>
-          <w:shd w:fill="auto" w:val="clear"/>
-          <w:lang w:val="en-US" w:eastAsia="zh-CN" w:bidi="hi-IN"/>
-        </w:rPr>
-        <w:t>Maria **não diz nenhuma palavra** no relato da crucificação — e esse silêncio é cheio de significado. É o silêncio de quem compreende que há dores que não se explicam, apenas se acolhem. Um silêncio que respeita o mistério da vontade divina.</w:t>
-      </w:r>
-    </w:p>
-    <w:p>
-      <w:pPr>
-        <w:pStyle w:val="Normal"/>
-        <w:jc w:val="both"/>
-        <w:rPr>
-          <w:sz w:val="36"/>
-          <w:szCs w:val="36"/>
-        </w:rPr>
-      </w:pPr>
-      <w:r>
-        <w:rPr/>
-      </w:r>
-    </w:p>
-    <w:p>
-      <w:pPr>
-        <w:pStyle w:val="Normal"/>
-        <w:jc w:val="both"/>
-        <w:rPr>
-          <w:sz w:val="36"/>
-          <w:szCs w:val="36"/>
-        </w:rPr>
-      </w:pPr>
-      <w:r>
-        <w:rPr>
-          <w:rFonts w:eastAsia="Arial" w:cs="Arial" w:ascii="Garamond" w:hAnsi="Garamond"/>
-          <w:color w:val="000000"/>
-          <w:kern w:val="0"/>
-          <w:sz w:val="36"/>
-          <w:szCs w:val="36"/>
-          <w:shd w:fill="auto" w:val="clear"/>
-          <w:lang w:val="en-US" w:eastAsia="zh-CN" w:bidi="hi-IN"/>
-        </w:rPr>
-        <w:t>---</w:t>
-      </w:r>
-    </w:p>
-    <w:p>
-      <w:pPr>
-        <w:pStyle w:val="Normal"/>
-        <w:jc w:val="both"/>
-        <w:rPr>
-          <w:sz w:val="36"/>
-          <w:szCs w:val="36"/>
-        </w:rPr>
-      </w:pPr>
-      <w:r>
-        <w:rPr/>
-      </w:r>
-    </w:p>
-    <w:p>
-      <w:pPr>
-        <w:pStyle w:val="Normal"/>
-        <w:jc w:val="both"/>
-        <w:rPr>
-          <w:sz w:val="36"/>
-          <w:szCs w:val="36"/>
-        </w:rPr>
-      </w:pPr>
-      <w:r>
-        <w:rPr>
-          <w:rFonts w:eastAsia="Arial" w:cs="Arial" w:ascii="Garamond" w:hAnsi="Garamond"/>
-          <w:color w:val="000000"/>
-          <w:kern w:val="0"/>
-          <w:sz w:val="36"/>
-          <w:szCs w:val="36"/>
-          <w:shd w:fill="auto" w:val="clear"/>
-          <w:lang w:val="en-US" w:eastAsia="zh-CN" w:bidi="hi-IN"/>
-        </w:rPr>
-        <w:t>### ✨ 5. **Compaixão e entrega**</w:t>
-      </w:r>
-    </w:p>
-    <w:p>
-      <w:pPr>
-        <w:pStyle w:val="Normal"/>
-        <w:jc w:val="both"/>
-        <w:rPr>
-          <w:sz w:val="36"/>
-          <w:szCs w:val="36"/>
-        </w:rPr>
-      </w:pPr>
-      <w:r>
-        <w:rPr/>
-      </w:r>
-    </w:p>
-    <w:p>
-      <w:pPr>
-        <w:pStyle w:val="Normal"/>
-        <w:jc w:val="both"/>
-        <w:rPr>
-          <w:sz w:val="36"/>
-          <w:szCs w:val="36"/>
-        </w:rPr>
-      </w:pPr>
-      <w:r>
-        <w:rPr>
-          <w:rFonts w:eastAsia="Arial" w:cs="Arial" w:ascii="Garamond" w:hAnsi="Garamond"/>
-          <w:color w:val="000000"/>
-          <w:kern w:val="0"/>
-          <w:sz w:val="36"/>
-          <w:szCs w:val="36"/>
-          <w:shd w:fill="auto" w:val="clear"/>
-          <w:lang w:val="en-US" w:eastAsia="zh-CN" w:bidi="hi-IN"/>
-        </w:rPr>
-        <w:t>Ao aceitar João como filho, Maria **alarga seu coração**. Mesmo dilacerada pela dor, ela **não se fecha em si mesma**, mas continua a servir. Jesus a convida a **abraçar a humanidade**, e ela aceita.</w:t>
-      </w:r>
-    </w:p>
-    <w:p>
-      <w:pPr>
-        <w:pStyle w:val="Normal"/>
-        <w:jc w:val="both"/>
-        <w:rPr>
-          <w:sz w:val="36"/>
-          <w:szCs w:val="36"/>
-        </w:rPr>
-      </w:pPr>
-      <w:r>
-        <w:rPr/>
-      </w:r>
-    </w:p>
-    <w:p>
-      <w:pPr>
-        <w:pStyle w:val="Normal"/>
-        <w:jc w:val="both"/>
-        <w:rPr>
-          <w:sz w:val="36"/>
-          <w:szCs w:val="36"/>
-        </w:rPr>
-      </w:pPr>
-      <w:r>
-        <w:rPr>
-          <w:rFonts w:eastAsia="Arial" w:cs="Arial" w:ascii="Garamond" w:hAnsi="Garamond"/>
-          <w:color w:val="000000"/>
-          <w:kern w:val="0"/>
-          <w:sz w:val="36"/>
-          <w:szCs w:val="36"/>
-          <w:shd w:fill="auto" w:val="clear"/>
-          <w:lang w:val="en-US" w:eastAsia="zh-CN" w:bidi="hi-IN"/>
-        </w:rPr>
-        <w:t>&gt; ➤ *"Mulher, eis aí teu filho... Eis aí tua mãe."* (João 19:26-27)</w:t>
-      </w:r>
-    </w:p>
-    <w:p>
-      <w:pPr>
-        <w:pStyle w:val="Normal"/>
-        <w:jc w:val="both"/>
-        <w:rPr>
-          <w:sz w:val="36"/>
-          <w:szCs w:val="36"/>
-        </w:rPr>
-      </w:pPr>
-      <w:r>
-        <w:rPr/>
-      </w:r>
-    </w:p>
-    <w:p>
-      <w:pPr>
-        <w:pStyle w:val="Normal"/>
-        <w:jc w:val="both"/>
-        <w:rPr>
-          <w:sz w:val="36"/>
-          <w:szCs w:val="36"/>
-        </w:rPr>
-      </w:pPr>
-      <w:r>
-        <w:rPr>
-          <w:rFonts w:eastAsia="Arial" w:cs="Arial" w:ascii="Garamond" w:hAnsi="Garamond"/>
-          <w:color w:val="000000"/>
-          <w:kern w:val="0"/>
-          <w:sz w:val="36"/>
-          <w:szCs w:val="36"/>
-          <w:shd w:fill="auto" w:val="clear"/>
-          <w:lang w:val="en-US" w:eastAsia="zh-CN" w:bidi="hi-IN"/>
-        </w:rPr>
-        <w:t>---</w:t>
-      </w:r>
-    </w:p>
-    <w:p>
-      <w:pPr>
-        <w:pStyle w:val="Normal"/>
-        <w:jc w:val="both"/>
-        <w:rPr>
-          <w:sz w:val="36"/>
-          <w:szCs w:val="36"/>
-        </w:rPr>
-      </w:pPr>
-      <w:r>
-        <w:rPr/>
-      </w:r>
-    </w:p>
-    <w:p>
-      <w:pPr>
-        <w:pStyle w:val="Normal"/>
-        <w:jc w:val="both"/>
-        <w:rPr>
-          <w:sz w:val="36"/>
-          <w:szCs w:val="36"/>
-        </w:rPr>
-      </w:pPr>
-      <w:r>
-        <w:rPr>
-          <w:rFonts w:eastAsia="Arial" w:cs="Arial" w:ascii="Garamond" w:hAnsi="Garamond"/>
-          <w:color w:val="000000"/>
-          <w:kern w:val="0"/>
-          <w:sz w:val="36"/>
-          <w:szCs w:val="36"/>
-          <w:shd w:fill="auto" w:val="clear"/>
-          <w:lang w:val="en-US" w:eastAsia="zh-CN" w:bidi="hi-IN"/>
-        </w:rPr>
-        <w:t>### ✨ 6. **Disposição em servir — mesmo na dor**</w:t>
-      </w:r>
-    </w:p>
-    <w:p>
-      <w:pPr>
-        <w:pStyle w:val="Normal"/>
-        <w:jc w:val="both"/>
-        <w:rPr>
-          <w:sz w:val="36"/>
-          <w:szCs w:val="36"/>
-        </w:rPr>
-      </w:pPr>
-      <w:r>
-        <w:rPr/>
-      </w:r>
-    </w:p>
-    <w:p>
-      <w:pPr>
-        <w:pStyle w:val="Normal"/>
-        <w:jc w:val="both"/>
-        <w:rPr>
-          <w:sz w:val="36"/>
-          <w:szCs w:val="36"/>
-        </w:rPr>
-      </w:pPr>
-      <w:r>
-        <w:rPr>
-          <w:rFonts w:eastAsia="Arial" w:cs="Arial" w:ascii="Garamond" w:hAnsi="Garamond"/>
-          <w:color w:val="000000"/>
-          <w:kern w:val="0"/>
-          <w:sz w:val="36"/>
-          <w:szCs w:val="36"/>
-          <w:shd w:fill="auto" w:val="clear"/>
-          <w:lang w:val="en-US" w:eastAsia="zh-CN" w:bidi="hi-IN"/>
-        </w:rPr>
-        <w:t>Esse é o ponto central da sua palestra. A crucificação seria o momento mais justificável para se recolher na dor. Mas não: ali, **Maria recebe uma nova missão** — ser mãe espiritual de todos. E ela **aceita**, em silêncio, como serva do Senhor.</w:t>
-      </w:r>
-    </w:p>
-    <w:p>
-      <w:pPr>
-        <w:pStyle w:val="Normal"/>
-        <w:jc w:val="both"/>
-        <w:rPr>
-          <w:sz w:val="36"/>
-          <w:szCs w:val="36"/>
-        </w:rPr>
-      </w:pPr>
-      <w:r>
-        <w:rPr/>
-      </w:r>
-    </w:p>
-    <w:p>
-      <w:pPr>
-        <w:pStyle w:val="Normal"/>
-        <w:jc w:val="both"/>
-        <w:rPr>
-          <w:sz w:val="36"/>
-          <w:szCs w:val="36"/>
-        </w:rPr>
-      </w:pPr>
-      <w:r>
-        <w:rPr>
-          <w:rFonts w:eastAsia="Arial" w:cs="Arial" w:ascii="Garamond" w:hAnsi="Garamond"/>
-          <w:color w:val="000000"/>
-          <w:kern w:val="0"/>
-          <w:sz w:val="36"/>
-          <w:szCs w:val="36"/>
-          <w:shd w:fill="auto" w:val="clear"/>
-          <w:lang w:val="en-US" w:eastAsia="zh-CN" w:bidi="hi-IN"/>
-        </w:rPr>
-        <w:t>---</w:t>
-      </w:r>
-    </w:p>
-    <w:p>
-      <w:pPr>
-        <w:pStyle w:val="Normal"/>
-        <w:jc w:val="both"/>
-        <w:rPr>
-          <w:sz w:val="36"/>
-          <w:szCs w:val="36"/>
-        </w:rPr>
-      </w:pPr>
-      <w:r>
-        <w:rPr/>
-      </w:r>
-    </w:p>
-    <w:p>
-      <w:pPr>
-        <w:pStyle w:val="Normal"/>
-        <w:jc w:val="both"/>
-        <w:rPr>
-          <w:sz w:val="36"/>
-          <w:szCs w:val="36"/>
-        </w:rPr>
-      </w:pPr>
-      <w:r>
-        <w:rPr>
-          <w:rFonts w:eastAsia="Arial" w:cs="Arial" w:ascii="Garamond" w:hAnsi="Garamond"/>
-          <w:color w:val="000000"/>
-          <w:kern w:val="0"/>
-          <w:sz w:val="36"/>
-          <w:szCs w:val="36"/>
-          <w:shd w:fill="auto" w:val="clear"/>
-          <w:lang w:val="en-US" w:eastAsia="zh-CN" w:bidi="hi-IN"/>
-        </w:rPr>
-        <w:t>Se desejar, posso transformar essas virtudes em uma estrutura breve para leitura ou exibição em sua palestra. Deseja isso?</w:t>
-      </w:r>
-    </w:p>
-    <w:p>
-      <w:pPr>
-        <w:pStyle w:val="Normal"/>
-        <w:jc w:val="both"/>
-        <w:rPr>
-          <w:sz w:val="36"/>
-          <w:szCs w:val="36"/>
-        </w:rPr>
-      </w:pPr>
-      <w:r>
-        <w:rPr>
-          <w:rFonts w:eastAsia="Arial" w:cs="Arial" w:ascii="Garamond" w:hAnsi="Garamond"/>
-          <w:color w:val="000000"/>
-          <w:kern w:val="0"/>
-          <w:sz w:val="36"/>
-          <w:szCs w:val="36"/>
-          <w:shd w:fill="auto" w:val="clear"/>
-          <w:lang w:val="en-US" w:eastAsia="zh-CN" w:bidi="hi-IN"/>
-        </w:rPr>
-        <w:t>&gt;&gt;&gt;</w:t>
-      </w:r>
-    </w:p>
-    <w:p>
-      <w:pPr>
-        <w:pStyle w:val="Normal"/>
-        <w:jc w:val="both"/>
-        <w:rPr>
-          <w:sz w:val="36"/>
-          <w:szCs w:val="36"/>
-        </w:rPr>
-      </w:pPr>
-      <w:r>
-        <w:rPr/>
-      </w:r>
-    </w:p>
-    <w:p>
-      <w:pPr>
-        <w:pStyle w:val="Normal"/>
-        <w:jc w:val="both"/>
-        <w:rPr>
-          <w:sz w:val="36"/>
-          <w:szCs w:val="36"/>
-        </w:rPr>
-      </w:pPr>
-      <w:r>
-        <w:rPr>
-          <w:rFonts w:eastAsia="Arial" w:cs="Arial" w:ascii="Garamond" w:hAnsi="Garamond"/>
-          <w:color w:val="000000"/>
-          <w:kern w:val="0"/>
-          <w:sz w:val="36"/>
-          <w:szCs w:val="36"/>
-          <w:shd w:fill="auto" w:val="clear"/>
-          <w:lang w:val="en-US" w:eastAsia="zh-CN" w:bidi="hi-IN"/>
-        </w:rPr>
-        <w:t>&lt;&lt;&lt;</w:t>
-      </w:r>
-    </w:p>
-    <w:p>
-      <w:pPr>
-        <w:pStyle w:val="Normal"/>
-        <w:jc w:val="both"/>
-        <w:rPr>
-          <w:sz w:val="36"/>
-          <w:szCs w:val="36"/>
-        </w:rPr>
-      </w:pPr>
-      <w:r>
-        <w:rPr>
-          <w:rFonts w:eastAsia="Arial" w:cs="Arial" w:ascii="Garamond" w:hAnsi="Garamond"/>
-          <w:color w:val="000000"/>
-          <w:kern w:val="0"/>
-          <w:sz w:val="36"/>
-          <w:szCs w:val="36"/>
-          <w:shd w:fill="auto" w:val="clear"/>
-          <w:lang w:val="en-US" w:eastAsia="zh-CN" w:bidi="hi-IN"/>
-        </w:rPr>
-        <w:t>Texto gerado pelo ChatGPT, VERSÃO 1</w:t>
-      </w:r>
-    </w:p>
-    <w:p>
-      <w:pPr>
-        <w:pStyle w:val="Normal"/>
-        <w:jc w:val="both"/>
-        <w:rPr>
-          <w:sz w:val="36"/>
-          <w:szCs w:val="36"/>
-        </w:rPr>
-      </w:pPr>
-      <w:r>
-        <w:rPr/>
-      </w:r>
-    </w:p>
-    <w:p>
-      <w:pPr>
-        <w:pStyle w:val="Normal"/>
-        <w:jc w:val="both"/>
-        <w:rPr>
-          <w:sz w:val="36"/>
-          <w:szCs w:val="36"/>
-        </w:rPr>
-      </w:pPr>
-      <w:r>
-        <w:rPr>
-          <w:rFonts w:eastAsia="Arial" w:cs="Arial" w:ascii="Garamond" w:hAnsi="Garamond"/>
-          <w:color w:val="000000"/>
-          <w:kern w:val="0"/>
-          <w:sz w:val="36"/>
-          <w:szCs w:val="36"/>
-          <w:shd w:fill="auto" w:val="clear"/>
-          <w:lang w:val="en-US" w:eastAsia="zh-CN" w:bidi="hi-IN"/>
-        </w:rPr>
-        <w:t>Ao pé da cruz, Maria nos oferece um dos testemunhos mais profundos de amor, fidelidade e entrega silenciosa já registrados. Diante do sofrimento indescritível do Filho, ela não se esconde, não se desespera, não reclama. Permanece. Sua presença é firme, serena, profundamente corajosa. Entre soldados, insultos e o peso da tragédia, Maria demonstra a virtude de quem sabe que o amor verdadeiro não recua diante da dor.</w:t>
-      </w:r>
-    </w:p>
-    <w:p>
-      <w:pPr>
-        <w:pStyle w:val="Normal"/>
-        <w:jc w:val="both"/>
-        <w:rPr>
-          <w:sz w:val="36"/>
-          <w:szCs w:val="36"/>
-        </w:rPr>
-      </w:pPr>
-      <w:r>
-        <w:rPr/>
-      </w:r>
-    </w:p>
-    <w:p>
-      <w:pPr>
-        <w:pStyle w:val="Normal"/>
-        <w:jc w:val="both"/>
-        <w:rPr>
-          <w:sz w:val="36"/>
-          <w:szCs w:val="36"/>
-        </w:rPr>
-      </w:pPr>
-      <w:r>
-        <w:rPr>
-          <w:rFonts w:eastAsia="Arial" w:cs="Arial" w:ascii="Garamond" w:hAnsi="Garamond"/>
-          <w:color w:val="000000"/>
-          <w:kern w:val="0"/>
-          <w:sz w:val="36"/>
-          <w:szCs w:val="36"/>
-          <w:shd w:fill="auto" w:val="clear"/>
-          <w:lang w:val="en-US" w:eastAsia="zh-CN" w:bidi="hi-IN"/>
-        </w:rPr>
-        <w:t>Em silêncio, ela acolhe o cumprimento das palavras do anjo anunciador e reafirma sua fidelidade à vontade divina. Se em Belém ela O recebeu nos braços, agora, no Calvário, ela O entrega de volta ao Pai — com a mesma humildade, com o mesmo espírito de serviço. Sua renúncia não é apenas materna, é espiritual. É uma entrega amorosa que transcende os laços consanguíneos.</w:t>
-      </w:r>
-    </w:p>
-    <w:p>
-      <w:pPr>
-        <w:pStyle w:val="Normal"/>
-        <w:jc w:val="both"/>
-        <w:rPr>
-          <w:sz w:val="36"/>
-          <w:szCs w:val="36"/>
-        </w:rPr>
-      </w:pPr>
-      <w:r>
-        <w:rPr/>
-      </w:r>
-    </w:p>
-    <w:p>
-      <w:pPr>
-        <w:pStyle w:val="Normal"/>
-        <w:jc w:val="both"/>
-        <w:rPr>
-          <w:sz w:val="36"/>
-          <w:szCs w:val="36"/>
-        </w:rPr>
-      </w:pPr>
-      <w:r>
-        <w:rPr>
-          <w:rFonts w:eastAsia="Arial" w:cs="Arial" w:ascii="Garamond" w:hAnsi="Garamond"/>
-          <w:color w:val="000000"/>
-          <w:kern w:val="0"/>
-          <w:sz w:val="36"/>
-          <w:szCs w:val="36"/>
-          <w:shd w:fill="auto" w:val="clear"/>
-          <w:lang w:val="en-US" w:eastAsia="zh-CN" w:bidi="hi-IN"/>
-        </w:rPr>
-        <w:t>No momento em que Jesus lhe confia João como filho, Maria não recusa a nova missão. Mesmo ferida pela dor, ela acolhe, compreende e continua a servir. A maternidade espiritual que ali se inicia é um convite silencioso, mas eterno, para que todos nós nos deixemos envolver por esse amor que consola, sustenta e guia. Maria serve, mesmo no martírio, porque sua disposição em servir não depende das circunstâncias: é expressão de sua alma.</w:t>
-      </w:r>
-    </w:p>
-    <w:p>
-      <w:pPr>
-        <w:pStyle w:val="Normal"/>
-        <w:jc w:val="both"/>
-        <w:rPr>
-          <w:sz w:val="36"/>
-          <w:szCs w:val="36"/>
-        </w:rPr>
-      </w:pPr>
-      <w:r>
-        <w:rPr/>
-      </w:r>
-    </w:p>
-    <w:p>
-      <w:pPr>
-        <w:pStyle w:val="Normal"/>
-        <w:jc w:val="both"/>
-        <w:rPr>
-          <w:sz w:val="36"/>
-          <w:szCs w:val="36"/>
-        </w:rPr>
-      </w:pPr>
-      <w:r>
-        <w:rPr>
-          <w:rFonts w:eastAsia="Arial" w:cs="Arial" w:ascii="Garamond" w:hAnsi="Garamond"/>
-          <w:color w:val="000000"/>
-          <w:kern w:val="0"/>
-          <w:sz w:val="36"/>
-          <w:szCs w:val="36"/>
-          <w:shd w:fill="auto" w:val="clear"/>
-          <w:lang w:val="en-US" w:eastAsia="zh-CN" w:bidi="hi-IN"/>
-        </w:rPr>
-        <w:t>Texto gerado pelo ChatGPT, VERSÃO 2 (mais formal)</w:t>
-      </w:r>
-    </w:p>
-    <w:p>
-      <w:pPr>
-        <w:pStyle w:val="Normal"/>
-        <w:jc w:val="both"/>
-        <w:rPr>
-          <w:sz w:val="36"/>
-          <w:szCs w:val="36"/>
-        </w:rPr>
-      </w:pPr>
-      <w:r>
-        <w:rPr>
-          <w:rFonts w:eastAsia="Arial" w:cs="Arial" w:ascii="Garamond" w:hAnsi="Garamond"/>
-          <w:color w:val="000000"/>
-          <w:kern w:val="0"/>
-          <w:sz w:val="36"/>
-          <w:szCs w:val="36"/>
-          <w:shd w:fill="auto" w:val="clear"/>
-          <w:lang w:val="en-US" w:eastAsia="zh-CN" w:bidi="hi-IN"/>
-        </w:rPr>
-        <w:t>À sombra da cruz, Maria de Nazaré revela-se em toda a grandeza de sua alma. Diante do suplício de seu Filho, ela se mantém de pé, em silêncio, sustentando com dignidade e firmeza o peso de uma dor inimaginável. Não se ausenta nem se desespera; sua fidelidade a Deus e a Jesus permanece intacta, mesmo nas circunstâncias mais adversas. Sua presença, discreta e constante, simboliza uma fé madura, cultivada na renúncia e na abnegação.</w:t>
-      </w:r>
-    </w:p>
-    <w:p>
-      <w:pPr>
-        <w:pStyle w:val="Normal"/>
-        <w:jc w:val="both"/>
-        <w:rPr>
-          <w:sz w:val="36"/>
-          <w:szCs w:val="36"/>
-        </w:rPr>
-      </w:pPr>
-      <w:r>
-        <w:rPr/>
-      </w:r>
-    </w:p>
-    <w:p>
-      <w:pPr>
-        <w:pStyle w:val="Normal"/>
-        <w:jc w:val="both"/>
-        <w:rPr>
-          <w:sz w:val="36"/>
-          <w:szCs w:val="36"/>
-        </w:rPr>
-      </w:pPr>
-      <w:r>
-        <w:rPr>
-          <w:rFonts w:eastAsia="Arial" w:cs="Arial" w:ascii="Garamond" w:hAnsi="Garamond"/>
-          <w:color w:val="000000"/>
-          <w:kern w:val="0"/>
-          <w:sz w:val="36"/>
-          <w:szCs w:val="36"/>
-          <w:shd w:fill="auto" w:val="clear"/>
-          <w:lang w:val="en-US" w:eastAsia="zh-CN" w:bidi="hi-IN"/>
-        </w:rPr>
-        <w:t>Maria não apenas presencia o cumprimento das promessas divinas anunciadas desde a concepção de Jesus, como também reafirma, por sua atitude, a disposição de continuar servindo aos desígnios do Alto. Se no início da missão materna ela acolheu o Verbo com humildade, no Calvário ela o devolve ao Pai com igual submissão. Tal gesto representa não apenas a dor de uma mãe, mas o testemunho de uma serva que compreende, profundamente, o valor da obediência à vontade divina.</w:t>
-      </w:r>
-    </w:p>
-    <w:p>
-      <w:pPr>
-        <w:pStyle w:val="Normal"/>
-        <w:jc w:val="both"/>
-        <w:rPr>
-          <w:sz w:val="36"/>
-          <w:szCs w:val="36"/>
-        </w:rPr>
-      </w:pPr>
-      <w:r>
-        <w:rPr/>
-      </w:r>
-    </w:p>
-    <w:p>
-      <w:pPr>
-        <w:pStyle w:val="Normal"/>
-        <w:jc w:val="both"/>
-        <w:rPr>
-          <w:sz w:val="36"/>
-          <w:szCs w:val="36"/>
-        </w:rPr>
-      </w:pPr>
-      <w:r>
-        <w:rPr>
-          <w:rFonts w:eastAsia="Arial" w:cs="Arial" w:ascii="Garamond" w:hAnsi="Garamond"/>
-          <w:color w:val="000000"/>
-          <w:kern w:val="0"/>
-          <w:sz w:val="36"/>
-          <w:szCs w:val="36"/>
-          <w:shd w:fill="auto" w:val="clear"/>
-          <w:lang w:val="en-US" w:eastAsia="zh-CN" w:bidi="hi-IN"/>
-        </w:rPr>
-        <w:t>Ao confiar-lhe João como filho, Jesus estende a maternidade de Maria à humanidade inteira. E ela, mesmo dilacerada pela dor, não recusa a nova incumbência. Seu silêncio torna-se eloquente: ensina-nos que o verdadeiro serviço ao bem não se interrompe diante do sofrimento, mas nele encontra nova expressão. Maria continua a servir, porque o serviço, para ela, é expressão natural do amor.</w:t>
-      </w:r>
-    </w:p>
-    <w:p>
-      <w:pPr>
-        <w:pStyle w:val="Normal"/>
-        <w:jc w:val="both"/>
-        <w:rPr>
-          <w:sz w:val="36"/>
-          <w:szCs w:val="36"/>
-        </w:rPr>
-      </w:pPr>
-      <w:r>
-        <w:rPr/>
-      </w:r>
-    </w:p>
-    <w:p>
-      <w:pPr>
-        <w:pStyle w:val="Normal"/>
-        <w:jc w:val="both"/>
-        <w:rPr>
-          <w:sz w:val="36"/>
-          <w:szCs w:val="36"/>
-        </w:rPr>
-      </w:pPr>
-      <w:r>
-        <w:rPr/>
-      </w:r>
-    </w:p>
-    <w:p>
-      <w:pPr>
-        <w:pStyle w:val="Normal"/>
-        <w:jc w:val="both"/>
-        <w:rPr>
-          <w:sz w:val="36"/>
-          <w:szCs w:val="36"/>
-        </w:rPr>
-      </w:pPr>
-      <w:r>
-        <w:rPr>
-          <w:rFonts w:eastAsia="Arial" w:cs="Arial" w:ascii="Garamond" w:hAnsi="Garamond"/>
-          <w:color w:val="000000"/>
-          <w:kern w:val="0"/>
-          <w:sz w:val="36"/>
-          <w:szCs w:val="36"/>
-          <w:shd w:fill="auto" w:val="clear"/>
-          <w:lang w:val="en-US" w:eastAsia="zh-CN" w:bidi="hi-IN"/>
-        </w:rPr>
-        <w:t>&gt;&gt;&gt;</w:t>
+        <w:t>Ao confiar-lhe João como filho, Jesus estende a maternidade de Maria à humanidade inteira e nos ensina que o amor verdadeiro procede não apenas dos laços consanguíneos, mas, sim, da nossa herança divina. E ela, mesmo dilacerada pela dor, não recusa a nova incumbência. Seu silêncio torna-se eloquente: ensina-nos que o verdadeiro serviço ao bem não se interrompe diante do sofrimento, mas nele encontra nova expressão. Maria continua a servir, porque o serviço, para ela, é expressão natural do amor.</w:t>
+      </w:r>
+    </w:p>
+    <w:p>
+      <w:pPr>
+        <w:pStyle w:val="Normal"/>
+        <w:jc w:val="both"/>
+        <w:rPr>
+          <w:rFonts w:ascii="Garamond" w:hAnsi="Garamond"/>
+          <w:sz w:val="36"/>
+          <w:szCs w:val="36"/>
+        </w:rPr>
+      </w:pPr>
+      <w:r>
+        <w:rPr>
+          <w:rFonts w:ascii="Garamond" w:hAnsi="Garamond"/>
+          <w:sz w:val="36"/>
+          <w:szCs w:val="36"/>
+        </w:rPr>
+      </w:r>
+    </w:p>
+    <w:p>
+      <w:pPr>
+        <w:pStyle w:val="Normal"/>
+        <w:jc w:val="both"/>
+        <w:rPr>
+          <w:rFonts w:ascii="Garamond" w:hAnsi="Garamond"/>
+          <w:sz w:val="36"/>
+          <w:szCs w:val="36"/>
+        </w:rPr>
+      </w:pPr>
+      <w:r>
+        <w:rPr>
+          <w:rFonts w:eastAsia="Arial" w:cs="Arial" w:ascii="Garamond" w:hAnsi="Garamond"/>
+          <w:color w:val="auto"/>
+          <w:kern w:val="0"/>
+          <w:sz w:val="36"/>
+          <w:szCs w:val="36"/>
+          <w:lang w:val="en-US" w:eastAsia="zh-CN" w:bidi="hi-IN"/>
+        </w:rPr>
+        <w:t>Q</w:t>
+      </w:r>
+      <w:r>
+        <w:rPr>
+          <w:rFonts w:ascii="Garamond" w:hAnsi="Garamond"/>
+          <w:sz w:val="36"/>
+          <w:szCs w:val="36"/>
+        </w:rPr>
+        <w:t>uais dos exemplos de Maria podemos trazer para nossas vidas?</w:t>
+      </w:r>
+    </w:p>
+    <w:p>
+      <w:pPr>
+        <w:pStyle w:val="Normal"/>
+        <w:jc w:val="both"/>
+        <w:rPr>
+          <w:rFonts w:ascii="Garamond" w:hAnsi="Garamond"/>
+          <w:sz w:val="36"/>
+          <w:szCs w:val="36"/>
+        </w:rPr>
+      </w:pPr>
+      <w:r>
+        <w:rPr>
+          <w:rFonts w:ascii="Garamond" w:hAnsi="Garamond"/>
+          <w:sz w:val="36"/>
+          <w:szCs w:val="36"/>
+        </w:rPr>
+      </w:r>
+    </w:p>
+    <w:p>
+      <w:pPr>
+        <w:pStyle w:val="Normal"/>
+        <w:jc w:val="both"/>
+        <w:rPr>
+          <w:rFonts w:ascii="Garamond" w:hAnsi="Garamond"/>
+          <w:sz w:val="36"/>
+          <w:szCs w:val="36"/>
+        </w:rPr>
+      </w:pPr>
+      <w:r>
+        <w:rPr>
+          <w:rFonts w:ascii="Garamond" w:hAnsi="Garamond"/>
+          <w:sz w:val="36"/>
+          <w:szCs w:val="36"/>
+        </w:rPr>
+        <w:t>O primeiro deles é a resignação. Maria sabia que Jesus não merecia o sofrimento que lhe foi imposto, mas resignou-se ao compreender que aquela era a vontade de Deus.</w:t>
+      </w:r>
+    </w:p>
+    <w:p>
+      <w:pPr>
+        <w:pStyle w:val="Normal"/>
+        <w:jc w:val="both"/>
+        <w:rPr>
+          <w:rFonts w:ascii="Garamond" w:hAnsi="Garamond"/>
+          <w:sz w:val="36"/>
+          <w:szCs w:val="36"/>
+        </w:rPr>
+      </w:pPr>
+      <w:r>
+        <w:rPr>
+          <w:rFonts w:ascii="Garamond" w:hAnsi="Garamond"/>
+          <w:sz w:val="36"/>
+          <w:szCs w:val="36"/>
+        </w:rPr>
+      </w:r>
+    </w:p>
+    <w:p>
+      <w:pPr>
+        <w:pStyle w:val="Normal"/>
+        <w:jc w:val="both"/>
+        <w:rPr>
+          <w:rFonts w:ascii="Garamond" w:hAnsi="Garamond"/>
+          <w:sz w:val="36"/>
+          <w:szCs w:val="36"/>
+        </w:rPr>
+      </w:pPr>
+      <w:r>
+        <w:rPr>
+          <w:rFonts w:ascii="Garamond" w:hAnsi="Garamond"/>
+          <w:sz w:val="36"/>
+          <w:szCs w:val="36"/>
+        </w:rPr>
+        <w:t xml:space="preserve">Muitas vezes vivemos situações em que alguém que amamos sofre, sem motivo aparente. Apesar dos nossos esforços, da nossa ajuda e de nossas orações, o sofrimento não se encerra. </w:t>
+      </w:r>
+    </w:p>
+    <w:p>
+      <w:pPr>
+        <w:pStyle w:val="Normal"/>
+        <w:jc w:val="both"/>
+        <w:rPr>
+          <w:rFonts w:ascii="Garamond" w:hAnsi="Garamond"/>
+          <w:sz w:val="36"/>
+          <w:szCs w:val="36"/>
+        </w:rPr>
+      </w:pPr>
+      <w:r>
+        <w:rPr>
+          <w:rFonts w:ascii="Garamond" w:hAnsi="Garamond"/>
+          <w:sz w:val="36"/>
+          <w:szCs w:val="36"/>
+        </w:rPr>
+      </w:r>
+    </w:p>
+    <w:p>
+      <w:pPr>
+        <w:pStyle w:val="Normal"/>
+        <w:jc w:val="both"/>
+        <w:rPr>
+          <w:rFonts w:ascii="Garamond" w:hAnsi="Garamond"/>
+          <w:sz w:val="36"/>
+          <w:szCs w:val="36"/>
+        </w:rPr>
+      </w:pPr>
+      <w:r>
+        <w:rPr>
+          <w:rFonts w:ascii="Garamond" w:hAnsi="Garamond"/>
+          <w:sz w:val="36"/>
+          <w:szCs w:val="36"/>
+        </w:rPr>
+        <w:t>Nessas horas, é comum que nossa fé se abale e que comecemos a questionar a justiça divina. [ REESCREVER -&gt; Quero convidar a plateia a refletir sobre como as demais virtudes que Maria demonstrou naquela passagem podem — e devem — ser aplicadas em nossas vidas. ]</w:t>
+      </w:r>
+    </w:p>
+    <w:p>
+      <w:pPr>
+        <w:pStyle w:val="Normal"/>
+        <w:jc w:val="both"/>
+        <w:rPr>
+          <w:rFonts w:ascii="Garamond" w:hAnsi="Garamond"/>
+          <w:sz w:val="36"/>
+          <w:szCs w:val="36"/>
+        </w:rPr>
+      </w:pPr>
+      <w:r>
+        <w:rPr>
+          <w:rFonts w:ascii="Garamond" w:hAnsi="Garamond"/>
+          <w:sz w:val="36"/>
+          <w:szCs w:val="36"/>
+        </w:rPr>
+      </w:r>
+    </w:p>
+    <w:p>
+      <w:pPr>
+        <w:pStyle w:val="Normal"/>
+        <w:jc w:val="both"/>
+        <w:rPr>
+          <w:rFonts w:ascii="Garamond" w:hAnsi="Garamond"/>
+          <w:sz w:val="36"/>
+          <w:szCs w:val="36"/>
+        </w:rPr>
+      </w:pPr>
+      <w:r>
+        <w:rPr>
+          <w:rFonts w:ascii="Garamond" w:hAnsi="Garamond"/>
+          <w:sz w:val="36"/>
+          <w:szCs w:val="36"/>
+        </w:rPr>
+        <w:t xml:space="preserve">Assim como Maria permaneceu firme diante do sofrimento de seu Filho, somos convidados a confiar, mesmo quando tudo parece escuro. A resignação, nesse contexto, não é passividade, mas um ato profundo de fé: é entregar a Deus aquilo que não conseguimos entender, </w:t>
+      </w:r>
+      <w:r>
+        <w:rPr>
+          <w:rFonts w:eastAsia="Arial" w:cs="Arial" w:ascii="Garamond" w:hAnsi="Garamond"/>
+          <w:color w:val="auto"/>
+          <w:kern w:val="0"/>
+          <w:sz w:val="36"/>
+          <w:szCs w:val="36"/>
+          <w:lang w:val="en-US" w:eastAsia="zh-CN" w:bidi="hi-IN"/>
+        </w:rPr>
+        <w:t>compreendendo</w:t>
+      </w:r>
+      <w:r>
+        <w:rPr>
+          <w:rFonts w:ascii="Garamond" w:hAnsi="Garamond"/>
+          <w:sz w:val="36"/>
+          <w:szCs w:val="36"/>
+        </w:rPr>
+        <w:t xml:space="preserve"> que Ele vê além do que nossos olhos alcançam.</w:t>
+      </w:r>
+    </w:p>
+    <w:p>
+      <w:pPr>
+        <w:pStyle w:val="Normal"/>
+        <w:jc w:val="both"/>
+        <w:rPr>
+          <w:rFonts w:ascii="Garamond" w:hAnsi="Garamond"/>
+          <w:sz w:val="36"/>
+          <w:szCs w:val="36"/>
+        </w:rPr>
+      </w:pPr>
+      <w:r>
+        <w:rPr>
+          <w:rFonts w:ascii="Garamond" w:hAnsi="Garamond"/>
+          <w:sz w:val="36"/>
+          <w:szCs w:val="36"/>
+        </w:rPr>
+      </w:r>
+    </w:p>
+    <w:p>
+      <w:pPr>
+        <w:pStyle w:val="Normal"/>
+        <w:jc w:val="both"/>
+        <w:rPr>
+          <w:rFonts w:ascii="Garamond" w:hAnsi="Garamond"/>
+          <w:sz w:val="36"/>
+          <w:szCs w:val="36"/>
+        </w:rPr>
+      </w:pPr>
+      <w:r>
+        <w:rPr>
+          <w:rFonts w:ascii="Garamond" w:hAnsi="Garamond"/>
+          <w:sz w:val="36"/>
+          <w:szCs w:val="36"/>
+        </w:rPr>
+        <w:t>Mas Maria não apenas resignou-se — ela permaneceu presente. Não fugiu da dor, não abandonou Jesus em seu momento de maior angústia. Ela estava ali, aos pés da cruz, silenciosa, mas inabalável em seu amor. E essa presença amorosa, ainda que silenciosa, pode ser um grande ensinamento para nós: nem sempre conseguiremos tirar o sofrimento de quem amamos, mas podemos ser suporte, consolo, presença fiel.</w:t>
+      </w:r>
+    </w:p>
+    <w:p>
+      <w:pPr>
+        <w:pStyle w:val="Normal"/>
+        <w:jc w:val="both"/>
+        <w:rPr>
+          <w:rFonts w:ascii="Garamond" w:hAnsi="Garamond"/>
+          <w:sz w:val="36"/>
+          <w:szCs w:val="36"/>
+        </w:rPr>
+      </w:pPr>
+      <w:r>
+        <w:rPr>
+          <w:rFonts w:ascii="Garamond" w:hAnsi="Garamond"/>
+          <w:sz w:val="36"/>
+          <w:szCs w:val="36"/>
+        </w:rPr>
+      </w:r>
+    </w:p>
+    <w:p>
+      <w:pPr>
+        <w:pStyle w:val="Normal"/>
+        <w:jc w:val="both"/>
+        <w:rPr>
+          <w:rFonts w:ascii="Garamond" w:hAnsi="Garamond"/>
+          <w:sz w:val="36"/>
+          <w:szCs w:val="36"/>
+        </w:rPr>
+      </w:pPr>
+      <w:r>
+        <w:rPr>
+          <w:rFonts w:ascii="Garamond" w:hAnsi="Garamond"/>
+          <w:sz w:val="36"/>
+          <w:szCs w:val="36"/>
+        </w:rPr>
+        <w:t>Ao olharmos para Maria, somos convidados a refletir também sobre sua coragem, esperança e confiança na promessa de Deus. Que possamos, diante de nossos próprios calvários ou dos calvários dos que nos são caros, cultivar essas virtudes e, como Maria, manter a fé viva mesmo no silêncio de Deus.</w:t>
       </w:r>
     </w:p>
     <w:p>
@@ -6022,7 +4716,7 @@
         <w:bCs/>
         <w:rFonts w:ascii="Garamond" w:hAnsi="Garamond"/>
       </w:rPr>
-      <w:t>28</w:t>
+      <w:t>23</w:t>
     </w:r>
     <w:r>
       <w:rPr>

</xml_diff>

<commit_message>
14/05/2025 - 23:44 h
</commit_message>
<xml_diff>
--- a/Maria de Nazaré e a disposição em servir/Maria de Nazaré e a disposição em servir.docx
+++ b/Maria de Nazaré e a disposição em servir/Maria de Nazaré e a disposição em servir.docx
@@ -3968,88 +3968,25 @@
         </w:rPr>
       </w:pPr>
       <w:r>
-        <w:rPr>
-          <w:rFonts w:ascii="Garamond" w:hAnsi="Garamond"/>
-          <w:sz w:val="36"/>
-          <w:szCs w:val="36"/>
-        </w:rPr>
-      </w:r>
-    </w:p>
-    <w:p>
-      <w:pPr>
-        <w:pStyle w:val="Normal"/>
-        <w:jc w:val="both"/>
-        <w:rPr>
-          <w:rFonts w:ascii="Garamond" w:hAnsi="Garamond"/>
-          <w:sz w:val="36"/>
-          <w:szCs w:val="36"/>
-        </w:rPr>
-      </w:pPr>
-      <w:r>
-        <w:rPr>
-          <w:rFonts w:eastAsia="Arial" w:cs="Arial" w:ascii="Garamond" w:hAnsi="Garamond"/>
-          <w:i w:val="false"/>
-          <w:iCs w:val="false"/>
-          <w:color w:val="auto"/>
-          <w:kern w:val="0"/>
-          <w:sz w:val="36"/>
-          <w:szCs w:val="36"/>
-          <w:lang w:val="en-US" w:eastAsia="zh-CN" w:bidi="hi-IN"/>
-        </w:rPr>
-        <w:t xml:space="preserve">Essa passagem é de uma </w:t>
-      </w:r>
-      <w:r>
-        <w:rPr>
-          <w:rFonts w:eastAsia="Arial" w:cs="Arial" w:ascii="Garamond" w:hAnsi="Garamond"/>
-          <w:i w:val="false"/>
-          <w:iCs w:val="false"/>
-          <w:color w:val="auto"/>
-          <w:kern w:val="0"/>
-          <w:sz w:val="36"/>
-          <w:szCs w:val="36"/>
-          <w:lang w:val="en-US" w:eastAsia="zh-CN" w:bidi="hi-IN"/>
-        </w:rPr>
-        <w:t xml:space="preserve">beleza e </w:t>
-      </w:r>
-      <w:r>
-        <w:rPr>
-          <w:rFonts w:eastAsia="Arial" w:cs="Arial" w:ascii="Garamond" w:hAnsi="Garamond"/>
-          <w:i w:val="false"/>
-          <w:iCs w:val="false"/>
-          <w:color w:val="auto"/>
-          <w:kern w:val="0"/>
-          <w:sz w:val="36"/>
-          <w:szCs w:val="36"/>
-          <w:lang w:val="en-US" w:eastAsia="zh-CN" w:bidi="hi-IN"/>
-        </w:rPr>
-        <w:t>riqueza espiritual enorme</w:t>
-      </w:r>
-      <w:r>
-        <w:rPr>
-          <w:rFonts w:eastAsia="Arial" w:cs="Arial" w:ascii="Garamond" w:hAnsi="Garamond"/>
-          <w:i w:val="false"/>
-          <w:iCs w:val="false"/>
-          <w:color w:val="auto"/>
-          <w:kern w:val="0"/>
-          <w:sz w:val="36"/>
-          <w:szCs w:val="36"/>
-          <w:lang w:val="en-US" w:eastAsia="zh-CN" w:bidi="hi-IN"/>
-        </w:rPr>
-        <w:t>s.</w:t>
-      </w:r>
-    </w:p>
-    <w:p>
-      <w:pPr>
-        <w:pStyle w:val="Normal"/>
-        <w:jc w:val="both"/>
-        <w:rPr>
-          <w:rFonts w:ascii="Garamond" w:hAnsi="Garamond"/>
-          <w:sz w:val="36"/>
-          <w:szCs w:val="36"/>
-        </w:rPr>
-      </w:pPr>
-      <w:r>
         <w:rPr/>
+      </w:r>
+    </w:p>
+    <w:p>
+      <w:pPr>
+        <w:pStyle w:val="Normal"/>
+        <w:jc w:val="both"/>
+        <w:rPr>
+          <w:rFonts w:ascii="Garamond" w:hAnsi="Garamond"/>
+          <w:sz w:val="36"/>
+          <w:szCs w:val="36"/>
+        </w:rPr>
+      </w:pPr>
+      <w:r>
+        <w:rPr>
+          <w:rFonts w:ascii="Garamond" w:hAnsi="Garamond"/>
+          <w:sz w:val="36"/>
+          <w:szCs w:val="36"/>
+        </w:rPr>
       </w:r>
     </w:p>
     <w:p>
@@ -4072,33 +4009,8 @@
           <w:shd w:fill="auto" w:val="clear"/>
           <w:lang w:val="en-US" w:eastAsia="zh-CN" w:bidi="hi-IN"/>
         </w:rPr>
-        <w:t xml:space="preserve">Ao pé da cruz, Maria nos oferece um dos testemunhos mais profundos de amor, fidelidade e entrega silenciosa já registrados. Diante do sofrimento indescritível do Filho, ela não se esconde, não se desespera, não reclama. Permanece. Sua presença é firme, serena, profundamente corajosa. </w:t>
-      </w:r>
-    </w:p>
-    <w:p>
-      <w:pPr>
-        <w:pStyle w:val="Normal"/>
-        <w:jc w:val="both"/>
-        <w:rPr>
-          <w:rFonts w:ascii="Garamond" w:hAnsi="Garamond"/>
-          <w:sz w:val="36"/>
-          <w:szCs w:val="36"/>
-        </w:rPr>
-      </w:pPr>
-      <w:r>
-        <w:rPr/>
-      </w:r>
-    </w:p>
-    <w:p>
-      <w:pPr>
-        <w:pStyle w:val="Normal"/>
-        <w:jc w:val="both"/>
-        <w:rPr>
-          <w:rFonts w:ascii="Garamond" w:hAnsi="Garamond"/>
-          <w:sz w:val="36"/>
-          <w:szCs w:val="36"/>
-        </w:rPr>
-      </w:pPr>
+        <w:t>Ao pé da cruz, Maria nos oferece um dos testemunhos mais profundos de amor, fidelidade e entrega silenciosa</w:t>
+      </w:r>
       <w:r>
         <w:rPr>
           <w:rFonts w:eastAsia="Times New Roman" w:cs="Times New Roman" w:ascii="Garamond" w:hAnsi="Garamond"/>
@@ -4109,7 +4021,7 @@
           <w:shd w:fill="auto" w:val="clear"/>
           <w:lang w:val="en-US" w:eastAsia="zh-CN" w:bidi="hi-IN"/>
         </w:rPr>
-        <w:t xml:space="preserve">Não condena nem amaldioça os algozes de Jesus, nem os poderosos que o condenaram, nem os soldados que o crucificaram e muito menos os ingratos que foram amparados por </w:t>
+        <w:t>.</w:t>
       </w:r>
       <w:r>
         <w:rPr>
@@ -4121,7 +4033,7 @@
           <w:shd w:fill="auto" w:val="clear"/>
           <w:lang w:val="en-US" w:eastAsia="zh-CN" w:bidi="hi-IN"/>
         </w:rPr>
-        <w:t>Ele</w:t>
+        <w:t xml:space="preserve"> Diante do sofrimento indescritível do Filho, ela não se esconde</w:t>
       </w:r>
       <w:r>
         <w:rPr>
@@ -4133,33 +4045,8 @@
           <w:shd w:fill="auto" w:val="clear"/>
           <w:lang w:val="en-US" w:eastAsia="zh-CN" w:bidi="hi-IN"/>
         </w:rPr>
-        <w:t>, mas que O abandonaram naquele momento tão doloroso. Em meio ao peso da tragédia, Maria demonstra a virtude de quem sabe que o amor verdadeiro não recua diante da dor.</w:t>
-      </w:r>
-    </w:p>
-    <w:p>
-      <w:pPr>
-        <w:pStyle w:val="Normal"/>
-        <w:jc w:val="both"/>
-        <w:rPr>
-          <w:rFonts w:ascii="Garamond" w:hAnsi="Garamond"/>
-          <w:sz w:val="36"/>
-          <w:szCs w:val="36"/>
-        </w:rPr>
-      </w:pPr>
-      <w:r>
-        <w:rPr/>
-      </w:r>
-    </w:p>
-    <w:p>
-      <w:pPr>
-        <w:pStyle w:val="Normal"/>
-        <w:jc w:val="both"/>
-        <w:rPr>
-          <w:rFonts w:ascii="Garamond" w:hAnsi="Garamond"/>
-          <w:sz w:val="36"/>
-          <w:szCs w:val="36"/>
-        </w:rPr>
-      </w:pPr>
+        <w:t xml:space="preserve">, não </w:t>
+      </w:r>
       <w:r>
         <w:rPr>
           <w:rFonts w:eastAsia="Times New Roman" w:cs="Times New Roman" w:ascii="Garamond" w:hAnsi="Garamond"/>
@@ -4170,33 +4057,8 @@
           <w:shd w:fill="auto" w:val="clear"/>
           <w:lang w:val="en-US" w:eastAsia="zh-CN" w:bidi="hi-IN"/>
         </w:rPr>
-        <w:t>Em silêncio, ela acolhe o cumprimento das palavras do anjo anunciador e reafirma sua fidelidade à vontade divina. Se em Belém ela recebeu Jesus nos braços, agora, no Calvário, ela O entrega de volta ao Pai — com a mesma humildade, com o mesmo espírito de serviço. Sua renúncia não é apenas materna, é espiritual. É uma entrega amorosa que transcende os laços consanguíneos.</w:t>
-      </w:r>
-    </w:p>
-    <w:p>
-      <w:pPr>
-        <w:pStyle w:val="Normal"/>
-        <w:jc w:val="both"/>
-        <w:rPr>
-          <w:rFonts w:ascii="Garamond" w:hAnsi="Garamond"/>
-          <w:sz w:val="36"/>
-          <w:szCs w:val="36"/>
-        </w:rPr>
-      </w:pPr>
-      <w:r>
-        <w:rPr/>
-      </w:r>
-    </w:p>
-    <w:p>
-      <w:pPr>
-        <w:pStyle w:val="Normal"/>
-        <w:jc w:val="both"/>
-        <w:rPr>
-          <w:rFonts w:ascii="Garamond" w:hAnsi="Garamond"/>
-          <w:sz w:val="36"/>
-          <w:szCs w:val="36"/>
-        </w:rPr>
-      </w:pPr>
+        <w:t>desespera</w:t>
+      </w:r>
       <w:r>
         <w:rPr>
           <w:rFonts w:eastAsia="Times New Roman" w:cs="Times New Roman" w:ascii="Garamond" w:hAnsi="Garamond"/>
@@ -4207,296 +4069,298 @@
           <w:shd w:fill="auto" w:val="clear"/>
           <w:lang w:val="en-US" w:eastAsia="zh-CN" w:bidi="hi-IN"/>
         </w:rPr>
-        <w:t>Ao confiar-lhe João como filho, Jesus estende a maternidade de Maria à humanidade inteira e nos ensina que o amor verdadeiro procede não apenas dos laços consanguíneos, mas, sim, da nossa herança divina. E ela, mesmo dilacerada pela dor, não recusa a nova incumbência. Seu silêncio torna-se eloquente: ensina-nos que o verdadeiro serviço ao bem não se interrompe diante do sofrimento, mas nele encontra nova expressão. Maria continua a servir, porque o serviço, para ela, é expressão natural do amor.</w:t>
-      </w:r>
-    </w:p>
-    <w:p>
-      <w:pPr>
-        <w:pStyle w:val="Normal"/>
-        <w:jc w:val="both"/>
-        <w:rPr>
-          <w:rFonts w:ascii="Garamond" w:hAnsi="Garamond"/>
-          <w:sz w:val="36"/>
-          <w:szCs w:val="36"/>
-        </w:rPr>
-      </w:pPr>
-      <w:r>
-        <w:rPr>
-          <w:rFonts w:ascii="Garamond" w:hAnsi="Garamond"/>
-          <w:sz w:val="36"/>
-          <w:szCs w:val="36"/>
-        </w:rPr>
-      </w:r>
-    </w:p>
-    <w:p>
-      <w:pPr>
-        <w:pStyle w:val="Normal"/>
-        <w:jc w:val="both"/>
-        <w:rPr>
-          <w:rFonts w:ascii="Garamond" w:hAnsi="Garamond"/>
-          <w:sz w:val="36"/>
-          <w:szCs w:val="36"/>
-        </w:rPr>
-      </w:pPr>
-      <w:r>
-        <w:rPr>
-          <w:rFonts w:eastAsia="Arial" w:cs="Arial" w:ascii="Garamond" w:hAnsi="Garamond"/>
-          <w:color w:val="auto"/>
-          <w:kern w:val="0"/>
-          <w:sz w:val="36"/>
-          <w:szCs w:val="36"/>
-          <w:lang w:val="en-US" w:eastAsia="zh-CN" w:bidi="hi-IN"/>
-        </w:rPr>
-        <w:t>Q</w:t>
-      </w:r>
-      <w:r>
-        <w:rPr>
-          <w:rFonts w:ascii="Garamond" w:hAnsi="Garamond"/>
-          <w:sz w:val="36"/>
-          <w:szCs w:val="36"/>
-        </w:rPr>
-        <w:t>uais dos exemplos de Maria podemos trazer para nossas vidas?</w:t>
-      </w:r>
-    </w:p>
-    <w:p>
-      <w:pPr>
-        <w:pStyle w:val="Normal"/>
-        <w:jc w:val="both"/>
-        <w:rPr>
-          <w:rFonts w:ascii="Garamond" w:hAnsi="Garamond"/>
-          <w:sz w:val="36"/>
-          <w:szCs w:val="36"/>
-        </w:rPr>
-      </w:pPr>
-      <w:r>
-        <w:rPr>
-          <w:rFonts w:ascii="Garamond" w:hAnsi="Garamond"/>
-          <w:sz w:val="36"/>
-          <w:szCs w:val="36"/>
-        </w:rPr>
-      </w:r>
-    </w:p>
-    <w:p>
-      <w:pPr>
-        <w:pStyle w:val="Normal"/>
-        <w:jc w:val="both"/>
-        <w:rPr>
-          <w:rFonts w:ascii="Garamond" w:hAnsi="Garamond"/>
-          <w:sz w:val="36"/>
-          <w:szCs w:val="36"/>
-        </w:rPr>
-      </w:pPr>
-      <w:r>
-        <w:rPr>
-          <w:rFonts w:ascii="Garamond" w:hAnsi="Garamond"/>
-          <w:sz w:val="36"/>
-          <w:szCs w:val="36"/>
-        </w:rPr>
-        <w:t>O primeiro deles é a resignação. Maria sabia que Jesus não merecia o sofrimento que lhe foi imposto, mas resignou-se ao compreender que aquela era a vontade de Deus.</w:t>
-      </w:r>
-    </w:p>
-    <w:p>
-      <w:pPr>
-        <w:pStyle w:val="Normal"/>
-        <w:jc w:val="both"/>
-        <w:rPr>
-          <w:rFonts w:ascii="Garamond" w:hAnsi="Garamond"/>
-          <w:sz w:val="36"/>
-          <w:szCs w:val="36"/>
-        </w:rPr>
-      </w:pPr>
-      <w:r>
-        <w:rPr>
-          <w:rFonts w:ascii="Garamond" w:hAnsi="Garamond"/>
-          <w:sz w:val="36"/>
-          <w:szCs w:val="36"/>
-        </w:rPr>
-      </w:r>
-    </w:p>
-    <w:p>
-      <w:pPr>
-        <w:pStyle w:val="Normal"/>
-        <w:jc w:val="both"/>
-        <w:rPr>
-          <w:rFonts w:ascii="Garamond" w:hAnsi="Garamond"/>
-          <w:sz w:val="36"/>
-          <w:szCs w:val="36"/>
-        </w:rPr>
-      </w:pPr>
-      <w:r>
-        <w:rPr>
-          <w:rFonts w:ascii="Garamond" w:hAnsi="Garamond"/>
-          <w:sz w:val="36"/>
-          <w:szCs w:val="36"/>
-        </w:rPr>
-        <w:t xml:space="preserve">Muitas vezes vivemos situações em que alguém que amamos sofre, sem motivo aparente. Apesar dos nossos esforços, da nossa ajuda e de nossas orações, o sofrimento não se encerra. </w:t>
-      </w:r>
-    </w:p>
-    <w:p>
-      <w:pPr>
-        <w:pStyle w:val="Normal"/>
-        <w:jc w:val="both"/>
-        <w:rPr>
-          <w:rFonts w:ascii="Garamond" w:hAnsi="Garamond"/>
-          <w:sz w:val="36"/>
-          <w:szCs w:val="36"/>
-        </w:rPr>
-      </w:pPr>
-      <w:r>
-        <w:rPr>
-          <w:rFonts w:ascii="Garamond" w:hAnsi="Garamond"/>
-          <w:sz w:val="36"/>
-          <w:szCs w:val="36"/>
-        </w:rPr>
-      </w:r>
-    </w:p>
-    <w:p>
-      <w:pPr>
-        <w:pStyle w:val="Normal"/>
-        <w:jc w:val="both"/>
-        <w:rPr>
-          <w:rFonts w:ascii="Garamond" w:hAnsi="Garamond"/>
-          <w:sz w:val="36"/>
-          <w:szCs w:val="36"/>
-        </w:rPr>
-      </w:pPr>
-      <w:r>
-        <w:rPr>
-          <w:rFonts w:ascii="Garamond" w:hAnsi="Garamond"/>
-          <w:sz w:val="36"/>
-          <w:szCs w:val="36"/>
-        </w:rPr>
-        <w:t>Nessas horas, é comum que nossa fé se abale e que comecemos a questionar a justiça divina. [ REESCREVER -&gt; Quero convidar a plateia a refletir sobre como as demais virtudes que Maria demonstrou naquela passagem podem — e devem — ser aplicadas em nossas vidas. ]</w:t>
-      </w:r>
-    </w:p>
-    <w:p>
-      <w:pPr>
-        <w:pStyle w:val="Normal"/>
-        <w:jc w:val="both"/>
-        <w:rPr>
-          <w:rFonts w:ascii="Garamond" w:hAnsi="Garamond"/>
-          <w:sz w:val="36"/>
-          <w:szCs w:val="36"/>
-        </w:rPr>
-      </w:pPr>
-      <w:r>
-        <w:rPr>
-          <w:rFonts w:ascii="Garamond" w:hAnsi="Garamond"/>
-          <w:sz w:val="36"/>
-          <w:szCs w:val="36"/>
-        </w:rPr>
-      </w:r>
-    </w:p>
-    <w:p>
-      <w:pPr>
-        <w:pStyle w:val="Normal"/>
-        <w:jc w:val="both"/>
-        <w:rPr>
-          <w:rFonts w:ascii="Garamond" w:hAnsi="Garamond"/>
-          <w:sz w:val="36"/>
-          <w:szCs w:val="36"/>
-        </w:rPr>
-      </w:pPr>
-      <w:r>
-        <w:rPr>
-          <w:rFonts w:ascii="Garamond" w:hAnsi="Garamond"/>
-          <w:sz w:val="36"/>
-          <w:szCs w:val="36"/>
-        </w:rPr>
-        <w:t xml:space="preserve">Assim como Maria permaneceu firme diante do sofrimento de seu Filho, somos convidados a confiar, mesmo quando tudo parece escuro. A resignação, nesse contexto, não é passividade, mas um ato profundo de fé: é entregar a Deus aquilo que não conseguimos entender, </w:t>
-      </w:r>
-      <w:r>
-        <w:rPr>
-          <w:rFonts w:eastAsia="Arial" w:cs="Arial" w:ascii="Garamond" w:hAnsi="Garamond"/>
-          <w:color w:val="auto"/>
-          <w:kern w:val="0"/>
-          <w:sz w:val="36"/>
-          <w:szCs w:val="36"/>
-          <w:lang w:val="en-US" w:eastAsia="zh-CN" w:bidi="hi-IN"/>
-        </w:rPr>
-        <w:t>compreendendo</w:t>
-      </w:r>
-      <w:r>
-        <w:rPr>
-          <w:rFonts w:ascii="Garamond" w:hAnsi="Garamond"/>
-          <w:sz w:val="36"/>
-          <w:szCs w:val="36"/>
-        </w:rPr>
-        <w:t xml:space="preserve"> que Ele vê além do que nossos olhos alcançam.</w:t>
-      </w:r>
-    </w:p>
-    <w:p>
-      <w:pPr>
-        <w:pStyle w:val="Normal"/>
-        <w:jc w:val="both"/>
-        <w:rPr>
-          <w:rFonts w:ascii="Garamond" w:hAnsi="Garamond"/>
-          <w:sz w:val="36"/>
-          <w:szCs w:val="36"/>
-        </w:rPr>
-      </w:pPr>
-      <w:r>
-        <w:rPr>
-          <w:rFonts w:ascii="Garamond" w:hAnsi="Garamond"/>
-          <w:sz w:val="36"/>
-          <w:szCs w:val="36"/>
-        </w:rPr>
-      </w:r>
-    </w:p>
-    <w:p>
-      <w:pPr>
-        <w:pStyle w:val="Normal"/>
-        <w:jc w:val="both"/>
-        <w:rPr>
-          <w:rFonts w:ascii="Garamond" w:hAnsi="Garamond"/>
-          <w:sz w:val="36"/>
-          <w:szCs w:val="36"/>
-        </w:rPr>
-      </w:pPr>
-      <w:r>
-        <w:rPr>
-          <w:rFonts w:ascii="Garamond" w:hAnsi="Garamond"/>
-          <w:sz w:val="36"/>
-          <w:szCs w:val="36"/>
-        </w:rPr>
-        <w:t>Mas Maria não apenas resignou-se — ela permaneceu presente. Não fugiu da dor, não abandonou Jesus em seu momento de maior angústia. Ela estava ali, aos pés da cruz, silenciosa, mas inabalável em seu amor. E essa presença amorosa, ainda que silenciosa, pode ser um grande ensinamento para nós: nem sempre conseguiremos tirar o sofrimento de quem amamos, mas podemos ser suporte, consolo, presença fiel.</w:t>
-      </w:r>
-    </w:p>
-    <w:p>
-      <w:pPr>
-        <w:pStyle w:val="Normal"/>
-        <w:jc w:val="both"/>
-        <w:rPr>
-          <w:rFonts w:ascii="Garamond" w:hAnsi="Garamond"/>
-          <w:sz w:val="36"/>
-          <w:szCs w:val="36"/>
-        </w:rPr>
-      </w:pPr>
-      <w:r>
-        <w:rPr>
-          <w:rFonts w:ascii="Garamond" w:hAnsi="Garamond"/>
-          <w:sz w:val="36"/>
-          <w:szCs w:val="36"/>
-        </w:rPr>
-      </w:r>
-    </w:p>
-    <w:p>
-      <w:pPr>
-        <w:pStyle w:val="Normal"/>
-        <w:jc w:val="both"/>
-        <w:rPr>
-          <w:rFonts w:ascii="Garamond" w:hAnsi="Garamond"/>
-          <w:sz w:val="36"/>
-          <w:szCs w:val="36"/>
-        </w:rPr>
-      </w:pPr>
-      <w:r>
-        <w:rPr>
-          <w:rFonts w:ascii="Garamond" w:hAnsi="Garamond"/>
-          <w:sz w:val="36"/>
-          <w:szCs w:val="36"/>
-        </w:rPr>
-        <w:t>Ao olharmos para Maria, somos convidados a refletir também sobre sua coragem, esperança e confiança na promessa de Deus. Que possamos, diante de nossos próprios calvários ou dos calvários dos que nos são caros, cultivar essas virtudes e, como Maria, manter a fé viva mesmo no silêncio de Deus.</w:t>
+        <w:t>,</w:t>
+      </w:r>
+      <w:r>
+        <w:rPr>
+          <w:rFonts w:eastAsia="Times New Roman" w:cs="Times New Roman" w:ascii="Garamond" w:hAnsi="Garamond"/>
+          <w:color w:val="000000"/>
+          <w:kern w:val="0"/>
+          <w:sz w:val="36"/>
+          <w:szCs w:val="36"/>
+          <w:shd w:fill="auto" w:val="clear"/>
+          <w:lang w:val="en-US" w:eastAsia="zh-CN" w:bidi="hi-IN"/>
+        </w:rPr>
+        <w:t xml:space="preserve"> não reclama. </w:t>
+      </w:r>
+      <w:r>
+        <w:rPr>
+          <w:rFonts w:eastAsia="Times New Roman" w:cs="Times New Roman" w:ascii="Garamond" w:hAnsi="Garamond"/>
+          <w:color w:val="000000"/>
+          <w:kern w:val="0"/>
+          <w:sz w:val="36"/>
+          <w:szCs w:val="36"/>
+          <w:shd w:fill="auto" w:val="clear"/>
+          <w:lang w:val="en-US" w:eastAsia="zh-CN" w:bidi="hi-IN"/>
+        </w:rPr>
+        <w:t>Ali p</w:t>
+      </w:r>
+      <w:r>
+        <w:rPr>
+          <w:rFonts w:eastAsia="Times New Roman" w:cs="Times New Roman" w:ascii="Garamond" w:hAnsi="Garamond"/>
+          <w:color w:val="000000"/>
+          <w:kern w:val="0"/>
+          <w:sz w:val="36"/>
+          <w:szCs w:val="36"/>
+          <w:shd w:fill="auto" w:val="clear"/>
+          <w:lang w:val="en-US" w:eastAsia="zh-CN" w:bidi="hi-IN"/>
+        </w:rPr>
+        <w:t>ermanece</w:t>
+      </w:r>
+      <w:r>
+        <w:rPr>
+          <w:rFonts w:eastAsia="Times New Roman" w:cs="Times New Roman" w:ascii="Garamond" w:hAnsi="Garamond"/>
+          <w:color w:val="000000"/>
+          <w:kern w:val="0"/>
+          <w:sz w:val="36"/>
+          <w:szCs w:val="36"/>
+          <w:shd w:fill="auto" w:val="clear"/>
+          <w:lang w:val="en-US" w:eastAsia="zh-CN" w:bidi="hi-IN"/>
+        </w:rPr>
+        <w:t xml:space="preserve"> de maneira</w:t>
+      </w:r>
+      <w:r>
+        <w:rPr>
+          <w:rFonts w:eastAsia="Times New Roman" w:cs="Times New Roman" w:ascii="Garamond" w:hAnsi="Garamond"/>
+          <w:color w:val="000000"/>
+          <w:kern w:val="0"/>
+          <w:sz w:val="36"/>
+          <w:szCs w:val="36"/>
+          <w:shd w:fill="auto" w:val="clear"/>
+          <w:lang w:val="en-US" w:eastAsia="zh-CN" w:bidi="hi-IN"/>
+        </w:rPr>
+        <w:t xml:space="preserve"> firme, serena</w:t>
+      </w:r>
+      <w:r>
+        <w:rPr>
+          <w:rFonts w:eastAsia="Times New Roman" w:cs="Times New Roman" w:ascii="Garamond" w:hAnsi="Garamond"/>
+          <w:color w:val="000000"/>
+          <w:kern w:val="0"/>
+          <w:sz w:val="36"/>
+          <w:szCs w:val="36"/>
+          <w:shd w:fill="auto" w:val="clear"/>
+          <w:lang w:val="en-US" w:eastAsia="zh-CN" w:bidi="hi-IN"/>
+        </w:rPr>
+        <w:t xml:space="preserve"> e </w:t>
+      </w:r>
+      <w:r>
+        <w:rPr>
+          <w:rFonts w:eastAsia="Times New Roman" w:cs="Times New Roman" w:ascii="Garamond" w:hAnsi="Garamond"/>
+          <w:color w:val="000000"/>
+          <w:kern w:val="0"/>
+          <w:sz w:val="36"/>
+          <w:szCs w:val="36"/>
+          <w:shd w:fill="auto" w:val="clear"/>
+          <w:lang w:val="en-US" w:eastAsia="zh-CN" w:bidi="hi-IN"/>
+        </w:rPr>
+        <w:t xml:space="preserve">corajosa. </w:t>
+      </w:r>
+    </w:p>
+    <w:p>
+      <w:pPr>
+        <w:pStyle w:val="Normal"/>
+        <w:jc w:val="both"/>
+        <w:rPr>
+          <w:rFonts w:ascii="Garamond" w:hAnsi="Garamond"/>
+          <w:sz w:val="36"/>
+          <w:szCs w:val="36"/>
+        </w:rPr>
+      </w:pPr>
+      <w:r>
+        <w:rPr>
+          <w:rFonts w:ascii="Garamond" w:hAnsi="Garamond"/>
+          <w:sz w:val="36"/>
+          <w:szCs w:val="36"/>
+        </w:rPr>
+      </w:r>
+    </w:p>
+    <w:p>
+      <w:pPr>
+        <w:pStyle w:val="Normal"/>
+        <w:jc w:val="both"/>
+        <w:rPr>
+          <w:rFonts w:ascii="Garamond" w:hAnsi="Garamond"/>
+          <w:sz w:val="36"/>
+          <w:szCs w:val="36"/>
+        </w:rPr>
+      </w:pPr>
+      <w:r>
+        <w:rPr>
+          <w:rFonts w:eastAsia="Times New Roman" w:cs="Times New Roman" w:ascii="Garamond" w:hAnsi="Garamond"/>
+          <w:color w:val="000000"/>
+          <w:kern w:val="0"/>
+          <w:sz w:val="36"/>
+          <w:szCs w:val="36"/>
+          <w:shd w:fill="auto" w:val="clear"/>
+          <w:lang w:val="en-US" w:eastAsia="zh-CN" w:bidi="hi-IN"/>
+        </w:rPr>
+        <w:t xml:space="preserve">Ela não julga os responsáveis pela morte de Jesus, tampouco os líderes que decretaram sua sentença; não acusa os soldados que o pregaram na cruz, muito menos </w:t>
+      </w:r>
+      <w:r>
+        <w:rPr>
+          <w:rFonts w:eastAsia="Times New Roman" w:cs="Times New Roman" w:ascii="Garamond" w:hAnsi="Garamond"/>
+          <w:color w:val="000000"/>
+          <w:kern w:val="0"/>
+          <w:sz w:val="36"/>
+          <w:szCs w:val="36"/>
+          <w:shd w:fill="auto" w:val="clear"/>
+          <w:lang w:val="en-US" w:eastAsia="zh-CN" w:bidi="hi-IN"/>
+        </w:rPr>
+        <w:t>aqueles</w:t>
+      </w:r>
+      <w:r>
+        <w:rPr>
+          <w:rFonts w:eastAsia="Times New Roman" w:cs="Times New Roman" w:ascii="Garamond" w:hAnsi="Garamond"/>
+          <w:color w:val="000000"/>
+          <w:kern w:val="0"/>
+          <w:sz w:val="36"/>
+          <w:szCs w:val="36"/>
+          <w:shd w:fill="auto" w:val="clear"/>
+          <w:lang w:val="en-US" w:eastAsia="zh-CN" w:bidi="hi-IN"/>
+        </w:rPr>
+        <w:t xml:space="preserve"> que, mesmo tendo </w:t>
+      </w:r>
+      <w:r>
+        <w:rPr>
+          <w:rFonts w:eastAsia="Times New Roman" w:cs="Times New Roman" w:ascii="Garamond" w:hAnsi="Garamond"/>
+          <w:color w:val="000000"/>
+          <w:kern w:val="0"/>
+          <w:sz w:val="36"/>
+          <w:szCs w:val="36"/>
+          <w:shd w:fill="auto" w:val="clear"/>
+          <w:lang w:val="en-US" w:eastAsia="zh-CN" w:bidi="hi-IN"/>
+        </w:rPr>
+        <w:t xml:space="preserve">sido auxiliados por Jesus. </w:t>
+      </w:r>
+      <w:r>
+        <w:rPr>
+          <w:rFonts w:eastAsia="Times New Roman" w:cs="Times New Roman" w:ascii="Garamond" w:hAnsi="Garamond"/>
+          <w:color w:val="000000"/>
+          <w:kern w:val="0"/>
+          <w:sz w:val="36"/>
+          <w:szCs w:val="36"/>
+          <w:shd w:fill="auto" w:val="clear"/>
+          <w:lang w:val="en-US" w:eastAsia="zh-CN" w:bidi="hi-IN"/>
+        </w:rPr>
+        <w:t>Maria demonstra a virtude de quem sabe que o amor verdadeiro não recua diante da dor.</w:t>
+      </w:r>
+    </w:p>
+    <w:p>
+      <w:pPr>
+        <w:pStyle w:val="Normal"/>
+        <w:jc w:val="both"/>
+        <w:rPr>
+          <w:rFonts w:ascii="Garamond" w:hAnsi="Garamond"/>
+          <w:sz w:val="36"/>
+          <w:szCs w:val="36"/>
+        </w:rPr>
+      </w:pPr>
+      <w:r>
+        <w:rPr>
+          <w:rFonts w:ascii="Garamond" w:hAnsi="Garamond"/>
+          <w:sz w:val="36"/>
+          <w:szCs w:val="36"/>
+        </w:rPr>
+      </w:r>
+    </w:p>
+    <w:p>
+      <w:pPr>
+        <w:pStyle w:val="Normal"/>
+        <w:jc w:val="both"/>
+        <w:rPr>
+          <w:rFonts w:ascii="Garamond" w:hAnsi="Garamond"/>
+          <w:sz w:val="36"/>
+          <w:szCs w:val="36"/>
+        </w:rPr>
+      </w:pPr>
+      <w:r>
+        <w:rPr>
+          <w:rFonts w:eastAsia="Times New Roman" w:cs="Times New Roman" w:ascii="Garamond" w:hAnsi="Garamond"/>
+          <w:color w:val="000000"/>
+          <w:kern w:val="0"/>
+          <w:sz w:val="36"/>
+          <w:szCs w:val="36"/>
+          <w:shd w:fill="auto" w:val="clear"/>
+          <w:lang w:val="en-US" w:eastAsia="zh-CN" w:bidi="hi-IN"/>
+        </w:rPr>
+        <w:t xml:space="preserve">Ali Maria </w:t>
+      </w:r>
+      <w:r>
+        <w:rPr>
+          <w:rFonts w:eastAsia="Times New Roman" w:cs="Times New Roman" w:ascii="Garamond" w:hAnsi="Garamond"/>
+          <w:color w:val="000000"/>
+          <w:kern w:val="0"/>
+          <w:sz w:val="36"/>
+          <w:szCs w:val="36"/>
+          <w:shd w:fill="auto" w:val="clear"/>
+          <w:lang w:val="en-US" w:eastAsia="zh-CN" w:bidi="hi-IN"/>
+        </w:rPr>
+        <w:t xml:space="preserve">reafirma sua fidelidade à vontade divina. Se em Belém ela recebeu Jesus nos braços, agora, no Calvário, ela O entrega de volta ao Pai — com a mesma humildade, com o mesmo espírito de serviço. Sua renúncia não é apenas materna, é espiritual. </w:t>
+      </w:r>
+    </w:p>
+    <w:p>
+      <w:pPr>
+        <w:pStyle w:val="Normal"/>
+        <w:jc w:val="both"/>
+        <w:rPr>
+          <w:rFonts w:ascii="Garamond" w:hAnsi="Garamond"/>
+          <w:sz w:val="36"/>
+          <w:szCs w:val="36"/>
+        </w:rPr>
+      </w:pPr>
+      <w:r>
+        <w:rPr>
+          <w:rFonts w:ascii="Garamond" w:hAnsi="Garamond"/>
+          <w:sz w:val="36"/>
+          <w:szCs w:val="36"/>
+        </w:rPr>
+      </w:r>
+    </w:p>
+    <w:p>
+      <w:pPr>
+        <w:pStyle w:val="Normal"/>
+        <w:jc w:val="both"/>
+        <w:rPr>
+          <w:rFonts w:ascii="Garamond" w:hAnsi="Garamond"/>
+          <w:sz w:val="36"/>
+          <w:szCs w:val="36"/>
+        </w:rPr>
+      </w:pPr>
+      <w:r>
+        <w:rPr>
+          <w:rFonts w:eastAsia="Times New Roman" w:cs="Times New Roman" w:ascii="Garamond" w:hAnsi="Garamond"/>
+          <w:color w:val="000000"/>
+          <w:kern w:val="0"/>
+          <w:sz w:val="36"/>
+          <w:szCs w:val="36"/>
+          <w:shd w:fill="auto" w:val="clear"/>
+          <w:lang w:val="en-US" w:eastAsia="zh-CN" w:bidi="hi-IN"/>
+        </w:rPr>
+        <w:t xml:space="preserve">Ao confiar-lhe João como filho, Jesus estende a maternidade de Maria à humanidade inteira e nos ensina que o amor verdadeiro procede não apenas dos laços consanguíneos, mas, sim, da nossa herança divina. </w:t>
+      </w:r>
+      <w:r>
+        <w:rPr>
+          <w:rFonts w:eastAsia="Times New Roman" w:cs="Times New Roman" w:ascii="Garamond" w:hAnsi="Garamond"/>
+          <w:color w:val="000000"/>
+          <w:kern w:val="0"/>
+          <w:sz w:val="36"/>
+          <w:szCs w:val="36"/>
+          <w:shd w:fill="auto" w:val="clear"/>
+          <w:lang w:val="en-US" w:eastAsia="zh-CN" w:bidi="hi-IN"/>
+        </w:rPr>
+        <w:t xml:space="preserve">Apesar da enorme dor, Maria </w:t>
+      </w:r>
+      <w:r>
+        <w:rPr>
+          <w:rFonts w:eastAsia="Times New Roman" w:cs="Times New Roman" w:ascii="Garamond" w:hAnsi="Garamond"/>
+          <w:color w:val="000000"/>
+          <w:kern w:val="0"/>
+          <w:sz w:val="36"/>
+          <w:szCs w:val="36"/>
+          <w:shd w:fill="auto" w:val="clear"/>
+          <w:lang w:val="en-US" w:eastAsia="zh-CN" w:bidi="hi-IN"/>
+        </w:rPr>
+        <w:t xml:space="preserve">não recusa a nova incumbência. </w:t>
       </w:r>
     </w:p>
     <w:p>
@@ -4511,6 +4375,293 @@
       </w:pPr>
       <w:r>
         <w:rPr/>
+      </w:r>
+    </w:p>
+    <w:p>
+      <w:pPr>
+        <w:pStyle w:val="Normal"/>
+        <w:jc w:val="both"/>
+        <w:rPr>
+          <w:rFonts w:ascii="Garamond" w:hAnsi="Garamond"/>
+          <w:sz w:val="36"/>
+          <w:szCs w:val="36"/>
+        </w:rPr>
+      </w:pPr>
+      <w:r>
+        <w:rPr>
+          <w:rFonts w:eastAsia="Times New Roman" w:cs="Times New Roman" w:ascii="Garamond" w:hAnsi="Garamond"/>
+          <w:color w:val="000000"/>
+          <w:kern w:val="0"/>
+          <w:sz w:val="36"/>
+          <w:szCs w:val="36"/>
+          <w:shd w:fill="auto" w:val="clear"/>
+          <w:lang w:val="en-US" w:eastAsia="zh-CN" w:bidi="hi-IN"/>
+        </w:rPr>
+        <w:t xml:space="preserve">Seu silêncio </w:t>
+      </w:r>
+      <w:r>
+        <w:rPr>
+          <w:rFonts w:eastAsia="Times New Roman" w:cs="Times New Roman" w:ascii="Garamond" w:hAnsi="Garamond"/>
+          <w:color w:val="000000"/>
+          <w:kern w:val="0"/>
+          <w:sz w:val="36"/>
+          <w:szCs w:val="36"/>
+          <w:shd w:fill="auto" w:val="clear"/>
+          <w:lang w:val="en-US" w:eastAsia="zh-CN" w:bidi="hi-IN"/>
+        </w:rPr>
+        <w:t xml:space="preserve">naquela hora </w:t>
+      </w:r>
+      <w:r>
+        <w:rPr>
+          <w:rFonts w:eastAsia="Times New Roman" w:cs="Times New Roman" w:ascii="Garamond" w:hAnsi="Garamond"/>
+          <w:color w:val="000000"/>
+          <w:kern w:val="0"/>
+          <w:sz w:val="36"/>
+          <w:szCs w:val="36"/>
+          <w:shd w:fill="auto" w:val="clear"/>
+          <w:lang w:val="en-US" w:eastAsia="zh-CN" w:bidi="hi-IN"/>
+        </w:rPr>
+        <w:t>ensina-nos que o verdadeiro serviço ao bem não se interrompe diante do sofrimento, mas nele encontra nova expressão. Maria continua a servir, porque o serviço, para ela, é expressão natural do amor.</w:t>
+      </w:r>
+    </w:p>
+    <w:p>
+      <w:pPr>
+        <w:pStyle w:val="Normal"/>
+        <w:jc w:val="both"/>
+        <w:rPr>
+          <w:rFonts w:ascii="Garamond" w:hAnsi="Garamond"/>
+          <w:sz w:val="36"/>
+          <w:szCs w:val="36"/>
+        </w:rPr>
+      </w:pPr>
+      <w:r>
+        <w:rPr>
+          <w:rFonts w:ascii="Garamond" w:hAnsi="Garamond"/>
+          <w:sz w:val="36"/>
+          <w:szCs w:val="36"/>
+        </w:rPr>
+      </w:r>
+    </w:p>
+    <w:p>
+      <w:pPr>
+        <w:pStyle w:val="Normal"/>
+        <w:jc w:val="both"/>
+        <w:rPr>
+          <w:rFonts w:ascii="Garamond" w:hAnsi="Garamond"/>
+          <w:sz w:val="36"/>
+          <w:szCs w:val="36"/>
+        </w:rPr>
+      </w:pPr>
+      <w:r>
+        <w:rPr>
+          <w:rFonts w:ascii="Garamond" w:hAnsi="Garamond"/>
+          <w:sz w:val="36"/>
+          <w:szCs w:val="36"/>
+        </w:rPr>
+        <w:t>A grandeza de espírito demonstrada por Maria ao pé da cruz é tamanha que nos faz hesitar diante da ideia de seguir seus passos. Ainda assim, somos convidados a refletir sobre como trazer seu testemunho de fé e amor para o cotidiano de nossas vidas. Que atitudes concretas podemos tomar para nos inspirar em seu exemplo?</w:t>
+      </w:r>
+    </w:p>
+    <w:p>
+      <w:pPr>
+        <w:pStyle w:val="Normal"/>
+        <w:jc w:val="both"/>
+        <w:rPr>
+          <w:rFonts w:ascii="Garamond" w:hAnsi="Garamond"/>
+          <w:sz w:val="36"/>
+          <w:szCs w:val="36"/>
+        </w:rPr>
+      </w:pPr>
+      <w:r>
+        <w:rPr>
+          <w:rFonts w:ascii="Garamond" w:hAnsi="Garamond"/>
+          <w:sz w:val="36"/>
+          <w:szCs w:val="36"/>
+        </w:rPr>
+      </w:r>
+    </w:p>
+    <w:p>
+      <w:pPr>
+        <w:pStyle w:val="Normal"/>
+        <w:jc w:val="both"/>
+        <w:rPr>
+          <w:rFonts w:ascii="Garamond" w:hAnsi="Garamond"/>
+          <w:sz w:val="36"/>
+          <w:szCs w:val="36"/>
+        </w:rPr>
+      </w:pPr>
+      <w:r>
+        <w:rPr>
+          <w:rFonts w:ascii="Garamond" w:hAnsi="Garamond"/>
+          <w:sz w:val="36"/>
+          <w:szCs w:val="36"/>
+        </w:rPr>
+        <w:t>A primeira delas é a resignação. Maria sabia que Jesus não merecia o sofrimento que lhe foi imposto, mas aceitou-o ao entender que aquela era a vontade de Deus. Talvez não compreendesse plenamente os propósitos divinos por trás de tanta dor, mas tinha a confiança de que tudo ocorria segundo os desígnios do Pai.</w:t>
+      </w:r>
+    </w:p>
+    <w:p>
+      <w:pPr>
+        <w:pStyle w:val="Normal"/>
+        <w:jc w:val="both"/>
+        <w:rPr>
+          <w:rFonts w:ascii="Garamond" w:hAnsi="Garamond"/>
+          <w:sz w:val="36"/>
+          <w:szCs w:val="36"/>
+        </w:rPr>
+      </w:pPr>
+      <w:r>
+        <w:rPr>
+          <w:rFonts w:ascii="Garamond" w:hAnsi="Garamond"/>
+          <w:sz w:val="36"/>
+          <w:szCs w:val="36"/>
+        </w:rPr>
+      </w:r>
+    </w:p>
+    <w:p>
+      <w:pPr>
+        <w:pStyle w:val="Normal"/>
+        <w:jc w:val="both"/>
+        <w:rPr>
+          <w:rFonts w:ascii="Garamond" w:hAnsi="Garamond"/>
+          <w:sz w:val="36"/>
+          <w:szCs w:val="36"/>
+        </w:rPr>
+      </w:pPr>
+      <w:r>
+        <w:rPr>
+          <w:rFonts w:ascii="Garamond" w:hAnsi="Garamond"/>
+          <w:sz w:val="36"/>
+          <w:szCs w:val="36"/>
+        </w:rPr>
+        <w:t>Muitas vezes, enfrentamos situações em que nós mesmos — ou alguém que amamos — sofre, aparentemente sem motivo. Apesar dos esforços, da ajuda recebida e de nossas orações, a dor persiste. Nessas horas, é natural que nossa fé se abale e que surjam questionamentos sobre a justiça divina.</w:t>
+      </w:r>
+    </w:p>
+    <w:p>
+      <w:pPr>
+        <w:pStyle w:val="Normal"/>
+        <w:jc w:val="both"/>
+        <w:rPr>
+          <w:rFonts w:ascii="Garamond" w:hAnsi="Garamond"/>
+          <w:sz w:val="36"/>
+          <w:szCs w:val="36"/>
+        </w:rPr>
+      </w:pPr>
+      <w:r>
+        <w:rPr>
+          <w:rFonts w:ascii="Garamond" w:hAnsi="Garamond"/>
+          <w:sz w:val="36"/>
+          <w:szCs w:val="36"/>
+        </w:rPr>
+      </w:r>
+    </w:p>
+    <w:p>
+      <w:pPr>
+        <w:pStyle w:val="Normal"/>
+        <w:jc w:val="both"/>
+        <w:rPr>
+          <w:rFonts w:ascii="Garamond" w:hAnsi="Garamond"/>
+          <w:sz w:val="36"/>
+          <w:szCs w:val="36"/>
+        </w:rPr>
+      </w:pPr>
+      <w:r>
+        <w:rPr>
+          <w:rFonts w:ascii="Garamond" w:hAnsi="Garamond"/>
+          <w:sz w:val="36"/>
+          <w:szCs w:val="36"/>
+        </w:rPr>
+        <w:t>Assim como Maria permaneceu firme diante do sofrimento de seu Filho, somos convidados a confiar, mesmo quando tudo parece envolto em escuridão. A resignação, nesse contexto, não é passividade, mas um ato profundo de fé: consiste em entregar a Deus aquilo que nos escapa à compreensão, reconhecendo que Ele enxerga muito além do que nossos olhos podem alcançar.</w:t>
+      </w:r>
+    </w:p>
+    <w:p>
+      <w:pPr>
+        <w:pStyle w:val="Normal"/>
+        <w:jc w:val="both"/>
+        <w:rPr>
+          <w:rFonts w:ascii="Garamond" w:hAnsi="Garamond"/>
+          <w:sz w:val="36"/>
+          <w:szCs w:val="36"/>
+        </w:rPr>
+      </w:pPr>
+      <w:r>
+        <w:rPr>
+          <w:rFonts w:ascii="Garamond" w:hAnsi="Garamond"/>
+          <w:sz w:val="36"/>
+          <w:szCs w:val="36"/>
+        </w:rPr>
+      </w:r>
+    </w:p>
+    <w:p>
+      <w:pPr>
+        <w:pStyle w:val="Normal"/>
+        <w:jc w:val="both"/>
+        <w:rPr>
+          <w:rFonts w:ascii="Garamond" w:hAnsi="Garamond"/>
+          <w:sz w:val="36"/>
+          <w:szCs w:val="36"/>
+        </w:rPr>
+      </w:pPr>
+      <w:r>
+        <w:rPr>
+          <w:rFonts w:ascii="Garamond" w:hAnsi="Garamond"/>
+          <w:sz w:val="36"/>
+          <w:szCs w:val="36"/>
+        </w:rPr>
+        <w:t>Mas Maria não apenas se resignou — ela permaneceu presente. Não fugiu da dor, nem abandonou Jesus em seu momento de maior angústia. Estava ali, silenciosa, mas inabalável em seu amor. E nos ensina que, embora nem sempre possamos afastar o sofrimento de quem amamos, podemos ser sustento, consolo e presença fiel.</w:t>
+      </w:r>
+    </w:p>
+    <w:p>
+      <w:pPr>
+        <w:pStyle w:val="Normal"/>
+        <w:jc w:val="both"/>
+        <w:rPr>
+          <w:rFonts w:ascii="Garamond" w:hAnsi="Garamond"/>
+          <w:sz w:val="36"/>
+          <w:szCs w:val="36"/>
+        </w:rPr>
+      </w:pPr>
+      <w:r>
+        <w:rPr>
+          <w:rFonts w:ascii="Garamond" w:hAnsi="Garamond"/>
+          <w:sz w:val="36"/>
+          <w:szCs w:val="36"/>
+        </w:rPr>
+      </w:r>
+    </w:p>
+    <w:p>
+      <w:pPr>
+        <w:pStyle w:val="Normal"/>
+        <w:jc w:val="both"/>
+        <w:rPr>
+          <w:rFonts w:ascii="Garamond" w:hAnsi="Garamond"/>
+          <w:sz w:val="36"/>
+          <w:szCs w:val="36"/>
+        </w:rPr>
+      </w:pPr>
+      <w:r>
+        <w:rPr>
+          <w:rFonts w:ascii="Garamond" w:hAnsi="Garamond"/>
+          <w:sz w:val="36"/>
+          <w:szCs w:val="36"/>
+        </w:rPr>
+        <w:t>Ao olharmos para Maria, somos convidados a refletir também sobre sua coragem, sua esperança e sua confiança na promessa de Deus. Que, diante de nossos próprios calvários — ou dos calvários daqueles que amamos — saibamos cultivar essas virtudes e, como ela, manter a fé viva mesmo no silêncio de Deus.</w:t>
+      </w:r>
+    </w:p>
+    <w:p>
+      <w:pPr>
+        <w:pStyle w:val="Normal"/>
+        <w:jc w:val="both"/>
+        <w:rPr>
+          <w:rFonts w:ascii="Garamond" w:hAnsi="Garamond"/>
+          <w:sz w:val="36"/>
+          <w:szCs w:val="36"/>
+        </w:rPr>
+      </w:pPr>
+      <w:r>
+        <w:rPr>
+          <w:rFonts w:ascii="Garamond" w:hAnsi="Garamond"/>
+          <w:sz w:val="36"/>
+          <w:szCs w:val="36"/>
+        </w:rPr>
       </w:r>
     </w:p>
     <w:p>

</xml_diff>

<commit_message>
15/05/2025 - 23:10 h
</commit_message>
<xml_diff>
--- a/Maria de Nazaré e a disposição em servir/Maria de Nazaré e a disposição em servir.docx
+++ b/Maria de Nazaré e a disposição em servir/Maria de Nazaré e a disposição em servir.docx
@@ -86,61 +86,6 @@
           <w:sz w:val="36"/>
           <w:szCs w:val="36"/>
         </w:rPr>
-      </w:r>
-    </w:p>
-    <w:p>
-      <w:pPr>
-        <w:pStyle w:val="Normal"/>
-        <w:jc w:val="both"/>
-        <w:rPr>
-          <w:rFonts w:ascii="Garamond" w:hAnsi="Garamond"/>
-          <w:sz w:val="36"/>
-          <w:szCs w:val="36"/>
-        </w:rPr>
-      </w:pPr>
-      <w:r>
-        <w:rPr>
-          <w:rFonts w:ascii="Garamond" w:hAnsi="Garamond"/>
-          <w:sz w:val="36"/>
-          <w:szCs w:val="36"/>
-        </w:rPr>
-        <w:t>O tema das nossas reflexões de hoje é "Maria de Nazaré e a disposição em servir".</w:t>
-      </w:r>
-    </w:p>
-    <w:p>
-      <w:pPr>
-        <w:pStyle w:val="Normal"/>
-        <w:jc w:val="both"/>
-        <w:rPr>
-          <w:rFonts w:ascii="Garamond" w:hAnsi="Garamond"/>
-          <w:sz w:val="36"/>
-          <w:szCs w:val="36"/>
-        </w:rPr>
-      </w:pPr>
-      <w:r>
-        <w:rPr>
-          <w:rFonts w:ascii="Garamond" w:hAnsi="Garamond"/>
-          <w:sz w:val="36"/>
-          <w:szCs w:val="36"/>
-        </w:rPr>
-      </w:r>
-    </w:p>
-    <w:p>
-      <w:pPr>
-        <w:pStyle w:val="Normal"/>
-        <w:jc w:val="both"/>
-        <w:rPr>
-          <w:rFonts w:ascii="Garamond" w:hAnsi="Garamond"/>
-          <w:sz w:val="36"/>
-          <w:szCs w:val="36"/>
-        </w:rPr>
-      </w:pPr>
-      <w:r>
-        <w:rPr>
-          <w:rFonts w:ascii="Garamond" w:hAnsi="Garamond"/>
-          <w:sz w:val="36"/>
-          <w:szCs w:val="36"/>
-        </w:rPr>
         <w:t xml:space="preserve">Falar sobre Maria de Nazaré é uma tarefa mais difícil do que </w:t>
       </w:r>
       <w:r>
@@ -311,49 +256,6 @@
           <w:szCs w:val="36"/>
         </w:rPr>
         <w:t xml:space="preserve"> Espírito puro, perfeito, que Deus ofereceu à humanidade para servir como guia e modelo: Jesus Cristo.</w:t>
-      </w:r>
-    </w:p>
-    <w:p>
-      <w:pPr>
-        <w:pStyle w:val="Normal"/>
-        <w:jc w:val="both"/>
-        <w:rPr>
-          <w:rFonts w:ascii="Garamond" w:hAnsi="Garamond"/>
-          <w:sz w:val="36"/>
-          <w:szCs w:val="36"/>
-        </w:rPr>
-      </w:pPr>
-      <w:r>
-        <w:rPr>
-          <w:rFonts w:ascii="Garamond" w:hAnsi="Garamond"/>
-          <w:sz w:val="36"/>
-          <w:szCs w:val="36"/>
-        </w:rPr>
-      </w:r>
-    </w:p>
-    <w:p>
-      <w:pPr>
-        <w:pStyle w:val="Normal"/>
-        <w:jc w:val="both"/>
-        <w:rPr>
-          <w:rFonts w:ascii="Garamond" w:hAnsi="Garamond" w:eastAsia="Arial" w:cs="Arial"/>
-          <w:color w:val="auto"/>
-          <w:kern w:val="0"/>
-          <w:sz w:val="36"/>
-          <w:szCs w:val="36"/>
-          <w:lang w:val="en-US" w:eastAsia="zh-CN" w:bidi="hi-IN"/>
-        </w:rPr>
-      </w:pPr>
-      <w:r>
-        <w:rPr>
-          <w:rFonts w:eastAsia="Arial" w:cs="Arial" w:ascii="Garamond" w:hAnsi="Garamond"/>
-          <w:color w:val="auto"/>
-          <w:kern w:val="0"/>
-          <w:sz w:val="36"/>
-          <w:szCs w:val="36"/>
-          <w:lang w:val="en-US" w:eastAsia="zh-CN" w:bidi="hi-IN"/>
-        </w:rPr>
-        <w:t>Vamos abrir um parêntese aqui para um breve esclarecimento.</w:t>
       </w:r>
     </w:p>
     <w:p>
@@ -683,29 +585,85 @@
           <w:shd w:fill="auto" w:val="clear"/>
           <w:lang w:val="en-US" w:eastAsia="zh-CN" w:bidi="hi-IN"/>
         </w:rPr>
-        <w:t xml:space="preserve"> já se  encontrava na condição de Governador Espiritual da Terra. </w:t>
-      </w:r>
-    </w:p>
-    <w:p>
-      <w:pPr>
-        <w:pStyle w:val="Normal"/>
-        <w:jc w:val="both"/>
-        <w:rPr>
-          <w:rFonts w:ascii="Garamond" w:hAnsi="Garamond"/>
-          <w:sz w:val="36"/>
-          <w:szCs w:val="36"/>
-        </w:rPr>
-      </w:pPr>
-      <w:r>
-        <w:rPr>
-          <w:rFonts w:eastAsia="Arial" w:cs="Arial" w:ascii="Garamond" w:hAnsi="Garamond"/>
-          <w:color w:val="auto"/>
-          <w:kern w:val="0"/>
-          <w:sz w:val="36"/>
-          <w:szCs w:val="36"/>
-          <w:lang w:val="en-US" w:eastAsia="zh-CN" w:bidi="hi-IN"/>
-        </w:rPr>
-        <w:t>Pois se o Cristo, cuja dimensão espiritual foge completamente à nossa compreensão, tornou-se o filho amado que Maria aceitou receber, o filho que ela concebeu, acolheu, educou e acompanhou durante toda a vida até os momentos derradeiros no calvário,  então o quê podemos  dizer da dimensão espiritual de Maria?</w:t>
+        <w:t xml:space="preserve"> já se  encontrava na condição de Governador Espiritual da Terra.</w:t>
+      </w:r>
+    </w:p>
+    <w:p>
+      <w:pPr>
+        <w:pStyle w:val="Normal"/>
+        <w:jc w:val="both"/>
+        <w:rPr>
+          <w:sz w:val="36"/>
+          <w:szCs w:val="36"/>
+        </w:rPr>
+      </w:pPr>
+      <w:r>
+        <w:rPr>
+          <w:sz w:val="36"/>
+          <w:szCs w:val="36"/>
+        </w:rPr>
+      </w:r>
+    </w:p>
+    <w:p>
+      <w:pPr>
+        <w:pStyle w:val="Normal"/>
+        <w:jc w:val="both"/>
+        <w:rPr>
+          <w:rFonts w:ascii="Garamond" w:hAnsi="Garamond"/>
+          <w:sz w:val="36"/>
+          <w:szCs w:val="36"/>
+        </w:rPr>
+      </w:pPr>
+      <w:r>
+        <w:rPr>
+          <w:rFonts w:eastAsia="Arial" w:cs="Arial" w:ascii="Garamond" w:hAnsi="Garamond"/>
+          <w:color w:val="auto"/>
+          <w:kern w:val="0"/>
+          <w:sz w:val="36"/>
+          <w:szCs w:val="36"/>
+          <w:lang w:val="en-US" w:eastAsia="zh-CN" w:bidi="hi-IN"/>
+        </w:rPr>
+        <w:t>Se o Cristo, cuja dimensão espiritual escapa completamente à nossa compreensão, tornou-se o filho amado que Maria concebeu, acolheu, educou e acompanhou durante toda a vida até os momentos derradeiros no calvário,  então o quê podemos  dizer da dimensão espiritual de Maria?</w:t>
+      </w:r>
+    </w:p>
+    <w:p>
+      <w:pPr>
+        <w:pStyle w:val="Normal"/>
+        <w:jc w:val="both"/>
+        <w:rPr>
+          <w:rFonts w:ascii="Garamond" w:hAnsi="Garamond"/>
+          <w:sz w:val="36"/>
+          <w:szCs w:val="36"/>
+        </w:rPr>
+      </w:pPr>
+      <w:r>
+        <w:rPr>
+          <w:rFonts w:ascii="Garamond" w:hAnsi="Garamond"/>
+          <w:sz w:val="36"/>
+          <w:szCs w:val="36"/>
+        </w:rPr>
+      </w:r>
+    </w:p>
+    <w:p>
+      <w:pPr>
+        <w:pStyle w:val="Normal"/>
+        <w:jc w:val="both"/>
+        <w:rPr>
+          <w:rFonts w:ascii="Garamond" w:hAnsi="Garamond"/>
+          <w:sz w:val="36"/>
+          <w:szCs w:val="36"/>
+        </w:rPr>
+      </w:pPr>
+      <w:r>
+        <w:rPr>
+          <w:rFonts w:eastAsia="Arial" w:cs="Arial" w:ascii="Garamond" w:hAnsi="Garamond"/>
+          <w:color w:val="auto"/>
+          <w:kern w:val="0"/>
+          <w:sz w:val="36"/>
+          <w:szCs w:val="36"/>
+          <w:lang w:val="en-US" w:eastAsia="zh-CN" w:bidi="hi-IN"/>
+        </w:rPr>
+        <w:t>Só para termos uma ideia vou trazer um fato curioso aqui.</w:t>
       </w:r>
     </w:p>
     <w:p>
@@ -782,25 +740,47 @@
           <w:sz w:val="36"/>
           <w:szCs w:val="36"/>
         </w:rPr>
-        <w:t>O Alcorão tem uma surata (capítulo) dedicada a ela, chamada "Surata Maryam" (19), que conta a história da anunciação, gravidez e nascimento de Jesus. A tradição islâmica também a descreve como "Imaculada" e como uma mulher pura e santa.</w:t>
-      </w:r>
-    </w:p>
-    <w:p>
-      <w:pPr>
-        <w:pStyle w:val="Normal"/>
-        <w:jc w:val="both"/>
-        <w:rPr>
-          <w:rFonts w:ascii="Garamond" w:hAnsi="Garamond"/>
-          <w:sz w:val="36"/>
-          <w:szCs w:val="36"/>
-        </w:rPr>
-      </w:pPr>
-      <w:r>
-        <w:rPr>
-          <w:rFonts w:ascii="Garamond" w:hAnsi="Garamond"/>
-          <w:sz w:val="36"/>
-          <w:szCs w:val="36"/>
-        </w:rPr>
+        <w:t>Os capítulos no Alcorão são chamados suratas. A surata 19 intitulada "Surata Maryam". Maryam é a forma árabe do nome Maria. A surata não é totalmente dedicada a Maria, mas lá é narrada a  história da anunciação, gravidez e nascimento de Jesus. A tradição islâmica descreve Maria como uma mulher pura e santa.</w:t>
+      </w:r>
+    </w:p>
+    <w:p>
+      <w:pPr>
+        <w:pStyle w:val="Normal"/>
+        <w:jc w:val="both"/>
+        <w:rPr>
+          <w:rFonts w:ascii="Garamond" w:hAnsi="Garamond"/>
+          <w:sz w:val="36"/>
+          <w:szCs w:val="36"/>
+        </w:rPr>
+      </w:pPr>
+      <w:r>
+        <w:rPr>
+          <w:rFonts w:ascii="Garamond" w:hAnsi="Garamond"/>
+          <w:sz w:val="36"/>
+          <w:szCs w:val="36"/>
+        </w:rPr>
+      </w:r>
+    </w:p>
+    <w:p>
+      <w:pPr>
+        <w:pStyle w:val="Normal"/>
+        <w:jc w:val="both"/>
+        <w:rPr>
+          <w:rFonts w:ascii="Garamond" w:hAnsi="Garamond"/>
+          <w:sz w:val="36"/>
+          <w:szCs w:val="36"/>
+        </w:rPr>
+      </w:pPr>
+      <w:r>
+        <w:rPr>
+          <w:rFonts w:eastAsia="Arial" w:cs="Arial" w:ascii="Garamond" w:hAnsi="Garamond"/>
+          <w:color w:val="auto"/>
+          <w:kern w:val="0"/>
+          <w:sz w:val="36"/>
+          <w:szCs w:val="36"/>
+          <w:lang w:val="en-US" w:eastAsia="zh-CN" w:bidi="hi-IN"/>
+        </w:rPr>
+        <w:t>Na surata Maryam, Jesus é tratado como um profeta muito importante, nascido de maneira milagrosa através de Maria, sem pai biológico, mas não é reconhecido como o Filho de Deus.  Ou seja, o Islã não reconhece a grandeza espiritual de Jesus, mas reconhece a grandeza de Maria.</w:t>
       </w:r>
     </w:p>
     <w:p>
@@ -1118,19 +1098,6 @@
         </w:rPr>
         <w:t xml:space="preserve">Anúncio do nascimento de Jesus - Lucas 1:26-38   </w:t>
       </w:r>
-      <w:r>
-        <w:rPr>
-          <w:rFonts w:ascii="Garamond" w:hAnsi="Garamond"/>
-          <w:b/>
-          <w:bCs/>
-          <w:i w:val="false"/>
-          <w:iCs w:val="false"/>
-          <w:color w:val="00A0FC"/>
-          <w:sz w:val="36"/>
-          <w:szCs w:val="36"/>
-        </w:rPr>
-        <w:t>Concluída</w:t>
-      </w:r>
     </w:p>
     <w:p>
       <w:pPr>
@@ -2052,175 +2019,66 @@
       </w:pPr>
       <w:r>
         <w:rPr>
-          <w:rFonts w:eastAsia="Arial" w:cs="Arial" w:ascii="Garamond" w:hAnsi="Garamond"/>
           <w:b/>
           <w:bCs/>
           <w:i w:val="false"/>
           <w:iCs w:val="false"/>
-          <w:color w:val="00A0FC"/>
-          <w:kern w:val="0"/>
-          <w:sz w:val="36"/>
-          <w:szCs w:val="36"/>
-          <w:lang w:val="en-US" w:eastAsia="zh-CN" w:bidi="hi-IN"/>
-        </w:rPr>
-        <w:t>Concluída</w:t>
-      </w:r>
-    </w:p>
-    <w:p>
-      <w:pPr>
-        <w:pStyle w:val="Normal"/>
-        <w:jc w:val="both"/>
-        <w:rPr>
-          <w:rFonts w:ascii="Garamond" w:hAnsi="Garamond"/>
-          <w:sz w:val="36"/>
-          <w:szCs w:val="36"/>
-        </w:rPr>
-      </w:pPr>
-      <w:r>
-        <w:rPr>
-          <w:rFonts w:ascii="Garamond" w:hAnsi="Garamond"/>
-          <w:sz w:val="36"/>
-          <w:szCs w:val="36"/>
-        </w:rPr>
-      </w:r>
-    </w:p>
-    <w:p>
-      <w:pPr>
-        <w:pStyle w:val="Normal"/>
-        <w:jc w:val="both"/>
-        <w:rPr>
-          <w:rFonts w:ascii="Garamond" w:hAnsi="Garamond"/>
-          <w:sz w:val="36"/>
-          <w:szCs w:val="36"/>
-        </w:rPr>
-      </w:pPr>
-      <w:r>
-        <w:rPr>
-          <w:rFonts w:ascii="Garamond" w:hAnsi="Garamond"/>
-          <w:sz w:val="36"/>
-          <w:szCs w:val="36"/>
-        </w:rPr>
-        <w:t>Nota [ ver se vale a pena manter essa nota] : A diferença entre “Isabel” e “Elisabet” nas versões do Evangelho se deve a variações de tradução e transliteração do nome original ao longo dos séculos, conforme o texto bíblico foi passado do hebraico ao grego, depois ao latim e, por fim, aos idiomas modernos.</w:t>
-      </w:r>
-    </w:p>
-    <w:p>
-      <w:pPr>
-        <w:pStyle w:val="Normal"/>
-        <w:jc w:val="both"/>
-        <w:rPr>
-          <w:rFonts w:ascii="Garamond" w:hAnsi="Garamond"/>
-          <w:sz w:val="36"/>
-          <w:szCs w:val="36"/>
-        </w:rPr>
-      </w:pPr>
-      <w:r>
-        <w:rPr>
-          <w:rFonts w:ascii="Garamond" w:hAnsi="Garamond"/>
-          <w:sz w:val="36"/>
-          <w:szCs w:val="36"/>
-        </w:rPr>
-      </w:r>
-    </w:p>
-    <w:p>
-      <w:pPr>
-        <w:pStyle w:val="Normal"/>
-        <w:jc w:val="both"/>
-        <w:rPr>
-          <w:rFonts w:ascii="Garamond" w:hAnsi="Garamond"/>
-          <w:sz w:val="36"/>
-          <w:szCs w:val="36"/>
-        </w:rPr>
-      </w:pPr>
-      <w:r>
-        <w:rPr>
-          <w:rFonts w:ascii="Garamond" w:hAnsi="Garamond"/>
-          <w:sz w:val="36"/>
-          <w:szCs w:val="36"/>
-        </w:rPr>
-        <w:t xml:space="preserve">O nome da prima de Maria provavelmente era </w:t>
-      </w:r>
-      <w:r>
-        <w:rPr>
-          <w:rFonts w:ascii="Garamond" w:hAnsi="Garamond"/>
-          <w:sz w:val="36"/>
-          <w:sz w:val="36"/>
-          <w:szCs w:val="36"/>
-          <w:rtl w:val="true"/>
-        </w:rPr>
-        <w:t>אֱלִישֶׁבַע</w:t>
-      </w:r>
-      <w:r>
-        <w:rPr>
-          <w:rFonts w:ascii="Garamond" w:hAnsi="Garamond"/>
-          <w:sz w:val="36"/>
-          <w:sz w:val="36"/>
-          <w:szCs w:val="36"/>
-        </w:rPr>
-        <w:t xml:space="preserve"> </w:t>
-      </w:r>
-      <w:r>
-        <w:rPr>
-          <w:rFonts w:ascii="Garamond" w:hAnsi="Garamond"/>
-          <w:sz w:val="36"/>
-          <w:szCs w:val="36"/>
-        </w:rPr>
-        <w:t>(Elisheva), que significa algo como "Deus é meu juramento". No Novo Testamento grego, esse nome aparece como Ἐλισάβετ (Elisábet), que tenta manter o som do hebraico original, mas adaptado à fonética grega.</w:t>
-      </w:r>
-    </w:p>
-    <w:p>
-      <w:pPr>
-        <w:pStyle w:val="Normal"/>
-        <w:jc w:val="both"/>
-        <w:rPr>
-          <w:rFonts w:ascii="Garamond" w:hAnsi="Garamond"/>
-          <w:sz w:val="36"/>
-          <w:szCs w:val="36"/>
-        </w:rPr>
-      </w:pPr>
-      <w:r>
-        <w:rPr>
-          <w:rFonts w:ascii="Garamond" w:hAnsi="Garamond"/>
-          <w:sz w:val="36"/>
-          <w:szCs w:val="36"/>
-        </w:rPr>
-      </w:r>
-    </w:p>
-    <w:p>
-      <w:pPr>
-        <w:pStyle w:val="Normal"/>
-        <w:jc w:val="both"/>
-        <w:rPr>
-          <w:rFonts w:ascii="Garamond" w:hAnsi="Garamond"/>
-          <w:sz w:val="36"/>
-          <w:szCs w:val="36"/>
-        </w:rPr>
-      </w:pPr>
-      <w:r>
-        <w:rPr>
-          <w:rFonts w:ascii="Garamond" w:hAnsi="Garamond"/>
-          <w:sz w:val="36"/>
-          <w:szCs w:val="36"/>
-        </w:rPr>
-        <w:t>A forma “Isabel” surgiu da evolução fonética de “Elisabeth” nas línguas latinas. O som th no final desapareceu, e o início foi suavizado:</w:t>
-      </w:r>
-    </w:p>
-    <w:p>
-      <w:pPr>
-        <w:pStyle w:val="Normal"/>
-        <w:jc w:val="both"/>
-        <w:rPr>
-          <w:rFonts w:ascii="Garamond" w:hAnsi="Garamond"/>
-          <w:sz w:val="36"/>
-          <w:szCs w:val="36"/>
-        </w:rPr>
-      </w:pPr>
-      <w:r>
-        <w:rPr>
-          <w:rFonts w:ascii="Garamond" w:hAnsi="Garamond"/>
-          <w:sz w:val="36"/>
-          <w:szCs w:val="36"/>
-        </w:rPr>
-        <w:t>Elisabeth → Elisabel → Isabel</w:t>
+          <w:color w:val="C9211E"/>
+        </w:rPr>
+      </w:r>
+    </w:p>
+    <w:p>
+      <w:pPr>
+        <w:pStyle w:val="Normal"/>
+        <w:jc w:val="both"/>
+        <w:rPr>
+          <w:rFonts w:ascii="Garamond" w:hAnsi="Garamond"/>
+          <w:sz w:val="36"/>
+          <w:szCs w:val="36"/>
+        </w:rPr>
+      </w:pPr>
+      <w:r>
+        <w:rPr>
+          <w:rFonts w:ascii="Garamond" w:hAnsi="Garamond"/>
+          <w:sz w:val="36"/>
+          <w:szCs w:val="36"/>
+        </w:rPr>
+      </w:r>
+    </w:p>
+    <w:p>
+      <w:pPr>
+        <w:pStyle w:val="Normal"/>
+        <w:jc w:val="both"/>
+        <w:rPr>
+          <w:rFonts w:ascii="Garamond" w:hAnsi="Garamond"/>
+          <w:sz w:val="36"/>
+          <w:szCs w:val="36"/>
+        </w:rPr>
+      </w:pPr>
+      <w:r>
+        <w:rPr>
+          <w:rFonts w:ascii="Garamond" w:hAnsi="Garamond"/>
+          <w:sz w:val="36"/>
+          <w:szCs w:val="36"/>
+        </w:rPr>
+        <w:t xml:space="preserve">[ </w:t>
+      </w:r>
+      <w:r>
+        <w:rPr>
+          <w:rFonts w:ascii="Garamond" w:hAnsi="Garamond"/>
+          <w:color w:val="023F62"/>
+          <w:sz w:val="36"/>
+          <w:szCs w:val="36"/>
+        </w:rPr>
+        <w:t>Citar brevemente a diferença de nomes Isabel / Elisabet</w:t>
+      </w:r>
+      <w:r>
+        <w:rPr>
+          <w:rFonts w:ascii="Garamond" w:hAnsi="Garamond"/>
+          <w:sz w:val="36"/>
+          <w:szCs w:val="36"/>
+        </w:rPr>
+        <w:t xml:space="preserve"> ]</w:t>
       </w:r>
     </w:p>
     <w:p>
@@ -2374,42 +2232,6 @@
           <w:szCs w:val="36"/>
         </w:rPr>
         <w:t xml:space="preserve">. Permanece ali por cerca de três meses, servindo não apenas com gestos, mas também com sua presença amorosa, com o consolo de sua escuta e a partilha do cotidiano. </w:t>
-      </w:r>
-    </w:p>
-    <w:p>
-      <w:pPr>
-        <w:pStyle w:val="Normal"/>
-        <w:jc w:val="both"/>
-        <w:rPr>
-          <w:rFonts w:ascii="Garamond" w:hAnsi="Garamond"/>
-          <w:sz w:val="36"/>
-          <w:szCs w:val="36"/>
-        </w:rPr>
-      </w:pPr>
-      <w:r>
-        <w:rPr>
-          <w:rFonts w:ascii="Garamond" w:hAnsi="Garamond"/>
-          <w:sz w:val="36"/>
-          <w:szCs w:val="36"/>
-        </w:rPr>
-      </w:r>
-    </w:p>
-    <w:p>
-      <w:pPr>
-        <w:pStyle w:val="Normal"/>
-        <w:jc w:val="both"/>
-        <w:rPr>
-          <w:rFonts w:ascii="Garamond" w:hAnsi="Garamond"/>
-          <w:sz w:val="36"/>
-          <w:szCs w:val="36"/>
-        </w:rPr>
-      </w:pPr>
-      <w:r>
-        <w:rPr>
-          <w:rFonts w:ascii="Garamond" w:hAnsi="Garamond"/>
-          <w:sz w:val="36"/>
-          <w:szCs w:val="36"/>
-        </w:rPr>
       </w:r>
     </w:p>
     <w:p>
@@ -2844,6 +2666,24 @@
           <w:lang w:val="en-US" w:eastAsia="zh-CN" w:bidi="hi-IN"/>
         </w:rPr>
         <w:t>Se eu ocupo um cargo de importância, tenho vários diplomas acadêmicos, falo 2 ou 3 idiomas, já viajei para diversos países em todo o mundo, isso não me torna melhor do que ninguém. Nada de errado com essas conquistas quando elas são o resultado do nosso esforço e  trabalho. Mas julgar que elas nos fazem melhor que os outros é um engano terrível.</w:t>
+      </w:r>
+    </w:p>
+    <w:p>
+      <w:pPr>
+        <w:pStyle w:val="Normal"/>
+        <w:jc w:val="both"/>
+        <w:rPr>
+          <w:rFonts w:ascii="Garamond" w:hAnsi="Garamond"/>
+          <w:sz w:val="36"/>
+          <w:szCs w:val="36"/>
+        </w:rPr>
+      </w:pPr>
+      <w:r>
+        <w:rPr>
+          <w:rFonts w:ascii="Garamond" w:hAnsi="Garamond"/>
+          <w:sz w:val="36"/>
+          <w:szCs w:val="36"/>
+        </w:rPr>
       </w:r>
     </w:p>
     <w:p>
@@ -3150,1533 +2990,783 @@
       </w:pPr>
       <w:r>
         <w:rPr>
-          <w:rFonts w:eastAsia="Arial" w:cs="Arial" w:ascii="Garamond" w:hAnsi="Garamond"/>
-          <w:b/>
-          <w:bCs/>
-          <w:i w:val="false"/>
-          <w:iCs w:val="false"/>
-          <w:color w:val="00A0FC"/>
-          <w:kern w:val="0"/>
-          <w:sz w:val="36"/>
-          <w:szCs w:val="36"/>
-          <w:lang w:val="en-US" w:eastAsia="zh-CN" w:bidi="hi-IN"/>
-        </w:rPr>
-        <w:t>Concluída</w:t>
-      </w:r>
-    </w:p>
-    <w:p>
-      <w:pPr>
-        <w:pStyle w:val="Normal"/>
-        <w:jc w:val="both"/>
-        <w:rPr>
-          <w:rFonts w:ascii="Garamond" w:hAnsi="Garamond"/>
-          <w:sz w:val="36"/>
-          <w:szCs w:val="36"/>
-        </w:rPr>
-      </w:pPr>
-      <w:r>
-        <w:rPr>
-          <w:rFonts w:ascii="Garamond" w:hAnsi="Garamond"/>
-          <w:sz w:val="36"/>
-          <w:szCs w:val="36"/>
-        </w:rPr>
-      </w:r>
-    </w:p>
-    <w:p>
-      <w:pPr>
-        <w:pStyle w:val="Normal"/>
-        <w:jc w:val="both"/>
-        <w:rPr>
-          <w:rFonts w:ascii="Garamond" w:hAnsi="Garamond"/>
-          <w:sz w:val="36"/>
-          <w:szCs w:val="36"/>
-        </w:rPr>
-      </w:pPr>
-      <w:r>
-        <w:rPr>
-          <w:rFonts w:ascii="Garamond" w:hAnsi="Garamond"/>
-          <w:sz w:val="36"/>
-          <w:szCs w:val="36"/>
-        </w:rPr>
-        <w:t xml:space="preserve">Nessa passagem destacamos a fé ou, se preferirem,  a confiança que </w:t>
-      </w:r>
-      <w:r>
-        <w:rPr>
-          <w:rFonts w:eastAsia="Arial" w:cs="Arial" w:ascii="Garamond" w:hAnsi="Garamond"/>
-          <w:color w:val="auto"/>
-          <w:kern w:val="0"/>
-          <w:sz w:val="36"/>
-          <w:szCs w:val="36"/>
-          <w:lang w:val="en-US" w:eastAsia="zh-CN" w:bidi="hi-IN"/>
-        </w:rPr>
-        <w:t>Maria</w:t>
-      </w:r>
-      <w:r>
-        <w:rPr>
-          <w:rFonts w:ascii="Garamond" w:hAnsi="Garamond"/>
-          <w:sz w:val="36"/>
-          <w:szCs w:val="36"/>
-        </w:rPr>
-        <w:t xml:space="preserve"> deposita em Jesus.</w:t>
-      </w:r>
-    </w:p>
-    <w:p>
-      <w:pPr>
-        <w:pStyle w:val="Normal"/>
-        <w:jc w:val="both"/>
-        <w:rPr>
-          <w:rFonts w:ascii="Garamond" w:hAnsi="Garamond"/>
-          <w:sz w:val="36"/>
-          <w:szCs w:val="36"/>
-        </w:rPr>
-      </w:pPr>
-      <w:r>
-        <w:rPr>
-          <w:rFonts w:ascii="Garamond" w:hAnsi="Garamond"/>
-          <w:sz w:val="36"/>
-          <w:szCs w:val="36"/>
-        </w:rPr>
-      </w:r>
-    </w:p>
-    <w:p>
-      <w:pPr>
-        <w:pStyle w:val="Normal"/>
-        <w:jc w:val="both"/>
-        <w:rPr>
-          <w:rFonts w:ascii="Garamond" w:hAnsi="Garamond"/>
-          <w:sz w:val="36"/>
-          <w:szCs w:val="36"/>
-        </w:rPr>
-      </w:pPr>
-      <w:r>
-        <w:rPr>
-          <w:rFonts w:eastAsia="Arial" w:cs="Arial" w:ascii="Garamond" w:hAnsi="Garamond"/>
-          <w:color w:val="auto"/>
-          <w:kern w:val="0"/>
-          <w:sz w:val="36"/>
-          <w:szCs w:val="36"/>
-          <w:lang w:val="en-US" w:eastAsia="zh-CN" w:bidi="hi-IN"/>
-        </w:rPr>
-        <w:t>Quando Maria interpela o filho dizendo que o vinho havia acabado Ele responde:</w:t>
-      </w:r>
-    </w:p>
-    <w:p>
-      <w:pPr>
-        <w:pStyle w:val="Normal"/>
-        <w:jc w:val="both"/>
-        <w:rPr>
-          <w:rFonts w:ascii="Garamond" w:hAnsi="Garamond"/>
-          <w:sz w:val="36"/>
-          <w:szCs w:val="36"/>
-        </w:rPr>
-      </w:pPr>
-      <w:r>
-        <w:rPr>
-          <w:rFonts w:ascii="Garamond" w:hAnsi="Garamond"/>
-          <w:sz w:val="36"/>
-          <w:szCs w:val="36"/>
-        </w:rPr>
-      </w:r>
-    </w:p>
-    <w:p>
-      <w:pPr>
-        <w:pStyle w:val="Normal"/>
-        <w:ind w:left="720" w:hanging="0"/>
-        <w:jc w:val="both"/>
-        <w:rPr>
-          <w:rFonts w:ascii="Garamond" w:hAnsi="Garamond"/>
-          <w:sz w:val="36"/>
-          <w:szCs w:val="36"/>
-        </w:rPr>
-      </w:pPr>
-      <w:r>
-        <w:rPr>
-          <w:rFonts w:eastAsia="Arial" w:cs="Arial" w:ascii="Garamond" w:hAnsi="Garamond"/>
-          <w:color w:val="auto"/>
-          <w:kern w:val="0"/>
-          <w:sz w:val="36"/>
-          <w:szCs w:val="36"/>
-          <w:lang w:val="en-US" w:eastAsia="zh-CN" w:bidi="hi-IN"/>
-        </w:rPr>
-        <w:t>“</w:t>
-      </w:r>
-      <w:r>
-        <w:rPr>
-          <w:rFonts w:eastAsia="Arial" w:cs="Arial" w:ascii="Garamond" w:hAnsi="Garamond"/>
-          <w:i/>
-          <w:iCs/>
-          <w:color w:val="auto"/>
-          <w:kern w:val="0"/>
-          <w:sz w:val="36"/>
-          <w:szCs w:val="36"/>
-          <w:lang w:val="en-US" w:eastAsia="zh-CN" w:bidi="hi-IN"/>
-        </w:rPr>
-        <w:t>Mulher, o que queres de mim? Minha hora ainda não chegou</w:t>
-      </w:r>
-      <w:r>
-        <w:rPr>
-          <w:rFonts w:eastAsia="Arial" w:cs="Arial" w:ascii="Garamond" w:hAnsi="Garamond"/>
-          <w:color w:val="auto"/>
-          <w:kern w:val="0"/>
-          <w:sz w:val="36"/>
-          <w:szCs w:val="36"/>
-          <w:lang w:val="en-US" w:eastAsia="zh-CN" w:bidi="hi-IN"/>
-        </w:rPr>
-        <w:t xml:space="preserve">”. </w:t>
-      </w:r>
-    </w:p>
-    <w:p>
-      <w:pPr>
-        <w:pStyle w:val="Normal"/>
-        <w:jc w:val="both"/>
-        <w:rPr>
-          <w:rFonts w:ascii="Garamond" w:hAnsi="Garamond"/>
-          <w:sz w:val="36"/>
-          <w:szCs w:val="36"/>
-        </w:rPr>
-      </w:pPr>
-      <w:r>
-        <w:rPr>
-          <w:rFonts w:ascii="Garamond" w:hAnsi="Garamond"/>
-          <w:sz w:val="36"/>
-          <w:szCs w:val="36"/>
-        </w:rPr>
-      </w:r>
-    </w:p>
-    <w:p>
-      <w:pPr>
-        <w:pStyle w:val="Normal"/>
-        <w:jc w:val="both"/>
-        <w:rPr>
-          <w:rFonts w:ascii="Garamond" w:hAnsi="Garamond"/>
-          <w:sz w:val="36"/>
-          <w:szCs w:val="36"/>
-        </w:rPr>
-      </w:pPr>
-      <w:r>
-        <w:rPr>
-          <w:rFonts w:eastAsia="Arial" w:cs="Arial" w:ascii="Garamond" w:hAnsi="Garamond"/>
-          <w:color w:val="auto"/>
-          <w:kern w:val="0"/>
-          <w:sz w:val="36"/>
-          <w:szCs w:val="36"/>
-          <w:lang w:val="en-US" w:eastAsia="zh-CN" w:bidi="hi-IN"/>
-        </w:rPr>
-        <w:t>Como tantas mães que conhecem bem os filhos, ela não se deixa abalar pela negativa inicial e  diz aos servidores da casa:</w:t>
-      </w:r>
-    </w:p>
-    <w:p>
-      <w:pPr>
-        <w:pStyle w:val="Normal"/>
-        <w:jc w:val="both"/>
-        <w:rPr>
-          <w:rFonts w:ascii="Garamond" w:hAnsi="Garamond"/>
-          <w:sz w:val="36"/>
-          <w:szCs w:val="36"/>
-        </w:rPr>
-      </w:pPr>
-      <w:r>
-        <w:rPr>
-          <w:rFonts w:ascii="Garamond" w:hAnsi="Garamond"/>
-          <w:sz w:val="36"/>
-          <w:szCs w:val="36"/>
-        </w:rPr>
-      </w:r>
-    </w:p>
-    <w:p>
-      <w:pPr>
-        <w:pStyle w:val="Normal"/>
-        <w:ind w:left="720" w:hanging="0"/>
-        <w:jc w:val="both"/>
-        <w:rPr>
-          <w:rFonts w:ascii="Garamond" w:hAnsi="Garamond"/>
-          <w:sz w:val="36"/>
-          <w:szCs w:val="36"/>
-        </w:rPr>
-      </w:pPr>
-      <w:r>
-        <w:rPr>
-          <w:rFonts w:eastAsia="Arial" w:cs="Arial" w:ascii="Garamond" w:hAnsi="Garamond"/>
-          <w:color w:val="auto"/>
-          <w:kern w:val="0"/>
-          <w:sz w:val="36"/>
-          <w:szCs w:val="36"/>
-          <w:lang w:val="en-US" w:eastAsia="zh-CN" w:bidi="hi-IN"/>
-        </w:rPr>
-        <w:t>“</w:t>
-      </w:r>
-      <w:r>
-        <w:rPr>
-          <w:rFonts w:eastAsia="Arial" w:cs="Arial" w:ascii="Garamond" w:hAnsi="Garamond"/>
-          <w:i/>
-          <w:iCs/>
-          <w:color w:val="auto"/>
-          <w:kern w:val="0"/>
-          <w:sz w:val="36"/>
-          <w:szCs w:val="36"/>
-          <w:lang w:val="en-US" w:eastAsia="zh-CN" w:bidi="hi-IN"/>
-        </w:rPr>
-        <w:t>Fazei o que ele vos disser</w:t>
-      </w:r>
-      <w:r>
-        <w:rPr>
-          <w:rFonts w:eastAsia="Arial" w:cs="Arial" w:ascii="Garamond" w:hAnsi="Garamond"/>
-          <w:color w:val="auto"/>
-          <w:kern w:val="0"/>
-          <w:sz w:val="36"/>
-          <w:szCs w:val="36"/>
-          <w:lang w:val="en-US" w:eastAsia="zh-CN" w:bidi="hi-IN"/>
-        </w:rPr>
-        <w:t xml:space="preserve">”. </w:t>
-      </w:r>
-    </w:p>
-    <w:p>
-      <w:pPr>
-        <w:pStyle w:val="Normal"/>
-        <w:jc w:val="both"/>
-        <w:rPr>
-          <w:rFonts w:ascii="Garamond" w:hAnsi="Garamond"/>
-          <w:sz w:val="36"/>
-          <w:szCs w:val="36"/>
-        </w:rPr>
-      </w:pPr>
-      <w:r>
-        <w:rPr>
-          <w:rFonts w:ascii="Garamond" w:hAnsi="Garamond"/>
-          <w:sz w:val="36"/>
-          <w:szCs w:val="36"/>
-        </w:rPr>
-      </w:r>
-    </w:p>
-    <w:p>
-      <w:pPr>
-        <w:pStyle w:val="Normal"/>
-        <w:jc w:val="both"/>
-        <w:rPr/>
-      </w:pPr>
-      <w:r>
-        <w:rPr>
-          <w:rFonts w:eastAsia="Arial" w:cs="Arial" w:ascii="Garamond" w:hAnsi="Garamond"/>
-          <w:color w:val="auto"/>
-          <w:kern w:val="0"/>
-          <w:sz w:val="36"/>
-          <w:szCs w:val="36"/>
-          <w:lang w:val="en-US" w:eastAsia="zh-CN" w:bidi="hi-IN"/>
-        </w:rPr>
-        <w:t xml:space="preserve">As poucas palavras de Maria nessa passagem contêm uma síntese da essência da fé cristã: escutar e obedecer ao Cristo. </w:t>
-      </w:r>
-    </w:p>
-    <w:p>
-      <w:pPr>
-        <w:pStyle w:val="Normal"/>
-        <w:jc w:val="both"/>
-        <w:rPr>
-          <w:rFonts w:ascii="Garamond" w:hAnsi="Garamond" w:eastAsia="Arial" w:cs="Arial"/>
-          <w:color w:val="auto"/>
-          <w:kern w:val="0"/>
-          <w:sz w:val="36"/>
-          <w:szCs w:val="36"/>
-          <w:lang w:val="en-US" w:eastAsia="zh-CN" w:bidi="hi-IN"/>
-        </w:rPr>
-      </w:pPr>
-      <w:r>
-        <w:rPr>
-          <w:rFonts w:eastAsia="Arial" w:cs="Arial" w:ascii="Garamond" w:hAnsi="Garamond"/>
-          <w:color w:val="auto"/>
-          <w:kern w:val="0"/>
-          <w:sz w:val="36"/>
-          <w:szCs w:val="36"/>
-          <w:lang w:val="en-US" w:eastAsia="zh-CN" w:bidi="hi-IN"/>
-        </w:rPr>
-      </w:r>
-    </w:p>
-    <w:p>
-      <w:pPr>
-        <w:pStyle w:val="Normal"/>
-        <w:jc w:val="both"/>
-        <w:rPr/>
-      </w:pPr>
-      <w:r>
-        <w:rPr>
-          <w:rFonts w:eastAsia="Arial" w:cs="Arial" w:ascii="Garamond" w:hAnsi="Garamond"/>
-          <w:color w:val="auto"/>
-          <w:kern w:val="0"/>
-          <w:sz w:val="36"/>
-          <w:szCs w:val="36"/>
-          <w:lang w:val="en-US" w:eastAsia="zh-CN" w:bidi="hi-IN"/>
-        </w:rPr>
-        <w:t>E vejam: Maria orienta os servidores a seguirem as instruções de Jesus antes mesmo de saber o que Ele faria. Ela tinha plena confiança no filho. Não sabia como mas tinha certeza de que Ele resolveria o problema.</w:t>
-      </w:r>
-    </w:p>
-    <w:p>
-      <w:pPr>
-        <w:pStyle w:val="Normal"/>
-        <w:jc w:val="both"/>
-        <w:rPr>
-          <w:rFonts w:ascii="Garamond" w:hAnsi="Garamond" w:eastAsia="Arial" w:cs="Arial"/>
-          <w:color w:val="auto"/>
-          <w:kern w:val="0"/>
-          <w:sz w:val="36"/>
-          <w:szCs w:val="36"/>
-          <w:lang w:val="en-US" w:eastAsia="zh-CN" w:bidi="hi-IN"/>
-        </w:rPr>
-      </w:pPr>
-      <w:r>
-        <w:rPr>
-          <w:rFonts w:eastAsia="Arial" w:cs="Arial" w:ascii="Garamond" w:hAnsi="Garamond"/>
-          <w:color w:val="auto"/>
-          <w:kern w:val="0"/>
-          <w:sz w:val="36"/>
-          <w:szCs w:val="36"/>
-          <w:lang w:val="en-US" w:eastAsia="zh-CN" w:bidi="hi-IN"/>
-        </w:rPr>
-      </w:r>
-    </w:p>
-    <w:p>
-      <w:pPr>
-        <w:pStyle w:val="Normal"/>
-        <w:jc w:val="both"/>
-        <w:rPr/>
-      </w:pPr>
-      <w:r>
-        <w:rPr>
-          <w:rFonts w:eastAsia="Arial" w:cs="Arial" w:ascii="Garamond" w:hAnsi="Garamond"/>
-          <w:color w:val="auto"/>
-          <w:kern w:val="0"/>
-          <w:sz w:val="36"/>
-          <w:szCs w:val="36"/>
-          <w:lang w:val="en-US" w:eastAsia="zh-CN" w:bidi="hi-IN"/>
-        </w:rPr>
-        <w:t>E quanto a nós? Sabemos de fato ouvir, obedecer e confiar em Jesus? Se fizermos um exame de consciência verdadeiro veremos que ainda não. É algo que precisamos exercitar muito ainda.</w:t>
-      </w:r>
-    </w:p>
-    <w:p>
-      <w:pPr>
-        <w:pStyle w:val="Normal"/>
-        <w:jc w:val="both"/>
-        <w:rPr>
-          <w:rFonts w:ascii="Garamond" w:hAnsi="Garamond" w:eastAsia="Arial" w:cs="Arial"/>
-          <w:color w:val="auto"/>
-          <w:kern w:val="0"/>
-          <w:sz w:val="36"/>
-          <w:szCs w:val="36"/>
-          <w:lang w:val="en-US" w:eastAsia="zh-CN" w:bidi="hi-IN"/>
-        </w:rPr>
-      </w:pPr>
-      <w:r>
-        <w:rPr>
-          <w:rFonts w:eastAsia="Arial" w:cs="Arial" w:ascii="Garamond" w:hAnsi="Garamond"/>
-          <w:color w:val="auto"/>
-          <w:kern w:val="0"/>
-          <w:sz w:val="36"/>
-          <w:szCs w:val="36"/>
-          <w:lang w:val="en-US" w:eastAsia="zh-CN" w:bidi="hi-IN"/>
-        </w:rPr>
-      </w:r>
-    </w:p>
-    <w:p>
-      <w:pPr>
-        <w:pStyle w:val="Normal"/>
-        <w:jc w:val="both"/>
-        <w:rPr/>
-      </w:pPr>
-      <w:r>
-        <w:rPr>
-          <w:rFonts w:eastAsia="Arial" w:cs="Arial" w:ascii="Garamond" w:hAnsi="Garamond"/>
-          <w:color w:val="auto"/>
-          <w:kern w:val="0"/>
-          <w:sz w:val="36"/>
-          <w:szCs w:val="36"/>
-          <w:lang w:val="en-US" w:eastAsia="zh-CN" w:bidi="hi-IN"/>
-        </w:rPr>
-        <w:t>Quantas vezes nos atormentamos desnecessariamente  por agir de maneira contrária àquilo que nos recomenda o evangelho? E quando a dor bate à nossa porta, lamentamos por termos ignorado as instruções do Mestre.</w:t>
-      </w:r>
-    </w:p>
-    <w:p>
-      <w:pPr>
-        <w:pStyle w:val="Normal"/>
-        <w:jc w:val="both"/>
-        <w:rPr>
-          <w:rFonts w:ascii="Garamond" w:hAnsi="Garamond" w:eastAsia="Arial" w:cs="Arial"/>
-          <w:color w:val="auto"/>
-          <w:kern w:val="0"/>
-          <w:sz w:val="36"/>
-          <w:szCs w:val="36"/>
-          <w:lang w:val="en-US" w:eastAsia="zh-CN" w:bidi="hi-IN"/>
-        </w:rPr>
-      </w:pPr>
-      <w:r>
-        <w:rPr>
-          <w:rFonts w:eastAsia="Arial" w:cs="Arial" w:ascii="Garamond" w:hAnsi="Garamond"/>
-          <w:color w:val="auto"/>
-          <w:kern w:val="0"/>
-          <w:sz w:val="36"/>
-          <w:szCs w:val="36"/>
-          <w:lang w:val="en-US" w:eastAsia="zh-CN" w:bidi="hi-IN"/>
-        </w:rPr>
-      </w:r>
-    </w:p>
-    <w:p>
-      <w:pPr>
-        <w:pStyle w:val="Normal"/>
-        <w:jc w:val="both"/>
-        <w:rPr/>
-      </w:pPr>
-      <w:r>
-        <w:rPr>
-          <w:rFonts w:eastAsia="Arial" w:cs="Arial" w:ascii="Garamond" w:hAnsi="Garamond"/>
-          <w:color w:val="auto"/>
-          <w:kern w:val="0"/>
-          <w:sz w:val="36"/>
-          <w:szCs w:val="36"/>
-          <w:lang w:val="en-US" w:eastAsia="zh-CN" w:bidi="hi-IN"/>
-        </w:rPr>
-        <w:t>Qual será nosso grau de confiança em Jesus hoje, depois de tudo o que temos aprendido, principalmente sob a luz da Doutrina Espírita?</w:t>
-      </w:r>
-    </w:p>
-    <w:p>
-      <w:pPr>
-        <w:pStyle w:val="Normal"/>
-        <w:jc w:val="both"/>
-        <w:rPr>
-          <w:rFonts w:ascii="Garamond" w:hAnsi="Garamond" w:eastAsia="Arial" w:cs="Arial"/>
-          <w:color w:val="auto"/>
-          <w:kern w:val="0"/>
-          <w:sz w:val="36"/>
-          <w:szCs w:val="36"/>
-          <w:lang w:val="en-US" w:eastAsia="zh-CN" w:bidi="hi-IN"/>
-        </w:rPr>
-      </w:pPr>
-      <w:r>
-        <w:rPr>
-          <w:rFonts w:eastAsia="Arial" w:cs="Arial" w:ascii="Garamond" w:hAnsi="Garamond"/>
-          <w:color w:val="auto"/>
-          <w:kern w:val="0"/>
-          <w:sz w:val="36"/>
-          <w:szCs w:val="36"/>
-          <w:lang w:val="en-US" w:eastAsia="zh-CN" w:bidi="hi-IN"/>
-        </w:rPr>
-      </w:r>
-    </w:p>
-    <w:p>
-      <w:pPr>
-        <w:pStyle w:val="Normal"/>
-        <w:jc w:val="both"/>
-        <w:rPr/>
-      </w:pPr>
-      <w:r>
-        <w:rPr>
-          <w:rFonts w:eastAsia="Arial" w:cs="Arial" w:ascii="Garamond" w:hAnsi="Garamond"/>
-          <w:color w:val="auto"/>
-          <w:kern w:val="0"/>
-          <w:sz w:val="36"/>
-          <w:szCs w:val="36"/>
-          <w:lang w:val="en-US" w:eastAsia="zh-CN" w:bidi="hi-IN"/>
-        </w:rPr>
-        <w:t>Somos servidores fiéis que fazem o que o Mestre nos recomenda tendo a certeza de que o resultado será o melhor? Certamente que ainda não.</w:t>
-      </w:r>
-    </w:p>
-    <w:p>
-      <w:pPr>
-        <w:pStyle w:val="Normal"/>
-        <w:jc w:val="both"/>
-        <w:rPr>
-          <w:rFonts w:ascii="Garamond" w:hAnsi="Garamond" w:eastAsia="Arial" w:cs="Arial"/>
-          <w:color w:val="auto"/>
-          <w:kern w:val="0"/>
-          <w:sz w:val="36"/>
-          <w:szCs w:val="36"/>
-          <w:lang w:val="en-US" w:eastAsia="zh-CN" w:bidi="hi-IN"/>
-        </w:rPr>
-      </w:pPr>
-      <w:r>
-        <w:rPr>
-          <w:rFonts w:eastAsia="Arial" w:cs="Arial" w:ascii="Garamond" w:hAnsi="Garamond"/>
-          <w:color w:val="auto"/>
-          <w:kern w:val="0"/>
-          <w:sz w:val="36"/>
-          <w:szCs w:val="36"/>
-          <w:lang w:val="en-US" w:eastAsia="zh-CN" w:bidi="hi-IN"/>
-        </w:rPr>
-      </w:r>
-    </w:p>
-    <w:p>
-      <w:pPr>
-        <w:pStyle w:val="Normal"/>
-        <w:jc w:val="both"/>
-        <w:rPr/>
-      </w:pPr>
-      <w:r>
-        <w:rPr>
-          <w:rFonts w:eastAsia="Arial" w:cs="Arial" w:ascii="Garamond" w:hAnsi="Garamond"/>
-          <w:color w:val="auto"/>
-          <w:kern w:val="0"/>
-          <w:sz w:val="36"/>
-          <w:szCs w:val="36"/>
-          <w:lang w:val="en-US" w:eastAsia="zh-CN" w:bidi="hi-IN"/>
-        </w:rPr>
-        <w:t>Vamos dar um exemplo simples: muitos de nós já colocamos na urna ou no livro de irradiação aqui da FEIG nomes de familiares ou amigos queridos que estavam enfermos.</w:t>
-      </w:r>
-    </w:p>
-    <w:p>
-      <w:pPr>
-        <w:pStyle w:val="Normal"/>
-        <w:jc w:val="both"/>
-        <w:rPr>
-          <w:rFonts w:ascii="Garamond" w:hAnsi="Garamond" w:eastAsia="Arial" w:cs="Arial"/>
-          <w:color w:val="auto"/>
-          <w:kern w:val="0"/>
-          <w:sz w:val="36"/>
-          <w:szCs w:val="36"/>
-          <w:lang w:val="en-US" w:eastAsia="zh-CN" w:bidi="hi-IN"/>
-        </w:rPr>
-      </w:pPr>
-      <w:r>
-        <w:rPr>
-          <w:rFonts w:eastAsia="Arial" w:cs="Arial" w:ascii="Garamond" w:hAnsi="Garamond"/>
-          <w:color w:val="auto"/>
-          <w:kern w:val="0"/>
-          <w:sz w:val="36"/>
-          <w:szCs w:val="36"/>
-          <w:lang w:val="en-US" w:eastAsia="zh-CN" w:bidi="hi-IN"/>
-        </w:rPr>
-      </w:r>
-    </w:p>
-    <w:p>
-      <w:pPr>
-        <w:pStyle w:val="Normal"/>
-        <w:jc w:val="both"/>
-        <w:rPr/>
-      </w:pPr>
-      <w:r>
-        <w:rPr>
-          <w:rFonts w:eastAsia="Arial" w:cs="Arial" w:ascii="Garamond" w:hAnsi="Garamond"/>
-          <w:color w:val="auto"/>
-          <w:kern w:val="0"/>
-          <w:sz w:val="36"/>
-          <w:szCs w:val="36"/>
-          <w:lang w:val="en-US" w:eastAsia="zh-CN" w:bidi="hi-IN"/>
-        </w:rPr>
-        <w:t xml:space="preserve">Nós fazemos isso na incerteza do que acontecerá. Mas a incerteza não é nosso maior problema. Afinal de contas, não há como sabermos de antemão se a pessoa será curada ou não.  Nosso grande problema é que não confiamos plenamente na resposta que Jesus dará ao pedido de ajuda que fizemos. </w:t>
-      </w:r>
-    </w:p>
-    <w:p>
-      <w:pPr>
-        <w:pStyle w:val="Normal"/>
-        <w:jc w:val="both"/>
-        <w:rPr>
-          <w:rFonts w:ascii="Garamond" w:hAnsi="Garamond" w:eastAsia="Arial" w:cs="Arial"/>
-          <w:color w:val="auto"/>
-          <w:kern w:val="0"/>
-          <w:sz w:val="36"/>
-          <w:szCs w:val="36"/>
-          <w:lang w:val="en-US" w:eastAsia="zh-CN" w:bidi="hi-IN"/>
-        </w:rPr>
-      </w:pPr>
-      <w:r>
-        <w:rPr>
-          <w:rFonts w:eastAsia="Arial" w:cs="Arial" w:ascii="Garamond" w:hAnsi="Garamond"/>
-          <w:color w:val="auto"/>
-          <w:kern w:val="0"/>
-          <w:sz w:val="36"/>
-          <w:szCs w:val="36"/>
-          <w:lang w:val="en-US" w:eastAsia="zh-CN" w:bidi="hi-IN"/>
-        </w:rPr>
-      </w:r>
-    </w:p>
-    <w:p>
-      <w:pPr>
-        <w:pStyle w:val="Normal"/>
-        <w:jc w:val="both"/>
-        <w:rPr/>
-      </w:pPr>
-      <w:r>
-        <w:rPr>
-          <w:rFonts w:eastAsia="Arial" w:cs="Arial" w:ascii="Garamond" w:hAnsi="Garamond"/>
-          <w:color w:val="auto"/>
-          <w:kern w:val="0"/>
-          <w:sz w:val="36"/>
-          <w:szCs w:val="36"/>
-          <w:lang w:val="en-US" w:eastAsia="zh-CN" w:bidi="hi-IN"/>
-        </w:rPr>
-        <w:t xml:space="preserve">No fundo o meu desejo é que Jesus permita que a pessoa seja curada: se for assim, então eu confio plenamente n'Ele. Mas, se a doença persistir, se agravar ou se a pessoa vier a desencarnar, minha confiança fica abalada. </w:t>
-      </w:r>
-    </w:p>
-    <w:p>
-      <w:pPr>
-        <w:pStyle w:val="Normal"/>
-        <w:jc w:val="both"/>
-        <w:rPr>
-          <w:rFonts w:ascii="Garamond" w:hAnsi="Garamond" w:eastAsia="Arial" w:cs="Arial"/>
-          <w:color w:val="auto"/>
-          <w:kern w:val="0"/>
-          <w:sz w:val="36"/>
-          <w:szCs w:val="36"/>
-          <w:lang w:val="en-US" w:eastAsia="zh-CN" w:bidi="hi-IN"/>
-        </w:rPr>
-      </w:pPr>
-      <w:r>
-        <w:rPr>
-          <w:rFonts w:eastAsia="Arial" w:cs="Arial" w:ascii="Garamond" w:hAnsi="Garamond"/>
-          <w:color w:val="auto"/>
-          <w:kern w:val="0"/>
-          <w:sz w:val="36"/>
-          <w:szCs w:val="36"/>
-          <w:lang w:val="en-US" w:eastAsia="zh-CN" w:bidi="hi-IN"/>
-        </w:rPr>
-      </w:r>
-    </w:p>
-    <w:p>
-      <w:pPr>
-        <w:pStyle w:val="Normal"/>
-        <w:jc w:val="both"/>
-        <w:rPr/>
-      </w:pPr>
-      <w:r>
-        <w:rPr>
-          <w:rFonts w:eastAsia="Arial" w:cs="Arial" w:ascii="Garamond" w:hAnsi="Garamond"/>
-          <w:color w:val="auto"/>
-          <w:kern w:val="0"/>
-          <w:sz w:val="36"/>
-          <w:szCs w:val="36"/>
-          <w:lang w:val="en-US" w:eastAsia="zh-CN" w:bidi="hi-IN"/>
-        </w:rPr>
-        <w:t xml:space="preserve">Precisamos compreender que a Terra é para nós, lar, oficina de trabalho, hospital de almas e escola. Jesus é nosso Mestre e guia. Portanto, tudo que nos acontece  tem como objetivo nos educar. </w:t>
-      </w:r>
-    </w:p>
-    <w:p>
-      <w:pPr>
-        <w:pStyle w:val="Normal"/>
-        <w:jc w:val="both"/>
-        <w:rPr>
-          <w:rFonts w:ascii="Garamond" w:hAnsi="Garamond" w:eastAsia="Arial" w:cs="Arial"/>
-          <w:color w:val="auto"/>
-          <w:kern w:val="0"/>
-          <w:sz w:val="36"/>
-          <w:szCs w:val="36"/>
-          <w:lang w:val="en-US" w:eastAsia="zh-CN" w:bidi="hi-IN"/>
-        </w:rPr>
-      </w:pPr>
-      <w:r>
-        <w:rPr>
-          <w:rFonts w:eastAsia="Arial" w:cs="Arial" w:ascii="Garamond" w:hAnsi="Garamond"/>
-          <w:color w:val="auto"/>
-          <w:kern w:val="0"/>
-          <w:sz w:val="36"/>
-          <w:szCs w:val="36"/>
-          <w:lang w:val="en-US" w:eastAsia="zh-CN" w:bidi="hi-IN"/>
-        </w:rPr>
-      </w:r>
-    </w:p>
-    <w:p>
-      <w:pPr>
-        <w:pStyle w:val="Normal"/>
-        <w:jc w:val="both"/>
-        <w:rPr>
-          <w:rFonts w:ascii="Garamond" w:hAnsi="Garamond" w:eastAsia="Arial" w:cs="Arial"/>
-          <w:color w:val="auto"/>
-          <w:kern w:val="0"/>
-          <w:sz w:val="36"/>
-          <w:szCs w:val="36"/>
-          <w:lang w:val="en-US" w:eastAsia="zh-CN" w:bidi="hi-IN"/>
-        </w:rPr>
-      </w:pPr>
-      <w:r>
-        <w:rPr>
-          <w:rFonts w:eastAsia="Arial" w:cs="Arial" w:ascii="Garamond" w:hAnsi="Garamond"/>
-          <w:color w:val="auto"/>
-          <w:kern w:val="0"/>
-          <w:sz w:val="36"/>
-          <w:szCs w:val="36"/>
-          <w:lang w:val="en-US" w:eastAsia="zh-CN" w:bidi="hi-IN"/>
-        </w:rPr>
-        <w:t>Reconhecendo nossa condição de alunos, devemos seguir aprendendo e trabalhando com Jesus e para Jesus, confiando sempre que tudo aquilo que fazemos hoje, por mais simples que seja, nos encontrará com justiça no futuro.</w:t>
-      </w:r>
-    </w:p>
-    <w:p>
-      <w:pPr>
-        <w:pStyle w:val="Normal"/>
-        <w:jc w:val="both"/>
-        <w:rPr>
-          <w:rFonts w:ascii="Garamond" w:hAnsi="Garamond" w:eastAsia="Arial" w:cs="Arial"/>
-          <w:color w:val="auto"/>
-          <w:kern w:val="0"/>
-          <w:sz w:val="36"/>
-          <w:szCs w:val="36"/>
-          <w:lang w:val="en-US" w:eastAsia="zh-CN" w:bidi="hi-IN"/>
-        </w:rPr>
-      </w:pPr>
-      <w:r>
-        <w:rPr>
-          <w:rFonts w:eastAsia="Arial" w:cs="Arial" w:ascii="Garamond" w:hAnsi="Garamond"/>
-          <w:color w:val="auto"/>
-          <w:kern w:val="0"/>
-          <w:sz w:val="36"/>
-          <w:szCs w:val="36"/>
-          <w:lang w:val="en-US" w:eastAsia="zh-CN" w:bidi="hi-IN"/>
-        </w:rPr>
-      </w:r>
-    </w:p>
-    <w:p>
-      <w:pPr>
-        <w:pStyle w:val="Normal"/>
-        <w:jc w:val="center"/>
-        <w:rPr>
-          <w:b/>
-          <w:b/>
-          <w:bCs/>
-          <w:color w:val="C9211E"/>
-        </w:rPr>
-      </w:pPr>
-      <w:r>
-        <w:rPr>
-          <w:rFonts w:eastAsia="Arial" w:cs="Arial" w:ascii="Garamond" w:hAnsi="Garamond"/>
-          <w:b/>
-          <w:bCs/>
-          <w:color w:val="C9211E"/>
-          <w:kern w:val="0"/>
-          <w:sz w:val="36"/>
-          <w:szCs w:val="36"/>
-          <w:lang w:val="en-US" w:eastAsia="zh-CN" w:bidi="hi-IN"/>
-        </w:rPr>
-        <w:t xml:space="preserve">Martírio e Crucificação - </w:t>
-      </w:r>
-      <w:r>
-        <w:rPr>
-          <w:rFonts w:eastAsia="Arial" w:cs="Arial" w:ascii="Garamond" w:hAnsi="Garamond"/>
           <w:b/>
           <w:bCs/>
           <w:i w:val="false"/>
           <w:iCs w:val="false"/>
           <w:color w:val="C9211E"/>
-          <w:kern w:val="0"/>
-          <w:sz w:val="36"/>
-          <w:szCs w:val="36"/>
-          <w:lang w:val="en-US" w:eastAsia="zh-CN" w:bidi="hi-IN"/>
-        </w:rPr>
-        <w:t>João 19:17-27</w:t>
-      </w:r>
-    </w:p>
-    <w:p>
-      <w:pPr>
-        <w:pStyle w:val="Normal"/>
-        <w:jc w:val="both"/>
-        <w:rPr>
-          <w:rFonts w:ascii="Garamond" w:hAnsi="Garamond"/>
-          <w:sz w:val="36"/>
-          <w:szCs w:val="36"/>
-        </w:rPr>
-      </w:pPr>
-      <w:r>
+        </w:rPr>
+      </w:r>
+    </w:p>
+    <w:p>
+      <w:pPr>
+        <w:pStyle w:val="Normal"/>
+        <w:jc w:val="both"/>
+        <w:rPr>
+          <w:rFonts w:ascii="Garamond" w:hAnsi="Garamond"/>
+          <w:sz w:val="36"/>
+          <w:szCs w:val="36"/>
+        </w:rPr>
+      </w:pPr>
+      <w:r>
+        <w:rPr>
+          <w:rFonts w:ascii="Garamond" w:hAnsi="Garamond"/>
+          <w:sz w:val="36"/>
+          <w:szCs w:val="36"/>
+        </w:rPr>
+      </w:r>
+    </w:p>
+    <w:p>
+      <w:pPr>
+        <w:pStyle w:val="Normal"/>
+        <w:jc w:val="both"/>
+        <w:rPr>
+          <w:rFonts w:ascii="Garamond" w:hAnsi="Garamond"/>
+          <w:sz w:val="36"/>
+          <w:szCs w:val="36"/>
+        </w:rPr>
+      </w:pPr>
+      <w:r>
+        <w:rPr>
+          <w:rFonts w:ascii="Garamond" w:hAnsi="Garamond"/>
+          <w:sz w:val="36"/>
+          <w:szCs w:val="36"/>
+        </w:rPr>
+        <w:t xml:space="preserve">Nessa passagem </w:t>
+      </w:r>
+      <w:r>
+        <w:rPr>
+          <w:rFonts w:eastAsia="Arial" w:cs="Arial" w:ascii="Garamond" w:hAnsi="Garamond"/>
+          <w:color w:val="auto"/>
+          <w:kern w:val="0"/>
+          <w:sz w:val="36"/>
+          <w:szCs w:val="36"/>
+          <w:lang w:val="en-US" w:eastAsia="zh-CN" w:bidi="hi-IN"/>
+        </w:rPr>
+        <w:t>fica evidente</w:t>
+      </w:r>
+      <w:r>
+        <w:rPr>
+          <w:rFonts w:ascii="Garamond" w:hAnsi="Garamond"/>
+          <w:sz w:val="36"/>
+          <w:szCs w:val="36"/>
+        </w:rPr>
+        <w:t xml:space="preserve"> a confiança que </w:t>
+      </w:r>
+      <w:r>
+        <w:rPr>
+          <w:rFonts w:eastAsia="Arial" w:cs="Arial" w:ascii="Garamond" w:hAnsi="Garamond"/>
+          <w:color w:val="auto"/>
+          <w:kern w:val="0"/>
+          <w:sz w:val="36"/>
+          <w:szCs w:val="36"/>
+          <w:lang w:val="en-US" w:eastAsia="zh-CN" w:bidi="hi-IN"/>
+        </w:rPr>
+        <w:t>Maria</w:t>
+      </w:r>
+      <w:r>
+        <w:rPr>
+          <w:rFonts w:ascii="Garamond" w:hAnsi="Garamond"/>
+          <w:sz w:val="36"/>
+          <w:szCs w:val="36"/>
+        </w:rPr>
+        <w:t xml:space="preserve"> deposita em Jesus.</w:t>
+      </w:r>
+    </w:p>
+    <w:p>
+      <w:pPr>
+        <w:pStyle w:val="Normal"/>
+        <w:jc w:val="both"/>
+        <w:rPr>
+          <w:rFonts w:ascii="Garamond" w:hAnsi="Garamond"/>
+          <w:sz w:val="36"/>
+          <w:szCs w:val="36"/>
+        </w:rPr>
+      </w:pPr>
+      <w:r>
+        <w:rPr>
+          <w:rFonts w:ascii="Garamond" w:hAnsi="Garamond"/>
+          <w:sz w:val="36"/>
+          <w:szCs w:val="36"/>
+        </w:rPr>
+      </w:r>
+    </w:p>
+    <w:p>
+      <w:pPr>
+        <w:pStyle w:val="Normal"/>
+        <w:jc w:val="both"/>
+        <w:rPr>
+          <w:rFonts w:ascii="Garamond" w:hAnsi="Garamond"/>
+          <w:sz w:val="36"/>
+          <w:szCs w:val="36"/>
+        </w:rPr>
+      </w:pPr>
+      <w:r>
+        <w:rPr>
+          <w:rFonts w:eastAsia="Arial" w:cs="Arial" w:ascii="Garamond" w:hAnsi="Garamond"/>
+          <w:color w:val="auto"/>
+          <w:kern w:val="0"/>
+          <w:sz w:val="36"/>
+          <w:szCs w:val="36"/>
+          <w:lang w:val="en-US" w:eastAsia="zh-CN" w:bidi="hi-IN"/>
+        </w:rPr>
+        <w:t>Quando Ela interpela o filho dizendo que o vinho havia acabado Ele responde:</w:t>
+      </w:r>
+    </w:p>
+    <w:p>
+      <w:pPr>
+        <w:pStyle w:val="Normal"/>
+        <w:jc w:val="both"/>
+        <w:rPr>
+          <w:rFonts w:ascii="Garamond" w:hAnsi="Garamond"/>
+          <w:sz w:val="36"/>
+          <w:szCs w:val="36"/>
+        </w:rPr>
+      </w:pPr>
+      <w:r>
+        <w:rPr>
+          <w:rFonts w:ascii="Garamond" w:hAnsi="Garamond"/>
+          <w:sz w:val="36"/>
+          <w:szCs w:val="36"/>
+        </w:rPr>
+      </w:r>
+    </w:p>
+    <w:p>
+      <w:pPr>
+        <w:pStyle w:val="Normal"/>
+        <w:ind w:left="720" w:hanging="0"/>
+        <w:jc w:val="both"/>
+        <w:rPr>
+          <w:rFonts w:ascii="Garamond" w:hAnsi="Garamond"/>
+          <w:sz w:val="36"/>
+          <w:szCs w:val="36"/>
+        </w:rPr>
+      </w:pPr>
+      <w:r>
+        <w:rPr>
+          <w:rFonts w:eastAsia="Arial" w:cs="Arial" w:ascii="Garamond" w:hAnsi="Garamond"/>
+          <w:color w:val="auto"/>
+          <w:kern w:val="0"/>
+          <w:sz w:val="36"/>
+          <w:szCs w:val="36"/>
+          <w:lang w:val="en-US" w:eastAsia="zh-CN" w:bidi="hi-IN"/>
+        </w:rPr>
+        <w:t>“</w:t>
+      </w:r>
+      <w:r>
+        <w:rPr>
+          <w:rFonts w:eastAsia="Arial" w:cs="Arial" w:ascii="Garamond" w:hAnsi="Garamond"/>
+          <w:i/>
+          <w:iCs/>
+          <w:color w:val="auto"/>
+          <w:kern w:val="0"/>
+          <w:sz w:val="36"/>
+          <w:szCs w:val="36"/>
+          <w:lang w:val="en-US" w:eastAsia="zh-CN" w:bidi="hi-IN"/>
+        </w:rPr>
+        <w:t>Mulher, o que queres de mim? Minha hora ainda não chegou</w:t>
+      </w:r>
+      <w:r>
+        <w:rPr>
+          <w:rFonts w:eastAsia="Arial" w:cs="Arial" w:ascii="Garamond" w:hAnsi="Garamond"/>
+          <w:color w:val="auto"/>
+          <w:kern w:val="0"/>
+          <w:sz w:val="36"/>
+          <w:szCs w:val="36"/>
+          <w:lang w:val="en-US" w:eastAsia="zh-CN" w:bidi="hi-IN"/>
+        </w:rPr>
+        <w:t xml:space="preserve">”. </w:t>
+      </w:r>
+    </w:p>
+    <w:p>
+      <w:pPr>
+        <w:pStyle w:val="Normal"/>
+        <w:jc w:val="both"/>
+        <w:rPr>
+          <w:rFonts w:ascii="Garamond" w:hAnsi="Garamond"/>
+          <w:sz w:val="36"/>
+          <w:szCs w:val="36"/>
+        </w:rPr>
+      </w:pPr>
+      <w:r>
+        <w:rPr>
+          <w:rFonts w:ascii="Garamond" w:hAnsi="Garamond"/>
+          <w:sz w:val="36"/>
+          <w:szCs w:val="36"/>
+        </w:rPr>
+      </w:r>
+    </w:p>
+    <w:p>
+      <w:pPr>
+        <w:pStyle w:val="Normal"/>
+        <w:jc w:val="both"/>
+        <w:rPr>
+          <w:rFonts w:ascii="Garamond" w:hAnsi="Garamond"/>
+          <w:sz w:val="36"/>
+          <w:szCs w:val="36"/>
+        </w:rPr>
+      </w:pPr>
+      <w:r>
+        <w:rPr>
+          <w:rFonts w:eastAsia="Arial" w:cs="Arial" w:ascii="Garamond" w:hAnsi="Garamond"/>
+          <w:color w:val="auto"/>
+          <w:kern w:val="0"/>
+          <w:sz w:val="36"/>
+          <w:szCs w:val="36"/>
+          <w:lang w:val="en-US" w:eastAsia="zh-CN" w:bidi="hi-IN"/>
+        </w:rPr>
+        <w:t>Como tantas mães que conhecem bem os filhos, ela não se deixa abalar pela negativa inicial e  diz aos servidores da casa:</w:t>
+      </w:r>
+    </w:p>
+    <w:p>
+      <w:pPr>
+        <w:pStyle w:val="Normal"/>
+        <w:jc w:val="both"/>
+        <w:rPr>
+          <w:rFonts w:ascii="Garamond" w:hAnsi="Garamond"/>
+          <w:sz w:val="36"/>
+          <w:szCs w:val="36"/>
+        </w:rPr>
+      </w:pPr>
+      <w:r>
+        <w:rPr>
+          <w:rFonts w:ascii="Garamond" w:hAnsi="Garamond"/>
+          <w:sz w:val="36"/>
+          <w:szCs w:val="36"/>
+        </w:rPr>
+      </w:r>
+    </w:p>
+    <w:p>
+      <w:pPr>
+        <w:pStyle w:val="Normal"/>
+        <w:ind w:left="720" w:hanging="0"/>
+        <w:jc w:val="both"/>
+        <w:rPr>
+          <w:rFonts w:ascii="Garamond" w:hAnsi="Garamond"/>
+          <w:sz w:val="36"/>
+          <w:szCs w:val="36"/>
+        </w:rPr>
+      </w:pPr>
+      <w:r>
+        <w:rPr>
+          <w:rFonts w:eastAsia="Arial" w:cs="Arial" w:ascii="Garamond" w:hAnsi="Garamond"/>
+          <w:color w:val="auto"/>
+          <w:kern w:val="0"/>
+          <w:sz w:val="36"/>
+          <w:szCs w:val="36"/>
+          <w:lang w:val="en-US" w:eastAsia="zh-CN" w:bidi="hi-IN"/>
+        </w:rPr>
+        <w:t>“</w:t>
+      </w:r>
+      <w:r>
+        <w:rPr>
+          <w:rFonts w:eastAsia="Arial" w:cs="Arial" w:ascii="Garamond" w:hAnsi="Garamond"/>
+          <w:i/>
+          <w:iCs/>
+          <w:color w:val="auto"/>
+          <w:kern w:val="0"/>
+          <w:sz w:val="36"/>
+          <w:szCs w:val="36"/>
+          <w:lang w:val="en-US" w:eastAsia="zh-CN" w:bidi="hi-IN"/>
+        </w:rPr>
+        <w:t>Fazei o que ele vos disser</w:t>
+      </w:r>
+      <w:r>
+        <w:rPr>
+          <w:rFonts w:eastAsia="Arial" w:cs="Arial" w:ascii="Garamond" w:hAnsi="Garamond"/>
+          <w:color w:val="auto"/>
+          <w:kern w:val="0"/>
+          <w:sz w:val="36"/>
+          <w:szCs w:val="36"/>
+          <w:lang w:val="en-US" w:eastAsia="zh-CN" w:bidi="hi-IN"/>
+        </w:rPr>
+        <w:t xml:space="preserve">”. </w:t>
+      </w:r>
+    </w:p>
+    <w:p>
+      <w:pPr>
+        <w:pStyle w:val="Normal"/>
+        <w:jc w:val="both"/>
+        <w:rPr>
+          <w:rFonts w:ascii="Garamond" w:hAnsi="Garamond"/>
+          <w:sz w:val="36"/>
+          <w:szCs w:val="36"/>
+        </w:rPr>
+      </w:pPr>
+      <w:r>
+        <w:rPr>
+          <w:rFonts w:ascii="Garamond" w:hAnsi="Garamond"/>
+          <w:sz w:val="36"/>
+          <w:szCs w:val="36"/>
+        </w:rPr>
+      </w:r>
+    </w:p>
+    <w:p>
+      <w:pPr>
+        <w:pStyle w:val="Normal"/>
+        <w:jc w:val="both"/>
         <w:rPr/>
-      </w:r>
-    </w:p>
-    <w:p>
-      <w:pPr>
-        <w:pStyle w:val="Normal"/>
-        <w:jc w:val="both"/>
-        <w:rPr>
-          <w:rFonts w:ascii="Garamond" w:hAnsi="Garamond"/>
-          <w:sz w:val="36"/>
-          <w:szCs w:val="36"/>
-        </w:rPr>
-      </w:pPr>
-      <w:r>
-        <w:rPr>
-          <w:rFonts w:ascii="Garamond" w:hAnsi="Garamond"/>
-          <w:sz w:val="36"/>
-          <w:szCs w:val="36"/>
-        </w:rPr>
-      </w:r>
-    </w:p>
-    <w:p>
-      <w:pPr>
-        <w:pStyle w:val="Normal"/>
-        <w:jc w:val="both"/>
-        <w:rPr>
-          <w:rFonts w:ascii="Garamond" w:hAnsi="Garamond"/>
-          <w:sz w:val="36"/>
-          <w:szCs w:val="36"/>
-        </w:rPr>
-      </w:pPr>
-      <w:r>
-        <w:rPr>
-          <w:rFonts w:eastAsia="Times New Roman" w:cs="Times New Roman" w:ascii="Garamond" w:hAnsi="Garamond"/>
-          <w:color w:val="000000"/>
-          <w:kern w:val="0"/>
-          <w:sz w:val="36"/>
-          <w:szCs w:val="36"/>
-          <w:shd w:fill="auto" w:val="clear"/>
-          <w:lang w:val="en-US" w:eastAsia="zh-CN" w:bidi="hi-IN"/>
-        </w:rPr>
-        <w:t>Ao pé da cruz, Maria nos oferece um dos testemunhos mais profundos de amor, fidelidade e entrega silenciosa</w:t>
-      </w:r>
-      <w:r>
-        <w:rPr>
-          <w:rFonts w:eastAsia="Times New Roman" w:cs="Times New Roman" w:ascii="Garamond" w:hAnsi="Garamond"/>
-          <w:color w:val="000000"/>
-          <w:kern w:val="0"/>
-          <w:sz w:val="36"/>
-          <w:szCs w:val="36"/>
-          <w:shd w:fill="auto" w:val="clear"/>
-          <w:lang w:val="en-US" w:eastAsia="zh-CN" w:bidi="hi-IN"/>
-        </w:rPr>
-        <w:t>.</w:t>
-      </w:r>
-      <w:r>
-        <w:rPr>
-          <w:rFonts w:eastAsia="Times New Roman" w:cs="Times New Roman" w:ascii="Garamond" w:hAnsi="Garamond"/>
-          <w:color w:val="000000"/>
-          <w:kern w:val="0"/>
-          <w:sz w:val="36"/>
-          <w:szCs w:val="36"/>
-          <w:shd w:fill="auto" w:val="clear"/>
-          <w:lang w:val="en-US" w:eastAsia="zh-CN" w:bidi="hi-IN"/>
-        </w:rPr>
-        <w:t xml:space="preserve"> Diante do sofrimento indescritível do Filho, ela não se esconde</w:t>
-      </w:r>
-      <w:r>
-        <w:rPr>
-          <w:rFonts w:eastAsia="Times New Roman" w:cs="Times New Roman" w:ascii="Garamond" w:hAnsi="Garamond"/>
-          <w:color w:val="000000"/>
-          <w:kern w:val="0"/>
-          <w:sz w:val="36"/>
-          <w:szCs w:val="36"/>
-          <w:shd w:fill="auto" w:val="clear"/>
-          <w:lang w:val="en-US" w:eastAsia="zh-CN" w:bidi="hi-IN"/>
-        </w:rPr>
-        <w:t xml:space="preserve">, não </w:t>
-      </w:r>
-      <w:r>
-        <w:rPr>
-          <w:rFonts w:eastAsia="Times New Roman" w:cs="Times New Roman" w:ascii="Garamond" w:hAnsi="Garamond"/>
-          <w:color w:val="000000"/>
-          <w:kern w:val="0"/>
-          <w:sz w:val="36"/>
-          <w:szCs w:val="36"/>
-          <w:shd w:fill="auto" w:val="clear"/>
-          <w:lang w:val="en-US" w:eastAsia="zh-CN" w:bidi="hi-IN"/>
-        </w:rPr>
-        <w:t>desespera</w:t>
-      </w:r>
-      <w:r>
-        <w:rPr>
-          <w:rFonts w:eastAsia="Times New Roman" w:cs="Times New Roman" w:ascii="Garamond" w:hAnsi="Garamond"/>
-          <w:color w:val="000000"/>
-          <w:kern w:val="0"/>
-          <w:sz w:val="36"/>
-          <w:szCs w:val="36"/>
-          <w:shd w:fill="auto" w:val="clear"/>
-          <w:lang w:val="en-US" w:eastAsia="zh-CN" w:bidi="hi-IN"/>
-        </w:rPr>
-        <w:t>,</w:t>
-      </w:r>
-      <w:r>
-        <w:rPr>
-          <w:rFonts w:eastAsia="Times New Roman" w:cs="Times New Roman" w:ascii="Garamond" w:hAnsi="Garamond"/>
-          <w:color w:val="000000"/>
-          <w:kern w:val="0"/>
-          <w:sz w:val="36"/>
-          <w:szCs w:val="36"/>
-          <w:shd w:fill="auto" w:val="clear"/>
-          <w:lang w:val="en-US" w:eastAsia="zh-CN" w:bidi="hi-IN"/>
-        </w:rPr>
-        <w:t xml:space="preserve"> não reclama. </w:t>
-      </w:r>
-      <w:r>
-        <w:rPr>
-          <w:rFonts w:eastAsia="Times New Roman" w:cs="Times New Roman" w:ascii="Garamond" w:hAnsi="Garamond"/>
-          <w:color w:val="000000"/>
-          <w:kern w:val="0"/>
-          <w:sz w:val="36"/>
-          <w:szCs w:val="36"/>
-          <w:shd w:fill="auto" w:val="clear"/>
-          <w:lang w:val="en-US" w:eastAsia="zh-CN" w:bidi="hi-IN"/>
-        </w:rPr>
-        <w:t>Ali p</w:t>
-      </w:r>
-      <w:r>
-        <w:rPr>
-          <w:rFonts w:eastAsia="Times New Roman" w:cs="Times New Roman" w:ascii="Garamond" w:hAnsi="Garamond"/>
-          <w:color w:val="000000"/>
-          <w:kern w:val="0"/>
-          <w:sz w:val="36"/>
-          <w:szCs w:val="36"/>
-          <w:shd w:fill="auto" w:val="clear"/>
-          <w:lang w:val="en-US" w:eastAsia="zh-CN" w:bidi="hi-IN"/>
-        </w:rPr>
-        <w:t>ermanece</w:t>
-      </w:r>
-      <w:r>
-        <w:rPr>
-          <w:rFonts w:eastAsia="Times New Roman" w:cs="Times New Roman" w:ascii="Garamond" w:hAnsi="Garamond"/>
-          <w:color w:val="000000"/>
-          <w:kern w:val="0"/>
-          <w:sz w:val="36"/>
-          <w:szCs w:val="36"/>
-          <w:shd w:fill="auto" w:val="clear"/>
-          <w:lang w:val="en-US" w:eastAsia="zh-CN" w:bidi="hi-IN"/>
-        </w:rPr>
-        <w:t xml:space="preserve"> de maneira</w:t>
-      </w:r>
-      <w:r>
-        <w:rPr>
-          <w:rFonts w:eastAsia="Times New Roman" w:cs="Times New Roman" w:ascii="Garamond" w:hAnsi="Garamond"/>
-          <w:color w:val="000000"/>
-          <w:kern w:val="0"/>
-          <w:sz w:val="36"/>
-          <w:szCs w:val="36"/>
-          <w:shd w:fill="auto" w:val="clear"/>
-          <w:lang w:val="en-US" w:eastAsia="zh-CN" w:bidi="hi-IN"/>
-        </w:rPr>
-        <w:t xml:space="preserve"> firme, serena</w:t>
-      </w:r>
-      <w:r>
-        <w:rPr>
-          <w:rFonts w:eastAsia="Times New Roman" w:cs="Times New Roman" w:ascii="Garamond" w:hAnsi="Garamond"/>
-          <w:color w:val="000000"/>
-          <w:kern w:val="0"/>
-          <w:sz w:val="36"/>
-          <w:szCs w:val="36"/>
-          <w:shd w:fill="auto" w:val="clear"/>
-          <w:lang w:val="en-US" w:eastAsia="zh-CN" w:bidi="hi-IN"/>
-        </w:rPr>
-        <w:t xml:space="preserve"> e </w:t>
-      </w:r>
-      <w:r>
-        <w:rPr>
-          <w:rFonts w:eastAsia="Times New Roman" w:cs="Times New Roman" w:ascii="Garamond" w:hAnsi="Garamond"/>
-          <w:color w:val="000000"/>
-          <w:kern w:val="0"/>
-          <w:sz w:val="36"/>
-          <w:szCs w:val="36"/>
-          <w:shd w:fill="auto" w:val="clear"/>
-          <w:lang w:val="en-US" w:eastAsia="zh-CN" w:bidi="hi-IN"/>
-        </w:rPr>
-        <w:t xml:space="preserve">corajosa. </w:t>
-      </w:r>
-    </w:p>
-    <w:p>
-      <w:pPr>
-        <w:pStyle w:val="Normal"/>
-        <w:jc w:val="both"/>
-        <w:rPr>
-          <w:rFonts w:ascii="Garamond" w:hAnsi="Garamond"/>
-          <w:sz w:val="36"/>
-          <w:szCs w:val="36"/>
-        </w:rPr>
-      </w:pPr>
-      <w:r>
-        <w:rPr>
-          <w:rFonts w:ascii="Garamond" w:hAnsi="Garamond"/>
-          <w:sz w:val="36"/>
-          <w:szCs w:val="36"/>
-        </w:rPr>
-      </w:r>
-    </w:p>
-    <w:p>
-      <w:pPr>
-        <w:pStyle w:val="Normal"/>
-        <w:jc w:val="both"/>
-        <w:rPr>
-          <w:rFonts w:ascii="Garamond" w:hAnsi="Garamond"/>
-          <w:sz w:val="36"/>
-          <w:szCs w:val="36"/>
-        </w:rPr>
-      </w:pPr>
-      <w:r>
-        <w:rPr>
-          <w:rFonts w:eastAsia="Times New Roman" w:cs="Times New Roman" w:ascii="Garamond" w:hAnsi="Garamond"/>
-          <w:color w:val="000000"/>
-          <w:kern w:val="0"/>
-          <w:sz w:val="36"/>
-          <w:szCs w:val="36"/>
-          <w:shd w:fill="auto" w:val="clear"/>
-          <w:lang w:val="en-US" w:eastAsia="zh-CN" w:bidi="hi-IN"/>
-        </w:rPr>
-        <w:t xml:space="preserve">Ela não julga os responsáveis pela morte de Jesus, tampouco os líderes que decretaram sua sentença; não acusa os soldados que o pregaram na cruz, muito menos </w:t>
-      </w:r>
-      <w:r>
-        <w:rPr>
-          <w:rFonts w:eastAsia="Times New Roman" w:cs="Times New Roman" w:ascii="Garamond" w:hAnsi="Garamond"/>
-          <w:color w:val="000000"/>
-          <w:kern w:val="0"/>
-          <w:sz w:val="36"/>
-          <w:szCs w:val="36"/>
-          <w:shd w:fill="auto" w:val="clear"/>
-          <w:lang w:val="en-US" w:eastAsia="zh-CN" w:bidi="hi-IN"/>
-        </w:rPr>
-        <w:t>aqueles</w:t>
-      </w:r>
-      <w:r>
-        <w:rPr>
-          <w:rFonts w:eastAsia="Times New Roman" w:cs="Times New Roman" w:ascii="Garamond" w:hAnsi="Garamond"/>
-          <w:color w:val="000000"/>
-          <w:kern w:val="0"/>
-          <w:sz w:val="36"/>
-          <w:szCs w:val="36"/>
-          <w:shd w:fill="auto" w:val="clear"/>
-          <w:lang w:val="en-US" w:eastAsia="zh-CN" w:bidi="hi-IN"/>
-        </w:rPr>
-        <w:t xml:space="preserve"> que, mesmo tendo </w:t>
-      </w:r>
-      <w:r>
-        <w:rPr>
-          <w:rFonts w:eastAsia="Times New Roman" w:cs="Times New Roman" w:ascii="Garamond" w:hAnsi="Garamond"/>
-          <w:color w:val="000000"/>
-          <w:kern w:val="0"/>
-          <w:sz w:val="36"/>
-          <w:szCs w:val="36"/>
-          <w:shd w:fill="auto" w:val="clear"/>
-          <w:lang w:val="en-US" w:eastAsia="zh-CN" w:bidi="hi-IN"/>
-        </w:rPr>
-        <w:t xml:space="preserve">sido auxiliados por Jesus. </w:t>
-      </w:r>
-      <w:r>
-        <w:rPr>
-          <w:rFonts w:eastAsia="Times New Roman" w:cs="Times New Roman" w:ascii="Garamond" w:hAnsi="Garamond"/>
-          <w:color w:val="000000"/>
-          <w:kern w:val="0"/>
-          <w:sz w:val="36"/>
-          <w:szCs w:val="36"/>
-          <w:shd w:fill="auto" w:val="clear"/>
-          <w:lang w:val="en-US" w:eastAsia="zh-CN" w:bidi="hi-IN"/>
-        </w:rPr>
-        <w:t>Maria demonstra a virtude de quem sabe que o amor verdadeiro não recua diante da dor.</w:t>
-      </w:r>
-    </w:p>
-    <w:p>
-      <w:pPr>
-        <w:pStyle w:val="Normal"/>
-        <w:jc w:val="both"/>
-        <w:rPr>
-          <w:rFonts w:ascii="Garamond" w:hAnsi="Garamond"/>
-          <w:sz w:val="36"/>
-          <w:szCs w:val="36"/>
-        </w:rPr>
-      </w:pPr>
-      <w:r>
-        <w:rPr>
-          <w:rFonts w:ascii="Garamond" w:hAnsi="Garamond"/>
-          <w:sz w:val="36"/>
-          <w:szCs w:val="36"/>
-        </w:rPr>
-      </w:r>
-    </w:p>
-    <w:p>
-      <w:pPr>
-        <w:pStyle w:val="Normal"/>
-        <w:jc w:val="both"/>
-        <w:rPr>
-          <w:rFonts w:ascii="Garamond" w:hAnsi="Garamond"/>
-          <w:sz w:val="36"/>
-          <w:szCs w:val="36"/>
-        </w:rPr>
-      </w:pPr>
-      <w:r>
-        <w:rPr>
-          <w:rFonts w:eastAsia="Times New Roman" w:cs="Times New Roman" w:ascii="Garamond" w:hAnsi="Garamond"/>
-          <w:color w:val="000000"/>
-          <w:kern w:val="0"/>
-          <w:sz w:val="36"/>
-          <w:szCs w:val="36"/>
-          <w:shd w:fill="auto" w:val="clear"/>
-          <w:lang w:val="en-US" w:eastAsia="zh-CN" w:bidi="hi-IN"/>
-        </w:rPr>
-        <w:t xml:space="preserve">Ali Maria </w:t>
-      </w:r>
-      <w:r>
-        <w:rPr>
-          <w:rFonts w:eastAsia="Times New Roman" w:cs="Times New Roman" w:ascii="Garamond" w:hAnsi="Garamond"/>
-          <w:color w:val="000000"/>
-          <w:kern w:val="0"/>
-          <w:sz w:val="36"/>
-          <w:szCs w:val="36"/>
-          <w:shd w:fill="auto" w:val="clear"/>
-          <w:lang w:val="en-US" w:eastAsia="zh-CN" w:bidi="hi-IN"/>
-        </w:rPr>
-        <w:t xml:space="preserve">reafirma sua fidelidade à vontade divina. Se em Belém ela recebeu Jesus nos braços, agora, no Calvário, ela O entrega de volta ao Pai — com a mesma humildade, com o mesmo espírito de serviço. Sua renúncia não é apenas materna, é espiritual. </w:t>
-      </w:r>
-    </w:p>
-    <w:p>
-      <w:pPr>
-        <w:pStyle w:val="Normal"/>
-        <w:jc w:val="both"/>
-        <w:rPr>
-          <w:rFonts w:ascii="Garamond" w:hAnsi="Garamond"/>
-          <w:sz w:val="36"/>
-          <w:szCs w:val="36"/>
-        </w:rPr>
-      </w:pPr>
-      <w:r>
-        <w:rPr>
-          <w:rFonts w:ascii="Garamond" w:hAnsi="Garamond"/>
-          <w:sz w:val="36"/>
-          <w:szCs w:val="36"/>
-        </w:rPr>
-      </w:r>
-    </w:p>
-    <w:p>
-      <w:pPr>
-        <w:pStyle w:val="Normal"/>
-        <w:jc w:val="both"/>
-        <w:rPr>
-          <w:rFonts w:ascii="Garamond" w:hAnsi="Garamond"/>
-          <w:sz w:val="36"/>
-          <w:szCs w:val="36"/>
-        </w:rPr>
-      </w:pPr>
-      <w:r>
-        <w:rPr>
-          <w:rFonts w:eastAsia="Times New Roman" w:cs="Times New Roman" w:ascii="Garamond" w:hAnsi="Garamond"/>
-          <w:color w:val="000000"/>
-          <w:kern w:val="0"/>
-          <w:sz w:val="36"/>
-          <w:szCs w:val="36"/>
-          <w:shd w:fill="auto" w:val="clear"/>
-          <w:lang w:val="en-US" w:eastAsia="zh-CN" w:bidi="hi-IN"/>
-        </w:rPr>
-        <w:t xml:space="preserve">Ao confiar-lhe João como filho, Jesus estende a maternidade de Maria à humanidade inteira e nos ensina que o amor verdadeiro procede não apenas dos laços consanguíneos, mas, sim, da nossa herança divina. </w:t>
-      </w:r>
-      <w:r>
-        <w:rPr>
-          <w:rFonts w:eastAsia="Times New Roman" w:cs="Times New Roman" w:ascii="Garamond" w:hAnsi="Garamond"/>
-          <w:color w:val="000000"/>
-          <w:kern w:val="0"/>
-          <w:sz w:val="36"/>
-          <w:szCs w:val="36"/>
-          <w:shd w:fill="auto" w:val="clear"/>
-          <w:lang w:val="en-US" w:eastAsia="zh-CN" w:bidi="hi-IN"/>
-        </w:rPr>
-        <w:t xml:space="preserve">Apesar da enorme dor, Maria </w:t>
-      </w:r>
-      <w:r>
-        <w:rPr>
-          <w:rFonts w:eastAsia="Times New Roman" w:cs="Times New Roman" w:ascii="Garamond" w:hAnsi="Garamond"/>
-          <w:color w:val="000000"/>
-          <w:kern w:val="0"/>
-          <w:sz w:val="36"/>
-          <w:szCs w:val="36"/>
-          <w:shd w:fill="auto" w:val="clear"/>
-          <w:lang w:val="en-US" w:eastAsia="zh-CN" w:bidi="hi-IN"/>
-        </w:rPr>
-        <w:t xml:space="preserve">não recusa a nova incumbência. </w:t>
-      </w:r>
-    </w:p>
-    <w:p>
-      <w:pPr>
-        <w:pStyle w:val="Normal"/>
-        <w:jc w:val="both"/>
-        <w:rPr>
-          <w:rFonts w:ascii="Garamond" w:hAnsi="Garamond"/>
-          <w:sz w:val="36"/>
-          <w:szCs w:val="36"/>
-        </w:rPr>
-      </w:pPr>
-      <w:r>
+      </w:pPr>
+      <w:r>
+        <w:rPr>
+          <w:rFonts w:eastAsia="Arial" w:cs="Arial" w:ascii="Garamond" w:hAnsi="Garamond"/>
+          <w:color w:val="auto"/>
+          <w:kern w:val="0"/>
+          <w:sz w:val="36"/>
+          <w:szCs w:val="36"/>
+          <w:lang w:val="en-US" w:eastAsia="zh-CN" w:bidi="hi-IN"/>
+        </w:rPr>
+        <w:t xml:space="preserve">Essa frase, embora curta, é a essência da fé cristã: escutar e obedecer ao Cristo. </w:t>
+      </w:r>
+    </w:p>
+    <w:p>
+      <w:pPr>
+        <w:pStyle w:val="Normal"/>
+        <w:jc w:val="both"/>
+        <w:rPr>
+          <w:rFonts w:ascii="Garamond" w:hAnsi="Garamond" w:eastAsia="Arial" w:cs="Arial"/>
+          <w:color w:val="auto"/>
+          <w:kern w:val="0"/>
+          <w:sz w:val="36"/>
+          <w:szCs w:val="36"/>
+          <w:lang w:val="en-US" w:eastAsia="zh-CN" w:bidi="hi-IN"/>
+        </w:rPr>
+      </w:pPr>
+      <w:r>
+        <w:rPr>
+          <w:rFonts w:eastAsia="Arial" w:cs="Arial" w:ascii="Garamond" w:hAnsi="Garamond"/>
+          <w:color w:val="auto"/>
+          <w:kern w:val="0"/>
+          <w:sz w:val="36"/>
+          <w:szCs w:val="36"/>
+          <w:lang w:val="en-US" w:eastAsia="zh-CN" w:bidi="hi-IN"/>
+        </w:rPr>
+      </w:r>
+    </w:p>
+    <w:p>
+      <w:pPr>
+        <w:pStyle w:val="Normal"/>
+        <w:jc w:val="both"/>
         <w:rPr/>
-      </w:r>
-    </w:p>
-    <w:p>
-      <w:pPr>
-        <w:pStyle w:val="Normal"/>
-        <w:jc w:val="both"/>
-        <w:rPr>
-          <w:rFonts w:ascii="Garamond" w:hAnsi="Garamond"/>
-          <w:sz w:val="36"/>
-          <w:szCs w:val="36"/>
-        </w:rPr>
-      </w:pPr>
-      <w:r>
-        <w:rPr>
-          <w:rFonts w:eastAsia="Times New Roman" w:cs="Times New Roman" w:ascii="Garamond" w:hAnsi="Garamond"/>
-          <w:color w:val="000000"/>
-          <w:kern w:val="0"/>
-          <w:sz w:val="36"/>
-          <w:szCs w:val="36"/>
-          <w:shd w:fill="auto" w:val="clear"/>
-          <w:lang w:val="en-US" w:eastAsia="zh-CN" w:bidi="hi-IN"/>
-        </w:rPr>
-        <w:t xml:space="preserve">Seu silêncio </w:t>
-      </w:r>
-      <w:r>
-        <w:rPr>
-          <w:rFonts w:eastAsia="Times New Roman" w:cs="Times New Roman" w:ascii="Garamond" w:hAnsi="Garamond"/>
-          <w:color w:val="000000"/>
-          <w:kern w:val="0"/>
-          <w:sz w:val="36"/>
-          <w:szCs w:val="36"/>
-          <w:shd w:fill="auto" w:val="clear"/>
-          <w:lang w:val="en-US" w:eastAsia="zh-CN" w:bidi="hi-IN"/>
-        </w:rPr>
-        <w:t xml:space="preserve">naquela hora </w:t>
-      </w:r>
-      <w:r>
-        <w:rPr>
-          <w:rFonts w:eastAsia="Times New Roman" w:cs="Times New Roman" w:ascii="Garamond" w:hAnsi="Garamond"/>
-          <w:color w:val="000000"/>
-          <w:kern w:val="0"/>
-          <w:sz w:val="36"/>
-          <w:szCs w:val="36"/>
-          <w:shd w:fill="auto" w:val="clear"/>
-          <w:lang w:val="en-US" w:eastAsia="zh-CN" w:bidi="hi-IN"/>
-        </w:rPr>
-        <w:t>ensina-nos que o verdadeiro serviço ao bem não se interrompe diante do sofrimento, mas nele encontra nova expressão. Maria continua a servir, porque o serviço, para ela, é expressão natural do amor.</w:t>
-      </w:r>
-    </w:p>
-    <w:p>
-      <w:pPr>
-        <w:pStyle w:val="Normal"/>
-        <w:jc w:val="both"/>
-        <w:rPr>
-          <w:rFonts w:ascii="Garamond" w:hAnsi="Garamond"/>
-          <w:sz w:val="36"/>
-          <w:szCs w:val="36"/>
-        </w:rPr>
-      </w:pPr>
-      <w:r>
-        <w:rPr>
-          <w:rFonts w:ascii="Garamond" w:hAnsi="Garamond"/>
-          <w:sz w:val="36"/>
-          <w:szCs w:val="36"/>
-        </w:rPr>
-      </w:r>
-    </w:p>
-    <w:p>
-      <w:pPr>
-        <w:pStyle w:val="Normal"/>
-        <w:jc w:val="both"/>
-        <w:rPr>
-          <w:rFonts w:ascii="Garamond" w:hAnsi="Garamond"/>
-          <w:sz w:val="36"/>
-          <w:szCs w:val="36"/>
-        </w:rPr>
-      </w:pPr>
-      <w:r>
-        <w:rPr>
-          <w:rFonts w:ascii="Garamond" w:hAnsi="Garamond"/>
-          <w:sz w:val="36"/>
-          <w:szCs w:val="36"/>
-        </w:rPr>
-        <w:t>A grandeza de espírito demonstrada por Maria ao pé da cruz é tamanha que nos faz hesitar diante da ideia de seguir seus passos. Ainda assim, somos convidados a refletir sobre como trazer seu testemunho de fé e amor para o cotidiano de nossas vidas. Que atitudes concretas podemos tomar para nos inspirar em seu exemplo?</w:t>
-      </w:r>
-    </w:p>
-    <w:p>
-      <w:pPr>
-        <w:pStyle w:val="Normal"/>
-        <w:jc w:val="both"/>
-        <w:rPr>
-          <w:rFonts w:ascii="Garamond" w:hAnsi="Garamond"/>
-          <w:sz w:val="36"/>
-          <w:szCs w:val="36"/>
-        </w:rPr>
-      </w:pPr>
-      <w:r>
-        <w:rPr>
-          <w:rFonts w:ascii="Garamond" w:hAnsi="Garamond"/>
-          <w:sz w:val="36"/>
-          <w:szCs w:val="36"/>
-        </w:rPr>
-      </w:r>
-    </w:p>
-    <w:p>
-      <w:pPr>
-        <w:pStyle w:val="Normal"/>
-        <w:jc w:val="both"/>
-        <w:rPr>
-          <w:rFonts w:ascii="Garamond" w:hAnsi="Garamond"/>
-          <w:sz w:val="36"/>
-          <w:szCs w:val="36"/>
-        </w:rPr>
-      </w:pPr>
-      <w:r>
-        <w:rPr>
-          <w:rFonts w:ascii="Garamond" w:hAnsi="Garamond"/>
-          <w:sz w:val="36"/>
-          <w:szCs w:val="36"/>
-        </w:rPr>
-        <w:t>A primeira delas é a resignação. Maria sabia que Jesus não merecia o sofrimento que lhe foi imposto, mas aceitou-o ao entender que aquela era a vontade de Deus. Talvez não compreendesse plenamente os propósitos divinos por trás de tanta dor, mas tinha a confiança de que tudo ocorria segundo os desígnios do Pai.</w:t>
-      </w:r>
-    </w:p>
-    <w:p>
-      <w:pPr>
-        <w:pStyle w:val="Normal"/>
-        <w:jc w:val="both"/>
-        <w:rPr>
-          <w:rFonts w:ascii="Garamond" w:hAnsi="Garamond"/>
-          <w:sz w:val="36"/>
-          <w:szCs w:val="36"/>
-        </w:rPr>
-      </w:pPr>
-      <w:r>
-        <w:rPr>
-          <w:rFonts w:ascii="Garamond" w:hAnsi="Garamond"/>
-          <w:sz w:val="36"/>
-          <w:szCs w:val="36"/>
-        </w:rPr>
-      </w:r>
-    </w:p>
-    <w:p>
-      <w:pPr>
-        <w:pStyle w:val="Normal"/>
-        <w:jc w:val="both"/>
-        <w:rPr>
-          <w:rFonts w:ascii="Garamond" w:hAnsi="Garamond"/>
-          <w:sz w:val="36"/>
-          <w:szCs w:val="36"/>
-        </w:rPr>
-      </w:pPr>
-      <w:r>
-        <w:rPr>
-          <w:rFonts w:ascii="Garamond" w:hAnsi="Garamond"/>
-          <w:sz w:val="36"/>
-          <w:szCs w:val="36"/>
-        </w:rPr>
-        <w:t>Muitas vezes, enfrentamos situações em que nós mesmos — ou alguém que amamos — sofre, aparentemente sem motivo. Apesar dos esforços, da ajuda recebida e de nossas orações, a dor persiste. Nessas horas, é natural que nossa fé se abale e que surjam questionamentos sobre a justiça divina.</w:t>
-      </w:r>
-    </w:p>
-    <w:p>
-      <w:pPr>
-        <w:pStyle w:val="Normal"/>
-        <w:jc w:val="both"/>
-        <w:rPr>
-          <w:rFonts w:ascii="Garamond" w:hAnsi="Garamond"/>
-          <w:sz w:val="36"/>
-          <w:szCs w:val="36"/>
-        </w:rPr>
-      </w:pPr>
-      <w:r>
-        <w:rPr>
-          <w:rFonts w:ascii="Garamond" w:hAnsi="Garamond"/>
-          <w:sz w:val="36"/>
-          <w:szCs w:val="36"/>
-        </w:rPr>
-      </w:r>
-    </w:p>
-    <w:p>
-      <w:pPr>
-        <w:pStyle w:val="Normal"/>
-        <w:jc w:val="both"/>
-        <w:rPr>
-          <w:rFonts w:ascii="Garamond" w:hAnsi="Garamond"/>
-          <w:sz w:val="36"/>
-          <w:szCs w:val="36"/>
-        </w:rPr>
-      </w:pPr>
-      <w:r>
-        <w:rPr>
-          <w:rFonts w:ascii="Garamond" w:hAnsi="Garamond"/>
-          <w:sz w:val="36"/>
-          <w:szCs w:val="36"/>
-        </w:rPr>
-        <w:t>Assim como Maria permaneceu firme diante do sofrimento de seu Filho, somos convidados a confiar, mesmo quando tudo parece envolto em escuridão. A resignação, nesse contexto, não é passividade, mas um ato profundo de fé: consiste em entregar a Deus aquilo que nos escapa à compreensão, reconhecendo que Ele enxerga muito além do que nossos olhos podem alcançar.</w:t>
-      </w:r>
-    </w:p>
-    <w:p>
-      <w:pPr>
-        <w:pStyle w:val="Normal"/>
-        <w:jc w:val="both"/>
-        <w:rPr>
-          <w:rFonts w:ascii="Garamond" w:hAnsi="Garamond"/>
-          <w:sz w:val="36"/>
-          <w:szCs w:val="36"/>
-        </w:rPr>
-      </w:pPr>
-      <w:r>
-        <w:rPr>
-          <w:rFonts w:ascii="Garamond" w:hAnsi="Garamond"/>
-          <w:sz w:val="36"/>
-          <w:szCs w:val="36"/>
-        </w:rPr>
-      </w:r>
-    </w:p>
-    <w:p>
-      <w:pPr>
-        <w:pStyle w:val="Normal"/>
-        <w:jc w:val="both"/>
-        <w:rPr>
-          <w:rFonts w:ascii="Garamond" w:hAnsi="Garamond"/>
-          <w:sz w:val="36"/>
-          <w:szCs w:val="36"/>
-        </w:rPr>
-      </w:pPr>
-      <w:r>
-        <w:rPr>
-          <w:rFonts w:ascii="Garamond" w:hAnsi="Garamond"/>
-          <w:sz w:val="36"/>
-          <w:szCs w:val="36"/>
-        </w:rPr>
-        <w:t>Mas Maria não apenas se resignou — ela permaneceu presente. Não fugiu da dor, nem abandonou Jesus em seu momento de maior angústia. Estava ali, silenciosa, mas inabalável em seu amor. E nos ensina que, embora nem sempre possamos afastar o sofrimento de quem amamos, podemos ser sustento, consolo e presença fiel.</w:t>
-      </w:r>
-    </w:p>
-    <w:p>
-      <w:pPr>
-        <w:pStyle w:val="Normal"/>
-        <w:jc w:val="both"/>
-        <w:rPr>
-          <w:rFonts w:ascii="Garamond" w:hAnsi="Garamond"/>
-          <w:sz w:val="36"/>
-          <w:szCs w:val="36"/>
-        </w:rPr>
-      </w:pPr>
-      <w:r>
-        <w:rPr>
-          <w:rFonts w:ascii="Garamond" w:hAnsi="Garamond"/>
-          <w:sz w:val="36"/>
-          <w:szCs w:val="36"/>
-        </w:rPr>
-      </w:r>
-    </w:p>
-    <w:p>
-      <w:pPr>
-        <w:pStyle w:val="Normal"/>
-        <w:jc w:val="both"/>
-        <w:rPr>
-          <w:rFonts w:ascii="Garamond" w:hAnsi="Garamond"/>
-          <w:sz w:val="36"/>
-          <w:szCs w:val="36"/>
-        </w:rPr>
-      </w:pPr>
-      <w:r>
-        <w:rPr>
-          <w:rFonts w:ascii="Garamond" w:hAnsi="Garamond"/>
-          <w:sz w:val="36"/>
-          <w:szCs w:val="36"/>
-        </w:rPr>
-        <w:t>Ao olharmos para Maria, somos convidados a refletir também sobre sua coragem, sua esperança e sua confiança na promessa de Deus. Que, diante de nossos próprios calvários — ou dos calvários daqueles que amamos — saibamos cultivar essas virtudes e, como ela, manter a fé viva mesmo no silêncio de Deus.</w:t>
-      </w:r>
-    </w:p>
-    <w:p>
-      <w:pPr>
-        <w:pStyle w:val="Normal"/>
-        <w:jc w:val="both"/>
-        <w:rPr>
-          <w:rFonts w:ascii="Garamond" w:hAnsi="Garamond"/>
-          <w:sz w:val="36"/>
-          <w:szCs w:val="36"/>
-        </w:rPr>
-      </w:pPr>
-      <w:r>
-        <w:rPr>
-          <w:rFonts w:ascii="Garamond" w:hAnsi="Garamond"/>
-          <w:sz w:val="36"/>
-          <w:szCs w:val="36"/>
-        </w:rPr>
-      </w:r>
-    </w:p>
-    <w:p>
-      <w:pPr>
-        <w:pStyle w:val="Normal"/>
-        <w:jc w:val="both"/>
-        <w:rPr>
-          <w:sz w:val="36"/>
-          <w:szCs w:val="36"/>
-        </w:rPr>
-      </w:pPr>
-      <w:r>
-        <w:rPr>
-          <w:sz w:val="36"/>
-          <w:szCs w:val="36"/>
+      </w:pPr>
+      <w:r>
+        <w:rPr>
+          <w:rFonts w:eastAsia="Arial" w:cs="Arial" w:ascii="Garamond" w:hAnsi="Garamond"/>
+          <w:color w:val="auto"/>
+          <w:kern w:val="0"/>
+          <w:sz w:val="36"/>
+          <w:szCs w:val="36"/>
+          <w:lang w:val="en-US" w:eastAsia="zh-CN" w:bidi="hi-IN"/>
+        </w:rPr>
+        <w:t>Maria orienta os servidores a seguirem as instruções de Jesus antes mesmo de saber o que Ele faria. Ela tinha plena confiança no filho. Não sabia como mas tinha certeza de que Ele resolveria o problema.</w:t>
+      </w:r>
+    </w:p>
+    <w:p>
+      <w:pPr>
+        <w:pStyle w:val="Normal"/>
+        <w:jc w:val="both"/>
+        <w:rPr>
+          <w:rFonts w:ascii="Garamond" w:hAnsi="Garamond" w:eastAsia="Arial" w:cs="Arial"/>
+          <w:color w:val="auto"/>
+          <w:kern w:val="0"/>
+          <w:sz w:val="36"/>
+          <w:szCs w:val="36"/>
+          <w:lang w:val="en-US" w:eastAsia="zh-CN" w:bidi="hi-IN"/>
+        </w:rPr>
+      </w:pPr>
+      <w:r>
+        <w:rPr>
+          <w:rFonts w:eastAsia="Arial" w:cs="Arial" w:ascii="Garamond" w:hAnsi="Garamond"/>
+          <w:color w:val="auto"/>
+          <w:kern w:val="0"/>
+          <w:sz w:val="36"/>
+          <w:szCs w:val="36"/>
+          <w:lang w:val="en-US" w:eastAsia="zh-CN" w:bidi="hi-IN"/>
+        </w:rPr>
+      </w:r>
+    </w:p>
+    <w:p>
+      <w:pPr>
+        <w:pStyle w:val="Normal"/>
+        <w:jc w:val="both"/>
+        <w:rPr/>
+      </w:pPr>
+      <w:r>
+        <w:rPr>
+          <w:rFonts w:eastAsia="Arial" w:cs="Arial" w:ascii="Garamond" w:hAnsi="Garamond"/>
+          <w:color w:val="auto"/>
+          <w:kern w:val="0"/>
+          <w:sz w:val="36"/>
+          <w:szCs w:val="36"/>
+          <w:lang w:val="en-US" w:eastAsia="zh-CN" w:bidi="hi-IN"/>
+        </w:rPr>
+        <w:t>E quanto a nós? Sabemos de fato ouvir, obedecer e confiar em Jesus? Se fizermos um exame de consciência verdadeiro veremos que ainda não. É algo que precisamos exercitar muito ainda.</w:t>
+      </w:r>
+    </w:p>
+    <w:p>
+      <w:pPr>
+        <w:pStyle w:val="Normal"/>
+        <w:jc w:val="both"/>
+        <w:rPr>
+          <w:rFonts w:ascii="Garamond" w:hAnsi="Garamond" w:eastAsia="Arial" w:cs="Arial"/>
+          <w:color w:val="auto"/>
+          <w:kern w:val="0"/>
+          <w:sz w:val="36"/>
+          <w:szCs w:val="36"/>
+          <w:lang w:val="en-US" w:eastAsia="zh-CN" w:bidi="hi-IN"/>
+        </w:rPr>
+      </w:pPr>
+      <w:r>
+        <w:rPr>
+          <w:rFonts w:eastAsia="Arial" w:cs="Arial" w:ascii="Garamond" w:hAnsi="Garamond"/>
+          <w:color w:val="auto"/>
+          <w:kern w:val="0"/>
+          <w:sz w:val="36"/>
+          <w:szCs w:val="36"/>
+          <w:lang w:val="en-US" w:eastAsia="zh-CN" w:bidi="hi-IN"/>
+        </w:rPr>
+      </w:r>
+    </w:p>
+    <w:p>
+      <w:pPr>
+        <w:pStyle w:val="Normal"/>
+        <w:jc w:val="both"/>
+        <w:rPr/>
+      </w:pPr>
+      <w:r>
+        <w:rPr>
+          <w:rFonts w:eastAsia="Arial" w:cs="Arial" w:ascii="Garamond" w:hAnsi="Garamond"/>
+          <w:color w:val="auto"/>
+          <w:kern w:val="0"/>
+          <w:sz w:val="36"/>
+          <w:szCs w:val="36"/>
+          <w:lang w:val="en-US" w:eastAsia="zh-CN" w:bidi="hi-IN"/>
+        </w:rPr>
+        <w:t>Quantas vezes nos atormentamos desnecessariamente  por agir de maneira contrária àquilo que nos recomenda o evangelho? E quando a dor bate à nossa porta, lamentamos por termos ignorado as instruções do Mestre.</w:t>
+      </w:r>
+    </w:p>
+    <w:p>
+      <w:pPr>
+        <w:pStyle w:val="Normal"/>
+        <w:jc w:val="both"/>
+        <w:rPr>
+          <w:rFonts w:ascii="Garamond" w:hAnsi="Garamond" w:eastAsia="Arial" w:cs="Arial"/>
+          <w:color w:val="auto"/>
+          <w:kern w:val="0"/>
+          <w:sz w:val="36"/>
+          <w:szCs w:val="36"/>
+          <w:lang w:val="en-US" w:eastAsia="zh-CN" w:bidi="hi-IN"/>
+        </w:rPr>
+      </w:pPr>
+      <w:r>
+        <w:rPr>
+          <w:rFonts w:eastAsia="Arial" w:cs="Arial" w:ascii="Garamond" w:hAnsi="Garamond"/>
+          <w:color w:val="auto"/>
+          <w:kern w:val="0"/>
+          <w:sz w:val="36"/>
+          <w:szCs w:val="36"/>
+          <w:lang w:val="en-US" w:eastAsia="zh-CN" w:bidi="hi-IN"/>
+        </w:rPr>
+      </w:r>
+    </w:p>
+    <w:p>
+      <w:pPr>
+        <w:pStyle w:val="Normal"/>
+        <w:jc w:val="both"/>
+        <w:rPr/>
+      </w:pPr>
+      <w:r>
+        <w:rPr>
+          <w:rFonts w:eastAsia="Arial" w:cs="Arial" w:ascii="Garamond" w:hAnsi="Garamond"/>
+          <w:color w:val="auto"/>
+          <w:kern w:val="0"/>
+          <w:sz w:val="36"/>
+          <w:szCs w:val="36"/>
+          <w:lang w:val="en-US" w:eastAsia="zh-CN" w:bidi="hi-IN"/>
+        </w:rPr>
+        <w:t>Qual será nosso grau de confiança em Jesus hoje, depois de tudo o que temos aprendido, principalmente sob a luz da Doutrina Espírita?</w:t>
+      </w:r>
+    </w:p>
+    <w:p>
+      <w:pPr>
+        <w:pStyle w:val="Normal"/>
+        <w:jc w:val="both"/>
+        <w:rPr>
+          <w:rFonts w:ascii="Garamond" w:hAnsi="Garamond" w:eastAsia="Arial" w:cs="Arial"/>
+          <w:color w:val="auto"/>
+          <w:kern w:val="0"/>
+          <w:sz w:val="36"/>
+          <w:szCs w:val="36"/>
+          <w:lang w:val="en-US" w:eastAsia="zh-CN" w:bidi="hi-IN"/>
+        </w:rPr>
+      </w:pPr>
+      <w:r>
+        <w:rPr>
+          <w:rFonts w:eastAsia="Arial" w:cs="Arial" w:ascii="Garamond" w:hAnsi="Garamond"/>
+          <w:color w:val="auto"/>
+          <w:kern w:val="0"/>
+          <w:sz w:val="36"/>
+          <w:szCs w:val="36"/>
+          <w:lang w:val="en-US" w:eastAsia="zh-CN" w:bidi="hi-IN"/>
+        </w:rPr>
+      </w:r>
+    </w:p>
+    <w:p>
+      <w:pPr>
+        <w:pStyle w:val="Normal"/>
+        <w:jc w:val="both"/>
+        <w:rPr/>
+      </w:pPr>
+      <w:r>
+        <w:rPr>
+          <w:rFonts w:eastAsia="Arial" w:cs="Arial" w:ascii="Garamond" w:hAnsi="Garamond"/>
+          <w:color w:val="auto"/>
+          <w:kern w:val="0"/>
+          <w:sz w:val="36"/>
+          <w:szCs w:val="36"/>
+          <w:lang w:val="en-US" w:eastAsia="zh-CN" w:bidi="hi-IN"/>
+        </w:rPr>
+        <w:t>Somos servidores fiéis que fazem o que o Mestre nos recomenda tendo a certeza de que o resultado será o melhor? Certamente que ainda não.</w:t>
+      </w:r>
+    </w:p>
+    <w:p>
+      <w:pPr>
+        <w:pStyle w:val="Normal"/>
+        <w:jc w:val="both"/>
+        <w:rPr>
+          <w:rFonts w:ascii="Garamond" w:hAnsi="Garamond" w:eastAsia="Arial" w:cs="Arial"/>
+          <w:color w:val="auto"/>
+          <w:kern w:val="0"/>
+          <w:sz w:val="36"/>
+          <w:szCs w:val="36"/>
+          <w:lang w:val="en-US" w:eastAsia="zh-CN" w:bidi="hi-IN"/>
+        </w:rPr>
+      </w:pPr>
+      <w:r>
+        <w:rPr>
+          <w:rFonts w:eastAsia="Arial" w:cs="Arial" w:ascii="Garamond" w:hAnsi="Garamond"/>
+          <w:color w:val="auto"/>
+          <w:kern w:val="0"/>
+          <w:sz w:val="36"/>
+          <w:szCs w:val="36"/>
+          <w:lang w:val="en-US" w:eastAsia="zh-CN" w:bidi="hi-IN"/>
+        </w:rPr>
+      </w:r>
+    </w:p>
+    <w:p>
+      <w:pPr>
+        <w:pStyle w:val="Normal"/>
+        <w:jc w:val="both"/>
+        <w:rPr/>
+      </w:pPr>
+      <w:r>
+        <w:rPr>
+          <w:rFonts w:eastAsia="Arial" w:cs="Arial" w:ascii="Garamond" w:hAnsi="Garamond"/>
+          <w:color w:val="auto"/>
+          <w:kern w:val="0"/>
+          <w:sz w:val="36"/>
+          <w:szCs w:val="36"/>
+          <w:lang w:val="en-US" w:eastAsia="zh-CN" w:bidi="hi-IN"/>
+        </w:rPr>
+        <w:t>Vamos dar um exemplo simples: muitos de nós já colocamos na urna ou no livro de irradiação aqui da FEIG nomes de familiares ou amigos queridos que estavam enfermos.</w:t>
+      </w:r>
+    </w:p>
+    <w:p>
+      <w:pPr>
+        <w:pStyle w:val="Normal"/>
+        <w:jc w:val="both"/>
+        <w:rPr>
+          <w:rFonts w:ascii="Garamond" w:hAnsi="Garamond" w:eastAsia="Arial" w:cs="Arial"/>
+          <w:color w:val="auto"/>
+          <w:kern w:val="0"/>
+          <w:sz w:val="36"/>
+          <w:szCs w:val="36"/>
+          <w:lang w:val="en-US" w:eastAsia="zh-CN" w:bidi="hi-IN"/>
+        </w:rPr>
+      </w:pPr>
+      <w:r>
+        <w:rPr>
+          <w:rFonts w:eastAsia="Arial" w:cs="Arial" w:ascii="Garamond" w:hAnsi="Garamond"/>
+          <w:color w:val="auto"/>
+          <w:kern w:val="0"/>
+          <w:sz w:val="36"/>
+          <w:szCs w:val="36"/>
+          <w:lang w:val="en-US" w:eastAsia="zh-CN" w:bidi="hi-IN"/>
+        </w:rPr>
+      </w:r>
+    </w:p>
+    <w:p>
+      <w:pPr>
+        <w:pStyle w:val="Normal"/>
+        <w:jc w:val="both"/>
+        <w:rPr/>
+      </w:pPr>
+      <w:r>
+        <w:rPr>
+          <w:rFonts w:eastAsia="Arial" w:cs="Arial" w:ascii="Garamond" w:hAnsi="Garamond"/>
+          <w:color w:val="auto"/>
+          <w:kern w:val="0"/>
+          <w:sz w:val="36"/>
+          <w:szCs w:val="36"/>
+          <w:lang w:val="en-US" w:eastAsia="zh-CN" w:bidi="hi-IN"/>
+        </w:rPr>
+        <w:t xml:space="preserve">Nós fazemos isso na incerteza do que acontecerá. Mas a incerteza não é nosso maior problema. Afinal de contas, não há como sabermos de antemão se a pessoa será curada ou não.  Nosso grande problema é que não confiamos plenamente na resposta que Jesus dará às nossas rogativas. </w:t>
+      </w:r>
+    </w:p>
+    <w:p>
+      <w:pPr>
+        <w:pStyle w:val="Normal"/>
+        <w:jc w:val="both"/>
+        <w:rPr>
+          <w:rFonts w:ascii="Garamond" w:hAnsi="Garamond" w:eastAsia="Arial" w:cs="Arial"/>
+          <w:color w:val="auto"/>
+          <w:kern w:val="0"/>
+          <w:sz w:val="36"/>
+          <w:szCs w:val="36"/>
+          <w:lang w:val="en-US" w:eastAsia="zh-CN" w:bidi="hi-IN"/>
+        </w:rPr>
+      </w:pPr>
+      <w:r>
+        <w:rPr>
+          <w:rFonts w:eastAsia="Arial" w:cs="Arial" w:ascii="Garamond" w:hAnsi="Garamond"/>
+          <w:color w:val="auto"/>
+          <w:kern w:val="0"/>
+          <w:sz w:val="36"/>
+          <w:szCs w:val="36"/>
+          <w:lang w:val="en-US" w:eastAsia="zh-CN" w:bidi="hi-IN"/>
+        </w:rPr>
+      </w:r>
+    </w:p>
+    <w:p>
+      <w:pPr>
+        <w:pStyle w:val="Normal"/>
+        <w:jc w:val="both"/>
+        <w:rPr/>
+      </w:pPr>
+      <w:r>
+        <w:rPr>
+          <w:rFonts w:eastAsia="Arial" w:cs="Arial" w:ascii="Garamond" w:hAnsi="Garamond"/>
+          <w:color w:val="auto"/>
+          <w:kern w:val="0"/>
+          <w:sz w:val="36"/>
+          <w:szCs w:val="36"/>
+          <w:lang w:val="en-US" w:eastAsia="zh-CN" w:bidi="hi-IN"/>
+        </w:rPr>
+        <w:t xml:space="preserve">No fundo o meu desejo é que Jesus permita que a pessoa seja curada: se for assim, então minha confiança é plena. Mas, se a doença persistir, se agravar ou se a pessoa vier a desencarnar, minha confiança fica abalada. </w:t>
+      </w:r>
+    </w:p>
+    <w:p>
+      <w:pPr>
+        <w:pStyle w:val="Normal"/>
+        <w:jc w:val="both"/>
+        <w:rPr>
+          <w:rFonts w:ascii="Garamond" w:hAnsi="Garamond" w:eastAsia="Arial" w:cs="Arial"/>
+          <w:color w:val="auto"/>
+          <w:kern w:val="0"/>
+          <w:sz w:val="36"/>
+          <w:szCs w:val="36"/>
+          <w:lang w:val="en-US" w:eastAsia="zh-CN" w:bidi="hi-IN"/>
+        </w:rPr>
+      </w:pPr>
+      <w:r>
+        <w:rPr>
+          <w:rFonts w:eastAsia="Arial" w:cs="Arial" w:ascii="Garamond" w:hAnsi="Garamond"/>
+          <w:color w:val="auto"/>
+          <w:kern w:val="0"/>
+          <w:sz w:val="36"/>
+          <w:szCs w:val="36"/>
+          <w:lang w:val="en-US" w:eastAsia="zh-CN" w:bidi="hi-IN"/>
+        </w:rPr>
+      </w:r>
+    </w:p>
+    <w:p>
+      <w:pPr>
+        <w:pStyle w:val="Normal"/>
+        <w:jc w:val="both"/>
+        <w:rPr/>
+      </w:pPr>
+      <w:r>
+        <w:rPr>
+          <w:rFonts w:eastAsia="Arial" w:cs="Arial" w:ascii="Garamond" w:hAnsi="Garamond"/>
+          <w:color w:val="auto"/>
+          <w:kern w:val="0"/>
+          <w:sz w:val="36"/>
+          <w:szCs w:val="36"/>
+          <w:lang w:val="en-US" w:eastAsia="zh-CN" w:bidi="hi-IN"/>
+        </w:rPr>
+        <w:t xml:space="preserve">Precisamos compreender que a Terra é para nós, lar, oficina de trabalho, hospital de almas e escola. Jesus é nosso Mestre e guia. Portanto, tudo que nos acontece  tem como objetivo nos educar. </w:t>
+      </w:r>
+    </w:p>
+    <w:p>
+      <w:pPr>
+        <w:pStyle w:val="Normal"/>
+        <w:jc w:val="both"/>
+        <w:rPr>
+          <w:rFonts w:ascii="Garamond" w:hAnsi="Garamond" w:eastAsia="Arial" w:cs="Arial"/>
+          <w:color w:val="auto"/>
+          <w:kern w:val="0"/>
+          <w:sz w:val="36"/>
+          <w:szCs w:val="36"/>
+          <w:lang w:val="en-US" w:eastAsia="zh-CN" w:bidi="hi-IN"/>
+        </w:rPr>
+      </w:pPr>
+      <w:r>
+        <w:rPr>
+          <w:rFonts w:eastAsia="Arial" w:cs="Arial" w:ascii="Garamond" w:hAnsi="Garamond"/>
+          <w:color w:val="auto"/>
+          <w:kern w:val="0"/>
+          <w:sz w:val="36"/>
+          <w:szCs w:val="36"/>
+          <w:lang w:val="en-US" w:eastAsia="zh-CN" w:bidi="hi-IN"/>
+        </w:rPr>
+      </w:r>
+    </w:p>
+    <w:p>
+      <w:pPr>
+        <w:pStyle w:val="Normal"/>
+        <w:jc w:val="both"/>
+        <w:rPr>
+          <w:rFonts w:ascii="Garamond" w:hAnsi="Garamond" w:eastAsia="Arial" w:cs="Arial"/>
+          <w:color w:val="auto"/>
+          <w:kern w:val="0"/>
+          <w:sz w:val="36"/>
+          <w:szCs w:val="36"/>
+          <w:lang w:val="en-US" w:eastAsia="zh-CN" w:bidi="hi-IN"/>
+        </w:rPr>
+      </w:pPr>
+      <w:r>
+        <w:rPr>
+          <w:rFonts w:eastAsia="Arial" w:cs="Arial" w:ascii="Garamond" w:hAnsi="Garamond"/>
+          <w:color w:val="auto"/>
+          <w:kern w:val="0"/>
+          <w:sz w:val="36"/>
+          <w:szCs w:val="36"/>
+          <w:lang w:val="en-US" w:eastAsia="zh-CN" w:bidi="hi-IN"/>
+        </w:rPr>
+        <w:t>Reconhecendo nossa condição de alunos, devemos seguir aprendendo e trabalhando com Jesus e para Jesus, confiando sempre que tudo aquilo que fazemos hoje, por mais simples que seja, nos encontrará com justiça no futuro.</w:t>
+      </w:r>
+    </w:p>
+    <w:p>
+      <w:pPr>
+        <w:pStyle w:val="Normal"/>
+        <w:jc w:val="both"/>
+        <w:rPr>
+          <w:rFonts w:ascii="Garamond" w:hAnsi="Garamond" w:eastAsia="Arial" w:cs="Arial"/>
+          <w:color w:val="auto"/>
+          <w:kern w:val="0"/>
+          <w:sz w:val="36"/>
+          <w:szCs w:val="36"/>
+          <w:lang w:val="en-US" w:eastAsia="zh-CN" w:bidi="hi-IN"/>
+        </w:rPr>
+      </w:pPr>
+      <w:r>
+        <w:rPr>
+          <w:rFonts w:eastAsia="Arial" w:cs="Arial" w:ascii="Garamond" w:hAnsi="Garamond"/>
+          <w:color w:val="auto"/>
+          <w:kern w:val="0"/>
+          <w:sz w:val="36"/>
+          <w:szCs w:val="36"/>
+          <w:lang w:val="en-US" w:eastAsia="zh-CN" w:bidi="hi-IN"/>
         </w:rPr>
       </w:r>
     </w:p>
@@ -4700,10 +3790,9 @@
           <w:kern w:val="0"/>
           <w:sz w:val="36"/>
           <w:szCs w:val="36"/>
-          <w:shd w:fill="auto" w:val="clear"/>
-          <w:lang w:val="en-US" w:eastAsia="zh-CN" w:bidi="hi-IN"/>
-        </w:rPr>
-        <w:t xml:space="preserve">Maria retorna ao Plano Espiritual - </w:t>
+          <w:lang w:val="en-US" w:eastAsia="zh-CN" w:bidi="hi-IN"/>
+        </w:rPr>
+        <w:t xml:space="preserve">Martírio e Crucificação - </w:t>
       </w:r>
       <w:r>
         <w:rPr>
@@ -4716,6 +3805,1495 @@
           <w:kern w:val="0"/>
           <w:sz w:val="36"/>
           <w:szCs w:val="36"/>
+          <w:lang w:val="en-US" w:eastAsia="zh-CN" w:bidi="hi-IN"/>
+        </w:rPr>
+        <w:t>João 19:17-27</w:t>
+      </w:r>
+    </w:p>
+    <w:p>
+      <w:pPr>
+        <w:pStyle w:val="Normal"/>
+        <w:jc w:val="both"/>
+        <w:rPr>
+          <w:rFonts w:ascii="Garamond" w:hAnsi="Garamond"/>
+          <w:sz w:val="36"/>
+          <w:szCs w:val="36"/>
+        </w:rPr>
+      </w:pPr>
+      <w:r>
+        <w:rPr>
+          <w:rFonts w:ascii="Garamond" w:hAnsi="Garamond"/>
+          <w:sz w:val="36"/>
+          <w:szCs w:val="36"/>
+        </w:rPr>
+      </w:r>
+    </w:p>
+    <w:p>
+      <w:pPr>
+        <w:pStyle w:val="Normal"/>
+        <w:jc w:val="both"/>
+        <w:rPr>
+          <w:rFonts w:ascii="Garamond" w:hAnsi="Garamond"/>
+          <w:sz w:val="36"/>
+          <w:szCs w:val="36"/>
+        </w:rPr>
+      </w:pPr>
+      <w:r>
+        <w:rPr>
+          <w:rFonts w:eastAsia="Times New Roman" w:cs="Times New Roman" w:ascii="Garamond" w:hAnsi="Garamond"/>
+          <w:color w:val="000000"/>
+          <w:kern w:val="0"/>
+          <w:sz w:val="36"/>
+          <w:szCs w:val="36"/>
+          <w:shd w:fill="auto" w:val="clear"/>
+          <w:lang w:val="en-US" w:eastAsia="zh-CN" w:bidi="hi-IN"/>
+        </w:rPr>
+        <w:t xml:space="preserve">Ao pé da cruz, Maria nos oferece um dos </w:t>
+      </w:r>
+      <w:r>
+        <w:rPr>
+          <w:rFonts w:eastAsia="Times New Roman" w:cs="Times New Roman" w:ascii="Garamond" w:hAnsi="Garamond"/>
+          <w:color w:val="000000"/>
+          <w:kern w:val="0"/>
+          <w:sz w:val="36"/>
+          <w:szCs w:val="36"/>
+          <w:shd w:fill="auto" w:val="clear"/>
+          <w:lang w:val="en-US" w:eastAsia="zh-CN" w:bidi="hi-IN"/>
+        </w:rPr>
+        <w:t xml:space="preserve">mais belos </w:t>
+      </w:r>
+      <w:r>
+        <w:rPr>
+          <w:rFonts w:eastAsia="Times New Roman" w:cs="Times New Roman" w:ascii="Garamond" w:hAnsi="Garamond"/>
+          <w:color w:val="000000"/>
+          <w:kern w:val="0"/>
+          <w:sz w:val="36"/>
+          <w:szCs w:val="36"/>
+          <w:shd w:fill="auto" w:val="clear"/>
+          <w:lang w:val="en-US" w:eastAsia="zh-CN" w:bidi="hi-IN"/>
+        </w:rPr>
+        <w:t xml:space="preserve">testemunhos de amor, fidelidade e entrega silenciosa. Diante do sofrimento indescritível </w:t>
+      </w:r>
+      <w:r>
+        <w:rPr>
+          <w:rFonts w:eastAsia="Times New Roman" w:cs="Times New Roman" w:ascii="Garamond" w:hAnsi="Garamond"/>
+          <w:color w:val="000000"/>
+          <w:kern w:val="0"/>
+          <w:sz w:val="36"/>
+          <w:szCs w:val="36"/>
+          <w:shd w:fill="auto" w:val="clear"/>
+          <w:lang w:val="en-US" w:eastAsia="zh-CN" w:bidi="hi-IN"/>
+        </w:rPr>
+        <w:t>de Jesus</w:t>
+      </w:r>
+      <w:r>
+        <w:rPr>
+          <w:rFonts w:eastAsia="Times New Roman" w:cs="Times New Roman" w:ascii="Garamond" w:hAnsi="Garamond"/>
+          <w:color w:val="000000"/>
+          <w:kern w:val="0"/>
+          <w:sz w:val="36"/>
+          <w:szCs w:val="36"/>
+          <w:shd w:fill="auto" w:val="clear"/>
+          <w:lang w:val="en-US" w:eastAsia="zh-CN" w:bidi="hi-IN"/>
+        </w:rPr>
+        <w:t xml:space="preserve">, ela não se esconde, não </w:t>
+      </w:r>
+      <w:r>
+        <w:rPr>
+          <w:rFonts w:eastAsia="Times New Roman" w:cs="Times New Roman" w:ascii="Garamond" w:hAnsi="Garamond"/>
+          <w:color w:val="000000"/>
+          <w:kern w:val="0"/>
+          <w:sz w:val="36"/>
+          <w:szCs w:val="36"/>
+          <w:shd w:fill="auto" w:val="clear"/>
+          <w:lang w:val="en-US" w:eastAsia="zh-CN" w:bidi="hi-IN"/>
+        </w:rPr>
+        <w:t xml:space="preserve">se </w:t>
+      </w:r>
+      <w:r>
+        <w:rPr>
+          <w:rFonts w:eastAsia="Times New Roman" w:cs="Times New Roman" w:ascii="Garamond" w:hAnsi="Garamond"/>
+          <w:color w:val="000000"/>
+          <w:kern w:val="0"/>
+          <w:sz w:val="36"/>
+          <w:szCs w:val="36"/>
+          <w:shd w:fill="auto" w:val="clear"/>
+          <w:lang w:val="en-US" w:eastAsia="zh-CN" w:bidi="hi-IN"/>
+        </w:rPr>
+        <w:t xml:space="preserve">desespera, não reclama. </w:t>
+      </w:r>
+      <w:r>
+        <w:rPr>
+          <w:rFonts w:eastAsia="Times New Roman" w:cs="Times New Roman" w:ascii="Garamond" w:hAnsi="Garamond"/>
+          <w:color w:val="000000"/>
+          <w:kern w:val="0"/>
+          <w:sz w:val="36"/>
+          <w:szCs w:val="36"/>
+          <w:shd w:fill="auto" w:val="clear"/>
+          <w:lang w:val="en-US" w:eastAsia="zh-CN" w:bidi="hi-IN"/>
+        </w:rPr>
+        <w:t>P</w:t>
+      </w:r>
+      <w:r>
+        <w:rPr>
+          <w:rFonts w:eastAsia="Times New Roman" w:cs="Times New Roman" w:ascii="Garamond" w:hAnsi="Garamond"/>
+          <w:color w:val="000000"/>
+          <w:kern w:val="0"/>
+          <w:sz w:val="36"/>
+          <w:szCs w:val="36"/>
+          <w:shd w:fill="auto" w:val="clear"/>
+          <w:lang w:val="en-US" w:eastAsia="zh-CN" w:bidi="hi-IN"/>
+        </w:rPr>
+        <w:t xml:space="preserve">ermanece </w:t>
+      </w:r>
+      <w:r>
+        <w:rPr>
+          <w:rFonts w:eastAsia="Times New Roman" w:cs="Times New Roman" w:ascii="Garamond" w:hAnsi="Garamond"/>
+          <w:color w:val="000000"/>
+          <w:kern w:val="0"/>
+          <w:sz w:val="36"/>
+          <w:szCs w:val="36"/>
+          <w:shd w:fill="auto" w:val="clear"/>
+          <w:lang w:val="en-US" w:eastAsia="zh-CN" w:bidi="hi-IN"/>
+        </w:rPr>
+        <w:t xml:space="preserve">ali </w:t>
+      </w:r>
+      <w:r>
+        <w:rPr>
+          <w:rFonts w:eastAsia="Times New Roman" w:cs="Times New Roman" w:ascii="Garamond" w:hAnsi="Garamond"/>
+          <w:color w:val="000000"/>
+          <w:kern w:val="0"/>
+          <w:sz w:val="36"/>
+          <w:szCs w:val="36"/>
+          <w:shd w:fill="auto" w:val="clear"/>
+          <w:lang w:val="en-US" w:eastAsia="zh-CN" w:bidi="hi-IN"/>
+        </w:rPr>
+        <w:t xml:space="preserve">de maneira firme, serena e corajosa. </w:t>
+      </w:r>
+    </w:p>
+    <w:p>
+      <w:pPr>
+        <w:pStyle w:val="Normal"/>
+        <w:jc w:val="both"/>
+        <w:rPr>
+          <w:rFonts w:ascii="Garamond" w:hAnsi="Garamond"/>
+          <w:sz w:val="36"/>
+          <w:szCs w:val="36"/>
+        </w:rPr>
+      </w:pPr>
+      <w:r>
+        <w:rPr>
+          <w:rFonts w:ascii="Garamond" w:hAnsi="Garamond"/>
+          <w:sz w:val="36"/>
+          <w:szCs w:val="36"/>
+        </w:rPr>
+      </w:r>
+    </w:p>
+    <w:p>
+      <w:pPr>
+        <w:pStyle w:val="Normal"/>
+        <w:jc w:val="both"/>
+        <w:rPr>
+          <w:rFonts w:ascii="Garamond" w:hAnsi="Garamond"/>
+          <w:sz w:val="36"/>
+          <w:szCs w:val="36"/>
+        </w:rPr>
+      </w:pPr>
+      <w:r>
+        <w:rPr>
+          <w:rFonts w:eastAsia="Times New Roman" w:cs="Times New Roman" w:ascii="Garamond" w:hAnsi="Garamond"/>
+          <w:color w:val="000000"/>
+          <w:kern w:val="0"/>
+          <w:sz w:val="36"/>
+          <w:szCs w:val="36"/>
+          <w:shd w:fill="auto" w:val="clear"/>
+          <w:lang w:val="en-US" w:eastAsia="zh-CN" w:bidi="hi-IN"/>
+        </w:rPr>
+        <w:t>N</w:t>
+      </w:r>
+      <w:r>
+        <w:rPr>
+          <w:rFonts w:eastAsia="Times New Roman" w:cs="Times New Roman" w:ascii="Garamond" w:hAnsi="Garamond"/>
+          <w:color w:val="000000"/>
+          <w:kern w:val="0"/>
+          <w:sz w:val="36"/>
+          <w:szCs w:val="36"/>
+          <w:shd w:fill="auto" w:val="clear"/>
+          <w:lang w:val="en-US" w:eastAsia="zh-CN" w:bidi="hi-IN"/>
+        </w:rPr>
+        <w:t xml:space="preserve">ão julga os responsáveis pela morte de Jesus, </w:t>
+      </w:r>
+      <w:r>
+        <w:rPr>
+          <w:rFonts w:eastAsia="Times New Roman" w:cs="Times New Roman" w:ascii="Garamond" w:hAnsi="Garamond"/>
+          <w:color w:val="000000"/>
+          <w:kern w:val="0"/>
+          <w:sz w:val="36"/>
+          <w:szCs w:val="36"/>
+          <w:shd w:fill="auto" w:val="clear"/>
+          <w:lang w:val="en-US" w:eastAsia="zh-CN" w:bidi="hi-IN"/>
+        </w:rPr>
+        <w:t>nem</w:t>
+      </w:r>
+      <w:r>
+        <w:rPr>
+          <w:rFonts w:eastAsia="Times New Roman" w:cs="Times New Roman" w:ascii="Garamond" w:hAnsi="Garamond"/>
+          <w:color w:val="000000"/>
+          <w:kern w:val="0"/>
+          <w:sz w:val="36"/>
+          <w:szCs w:val="36"/>
+          <w:shd w:fill="auto" w:val="clear"/>
+          <w:lang w:val="en-US" w:eastAsia="zh-CN" w:bidi="hi-IN"/>
+        </w:rPr>
+        <w:t xml:space="preserve"> os </w:t>
+      </w:r>
+      <w:r>
+        <w:rPr>
+          <w:rFonts w:eastAsia="Times New Roman" w:cs="Times New Roman" w:ascii="Garamond" w:hAnsi="Garamond"/>
+          <w:color w:val="000000"/>
+          <w:kern w:val="0"/>
+          <w:sz w:val="36"/>
+          <w:szCs w:val="36"/>
+          <w:shd w:fill="auto" w:val="clear"/>
+          <w:lang w:val="en-US" w:eastAsia="zh-CN" w:bidi="hi-IN"/>
+        </w:rPr>
+        <w:t>poderosos</w:t>
+      </w:r>
+      <w:r>
+        <w:rPr>
+          <w:rFonts w:eastAsia="Times New Roman" w:cs="Times New Roman" w:ascii="Garamond" w:hAnsi="Garamond"/>
+          <w:color w:val="000000"/>
+          <w:kern w:val="0"/>
+          <w:sz w:val="36"/>
+          <w:szCs w:val="36"/>
+          <w:shd w:fill="auto" w:val="clear"/>
+          <w:lang w:val="en-US" w:eastAsia="zh-CN" w:bidi="hi-IN"/>
+        </w:rPr>
+        <w:t xml:space="preserve"> que </w:t>
+      </w:r>
+      <w:r>
+        <w:rPr>
+          <w:rFonts w:eastAsia="Times New Roman" w:cs="Times New Roman" w:ascii="Garamond" w:hAnsi="Garamond"/>
+          <w:color w:val="000000"/>
+          <w:kern w:val="0"/>
+          <w:sz w:val="36"/>
+          <w:szCs w:val="36"/>
+          <w:shd w:fill="auto" w:val="clear"/>
+          <w:lang w:val="en-US" w:eastAsia="zh-CN" w:bidi="hi-IN"/>
+        </w:rPr>
+        <w:t>O condenaram</w:t>
+      </w:r>
+      <w:r>
+        <w:rPr>
+          <w:rFonts w:eastAsia="Times New Roman" w:cs="Times New Roman" w:ascii="Garamond" w:hAnsi="Garamond"/>
+          <w:color w:val="000000"/>
+          <w:kern w:val="0"/>
+          <w:sz w:val="36"/>
+          <w:szCs w:val="36"/>
+          <w:shd w:fill="auto" w:val="clear"/>
+          <w:lang w:val="en-US" w:eastAsia="zh-CN" w:bidi="hi-IN"/>
+        </w:rPr>
+        <w:t xml:space="preserve">; não acusa os soldados que </w:t>
+      </w:r>
+      <w:r>
+        <w:rPr>
+          <w:rFonts w:eastAsia="Times New Roman" w:cs="Times New Roman" w:ascii="Garamond" w:hAnsi="Garamond"/>
+          <w:color w:val="000000"/>
+          <w:kern w:val="0"/>
+          <w:sz w:val="36"/>
+          <w:szCs w:val="36"/>
+          <w:shd w:fill="auto" w:val="clear"/>
+          <w:lang w:val="en-US" w:eastAsia="zh-CN" w:bidi="hi-IN"/>
+        </w:rPr>
+        <w:t>O</w:t>
+      </w:r>
+      <w:r>
+        <w:rPr>
+          <w:rFonts w:eastAsia="Times New Roman" w:cs="Times New Roman" w:ascii="Garamond" w:hAnsi="Garamond"/>
+          <w:color w:val="000000"/>
+          <w:kern w:val="0"/>
+          <w:sz w:val="36"/>
+          <w:szCs w:val="36"/>
+          <w:shd w:fill="auto" w:val="clear"/>
+          <w:lang w:val="en-US" w:eastAsia="zh-CN" w:bidi="hi-IN"/>
+        </w:rPr>
+        <w:t xml:space="preserve"> pregaram na cruz, muito menos </w:t>
+      </w:r>
+      <w:r>
+        <w:rPr>
+          <w:rFonts w:eastAsia="Times New Roman" w:cs="Times New Roman" w:ascii="Garamond" w:hAnsi="Garamond"/>
+          <w:color w:val="000000"/>
+          <w:kern w:val="0"/>
+          <w:sz w:val="36"/>
+          <w:szCs w:val="36"/>
+          <w:shd w:fill="auto" w:val="clear"/>
+          <w:lang w:val="en-US" w:eastAsia="zh-CN" w:bidi="hi-IN"/>
+        </w:rPr>
+        <w:t>aqueles</w:t>
+      </w:r>
+      <w:r>
+        <w:rPr>
+          <w:rFonts w:eastAsia="Times New Roman" w:cs="Times New Roman" w:ascii="Garamond" w:hAnsi="Garamond"/>
+          <w:color w:val="000000"/>
+          <w:kern w:val="0"/>
+          <w:sz w:val="36"/>
+          <w:szCs w:val="36"/>
+          <w:shd w:fill="auto" w:val="clear"/>
+          <w:lang w:val="en-US" w:eastAsia="zh-CN" w:bidi="hi-IN"/>
+        </w:rPr>
+        <w:t xml:space="preserve"> </w:t>
+      </w:r>
+      <w:r>
+        <w:rPr>
+          <w:rFonts w:eastAsia="Times New Roman" w:cs="Times New Roman" w:ascii="Garamond" w:hAnsi="Garamond"/>
+          <w:color w:val="000000"/>
+          <w:kern w:val="0"/>
+          <w:sz w:val="36"/>
+          <w:szCs w:val="36"/>
+          <w:shd w:fill="auto" w:val="clear"/>
+          <w:lang w:val="en-US" w:eastAsia="zh-CN" w:bidi="hi-IN"/>
+        </w:rPr>
+        <w:t xml:space="preserve">que em algum momento receberam o auxílio do Mestre, mas que naquela hora sombria O abandonaram. </w:t>
+      </w:r>
+    </w:p>
+    <w:p>
+      <w:pPr>
+        <w:pStyle w:val="Normal"/>
+        <w:jc w:val="both"/>
+        <w:rPr>
+          <w:rFonts w:ascii="Garamond" w:hAnsi="Garamond"/>
+          <w:sz w:val="36"/>
+          <w:szCs w:val="36"/>
+        </w:rPr>
+      </w:pPr>
+      <w:r>
+        <w:rPr/>
+      </w:r>
+    </w:p>
+    <w:p>
+      <w:pPr>
+        <w:pStyle w:val="Normal"/>
+        <w:jc w:val="both"/>
+        <w:rPr>
+          <w:rFonts w:ascii="Garamond" w:hAnsi="Garamond"/>
+          <w:sz w:val="36"/>
+          <w:szCs w:val="36"/>
+        </w:rPr>
+      </w:pPr>
+      <w:r>
+        <w:rPr>
+          <w:rFonts w:eastAsia="Times New Roman" w:cs="Times New Roman" w:ascii="Garamond" w:hAnsi="Garamond"/>
+          <w:color w:val="000000"/>
+          <w:kern w:val="0"/>
+          <w:sz w:val="36"/>
+          <w:szCs w:val="36"/>
+          <w:shd w:fill="auto" w:val="clear"/>
+          <w:lang w:val="en-US" w:eastAsia="zh-CN" w:bidi="hi-IN"/>
+        </w:rPr>
+        <w:t xml:space="preserve">Diante da tragédia, Maria revela a virtude de quem compreende que o amor </w:t>
+      </w:r>
+      <w:r>
+        <w:rPr>
+          <w:rFonts w:eastAsia="Times New Roman" w:cs="Times New Roman" w:ascii="Garamond" w:hAnsi="Garamond"/>
+          <w:color w:val="000000"/>
+          <w:kern w:val="0"/>
+          <w:sz w:val="36"/>
+          <w:szCs w:val="36"/>
+          <w:shd w:fill="auto" w:val="clear"/>
+          <w:lang w:val="en-US" w:eastAsia="zh-CN" w:bidi="hi-IN"/>
+        </w:rPr>
+        <w:t>verdadeiro</w:t>
+      </w:r>
+      <w:r>
+        <w:rPr>
+          <w:rFonts w:eastAsia="Times New Roman" w:cs="Times New Roman" w:ascii="Garamond" w:hAnsi="Garamond"/>
+          <w:color w:val="000000"/>
+          <w:kern w:val="0"/>
+          <w:sz w:val="36"/>
+          <w:szCs w:val="36"/>
+          <w:shd w:fill="auto" w:val="clear"/>
+          <w:lang w:val="en-US" w:eastAsia="zh-CN" w:bidi="hi-IN"/>
+        </w:rPr>
+        <w:t xml:space="preserve"> permanece firme, mesmo em meio ao sofrimento.</w:t>
+      </w:r>
+    </w:p>
+    <w:p>
+      <w:pPr>
+        <w:pStyle w:val="Normal"/>
+        <w:jc w:val="both"/>
+        <w:rPr>
+          <w:rFonts w:ascii="Garamond" w:hAnsi="Garamond"/>
+          <w:sz w:val="36"/>
+          <w:szCs w:val="36"/>
+        </w:rPr>
+      </w:pPr>
+      <w:r>
+        <w:rPr>
+          <w:rFonts w:ascii="Garamond" w:hAnsi="Garamond"/>
+          <w:sz w:val="36"/>
+          <w:szCs w:val="36"/>
+        </w:rPr>
+      </w:r>
+    </w:p>
+    <w:p>
+      <w:pPr>
+        <w:pStyle w:val="Normal"/>
+        <w:jc w:val="both"/>
+        <w:rPr>
+          <w:rFonts w:ascii="Garamond" w:hAnsi="Garamond"/>
+          <w:sz w:val="36"/>
+          <w:szCs w:val="36"/>
+        </w:rPr>
+      </w:pPr>
+      <w:r>
+        <w:rPr>
+          <w:rFonts w:eastAsia="Times New Roman" w:cs="Times New Roman" w:ascii="Garamond" w:hAnsi="Garamond"/>
+          <w:color w:val="000000"/>
+          <w:kern w:val="0"/>
+          <w:sz w:val="36"/>
+          <w:szCs w:val="36"/>
+          <w:shd w:fill="auto" w:val="clear"/>
+          <w:lang w:val="en-US" w:eastAsia="zh-CN" w:bidi="hi-IN"/>
+        </w:rPr>
+        <w:t xml:space="preserve">Ali ela </w:t>
+      </w:r>
+      <w:r>
+        <w:rPr>
+          <w:rFonts w:eastAsia="Times New Roman" w:cs="Times New Roman" w:ascii="Garamond" w:hAnsi="Garamond"/>
+          <w:color w:val="000000"/>
+          <w:kern w:val="0"/>
+          <w:sz w:val="36"/>
+          <w:szCs w:val="36"/>
+          <w:shd w:fill="auto" w:val="clear"/>
+          <w:lang w:val="en-US" w:eastAsia="zh-CN" w:bidi="hi-IN"/>
+        </w:rPr>
+        <w:t xml:space="preserve">também </w:t>
+      </w:r>
+      <w:r>
+        <w:rPr>
+          <w:rFonts w:eastAsia="Times New Roman" w:cs="Times New Roman" w:ascii="Garamond" w:hAnsi="Garamond"/>
+          <w:color w:val="000000"/>
+          <w:kern w:val="0"/>
+          <w:sz w:val="36"/>
+          <w:szCs w:val="36"/>
+          <w:shd w:fill="auto" w:val="clear"/>
+          <w:lang w:val="en-US" w:eastAsia="zh-CN" w:bidi="hi-IN"/>
+        </w:rPr>
+        <w:t xml:space="preserve">reafirma sua fidelidade </w:t>
+      </w:r>
+      <w:r>
+        <w:rPr>
+          <w:rFonts w:eastAsia="Times New Roman" w:cs="Times New Roman" w:ascii="Garamond" w:hAnsi="Garamond"/>
+          <w:color w:val="000000"/>
+          <w:kern w:val="0"/>
+          <w:sz w:val="36"/>
+          <w:szCs w:val="36"/>
+          <w:shd w:fill="auto" w:val="clear"/>
+          <w:lang w:val="en-US" w:eastAsia="zh-CN" w:bidi="hi-IN"/>
+        </w:rPr>
+        <w:t>aos desígnios de Deus</w:t>
+      </w:r>
+      <w:r>
+        <w:rPr>
+          <w:rFonts w:eastAsia="Times New Roman" w:cs="Times New Roman" w:ascii="Garamond" w:hAnsi="Garamond"/>
+          <w:color w:val="000000"/>
+          <w:kern w:val="0"/>
+          <w:sz w:val="36"/>
+          <w:szCs w:val="36"/>
+          <w:shd w:fill="auto" w:val="clear"/>
+          <w:lang w:val="en-US" w:eastAsia="zh-CN" w:bidi="hi-IN"/>
+        </w:rPr>
+        <w:t xml:space="preserve">. Se em Belém ela recebeu Jesus nos braços, agora, no Calvário, ela O entrega de volta ao Pai — com a mesma humildade, com o mesmo espírito de serviço. Sua renúncia não é apenas materna, é espiritual. </w:t>
+      </w:r>
+    </w:p>
+    <w:p>
+      <w:pPr>
+        <w:pStyle w:val="Normal"/>
+        <w:jc w:val="both"/>
+        <w:rPr>
+          <w:rFonts w:ascii="Garamond" w:hAnsi="Garamond"/>
+          <w:sz w:val="36"/>
+          <w:szCs w:val="36"/>
+        </w:rPr>
+      </w:pPr>
+      <w:r>
+        <w:rPr>
+          <w:rFonts w:ascii="Garamond" w:hAnsi="Garamond"/>
+          <w:sz w:val="36"/>
+          <w:szCs w:val="36"/>
+        </w:rPr>
+      </w:r>
+    </w:p>
+    <w:p>
+      <w:pPr>
+        <w:pStyle w:val="Normal"/>
+        <w:jc w:val="both"/>
+        <w:rPr>
+          <w:rFonts w:ascii="Garamond" w:hAnsi="Garamond"/>
+          <w:sz w:val="36"/>
+          <w:szCs w:val="36"/>
+        </w:rPr>
+      </w:pPr>
+      <w:r>
+        <w:rPr>
+          <w:rFonts w:eastAsia="Times New Roman" w:cs="Times New Roman" w:ascii="Garamond" w:hAnsi="Garamond"/>
+          <w:color w:val="000000"/>
+          <w:kern w:val="0"/>
+          <w:sz w:val="36"/>
+          <w:szCs w:val="36"/>
+          <w:shd w:fill="auto" w:val="clear"/>
+          <w:lang w:val="en-US" w:eastAsia="zh-CN" w:bidi="hi-IN"/>
+        </w:rPr>
+        <w:t xml:space="preserve">No momento em que Jesus entrega João como um filho à Maria, Ele a eleva à condição de mãe de toda a humanidade e também </w:t>
+      </w:r>
+      <w:r>
+        <w:rPr>
+          <w:rFonts w:eastAsia="Times New Roman" w:cs="Times New Roman" w:ascii="Garamond" w:hAnsi="Garamond"/>
+          <w:color w:val="000000"/>
+          <w:kern w:val="0"/>
+          <w:sz w:val="36"/>
+          <w:szCs w:val="36"/>
+          <w:shd w:fill="auto" w:val="clear"/>
+          <w:lang w:val="en-US" w:eastAsia="zh-CN" w:bidi="hi-IN"/>
+        </w:rPr>
+        <w:t xml:space="preserve">nos ensina que o amor verdadeiro procede não apenas dos laços consanguíneos, mas, sim, da herança divina que todos nós possuímos. </w:t>
+      </w:r>
+    </w:p>
+    <w:p>
+      <w:pPr>
+        <w:pStyle w:val="Normal"/>
+        <w:jc w:val="both"/>
+        <w:rPr>
+          <w:rFonts w:ascii="Garamond" w:hAnsi="Garamond"/>
+          <w:sz w:val="36"/>
+          <w:szCs w:val="36"/>
+        </w:rPr>
+      </w:pPr>
+      <w:r>
+        <w:rPr/>
+      </w:r>
+    </w:p>
+    <w:p>
+      <w:pPr>
+        <w:pStyle w:val="Normal"/>
+        <w:jc w:val="both"/>
+        <w:rPr>
+          <w:rFonts w:ascii="Garamond" w:hAnsi="Garamond"/>
+          <w:sz w:val="36"/>
+          <w:szCs w:val="36"/>
+        </w:rPr>
+      </w:pPr>
+      <w:r>
+        <w:rPr>
+          <w:rFonts w:eastAsia="Times New Roman" w:cs="Times New Roman" w:ascii="Garamond" w:hAnsi="Garamond"/>
+          <w:color w:val="000000"/>
+          <w:kern w:val="0"/>
+          <w:sz w:val="36"/>
+          <w:szCs w:val="36"/>
+          <w:shd w:fill="auto" w:val="clear"/>
+          <w:lang w:val="en-US" w:eastAsia="zh-CN" w:bidi="hi-IN"/>
+        </w:rPr>
+        <w:t>E Maria, a</w:t>
+      </w:r>
+      <w:r>
+        <w:rPr>
+          <w:rFonts w:eastAsia="Times New Roman" w:cs="Times New Roman" w:ascii="Garamond" w:hAnsi="Garamond"/>
+          <w:color w:val="000000"/>
+          <w:kern w:val="0"/>
+          <w:sz w:val="36"/>
+          <w:szCs w:val="36"/>
+          <w:shd w:fill="auto" w:val="clear"/>
+          <w:lang w:val="en-US" w:eastAsia="zh-CN" w:bidi="hi-IN"/>
+        </w:rPr>
+        <w:t>pesar da enorme dor</w:t>
+      </w:r>
+      <w:r>
+        <w:rPr>
+          <w:rFonts w:eastAsia="Times New Roman" w:cs="Times New Roman" w:ascii="Garamond" w:hAnsi="Garamond"/>
+          <w:color w:val="000000"/>
+          <w:kern w:val="0"/>
+          <w:sz w:val="36"/>
+          <w:szCs w:val="36"/>
+          <w:shd w:fill="auto" w:val="clear"/>
+          <w:lang w:val="en-US" w:eastAsia="zh-CN" w:bidi="hi-IN"/>
+        </w:rPr>
+        <w:t xml:space="preserve"> daquele momento</w:t>
+      </w:r>
+      <w:r>
+        <w:rPr>
+          <w:rFonts w:eastAsia="Times New Roman" w:cs="Times New Roman" w:ascii="Garamond" w:hAnsi="Garamond"/>
+          <w:color w:val="000000"/>
+          <w:kern w:val="0"/>
+          <w:sz w:val="36"/>
+          <w:szCs w:val="36"/>
+          <w:shd w:fill="auto" w:val="clear"/>
+          <w:lang w:val="en-US" w:eastAsia="zh-CN" w:bidi="hi-IN"/>
+        </w:rPr>
+        <w:t xml:space="preserve">, não recusa </w:t>
+      </w:r>
+      <w:r>
+        <w:rPr>
+          <w:rFonts w:eastAsia="Times New Roman" w:cs="Times New Roman" w:ascii="Garamond" w:hAnsi="Garamond"/>
+          <w:color w:val="000000"/>
+          <w:kern w:val="0"/>
+          <w:sz w:val="36"/>
+          <w:szCs w:val="36"/>
+          <w:shd w:fill="auto" w:val="clear"/>
+          <w:lang w:val="en-US" w:eastAsia="zh-CN" w:bidi="hi-IN"/>
+        </w:rPr>
+        <w:t>su</w:t>
+      </w:r>
+      <w:r>
+        <w:rPr>
+          <w:rFonts w:eastAsia="Times New Roman" w:cs="Times New Roman" w:ascii="Garamond" w:hAnsi="Garamond"/>
+          <w:color w:val="000000"/>
+          <w:kern w:val="0"/>
+          <w:sz w:val="36"/>
+          <w:szCs w:val="36"/>
+          <w:shd w:fill="auto" w:val="clear"/>
+          <w:lang w:val="en-US" w:eastAsia="zh-CN" w:bidi="hi-IN"/>
+        </w:rPr>
+        <w:t xml:space="preserve">a nova </w:t>
+      </w:r>
+      <w:r>
+        <w:rPr>
+          <w:rFonts w:eastAsia="Times New Roman" w:cs="Times New Roman" w:ascii="Garamond" w:hAnsi="Garamond"/>
+          <w:color w:val="000000"/>
+          <w:kern w:val="0"/>
+          <w:sz w:val="36"/>
+          <w:szCs w:val="36"/>
+          <w:shd w:fill="auto" w:val="clear"/>
+          <w:lang w:val="en-US" w:eastAsia="zh-CN" w:bidi="hi-IN"/>
+        </w:rPr>
+        <w:t>missão</w:t>
+      </w:r>
+      <w:r>
+        <w:rPr>
+          <w:rFonts w:eastAsia="Times New Roman" w:cs="Times New Roman" w:ascii="Garamond" w:hAnsi="Garamond"/>
+          <w:color w:val="000000"/>
+          <w:kern w:val="0"/>
+          <w:sz w:val="36"/>
+          <w:szCs w:val="36"/>
+          <w:shd w:fill="auto" w:val="clear"/>
+          <w:lang w:val="en-US" w:eastAsia="zh-CN" w:bidi="hi-IN"/>
+        </w:rPr>
+        <w:t xml:space="preserve">. </w:t>
+      </w:r>
+    </w:p>
+    <w:p>
+      <w:pPr>
+        <w:pStyle w:val="Normal"/>
+        <w:jc w:val="both"/>
+        <w:rPr>
+          <w:rFonts w:ascii="Garamond" w:hAnsi="Garamond"/>
+          <w:sz w:val="36"/>
+          <w:szCs w:val="36"/>
+        </w:rPr>
+      </w:pPr>
+      <w:r>
+        <w:rPr>
+          <w:rFonts w:ascii="Garamond" w:hAnsi="Garamond"/>
+          <w:sz w:val="36"/>
+          <w:szCs w:val="36"/>
+        </w:rPr>
+      </w:r>
+    </w:p>
+    <w:p>
+      <w:pPr>
+        <w:pStyle w:val="Normal"/>
+        <w:jc w:val="both"/>
+        <w:rPr>
+          <w:rFonts w:ascii="Garamond" w:hAnsi="Garamond"/>
+          <w:sz w:val="36"/>
+          <w:szCs w:val="36"/>
+        </w:rPr>
+      </w:pPr>
+      <w:r>
+        <w:rPr>
+          <w:rFonts w:ascii="Garamond" w:hAnsi="Garamond"/>
+          <w:sz w:val="36"/>
+          <w:szCs w:val="36"/>
+        </w:rPr>
+        <w:t xml:space="preserve">A grandeza de espírito demonstrada por Maria ao pé da cruz é tamanha que nos faz hesitar diante da ideia de seguir seus passos. </w:t>
+      </w:r>
+      <w:r>
+        <w:rPr>
+          <w:rFonts w:ascii="Garamond" w:hAnsi="Garamond"/>
+          <w:sz w:val="36"/>
+          <w:szCs w:val="36"/>
+        </w:rPr>
+        <w:t>Apesar da distância abissal que existe entre nós e ela, precisamos refletir sobre as atitudes concretas que podemos tomar inspirados pelos exemplos de Maria.</w:t>
+      </w:r>
+    </w:p>
+    <w:p>
+      <w:pPr>
+        <w:pStyle w:val="Normal"/>
+        <w:jc w:val="both"/>
+        <w:rPr>
+          <w:rFonts w:ascii="Garamond" w:hAnsi="Garamond"/>
+          <w:sz w:val="36"/>
+          <w:szCs w:val="36"/>
+        </w:rPr>
+      </w:pPr>
+      <w:r>
+        <w:rPr/>
+      </w:r>
+    </w:p>
+    <w:p>
+      <w:pPr>
+        <w:pStyle w:val="Normal"/>
+        <w:jc w:val="both"/>
+        <w:rPr>
+          <w:rFonts w:ascii="Garamond" w:hAnsi="Garamond"/>
+          <w:sz w:val="36"/>
+          <w:szCs w:val="36"/>
+        </w:rPr>
+      </w:pPr>
+      <w:r>
+        <w:rPr>
+          <w:rFonts w:ascii="Garamond" w:hAnsi="Garamond"/>
+          <w:sz w:val="36"/>
+          <w:szCs w:val="36"/>
+        </w:rPr>
+        <w:t xml:space="preserve">A primeira </w:t>
+      </w:r>
+      <w:r>
+        <w:rPr>
+          <w:rFonts w:ascii="Garamond" w:hAnsi="Garamond"/>
+          <w:sz w:val="36"/>
+          <w:szCs w:val="36"/>
+        </w:rPr>
+        <w:t xml:space="preserve">e mais evidente </w:t>
+      </w:r>
+      <w:r>
+        <w:rPr>
+          <w:rFonts w:ascii="Garamond" w:hAnsi="Garamond"/>
+          <w:sz w:val="36"/>
+          <w:szCs w:val="36"/>
+        </w:rPr>
+        <w:t>é a resignação. Maria sabia que Jesus não merecia o sofrimento que lhe foi imposto, mas aceitou</w:t>
+      </w:r>
+      <w:r>
+        <w:rPr>
+          <w:rFonts w:eastAsia="Arial" w:cs="Arial" w:ascii="Garamond" w:hAnsi="Garamond"/>
+          <w:color w:val="auto"/>
+          <w:kern w:val="0"/>
+          <w:sz w:val="36"/>
+          <w:szCs w:val="36"/>
+          <w:lang w:val="en-US" w:eastAsia="zh-CN" w:bidi="hi-IN"/>
+        </w:rPr>
+        <w:t xml:space="preserve"> a situação entendendo</w:t>
+      </w:r>
+      <w:r>
+        <w:rPr>
+          <w:rFonts w:ascii="Garamond" w:hAnsi="Garamond"/>
+          <w:sz w:val="36"/>
+          <w:szCs w:val="36"/>
+        </w:rPr>
+        <w:t xml:space="preserve"> que aquela era a vontade de Deus. Talvez não compreendesse </w:t>
+      </w:r>
+      <w:r>
+        <w:rPr>
+          <w:rFonts w:eastAsia="Arial" w:cs="Arial" w:ascii="Garamond" w:hAnsi="Garamond"/>
+          <w:color w:val="auto"/>
+          <w:kern w:val="0"/>
+          <w:sz w:val="36"/>
+          <w:szCs w:val="36"/>
+          <w:lang w:val="en-US" w:eastAsia="zh-CN" w:bidi="hi-IN"/>
+        </w:rPr>
+        <w:t>exatamente quais eram</w:t>
+      </w:r>
+      <w:r>
+        <w:rPr>
+          <w:rFonts w:ascii="Garamond" w:hAnsi="Garamond"/>
+          <w:sz w:val="36"/>
+          <w:szCs w:val="36"/>
+        </w:rPr>
+        <w:t xml:space="preserve"> os propósitos divinos por trás de tanta dor, mas </w:t>
+      </w:r>
+      <w:r>
+        <w:rPr>
+          <w:rFonts w:eastAsia="Arial" w:cs="Arial" w:ascii="Garamond" w:hAnsi="Garamond"/>
+          <w:color w:val="auto"/>
+          <w:kern w:val="0"/>
+          <w:sz w:val="36"/>
+          <w:szCs w:val="36"/>
+          <w:lang w:val="en-US" w:eastAsia="zh-CN" w:bidi="hi-IN"/>
+        </w:rPr>
+        <w:t>sabia que tudo estava acontecendo</w:t>
+      </w:r>
+      <w:r>
+        <w:rPr>
+          <w:rFonts w:ascii="Garamond" w:hAnsi="Garamond"/>
+          <w:sz w:val="36"/>
+          <w:szCs w:val="36"/>
+        </w:rPr>
+        <w:t xml:space="preserve"> segundo os desígnios do Pai.</w:t>
+      </w:r>
+    </w:p>
+    <w:p>
+      <w:pPr>
+        <w:pStyle w:val="Normal"/>
+        <w:jc w:val="both"/>
+        <w:rPr>
+          <w:rFonts w:ascii="Garamond" w:hAnsi="Garamond"/>
+          <w:sz w:val="36"/>
+          <w:szCs w:val="36"/>
+        </w:rPr>
+      </w:pPr>
+      <w:r>
+        <w:rPr/>
+      </w:r>
+    </w:p>
+    <w:p>
+      <w:pPr>
+        <w:pStyle w:val="Normal"/>
+        <w:jc w:val="both"/>
+        <w:rPr>
+          <w:rFonts w:ascii="Garamond" w:hAnsi="Garamond"/>
+          <w:sz w:val="36"/>
+          <w:szCs w:val="36"/>
+        </w:rPr>
+      </w:pPr>
+      <w:r>
+        <w:rPr>
+          <w:rFonts w:ascii="Garamond" w:hAnsi="Garamond"/>
+          <w:sz w:val="36"/>
+          <w:szCs w:val="36"/>
+        </w:rPr>
+        <w:t>Muitas vezes, enfrentamos situações em que nós  — ou alguém que amamos — sofre, aparentemente sem motivo. Apesar dos esforços, d</w:t>
+      </w:r>
+      <w:r>
+        <w:rPr>
+          <w:rFonts w:ascii="Garamond" w:hAnsi="Garamond"/>
+          <w:sz w:val="36"/>
+          <w:szCs w:val="36"/>
+        </w:rPr>
+        <w:t>e todo o auxílio</w:t>
+      </w:r>
+      <w:r>
+        <w:rPr>
+          <w:rFonts w:ascii="Garamond" w:hAnsi="Garamond"/>
+          <w:sz w:val="36"/>
+          <w:szCs w:val="36"/>
+        </w:rPr>
+        <w:t xml:space="preserve"> e d</w:t>
+      </w:r>
+      <w:r>
+        <w:rPr>
+          <w:rFonts w:eastAsia="Arial" w:cs="Arial" w:ascii="Garamond" w:hAnsi="Garamond"/>
+          <w:color w:val="auto"/>
+          <w:kern w:val="0"/>
+          <w:sz w:val="36"/>
+          <w:szCs w:val="36"/>
+          <w:lang w:val="en-US" w:eastAsia="zh-CN" w:bidi="hi-IN"/>
+        </w:rPr>
+        <w:t>as</w:t>
+      </w:r>
+      <w:r>
+        <w:rPr>
+          <w:rFonts w:ascii="Garamond" w:hAnsi="Garamond"/>
+          <w:sz w:val="36"/>
+          <w:szCs w:val="36"/>
+        </w:rPr>
+        <w:t xml:space="preserve"> orações</w:t>
+      </w:r>
+      <w:r>
+        <w:rPr>
+          <w:rFonts w:ascii="Garamond" w:hAnsi="Garamond"/>
+          <w:sz w:val="36"/>
+          <w:szCs w:val="36"/>
+        </w:rPr>
+        <w:t xml:space="preserve"> recebidas</w:t>
+      </w:r>
+      <w:r>
+        <w:rPr>
+          <w:rFonts w:ascii="Garamond" w:hAnsi="Garamond"/>
+          <w:sz w:val="36"/>
+          <w:szCs w:val="36"/>
+        </w:rPr>
+        <w:t xml:space="preserve">, a dor persiste. Nessas horas, é </w:t>
+      </w:r>
+      <w:r>
+        <w:rPr>
+          <w:rFonts w:ascii="Garamond" w:hAnsi="Garamond"/>
+          <w:sz w:val="36"/>
+          <w:szCs w:val="36"/>
+        </w:rPr>
+        <w:t xml:space="preserve">comum nossa fé se abalar e nós questionarmos a </w:t>
+      </w:r>
+      <w:r>
+        <w:rPr>
+          <w:rFonts w:ascii="Garamond" w:hAnsi="Garamond"/>
+          <w:sz w:val="36"/>
+          <w:szCs w:val="36"/>
+        </w:rPr>
+        <w:t>justiça divina.</w:t>
+      </w:r>
+    </w:p>
+    <w:p>
+      <w:pPr>
+        <w:pStyle w:val="Normal"/>
+        <w:jc w:val="both"/>
+        <w:rPr>
+          <w:rFonts w:ascii="Garamond" w:hAnsi="Garamond"/>
+          <w:sz w:val="36"/>
+          <w:szCs w:val="36"/>
+        </w:rPr>
+      </w:pPr>
+      <w:r>
+        <w:rPr>
+          <w:rFonts w:ascii="Garamond" w:hAnsi="Garamond"/>
+          <w:sz w:val="36"/>
+          <w:szCs w:val="36"/>
+        </w:rPr>
+      </w:r>
+    </w:p>
+    <w:p>
+      <w:pPr>
+        <w:pStyle w:val="Normal"/>
+        <w:jc w:val="both"/>
+        <w:rPr>
+          <w:rFonts w:ascii="Garamond" w:hAnsi="Garamond"/>
+          <w:sz w:val="36"/>
+          <w:szCs w:val="36"/>
+        </w:rPr>
+      </w:pPr>
+      <w:r>
+        <w:rPr>
+          <w:rFonts w:ascii="Garamond" w:hAnsi="Garamond"/>
+          <w:sz w:val="36"/>
+          <w:szCs w:val="36"/>
+        </w:rPr>
+        <w:t xml:space="preserve">Assim como Maria permaneceu firme diante do sofrimento de seu </w:t>
+      </w:r>
+      <w:r>
+        <w:rPr>
+          <w:rFonts w:ascii="Garamond" w:hAnsi="Garamond"/>
+          <w:sz w:val="36"/>
+          <w:szCs w:val="36"/>
+        </w:rPr>
+        <w:t>f</w:t>
+      </w:r>
+      <w:r>
+        <w:rPr>
+          <w:rFonts w:ascii="Garamond" w:hAnsi="Garamond"/>
+          <w:sz w:val="36"/>
+          <w:szCs w:val="36"/>
+        </w:rPr>
+        <w:t xml:space="preserve">ilho, somos convidados a confiar, mesmo quando tudo parece envolto em escuridão. A resignação, nesse contexto, não é passividade, mas um ato profundo de fé: consiste em entregar a Deus aquilo que nos escapa à compreensão, </w:t>
+      </w:r>
+      <w:r>
+        <w:rPr>
+          <w:rFonts w:ascii="Garamond" w:hAnsi="Garamond"/>
+          <w:sz w:val="36"/>
+          <w:szCs w:val="36"/>
+        </w:rPr>
+        <w:t>mesmo depois de termos feito tudo o que poderíamos para pôr um termo ao sofrimento.</w:t>
+      </w:r>
+    </w:p>
+    <w:p>
+      <w:pPr>
+        <w:pStyle w:val="Normal"/>
+        <w:jc w:val="both"/>
+        <w:rPr>
+          <w:rFonts w:ascii="Garamond" w:hAnsi="Garamond"/>
+          <w:sz w:val="36"/>
+          <w:szCs w:val="36"/>
+        </w:rPr>
+      </w:pPr>
+      <w:r>
+        <w:rPr/>
+      </w:r>
+    </w:p>
+    <w:p>
+      <w:pPr>
+        <w:pStyle w:val="Normal"/>
+        <w:jc w:val="both"/>
+        <w:rPr>
+          <w:rFonts w:ascii="Garamond" w:hAnsi="Garamond"/>
+          <w:sz w:val="36"/>
+          <w:szCs w:val="36"/>
+        </w:rPr>
+      </w:pPr>
+      <w:r>
+        <w:rPr>
+          <w:rFonts w:ascii="Garamond" w:hAnsi="Garamond"/>
+          <w:sz w:val="36"/>
+          <w:szCs w:val="36"/>
+        </w:rPr>
+        <w:t>Mas Maria não apenas se resignou — ela permaneceu presente. Não fugiu da dor, nem abandonou Jesus em seu momento de maior angústia. Estava ali, silenciosa, mas inabalável</w:t>
+      </w:r>
+      <w:r>
+        <w:rPr>
+          <w:rFonts w:ascii="Garamond" w:hAnsi="Garamond"/>
+          <w:sz w:val="36"/>
+          <w:szCs w:val="36"/>
+        </w:rPr>
+        <w:t>.</w:t>
+      </w:r>
+      <w:r>
+        <w:rPr>
+          <w:rFonts w:ascii="Garamond" w:hAnsi="Garamond"/>
+          <w:sz w:val="36"/>
+          <w:szCs w:val="36"/>
+        </w:rPr>
+        <w:t xml:space="preserve"> E nos ensina que, embora nem sempre possamos afastar o sofrimento</w:t>
+      </w:r>
+      <w:r>
+        <w:rPr>
+          <w:rFonts w:ascii="Garamond" w:hAnsi="Garamond"/>
+          <w:sz w:val="36"/>
+          <w:szCs w:val="36"/>
+        </w:rPr>
+        <w:t>,</w:t>
+      </w:r>
+      <w:r>
+        <w:rPr>
+          <w:rFonts w:ascii="Garamond" w:hAnsi="Garamond"/>
+          <w:sz w:val="36"/>
+          <w:szCs w:val="36"/>
+        </w:rPr>
+        <w:t xml:space="preserve"> </w:t>
+      </w:r>
+      <w:r>
+        <w:rPr>
+          <w:rFonts w:eastAsia="Arial" w:cs="Arial" w:ascii="Garamond" w:hAnsi="Garamond"/>
+          <w:color w:val="auto"/>
+          <w:kern w:val="0"/>
+          <w:sz w:val="36"/>
+          <w:szCs w:val="36"/>
+          <w:lang w:val="en-US" w:eastAsia="zh-CN" w:bidi="hi-IN"/>
+        </w:rPr>
+        <w:t>ainda</w:t>
+      </w:r>
+      <w:r>
+        <w:rPr>
+          <w:rFonts w:ascii="Garamond" w:hAnsi="Garamond"/>
+          <w:sz w:val="36"/>
+          <w:szCs w:val="36"/>
+        </w:rPr>
+        <w:t xml:space="preserve"> podemos ser sustento, consolo e presença fiel.</w:t>
+      </w:r>
+    </w:p>
+    <w:p>
+      <w:pPr>
+        <w:pStyle w:val="Normal"/>
+        <w:jc w:val="both"/>
+        <w:rPr>
+          <w:rFonts w:ascii="Garamond" w:hAnsi="Garamond"/>
+          <w:sz w:val="36"/>
+          <w:szCs w:val="36"/>
+        </w:rPr>
+      </w:pPr>
+      <w:r>
+        <w:rPr/>
+      </w:r>
+    </w:p>
+    <w:p>
+      <w:pPr>
+        <w:pStyle w:val="Normal"/>
+        <w:jc w:val="both"/>
+        <w:rPr>
+          <w:rFonts w:ascii="Garamond" w:hAnsi="Garamond"/>
+          <w:sz w:val="36"/>
+          <w:szCs w:val="36"/>
+        </w:rPr>
+      </w:pPr>
+      <w:r>
+        <w:rPr>
+          <w:rFonts w:ascii="Garamond" w:hAnsi="Garamond"/>
+          <w:sz w:val="36"/>
+          <w:szCs w:val="36"/>
+        </w:rPr>
+        <w:t>Ao olharmos para Maria, somos convidados a refletir também sobre sua coragem, sua esperança e sua confiança na promessa de Deus. Que, diante de nossos próprios calvários — ou dos calvários daqueles que amamos — saibamos cultivar essas virtudes e, como ela, manter a fé viva mesmo diante do silêncio de Deus.</w:t>
+      </w:r>
+    </w:p>
+    <w:p>
+      <w:pPr>
+        <w:pStyle w:val="Normal"/>
+        <w:jc w:val="both"/>
+        <w:rPr>
+          <w:rFonts w:ascii="Garamond" w:hAnsi="Garamond"/>
+          <w:sz w:val="36"/>
+          <w:szCs w:val="36"/>
+        </w:rPr>
+      </w:pPr>
+      <w:r>
+        <w:rPr/>
+      </w:r>
+    </w:p>
+    <w:p>
+      <w:pPr>
+        <w:pStyle w:val="Normal"/>
+        <w:jc w:val="both"/>
+        <w:rPr>
+          <w:rFonts w:ascii="Garamond" w:hAnsi="Garamond"/>
+          <w:sz w:val="36"/>
+          <w:szCs w:val="36"/>
+        </w:rPr>
+      </w:pPr>
+      <w:r>
+        <w:rPr>
+          <w:rFonts w:ascii="Garamond" w:hAnsi="Garamond"/>
+          <w:sz w:val="36"/>
+          <w:szCs w:val="36"/>
+        </w:rPr>
+        <w:t xml:space="preserve">Após </w:t>
+      </w:r>
+      <w:r>
+        <w:rPr>
+          <w:rFonts w:eastAsia="Arial" w:cs="Arial" w:ascii="Garamond" w:hAnsi="Garamond"/>
+          <w:color w:val="auto"/>
+          <w:kern w:val="0"/>
+          <w:sz w:val="36"/>
+          <w:szCs w:val="36"/>
+          <w:lang w:val="en-US" w:eastAsia="zh-CN" w:bidi="hi-IN"/>
+        </w:rPr>
+        <w:t>a</w:t>
+      </w:r>
+      <w:r>
+        <w:rPr>
+          <w:rFonts w:ascii="Garamond" w:hAnsi="Garamond"/>
+          <w:sz w:val="36"/>
+          <w:szCs w:val="36"/>
+        </w:rPr>
+        <w:t xml:space="preserve"> passagem da crucificação de Jesus, Maria só volta a ser citada nos evangelhos </w:t>
+      </w:r>
+      <w:r>
+        <w:rPr>
+          <w:rFonts w:ascii="Garamond" w:hAnsi="Garamond"/>
+          <w:sz w:val="36"/>
+          <w:szCs w:val="36"/>
+        </w:rPr>
+        <w:t>em Atos 1:14:</w:t>
+      </w:r>
+    </w:p>
+    <w:p>
+      <w:pPr>
+        <w:pStyle w:val="Normal"/>
+        <w:jc w:val="both"/>
+        <w:rPr>
+          <w:rFonts w:ascii="Garamond" w:hAnsi="Garamond"/>
+          <w:sz w:val="36"/>
+          <w:szCs w:val="36"/>
+        </w:rPr>
+      </w:pPr>
+      <w:r>
+        <w:rPr/>
+      </w:r>
+    </w:p>
+    <w:p>
+      <w:pPr>
+        <w:pStyle w:val="Normal"/>
+        <w:ind w:left="720" w:hanging="0"/>
+        <w:jc w:val="both"/>
+        <w:rPr>
+          <w:i/>
+          <w:i/>
+          <w:iCs/>
+        </w:rPr>
+      </w:pPr>
+      <w:r>
+        <w:rPr>
+          <w:rFonts w:ascii="Garamond" w:hAnsi="Garamond"/>
+          <w:i/>
+          <w:iCs/>
+          <w:sz w:val="36"/>
+          <w:szCs w:val="36"/>
+        </w:rPr>
+        <w:t>Todos estes perseveravam unânimes em oração, com as mulheres, e Maria, mãe de Jesus, e com os irmãos dele.</w:t>
+      </w:r>
+    </w:p>
+    <w:p>
+      <w:pPr>
+        <w:pStyle w:val="Normal"/>
+        <w:jc w:val="both"/>
+        <w:rPr>
+          <w:rFonts w:ascii="Garamond" w:hAnsi="Garamond"/>
+          <w:sz w:val="36"/>
+          <w:szCs w:val="36"/>
+        </w:rPr>
+      </w:pPr>
+      <w:r>
+        <w:rPr>
+          <w:rFonts w:ascii="Garamond" w:hAnsi="Garamond"/>
+          <w:sz w:val="36"/>
+          <w:szCs w:val="36"/>
+        </w:rPr>
+      </w:r>
+    </w:p>
+    <w:p>
+      <w:pPr>
+        <w:pStyle w:val="Normal"/>
+        <w:jc w:val="both"/>
+        <w:rPr>
+          <w:rFonts w:ascii="Garamond" w:hAnsi="Garamond"/>
+          <w:sz w:val="36"/>
+          <w:szCs w:val="36"/>
+        </w:rPr>
+      </w:pPr>
+      <w:r>
+        <w:rPr>
+          <w:rFonts w:ascii="Garamond" w:hAnsi="Garamond"/>
+          <w:sz w:val="36"/>
+          <w:szCs w:val="36"/>
+        </w:rPr>
+        <w:t xml:space="preserve">Porém, Maria não deixou de servir no bem. </w:t>
+      </w:r>
+      <w:r>
+        <w:rPr>
+          <w:rFonts w:eastAsia="Arial" w:cs="Arial" w:ascii="Garamond" w:hAnsi="Garamond"/>
+          <w:color w:val="auto"/>
+          <w:kern w:val="0"/>
+          <w:sz w:val="36"/>
+          <w:szCs w:val="36"/>
+          <w:lang w:val="en-US" w:eastAsia="zh-CN" w:bidi="hi-IN"/>
+        </w:rPr>
+        <w:t>Na obra Boa Nova, com psicografia de Chico Xavier, no capítulo intitulado Maria, Humberto de Campos narra os acontecimentos na vida de Maria após a crucificação de Jesus.</w:t>
+      </w:r>
+    </w:p>
+    <w:p>
+      <w:pPr>
+        <w:pStyle w:val="Normal"/>
+        <w:jc w:val="both"/>
+        <w:rPr>
+          <w:rFonts w:eastAsia="Arial" w:cs="Arial"/>
+          <w:color w:val="auto"/>
+          <w:kern w:val="0"/>
+          <w:lang w:val="en-US" w:eastAsia="zh-CN" w:bidi="hi-IN"/>
+        </w:rPr>
+      </w:pPr>
+      <w:r>
+        <w:rPr>
+          <w:rFonts w:ascii="Garamond" w:hAnsi="Garamond"/>
+          <w:sz w:val="36"/>
+          <w:szCs w:val="36"/>
+        </w:rPr>
+      </w:r>
+    </w:p>
+    <w:p>
+      <w:pPr>
+        <w:pStyle w:val="Normal"/>
+        <w:jc w:val="both"/>
+        <w:rPr>
+          <w:rFonts w:ascii="Garamond" w:hAnsi="Garamond"/>
+          <w:sz w:val="36"/>
+          <w:szCs w:val="36"/>
+        </w:rPr>
+      </w:pPr>
+      <w:r>
+        <w:rPr>
+          <w:rFonts w:eastAsia="Arial" w:cs="Arial" w:ascii="Garamond" w:hAnsi="Garamond"/>
+          <w:color w:val="auto"/>
+          <w:kern w:val="0"/>
+          <w:sz w:val="36"/>
+          <w:szCs w:val="36"/>
+          <w:lang w:val="en-US" w:eastAsia="zh-CN" w:bidi="hi-IN"/>
+        </w:rPr>
+        <w:t>Alguns anos após o retorno de Jesus ao plano espiritual, Maria percebe que os ensinamentos de seu filho começam a ser esquecidos ou tornam-se motivo de discórdia entre seus seguidores.</w:t>
+      </w:r>
+    </w:p>
+    <w:p>
+      <w:pPr>
+        <w:pStyle w:val="Normal"/>
+        <w:jc w:val="both"/>
+        <w:rPr>
+          <w:rFonts w:eastAsia="Arial" w:cs="Arial"/>
+          <w:color w:val="auto"/>
+          <w:kern w:val="0"/>
+          <w:lang w:val="en-US" w:eastAsia="zh-CN" w:bidi="hi-IN"/>
+        </w:rPr>
+      </w:pPr>
+      <w:r>
+        <w:rPr>
+          <w:rFonts w:ascii="Garamond" w:hAnsi="Garamond"/>
+          <w:sz w:val="36"/>
+          <w:szCs w:val="36"/>
+        </w:rPr>
+      </w:r>
+    </w:p>
+    <w:p>
+      <w:pPr>
+        <w:pStyle w:val="Normal"/>
+        <w:jc w:val="both"/>
+        <w:rPr>
+          <w:rFonts w:ascii="Garamond" w:hAnsi="Garamond"/>
+          <w:sz w:val="36"/>
+          <w:szCs w:val="36"/>
+        </w:rPr>
+      </w:pPr>
+      <w:r>
+        <w:rPr>
+          <w:rFonts w:eastAsia="Arial" w:cs="Arial" w:ascii="Garamond" w:hAnsi="Garamond"/>
+          <w:color w:val="auto"/>
+          <w:kern w:val="0"/>
+          <w:sz w:val="36"/>
+          <w:szCs w:val="36"/>
+          <w:lang w:val="en-US" w:eastAsia="zh-CN" w:bidi="hi-IN"/>
+        </w:rPr>
+        <w:t>Recorda-se frequentemente do dia em que Jesus nasceu naquele berço simples e improvisado. Recorda-se também das paisagens belas e alegres de Nazaré, entre as quais surgia o filho trabalhando e amando.</w:t>
+      </w:r>
+    </w:p>
+    <w:p>
+      <w:pPr>
+        <w:pStyle w:val="Normal"/>
+        <w:jc w:val="both"/>
+        <w:rPr>
+          <w:rFonts w:eastAsia="Arial" w:cs="Arial"/>
+          <w:color w:val="auto"/>
+          <w:kern w:val="0"/>
+          <w:lang w:val="en-US" w:eastAsia="zh-CN" w:bidi="hi-IN"/>
+        </w:rPr>
+      </w:pPr>
+      <w:r>
+        <w:rPr>
+          <w:rFonts w:ascii="Garamond" w:hAnsi="Garamond"/>
+          <w:sz w:val="36"/>
+          <w:szCs w:val="36"/>
+        </w:rPr>
+      </w:r>
+    </w:p>
+    <w:p>
+      <w:pPr>
+        <w:pStyle w:val="Normal"/>
+        <w:jc w:val="both"/>
+        <w:rPr>
+          <w:rFonts w:ascii="Garamond" w:hAnsi="Garamond"/>
+          <w:sz w:val="36"/>
+          <w:szCs w:val="36"/>
+        </w:rPr>
+      </w:pPr>
+      <w:r>
+        <w:rPr>
+          <w:rFonts w:eastAsia="Arial" w:cs="Arial" w:ascii="Garamond" w:hAnsi="Garamond"/>
+          <w:color w:val="auto"/>
+          <w:kern w:val="0"/>
+          <w:sz w:val="36"/>
+          <w:szCs w:val="36"/>
+          <w:lang w:val="en-US" w:eastAsia="zh-CN" w:bidi="hi-IN"/>
+        </w:rPr>
+        <w:t xml:space="preserve">Surge então João que, recordando-se das recomendações de Jesus crucificado, oferece à Maria a proteção filial. João conta à Maria que estava vivendo em Éfeso onde as ideias cristãs estavam ganhando força. </w:t>
+      </w:r>
+    </w:p>
+    <w:p>
+      <w:pPr>
+        <w:pStyle w:val="Normal"/>
+        <w:jc w:val="both"/>
+        <w:rPr>
+          <w:rFonts w:eastAsia="Arial" w:cs="Arial"/>
+          <w:color w:val="auto"/>
+          <w:kern w:val="0"/>
+          <w:lang w:val="en-US" w:eastAsia="zh-CN" w:bidi="hi-IN"/>
+        </w:rPr>
+      </w:pPr>
+      <w:r>
+        <w:rPr>
+          <w:rFonts w:ascii="Garamond" w:hAnsi="Garamond"/>
+          <w:sz w:val="36"/>
+          <w:szCs w:val="36"/>
+        </w:rPr>
+      </w:r>
+    </w:p>
+    <w:p>
+      <w:pPr>
+        <w:pStyle w:val="Normal"/>
+        <w:jc w:val="both"/>
+        <w:rPr>
+          <w:rFonts w:ascii="Garamond" w:hAnsi="Garamond"/>
+          <w:sz w:val="36"/>
+          <w:szCs w:val="36"/>
+        </w:rPr>
+      </w:pPr>
+      <w:r>
+        <w:rPr>
+          <w:rFonts w:eastAsia="Arial" w:cs="Arial" w:ascii="Garamond" w:hAnsi="Garamond"/>
+          <w:color w:val="auto"/>
+          <w:kern w:val="0"/>
+          <w:sz w:val="36"/>
+          <w:szCs w:val="36"/>
+          <w:lang w:val="en-US" w:eastAsia="zh-CN" w:bidi="hi-IN"/>
+        </w:rPr>
+        <w:t>João propõe a Maria levá-la consigo. Daria a ela o amor de um filho e sabia que receberia de Maria a ternura maternal. Explica que não fora buscar Maria antes porque não tinha uma casa para abrigá-los. Porém, havia recebido de um recém convertido cristão uma casinha pobre onde poderiam morar.</w:t>
+      </w:r>
+    </w:p>
+    <w:p>
+      <w:pPr>
+        <w:pStyle w:val="Normal"/>
+        <w:jc w:val="both"/>
+        <w:rPr>
+          <w:rFonts w:eastAsia="Arial" w:cs="Arial"/>
+          <w:color w:val="auto"/>
+          <w:kern w:val="0"/>
+          <w:lang w:val="en-US" w:eastAsia="zh-CN" w:bidi="hi-IN"/>
+        </w:rPr>
+      </w:pPr>
+      <w:r>
+        <w:rPr>
+          <w:rFonts w:ascii="Garamond" w:hAnsi="Garamond"/>
+          <w:sz w:val="36"/>
+          <w:szCs w:val="36"/>
+        </w:rPr>
+      </w:r>
+    </w:p>
+    <w:p>
+      <w:pPr>
+        <w:pStyle w:val="Normal"/>
+        <w:jc w:val="both"/>
+        <w:rPr>
+          <w:rFonts w:ascii="Garamond" w:hAnsi="Garamond"/>
+          <w:sz w:val="36"/>
+          <w:szCs w:val="36"/>
+        </w:rPr>
+      </w:pPr>
+      <w:r>
+        <w:rPr>
+          <w:rFonts w:eastAsia="Arial" w:cs="Arial" w:ascii="Garamond" w:hAnsi="Garamond"/>
+          <w:color w:val="auto"/>
+          <w:kern w:val="0"/>
+          <w:sz w:val="36"/>
+          <w:szCs w:val="36"/>
+          <w:lang w:val="en-US" w:eastAsia="zh-CN" w:bidi="hi-IN"/>
+        </w:rPr>
+        <w:t>como vinha sendo sua vida  anos vividos com Jesus, desde seu nascimento</w:t>
+      </w:r>
+    </w:p>
+    <w:p>
+      <w:pPr>
+        <w:pStyle w:val="Normal"/>
+        <w:jc w:val="center"/>
+        <w:rPr>
+          <w:b/>
+          <w:b/>
+          <w:bCs/>
+          <w:color w:val="C9211E"/>
+        </w:rPr>
+      </w:pPr>
+      <w:r>
+        <w:rPr>
+          <w:rFonts w:eastAsia="Arial" w:cs="Arial" w:ascii="Garamond" w:hAnsi="Garamond"/>
+          <w:b/>
+          <w:bCs/>
+          <w:color w:val="C9211E"/>
+          <w:kern w:val="0"/>
+          <w:sz w:val="36"/>
+          <w:szCs w:val="36"/>
+          <w:shd w:fill="auto" w:val="clear"/>
+          <w:lang w:val="en-US" w:eastAsia="zh-CN" w:bidi="hi-IN"/>
+        </w:rPr>
+        <w:t xml:space="preserve">Maria retorna ao Plano Espiritual - </w:t>
+      </w:r>
+      <w:r>
+        <w:rPr>
+          <w:rFonts w:eastAsia="Arial" w:cs="Arial" w:ascii="Garamond" w:hAnsi="Garamond"/>
+          <w:b/>
+          <w:bCs/>
+          <w:i w:val="false"/>
+          <w:iCs w:val="false"/>
+          <w:color w:val="C9211E"/>
+          <w:kern w:val="0"/>
+          <w:sz w:val="36"/>
+          <w:szCs w:val="36"/>
           <w:shd w:fill="auto" w:val="clear"/>
           <w:lang w:val="en-US" w:eastAsia="zh-CN" w:bidi="hi-IN"/>
         </w:rPr>
@@ -4796,6 +5374,133 @@
           <w:lang w:val="en-US" w:eastAsia="zh-CN" w:bidi="hi-IN"/>
         </w:rPr>
         <w:t>Antes de sua definitiva ascensão aos Céus, Maria roga a Jesus a graça de rever os lugares marcados pela presença do Evangelho. Do alto, contempla a Galileia em silêncio, emocionada, enxergando o lago de Genesaré como se fosse um grande alaúde moldado pela natureza — instrumento sagrado que embalara a Boa Nova entre os homens. Seu olhar repousa com carinho sobre as paisagens que testemunharam os passos e ensinamentos de seu filho. Movida por compaixão e sensibilidade, pede ainda para visitar os discípulos em Roma, que sofriam perseguições e encarceramento por seguirem o Cristo. Lá, caminha entre os corredores sombrios das prisões, consolando os que se mantinham firmes na fé e rogando a Deus que deixasse em seus corações não apenas coragem, mas também alegria, mesmo em meio à dor. Aproxima-se especialmente de uma jovem prisioneira e, ao sussurrar palavras de esperança, vê nascer um canto doce e sereno, que se espalha entre os cativos como um sopro de paz. A canção transforma o ambiente, enchendo os corações aflitos de luz, como se a presença de Maria ali tivesse suavizado o sofrimento com o bálsamo do amor. Desde então, mesmo nos tempos mais sombrios, os seguidores de Jesus lembram-se daquele instante e continuam a cantar, sustentados pela herança de ternura e fé deixada pela Mãe Santíssima.</w:t>
+      </w:r>
+    </w:p>
+    <w:p>
+      <w:pPr>
+        <w:pStyle w:val="Normal"/>
+        <w:jc w:val="both"/>
+        <w:rPr>
+          <w:sz w:val="36"/>
+          <w:szCs w:val="36"/>
+        </w:rPr>
+      </w:pPr>
+      <w:r>
+        <w:rPr/>
+      </w:r>
+    </w:p>
+    <w:p>
+      <w:pPr>
+        <w:pStyle w:val="Normal"/>
+        <w:jc w:val="both"/>
+        <w:rPr>
+          <w:sz w:val="36"/>
+          <w:szCs w:val="36"/>
+        </w:rPr>
+      </w:pPr>
+      <w:r>
+        <w:rPr>
+          <w:rFonts w:eastAsia="Arial" w:cs="Arial" w:ascii="Garamond" w:hAnsi="Garamond"/>
+          <w:color w:val="000000"/>
+          <w:kern w:val="0"/>
+          <w:sz w:val="36"/>
+          <w:szCs w:val="36"/>
+          <w:shd w:fill="auto" w:val="clear"/>
+          <w:lang w:val="en-US" w:eastAsia="zh-CN" w:bidi="hi-IN"/>
+        </w:rPr>
+        <w:t>&gt;&gt;&gt;&gt;&gt;&gt;&gt;&gt;&gt;&gt;&gt;&gt;&gt;&gt;&gt;&gt;&gt;&gt;&gt;&gt;&gt;&gt;</w:t>
+      </w:r>
+    </w:p>
+    <w:p>
+      <w:pPr>
+        <w:pStyle w:val="Normal"/>
+        <w:jc w:val="both"/>
+        <w:rPr>
+          <w:sz w:val="36"/>
+          <w:szCs w:val="36"/>
+        </w:rPr>
+      </w:pPr>
+      <w:r>
+        <w:rPr>
+          <w:rFonts w:eastAsia="Arial" w:cs="Arial" w:ascii="Garamond" w:hAnsi="Garamond"/>
+          <w:color w:val="000000"/>
+          <w:kern w:val="0"/>
+          <w:sz w:val="36"/>
+          <w:szCs w:val="36"/>
+          <w:shd w:fill="auto" w:val="clear"/>
+          <w:lang w:val="en-US" w:eastAsia="zh-CN" w:bidi="hi-IN"/>
+        </w:rPr>
+        <w:t>Ao longo da preparação desta palestra, minha visão sobre Maria de Nazaré passou por uma profunda transformação. Se antes eu a admirava simplesmente por ser a mãe de Jesus, o estudo detalhado de cada passagem em que ela é mencionada, cada palavra e até mesmo cada silêncio dela, me revelou a grandeza de seu espírito.</w:t>
+      </w:r>
+    </w:p>
+    <w:p>
+      <w:pPr>
+        <w:pStyle w:val="Normal"/>
+        <w:jc w:val="both"/>
+        <w:rPr>
+          <w:sz w:val="36"/>
+          <w:szCs w:val="36"/>
+        </w:rPr>
+      </w:pPr>
+      <w:r>
+        <w:rPr/>
+      </w:r>
+    </w:p>
+    <w:p>
+      <w:pPr>
+        <w:pStyle w:val="Normal"/>
+        <w:jc w:val="both"/>
+        <w:rPr>
+          <w:sz w:val="36"/>
+          <w:szCs w:val="36"/>
+        </w:rPr>
+      </w:pPr>
+      <w:r>
+        <w:rPr>
+          <w:rFonts w:eastAsia="Arial" w:cs="Arial" w:ascii="Garamond" w:hAnsi="Garamond"/>
+          <w:color w:val="000000"/>
+          <w:kern w:val="0"/>
+          <w:sz w:val="36"/>
+          <w:szCs w:val="36"/>
+          <w:shd w:fill="auto" w:val="clear"/>
+          <w:lang w:val="en-US" w:eastAsia="zh-CN" w:bidi="hi-IN"/>
+        </w:rPr>
+        <w:t>Maria não é apenas uma figura histórica ou religiosa; ela é um exemplo vivo de humildade, coragem e fé inabalável. Sua presença discreta, sua entrega silenciosa e seu papel fundamental na missão de Jesus me ensinaram que, às vezes, é no silêncio e na simplicidade que se encontra a maior força.</w:t>
+      </w:r>
+    </w:p>
+    <w:p>
+      <w:pPr>
+        <w:pStyle w:val="Normal"/>
+        <w:jc w:val="both"/>
+        <w:rPr>
+          <w:sz w:val="36"/>
+          <w:szCs w:val="36"/>
+        </w:rPr>
+      </w:pPr>
+      <w:r>
+        <w:rPr/>
+      </w:r>
+    </w:p>
+    <w:p>
+      <w:pPr>
+        <w:pStyle w:val="Normal"/>
+        <w:jc w:val="both"/>
+        <w:rPr>
+          <w:sz w:val="36"/>
+          <w:szCs w:val="36"/>
+        </w:rPr>
+      </w:pPr>
+      <w:r>
+        <w:rPr>
+          <w:rFonts w:eastAsia="Arial" w:cs="Arial" w:ascii="Garamond" w:hAnsi="Garamond"/>
+          <w:color w:val="000000"/>
+          <w:kern w:val="0"/>
+          <w:sz w:val="36"/>
+          <w:szCs w:val="36"/>
+          <w:shd w:fill="auto" w:val="clear"/>
+          <w:lang w:val="en-US" w:eastAsia="zh-CN" w:bidi="hi-IN"/>
+        </w:rPr>
+        <w:t>Essa descoberta pessoal reforçou não só a minha admiração, mas também meu respeito e gratidão por Maria, que permanece um farol espiritual para todos nós, inspirando fé e esperança em meio às dificuldades da vida.</w:t>
       </w:r>
     </w:p>
     <w:sectPr>
@@ -4867,7 +5572,7 @@
         <w:bCs/>
         <w:rFonts w:ascii="Garamond" w:hAnsi="Garamond"/>
       </w:rPr>
-      <w:t>23</w:t>
+      <w:t>24</w:t>
     </w:r>
     <w:r>
       <w:rPr>

</xml_diff>

<commit_message>
16/05/2025 - 22:26 h
</commit_message>
<xml_diff>
--- a/Maria de Nazaré e a disposição em servir/Maria de Nazaré e a disposição em servir.docx
+++ b/Maria de Nazaré e a disposição em servir/Maria de Nazaré e a disposição em servir.docx
@@ -3848,8 +3848,37 @@
           <w:shd w:fill="auto" w:val="clear"/>
           <w:lang w:val="en-US" w:eastAsia="zh-CN" w:bidi="hi-IN"/>
         </w:rPr>
-        <w:t xml:space="preserve">Ao pé da cruz, Maria nos oferece um dos </w:t>
-      </w:r>
+        <w:t xml:space="preserve">Ao pé da cruz, Maria nos oferece um dos mais belos testemunhos de amor, fidelidade e entrega silenciosa. Diante do sofrimento indescritível de Jesus, ela não se esconde, não se desespera, não reclama. Permanece ali de maneira firme, serena e corajosa. </w:t>
+      </w:r>
+    </w:p>
+    <w:p>
+      <w:pPr>
+        <w:pStyle w:val="Normal"/>
+        <w:jc w:val="both"/>
+        <w:rPr>
+          <w:rFonts w:ascii="Garamond" w:hAnsi="Garamond"/>
+          <w:sz w:val="36"/>
+          <w:szCs w:val="36"/>
+        </w:rPr>
+      </w:pPr>
+      <w:r>
+        <w:rPr>
+          <w:rFonts w:ascii="Garamond" w:hAnsi="Garamond"/>
+          <w:sz w:val="36"/>
+          <w:szCs w:val="36"/>
+        </w:rPr>
+      </w:r>
+    </w:p>
+    <w:p>
+      <w:pPr>
+        <w:pStyle w:val="Normal"/>
+        <w:jc w:val="both"/>
+        <w:rPr>
+          <w:rFonts w:ascii="Garamond" w:hAnsi="Garamond"/>
+          <w:sz w:val="36"/>
+          <w:szCs w:val="36"/>
+        </w:rPr>
+      </w:pPr>
       <w:r>
         <w:rPr>
           <w:rFonts w:eastAsia="Times New Roman" w:cs="Times New Roman" w:ascii="Garamond" w:hAnsi="Garamond"/>
@@ -3860,8 +3889,37 @@
           <w:shd w:fill="auto" w:val="clear"/>
           <w:lang w:val="en-US" w:eastAsia="zh-CN" w:bidi="hi-IN"/>
         </w:rPr>
-        <w:t xml:space="preserve">mais belos </w:t>
-      </w:r>
+        <w:t xml:space="preserve">Não julga os responsáveis pela morte de Jesus, nem os poderosos que O condenaram; não acusa os soldados que O pregaram na cruz, muito menos aqueles que em algum momento receberam o auxílio do Mestre, mas que naquela hora sombria O abandonaram. </w:t>
+      </w:r>
+    </w:p>
+    <w:p>
+      <w:pPr>
+        <w:pStyle w:val="Normal"/>
+        <w:jc w:val="both"/>
+        <w:rPr>
+          <w:rFonts w:ascii="Garamond" w:hAnsi="Garamond"/>
+          <w:sz w:val="36"/>
+          <w:szCs w:val="36"/>
+        </w:rPr>
+      </w:pPr>
+      <w:r>
+        <w:rPr>
+          <w:rFonts w:ascii="Garamond" w:hAnsi="Garamond"/>
+          <w:sz w:val="36"/>
+          <w:szCs w:val="36"/>
+        </w:rPr>
+      </w:r>
+    </w:p>
+    <w:p>
+      <w:pPr>
+        <w:pStyle w:val="Normal"/>
+        <w:jc w:val="both"/>
+        <w:rPr>
+          <w:rFonts w:ascii="Garamond" w:hAnsi="Garamond"/>
+          <w:sz w:val="36"/>
+          <w:szCs w:val="36"/>
+        </w:rPr>
+      </w:pPr>
       <w:r>
         <w:rPr>
           <w:rFonts w:eastAsia="Times New Roman" w:cs="Times New Roman" w:ascii="Garamond" w:hAnsi="Garamond"/>
@@ -3872,8 +3930,37 @@
           <w:shd w:fill="auto" w:val="clear"/>
           <w:lang w:val="en-US" w:eastAsia="zh-CN" w:bidi="hi-IN"/>
         </w:rPr>
-        <w:t xml:space="preserve">testemunhos de amor, fidelidade e entrega silenciosa. Diante do sofrimento indescritível </w:t>
-      </w:r>
+        <w:t>Diante da tragédia, Maria revela a virtude de quem compreende que o amor verdadeiro permanece firme, mesmo em meio ao sofrimento.</w:t>
+      </w:r>
+    </w:p>
+    <w:p>
+      <w:pPr>
+        <w:pStyle w:val="Normal"/>
+        <w:jc w:val="both"/>
+        <w:rPr>
+          <w:rFonts w:ascii="Garamond" w:hAnsi="Garamond"/>
+          <w:sz w:val="36"/>
+          <w:szCs w:val="36"/>
+        </w:rPr>
+      </w:pPr>
+      <w:r>
+        <w:rPr>
+          <w:rFonts w:ascii="Garamond" w:hAnsi="Garamond"/>
+          <w:sz w:val="36"/>
+          <w:szCs w:val="36"/>
+        </w:rPr>
+      </w:r>
+    </w:p>
+    <w:p>
+      <w:pPr>
+        <w:pStyle w:val="Normal"/>
+        <w:jc w:val="both"/>
+        <w:rPr>
+          <w:rFonts w:ascii="Garamond" w:hAnsi="Garamond"/>
+          <w:sz w:val="36"/>
+          <w:szCs w:val="36"/>
+        </w:rPr>
+      </w:pPr>
       <w:r>
         <w:rPr>
           <w:rFonts w:eastAsia="Times New Roman" w:cs="Times New Roman" w:ascii="Garamond" w:hAnsi="Garamond"/>
@@ -3884,8 +3971,37 @@
           <w:shd w:fill="auto" w:val="clear"/>
           <w:lang w:val="en-US" w:eastAsia="zh-CN" w:bidi="hi-IN"/>
         </w:rPr>
-        <w:t>de Jesus</w:t>
-      </w:r>
+        <w:t xml:space="preserve">Ali ela também reafirma sua fidelidade aos desígnios de Deus. Se em Belém ela recebeu Jesus nos braços, agora, no Calvário, ela O entrega de volta ao Pai — com a mesma humildade, com o mesmo espírito de serviço. Sua renúncia não é apenas materna, é espiritual. </w:t>
+      </w:r>
+    </w:p>
+    <w:p>
+      <w:pPr>
+        <w:pStyle w:val="Normal"/>
+        <w:jc w:val="both"/>
+        <w:rPr>
+          <w:rFonts w:ascii="Garamond" w:hAnsi="Garamond"/>
+          <w:sz w:val="36"/>
+          <w:szCs w:val="36"/>
+        </w:rPr>
+      </w:pPr>
+      <w:r>
+        <w:rPr>
+          <w:rFonts w:ascii="Garamond" w:hAnsi="Garamond"/>
+          <w:sz w:val="36"/>
+          <w:szCs w:val="36"/>
+        </w:rPr>
+      </w:r>
+    </w:p>
+    <w:p>
+      <w:pPr>
+        <w:pStyle w:val="Normal"/>
+        <w:jc w:val="both"/>
+        <w:rPr>
+          <w:rFonts w:ascii="Garamond" w:hAnsi="Garamond"/>
+          <w:sz w:val="36"/>
+          <w:szCs w:val="36"/>
+        </w:rPr>
+      </w:pPr>
       <w:r>
         <w:rPr>
           <w:rFonts w:eastAsia="Times New Roman" w:cs="Times New Roman" w:ascii="Garamond" w:hAnsi="Garamond"/>
@@ -3896,8 +4012,37 @@
           <w:shd w:fill="auto" w:val="clear"/>
           <w:lang w:val="en-US" w:eastAsia="zh-CN" w:bidi="hi-IN"/>
         </w:rPr>
-        <w:t xml:space="preserve">, ela não se esconde, não </w:t>
-      </w:r>
+        <w:t xml:space="preserve">No momento em que Jesus entrega João como um filho à Maria, Ele a eleva à condição de mãe de toda a humanidade e também nos ensina que o amor verdadeiro procede não apenas dos laços consanguíneos, mas, sim, da herança divina que todos nós possuímos. </w:t>
+      </w:r>
+    </w:p>
+    <w:p>
+      <w:pPr>
+        <w:pStyle w:val="Normal"/>
+        <w:jc w:val="both"/>
+        <w:rPr>
+          <w:rFonts w:ascii="Garamond" w:hAnsi="Garamond"/>
+          <w:sz w:val="36"/>
+          <w:szCs w:val="36"/>
+        </w:rPr>
+      </w:pPr>
+      <w:r>
+        <w:rPr>
+          <w:rFonts w:ascii="Garamond" w:hAnsi="Garamond"/>
+          <w:sz w:val="36"/>
+          <w:szCs w:val="36"/>
+        </w:rPr>
+      </w:r>
+    </w:p>
+    <w:p>
+      <w:pPr>
+        <w:pStyle w:val="Normal"/>
+        <w:jc w:val="both"/>
+        <w:rPr>
+          <w:rFonts w:ascii="Garamond" w:hAnsi="Garamond"/>
+          <w:sz w:val="36"/>
+          <w:szCs w:val="36"/>
+        </w:rPr>
+      </w:pPr>
       <w:r>
         <w:rPr>
           <w:rFonts w:eastAsia="Times New Roman" w:cs="Times New Roman" w:ascii="Garamond" w:hAnsi="Garamond"/>
@@ -3908,670 +4053,81 @@
           <w:shd w:fill="auto" w:val="clear"/>
           <w:lang w:val="en-US" w:eastAsia="zh-CN" w:bidi="hi-IN"/>
         </w:rPr>
-        <w:t xml:space="preserve">se </w:t>
-      </w:r>
-      <w:r>
-        <w:rPr>
-          <w:rFonts w:eastAsia="Times New Roman" w:cs="Times New Roman" w:ascii="Garamond" w:hAnsi="Garamond"/>
-          <w:color w:val="000000"/>
-          <w:kern w:val="0"/>
-          <w:sz w:val="36"/>
-          <w:szCs w:val="36"/>
-          <w:shd w:fill="auto" w:val="clear"/>
-          <w:lang w:val="en-US" w:eastAsia="zh-CN" w:bidi="hi-IN"/>
-        </w:rPr>
-        <w:t xml:space="preserve">desespera, não reclama. </w:t>
-      </w:r>
-      <w:r>
-        <w:rPr>
-          <w:rFonts w:eastAsia="Times New Roman" w:cs="Times New Roman" w:ascii="Garamond" w:hAnsi="Garamond"/>
-          <w:color w:val="000000"/>
-          <w:kern w:val="0"/>
-          <w:sz w:val="36"/>
-          <w:szCs w:val="36"/>
-          <w:shd w:fill="auto" w:val="clear"/>
-          <w:lang w:val="en-US" w:eastAsia="zh-CN" w:bidi="hi-IN"/>
-        </w:rPr>
-        <w:t>P</w:t>
-      </w:r>
-      <w:r>
-        <w:rPr>
-          <w:rFonts w:eastAsia="Times New Roman" w:cs="Times New Roman" w:ascii="Garamond" w:hAnsi="Garamond"/>
-          <w:color w:val="000000"/>
-          <w:kern w:val="0"/>
-          <w:sz w:val="36"/>
-          <w:szCs w:val="36"/>
-          <w:shd w:fill="auto" w:val="clear"/>
-          <w:lang w:val="en-US" w:eastAsia="zh-CN" w:bidi="hi-IN"/>
-        </w:rPr>
-        <w:t xml:space="preserve">ermanece </w:t>
-      </w:r>
-      <w:r>
-        <w:rPr>
-          <w:rFonts w:eastAsia="Times New Roman" w:cs="Times New Roman" w:ascii="Garamond" w:hAnsi="Garamond"/>
-          <w:color w:val="000000"/>
-          <w:kern w:val="0"/>
-          <w:sz w:val="36"/>
-          <w:szCs w:val="36"/>
-          <w:shd w:fill="auto" w:val="clear"/>
-          <w:lang w:val="en-US" w:eastAsia="zh-CN" w:bidi="hi-IN"/>
-        </w:rPr>
-        <w:t xml:space="preserve">ali </w:t>
-      </w:r>
-      <w:r>
-        <w:rPr>
-          <w:rFonts w:eastAsia="Times New Roman" w:cs="Times New Roman" w:ascii="Garamond" w:hAnsi="Garamond"/>
-          <w:color w:val="000000"/>
-          <w:kern w:val="0"/>
-          <w:sz w:val="36"/>
-          <w:szCs w:val="36"/>
-          <w:shd w:fill="auto" w:val="clear"/>
-          <w:lang w:val="en-US" w:eastAsia="zh-CN" w:bidi="hi-IN"/>
-        </w:rPr>
-        <w:t xml:space="preserve">de maneira firme, serena e corajosa. </w:t>
-      </w:r>
-    </w:p>
-    <w:p>
-      <w:pPr>
-        <w:pStyle w:val="Normal"/>
-        <w:jc w:val="both"/>
-        <w:rPr>
-          <w:rFonts w:ascii="Garamond" w:hAnsi="Garamond"/>
-          <w:sz w:val="36"/>
-          <w:szCs w:val="36"/>
-        </w:rPr>
-      </w:pPr>
-      <w:r>
-        <w:rPr>
-          <w:rFonts w:ascii="Garamond" w:hAnsi="Garamond"/>
-          <w:sz w:val="36"/>
-          <w:szCs w:val="36"/>
-        </w:rPr>
-      </w:r>
-    </w:p>
-    <w:p>
-      <w:pPr>
-        <w:pStyle w:val="Normal"/>
-        <w:jc w:val="both"/>
-        <w:rPr>
-          <w:rFonts w:ascii="Garamond" w:hAnsi="Garamond"/>
-          <w:sz w:val="36"/>
-          <w:szCs w:val="36"/>
-        </w:rPr>
-      </w:pPr>
-      <w:r>
-        <w:rPr>
-          <w:rFonts w:eastAsia="Times New Roman" w:cs="Times New Roman" w:ascii="Garamond" w:hAnsi="Garamond"/>
-          <w:color w:val="000000"/>
-          <w:kern w:val="0"/>
-          <w:sz w:val="36"/>
-          <w:szCs w:val="36"/>
-          <w:shd w:fill="auto" w:val="clear"/>
-          <w:lang w:val="en-US" w:eastAsia="zh-CN" w:bidi="hi-IN"/>
-        </w:rPr>
-        <w:t>N</w:t>
-      </w:r>
-      <w:r>
-        <w:rPr>
-          <w:rFonts w:eastAsia="Times New Roman" w:cs="Times New Roman" w:ascii="Garamond" w:hAnsi="Garamond"/>
-          <w:color w:val="000000"/>
-          <w:kern w:val="0"/>
-          <w:sz w:val="36"/>
-          <w:szCs w:val="36"/>
-          <w:shd w:fill="auto" w:val="clear"/>
-          <w:lang w:val="en-US" w:eastAsia="zh-CN" w:bidi="hi-IN"/>
-        </w:rPr>
-        <w:t xml:space="preserve">ão julga os responsáveis pela morte de Jesus, </w:t>
-      </w:r>
-      <w:r>
-        <w:rPr>
-          <w:rFonts w:eastAsia="Times New Roman" w:cs="Times New Roman" w:ascii="Garamond" w:hAnsi="Garamond"/>
-          <w:color w:val="000000"/>
-          <w:kern w:val="0"/>
-          <w:sz w:val="36"/>
-          <w:szCs w:val="36"/>
-          <w:shd w:fill="auto" w:val="clear"/>
-          <w:lang w:val="en-US" w:eastAsia="zh-CN" w:bidi="hi-IN"/>
-        </w:rPr>
-        <w:t>nem</w:t>
-      </w:r>
-      <w:r>
-        <w:rPr>
-          <w:rFonts w:eastAsia="Times New Roman" w:cs="Times New Roman" w:ascii="Garamond" w:hAnsi="Garamond"/>
-          <w:color w:val="000000"/>
-          <w:kern w:val="0"/>
-          <w:sz w:val="36"/>
-          <w:szCs w:val="36"/>
-          <w:shd w:fill="auto" w:val="clear"/>
-          <w:lang w:val="en-US" w:eastAsia="zh-CN" w:bidi="hi-IN"/>
-        </w:rPr>
-        <w:t xml:space="preserve"> os </w:t>
-      </w:r>
-      <w:r>
-        <w:rPr>
-          <w:rFonts w:eastAsia="Times New Roman" w:cs="Times New Roman" w:ascii="Garamond" w:hAnsi="Garamond"/>
-          <w:color w:val="000000"/>
-          <w:kern w:val="0"/>
-          <w:sz w:val="36"/>
-          <w:szCs w:val="36"/>
-          <w:shd w:fill="auto" w:val="clear"/>
-          <w:lang w:val="en-US" w:eastAsia="zh-CN" w:bidi="hi-IN"/>
-        </w:rPr>
-        <w:t>poderosos</w:t>
-      </w:r>
-      <w:r>
-        <w:rPr>
-          <w:rFonts w:eastAsia="Times New Roman" w:cs="Times New Roman" w:ascii="Garamond" w:hAnsi="Garamond"/>
-          <w:color w:val="000000"/>
-          <w:kern w:val="0"/>
-          <w:sz w:val="36"/>
-          <w:szCs w:val="36"/>
-          <w:shd w:fill="auto" w:val="clear"/>
-          <w:lang w:val="en-US" w:eastAsia="zh-CN" w:bidi="hi-IN"/>
-        </w:rPr>
-        <w:t xml:space="preserve"> que </w:t>
-      </w:r>
-      <w:r>
-        <w:rPr>
-          <w:rFonts w:eastAsia="Times New Roman" w:cs="Times New Roman" w:ascii="Garamond" w:hAnsi="Garamond"/>
-          <w:color w:val="000000"/>
-          <w:kern w:val="0"/>
-          <w:sz w:val="36"/>
-          <w:szCs w:val="36"/>
-          <w:shd w:fill="auto" w:val="clear"/>
-          <w:lang w:val="en-US" w:eastAsia="zh-CN" w:bidi="hi-IN"/>
-        </w:rPr>
-        <w:t>O condenaram</w:t>
-      </w:r>
-      <w:r>
-        <w:rPr>
-          <w:rFonts w:eastAsia="Times New Roman" w:cs="Times New Roman" w:ascii="Garamond" w:hAnsi="Garamond"/>
-          <w:color w:val="000000"/>
-          <w:kern w:val="0"/>
-          <w:sz w:val="36"/>
-          <w:szCs w:val="36"/>
-          <w:shd w:fill="auto" w:val="clear"/>
-          <w:lang w:val="en-US" w:eastAsia="zh-CN" w:bidi="hi-IN"/>
-        </w:rPr>
-        <w:t xml:space="preserve">; não acusa os soldados que </w:t>
-      </w:r>
-      <w:r>
-        <w:rPr>
-          <w:rFonts w:eastAsia="Times New Roman" w:cs="Times New Roman" w:ascii="Garamond" w:hAnsi="Garamond"/>
-          <w:color w:val="000000"/>
-          <w:kern w:val="0"/>
-          <w:sz w:val="36"/>
-          <w:szCs w:val="36"/>
-          <w:shd w:fill="auto" w:val="clear"/>
-          <w:lang w:val="en-US" w:eastAsia="zh-CN" w:bidi="hi-IN"/>
-        </w:rPr>
-        <w:t>O</w:t>
-      </w:r>
-      <w:r>
-        <w:rPr>
-          <w:rFonts w:eastAsia="Times New Roman" w:cs="Times New Roman" w:ascii="Garamond" w:hAnsi="Garamond"/>
-          <w:color w:val="000000"/>
-          <w:kern w:val="0"/>
-          <w:sz w:val="36"/>
-          <w:szCs w:val="36"/>
-          <w:shd w:fill="auto" w:val="clear"/>
-          <w:lang w:val="en-US" w:eastAsia="zh-CN" w:bidi="hi-IN"/>
-        </w:rPr>
-        <w:t xml:space="preserve"> pregaram na cruz, muito menos </w:t>
-      </w:r>
-      <w:r>
-        <w:rPr>
-          <w:rFonts w:eastAsia="Times New Roman" w:cs="Times New Roman" w:ascii="Garamond" w:hAnsi="Garamond"/>
-          <w:color w:val="000000"/>
-          <w:kern w:val="0"/>
-          <w:sz w:val="36"/>
-          <w:szCs w:val="36"/>
-          <w:shd w:fill="auto" w:val="clear"/>
-          <w:lang w:val="en-US" w:eastAsia="zh-CN" w:bidi="hi-IN"/>
-        </w:rPr>
-        <w:t>aqueles</w:t>
-      </w:r>
-      <w:r>
-        <w:rPr>
-          <w:rFonts w:eastAsia="Times New Roman" w:cs="Times New Roman" w:ascii="Garamond" w:hAnsi="Garamond"/>
-          <w:color w:val="000000"/>
-          <w:kern w:val="0"/>
-          <w:sz w:val="36"/>
-          <w:szCs w:val="36"/>
-          <w:shd w:fill="auto" w:val="clear"/>
-          <w:lang w:val="en-US" w:eastAsia="zh-CN" w:bidi="hi-IN"/>
-        </w:rPr>
-        <w:t xml:space="preserve"> </w:t>
-      </w:r>
-      <w:r>
-        <w:rPr>
-          <w:rFonts w:eastAsia="Times New Roman" w:cs="Times New Roman" w:ascii="Garamond" w:hAnsi="Garamond"/>
-          <w:color w:val="000000"/>
-          <w:kern w:val="0"/>
-          <w:sz w:val="36"/>
-          <w:szCs w:val="36"/>
-          <w:shd w:fill="auto" w:val="clear"/>
-          <w:lang w:val="en-US" w:eastAsia="zh-CN" w:bidi="hi-IN"/>
-        </w:rPr>
-        <w:t xml:space="preserve">que em algum momento receberam o auxílio do Mestre, mas que naquela hora sombria O abandonaram. </w:t>
-      </w:r>
-    </w:p>
-    <w:p>
-      <w:pPr>
-        <w:pStyle w:val="Normal"/>
-        <w:jc w:val="both"/>
-        <w:rPr>
-          <w:rFonts w:ascii="Garamond" w:hAnsi="Garamond"/>
-          <w:sz w:val="36"/>
-          <w:szCs w:val="36"/>
-        </w:rPr>
-      </w:pPr>
-      <w:r>
-        <w:rPr/>
-      </w:r>
-    </w:p>
-    <w:p>
-      <w:pPr>
-        <w:pStyle w:val="Normal"/>
-        <w:jc w:val="both"/>
-        <w:rPr>
-          <w:rFonts w:ascii="Garamond" w:hAnsi="Garamond"/>
-          <w:sz w:val="36"/>
-          <w:szCs w:val="36"/>
-        </w:rPr>
-      </w:pPr>
-      <w:r>
-        <w:rPr>
-          <w:rFonts w:eastAsia="Times New Roman" w:cs="Times New Roman" w:ascii="Garamond" w:hAnsi="Garamond"/>
-          <w:color w:val="000000"/>
-          <w:kern w:val="0"/>
-          <w:sz w:val="36"/>
-          <w:szCs w:val="36"/>
-          <w:shd w:fill="auto" w:val="clear"/>
-          <w:lang w:val="en-US" w:eastAsia="zh-CN" w:bidi="hi-IN"/>
-        </w:rPr>
-        <w:t xml:space="preserve">Diante da tragédia, Maria revela a virtude de quem compreende que o amor </w:t>
-      </w:r>
-      <w:r>
-        <w:rPr>
-          <w:rFonts w:eastAsia="Times New Roman" w:cs="Times New Roman" w:ascii="Garamond" w:hAnsi="Garamond"/>
-          <w:color w:val="000000"/>
-          <w:kern w:val="0"/>
-          <w:sz w:val="36"/>
-          <w:szCs w:val="36"/>
-          <w:shd w:fill="auto" w:val="clear"/>
-          <w:lang w:val="en-US" w:eastAsia="zh-CN" w:bidi="hi-IN"/>
-        </w:rPr>
-        <w:t>verdadeiro</w:t>
-      </w:r>
-      <w:r>
-        <w:rPr>
-          <w:rFonts w:eastAsia="Times New Roman" w:cs="Times New Roman" w:ascii="Garamond" w:hAnsi="Garamond"/>
-          <w:color w:val="000000"/>
-          <w:kern w:val="0"/>
-          <w:sz w:val="36"/>
-          <w:szCs w:val="36"/>
-          <w:shd w:fill="auto" w:val="clear"/>
-          <w:lang w:val="en-US" w:eastAsia="zh-CN" w:bidi="hi-IN"/>
-        </w:rPr>
-        <w:t xml:space="preserve"> permanece firme, mesmo em meio ao sofrimento.</w:t>
-      </w:r>
-    </w:p>
-    <w:p>
-      <w:pPr>
-        <w:pStyle w:val="Normal"/>
-        <w:jc w:val="both"/>
-        <w:rPr>
-          <w:rFonts w:ascii="Garamond" w:hAnsi="Garamond"/>
-          <w:sz w:val="36"/>
-          <w:szCs w:val="36"/>
-        </w:rPr>
-      </w:pPr>
-      <w:r>
-        <w:rPr>
-          <w:rFonts w:ascii="Garamond" w:hAnsi="Garamond"/>
-          <w:sz w:val="36"/>
-          <w:szCs w:val="36"/>
-        </w:rPr>
-      </w:r>
-    </w:p>
-    <w:p>
-      <w:pPr>
-        <w:pStyle w:val="Normal"/>
-        <w:jc w:val="both"/>
-        <w:rPr>
-          <w:rFonts w:ascii="Garamond" w:hAnsi="Garamond"/>
-          <w:sz w:val="36"/>
-          <w:szCs w:val="36"/>
-        </w:rPr>
-      </w:pPr>
-      <w:r>
-        <w:rPr>
-          <w:rFonts w:eastAsia="Times New Roman" w:cs="Times New Roman" w:ascii="Garamond" w:hAnsi="Garamond"/>
-          <w:color w:val="000000"/>
-          <w:kern w:val="0"/>
-          <w:sz w:val="36"/>
-          <w:szCs w:val="36"/>
-          <w:shd w:fill="auto" w:val="clear"/>
-          <w:lang w:val="en-US" w:eastAsia="zh-CN" w:bidi="hi-IN"/>
-        </w:rPr>
-        <w:t xml:space="preserve">Ali ela </w:t>
-      </w:r>
-      <w:r>
-        <w:rPr>
-          <w:rFonts w:eastAsia="Times New Roman" w:cs="Times New Roman" w:ascii="Garamond" w:hAnsi="Garamond"/>
-          <w:color w:val="000000"/>
-          <w:kern w:val="0"/>
-          <w:sz w:val="36"/>
-          <w:szCs w:val="36"/>
-          <w:shd w:fill="auto" w:val="clear"/>
-          <w:lang w:val="en-US" w:eastAsia="zh-CN" w:bidi="hi-IN"/>
-        </w:rPr>
-        <w:t xml:space="preserve">também </w:t>
-      </w:r>
-      <w:r>
-        <w:rPr>
-          <w:rFonts w:eastAsia="Times New Roman" w:cs="Times New Roman" w:ascii="Garamond" w:hAnsi="Garamond"/>
-          <w:color w:val="000000"/>
-          <w:kern w:val="0"/>
-          <w:sz w:val="36"/>
-          <w:szCs w:val="36"/>
-          <w:shd w:fill="auto" w:val="clear"/>
-          <w:lang w:val="en-US" w:eastAsia="zh-CN" w:bidi="hi-IN"/>
-        </w:rPr>
-        <w:t xml:space="preserve">reafirma sua fidelidade </w:t>
-      </w:r>
-      <w:r>
-        <w:rPr>
-          <w:rFonts w:eastAsia="Times New Roman" w:cs="Times New Roman" w:ascii="Garamond" w:hAnsi="Garamond"/>
-          <w:color w:val="000000"/>
-          <w:kern w:val="0"/>
-          <w:sz w:val="36"/>
-          <w:szCs w:val="36"/>
-          <w:shd w:fill="auto" w:val="clear"/>
-          <w:lang w:val="en-US" w:eastAsia="zh-CN" w:bidi="hi-IN"/>
-        </w:rPr>
-        <w:t>aos desígnios de Deus</w:t>
-      </w:r>
-      <w:r>
-        <w:rPr>
-          <w:rFonts w:eastAsia="Times New Roman" w:cs="Times New Roman" w:ascii="Garamond" w:hAnsi="Garamond"/>
-          <w:color w:val="000000"/>
-          <w:kern w:val="0"/>
-          <w:sz w:val="36"/>
-          <w:szCs w:val="36"/>
-          <w:shd w:fill="auto" w:val="clear"/>
-          <w:lang w:val="en-US" w:eastAsia="zh-CN" w:bidi="hi-IN"/>
-        </w:rPr>
-        <w:t xml:space="preserve">. Se em Belém ela recebeu Jesus nos braços, agora, no Calvário, ela O entrega de volta ao Pai — com a mesma humildade, com o mesmo espírito de serviço. Sua renúncia não é apenas materna, é espiritual. </w:t>
-      </w:r>
-    </w:p>
-    <w:p>
-      <w:pPr>
-        <w:pStyle w:val="Normal"/>
-        <w:jc w:val="both"/>
-        <w:rPr>
-          <w:rFonts w:ascii="Garamond" w:hAnsi="Garamond"/>
-          <w:sz w:val="36"/>
-          <w:szCs w:val="36"/>
-        </w:rPr>
-      </w:pPr>
-      <w:r>
-        <w:rPr>
-          <w:rFonts w:ascii="Garamond" w:hAnsi="Garamond"/>
-          <w:sz w:val="36"/>
-          <w:szCs w:val="36"/>
-        </w:rPr>
-      </w:r>
-    </w:p>
-    <w:p>
-      <w:pPr>
-        <w:pStyle w:val="Normal"/>
-        <w:jc w:val="both"/>
-        <w:rPr>
-          <w:rFonts w:ascii="Garamond" w:hAnsi="Garamond"/>
-          <w:sz w:val="36"/>
-          <w:szCs w:val="36"/>
-        </w:rPr>
-      </w:pPr>
-      <w:r>
-        <w:rPr>
-          <w:rFonts w:eastAsia="Times New Roman" w:cs="Times New Roman" w:ascii="Garamond" w:hAnsi="Garamond"/>
-          <w:color w:val="000000"/>
-          <w:kern w:val="0"/>
-          <w:sz w:val="36"/>
-          <w:szCs w:val="36"/>
-          <w:shd w:fill="auto" w:val="clear"/>
-          <w:lang w:val="en-US" w:eastAsia="zh-CN" w:bidi="hi-IN"/>
-        </w:rPr>
-        <w:t xml:space="preserve">No momento em que Jesus entrega João como um filho à Maria, Ele a eleva à condição de mãe de toda a humanidade e também </w:t>
-      </w:r>
-      <w:r>
-        <w:rPr>
-          <w:rFonts w:eastAsia="Times New Roman" w:cs="Times New Roman" w:ascii="Garamond" w:hAnsi="Garamond"/>
-          <w:color w:val="000000"/>
-          <w:kern w:val="0"/>
-          <w:sz w:val="36"/>
-          <w:szCs w:val="36"/>
-          <w:shd w:fill="auto" w:val="clear"/>
-          <w:lang w:val="en-US" w:eastAsia="zh-CN" w:bidi="hi-IN"/>
-        </w:rPr>
-        <w:t xml:space="preserve">nos ensina que o amor verdadeiro procede não apenas dos laços consanguíneos, mas, sim, da herança divina que todos nós possuímos. </w:t>
-      </w:r>
-    </w:p>
-    <w:p>
-      <w:pPr>
-        <w:pStyle w:val="Normal"/>
-        <w:jc w:val="both"/>
-        <w:rPr>
-          <w:rFonts w:ascii="Garamond" w:hAnsi="Garamond"/>
-          <w:sz w:val="36"/>
-          <w:szCs w:val="36"/>
-        </w:rPr>
-      </w:pPr>
-      <w:r>
-        <w:rPr/>
-      </w:r>
-    </w:p>
-    <w:p>
-      <w:pPr>
-        <w:pStyle w:val="Normal"/>
-        <w:jc w:val="both"/>
-        <w:rPr>
-          <w:rFonts w:ascii="Garamond" w:hAnsi="Garamond"/>
-          <w:sz w:val="36"/>
-          <w:szCs w:val="36"/>
-        </w:rPr>
-      </w:pPr>
-      <w:r>
-        <w:rPr>
-          <w:rFonts w:eastAsia="Times New Roman" w:cs="Times New Roman" w:ascii="Garamond" w:hAnsi="Garamond"/>
-          <w:color w:val="000000"/>
-          <w:kern w:val="0"/>
-          <w:sz w:val="36"/>
-          <w:szCs w:val="36"/>
-          <w:shd w:fill="auto" w:val="clear"/>
-          <w:lang w:val="en-US" w:eastAsia="zh-CN" w:bidi="hi-IN"/>
-        </w:rPr>
-        <w:t>E Maria, a</w:t>
-      </w:r>
-      <w:r>
-        <w:rPr>
-          <w:rFonts w:eastAsia="Times New Roman" w:cs="Times New Roman" w:ascii="Garamond" w:hAnsi="Garamond"/>
-          <w:color w:val="000000"/>
-          <w:kern w:val="0"/>
-          <w:sz w:val="36"/>
-          <w:szCs w:val="36"/>
-          <w:shd w:fill="auto" w:val="clear"/>
-          <w:lang w:val="en-US" w:eastAsia="zh-CN" w:bidi="hi-IN"/>
-        </w:rPr>
-        <w:t>pesar da enorme dor</w:t>
-      </w:r>
-      <w:r>
-        <w:rPr>
-          <w:rFonts w:eastAsia="Times New Roman" w:cs="Times New Roman" w:ascii="Garamond" w:hAnsi="Garamond"/>
-          <w:color w:val="000000"/>
-          <w:kern w:val="0"/>
-          <w:sz w:val="36"/>
-          <w:szCs w:val="36"/>
-          <w:shd w:fill="auto" w:val="clear"/>
-          <w:lang w:val="en-US" w:eastAsia="zh-CN" w:bidi="hi-IN"/>
-        </w:rPr>
-        <w:t xml:space="preserve"> daquele momento</w:t>
-      </w:r>
-      <w:r>
-        <w:rPr>
-          <w:rFonts w:eastAsia="Times New Roman" w:cs="Times New Roman" w:ascii="Garamond" w:hAnsi="Garamond"/>
-          <w:color w:val="000000"/>
-          <w:kern w:val="0"/>
-          <w:sz w:val="36"/>
-          <w:szCs w:val="36"/>
-          <w:shd w:fill="auto" w:val="clear"/>
-          <w:lang w:val="en-US" w:eastAsia="zh-CN" w:bidi="hi-IN"/>
-        </w:rPr>
-        <w:t xml:space="preserve">, não recusa </w:t>
-      </w:r>
-      <w:r>
-        <w:rPr>
-          <w:rFonts w:eastAsia="Times New Roman" w:cs="Times New Roman" w:ascii="Garamond" w:hAnsi="Garamond"/>
-          <w:color w:val="000000"/>
-          <w:kern w:val="0"/>
-          <w:sz w:val="36"/>
-          <w:szCs w:val="36"/>
-          <w:shd w:fill="auto" w:val="clear"/>
-          <w:lang w:val="en-US" w:eastAsia="zh-CN" w:bidi="hi-IN"/>
-        </w:rPr>
-        <w:t>su</w:t>
-      </w:r>
-      <w:r>
-        <w:rPr>
-          <w:rFonts w:eastAsia="Times New Roman" w:cs="Times New Roman" w:ascii="Garamond" w:hAnsi="Garamond"/>
-          <w:color w:val="000000"/>
-          <w:kern w:val="0"/>
-          <w:sz w:val="36"/>
-          <w:szCs w:val="36"/>
-          <w:shd w:fill="auto" w:val="clear"/>
-          <w:lang w:val="en-US" w:eastAsia="zh-CN" w:bidi="hi-IN"/>
-        </w:rPr>
-        <w:t xml:space="preserve">a nova </w:t>
-      </w:r>
-      <w:r>
-        <w:rPr>
-          <w:rFonts w:eastAsia="Times New Roman" w:cs="Times New Roman" w:ascii="Garamond" w:hAnsi="Garamond"/>
-          <w:color w:val="000000"/>
-          <w:kern w:val="0"/>
-          <w:sz w:val="36"/>
-          <w:szCs w:val="36"/>
-          <w:shd w:fill="auto" w:val="clear"/>
-          <w:lang w:val="en-US" w:eastAsia="zh-CN" w:bidi="hi-IN"/>
-        </w:rPr>
-        <w:t>missão</w:t>
-      </w:r>
-      <w:r>
-        <w:rPr>
-          <w:rFonts w:eastAsia="Times New Roman" w:cs="Times New Roman" w:ascii="Garamond" w:hAnsi="Garamond"/>
-          <w:color w:val="000000"/>
-          <w:kern w:val="0"/>
-          <w:sz w:val="36"/>
-          <w:szCs w:val="36"/>
-          <w:shd w:fill="auto" w:val="clear"/>
-          <w:lang w:val="en-US" w:eastAsia="zh-CN" w:bidi="hi-IN"/>
-        </w:rPr>
-        <w:t xml:space="preserve">. </w:t>
-      </w:r>
-    </w:p>
-    <w:p>
-      <w:pPr>
-        <w:pStyle w:val="Normal"/>
-        <w:jc w:val="both"/>
-        <w:rPr>
-          <w:rFonts w:ascii="Garamond" w:hAnsi="Garamond"/>
-          <w:sz w:val="36"/>
-          <w:szCs w:val="36"/>
-        </w:rPr>
-      </w:pPr>
-      <w:r>
-        <w:rPr>
-          <w:rFonts w:ascii="Garamond" w:hAnsi="Garamond"/>
-          <w:sz w:val="36"/>
-          <w:szCs w:val="36"/>
-        </w:rPr>
-      </w:r>
-    </w:p>
-    <w:p>
-      <w:pPr>
-        <w:pStyle w:val="Normal"/>
-        <w:jc w:val="both"/>
-        <w:rPr>
-          <w:rFonts w:ascii="Garamond" w:hAnsi="Garamond"/>
-          <w:sz w:val="36"/>
-          <w:szCs w:val="36"/>
-        </w:rPr>
-      </w:pPr>
-      <w:r>
-        <w:rPr>
-          <w:rFonts w:ascii="Garamond" w:hAnsi="Garamond"/>
-          <w:sz w:val="36"/>
-          <w:szCs w:val="36"/>
-        </w:rPr>
-        <w:t xml:space="preserve">A grandeza de espírito demonstrada por Maria ao pé da cruz é tamanha que nos faz hesitar diante da ideia de seguir seus passos. </w:t>
-      </w:r>
-      <w:r>
-        <w:rPr>
-          <w:rFonts w:ascii="Garamond" w:hAnsi="Garamond"/>
-          <w:sz w:val="36"/>
-          <w:szCs w:val="36"/>
-        </w:rPr>
-        <w:t>Apesar da distância abissal que existe entre nós e ela, precisamos refletir sobre as atitudes concretas que podemos tomar inspirados pelos exemplos de Maria.</w:t>
-      </w:r>
-    </w:p>
-    <w:p>
-      <w:pPr>
-        <w:pStyle w:val="Normal"/>
-        <w:jc w:val="both"/>
-        <w:rPr>
-          <w:rFonts w:ascii="Garamond" w:hAnsi="Garamond"/>
-          <w:sz w:val="36"/>
-          <w:szCs w:val="36"/>
-        </w:rPr>
-      </w:pPr>
-      <w:r>
-        <w:rPr/>
-      </w:r>
-    </w:p>
-    <w:p>
-      <w:pPr>
-        <w:pStyle w:val="Normal"/>
-        <w:jc w:val="both"/>
-        <w:rPr>
-          <w:rFonts w:ascii="Garamond" w:hAnsi="Garamond"/>
-          <w:sz w:val="36"/>
-          <w:szCs w:val="36"/>
-        </w:rPr>
-      </w:pPr>
-      <w:r>
-        <w:rPr>
-          <w:rFonts w:ascii="Garamond" w:hAnsi="Garamond"/>
-          <w:sz w:val="36"/>
-          <w:szCs w:val="36"/>
-        </w:rPr>
-        <w:t xml:space="preserve">A primeira </w:t>
-      </w:r>
-      <w:r>
-        <w:rPr>
-          <w:rFonts w:ascii="Garamond" w:hAnsi="Garamond"/>
-          <w:sz w:val="36"/>
-          <w:szCs w:val="36"/>
-        </w:rPr>
-        <w:t xml:space="preserve">e mais evidente </w:t>
-      </w:r>
-      <w:r>
-        <w:rPr>
-          <w:rFonts w:ascii="Garamond" w:hAnsi="Garamond"/>
-          <w:sz w:val="36"/>
-          <w:szCs w:val="36"/>
-        </w:rPr>
-        <w:t>é a resignação. Maria sabia que Jesus não merecia o sofrimento que lhe foi imposto, mas aceitou</w:t>
+        <w:t xml:space="preserve">E Maria, apesar da enorme dor daquele momento, não recusa sua nova missão. </w:t>
+      </w:r>
+    </w:p>
+    <w:p>
+      <w:pPr>
+        <w:pStyle w:val="Normal"/>
+        <w:jc w:val="both"/>
+        <w:rPr>
+          <w:rFonts w:ascii="Garamond" w:hAnsi="Garamond"/>
+          <w:sz w:val="36"/>
+          <w:szCs w:val="36"/>
+        </w:rPr>
+      </w:pPr>
+      <w:r>
+        <w:rPr>
+          <w:rFonts w:ascii="Garamond" w:hAnsi="Garamond"/>
+          <w:sz w:val="36"/>
+          <w:szCs w:val="36"/>
+        </w:rPr>
+      </w:r>
+    </w:p>
+    <w:p>
+      <w:pPr>
+        <w:pStyle w:val="Normal"/>
+        <w:jc w:val="both"/>
+        <w:rPr>
+          <w:rFonts w:ascii="Garamond" w:hAnsi="Garamond"/>
+          <w:sz w:val="36"/>
+          <w:szCs w:val="36"/>
+        </w:rPr>
+      </w:pPr>
+      <w:r>
+        <w:rPr>
+          <w:rFonts w:ascii="Garamond" w:hAnsi="Garamond"/>
+          <w:sz w:val="36"/>
+          <w:szCs w:val="36"/>
+        </w:rPr>
+        <w:t>A grandeza de espírito demonstrada por Maria ao pé da cruz é tamanha que nos faz hesitar diante da ideia de seguir seus passos. Apesar da distância abissal que existe entre nós e ela, precisamos refletir sobre as atitudes concretas que podemos tomar inspirados pelos exemplos de Maria.</w:t>
+      </w:r>
+    </w:p>
+    <w:p>
+      <w:pPr>
+        <w:pStyle w:val="Normal"/>
+        <w:jc w:val="both"/>
+        <w:rPr>
+          <w:rFonts w:ascii="Garamond" w:hAnsi="Garamond"/>
+          <w:sz w:val="36"/>
+          <w:szCs w:val="36"/>
+        </w:rPr>
+      </w:pPr>
+      <w:r>
+        <w:rPr>
+          <w:rFonts w:ascii="Garamond" w:hAnsi="Garamond"/>
+          <w:sz w:val="36"/>
+          <w:szCs w:val="36"/>
+        </w:rPr>
+      </w:r>
+    </w:p>
+    <w:p>
+      <w:pPr>
+        <w:pStyle w:val="Normal"/>
+        <w:jc w:val="both"/>
+        <w:rPr>
+          <w:rFonts w:ascii="Garamond" w:hAnsi="Garamond"/>
+          <w:sz w:val="36"/>
+          <w:szCs w:val="36"/>
+        </w:rPr>
+      </w:pPr>
+      <w:r>
+        <w:rPr>
+          <w:rFonts w:ascii="Garamond" w:hAnsi="Garamond"/>
+          <w:sz w:val="36"/>
+          <w:szCs w:val="36"/>
+        </w:rPr>
+        <w:t>A primeira e mais evidente é a resignação. Maria sabia que Jesus não merecia o sofrimento que lhe foi imposto, mas aceitou</w:t>
       </w:r>
       <w:r>
         <w:rPr>
@@ -4642,42 +4198,30 @@
         </w:rPr>
       </w:pPr>
       <w:r>
-        <w:rPr/>
-      </w:r>
-    </w:p>
-    <w:p>
-      <w:pPr>
-        <w:pStyle w:val="Normal"/>
-        <w:jc w:val="both"/>
-        <w:rPr>
-          <w:rFonts w:ascii="Garamond" w:hAnsi="Garamond"/>
-          <w:sz w:val="36"/>
-          <w:szCs w:val="36"/>
-        </w:rPr>
-      </w:pPr>
-      <w:r>
-        <w:rPr>
-          <w:rFonts w:ascii="Garamond" w:hAnsi="Garamond"/>
-          <w:sz w:val="36"/>
-          <w:szCs w:val="36"/>
-        </w:rPr>
-        <w:t>Muitas vezes, enfrentamos situações em que nós  — ou alguém que amamos — sofre, aparentemente sem motivo. Apesar dos esforços, d</w:t>
-      </w:r>
-      <w:r>
-        <w:rPr>
-          <w:rFonts w:ascii="Garamond" w:hAnsi="Garamond"/>
-          <w:sz w:val="36"/>
-          <w:szCs w:val="36"/>
-        </w:rPr>
-        <w:t>e todo o auxílio</w:t>
-      </w:r>
-      <w:r>
-        <w:rPr>
-          <w:rFonts w:ascii="Garamond" w:hAnsi="Garamond"/>
-          <w:sz w:val="36"/>
-          <w:szCs w:val="36"/>
-        </w:rPr>
-        <w:t xml:space="preserve"> e d</w:t>
+        <w:rPr>
+          <w:rFonts w:ascii="Garamond" w:hAnsi="Garamond"/>
+          <w:sz w:val="36"/>
+          <w:szCs w:val="36"/>
+        </w:rPr>
+      </w:r>
+    </w:p>
+    <w:p>
+      <w:pPr>
+        <w:pStyle w:val="Normal"/>
+        <w:jc w:val="both"/>
+        <w:rPr>
+          <w:rFonts w:ascii="Garamond" w:hAnsi="Garamond"/>
+          <w:sz w:val="36"/>
+          <w:szCs w:val="36"/>
+        </w:rPr>
+      </w:pPr>
+      <w:r>
+        <w:rPr>
+          <w:rFonts w:ascii="Garamond" w:hAnsi="Garamond"/>
+          <w:sz w:val="36"/>
+          <w:szCs w:val="36"/>
+        </w:rPr>
+        <w:t>Muitas vezes, enfrentamos situações em que nós  — ou alguém que amamos — sofre, aparentemente sem motivo. Apesar dos esforços, de todo o auxílio e d</w:t>
       </w:r>
       <w:r>
         <w:rPr>
@@ -4696,165 +4240,81 @@
           <w:sz w:val="36"/>
           <w:szCs w:val="36"/>
         </w:rPr>
-        <w:t xml:space="preserve"> orações</w:t>
-      </w:r>
-      <w:r>
-        <w:rPr>
-          <w:rFonts w:ascii="Garamond" w:hAnsi="Garamond"/>
-          <w:sz w:val="36"/>
-          <w:szCs w:val="36"/>
-        </w:rPr>
-        <w:t xml:space="preserve"> recebidas</w:t>
-      </w:r>
-      <w:r>
-        <w:rPr>
-          <w:rFonts w:ascii="Garamond" w:hAnsi="Garamond"/>
-          <w:sz w:val="36"/>
-          <w:szCs w:val="36"/>
-        </w:rPr>
-        <w:t xml:space="preserve">, a dor persiste. Nessas horas, é </w:t>
-      </w:r>
-      <w:r>
-        <w:rPr>
-          <w:rFonts w:ascii="Garamond" w:hAnsi="Garamond"/>
-          <w:sz w:val="36"/>
-          <w:szCs w:val="36"/>
-        </w:rPr>
-        <w:t xml:space="preserve">comum nossa fé se abalar e nós questionarmos a </w:t>
-      </w:r>
-      <w:r>
-        <w:rPr>
-          <w:rFonts w:ascii="Garamond" w:hAnsi="Garamond"/>
-          <w:sz w:val="36"/>
-          <w:szCs w:val="36"/>
-        </w:rPr>
-        <w:t>justiça divina.</w:t>
-      </w:r>
-    </w:p>
-    <w:p>
-      <w:pPr>
-        <w:pStyle w:val="Normal"/>
-        <w:jc w:val="both"/>
-        <w:rPr>
-          <w:rFonts w:ascii="Garamond" w:hAnsi="Garamond"/>
-          <w:sz w:val="36"/>
-          <w:szCs w:val="36"/>
-        </w:rPr>
-      </w:pPr>
-      <w:r>
-        <w:rPr>
-          <w:rFonts w:ascii="Garamond" w:hAnsi="Garamond"/>
-          <w:sz w:val="36"/>
-          <w:szCs w:val="36"/>
-        </w:rPr>
-      </w:r>
-    </w:p>
-    <w:p>
-      <w:pPr>
-        <w:pStyle w:val="Normal"/>
-        <w:jc w:val="both"/>
-        <w:rPr>
-          <w:rFonts w:ascii="Garamond" w:hAnsi="Garamond"/>
-          <w:sz w:val="36"/>
-          <w:szCs w:val="36"/>
-        </w:rPr>
-      </w:pPr>
-      <w:r>
-        <w:rPr>
-          <w:rFonts w:ascii="Garamond" w:hAnsi="Garamond"/>
-          <w:sz w:val="36"/>
-          <w:szCs w:val="36"/>
-        </w:rPr>
-        <w:t xml:space="preserve">Assim como Maria permaneceu firme diante do sofrimento de seu </w:t>
-      </w:r>
-      <w:r>
-        <w:rPr>
-          <w:rFonts w:ascii="Garamond" w:hAnsi="Garamond"/>
-          <w:sz w:val="36"/>
-          <w:szCs w:val="36"/>
-        </w:rPr>
-        <w:t>f</w:t>
-      </w:r>
-      <w:r>
-        <w:rPr>
-          <w:rFonts w:ascii="Garamond" w:hAnsi="Garamond"/>
-          <w:sz w:val="36"/>
-          <w:szCs w:val="36"/>
-        </w:rPr>
-        <w:t xml:space="preserve">ilho, somos convidados a confiar, mesmo quando tudo parece envolto em escuridão. A resignação, nesse contexto, não é passividade, mas um ato profundo de fé: consiste em entregar a Deus aquilo que nos escapa à compreensão, </w:t>
-      </w:r>
-      <w:r>
-        <w:rPr>
-          <w:rFonts w:ascii="Garamond" w:hAnsi="Garamond"/>
-          <w:sz w:val="36"/>
-          <w:szCs w:val="36"/>
-        </w:rPr>
-        <w:t>mesmo depois de termos feito tudo o que poderíamos para pôr um termo ao sofrimento.</w:t>
-      </w:r>
-    </w:p>
-    <w:p>
-      <w:pPr>
-        <w:pStyle w:val="Normal"/>
-        <w:jc w:val="both"/>
-        <w:rPr>
-          <w:rFonts w:ascii="Garamond" w:hAnsi="Garamond"/>
-          <w:sz w:val="36"/>
-          <w:szCs w:val="36"/>
-        </w:rPr>
-      </w:pPr>
-      <w:r>
-        <w:rPr/>
-      </w:r>
-    </w:p>
-    <w:p>
-      <w:pPr>
-        <w:pStyle w:val="Normal"/>
-        <w:jc w:val="both"/>
-        <w:rPr>
-          <w:rFonts w:ascii="Garamond" w:hAnsi="Garamond"/>
-          <w:sz w:val="36"/>
-          <w:szCs w:val="36"/>
-        </w:rPr>
-      </w:pPr>
-      <w:r>
-        <w:rPr>
-          <w:rFonts w:ascii="Garamond" w:hAnsi="Garamond"/>
-          <w:sz w:val="36"/>
-          <w:szCs w:val="36"/>
-        </w:rPr>
-        <w:t>Mas Maria não apenas se resignou — ela permaneceu presente. Não fugiu da dor, nem abandonou Jesus em seu momento de maior angústia. Estava ali, silenciosa, mas inabalável</w:t>
-      </w:r>
-      <w:r>
-        <w:rPr>
-          <w:rFonts w:ascii="Garamond" w:hAnsi="Garamond"/>
-          <w:sz w:val="36"/>
-          <w:szCs w:val="36"/>
-        </w:rPr>
-        <w:t>.</w:t>
-      </w:r>
-      <w:r>
-        <w:rPr>
-          <w:rFonts w:ascii="Garamond" w:hAnsi="Garamond"/>
-          <w:sz w:val="36"/>
-          <w:szCs w:val="36"/>
-        </w:rPr>
-        <w:t xml:space="preserve"> E nos ensina que, embora nem sempre possamos afastar o sofrimento</w:t>
-      </w:r>
-      <w:r>
-        <w:rPr>
-          <w:rFonts w:ascii="Garamond" w:hAnsi="Garamond"/>
-          <w:sz w:val="36"/>
-          <w:szCs w:val="36"/>
-        </w:rPr>
-        <w:t>,</w:t>
-      </w:r>
-      <w:r>
-        <w:rPr>
-          <w:rFonts w:ascii="Garamond" w:hAnsi="Garamond"/>
-          <w:sz w:val="36"/>
-          <w:szCs w:val="36"/>
-        </w:rPr>
-        <w:t xml:space="preserve"> </w:t>
+        <w:t xml:space="preserve"> orações recebidas, a dor persiste. Nessas horas, é comum nossa fé se abalar e nós questionarmos a justiça divina.</w:t>
+      </w:r>
+    </w:p>
+    <w:p>
+      <w:pPr>
+        <w:pStyle w:val="Normal"/>
+        <w:jc w:val="both"/>
+        <w:rPr>
+          <w:rFonts w:ascii="Garamond" w:hAnsi="Garamond"/>
+          <w:sz w:val="36"/>
+          <w:szCs w:val="36"/>
+        </w:rPr>
+      </w:pPr>
+      <w:r>
+        <w:rPr>
+          <w:rFonts w:ascii="Garamond" w:hAnsi="Garamond"/>
+          <w:sz w:val="36"/>
+          <w:szCs w:val="36"/>
+        </w:rPr>
+      </w:r>
+    </w:p>
+    <w:p>
+      <w:pPr>
+        <w:pStyle w:val="Normal"/>
+        <w:jc w:val="both"/>
+        <w:rPr>
+          <w:rFonts w:ascii="Garamond" w:hAnsi="Garamond"/>
+          <w:sz w:val="36"/>
+          <w:szCs w:val="36"/>
+        </w:rPr>
+      </w:pPr>
+      <w:r>
+        <w:rPr>
+          <w:rFonts w:ascii="Garamond" w:hAnsi="Garamond"/>
+          <w:sz w:val="36"/>
+          <w:szCs w:val="36"/>
+        </w:rPr>
+        <w:t>Assim como Maria permaneceu firme diante do sofrimento de seu filho, somos convidados a confiar, mesmo quando tudo parece envolto em escuridão. A resignação, nesse contexto, não é passividade, mas um ato profundo de fé: consiste em entregar a Deus aquilo que nos escapa à compreensão, mesmo depois de termos feito tudo o que poderíamos para pôr um termo ao sofrimento.</w:t>
+      </w:r>
+    </w:p>
+    <w:p>
+      <w:pPr>
+        <w:pStyle w:val="Normal"/>
+        <w:jc w:val="both"/>
+        <w:rPr>
+          <w:rFonts w:ascii="Garamond" w:hAnsi="Garamond"/>
+          <w:sz w:val="36"/>
+          <w:szCs w:val="36"/>
+        </w:rPr>
+      </w:pPr>
+      <w:r>
+        <w:rPr>
+          <w:rFonts w:ascii="Garamond" w:hAnsi="Garamond"/>
+          <w:sz w:val="36"/>
+          <w:szCs w:val="36"/>
+        </w:rPr>
+      </w:r>
+    </w:p>
+    <w:p>
+      <w:pPr>
+        <w:pStyle w:val="Normal"/>
+        <w:jc w:val="both"/>
+        <w:rPr>
+          <w:rFonts w:ascii="Garamond" w:hAnsi="Garamond"/>
+          <w:sz w:val="36"/>
+          <w:szCs w:val="36"/>
+        </w:rPr>
+      </w:pPr>
+      <w:r>
+        <w:rPr>
+          <w:rFonts w:ascii="Garamond" w:hAnsi="Garamond"/>
+          <w:sz w:val="36"/>
+          <w:szCs w:val="36"/>
+        </w:rPr>
+        <w:t xml:space="preserve">Mas Maria não apenas se resignou — ela permaneceu presente. Não fugiu da dor, nem abandonou Jesus em seu momento de maior angústia. Estava ali, silenciosa, mas inabalável. E nos ensina que, embora nem sempre possamos afastar o sofrimento, </w:t>
       </w:r>
       <w:r>
         <w:rPr>
@@ -4887,7 +4347,11 @@
         </w:rPr>
       </w:pPr>
       <w:r>
-        <w:rPr/>
+        <w:rPr>
+          <w:rFonts w:ascii="Garamond" w:hAnsi="Garamond"/>
+          <w:sz w:val="36"/>
+          <w:szCs w:val="36"/>
+        </w:rPr>
       </w:r>
     </w:p>
     <w:p>
@@ -4920,7 +4384,11 @@
         </w:rPr>
       </w:pPr>
       <w:r>
-        <w:rPr/>
+        <w:rPr>
+          <w:rFonts w:ascii="Garamond" w:hAnsi="Garamond"/>
+          <w:sz w:val="36"/>
+          <w:szCs w:val="36"/>
+        </w:rPr>
       </w:r>
     </w:p>
     <w:p>
@@ -4958,29 +4426,25 @@
           <w:sz w:val="36"/>
           <w:szCs w:val="36"/>
         </w:rPr>
-        <w:t xml:space="preserve"> passagem da crucificação de Jesus, Maria só volta a ser citada nos evangelhos </w:t>
-      </w:r>
-      <w:r>
-        <w:rPr>
-          <w:rFonts w:ascii="Garamond" w:hAnsi="Garamond"/>
-          <w:sz w:val="36"/>
-          <w:szCs w:val="36"/>
-        </w:rPr>
-        <w:t>em Atos 1:14:</w:t>
-      </w:r>
-    </w:p>
-    <w:p>
-      <w:pPr>
-        <w:pStyle w:val="Normal"/>
-        <w:jc w:val="both"/>
-        <w:rPr>
-          <w:rFonts w:ascii="Garamond" w:hAnsi="Garamond"/>
-          <w:sz w:val="36"/>
-          <w:szCs w:val="36"/>
-        </w:rPr>
-      </w:pPr>
-      <w:r>
-        <w:rPr/>
+        <w:t xml:space="preserve"> passagem da crucificação de Jesus, Maria só volta a ser citada nos evangelhos em Atos 1:14:</w:t>
+      </w:r>
+    </w:p>
+    <w:p>
+      <w:pPr>
+        <w:pStyle w:val="Normal"/>
+        <w:jc w:val="both"/>
+        <w:rPr>
+          <w:rFonts w:ascii="Garamond" w:hAnsi="Garamond"/>
+          <w:sz w:val="36"/>
+          <w:szCs w:val="36"/>
+        </w:rPr>
+      </w:pPr>
+      <w:r>
+        <w:rPr>
+          <w:rFonts w:ascii="Garamond" w:hAnsi="Garamond"/>
+          <w:sz w:val="36"/>
+          <w:szCs w:val="36"/>
+        </w:rPr>
       </w:r>
     </w:p>
     <w:p>
@@ -5066,9 +4530,10 @@
       </w:pPr>
       <w:r>
         <w:rPr>
-          <w:rFonts w:ascii="Garamond" w:hAnsi="Garamond"/>
-          <w:sz w:val="36"/>
-          <w:szCs w:val="36"/>
+          <w:rFonts w:eastAsia="Arial" w:cs="Arial"/>
+          <w:color w:val="auto"/>
+          <w:kern w:val="0"/>
+          <w:lang w:val="en-US" w:eastAsia="zh-CN" w:bidi="hi-IN"/>
         </w:rPr>
       </w:r>
     </w:p>
@@ -5107,50 +4572,74 @@
       </w:pPr>
       <w:r>
         <w:rPr>
-          <w:rFonts w:ascii="Garamond" w:hAnsi="Garamond"/>
-          <w:sz w:val="36"/>
-          <w:szCs w:val="36"/>
-        </w:rPr>
-      </w:r>
-    </w:p>
-    <w:p>
-      <w:pPr>
-        <w:pStyle w:val="Normal"/>
-        <w:jc w:val="both"/>
-        <w:rPr>
-          <w:rFonts w:ascii="Garamond" w:hAnsi="Garamond"/>
-          <w:sz w:val="36"/>
-          <w:szCs w:val="36"/>
-        </w:rPr>
-      </w:pPr>
-      <w:r>
-        <w:rPr>
-          <w:rFonts w:eastAsia="Arial" w:cs="Arial" w:ascii="Garamond" w:hAnsi="Garamond"/>
-          <w:color w:val="auto"/>
-          <w:kern w:val="0"/>
-          <w:sz w:val="36"/>
-          <w:szCs w:val="36"/>
-          <w:lang w:val="en-US" w:eastAsia="zh-CN" w:bidi="hi-IN"/>
-        </w:rPr>
-        <w:t>Recorda-se frequentemente do dia em que Jesus nasceu naquele berço simples e improvisado. Recorda-se também das paisagens belas e alegres de Nazaré, entre as quais surgia o filho trabalhando e amando.</w:t>
-      </w:r>
-    </w:p>
-    <w:p>
-      <w:pPr>
-        <w:pStyle w:val="Normal"/>
-        <w:jc w:val="both"/>
-        <w:rPr>
           <w:rFonts w:eastAsia="Arial" w:cs="Arial"/>
           <w:color w:val="auto"/>
           <w:kern w:val="0"/>
           <w:lang w:val="en-US" w:eastAsia="zh-CN" w:bidi="hi-IN"/>
         </w:rPr>
-      </w:pPr>
-      <w:r>
-        <w:rPr>
-          <w:rFonts w:ascii="Garamond" w:hAnsi="Garamond"/>
-          <w:sz w:val="36"/>
-          <w:szCs w:val="36"/>
+      </w:r>
+    </w:p>
+    <w:p>
+      <w:pPr>
+        <w:pStyle w:val="Normal"/>
+        <w:jc w:val="both"/>
+        <w:rPr>
+          <w:rFonts w:ascii="Garamond" w:hAnsi="Garamond"/>
+          <w:sz w:val="36"/>
+          <w:szCs w:val="36"/>
+        </w:rPr>
+      </w:pPr>
+      <w:r>
+        <w:rPr>
+          <w:rFonts w:eastAsia="Arial" w:cs="Arial" w:ascii="Garamond" w:hAnsi="Garamond"/>
+          <w:color w:val="auto"/>
+          <w:kern w:val="0"/>
+          <w:sz w:val="36"/>
+          <w:szCs w:val="36"/>
+          <w:lang w:val="en-US" w:eastAsia="zh-CN" w:bidi="hi-IN"/>
+        </w:rPr>
+        <w:t xml:space="preserve">Recorda-se frequentemente do dia em que Jesus nasceu naquele berço simples e improvisado. Recorda-se também das paisagens belas e alegres de Nazaré, entre as quais </w:t>
+      </w:r>
+      <w:r>
+        <w:rPr>
+          <w:rFonts w:eastAsia="Arial" w:cs="Arial" w:ascii="Garamond" w:hAnsi="Garamond"/>
+          <w:color w:val="auto"/>
+          <w:kern w:val="0"/>
+          <w:sz w:val="36"/>
+          <w:szCs w:val="36"/>
+          <w:lang w:val="en-US" w:eastAsia="zh-CN" w:bidi="hi-IN"/>
+        </w:rPr>
+        <w:t>sempre via</w:t>
+      </w:r>
+      <w:r>
+        <w:rPr>
+          <w:rFonts w:eastAsia="Arial" w:cs="Arial" w:ascii="Garamond" w:hAnsi="Garamond"/>
+          <w:color w:val="auto"/>
+          <w:kern w:val="0"/>
+          <w:sz w:val="36"/>
+          <w:szCs w:val="36"/>
+          <w:lang w:val="en-US" w:eastAsia="zh-CN" w:bidi="hi-IN"/>
+        </w:rPr>
+        <w:t xml:space="preserve"> o filho trabalhando e amando.</w:t>
+      </w:r>
+    </w:p>
+    <w:p>
+      <w:pPr>
+        <w:pStyle w:val="Normal"/>
+        <w:jc w:val="both"/>
+        <w:rPr>
+          <w:rFonts w:eastAsia="Arial" w:cs="Arial"/>
+          <w:color w:val="auto"/>
+          <w:kern w:val="0"/>
+          <w:lang w:val="en-US" w:eastAsia="zh-CN" w:bidi="hi-IN"/>
+        </w:rPr>
+      </w:pPr>
+      <w:r>
+        <w:rPr>
+          <w:rFonts w:eastAsia="Arial" w:cs="Arial"/>
+          <w:color w:val="auto"/>
+          <w:kern w:val="0"/>
+          <w:lang w:val="en-US" w:eastAsia="zh-CN" w:bidi="hi-IN"/>
         </w:rPr>
       </w:r>
     </w:p>
@@ -5189,131 +4678,508 @@
       </w:pPr>
       <w:r>
         <w:rPr>
-          <w:rFonts w:ascii="Garamond" w:hAnsi="Garamond"/>
-          <w:sz w:val="36"/>
-          <w:szCs w:val="36"/>
-        </w:rPr>
-      </w:r>
-    </w:p>
-    <w:p>
-      <w:pPr>
-        <w:pStyle w:val="Normal"/>
-        <w:jc w:val="both"/>
-        <w:rPr>
-          <w:rFonts w:ascii="Garamond" w:hAnsi="Garamond"/>
-          <w:sz w:val="36"/>
-          <w:szCs w:val="36"/>
-        </w:rPr>
-      </w:pPr>
-      <w:r>
-        <w:rPr>
-          <w:rFonts w:eastAsia="Arial" w:cs="Arial" w:ascii="Garamond" w:hAnsi="Garamond"/>
-          <w:color w:val="auto"/>
-          <w:kern w:val="0"/>
-          <w:sz w:val="36"/>
-          <w:szCs w:val="36"/>
-          <w:lang w:val="en-US" w:eastAsia="zh-CN" w:bidi="hi-IN"/>
-        </w:rPr>
-        <w:t>João propõe a Maria levá-la consigo. Daria a ela o amor de um filho e sabia que receberia de Maria a ternura maternal. Explica que não fora buscar Maria antes porque não tinha uma casa para abrigá-los. Porém, havia recebido de um recém convertido cristão uma casinha pobre onde poderiam morar.</w:t>
-      </w:r>
-    </w:p>
-    <w:p>
-      <w:pPr>
-        <w:pStyle w:val="Normal"/>
-        <w:jc w:val="both"/>
-        <w:rPr>
           <w:rFonts w:eastAsia="Arial" w:cs="Arial"/>
           <w:color w:val="auto"/>
           <w:kern w:val="0"/>
           <w:lang w:val="en-US" w:eastAsia="zh-CN" w:bidi="hi-IN"/>
         </w:rPr>
-      </w:pPr>
-      <w:r>
-        <w:rPr>
-          <w:rFonts w:ascii="Garamond" w:hAnsi="Garamond"/>
-          <w:sz w:val="36"/>
-          <w:szCs w:val="36"/>
-        </w:rPr>
-      </w:r>
-    </w:p>
-    <w:p>
-      <w:pPr>
-        <w:pStyle w:val="Normal"/>
-        <w:jc w:val="both"/>
-        <w:rPr>
-          <w:rFonts w:ascii="Garamond" w:hAnsi="Garamond"/>
-          <w:sz w:val="36"/>
-          <w:szCs w:val="36"/>
-        </w:rPr>
-      </w:pPr>
-      <w:r>
-        <w:rPr>
-          <w:rFonts w:eastAsia="Arial" w:cs="Arial" w:ascii="Garamond" w:hAnsi="Garamond"/>
-          <w:color w:val="auto"/>
-          <w:kern w:val="0"/>
-          <w:sz w:val="36"/>
-          <w:szCs w:val="36"/>
-          <w:lang w:val="en-US" w:eastAsia="zh-CN" w:bidi="hi-IN"/>
-        </w:rPr>
-        <w:t>como vinha sendo sua vida  anos vividos com Jesus, desde seu nascimento</w:t>
-      </w:r>
-    </w:p>
-    <w:p>
-      <w:pPr>
-        <w:pStyle w:val="Normal"/>
-        <w:jc w:val="center"/>
-        <w:rPr>
-          <w:b/>
-          <w:b/>
-          <w:bCs/>
-          <w:color w:val="C9211E"/>
-        </w:rPr>
-      </w:pPr>
-      <w:r>
-        <w:rPr>
-          <w:rFonts w:eastAsia="Arial" w:cs="Arial" w:ascii="Garamond" w:hAnsi="Garamond"/>
-          <w:b/>
-          <w:bCs/>
-          <w:color w:val="C9211E"/>
+      </w:r>
+    </w:p>
+    <w:p>
+      <w:pPr>
+        <w:pStyle w:val="Normal"/>
+        <w:jc w:val="both"/>
+        <w:rPr>
+          <w:rFonts w:ascii="Garamond" w:hAnsi="Garamond"/>
+          <w:sz w:val="36"/>
+          <w:szCs w:val="36"/>
+        </w:rPr>
+      </w:pPr>
+      <w:r>
+        <w:rPr>
+          <w:rFonts w:eastAsia="Arial" w:cs="Arial" w:ascii="Garamond" w:hAnsi="Garamond"/>
+          <w:color w:val="auto"/>
+          <w:kern w:val="0"/>
+          <w:sz w:val="36"/>
+          <w:szCs w:val="36"/>
+          <w:lang w:val="en-US" w:eastAsia="zh-CN" w:bidi="hi-IN"/>
+        </w:rPr>
+        <w:t xml:space="preserve">João propõe a Maria levá-la consigo. Daria a ela o amor de um filho e sabia que receberia de Maria a ternura maternal. Explica que </w:t>
+      </w:r>
+      <w:r>
+        <w:rPr>
+          <w:rFonts w:eastAsia="Arial" w:cs="Arial" w:ascii="Garamond" w:hAnsi="Garamond"/>
+          <w:color w:val="auto"/>
+          <w:kern w:val="0"/>
+          <w:sz w:val="36"/>
+          <w:szCs w:val="36"/>
+          <w:lang w:val="en-US" w:eastAsia="zh-CN" w:bidi="hi-IN"/>
+        </w:rPr>
+        <w:t>não viera</w:t>
+      </w:r>
+      <w:r>
+        <w:rPr>
+          <w:rFonts w:eastAsia="Arial" w:cs="Arial" w:ascii="Garamond" w:hAnsi="Garamond"/>
+          <w:color w:val="auto"/>
+          <w:kern w:val="0"/>
+          <w:sz w:val="36"/>
+          <w:szCs w:val="36"/>
+          <w:lang w:val="en-US" w:eastAsia="zh-CN" w:bidi="hi-IN"/>
+        </w:rPr>
+        <w:t xml:space="preserve"> antes porque não tinha uma casa para abrigá-los. Porém, havia recebido de um </w:t>
+      </w:r>
+      <w:r>
+        <w:rPr>
+          <w:rFonts w:eastAsia="Arial" w:cs="Arial" w:ascii="Garamond" w:hAnsi="Garamond"/>
+          <w:color w:val="auto"/>
+          <w:kern w:val="0"/>
+          <w:sz w:val="36"/>
+          <w:szCs w:val="36"/>
+          <w:lang w:val="en-US" w:eastAsia="zh-CN" w:bidi="hi-IN"/>
+        </w:rPr>
+        <w:t>membro</w:t>
+      </w:r>
+      <w:r>
+        <w:rPr>
+          <w:rFonts w:eastAsia="Arial" w:cs="Arial" w:ascii="Garamond" w:hAnsi="Garamond"/>
+          <w:color w:val="auto"/>
+          <w:kern w:val="0"/>
+          <w:sz w:val="36"/>
+          <w:szCs w:val="36"/>
+          <w:lang w:val="en-US" w:eastAsia="zh-CN" w:bidi="hi-IN"/>
+        </w:rPr>
+        <w:t xml:space="preserve"> da família real, </w:t>
+      </w:r>
+      <w:r>
+        <w:rPr>
+          <w:rFonts w:eastAsia="Arial" w:cs="Arial" w:ascii="Garamond" w:hAnsi="Garamond"/>
+          <w:color w:val="auto"/>
+          <w:kern w:val="0"/>
+          <w:sz w:val="36"/>
+          <w:szCs w:val="36"/>
+          <w:lang w:val="en-US" w:eastAsia="zh-CN" w:bidi="hi-IN"/>
+        </w:rPr>
+        <w:t xml:space="preserve">recém convertido </w:t>
+      </w:r>
+      <w:r>
+        <w:rPr>
+          <w:rFonts w:eastAsia="Arial" w:cs="Arial" w:ascii="Garamond" w:hAnsi="Garamond"/>
+          <w:color w:val="auto"/>
+          <w:kern w:val="0"/>
+          <w:sz w:val="36"/>
+          <w:szCs w:val="36"/>
+          <w:lang w:val="en-US" w:eastAsia="zh-CN" w:bidi="hi-IN"/>
+        </w:rPr>
+        <w:t>ao cristianismo,</w:t>
+      </w:r>
+      <w:r>
+        <w:rPr>
+          <w:rFonts w:eastAsia="Arial" w:cs="Arial" w:ascii="Garamond" w:hAnsi="Garamond"/>
+          <w:color w:val="auto"/>
+          <w:kern w:val="0"/>
+          <w:sz w:val="36"/>
+          <w:szCs w:val="36"/>
+          <w:lang w:val="en-US" w:eastAsia="zh-CN" w:bidi="hi-IN"/>
+        </w:rPr>
+        <w:t xml:space="preserve"> uma casinha pobre onde poderiam morar.</w:t>
+      </w:r>
+    </w:p>
+    <w:p>
+      <w:pPr>
+        <w:pStyle w:val="Normal"/>
+        <w:jc w:val="both"/>
+        <w:rPr>
+          <w:rFonts w:ascii="Garamond" w:hAnsi="Garamond"/>
+          <w:sz w:val="36"/>
+          <w:szCs w:val="36"/>
+        </w:rPr>
+      </w:pPr>
+      <w:r>
+        <w:rPr/>
+      </w:r>
+    </w:p>
+    <w:p>
+      <w:pPr>
+        <w:pStyle w:val="Normal"/>
+        <w:jc w:val="both"/>
+        <w:rPr>
+          <w:rFonts w:ascii="Garamond" w:hAnsi="Garamond"/>
+          <w:sz w:val="36"/>
+          <w:szCs w:val="36"/>
+        </w:rPr>
+      </w:pPr>
+      <w:r>
+        <w:rPr>
+          <w:rFonts w:eastAsia="Arial" w:cs="Arial" w:ascii="Garamond" w:hAnsi="Garamond"/>
+          <w:color w:val="auto"/>
+          <w:kern w:val="0"/>
+          <w:sz w:val="36"/>
+          <w:szCs w:val="36"/>
+          <w:lang w:val="en-US" w:eastAsia="zh-CN" w:bidi="hi-IN"/>
+        </w:rPr>
+        <w:t>Ali estabeleceriam um pouso e refúgio aos desamparados a quem ensinariam as verdades do evangelho.</w:t>
+      </w:r>
+    </w:p>
+    <w:p>
+      <w:pPr>
+        <w:pStyle w:val="Normal"/>
+        <w:jc w:val="both"/>
+        <w:rPr>
+          <w:rFonts w:ascii="Garamond" w:hAnsi="Garamond"/>
+          <w:sz w:val="36"/>
+          <w:szCs w:val="36"/>
+        </w:rPr>
+      </w:pPr>
+      <w:r>
+        <w:rPr/>
+      </w:r>
+    </w:p>
+    <w:p>
+      <w:pPr>
+        <w:pStyle w:val="Normal"/>
+        <w:jc w:val="both"/>
+        <w:rPr>
+          <w:rFonts w:ascii="Garamond" w:hAnsi="Garamond"/>
+          <w:sz w:val="36"/>
+          <w:szCs w:val="36"/>
+        </w:rPr>
+      </w:pPr>
+      <w:r>
+        <w:rPr>
+          <w:rFonts w:eastAsia="Arial" w:cs="Arial" w:ascii="Garamond" w:hAnsi="Garamond"/>
+          <w:color w:val="auto"/>
+          <w:kern w:val="0"/>
+          <w:sz w:val="36"/>
+          <w:szCs w:val="36"/>
+          <w:lang w:val="en-US" w:eastAsia="zh-CN" w:bidi="hi-IN"/>
+        </w:rPr>
+        <w:t>Maria aceita o convite e em algumas semanas aquela casa simples tornou-se local de reuniões adoráveis nas quais Maria falava de Jesus e João ensinava o evangelho.</w:t>
+      </w:r>
+    </w:p>
+    <w:p>
+      <w:pPr>
+        <w:pStyle w:val="Normal"/>
+        <w:jc w:val="both"/>
+        <w:rPr>
+          <w:rFonts w:ascii="Garamond" w:hAnsi="Garamond"/>
+          <w:sz w:val="36"/>
+          <w:szCs w:val="36"/>
+        </w:rPr>
+      </w:pPr>
+      <w:r>
+        <w:rPr/>
+      </w:r>
+    </w:p>
+    <w:p>
+      <w:pPr>
+        <w:pStyle w:val="Normal"/>
+        <w:jc w:val="both"/>
+        <w:rPr>
+          <w:rFonts w:ascii="Garamond" w:hAnsi="Garamond"/>
+          <w:sz w:val="36"/>
+          <w:szCs w:val="36"/>
+        </w:rPr>
+      </w:pPr>
+      <w:r>
+        <w:rPr>
+          <w:rFonts w:eastAsia="Arial" w:cs="Arial" w:ascii="Garamond" w:hAnsi="Garamond"/>
+          <w:color w:val="auto"/>
+          <w:kern w:val="0"/>
+          <w:sz w:val="36"/>
+          <w:szCs w:val="36"/>
+          <w:lang w:val="en-US" w:eastAsia="zh-CN" w:bidi="hi-IN"/>
+        </w:rPr>
+        <w:t xml:space="preserve">Dentro de poucos meses grandes fileiras de necessitados iam até aquela casa pois tomaram conhecimento de que Maria vivia ali. </w:t>
+      </w:r>
+      <w:r>
+        <w:rPr>
+          <w:rFonts w:eastAsia="Arial" w:cs="Arial" w:ascii="Garamond" w:hAnsi="Garamond"/>
+          <w:color w:val="auto"/>
+          <w:kern w:val="0"/>
+          <w:sz w:val="36"/>
+          <w:szCs w:val="36"/>
+          <w:lang w:val="en-US" w:eastAsia="zh-CN" w:bidi="hi-IN"/>
+        </w:rPr>
+        <w:t>Maria recebia e atendia a todos, enquanto João espalhava o Evangelho nas cidades próximas.</w:t>
+      </w:r>
+    </w:p>
+    <w:p>
+      <w:pPr>
+        <w:pStyle w:val="Normal"/>
+        <w:jc w:val="both"/>
+        <w:rPr>
+          <w:rFonts w:ascii="Garamond" w:hAnsi="Garamond"/>
+          <w:sz w:val="36"/>
+          <w:szCs w:val="36"/>
+        </w:rPr>
+      </w:pPr>
+      <w:r>
+        <w:rPr/>
+      </w:r>
+    </w:p>
+    <w:p>
+      <w:pPr>
+        <w:pStyle w:val="Normal"/>
+        <w:jc w:val="both"/>
+        <w:rPr>
+          <w:rFonts w:ascii="Garamond" w:hAnsi="Garamond"/>
+          <w:sz w:val="36"/>
+          <w:szCs w:val="36"/>
+        </w:rPr>
+      </w:pPr>
+      <w:r>
+        <w:rPr>
+          <w:rFonts w:eastAsia="Arial" w:cs="Arial" w:ascii="Garamond" w:hAnsi="Garamond"/>
+          <w:color w:val="auto"/>
+          <w:kern w:val="0"/>
+          <w:sz w:val="36"/>
+          <w:szCs w:val="36"/>
+          <w:lang w:val="en-US" w:eastAsia="zh-CN" w:bidi="hi-IN"/>
+        </w:rPr>
+        <w:t>Em certa ocasião Maria atendeu a um leproso, aliviando suas chagas. Ele beijou as mãos de Maria e disse:</w:t>
+      </w:r>
+    </w:p>
+    <w:p>
+      <w:pPr>
+        <w:pStyle w:val="Normal"/>
+        <w:jc w:val="both"/>
+        <w:rPr>
+          <w:rFonts w:ascii="Garamond" w:hAnsi="Garamond"/>
+          <w:sz w:val="36"/>
+          <w:szCs w:val="36"/>
+        </w:rPr>
+      </w:pPr>
+      <w:r>
+        <w:rPr/>
+      </w:r>
+    </w:p>
+    <w:p>
+      <w:pPr>
+        <w:pStyle w:val="Normal"/>
+        <w:ind w:left="720" w:hanging="0"/>
+        <w:jc w:val="both"/>
+        <w:rPr>
+          <w:i/>
+          <w:i/>
+          <w:iCs/>
+        </w:rPr>
+      </w:pPr>
+      <w:r>
+        <w:rPr>
+          <w:rFonts w:eastAsia="Arial" w:cs="Arial" w:ascii="Garamond" w:hAnsi="Garamond"/>
+          <w:i/>
+          <w:iCs/>
+          <w:color w:val="auto"/>
+          <w:kern w:val="0"/>
+          <w:sz w:val="36"/>
+          <w:szCs w:val="36"/>
+          <w:lang w:val="en-US" w:eastAsia="zh-CN" w:bidi="hi-IN"/>
+        </w:rPr>
+        <w:t>“</w:t>
+      </w:r>
+      <w:r>
+        <w:rPr>
+          <w:rFonts w:eastAsia="Arial" w:cs="Arial" w:ascii="Garamond" w:hAnsi="Garamond"/>
+          <w:i/>
+          <w:iCs/>
+          <w:color w:val="auto"/>
+          <w:kern w:val="0"/>
+          <w:sz w:val="36"/>
+          <w:szCs w:val="36"/>
+          <w:lang w:val="en-US" w:eastAsia="zh-CN" w:bidi="hi-IN"/>
+        </w:rPr>
+        <w:t>Senhora, sois a mãe de nosso Mestre e nossa Mãe Santíssima”.</w:t>
+      </w:r>
+    </w:p>
+    <w:p>
+      <w:pPr>
+        <w:pStyle w:val="Normal"/>
+        <w:jc w:val="both"/>
+        <w:rPr>
+          <w:rFonts w:ascii="Garamond" w:hAnsi="Garamond"/>
+          <w:sz w:val="36"/>
+          <w:szCs w:val="36"/>
+        </w:rPr>
+      </w:pPr>
+      <w:r>
+        <w:rPr/>
+      </w:r>
+    </w:p>
+    <w:p>
+      <w:pPr>
+        <w:pStyle w:val="Normal"/>
+        <w:jc w:val="both"/>
+        <w:rPr>
+          <w:rFonts w:ascii="Garamond" w:hAnsi="Garamond" w:eastAsia="Arial" w:cs="Arial"/>
+          <w:color w:val="auto"/>
+          <w:kern w:val="0"/>
+          <w:sz w:val="36"/>
+          <w:szCs w:val="36"/>
+          <w:lang w:val="en-US" w:eastAsia="zh-CN" w:bidi="hi-IN"/>
+        </w:rPr>
+      </w:pPr>
+      <w:r>
+        <w:rPr>
+          <w:rFonts w:eastAsia="Arial" w:cs="Arial" w:ascii="Garamond" w:hAnsi="Garamond"/>
+          <w:color w:val="auto"/>
+          <w:kern w:val="0"/>
+          <w:sz w:val="36"/>
+          <w:szCs w:val="36"/>
+          <w:lang w:val="en-US" w:eastAsia="zh-CN" w:bidi="hi-IN"/>
+        </w:rPr>
+        <w:t>Desde então a casa simples passou a ser conhecida como "Casa da Santíssima". Maria evitava as homenagens, mas sentia-se feliz por ser procurada e poder ajudar a todos aqueles necessitados.</w:t>
+      </w:r>
+    </w:p>
+    <w:p>
+      <w:pPr>
+        <w:pStyle w:val="Normal"/>
+        <w:jc w:val="both"/>
+        <w:rPr>
+          <w:rFonts w:ascii="Garamond" w:hAnsi="Garamond" w:eastAsia="Arial" w:cs="Arial"/>
+          <w:color w:val="auto"/>
+          <w:kern w:val="0"/>
+          <w:sz w:val="36"/>
+          <w:szCs w:val="36"/>
+          <w:lang w:val="en-US" w:eastAsia="zh-CN" w:bidi="hi-IN"/>
+        </w:rPr>
+      </w:pPr>
+      <w:r>
+        <w:rPr>
+          <w:rFonts w:eastAsia="Arial" w:cs="Arial" w:ascii="Garamond" w:hAnsi="Garamond"/>
+          <w:color w:val="auto"/>
+          <w:kern w:val="0"/>
+          <w:sz w:val="36"/>
+          <w:szCs w:val="36"/>
+          <w:lang w:val="en-US" w:eastAsia="zh-CN" w:bidi="hi-IN"/>
+        </w:rPr>
+      </w:r>
+    </w:p>
+    <w:p>
+      <w:pPr>
+        <w:pStyle w:val="Normal"/>
+        <w:jc w:val="both"/>
+        <w:rPr>
+          <w:rFonts w:ascii="Garamond" w:hAnsi="Garamond" w:eastAsia="Arial" w:cs="Arial"/>
+          <w:color w:val="auto"/>
+          <w:kern w:val="0"/>
+          <w:sz w:val="36"/>
+          <w:szCs w:val="36"/>
+          <w:lang w:val="en-US" w:eastAsia="zh-CN" w:bidi="hi-IN"/>
+        </w:rPr>
+      </w:pPr>
+      <w:r>
+        <w:rPr>
+          <w:rFonts w:eastAsia="Arial" w:cs="Arial" w:ascii="Garamond" w:hAnsi="Garamond"/>
+          <w:color w:val="auto"/>
+          <w:kern w:val="0"/>
+          <w:sz w:val="36"/>
+          <w:szCs w:val="36"/>
+          <w:lang w:val="en-US" w:eastAsia="zh-CN" w:bidi="hi-IN"/>
+        </w:rPr>
+        <w:t>Os anos se seguiram, Maria continuou trabalhando, mesmo com a idade avançada. Começaram a chegar então as notícias de perseguição aos cristãos.</w:t>
+      </w:r>
+    </w:p>
+    <w:p>
+      <w:pPr>
+        <w:pStyle w:val="Normal"/>
+        <w:jc w:val="both"/>
+        <w:rPr>
+          <w:rFonts w:ascii="Garamond" w:hAnsi="Garamond" w:eastAsia="Arial" w:cs="Arial"/>
+          <w:color w:val="auto"/>
+          <w:kern w:val="0"/>
+          <w:sz w:val="36"/>
+          <w:szCs w:val="36"/>
+          <w:lang w:val="en-US" w:eastAsia="zh-CN" w:bidi="hi-IN"/>
+        </w:rPr>
+      </w:pPr>
+      <w:r>
+        <w:rPr>
+          <w:rFonts w:eastAsia="Arial" w:cs="Arial" w:ascii="Garamond" w:hAnsi="Garamond"/>
+          <w:color w:val="auto"/>
+          <w:kern w:val="0"/>
+          <w:sz w:val="36"/>
+          <w:szCs w:val="36"/>
+          <w:lang w:val="en-US" w:eastAsia="zh-CN" w:bidi="hi-IN"/>
+        </w:rPr>
+      </w:r>
+    </w:p>
+    <w:p>
+      <w:pPr>
+        <w:pStyle w:val="Normal"/>
+        <w:jc w:val="both"/>
+        <w:rPr>
+          <w:sz w:val="36"/>
+          <w:szCs w:val="36"/>
+        </w:rPr>
+      </w:pPr>
+      <w:r>
+        <w:rPr>
+          <w:rFonts w:eastAsia="Arial" w:cs="Arial" w:ascii="Garamond" w:hAnsi="Garamond"/>
+          <w:color w:val="000000"/>
           <w:kern w:val="0"/>
           <w:sz w:val="36"/>
           <w:szCs w:val="36"/>
           <w:shd w:fill="auto" w:val="clear"/>
           <w:lang w:val="en-US" w:eastAsia="zh-CN" w:bidi="hi-IN"/>
         </w:rPr>
-        <w:t xml:space="preserve">Maria retorna ao Plano Espiritual - </w:t>
-      </w:r>
-      <w:r>
-        <w:rPr>
-          <w:rFonts w:eastAsia="Arial" w:cs="Arial" w:ascii="Garamond" w:hAnsi="Garamond"/>
-          <w:b/>
-          <w:bCs/>
-          <w:i w:val="false"/>
-          <w:iCs w:val="false"/>
-          <w:color w:val="C9211E"/>
+        <w:t>Num crepúsculo sereno e estrelado, Maria, como de costume, entregava-se às orações, quando recebeu a visita inesperada de um peregrino que, com palavras suaves e cheias de consolo, tocou-lhe a alma com ternura e compreensão.</w:t>
+      </w:r>
+    </w:p>
+    <w:p>
+      <w:pPr>
+        <w:pStyle w:val="Normal"/>
+        <w:jc w:val="both"/>
+        <w:rPr>
+          <w:sz w:val="36"/>
+          <w:szCs w:val="36"/>
+        </w:rPr>
+      </w:pPr>
+      <w:r>
+        <w:rPr>
+          <w:rFonts w:eastAsia="Arial" w:cs="Arial" w:ascii="Garamond" w:hAnsi="Garamond"/>
+          <w:color w:val="auto"/>
+          <w:kern w:val="0"/>
+          <w:sz w:val="36"/>
+          <w:szCs w:val="36"/>
+          <w:lang w:val="en-US" w:eastAsia="zh-CN" w:bidi="hi-IN"/>
+        </w:rPr>
+      </w:r>
+    </w:p>
+    <w:p>
+      <w:pPr>
+        <w:pStyle w:val="Normal"/>
+        <w:jc w:val="both"/>
+        <w:rPr>
+          <w:sz w:val="36"/>
+          <w:szCs w:val="36"/>
+        </w:rPr>
+      </w:pPr>
+      <w:r>
+        <w:rPr>
+          <w:rFonts w:eastAsia="Arial" w:cs="Arial" w:ascii="Garamond" w:hAnsi="Garamond"/>
+          <w:color w:val="000000"/>
           <w:kern w:val="0"/>
           <w:sz w:val="36"/>
           <w:szCs w:val="36"/>
           <w:shd w:fill="auto" w:val="clear"/>
           <w:lang w:val="en-US" w:eastAsia="zh-CN" w:bidi="hi-IN"/>
         </w:rPr>
-        <w:t>Humberto de Campos / Chico Xavier - Boa Nova - Maria</w:t>
-      </w:r>
-    </w:p>
-    <w:p>
-      <w:pPr>
-        <w:pStyle w:val="Normal"/>
-        <w:jc w:val="both"/>
-        <w:rPr>
-          <w:sz w:val="36"/>
-          <w:szCs w:val="36"/>
-        </w:rPr>
-      </w:pPr>
-      <w:r>
-        <w:rPr>
-          <w:sz w:val="36"/>
-          <w:szCs w:val="36"/>
-        </w:rPr>
+        <w:t xml:space="preserve">A presença daquele estranho lhe despertava emoções profundas e familiares, até que, ao reconhecer nele as chagas de seu filho crucificado, Maria, tomada por intensa comoção, compreendeu tratar-se de Jesus. </w:t>
+      </w:r>
+    </w:p>
+    <w:p>
+      <w:pPr>
+        <w:pStyle w:val="Normal"/>
+        <w:jc w:val="both"/>
+        <w:rPr>
+          <w:rFonts w:eastAsia="Arial" w:cs="Arial"/>
+          <w:color w:val="auto"/>
+          <w:kern w:val="0"/>
+          <w:lang w:val="en-US" w:eastAsia="zh-CN" w:bidi="hi-IN"/>
+        </w:rPr>
+      </w:pPr>
+      <w:r>
+        <w:rPr/>
       </w:r>
     </w:p>
     <w:p>
@@ -5335,23 +5201,7 @@
           <w:shd w:fill="auto" w:val="clear"/>
           <w:lang w:val="en-US" w:eastAsia="zh-CN" w:bidi="hi-IN"/>
         </w:rPr>
-        <w:t>Num crepúsculo sereno e estrelado, Maria, como de costume, entregava-se às orações, quando recebeu a visita inesperada de um peregrino que, com palavras suaves e cheias de consolo, tocou-lhe a alma com ternura e compreensão. A presença daquele estranho lhe despertava emoções profundas e familiares, até que, ao reconhecer nele as chagas de seu filho crucificado, Maria, tomada por intensa comoção, compreendeu tratar-se de Jesus. Ele viera buscá-la, revelando que o Pai a desejava como Rainha dos Anjos em seu Reino. Envolta em júbilo e reverência, Maria despediu-se do mundo terreno com serenidade, partindo na alvorada entre cânticos celestiais e multidões de espíritos luminosos.</w:t>
-      </w:r>
-    </w:p>
-    <w:p>
-      <w:pPr>
-        <w:pStyle w:val="Normal"/>
-        <w:jc w:val="both"/>
-        <w:rPr>
-          <w:sz w:val="36"/>
-          <w:szCs w:val="36"/>
-        </w:rPr>
-      </w:pPr>
-      <w:r>
-        <w:rPr>
-          <w:sz w:val="36"/>
-          <w:szCs w:val="36"/>
-        </w:rPr>
+        <w:t>Ele viera buscá-la, revelando que o Pai a desejava como Rainha dos Anjos em seu Reino. Envolta em júbilo e reverência, Maria despediu-se do mundo terreno com serenidade, partindo na alvorada entre cânticos celestiais e multidões de espíritos luminosos.</w:t>
       </w:r>
     </w:p>
     <w:p>
@@ -5373,7 +5223,7 @@
           <w:shd w:fill="auto" w:val="clear"/>
           <w:lang w:val="en-US" w:eastAsia="zh-CN" w:bidi="hi-IN"/>
         </w:rPr>
-        <w:t>Antes de sua definitiva ascensão aos Céus, Maria roga a Jesus a graça de rever os lugares marcados pela presença do Evangelho. Do alto, contempla a Galileia em silêncio, emocionada, enxergando o lago de Genesaré como se fosse um grande alaúde moldado pela natureza — instrumento sagrado que embalara a Boa Nova entre os homens. Seu olhar repousa com carinho sobre as paisagens que testemunharam os passos e ensinamentos de seu filho. Movida por compaixão e sensibilidade, pede ainda para visitar os discípulos em Roma, que sofriam perseguições e encarceramento por seguirem o Cristo. Lá, caminha entre os corredores sombrios das prisões, consolando os que se mantinham firmes na fé e rogando a Deus que deixasse em seus corações não apenas coragem, mas também alegria, mesmo em meio à dor. Aproxima-se especialmente de uma jovem prisioneira e, ao sussurrar palavras de esperança, vê nascer um canto doce e sereno, que se espalha entre os cativos como um sopro de paz. A canção transforma o ambiente, enchendo os corações aflitos de luz, como se a presença de Maria ali tivesse suavizado o sofrimento com o bálsamo do amor. Desde então, mesmo nos tempos mais sombrios, os seguidores de Jesus lembram-se daquele instante e continuam a cantar, sustentados pela herança de ternura e fé deixada pela Mãe Santíssima.</w:t>
+        <w:t xml:space="preserve">Antes de sua definitiva ascensão aos Céus, Maria roga a Jesus a graça de rever os lugares marcados pela presença do Evangelho. Do alto, contempla a Galileia em silêncio, emocionada, enxergando o lago de Genesaré como se fosse um grande alaúde moldado pela natureza — instrumento sagrado que embalara a Boa Nova entre os homens. </w:t>
       </w:r>
     </w:p>
     <w:p>
@@ -5408,7 +5258,20 @@
           <w:shd w:fill="auto" w:val="clear"/>
           <w:lang w:val="en-US" w:eastAsia="zh-CN" w:bidi="hi-IN"/>
         </w:rPr>
-        <w:t>&gt;&gt;&gt;&gt;&gt;&gt;&gt;&gt;&gt;&gt;&gt;&gt;&gt;&gt;&gt;&gt;&gt;&gt;&gt;&gt;&gt;&gt;</w:t>
+        <w:t>Seu olhar repousa com carinho sobre as paisagens que testemunharam os passos e ensinamentos de seu filho. Movida por compaixão e sensibilidade, pede ainda para visitar os discípulos em Roma, que sofriam perseguições e encarceramento por seguirem o Cristo.</w:t>
+      </w:r>
+    </w:p>
+    <w:p>
+      <w:pPr>
+        <w:pStyle w:val="Normal"/>
+        <w:jc w:val="both"/>
+        <w:rPr>
+          <w:sz w:val="36"/>
+          <w:szCs w:val="36"/>
+        </w:rPr>
+      </w:pPr>
+      <w:r>
+        <w:rPr/>
       </w:r>
     </w:p>
     <w:p>
@@ -5430,7 +5293,7 @@
           <w:shd w:fill="auto" w:val="clear"/>
           <w:lang w:val="en-US" w:eastAsia="zh-CN" w:bidi="hi-IN"/>
         </w:rPr>
-        <w:t>Ao longo da preparação desta palestra, minha visão sobre Maria de Nazaré passou por uma profunda transformação. Se antes eu a admirava simplesmente por ser a mãe de Jesus, o estudo detalhado de cada passagem em que ela é mencionada, cada palavra e até mesmo cada silêncio dela, me revelou a grandeza de seu espírito.</w:t>
+        <w:t xml:space="preserve">Lá, caminha entre os corredores sombrios das prisões, consolando os que se mantinham firmes na fé e rogando a Deus que deixasse em seus corações não apenas coragem, mas também alegria, mesmo em meio à dor. </w:t>
       </w:r>
     </w:p>
     <w:p>
@@ -5465,6 +5328,683 @@
           <w:shd w:fill="auto" w:val="clear"/>
           <w:lang w:val="en-US" w:eastAsia="zh-CN" w:bidi="hi-IN"/>
         </w:rPr>
+        <w:t>Aproxima-se especialmente de uma jovem prisioneira e</w:t>
+      </w:r>
+      <w:r>
+        <w:rPr>
+          <w:rFonts w:eastAsia="Arial" w:cs="Arial" w:ascii="Garamond" w:hAnsi="Garamond"/>
+          <w:color w:val="000000"/>
+          <w:kern w:val="0"/>
+          <w:sz w:val="36"/>
+          <w:szCs w:val="36"/>
+          <w:shd w:fill="auto" w:val="clear"/>
+          <w:lang w:val="en-US" w:eastAsia="zh-CN" w:bidi="hi-IN"/>
+        </w:rPr>
+        <w:t xml:space="preserve"> lhe diz ao ouvido:</w:t>
+      </w:r>
+    </w:p>
+    <w:p>
+      <w:pPr>
+        <w:pStyle w:val="Normal"/>
+        <w:jc w:val="both"/>
+        <w:rPr>
+          <w:sz w:val="36"/>
+          <w:szCs w:val="36"/>
+        </w:rPr>
+      </w:pPr>
+      <w:r>
+        <w:rPr/>
+      </w:r>
+    </w:p>
+    <w:p>
+      <w:pPr>
+        <w:pStyle w:val="Normal"/>
+        <w:ind w:left="720" w:hanging="0"/>
+        <w:jc w:val="both"/>
+        <w:rPr>
+          <w:i/>
+          <w:i/>
+          <w:iCs/>
+        </w:rPr>
+      </w:pPr>
+      <w:r>
+        <w:rPr>
+          <w:rFonts w:eastAsia="Arial" w:cs="Arial" w:ascii="Garamond" w:hAnsi="Garamond"/>
+          <w:i/>
+          <w:iCs/>
+          <w:color w:val="000000"/>
+          <w:kern w:val="0"/>
+          <w:sz w:val="36"/>
+          <w:szCs w:val="36"/>
+          <w:shd w:fill="auto" w:val="clear"/>
+          <w:lang w:val="en-US" w:eastAsia="zh-CN" w:bidi="hi-IN"/>
+        </w:rPr>
+        <w:t>“</w:t>
+      </w:r>
+      <w:r>
+        <w:rPr>
+          <w:rFonts w:eastAsia="Arial" w:cs="Arial" w:ascii="Garamond" w:hAnsi="Garamond"/>
+          <w:i/>
+          <w:iCs/>
+          <w:color w:val="000000"/>
+          <w:kern w:val="0"/>
+          <w:sz w:val="36"/>
+          <w:szCs w:val="36"/>
+          <w:shd w:fill="auto" w:val="clear"/>
+          <w:lang w:val="en-US" w:eastAsia="zh-CN" w:bidi="hi-IN"/>
+        </w:rPr>
+        <w:t>Canta, minha filha! Tenhamos bom ânimo! Convertamos as nossas dores da Terra em alegrias</w:t>
+      </w:r>
+    </w:p>
+    <w:p>
+      <w:pPr>
+        <w:pStyle w:val="Normal"/>
+        <w:ind w:left="720" w:hanging="0"/>
+        <w:jc w:val="both"/>
+        <w:rPr>
+          <w:i/>
+          <w:i/>
+          <w:iCs/>
+        </w:rPr>
+      </w:pPr>
+      <w:r>
+        <w:rPr>
+          <w:rFonts w:eastAsia="Arial" w:cs="Arial" w:ascii="Garamond" w:hAnsi="Garamond"/>
+          <w:i/>
+          <w:iCs/>
+          <w:color w:val="000000"/>
+          <w:kern w:val="0"/>
+          <w:sz w:val="36"/>
+          <w:szCs w:val="36"/>
+          <w:shd w:fill="auto" w:val="clear"/>
+          <w:lang w:val="en-US" w:eastAsia="zh-CN" w:bidi="hi-IN"/>
+        </w:rPr>
+        <w:t>para o Céu!</w:t>
+      </w:r>
+    </w:p>
+    <w:p>
+      <w:pPr>
+        <w:pStyle w:val="Normal"/>
+        <w:jc w:val="both"/>
+        <w:rPr>
+          <w:sz w:val="36"/>
+          <w:szCs w:val="36"/>
+        </w:rPr>
+      </w:pPr>
+      <w:r>
+        <w:rPr/>
+      </w:r>
+    </w:p>
+    <w:p>
+      <w:pPr>
+        <w:pStyle w:val="Normal"/>
+        <w:jc w:val="both"/>
+        <w:rPr>
+          <w:sz w:val="36"/>
+          <w:szCs w:val="36"/>
+        </w:rPr>
+      </w:pPr>
+      <w:r>
+        <w:rPr>
+          <w:rFonts w:eastAsia="Arial" w:cs="Arial" w:ascii="Garamond" w:hAnsi="Garamond"/>
+          <w:color w:val="000000"/>
+          <w:kern w:val="0"/>
+          <w:sz w:val="36"/>
+          <w:szCs w:val="36"/>
+          <w:shd w:fill="auto" w:val="clear"/>
+          <w:lang w:val="en-US" w:eastAsia="zh-CN" w:bidi="hi-IN"/>
+        </w:rPr>
+        <w:t>Maria então</w:t>
+      </w:r>
+      <w:r>
+        <w:rPr>
+          <w:rFonts w:eastAsia="Arial" w:cs="Arial" w:ascii="Garamond" w:hAnsi="Garamond"/>
+          <w:color w:val="000000"/>
+          <w:kern w:val="0"/>
+          <w:sz w:val="36"/>
+          <w:szCs w:val="36"/>
+          <w:shd w:fill="auto" w:val="clear"/>
+          <w:lang w:val="en-US" w:eastAsia="zh-CN" w:bidi="hi-IN"/>
+        </w:rPr>
+        <w:t xml:space="preserve"> vê nascer um canto doce e sereno, que se espalha entre os cativos como um sopro de paz. A canção transforma o ambiente, enchendo os corações aflitos de luz, como se a presença de Maria ali tivesse suavizado o sofrimento com o bálsamo do amor. </w:t>
+      </w:r>
+    </w:p>
+    <w:p>
+      <w:pPr>
+        <w:pStyle w:val="Normal"/>
+        <w:jc w:val="both"/>
+        <w:rPr>
+          <w:sz w:val="36"/>
+          <w:szCs w:val="36"/>
+        </w:rPr>
+      </w:pPr>
+      <w:r>
+        <w:rPr/>
+      </w:r>
+    </w:p>
+    <w:p>
+      <w:pPr>
+        <w:pStyle w:val="Normal"/>
+        <w:jc w:val="both"/>
+        <w:rPr>
+          <w:sz w:val="36"/>
+          <w:szCs w:val="36"/>
+        </w:rPr>
+      </w:pPr>
+      <w:r>
+        <w:rPr>
+          <w:rFonts w:eastAsia="Arial" w:cs="Arial" w:ascii="Garamond" w:hAnsi="Garamond"/>
+          <w:color w:val="000000"/>
+          <w:kern w:val="0"/>
+          <w:sz w:val="36"/>
+          <w:szCs w:val="36"/>
+          <w:shd w:fill="auto" w:val="clear"/>
+          <w:lang w:val="en-US" w:eastAsia="zh-CN" w:bidi="hi-IN"/>
+        </w:rPr>
+        <w:t xml:space="preserve">Em seguida a </w:t>
+      </w:r>
+      <w:r>
+        <w:rPr>
+          <w:rFonts w:eastAsia="Arial" w:cs="Arial" w:ascii="Garamond" w:hAnsi="Garamond"/>
+          <w:color w:val="000000"/>
+          <w:kern w:val="0"/>
+          <w:sz w:val="36"/>
+          <w:szCs w:val="36"/>
+          <w:shd w:fill="auto" w:val="clear"/>
+          <w:lang w:val="en-US" w:eastAsia="zh-CN" w:bidi="hi-IN"/>
+        </w:rPr>
+        <w:t xml:space="preserve"> caravana majestosa conduziu ao Reino do Mestre a bendita entre as mulheres e, desde esse</w:t>
+      </w:r>
+      <w:r>
+        <w:rPr>
+          <w:rFonts w:eastAsia="Arial" w:cs="Arial" w:ascii="Garamond" w:hAnsi="Garamond"/>
+          <w:color w:val="000000"/>
+          <w:kern w:val="0"/>
+          <w:sz w:val="36"/>
+          <w:szCs w:val="36"/>
+          <w:shd w:fill="auto" w:val="clear"/>
+          <w:lang w:val="en-US" w:eastAsia="zh-CN" w:bidi="hi-IN"/>
+        </w:rPr>
+        <w:t xml:space="preserve"> </w:t>
+      </w:r>
+      <w:r>
+        <w:rPr>
+          <w:rFonts w:eastAsia="Arial" w:cs="Arial" w:ascii="Garamond" w:hAnsi="Garamond"/>
+          <w:color w:val="000000"/>
+          <w:kern w:val="0"/>
+          <w:sz w:val="36"/>
+          <w:szCs w:val="36"/>
+          <w:shd w:fill="auto" w:val="clear"/>
+          <w:lang w:val="en-US" w:eastAsia="zh-CN" w:bidi="hi-IN"/>
+        </w:rPr>
+        <w:t>dia, nos tormentos mais duros, os discípulos de Jesus têm cantado na Terra, exprimindo o seu bom ânimo</w:t>
+      </w:r>
+      <w:r>
+        <w:rPr>
+          <w:rFonts w:eastAsia="Arial" w:cs="Arial" w:ascii="Garamond" w:hAnsi="Garamond"/>
+          <w:color w:val="000000"/>
+          <w:kern w:val="0"/>
+          <w:sz w:val="36"/>
+          <w:szCs w:val="36"/>
+          <w:shd w:fill="auto" w:val="clear"/>
+          <w:lang w:val="en-US" w:eastAsia="zh-CN" w:bidi="hi-IN"/>
+        </w:rPr>
+        <w:t xml:space="preserve"> </w:t>
+      </w:r>
+      <w:r>
+        <w:rPr>
+          <w:rFonts w:eastAsia="Arial" w:cs="Arial" w:ascii="Garamond" w:hAnsi="Garamond"/>
+          <w:color w:val="000000"/>
+          <w:kern w:val="0"/>
+          <w:sz w:val="36"/>
+          <w:szCs w:val="36"/>
+          <w:shd w:fill="auto" w:val="clear"/>
+          <w:lang w:val="en-US" w:eastAsia="zh-CN" w:bidi="hi-IN"/>
+        </w:rPr>
+        <w:t>e a sua alegria, guardando a suave herança de nossa Mãe Santíssima.</w:t>
+      </w:r>
+    </w:p>
+    <w:p>
+      <w:pPr>
+        <w:pStyle w:val="Normal"/>
+        <w:jc w:val="both"/>
+        <w:rPr>
+          <w:sz w:val="36"/>
+          <w:szCs w:val="36"/>
+        </w:rPr>
+      </w:pPr>
+      <w:r>
+        <w:rPr/>
+      </w:r>
+    </w:p>
+    <w:p>
+      <w:pPr>
+        <w:pStyle w:val="Normal"/>
+        <w:jc w:val="both"/>
+        <w:rPr>
+          <w:sz w:val="36"/>
+          <w:szCs w:val="36"/>
+        </w:rPr>
+      </w:pPr>
+      <w:r>
+        <w:rPr>
+          <w:rFonts w:eastAsia="Arial" w:cs="Arial" w:ascii="Garamond" w:hAnsi="Garamond"/>
+          <w:color w:val="000000"/>
+          <w:kern w:val="0"/>
+          <w:sz w:val="36"/>
+          <w:szCs w:val="36"/>
+          <w:shd w:fill="auto" w:val="clear"/>
+          <w:lang w:val="en-US" w:eastAsia="zh-CN" w:bidi="hi-IN"/>
+        </w:rPr>
+        <w:t>Desde então, mesmo nos tempos mais sombrios, os seguidores de Jesus lembram-se daquele instante e continuam a cantar, sustentados pela herança de ternura e fé deixada pela Mãe Santíssima.</w:t>
+      </w:r>
+    </w:p>
+    <w:p>
+      <w:pPr>
+        <w:pStyle w:val="Normal"/>
+        <w:jc w:val="both"/>
+        <w:rPr>
+          <w:sz w:val="36"/>
+          <w:szCs w:val="36"/>
+        </w:rPr>
+      </w:pPr>
+      <w:r>
+        <w:rPr>
+          <w:sz w:val="36"/>
+          <w:szCs w:val="36"/>
+        </w:rPr>
+      </w:r>
+    </w:p>
+    <w:p>
+      <w:pPr>
+        <w:pStyle w:val="Normal"/>
+        <w:jc w:val="both"/>
+        <w:rPr>
+          <w:rFonts w:ascii="Garamond" w:hAnsi="Garamond" w:eastAsia="Arial" w:cs="Arial"/>
+          <w:color w:val="000000"/>
+          <w:kern w:val="0"/>
+          <w:sz w:val="36"/>
+          <w:szCs w:val="36"/>
+          <w:shd w:fill="auto" w:val="clear"/>
+          <w:lang w:val="en-US" w:eastAsia="zh-CN" w:bidi="hi-IN"/>
+        </w:rPr>
+      </w:pPr>
+      <w:r>
+        <w:rPr>
+          <w:rFonts w:eastAsia="Arial" w:cs="Arial" w:ascii="Garamond" w:hAnsi="Garamond"/>
+          <w:color w:val="000000"/>
+          <w:kern w:val="0"/>
+          <w:sz w:val="36"/>
+          <w:szCs w:val="36"/>
+          <w:shd w:fill="auto" w:val="clear"/>
+          <w:lang w:val="en-US" w:eastAsia="zh-CN" w:bidi="hi-IN"/>
+        </w:rPr>
+        <w:t>&lt;&lt;&lt; Primeira opção de conclusão &gt;&gt;&gt;</w:t>
+      </w:r>
+    </w:p>
+    <w:p>
+      <w:pPr>
+        <w:pStyle w:val="Normal"/>
+        <w:jc w:val="both"/>
+        <w:rPr>
+          <w:sz w:val="36"/>
+          <w:szCs w:val="36"/>
+        </w:rPr>
+      </w:pPr>
+      <w:r>
+        <w:rPr/>
+      </w:r>
+    </w:p>
+    <w:p>
+      <w:pPr>
+        <w:pStyle w:val="Normal"/>
+        <w:jc w:val="both"/>
+        <w:rPr>
+          <w:sz w:val="36"/>
+          <w:szCs w:val="36"/>
+        </w:rPr>
+      </w:pPr>
+      <w:r>
+        <w:rPr>
+          <w:rFonts w:eastAsia="Arial" w:cs="Arial" w:ascii="Garamond" w:hAnsi="Garamond"/>
+          <w:color w:val="000000"/>
+          <w:kern w:val="0"/>
+          <w:sz w:val="36"/>
+          <w:szCs w:val="36"/>
+          <w:shd w:fill="auto" w:val="clear"/>
+          <w:lang w:val="en-US" w:eastAsia="zh-CN" w:bidi="hi-IN"/>
+        </w:rPr>
+        <w:t xml:space="preserve">Ao longo da </w:t>
+      </w:r>
+      <w:r>
+        <w:rPr>
+          <w:rFonts w:eastAsia="Arial" w:cs="Arial" w:ascii="Garamond" w:hAnsi="Garamond"/>
+          <w:color w:val="000000"/>
+          <w:kern w:val="0"/>
+          <w:sz w:val="36"/>
+          <w:szCs w:val="36"/>
+          <w:shd w:fill="auto" w:val="clear"/>
+          <w:lang w:val="en-US" w:eastAsia="zh-CN" w:bidi="hi-IN"/>
+        </w:rPr>
+        <w:t>elaboração do estudo apresentado aqui hoje</w:t>
+      </w:r>
+      <w:r>
+        <w:rPr>
+          <w:rFonts w:eastAsia="Arial" w:cs="Arial" w:ascii="Garamond" w:hAnsi="Garamond"/>
+          <w:color w:val="000000"/>
+          <w:kern w:val="0"/>
+          <w:sz w:val="36"/>
+          <w:szCs w:val="36"/>
+          <w:shd w:fill="auto" w:val="clear"/>
+          <w:lang w:val="en-US" w:eastAsia="zh-CN" w:bidi="hi-IN"/>
+        </w:rPr>
+        <w:t xml:space="preserve">, minha visão sobre Maria de Nazaré </w:t>
+      </w:r>
+      <w:r>
+        <w:rPr>
+          <w:rFonts w:eastAsia="Arial" w:cs="Arial" w:ascii="Garamond" w:hAnsi="Garamond"/>
+          <w:color w:val="000000"/>
+          <w:kern w:val="0"/>
+          <w:sz w:val="36"/>
+          <w:szCs w:val="36"/>
+          <w:shd w:fill="auto" w:val="clear"/>
+          <w:lang w:val="en-US" w:eastAsia="zh-CN" w:bidi="hi-IN"/>
+        </w:rPr>
+        <w:t xml:space="preserve">alterou-se consideravelmente. </w:t>
+      </w:r>
+    </w:p>
+    <w:p>
+      <w:pPr>
+        <w:pStyle w:val="Normal"/>
+        <w:jc w:val="both"/>
+        <w:rPr>
+          <w:sz w:val="36"/>
+          <w:szCs w:val="36"/>
+        </w:rPr>
+      </w:pPr>
+      <w:r>
+        <w:rPr>
+          <w:rFonts w:eastAsia="Arial" w:cs="Arial" w:ascii="Garamond" w:hAnsi="Garamond"/>
+          <w:color w:val="000000"/>
+          <w:kern w:val="0"/>
+          <w:sz w:val="36"/>
+          <w:szCs w:val="36"/>
+          <w:shd w:fill="auto" w:val="clear"/>
+          <w:lang w:val="en-US" w:eastAsia="zh-CN" w:bidi="hi-IN"/>
+        </w:rPr>
+        <w:t>Maria é reverenciada por bilhões de pessoas no mundo inteiro p</w:t>
+      </w:r>
+      <w:r>
+        <w:rPr>
+          <w:rFonts w:eastAsia="Arial" w:cs="Arial" w:ascii="Garamond" w:hAnsi="Garamond"/>
+          <w:color w:val="000000"/>
+          <w:kern w:val="0"/>
+          <w:sz w:val="36"/>
+          <w:szCs w:val="36"/>
+          <w:shd w:fill="auto" w:val="clear"/>
+          <w:lang w:val="en-US" w:eastAsia="zh-CN" w:bidi="hi-IN"/>
+        </w:rPr>
+        <w:t>or ser a mãe d</w:t>
+      </w:r>
+      <w:r>
+        <w:rPr>
+          <w:rFonts w:eastAsia="Arial" w:cs="Arial" w:ascii="Garamond" w:hAnsi="Garamond"/>
+          <w:color w:val="000000"/>
+          <w:kern w:val="0"/>
+          <w:sz w:val="36"/>
+          <w:szCs w:val="36"/>
+          <w:shd w:fill="auto" w:val="clear"/>
+          <w:lang w:val="en-US" w:eastAsia="zh-CN" w:bidi="hi-IN"/>
+        </w:rPr>
+        <w:t>o nosso divino Mestre</w:t>
+      </w:r>
+      <w:r>
+        <w:rPr>
+          <w:rFonts w:eastAsia="Arial" w:cs="Arial" w:ascii="Garamond" w:hAnsi="Garamond"/>
+          <w:color w:val="000000"/>
+          <w:kern w:val="0"/>
+          <w:sz w:val="36"/>
+          <w:szCs w:val="36"/>
+          <w:shd w:fill="auto" w:val="clear"/>
+          <w:lang w:val="en-US" w:eastAsia="zh-CN" w:bidi="hi-IN"/>
+        </w:rPr>
+        <w:t xml:space="preserve"> Jesus</w:t>
+      </w:r>
+      <w:r>
+        <w:rPr>
+          <w:rFonts w:eastAsia="Arial" w:cs="Arial" w:ascii="Garamond" w:hAnsi="Garamond"/>
+          <w:color w:val="000000"/>
+          <w:kern w:val="0"/>
+          <w:sz w:val="36"/>
+          <w:szCs w:val="36"/>
+          <w:shd w:fill="auto" w:val="clear"/>
+          <w:lang w:val="en-US" w:eastAsia="zh-CN" w:bidi="hi-IN"/>
+        </w:rPr>
+        <w:t xml:space="preserve"> Cristo. Entretanto, ao pesquisar dados históricos sobre a vida de Maria, ao aprofundar em suas palavras, suas  atitudes e até mesmo em seu silêncio, compreendi que a grandeza de Maria vai muito além  do que eu imaginava. </w:t>
+      </w:r>
+    </w:p>
+    <w:p>
+      <w:pPr>
+        <w:pStyle w:val="Normal"/>
+        <w:jc w:val="both"/>
+        <w:rPr>
+          <w:sz w:val="36"/>
+          <w:szCs w:val="36"/>
+        </w:rPr>
+      </w:pPr>
+      <w:r>
+        <w:rPr>
+          <w:sz w:val="36"/>
+          <w:szCs w:val="36"/>
+        </w:rPr>
+      </w:r>
+    </w:p>
+    <w:p>
+      <w:pPr>
+        <w:pStyle w:val="Normal"/>
+        <w:jc w:val="both"/>
+        <w:rPr>
+          <w:sz w:val="36"/>
+          <w:szCs w:val="36"/>
+        </w:rPr>
+      </w:pPr>
+      <w:r>
+        <w:rPr>
+          <w:rFonts w:eastAsia="Arial" w:cs="Arial" w:ascii="Garamond" w:hAnsi="Garamond"/>
+          <w:color w:val="000000"/>
+          <w:kern w:val="0"/>
+          <w:sz w:val="36"/>
+          <w:szCs w:val="36"/>
+          <w:shd w:fill="auto" w:val="clear"/>
+          <w:lang w:val="en-US" w:eastAsia="zh-CN" w:bidi="hi-IN"/>
+        </w:rPr>
+        <w:t>Dentre todas as virtudes de Maria, talvez aquelas que sejam mais necessárias para nós nos dias atuais sejam a resignação e a confiança em Jesus.</w:t>
+      </w:r>
+    </w:p>
+    <w:p>
+      <w:pPr>
+        <w:pStyle w:val="Normal"/>
+        <w:jc w:val="both"/>
+        <w:rPr>
+          <w:sz w:val="36"/>
+          <w:szCs w:val="36"/>
+        </w:rPr>
+      </w:pPr>
+      <w:r>
+        <w:rPr/>
+      </w:r>
+    </w:p>
+    <w:p>
+      <w:pPr>
+        <w:pStyle w:val="Normal"/>
+        <w:jc w:val="both"/>
+        <w:rPr>
+          <w:sz w:val="36"/>
+          <w:szCs w:val="36"/>
+        </w:rPr>
+      </w:pPr>
+      <w:r>
+        <w:rPr>
+          <w:rFonts w:eastAsia="Arial" w:cs="Arial" w:ascii="Garamond" w:hAnsi="Garamond"/>
+          <w:color w:val="000000"/>
+          <w:kern w:val="0"/>
+          <w:sz w:val="36"/>
+          <w:szCs w:val="36"/>
+          <w:shd w:fill="auto" w:val="clear"/>
+          <w:lang w:val="en-US" w:eastAsia="zh-CN" w:bidi="hi-IN"/>
+        </w:rPr>
+        <w:t>Estamos vivendo tempos turbulentos nos quais saltam aos nossos olhos injustiça, crueldade, imoralidade, corrupção. A vitória aparente dos maus nos causa angústia e desesperança.</w:t>
+      </w:r>
+    </w:p>
+    <w:p>
+      <w:pPr>
+        <w:pStyle w:val="Normal"/>
+        <w:jc w:val="both"/>
+        <w:rPr>
+          <w:sz w:val="36"/>
+          <w:szCs w:val="36"/>
+        </w:rPr>
+      </w:pPr>
+      <w:r>
+        <w:rPr/>
+      </w:r>
+    </w:p>
+    <w:p>
+      <w:pPr>
+        <w:pStyle w:val="Normal"/>
+        <w:jc w:val="both"/>
+        <w:rPr>
+          <w:sz w:val="36"/>
+          <w:szCs w:val="36"/>
+        </w:rPr>
+      </w:pPr>
+      <w:r>
+        <w:rPr>
+          <w:rFonts w:eastAsia="Arial" w:cs="Arial" w:ascii="Garamond" w:hAnsi="Garamond"/>
+          <w:color w:val="000000"/>
+          <w:kern w:val="0"/>
+          <w:sz w:val="36"/>
+          <w:szCs w:val="36"/>
+          <w:shd w:fill="auto" w:val="clear"/>
+          <w:lang w:val="en-US" w:eastAsia="zh-CN" w:bidi="hi-IN"/>
+        </w:rPr>
+        <w:t>Confesso que eu ainda me encontro perguntando: "Por quê Deus ainda permite que tais coisas aconteçam? Por quê Jesus Cristo não intercede em nosso favor?".</w:t>
+      </w:r>
+    </w:p>
+    <w:p>
+      <w:pPr>
+        <w:pStyle w:val="Normal"/>
+        <w:jc w:val="both"/>
+        <w:rPr>
+          <w:sz w:val="36"/>
+          <w:szCs w:val="36"/>
+        </w:rPr>
+      </w:pPr>
+      <w:r>
+        <w:rPr/>
+      </w:r>
+    </w:p>
+    <w:p>
+      <w:pPr>
+        <w:pStyle w:val="Normal"/>
+        <w:jc w:val="both"/>
+        <w:rPr>
+          <w:sz w:val="36"/>
+          <w:szCs w:val="36"/>
+        </w:rPr>
+      </w:pPr>
+      <w:r>
+        <w:rPr>
+          <w:rFonts w:eastAsia="Arial" w:cs="Arial" w:ascii="Garamond" w:hAnsi="Garamond"/>
+          <w:color w:val="000000"/>
+          <w:kern w:val="0"/>
+          <w:sz w:val="36"/>
+          <w:szCs w:val="36"/>
+          <w:shd w:fill="auto" w:val="clear"/>
+          <w:lang w:val="en-US" w:eastAsia="zh-CN" w:bidi="hi-IN"/>
+        </w:rPr>
+        <w:t>Maria de Nazaré sob o nome de Nossa Senhora Aparecida é a padroeira do Brasil. E eu também já perguntei a ela: "Mãe Santíssima, a senhora não fará nada pela nossa nação?".</w:t>
+      </w:r>
+    </w:p>
+    <w:p>
+      <w:pPr>
+        <w:pStyle w:val="Normal"/>
+        <w:jc w:val="both"/>
+        <w:rPr>
+          <w:sz w:val="36"/>
+          <w:szCs w:val="36"/>
+        </w:rPr>
+      </w:pPr>
+      <w:r>
+        <w:rPr/>
+      </w:r>
+    </w:p>
+    <w:p>
+      <w:pPr>
+        <w:pStyle w:val="Normal"/>
+        <w:jc w:val="both"/>
+        <w:rPr>
+          <w:sz w:val="36"/>
+          <w:szCs w:val="36"/>
+        </w:rPr>
+      </w:pPr>
+      <w:r>
+        <w:rPr>
+          <w:rFonts w:eastAsia="Arial" w:cs="Arial" w:ascii="Garamond" w:hAnsi="Garamond"/>
+          <w:color w:val="000000"/>
+          <w:kern w:val="0"/>
+          <w:sz w:val="36"/>
+          <w:szCs w:val="36"/>
+          <w:shd w:fill="auto" w:val="clear"/>
+          <w:lang w:val="en-US" w:eastAsia="zh-CN" w:bidi="hi-IN"/>
+        </w:rPr>
+        <w:t>[</w:t>
+      </w:r>
+      <w:r>
+        <w:rPr>
+          <w:rFonts w:eastAsia="Arial" w:cs="Arial" w:ascii="Garamond" w:hAnsi="Garamond"/>
+          <w:color w:val="000000"/>
+          <w:kern w:val="0"/>
+          <w:sz w:val="36"/>
+          <w:szCs w:val="36"/>
+          <w:shd w:fill="auto" w:val="clear"/>
+          <w:lang w:val="en-US" w:eastAsia="zh-CN" w:bidi="hi-IN"/>
+        </w:rPr>
+        <w:t xml:space="preserve"> Continuar a conclusão a partir desse ponto ]</w:t>
+      </w:r>
+    </w:p>
+    <w:p>
+      <w:pPr>
+        <w:pStyle w:val="Normal"/>
+        <w:jc w:val="both"/>
+        <w:rPr>
+          <w:sz w:val="36"/>
+          <w:szCs w:val="36"/>
+        </w:rPr>
+      </w:pPr>
+      <w:r>
+        <w:rPr/>
+      </w:r>
+    </w:p>
+    <w:p>
+      <w:pPr>
+        <w:pStyle w:val="Normal"/>
+        <w:jc w:val="both"/>
+        <w:rPr>
+          <w:sz w:val="36"/>
+          <w:szCs w:val="36"/>
+        </w:rPr>
+      </w:pPr>
+      <w:r>
+        <w:rPr>
+          <w:rFonts w:eastAsia="Arial" w:cs="Arial" w:ascii="Garamond" w:hAnsi="Garamond"/>
+          <w:color w:val="000000"/>
+          <w:kern w:val="0"/>
+          <w:sz w:val="36"/>
+          <w:szCs w:val="36"/>
+          <w:shd w:fill="auto" w:val="clear"/>
+          <w:lang w:val="en-US" w:eastAsia="zh-CN" w:bidi="hi-IN"/>
+        </w:rPr>
         <w:t>Maria não é apenas uma figura histórica ou religiosa; ela é um exemplo vivo de humildade, coragem e fé inabalável. Sua presença discreta, sua entrega silenciosa e seu papel fundamental na missão de Jesus me ensinaram que, às vezes, é no silêncio e na simplicidade que se encontra a maior força.</w:t>
       </w:r>
     </w:p>
@@ -5478,6 +6018,44 @@
         </w:rPr>
       </w:pPr>
       <w:r>
+        <w:rPr>
+          <w:sz w:val="36"/>
+          <w:szCs w:val="36"/>
+        </w:rPr>
+      </w:r>
+    </w:p>
+    <w:p>
+      <w:pPr>
+        <w:pStyle w:val="Normal"/>
+        <w:jc w:val="both"/>
+        <w:rPr>
+          <w:sz w:val="36"/>
+          <w:szCs w:val="36"/>
+        </w:rPr>
+      </w:pPr>
+      <w:r>
+        <w:rPr>
+          <w:rFonts w:eastAsia="Arial" w:cs="Arial" w:ascii="Garamond" w:hAnsi="Garamond"/>
+          <w:color w:val="000000"/>
+          <w:kern w:val="0"/>
+          <w:sz w:val="36"/>
+          <w:szCs w:val="36"/>
+          <w:shd w:fill="auto" w:val="clear"/>
+          <w:lang w:val="en-US" w:eastAsia="zh-CN" w:bidi="hi-IN"/>
+        </w:rPr>
+        <w:t>Essa descoberta pessoal reforçou não só a minha admiração, mas também meu respeito e gratidão por Maria, que permanece um farol espiritual para todos nós, inspirando fé e esperança em meio às dificuldades da vida.</w:t>
+      </w:r>
+    </w:p>
+    <w:p>
+      <w:pPr>
+        <w:pStyle w:val="Normal"/>
+        <w:jc w:val="both"/>
+        <w:rPr>
+          <w:sz w:val="36"/>
+          <w:szCs w:val="36"/>
+        </w:rPr>
+      </w:pPr>
+      <w:r>
         <w:rPr/>
       </w:r>
     </w:p>
@@ -5500,7 +6078,6 @@
           <w:shd w:fill="auto" w:val="clear"/>
           <w:lang w:val="en-US" w:eastAsia="zh-CN" w:bidi="hi-IN"/>
         </w:rPr>
-        <w:t>Essa descoberta pessoal reforçou não só a minha admiração, mas também meu respeito e gratidão por Maria, que permanece um farol espiritual para todos nós, inspirando fé e esperança em meio às dificuldades da vida.</w:t>
       </w:r>
     </w:p>
     <w:sectPr>
@@ -5572,7 +6149,7 @@
         <w:bCs/>
         <w:rFonts w:ascii="Garamond" w:hAnsi="Garamond"/>
       </w:rPr>
-      <w:t>24</w:t>
+      <w:t>27</w:t>
     </w:r>
     <w:r>
       <w:rPr>

</xml_diff>

<commit_message>
17/05/2025 - 19:05 h
</commit_message>
<xml_diff>
--- a/Maria de Nazaré e a disposição em servir/Maria de Nazaré e a disposição em servir.docx
+++ b/Maria de Nazaré e a disposição em servir/Maria de Nazaré e a disposição em servir.docx
@@ -255,7 +255,7 @@
           <w:sz w:val="36"/>
           <w:szCs w:val="36"/>
         </w:rPr>
-        <w:t xml:space="preserve"> Espírito puro, perfeito, que Deus ofereceu à humanidade para servir como guia e modelo: Jesus Cristo.</w:t>
+        <w:t xml:space="preserve"> Espírito puro, perfeito, que Deus ofereceu à humanidade terrena para servir como guia e modelo: Jesus Cristo.</w:t>
       </w:r>
     </w:p>
     <w:p>
@@ -740,7 +740,7 @@
           <w:sz w:val="36"/>
           <w:szCs w:val="36"/>
         </w:rPr>
-        <w:t>Os capítulos no Alcorão são chamados suratas. A surata 19 intitulada "Surata Maryam". Maryam é a forma árabe do nome Maria. A surata não é totalmente dedicada a Maria, mas lá é narrada a  história da anunciação, gravidez e nascimento de Jesus. A tradição islâmica descreve Maria como uma mulher pura e santa.</w:t>
+        <w:t>Os capítulos no Alcorão são chamados suratas. A surata 19 é intitulada "Surata Maryam". Maryam é a forma árabe do nome Maria. A "Surata Maryam" não é totalmente dedicada a Maria, mas lá é narrada a  história da anunciação, gravidez e nascimento de Jesus. A tradição islâmica descreve Maria como uma mulher pura e santa.</w:t>
       </w:r>
     </w:p>
     <w:p>
@@ -1475,7 +1475,7 @@
           <w:sz w:val="36"/>
           <w:szCs w:val="36"/>
         </w:rPr>
-        <w:t>missão, mesmo sabendo dos riscos, sofrimentos e incertezas a que estaria submetida. Ela revela uma obediência madura</w:t>
+        <w:t>missão, mesmo sabendo dos riscos, sofrimentos e incertezas a que estaria submetida. Revela uma obediência madura</w:t>
       </w:r>
       <w:r>
         <w:rPr>
@@ -1494,7 +1494,26 @@
           <w:sz w:val="36"/>
           <w:szCs w:val="36"/>
         </w:rPr>
-        <w:t xml:space="preserve"> ativa: escolhe colocar a vontade de Deus acima da sua própria vontade.</w:t>
+        <w:t xml:space="preserve"> ativa: </w:t>
+      </w:r>
+      <w:r>
+        <w:rPr>
+          <w:rFonts w:eastAsia="Arial" w:cs="Arial" w:ascii="Garamond" w:hAnsi="Garamond"/>
+          <w:color w:val="auto"/>
+          <w:kern w:val="0"/>
+          <w:sz w:val="36"/>
+          <w:szCs w:val="36"/>
+          <w:lang w:val="en-US" w:eastAsia="zh-CN" w:bidi="hi-IN"/>
+        </w:rPr>
+        <w:t>coloca</w:t>
+      </w:r>
+      <w:r>
+        <w:rPr>
+          <w:rFonts w:ascii="Garamond" w:hAnsi="Garamond"/>
+          <w:sz w:val="36"/>
+          <w:szCs w:val="36"/>
+        </w:rPr>
+        <w:t xml:space="preserve"> a vontade de Deus acima da sua própria vontade.</w:t>
       </w:r>
     </w:p>
     <w:p>
@@ -1793,118 +1812,167 @@
           <w:sz w:val="36"/>
           <w:szCs w:val="36"/>
         </w:rPr>
-        <w:t>E quanto à obediência aos propósitos divinos? Será que temos sido obedientes? Aceitamos de boa vontade tudo aquilo que Deus coloca em nossas vidas ou nos revoltamos, nos rebelamos quando os desejos de Deus são diferentes do nosso?</w:t>
-      </w:r>
-    </w:p>
-    <w:p>
-      <w:pPr>
-        <w:pStyle w:val="Normal"/>
-        <w:jc w:val="both"/>
-        <w:rPr>
-          <w:rFonts w:ascii="Garamond" w:hAnsi="Garamond"/>
-          <w:sz w:val="36"/>
-          <w:szCs w:val="36"/>
-        </w:rPr>
-      </w:pPr>
-      <w:r>
-        <w:rPr>
-          <w:rFonts w:ascii="Garamond" w:hAnsi="Garamond"/>
-          <w:sz w:val="36"/>
-          <w:szCs w:val="36"/>
-        </w:rPr>
-      </w:r>
-    </w:p>
-    <w:p>
-      <w:pPr>
-        <w:pStyle w:val="Normal"/>
-        <w:jc w:val="both"/>
-        <w:rPr>
-          <w:rFonts w:ascii="Garamond" w:hAnsi="Garamond"/>
-          <w:sz w:val="36"/>
-          <w:szCs w:val="36"/>
-        </w:rPr>
-      </w:pPr>
-      <w:r>
-        <w:rPr>
-          <w:rFonts w:ascii="Garamond" w:hAnsi="Garamond"/>
-          <w:sz w:val="36"/>
-          <w:szCs w:val="36"/>
-        </w:rPr>
-        <w:t xml:space="preserve">Quando oramos o Pai Nosso nós dizemos: "seja feita a vossa vontade, assim na Terra como no Céu", mas na prática a gente quase coloca uma nota de rodapé nessa frase dizendo "desde que a vontade de Deus seja a minha vontade". </w:t>
-      </w:r>
-    </w:p>
-    <w:p>
-      <w:pPr>
-        <w:pStyle w:val="Normal"/>
-        <w:jc w:val="both"/>
-        <w:rPr>
-          <w:rFonts w:ascii="Garamond" w:hAnsi="Garamond"/>
-          <w:sz w:val="36"/>
-          <w:szCs w:val="36"/>
-        </w:rPr>
-      </w:pPr>
-      <w:r>
-        <w:rPr>
-          <w:rFonts w:ascii="Garamond" w:hAnsi="Garamond"/>
-          <w:sz w:val="36"/>
-          <w:szCs w:val="36"/>
-        </w:rPr>
-      </w:r>
-    </w:p>
-    <w:p>
-      <w:pPr>
-        <w:pStyle w:val="Normal"/>
-        <w:jc w:val="both"/>
-        <w:rPr>
-          <w:rFonts w:ascii="Garamond" w:hAnsi="Garamond"/>
-          <w:sz w:val="36"/>
-          <w:szCs w:val="36"/>
-        </w:rPr>
-      </w:pPr>
-      <w:r>
-        <w:rPr>
-          <w:rFonts w:ascii="Garamond" w:hAnsi="Garamond"/>
-          <w:sz w:val="36"/>
-          <w:szCs w:val="36"/>
-        </w:rPr>
-        <w:t>Nós invertemos o sentido dessa frase. Queremos que Deus faça a nossa vontade, do nosso modo, no nosso tempo. Claro que não é assim que acontece e então surge em nós a revolta, a tristeza, a descrença e a desobediência.</w:t>
-      </w:r>
-    </w:p>
-    <w:p>
-      <w:pPr>
-        <w:pStyle w:val="Normal"/>
-        <w:jc w:val="both"/>
-        <w:rPr>
-          <w:rFonts w:ascii="Garamond" w:hAnsi="Garamond"/>
-          <w:sz w:val="36"/>
-          <w:szCs w:val="36"/>
-        </w:rPr>
-      </w:pPr>
-      <w:r>
-        <w:rPr>
-          <w:rFonts w:ascii="Garamond" w:hAnsi="Garamond"/>
-          <w:sz w:val="36"/>
-          <w:szCs w:val="36"/>
-        </w:rPr>
-      </w:r>
-    </w:p>
-    <w:p>
-      <w:pPr>
-        <w:pStyle w:val="Normal"/>
-        <w:jc w:val="both"/>
-        <w:rPr>
-          <w:rFonts w:ascii="Garamond" w:hAnsi="Garamond"/>
-          <w:sz w:val="36"/>
-          <w:szCs w:val="36"/>
-        </w:rPr>
-      </w:pPr>
-      <w:r>
-        <w:rPr>
-          <w:rFonts w:ascii="Garamond" w:hAnsi="Garamond"/>
-          <w:sz w:val="36"/>
-          <w:szCs w:val="36"/>
-        </w:rPr>
-        <w:t xml:space="preserve">Se nos mantivermos obedientes aos desígnios </w:t>
+        <w:t>E quanto à obediência aos propósitos divinos? Será que temos sido obedientes? Aceitamos de boa vontade tudo aquilo que Deus coloca em nossas vidas ou nos revoltamos, nos rebelamos quando os desejos de Deus são diferentes dos nossos?</w:t>
+      </w:r>
+    </w:p>
+    <w:p>
+      <w:pPr>
+        <w:pStyle w:val="Normal"/>
+        <w:jc w:val="both"/>
+        <w:rPr>
+          <w:rFonts w:ascii="Garamond" w:hAnsi="Garamond"/>
+          <w:sz w:val="36"/>
+          <w:szCs w:val="36"/>
+        </w:rPr>
+      </w:pPr>
+      <w:r>
+        <w:rPr>
+          <w:rFonts w:ascii="Garamond" w:hAnsi="Garamond"/>
+          <w:sz w:val="36"/>
+          <w:szCs w:val="36"/>
+        </w:rPr>
+      </w:r>
+    </w:p>
+    <w:p>
+      <w:pPr>
+        <w:pStyle w:val="Normal"/>
+        <w:jc w:val="both"/>
+        <w:rPr>
+          <w:rFonts w:ascii="Garamond" w:hAnsi="Garamond"/>
+          <w:sz w:val="36"/>
+          <w:szCs w:val="36"/>
+        </w:rPr>
+      </w:pPr>
+      <w:r>
+        <w:rPr>
+          <w:rFonts w:ascii="Garamond" w:hAnsi="Garamond"/>
+          <w:sz w:val="36"/>
+          <w:szCs w:val="36"/>
+        </w:rPr>
+        <w:t xml:space="preserve">Quando oramos o Pai Nosso nós dizemos: "seja feita a vossa vontade, assim na Terra como no Céu", mas </w:t>
+      </w:r>
+      <w:r>
+        <w:rPr>
+          <w:rFonts w:eastAsia="Arial" w:cs="Arial" w:ascii="Garamond" w:hAnsi="Garamond"/>
+          <w:color w:val="auto"/>
+          <w:kern w:val="0"/>
+          <w:sz w:val="36"/>
+          <w:szCs w:val="36"/>
+          <w:lang w:val="en-US" w:eastAsia="zh-CN" w:bidi="hi-IN"/>
+        </w:rPr>
+        <w:t>na realidade nós ainda não estamos em condições de aceitar plenamente a vontade de Deus</w:t>
+      </w:r>
+      <w:r>
+        <w:rPr>
+          <w:rFonts w:ascii="Garamond" w:hAnsi="Garamond"/>
+          <w:sz w:val="36"/>
+          <w:szCs w:val="36"/>
+        </w:rPr>
+        <w:t xml:space="preserve">. </w:t>
+      </w:r>
+    </w:p>
+    <w:p>
+      <w:pPr>
+        <w:pStyle w:val="Normal"/>
+        <w:jc w:val="both"/>
+        <w:rPr>
+          <w:rFonts w:ascii="Garamond" w:hAnsi="Garamond"/>
+          <w:sz w:val="36"/>
+          <w:szCs w:val="36"/>
+        </w:rPr>
+      </w:pPr>
+      <w:r>
+        <w:rPr>
+          <w:rFonts w:ascii="Garamond" w:hAnsi="Garamond"/>
+          <w:sz w:val="36"/>
+          <w:szCs w:val="36"/>
+        </w:rPr>
+      </w:r>
+    </w:p>
+    <w:p>
+      <w:pPr>
+        <w:pStyle w:val="Normal"/>
+        <w:jc w:val="both"/>
+        <w:rPr>
+          <w:rFonts w:ascii="Garamond" w:hAnsi="Garamond"/>
+          <w:sz w:val="36"/>
+          <w:szCs w:val="36"/>
+        </w:rPr>
+      </w:pPr>
+      <w:r>
+        <w:rPr>
+          <w:rFonts w:eastAsia="Arial" w:cs="Arial" w:ascii="Garamond" w:hAnsi="Garamond"/>
+          <w:color w:val="auto"/>
+          <w:kern w:val="0"/>
+          <w:sz w:val="36"/>
+          <w:szCs w:val="36"/>
+          <w:lang w:val="en-US" w:eastAsia="zh-CN" w:bidi="hi-IN"/>
+        </w:rPr>
+        <w:t>I</w:t>
+      </w:r>
+      <w:r>
+        <w:rPr>
+          <w:rFonts w:ascii="Garamond" w:hAnsi="Garamond"/>
+          <w:sz w:val="36"/>
+          <w:szCs w:val="36"/>
+        </w:rPr>
+        <w:t>nvertemos o sentido dessa frase. Queremos que Deus faça a nossa vontade, do nosso modo, no nosso tempo. Como Deus é justo e sábio, não é assim que acontece e então surge em nós a revolta, a tristeza, a descrença e a desobediência.</w:t>
+      </w:r>
+    </w:p>
+    <w:p>
+      <w:pPr>
+        <w:pStyle w:val="Normal"/>
+        <w:jc w:val="both"/>
+        <w:rPr>
+          <w:rFonts w:ascii="Garamond" w:hAnsi="Garamond"/>
+          <w:sz w:val="36"/>
+          <w:szCs w:val="36"/>
+        </w:rPr>
+      </w:pPr>
+      <w:r>
+        <w:rPr>
+          <w:rFonts w:ascii="Garamond" w:hAnsi="Garamond"/>
+          <w:sz w:val="36"/>
+          <w:szCs w:val="36"/>
+        </w:rPr>
+      </w:r>
+    </w:p>
+    <w:p>
+      <w:pPr>
+        <w:pStyle w:val="Normal"/>
+        <w:jc w:val="both"/>
+        <w:rPr>
+          <w:rFonts w:ascii="Garamond" w:hAnsi="Garamond"/>
+          <w:sz w:val="36"/>
+          <w:szCs w:val="36"/>
+        </w:rPr>
+      </w:pPr>
+      <w:r>
+        <w:rPr>
+          <w:rFonts w:ascii="Garamond" w:hAnsi="Garamond"/>
+          <w:sz w:val="36"/>
+          <w:szCs w:val="36"/>
+        </w:rPr>
+        <w:t xml:space="preserve">Se </w:t>
+      </w:r>
+      <w:r>
+        <w:rPr>
+          <w:rFonts w:eastAsia="Arial" w:cs="Arial" w:ascii="Garamond" w:hAnsi="Garamond"/>
+          <w:color w:val="auto"/>
+          <w:kern w:val="0"/>
+          <w:sz w:val="36"/>
+          <w:szCs w:val="36"/>
+          <w:lang w:val="en-US" w:eastAsia="zh-CN" w:bidi="hi-IN"/>
+        </w:rPr>
+        <w:t>formos</w:t>
+      </w:r>
+      <w:r>
+        <w:rPr>
+          <w:rFonts w:ascii="Garamond" w:hAnsi="Garamond"/>
+          <w:sz w:val="36"/>
+          <w:szCs w:val="36"/>
+        </w:rPr>
+        <w:t xml:space="preserve"> obedientes aos desígnios </w:t>
       </w:r>
       <w:r>
         <w:rPr>
@@ -1923,7 +1991,26 @@
           <w:sz w:val="36"/>
           <w:szCs w:val="36"/>
         </w:rPr>
-        <w:t xml:space="preserve">, realizando de boa vontade o trabalho que nos cabe,  estaremos construindo </w:t>
+        <w:t xml:space="preserve">, realizando de boa vontade o trabalho que nos cabe,  </w:t>
+      </w:r>
+      <w:r>
+        <w:rPr>
+          <w:rFonts w:eastAsia="Arial" w:cs="Arial" w:ascii="Garamond" w:hAnsi="Garamond"/>
+          <w:color w:val="auto"/>
+          <w:kern w:val="0"/>
+          <w:sz w:val="36"/>
+          <w:szCs w:val="36"/>
+          <w:lang w:val="en-US" w:eastAsia="zh-CN" w:bidi="hi-IN"/>
+        </w:rPr>
+        <w:t>pouco a pouco construiremos</w:t>
+      </w:r>
+      <w:r>
+        <w:rPr>
+          <w:rFonts w:ascii="Garamond" w:hAnsi="Garamond"/>
+          <w:sz w:val="36"/>
+          <w:szCs w:val="36"/>
+        </w:rPr>
+        <w:t xml:space="preserve"> </w:t>
       </w:r>
       <w:r>
         <w:rPr>
@@ -2126,7 +2213,7 @@
           <w:sz w:val="36"/>
           <w:szCs w:val="36"/>
         </w:rPr>
-        <w:t xml:space="preserve">Maria nos dá exemplos, novamente, de humildade, prontidão generosa e presença consoladora.  Ao saber da gravidez da prima já idosa, ela não hesita: parte apressadamente pelas montanhas da Judeia, mostrando que a verdadeira caridade é pronta, sensível e ativa. </w:t>
+        <w:t xml:space="preserve">Maria nos dá exemplos, novamente, de humildade, prontidão generosa e presença consoladora.  Ao saber da gravidez da prima já idosa, ela não hesita: parte apressadamente pelas montanhas da Judeia, mostrando que a verdadeira caridade é pronta e ativa. </w:t>
       </w:r>
     </w:p>
     <w:p>
@@ -2231,7 +2318,25 @@
           <w:sz w:val="36"/>
           <w:szCs w:val="36"/>
         </w:rPr>
-        <w:t xml:space="preserve">. Permanece ali por cerca de três meses, servindo não apenas com gestos, mas também com sua presença amorosa, com o consolo de sua escuta e a partilha do cotidiano. </w:t>
+        <w:t xml:space="preserve">. Permanece ali por cerca de três meses, servindo com sua presença amorosa, com o consolo de sua escuta e a partilha do cotidiano. </w:t>
+      </w:r>
+    </w:p>
+    <w:p>
+      <w:pPr>
+        <w:pStyle w:val="Normal"/>
+        <w:jc w:val="both"/>
+        <w:rPr>
+          <w:rFonts w:ascii="Garamond" w:hAnsi="Garamond"/>
+          <w:sz w:val="36"/>
+          <w:szCs w:val="36"/>
+        </w:rPr>
+      </w:pPr>
+      <w:r>
+        <w:rPr>
+          <w:rFonts w:ascii="Garamond" w:hAnsi="Garamond"/>
+          <w:sz w:val="36"/>
+          <w:szCs w:val="36"/>
+        </w:rPr>
       </w:r>
     </w:p>
     <w:p>
@@ -2336,7 +2441,7 @@
           <w:sz w:val="36"/>
           <w:szCs w:val="36"/>
         </w:rPr>
-        <w:t>estima-se que de Nazaré a Ain Karim, a distância aproximada seria de 130 km a 150 km.</w:t>
+        <w:t>estima-se que de Nazaré a Ain Karim, a distância seria de 130 km a 150 km.</w:t>
       </w:r>
     </w:p>
     <w:p>
@@ -2625,7 +2730,7 @@
           <w:szCs w:val="36"/>
           <w:lang w:val="en-US" w:eastAsia="zh-CN" w:bidi="hi-IN"/>
         </w:rPr>
-        <w:t>Nesse sentido, qual tem sido nossa postura diante da vida? Conseguimos  abdicar de nossas conquistas materiais e espirituais que, verdade seja dita, são ainda muito pequenas, para nos colocarmos a serviço dos outros ou o orgulho ainda fala mais alto dentro de nós?</w:t>
+        <w:t>Nesse sentido, qual tem sido nossa postura? Conseguimos  abdicar de nossas conquistas materiais e espirituais que, verdade seja dita, são ainda muito pequenas, para nos colocarmos a serviço dos outros ou o orgulho ainda fala mais alto dentro de nós?</w:t>
       </w:r>
     </w:p>
     <w:p>
@@ -2680,24 +2785,6 @@
       </w:pPr>
       <w:r>
         <w:rPr>
-          <w:rFonts w:ascii="Garamond" w:hAnsi="Garamond"/>
-          <w:sz w:val="36"/>
-          <w:szCs w:val="36"/>
-        </w:rPr>
-      </w:r>
-    </w:p>
-    <w:p>
-      <w:pPr>
-        <w:pStyle w:val="Normal"/>
-        <w:jc w:val="both"/>
-        <w:rPr>
-          <w:rFonts w:ascii="Garamond" w:hAnsi="Garamond"/>
-          <w:sz w:val="36"/>
-          <w:szCs w:val="36"/>
-        </w:rPr>
-      </w:pPr>
-      <w:r>
-        <w:rPr>
           <w:rFonts w:eastAsia="Arial" w:cs="Arial" w:ascii="Garamond" w:hAnsi="Garamond"/>
           <w:color w:val="auto"/>
           <w:kern w:val="0"/>
@@ -2849,7 +2936,7 @@
           <w:szCs w:val="36"/>
           <w:lang w:val="en-US" w:eastAsia="zh-CN" w:bidi="hi-IN"/>
         </w:rPr>
-        <w:t>atacar,</w:t>
+        <w:t>agredir,</w:t>
       </w:r>
       <w:r>
         <w:rPr>
@@ -3323,6 +3410,24 @@
       <w:pPr>
         <w:pStyle w:val="Normal"/>
         <w:jc w:val="both"/>
+        <w:rPr/>
+      </w:pPr>
+      <w:r>
+        <w:rPr>
+          <w:rFonts w:eastAsia="Arial" w:cs="Arial" w:ascii="Garamond" w:hAnsi="Garamond"/>
+          <w:color w:val="auto"/>
+          <w:kern w:val="0"/>
+          <w:sz w:val="36"/>
+          <w:szCs w:val="36"/>
+          <w:lang w:val="en-US" w:eastAsia="zh-CN" w:bidi="hi-IN"/>
+        </w:rPr>
+        <w:t>Maria orienta os servidores a seguirem as instruções de Jesus antes mesmo de saber o que Ele faria. Ela tinha plena confiança no filho. Não sabia como mas tinha certeza de que Ele resolveria o problema.</w:t>
+      </w:r>
+    </w:p>
+    <w:p>
+      <w:pPr>
+        <w:pStyle w:val="Normal"/>
+        <w:jc w:val="both"/>
         <w:rPr>
           <w:rFonts w:ascii="Garamond" w:hAnsi="Garamond" w:eastAsia="Arial" w:cs="Arial"/>
           <w:color w:val="auto"/>
@@ -3358,7 +3463,7 @@
           <w:szCs w:val="36"/>
           <w:lang w:val="en-US" w:eastAsia="zh-CN" w:bidi="hi-IN"/>
         </w:rPr>
-        <w:t>Maria orienta os servidores a seguirem as instruções de Jesus antes mesmo de saber o que Ele faria. Ela tinha plena confiança no filho. Não sabia como mas tinha certeza de que Ele resolveria o problema.</w:t>
+        <w:t>E quanto a nós? Sabemos de fato ouvir, obedecer e confiar em Jesus? Se fizermos um exame de consciência verdadeiro veremos que não. É algo que precisamos exercitar muito ainda.</w:t>
       </w:r>
     </w:p>
     <w:p>
@@ -3400,7 +3505,7 @@
           <w:szCs w:val="36"/>
           <w:lang w:val="en-US" w:eastAsia="zh-CN" w:bidi="hi-IN"/>
         </w:rPr>
-        <w:t>E quanto a nós? Sabemos de fato ouvir, obedecer e confiar em Jesus? Se fizermos um exame de consciência verdadeiro veremos que ainda não. É algo que precisamos exercitar muito ainda.</w:t>
+        <w:t>Quantas vezes nos atormentamos desnecessariamente  por agir de maneira contrária àquilo que nos recomenda o evangelho? E quando a dor bate à nossa porta, lamentamos por termos ignorado as instruções do Mestre.</w:t>
       </w:r>
     </w:p>
     <w:p>
@@ -3442,7 +3547,7 @@
           <w:szCs w:val="36"/>
           <w:lang w:val="en-US" w:eastAsia="zh-CN" w:bidi="hi-IN"/>
         </w:rPr>
-        <w:t>Quantas vezes nos atormentamos desnecessariamente  por agir de maneira contrária àquilo que nos recomenda o evangelho? E quando a dor bate à nossa porta, lamentamos por termos ignorado as instruções do Mestre.</w:t>
+        <w:t>Qual será nosso grau de confiança em Jesus hoje, depois de tudo o que temos aprendido, principalmente sob a luz da Doutrina Espírita?</w:t>
       </w:r>
     </w:p>
     <w:p>
@@ -3484,7 +3589,25 @@
           <w:szCs w:val="36"/>
           <w:lang w:val="en-US" w:eastAsia="zh-CN" w:bidi="hi-IN"/>
         </w:rPr>
-        <w:t>Qual será nosso grau de confiança em Jesus hoje, depois de tudo o que temos aprendido, principalmente sob a luz da Doutrina Espírita?</w:t>
+        <w:t>Somos servidores fiéis que fazem o que o Mestre nos recomenda tendo a certeza de que o resultado será o melhor? Definitivamente não.</w:t>
+      </w:r>
+    </w:p>
+    <w:p>
+      <w:pPr>
+        <w:pStyle w:val="Normal"/>
+        <w:jc w:val="both"/>
+        <w:rPr/>
+      </w:pPr>
+      <w:r>
+        <w:rPr>
+          <w:rFonts w:eastAsia="Arial" w:cs="Arial" w:ascii="Garamond" w:hAnsi="Garamond"/>
+          <w:color w:val="auto"/>
+          <w:kern w:val="0"/>
+          <w:sz w:val="36"/>
+          <w:szCs w:val="36"/>
+          <w:lang w:val="en-US" w:eastAsia="zh-CN" w:bidi="hi-IN"/>
+        </w:rPr>
+        <w:t>Vamos dar um exemplo simples: muitos de nós já colocamos na urna ou no livro de irradiação aqui da FEIG nomes de familiares ou amigos queridos que estavam enfermos.</w:t>
       </w:r>
     </w:p>
     <w:p>
@@ -3526,7 +3649,7 @@
           <w:szCs w:val="36"/>
           <w:lang w:val="en-US" w:eastAsia="zh-CN" w:bidi="hi-IN"/>
         </w:rPr>
-        <w:t>Somos servidores fiéis que fazem o que o Mestre nos recomenda tendo a certeza de que o resultado será o melhor? Certamente que ainda não.</w:t>
+        <w:t xml:space="preserve">Nós fazemos isso na incerteza do que acontecerá. Mas a incerteza não é nosso maior problema. Afinal de contas, não há como sabermos de antemão se a pessoa será curada ou não.  Nosso grande problema é que não confiamos plenamente na resposta de Jesus às nossas rogativas. </w:t>
       </w:r>
     </w:p>
     <w:p>
@@ -3568,7 +3691,7 @@
           <w:szCs w:val="36"/>
           <w:lang w:val="en-US" w:eastAsia="zh-CN" w:bidi="hi-IN"/>
         </w:rPr>
-        <w:t>Vamos dar um exemplo simples: muitos de nós já colocamos na urna ou no livro de irradiação aqui da FEIG nomes de familiares ou amigos queridos que estavam enfermos.</w:t>
+        <w:t xml:space="preserve">No fundo o meu desejo é que Jesus permita que a pessoa seja curada: se for assim, então minha confiança é plena. Mas, se a doença persistir, se agravar ou se a pessoa vier a desencarnar, minha confiança fica abalada. </w:t>
       </w:r>
     </w:p>
     <w:p>
@@ -3610,7 +3733,7 @@
           <w:szCs w:val="36"/>
           <w:lang w:val="en-US" w:eastAsia="zh-CN" w:bidi="hi-IN"/>
         </w:rPr>
-        <w:t xml:space="preserve">Nós fazemos isso na incerteza do que acontecerá. Mas a incerteza não é nosso maior problema. Afinal de contas, não há como sabermos de antemão se a pessoa será curada ou não.  Nosso grande problema é que não confiamos plenamente na resposta que Jesus dará às nossas rogativas. </w:t>
+        <w:t xml:space="preserve">A Terra é para nós, lar, oficina de trabalho, hospital de almas e escola. Jesus é nosso Mestre e guia. Portanto, tudo que nos acontece  tem como objetivo nos educar. </w:t>
       </w:r>
     </w:p>
     <w:p>
@@ -3641,24 +3764,6 @@
       <w:pPr>
         <w:pStyle w:val="Normal"/>
         <w:jc w:val="both"/>
-        <w:rPr/>
-      </w:pPr>
-      <w:r>
-        <w:rPr>
-          <w:rFonts w:eastAsia="Arial" w:cs="Arial" w:ascii="Garamond" w:hAnsi="Garamond"/>
-          <w:color w:val="auto"/>
-          <w:kern w:val="0"/>
-          <w:sz w:val="36"/>
-          <w:szCs w:val="36"/>
-          <w:lang w:val="en-US" w:eastAsia="zh-CN" w:bidi="hi-IN"/>
-        </w:rPr>
-        <w:t xml:space="preserve">No fundo o meu desejo é que Jesus permita que a pessoa seja curada: se for assim, então minha confiança é plena. Mas, se a doença persistir, se agravar ou se a pessoa vier a desencarnar, minha confiança fica abalada. </w:t>
-      </w:r>
-    </w:p>
-    <w:p>
-      <w:pPr>
-        <w:pStyle w:val="Normal"/>
-        <w:jc w:val="both"/>
         <w:rPr>
           <w:rFonts w:ascii="Garamond" w:hAnsi="Garamond" w:eastAsia="Arial" w:cs="Arial"/>
           <w:color w:val="auto"/>
@@ -3677,73 +3782,7 @@
           <w:szCs w:val="36"/>
           <w:lang w:val="en-US" w:eastAsia="zh-CN" w:bidi="hi-IN"/>
         </w:rPr>
-      </w:r>
-    </w:p>
-    <w:p>
-      <w:pPr>
-        <w:pStyle w:val="Normal"/>
-        <w:jc w:val="both"/>
-        <w:rPr/>
-      </w:pPr>
-      <w:r>
-        <w:rPr>
-          <w:rFonts w:eastAsia="Arial" w:cs="Arial" w:ascii="Garamond" w:hAnsi="Garamond"/>
-          <w:color w:val="auto"/>
-          <w:kern w:val="0"/>
-          <w:sz w:val="36"/>
-          <w:szCs w:val="36"/>
-          <w:lang w:val="en-US" w:eastAsia="zh-CN" w:bidi="hi-IN"/>
-        </w:rPr>
-        <w:t xml:space="preserve">Precisamos compreender que a Terra é para nós, lar, oficina de trabalho, hospital de almas e escola. Jesus é nosso Mestre e guia. Portanto, tudo que nos acontece  tem como objetivo nos educar. </w:t>
-      </w:r>
-    </w:p>
-    <w:p>
-      <w:pPr>
-        <w:pStyle w:val="Normal"/>
-        <w:jc w:val="both"/>
-        <w:rPr>
-          <w:rFonts w:ascii="Garamond" w:hAnsi="Garamond" w:eastAsia="Arial" w:cs="Arial"/>
-          <w:color w:val="auto"/>
-          <w:kern w:val="0"/>
-          <w:sz w:val="36"/>
-          <w:szCs w:val="36"/>
-          <w:lang w:val="en-US" w:eastAsia="zh-CN" w:bidi="hi-IN"/>
-        </w:rPr>
-      </w:pPr>
-      <w:r>
-        <w:rPr>
-          <w:rFonts w:eastAsia="Arial" w:cs="Arial" w:ascii="Garamond" w:hAnsi="Garamond"/>
-          <w:color w:val="auto"/>
-          <w:kern w:val="0"/>
-          <w:sz w:val="36"/>
-          <w:szCs w:val="36"/>
-          <w:lang w:val="en-US" w:eastAsia="zh-CN" w:bidi="hi-IN"/>
-        </w:rPr>
-      </w:r>
-    </w:p>
-    <w:p>
-      <w:pPr>
-        <w:pStyle w:val="Normal"/>
-        <w:jc w:val="both"/>
-        <w:rPr>
-          <w:rFonts w:ascii="Garamond" w:hAnsi="Garamond" w:eastAsia="Arial" w:cs="Arial"/>
-          <w:color w:val="auto"/>
-          <w:kern w:val="0"/>
-          <w:sz w:val="36"/>
-          <w:szCs w:val="36"/>
-          <w:lang w:val="en-US" w:eastAsia="zh-CN" w:bidi="hi-IN"/>
-        </w:rPr>
-      </w:pPr>
-      <w:r>
-        <w:rPr>
-          <w:rFonts w:eastAsia="Arial" w:cs="Arial" w:ascii="Garamond" w:hAnsi="Garamond"/>
-          <w:color w:val="auto"/>
-          <w:kern w:val="0"/>
-          <w:sz w:val="36"/>
-          <w:szCs w:val="36"/>
-          <w:lang w:val="en-US" w:eastAsia="zh-CN" w:bidi="hi-IN"/>
-        </w:rPr>
-        <w:t>Reconhecendo nossa condição de alunos, devemos seguir aprendendo e trabalhando com Jesus e para Jesus, confiando sempre que tudo aquilo que fazemos hoje, por mais simples que seja, nos encontrará com justiça no futuro.</w:t>
+        <w:t>Reconhecendo nossa condição de alunos, devemos seguir aprendendo e trabalhando no bem, confiando que Jesus fará por nós aquilo que precisamos e merecemos.</w:t>
       </w:r>
     </w:p>
     <w:p>
@@ -3971,7 +4010,7 @@
           <w:shd w:fill="auto" w:val="clear"/>
           <w:lang w:val="en-US" w:eastAsia="zh-CN" w:bidi="hi-IN"/>
         </w:rPr>
-        <w:t xml:space="preserve">Ali ela também reafirma sua fidelidade aos desígnios de Deus. Se em Belém ela recebeu Jesus nos braços, agora, no Calvário, ela O entrega de volta ao Pai — com a mesma humildade, com o mesmo espírito de serviço. Sua renúncia não é apenas materna, é espiritual. </w:t>
+        <w:t xml:space="preserve">Ali Maria também reafirma sua fidelidade aos desígnios de Deus. Se em Belém ela recebeu Jesus nos braços, agora, no Calvário, ela O entrega de volta ao Pai — com a mesma humildade, com o mesmo espírito de serviço. Sua renúncia não é apenas materna, é espiritual. </w:t>
       </w:r>
     </w:p>
     <w:p>
@@ -4109,25 +4148,7 @@
           <w:sz w:val="36"/>
           <w:szCs w:val="36"/>
         </w:rPr>
-      </w:r>
-    </w:p>
-    <w:p>
-      <w:pPr>
-        <w:pStyle w:val="Normal"/>
-        <w:jc w:val="both"/>
-        <w:rPr>
-          <w:rFonts w:ascii="Garamond" w:hAnsi="Garamond"/>
-          <w:sz w:val="36"/>
-          <w:szCs w:val="36"/>
-        </w:rPr>
-      </w:pPr>
-      <w:r>
-        <w:rPr>
-          <w:rFonts w:ascii="Garamond" w:hAnsi="Garamond"/>
-          <w:sz w:val="36"/>
-          <w:szCs w:val="36"/>
-        </w:rPr>
-        <w:t>A primeira e mais evidente é a resignação. Maria sabia que Jesus não merecia o sofrimento que lhe foi imposto, mas aceitou</w:t>
+        <w:t>A mais evidente de todas é a resignação. Maria sabia que Jesus não merecia o sofrimento que lhe foi imposto, mas aceitou</w:t>
       </w:r>
       <w:r>
         <w:rPr>
@@ -4221,7 +4242,7 @@
           <w:sz w:val="36"/>
           <w:szCs w:val="36"/>
         </w:rPr>
-        <w:t>Muitas vezes, enfrentamos situações em que nós  — ou alguém que amamos — sofre, aparentemente sem motivo. Apesar dos esforços, de todo o auxílio e d</w:t>
+        <w:t>Muitas vezes, enfrentamos situações em que nós  — ou alguém que amamos — sofre, aparentemente sem motivo justo. Apesar dos esforços, de todo o auxílio e d</w:t>
       </w:r>
       <w:r>
         <w:rPr>
@@ -4277,44 +4298,102 @@
           <w:sz w:val="36"/>
           <w:szCs w:val="36"/>
         </w:rPr>
-        <w:t>Assim como Maria permaneceu firme diante do sofrimento de seu filho, somos convidados a confiar, mesmo quando tudo parece envolto em escuridão. A resignação, nesse contexto, não é passividade, mas um ato profundo de fé: consiste em entregar a Deus aquilo que nos escapa à compreensão, mesmo depois de termos feito tudo o que poderíamos para pôr um termo ao sofrimento.</w:t>
-      </w:r>
-    </w:p>
-    <w:p>
-      <w:pPr>
-        <w:pStyle w:val="Normal"/>
-        <w:jc w:val="both"/>
-        <w:rPr>
-          <w:rFonts w:ascii="Garamond" w:hAnsi="Garamond"/>
-          <w:sz w:val="36"/>
-          <w:szCs w:val="36"/>
-        </w:rPr>
-      </w:pPr>
-      <w:r>
-        <w:rPr>
-          <w:rFonts w:ascii="Garamond" w:hAnsi="Garamond"/>
-          <w:sz w:val="36"/>
-          <w:szCs w:val="36"/>
-        </w:rPr>
-      </w:r>
-    </w:p>
-    <w:p>
-      <w:pPr>
-        <w:pStyle w:val="Normal"/>
-        <w:jc w:val="both"/>
-        <w:rPr>
-          <w:rFonts w:ascii="Garamond" w:hAnsi="Garamond"/>
-          <w:sz w:val="36"/>
-          <w:szCs w:val="36"/>
-        </w:rPr>
-      </w:pPr>
-      <w:r>
-        <w:rPr>
-          <w:rFonts w:ascii="Garamond" w:hAnsi="Garamond"/>
-          <w:sz w:val="36"/>
-          <w:szCs w:val="36"/>
-        </w:rPr>
-        <w:t xml:space="preserve">Mas Maria não apenas se resignou — ela permaneceu presente. Não fugiu da dor, nem abandonou Jesus em seu momento de maior angústia. Estava ali, silenciosa, mas inabalável. E nos ensina que, embora nem sempre possamos afastar o sofrimento, </w:t>
+        <w:t xml:space="preserve">Assim como Maria permaneceu firme diante do sofrimento de seu filho, somos convidados a confiar, mesmo quando tudo parece envolto em escuridão. A resignação, nesse contexto, não é passividade, mas um ato profundo de fé: consiste em entregar a Deus aquilo que nos escapa à compreensão, </w:t>
+      </w:r>
+      <w:r>
+        <w:rPr>
+          <w:rFonts w:eastAsia="Arial" w:cs="Arial" w:ascii="Garamond" w:hAnsi="Garamond"/>
+          <w:color w:val="auto"/>
+          <w:kern w:val="0"/>
+          <w:sz w:val="36"/>
+          <w:szCs w:val="36"/>
+          <w:lang w:val="en-US" w:eastAsia="zh-CN" w:bidi="hi-IN"/>
+        </w:rPr>
+        <w:t>principalmente</w:t>
+      </w:r>
+      <w:r>
+        <w:rPr>
+          <w:rFonts w:ascii="Garamond" w:hAnsi="Garamond"/>
+          <w:sz w:val="36"/>
+          <w:szCs w:val="36"/>
+        </w:rPr>
+        <w:t xml:space="preserve"> depois de termos feito tudo o que </w:t>
+      </w:r>
+      <w:r>
+        <w:rPr>
+          <w:rFonts w:eastAsia="Arial" w:cs="Arial" w:ascii="Garamond" w:hAnsi="Garamond"/>
+          <w:color w:val="auto"/>
+          <w:kern w:val="0"/>
+          <w:sz w:val="36"/>
+          <w:szCs w:val="36"/>
+          <w:lang w:val="en-US" w:eastAsia="zh-CN" w:bidi="hi-IN"/>
+        </w:rPr>
+        <w:t>estava ao nosso alcance</w:t>
+      </w:r>
+      <w:r>
+        <w:rPr>
+          <w:rFonts w:ascii="Garamond" w:hAnsi="Garamond"/>
+          <w:sz w:val="36"/>
+          <w:szCs w:val="36"/>
+        </w:rPr>
+        <w:t xml:space="preserve"> para pôr um termo ao sofrimento.</w:t>
+      </w:r>
+    </w:p>
+    <w:p>
+      <w:pPr>
+        <w:pStyle w:val="Normal"/>
+        <w:jc w:val="both"/>
+        <w:rPr>
+          <w:rFonts w:ascii="Garamond" w:hAnsi="Garamond"/>
+          <w:sz w:val="36"/>
+          <w:szCs w:val="36"/>
+        </w:rPr>
+      </w:pPr>
+      <w:r>
+        <w:rPr>
+          <w:rFonts w:ascii="Garamond" w:hAnsi="Garamond"/>
+          <w:sz w:val="36"/>
+          <w:szCs w:val="36"/>
+        </w:rPr>
+        <w:t xml:space="preserve">Mas Maria não apenas se resignou — ela </w:t>
+      </w:r>
+      <w:r>
+        <w:rPr>
+          <w:rFonts w:eastAsia="Arial" w:cs="Arial" w:ascii="Garamond" w:hAnsi="Garamond"/>
+          <w:color w:val="auto"/>
+          <w:kern w:val="0"/>
+          <w:sz w:val="36"/>
+          <w:szCs w:val="36"/>
+          <w:lang w:val="en-US" w:eastAsia="zh-CN" w:bidi="hi-IN"/>
+        </w:rPr>
+        <w:t>n</w:t>
+      </w:r>
+      <w:r>
+        <w:rPr>
+          <w:rFonts w:ascii="Garamond" w:hAnsi="Garamond"/>
+          <w:sz w:val="36"/>
+          <w:szCs w:val="36"/>
+        </w:rPr>
+        <w:t xml:space="preserve">ão fugiu da dor, nem abandonou Jesus. </w:t>
+      </w:r>
+      <w:r>
+        <w:rPr>
+          <w:rFonts w:eastAsia="Arial" w:cs="Arial" w:ascii="Garamond" w:hAnsi="Garamond"/>
+          <w:color w:val="auto"/>
+          <w:kern w:val="0"/>
+          <w:sz w:val="36"/>
+          <w:szCs w:val="36"/>
+          <w:lang w:val="en-US" w:eastAsia="zh-CN" w:bidi="hi-IN"/>
+        </w:rPr>
+        <w:t>Permaneceu</w:t>
+      </w:r>
+      <w:r>
+        <w:rPr>
+          <w:rFonts w:ascii="Garamond" w:hAnsi="Garamond"/>
+          <w:sz w:val="36"/>
+          <w:szCs w:val="36"/>
+        </w:rPr>
+        <w:t xml:space="preserve"> ali, silenciosa, mas inabalável. E nos ensina que, embora nem sempre possamos afastar o sofrimento, </w:t>
       </w:r>
       <w:r>
         <w:rPr>
@@ -4333,100 +4412,102 @@
           <w:sz w:val="36"/>
           <w:szCs w:val="36"/>
         </w:rPr>
-        <w:t xml:space="preserve"> podemos ser sustento, consolo e presença fiel.</w:t>
-      </w:r>
-    </w:p>
-    <w:p>
-      <w:pPr>
-        <w:pStyle w:val="Normal"/>
-        <w:jc w:val="both"/>
-        <w:rPr>
-          <w:rFonts w:ascii="Garamond" w:hAnsi="Garamond"/>
-          <w:sz w:val="36"/>
-          <w:szCs w:val="36"/>
-        </w:rPr>
-      </w:pPr>
-      <w:r>
-        <w:rPr>
-          <w:rFonts w:ascii="Garamond" w:hAnsi="Garamond"/>
-          <w:sz w:val="36"/>
-          <w:szCs w:val="36"/>
-        </w:rPr>
-      </w:r>
-    </w:p>
-    <w:p>
-      <w:pPr>
-        <w:pStyle w:val="Normal"/>
-        <w:jc w:val="both"/>
-        <w:rPr>
-          <w:rFonts w:ascii="Garamond" w:hAnsi="Garamond"/>
-          <w:sz w:val="36"/>
-          <w:szCs w:val="36"/>
-        </w:rPr>
-      </w:pPr>
-      <w:r>
-        <w:rPr>
-          <w:rFonts w:ascii="Garamond" w:hAnsi="Garamond"/>
-          <w:sz w:val="36"/>
-          <w:szCs w:val="36"/>
-        </w:rPr>
-        <w:t>Ao olharmos para Maria, somos convidados a refletir também sobre sua coragem, sua esperança e sua confiança na promessa de Deus. Que, diante de nossos próprios calvários — ou dos calvários daqueles que amamos — saibamos cultivar essas virtudes e, como ela, manter a fé viva mesmo diante do silêncio de Deus.</w:t>
-      </w:r>
-    </w:p>
-    <w:p>
-      <w:pPr>
-        <w:pStyle w:val="Normal"/>
-        <w:jc w:val="both"/>
-        <w:rPr>
-          <w:rFonts w:ascii="Garamond" w:hAnsi="Garamond"/>
-          <w:sz w:val="36"/>
-          <w:szCs w:val="36"/>
-        </w:rPr>
-      </w:pPr>
-      <w:r>
-        <w:rPr>
-          <w:rFonts w:ascii="Garamond" w:hAnsi="Garamond"/>
-          <w:sz w:val="36"/>
-          <w:szCs w:val="36"/>
-        </w:rPr>
-      </w:r>
-    </w:p>
-    <w:p>
-      <w:pPr>
-        <w:pStyle w:val="Normal"/>
-        <w:jc w:val="both"/>
-        <w:rPr>
-          <w:rFonts w:ascii="Garamond" w:hAnsi="Garamond"/>
-          <w:sz w:val="36"/>
-          <w:szCs w:val="36"/>
-        </w:rPr>
-      </w:pPr>
-      <w:r>
-        <w:rPr>
-          <w:rFonts w:ascii="Garamond" w:hAnsi="Garamond"/>
-          <w:sz w:val="36"/>
-          <w:szCs w:val="36"/>
-        </w:rPr>
-        <w:t xml:space="preserve">Após </w:t>
-      </w:r>
-      <w:r>
-        <w:rPr>
-          <w:rFonts w:eastAsia="Arial" w:cs="Arial" w:ascii="Garamond" w:hAnsi="Garamond"/>
-          <w:color w:val="auto"/>
-          <w:kern w:val="0"/>
-          <w:sz w:val="36"/>
-          <w:szCs w:val="36"/>
-          <w:lang w:val="en-US" w:eastAsia="zh-CN" w:bidi="hi-IN"/>
-        </w:rPr>
-        <w:t>a</w:t>
-      </w:r>
-      <w:r>
-        <w:rPr>
-          <w:rFonts w:ascii="Garamond" w:hAnsi="Garamond"/>
-          <w:sz w:val="36"/>
-          <w:szCs w:val="36"/>
-        </w:rPr>
-        <w:t xml:space="preserve"> passagem da crucificação de Jesus, Maria só volta a ser citada nos evangelhos em Atos 1:14:</w:t>
+        <w:t xml:space="preserve"> podemos ser sustento, consolo e presença fiel na vida daquele que sofre.</w:t>
+      </w:r>
+    </w:p>
+    <w:p>
+      <w:pPr>
+        <w:pStyle w:val="Normal"/>
+        <w:jc w:val="both"/>
+        <w:rPr>
+          <w:rFonts w:ascii="Garamond" w:hAnsi="Garamond"/>
+          <w:sz w:val="36"/>
+          <w:szCs w:val="36"/>
+        </w:rPr>
+      </w:pPr>
+      <w:r>
+        <w:rPr>
+          <w:rFonts w:ascii="Garamond" w:hAnsi="Garamond"/>
+          <w:sz w:val="36"/>
+          <w:szCs w:val="36"/>
+        </w:rPr>
+      </w:r>
+    </w:p>
+    <w:p>
+      <w:pPr>
+        <w:pStyle w:val="Normal"/>
+        <w:jc w:val="both"/>
+        <w:rPr>
+          <w:rFonts w:ascii="Garamond" w:hAnsi="Garamond"/>
+          <w:sz w:val="36"/>
+          <w:szCs w:val="36"/>
+        </w:rPr>
+      </w:pPr>
+      <w:r>
+        <w:rPr>
+          <w:rFonts w:ascii="Garamond" w:hAnsi="Garamond"/>
+          <w:sz w:val="36"/>
+          <w:szCs w:val="36"/>
+        </w:rPr>
+        <w:t>Ao olharmos para Maria, somos convidados a refletir  sobre sua coragem, sua esperança e sua confiança na promessa de Deus. Que, diante de nossos próprios calvários — ou dos calvários daqueles que amamos — saibamos cultivar essas virtudes e, como ela, manter a fé viva mesmo diante do aparente silêncio de Deus.</w:t>
+      </w:r>
+    </w:p>
+    <w:p>
+      <w:pPr>
+        <w:pStyle w:val="Normal"/>
+        <w:jc w:val="both"/>
+        <w:rPr>
+          <w:rFonts w:ascii="Garamond" w:hAnsi="Garamond"/>
+          <w:sz w:val="36"/>
+          <w:szCs w:val="36"/>
+        </w:rPr>
+      </w:pPr>
+      <w:r>
+        <w:rPr>
+          <w:rFonts w:ascii="Garamond" w:hAnsi="Garamond"/>
+          <w:sz w:val="36"/>
+          <w:szCs w:val="36"/>
+        </w:rPr>
+      </w:r>
+    </w:p>
+    <w:p>
+      <w:pPr>
+        <w:pStyle w:val="Normal"/>
+        <w:jc w:val="center"/>
+        <w:rPr>
+          <w:b/>
+          <w:b/>
+          <w:bCs/>
+          <w:color w:val="C9211E"/>
+        </w:rPr>
+      </w:pPr>
+      <w:r>
+        <w:rPr>
+          <w:rFonts w:eastAsia="Arial" w:cs="Arial" w:ascii="Garamond" w:hAnsi="Garamond"/>
+          <w:b/>
+          <w:bCs/>
+          <w:color w:val="C9211E"/>
+          <w:kern w:val="0"/>
+          <w:sz w:val="36"/>
+          <w:szCs w:val="36"/>
+          <w:lang w:val="en-US" w:eastAsia="zh-CN" w:bidi="hi-IN"/>
+        </w:rPr>
+        <w:t xml:space="preserve">Substituição de Judas - </w:t>
+      </w:r>
+      <w:r>
+        <w:rPr>
+          <w:rFonts w:eastAsia="Arial" w:cs="Arial" w:ascii="Garamond" w:hAnsi="Garamond"/>
+          <w:b/>
+          <w:bCs/>
+          <w:i w:val="false"/>
+          <w:iCs w:val="false"/>
+          <w:color w:val="C9211E"/>
+          <w:kern w:val="0"/>
+          <w:sz w:val="36"/>
+          <w:szCs w:val="36"/>
+          <w:lang w:val="en-US" w:eastAsia="zh-CN" w:bidi="hi-IN"/>
+        </w:rPr>
+        <w:t>Atos 1:14</w:t>
       </w:r>
     </w:p>
     <w:p>
@@ -4466,44 +4547,387 @@
           <w:sz w:val="36"/>
           <w:szCs w:val="36"/>
         </w:rPr>
-        <w:t>Todos estes perseveravam unânimes em oração, com as mulheres, e Maria, mãe de Jesus, e com os irmãos dele.</w:t>
-      </w:r>
-    </w:p>
-    <w:p>
-      <w:pPr>
-        <w:pStyle w:val="Normal"/>
-        <w:jc w:val="both"/>
-        <w:rPr>
-          <w:rFonts w:ascii="Garamond" w:hAnsi="Garamond"/>
-          <w:sz w:val="36"/>
-          <w:szCs w:val="36"/>
-        </w:rPr>
-      </w:pPr>
-      <w:r>
-        <w:rPr>
-          <w:rFonts w:ascii="Garamond" w:hAnsi="Garamond"/>
-          <w:sz w:val="36"/>
-          <w:szCs w:val="36"/>
-        </w:rPr>
-      </w:r>
-    </w:p>
-    <w:p>
-      <w:pPr>
-        <w:pStyle w:val="Normal"/>
-        <w:jc w:val="both"/>
-        <w:rPr>
-          <w:rFonts w:ascii="Garamond" w:hAnsi="Garamond"/>
-          <w:sz w:val="36"/>
-          <w:szCs w:val="36"/>
-        </w:rPr>
-      </w:pPr>
-      <w:r>
-        <w:rPr>
-          <w:rFonts w:ascii="Garamond" w:hAnsi="Garamond"/>
-          <w:sz w:val="36"/>
-          <w:szCs w:val="36"/>
-        </w:rPr>
-        <w:t xml:space="preserve">Porém, Maria não deixou de servir no bem. </w:t>
+        <w:t xml:space="preserve">Todos </w:t>
+      </w:r>
+      <w:r>
+        <w:rPr>
+          <w:rFonts w:eastAsia="Arial" w:cs="Arial" w:ascii="Garamond" w:hAnsi="Garamond"/>
+          <w:i/>
+          <w:iCs/>
+          <w:color w:val="auto"/>
+          <w:kern w:val="0"/>
+          <w:sz w:val="36"/>
+          <w:szCs w:val="36"/>
+          <w:lang w:val="en-US" w:eastAsia="zh-CN" w:bidi="hi-IN"/>
+        </w:rPr>
+        <w:t>eles estavam perseverando</w:t>
+      </w:r>
+      <w:r>
+        <w:rPr>
+          <w:rFonts w:ascii="Garamond" w:hAnsi="Garamond"/>
+          <w:i/>
+          <w:iCs/>
+          <w:sz w:val="36"/>
+          <w:szCs w:val="36"/>
+        </w:rPr>
+        <w:t xml:space="preserve"> unânimes em oração, com as mulheres, com Maria, a mãe de Jesus, e com os irmãos dele.</w:t>
+      </w:r>
+    </w:p>
+    <w:p>
+      <w:pPr>
+        <w:pStyle w:val="Normal"/>
+        <w:jc w:val="both"/>
+        <w:rPr>
+          <w:rFonts w:ascii="Garamond" w:hAnsi="Garamond"/>
+          <w:sz w:val="36"/>
+          <w:szCs w:val="36"/>
+        </w:rPr>
+      </w:pPr>
+      <w:r>
+        <w:rPr>
+          <w:rFonts w:ascii="Garamond" w:hAnsi="Garamond"/>
+          <w:sz w:val="36"/>
+          <w:szCs w:val="36"/>
+        </w:rPr>
+      </w:r>
+    </w:p>
+    <w:p>
+      <w:pPr>
+        <w:pStyle w:val="Normal"/>
+        <w:jc w:val="both"/>
+        <w:rPr>
+          <w:rFonts w:ascii="Garamond" w:hAnsi="Garamond"/>
+          <w:sz w:val="36"/>
+          <w:szCs w:val="36"/>
+        </w:rPr>
+      </w:pPr>
+      <w:r>
+        <w:rPr>
+          <w:rFonts w:eastAsia="Arial" w:cs="Arial" w:ascii="Garamond" w:hAnsi="Garamond"/>
+          <w:color w:val="auto"/>
+          <w:kern w:val="0"/>
+          <w:sz w:val="36"/>
+          <w:szCs w:val="36"/>
+          <w:lang w:val="en-US" w:eastAsia="zh-CN" w:bidi="hi-IN"/>
+        </w:rPr>
+        <w:t>Essa é</w:t>
+      </w:r>
+      <w:r>
+        <w:rPr>
+          <w:rFonts w:ascii="Garamond" w:hAnsi="Garamond"/>
+          <w:sz w:val="36"/>
+          <w:szCs w:val="36"/>
+        </w:rPr>
+        <w:t xml:space="preserve"> a última menção à Maria no novo testamento.</w:t>
+      </w:r>
+    </w:p>
+    <w:p>
+      <w:pPr>
+        <w:pStyle w:val="Normal"/>
+        <w:jc w:val="both"/>
+        <w:rPr>
+          <w:rFonts w:ascii="Garamond" w:hAnsi="Garamond"/>
+          <w:sz w:val="36"/>
+          <w:szCs w:val="36"/>
+        </w:rPr>
+      </w:pPr>
+      <w:r>
+        <w:rPr>
+          <w:rFonts w:ascii="Garamond" w:hAnsi="Garamond"/>
+          <w:sz w:val="36"/>
+          <w:szCs w:val="36"/>
+        </w:rPr>
+      </w:r>
+    </w:p>
+    <w:p>
+      <w:pPr>
+        <w:pStyle w:val="Normal"/>
+        <w:jc w:val="both"/>
+        <w:rPr>
+          <w:rFonts w:ascii="Garamond" w:hAnsi="Garamond"/>
+          <w:sz w:val="36"/>
+          <w:szCs w:val="36"/>
+        </w:rPr>
+      </w:pPr>
+      <w:r>
+        <w:rPr>
+          <w:rFonts w:ascii="Garamond" w:hAnsi="Garamond"/>
+          <w:sz w:val="36"/>
+          <w:szCs w:val="36"/>
+        </w:rPr>
+        <w:t>Aquel</w:t>
+      </w:r>
+      <w:r>
+        <w:rPr>
+          <w:rFonts w:eastAsia="Arial" w:cs="Arial" w:ascii="Garamond" w:hAnsi="Garamond"/>
+          <w:color w:val="auto"/>
+          <w:kern w:val="0"/>
+          <w:sz w:val="36"/>
+          <w:szCs w:val="36"/>
+          <w:lang w:val="en-US" w:eastAsia="zh-CN" w:bidi="hi-IN"/>
+        </w:rPr>
+        <w:t>as pessoas</w:t>
+      </w:r>
+      <w:r>
+        <w:rPr>
+          <w:rFonts w:ascii="Garamond" w:hAnsi="Garamond"/>
+          <w:sz w:val="36"/>
+          <w:szCs w:val="36"/>
+        </w:rPr>
+        <w:t xml:space="preserve"> encontravam-se em oração como  atitude de espera pela vinda do Espírito Santo, conforme prometido por Jesus.</w:t>
+      </w:r>
+    </w:p>
+    <w:p>
+      <w:pPr>
+        <w:pStyle w:val="Normal"/>
+        <w:jc w:val="both"/>
+        <w:rPr>
+          <w:rFonts w:ascii="Garamond" w:hAnsi="Garamond"/>
+          <w:sz w:val="36"/>
+          <w:szCs w:val="36"/>
+        </w:rPr>
+      </w:pPr>
+      <w:r>
+        <w:rPr>
+          <w:rFonts w:ascii="Garamond" w:hAnsi="Garamond"/>
+          <w:sz w:val="36"/>
+          <w:szCs w:val="36"/>
+        </w:rPr>
+      </w:r>
+    </w:p>
+    <w:p>
+      <w:pPr>
+        <w:pStyle w:val="Normal"/>
+        <w:jc w:val="both"/>
+        <w:rPr>
+          <w:rFonts w:ascii="Garamond" w:hAnsi="Garamond"/>
+          <w:sz w:val="36"/>
+          <w:szCs w:val="36"/>
+        </w:rPr>
+      </w:pPr>
+      <w:r>
+        <w:rPr>
+          <w:rFonts w:ascii="Garamond" w:hAnsi="Garamond"/>
+          <w:sz w:val="36"/>
+          <w:szCs w:val="36"/>
+        </w:rPr>
+        <w:t>Antes do Pentecostes, os discípulos entenderam que era importante restaurar o grupo dos 12 apóstolos, número simbólico que representava as 12 tribos de Israel. Isso tinha valor espiritual e profético para a missão que iriam receber. Como Judas Iscariotes havia suicidado, era necessário encontrar um substituto para ele.</w:t>
+      </w:r>
+    </w:p>
+    <w:p>
+      <w:pPr>
+        <w:pStyle w:val="Normal"/>
+        <w:jc w:val="both"/>
+        <w:rPr>
+          <w:rFonts w:ascii="Garamond" w:hAnsi="Garamond"/>
+          <w:sz w:val="36"/>
+          <w:szCs w:val="36"/>
+        </w:rPr>
+      </w:pPr>
+      <w:r>
+        <w:rPr>
+          <w:rFonts w:ascii="Garamond" w:hAnsi="Garamond"/>
+          <w:sz w:val="36"/>
+          <w:szCs w:val="36"/>
+        </w:rPr>
+      </w:r>
+    </w:p>
+    <w:p>
+      <w:pPr>
+        <w:pStyle w:val="Normal"/>
+        <w:jc w:val="both"/>
+        <w:rPr>
+          <w:rFonts w:ascii="Garamond" w:hAnsi="Garamond"/>
+          <w:sz w:val="36"/>
+          <w:szCs w:val="36"/>
+        </w:rPr>
+      </w:pPr>
+      <w:r>
+        <w:rPr>
+          <w:rFonts w:ascii="Garamond" w:hAnsi="Garamond"/>
+          <w:sz w:val="36"/>
+          <w:szCs w:val="36"/>
+        </w:rPr>
+        <w:t xml:space="preserve">Esse versículo mostra que havia várias mulheres entre os discípulos naquele momento </w:t>
+      </w:r>
+      <w:r>
+        <w:rPr>
+          <w:rFonts w:eastAsia="Arial" w:cs="Arial" w:ascii="Garamond" w:hAnsi="Garamond"/>
+          <w:color w:val="auto"/>
+          <w:kern w:val="0"/>
+          <w:sz w:val="36"/>
+          <w:szCs w:val="36"/>
+          <w:lang w:val="en-US" w:eastAsia="zh-CN" w:bidi="hi-IN"/>
+        </w:rPr>
+        <w:t>de</w:t>
+      </w:r>
+      <w:r>
+        <w:rPr>
+          <w:rFonts w:ascii="Garamond" w:hAnsi="Garamond"/>
+          <w:sz w:val="36"/>
+          <w:szCs w:val="36"/>
+        </w:rPr>
+        <w:t xml:space="preserve"> espera pela vinda do Espírito Santo. No entanto, apenas o nome de Maria é citado.</w:t>
+      </w:r>
+    </w:p>
+    <w:p>
+      <w:pPr>
+        <w:pStyle w:val="Normal"/>
+        <w:jc w:val="both"/>
+        <w:rPr>
+          <w:rFonts w:ascii="Garamond" w:hAnsi="Garamond"/>
+          <w:sz w:val="36"/>
+          <w:szCs w:val="36"/>
+        </w:rPr>
+      </w:pPr>
+      <w:r>
+        <w:rPr>
+          <w:rFonts w:ascii="Garamond" w:hAnsi="Garamond"/>
+          <w:sz w:val="36"/>
+          <w:szCs w:val="36"/>
+        </w:rPr>
+      </w:r>
+    </w:p>
+    <w:p>
+      <w:pPr>
+        <w:pStyle w:val="Normal"/>
+        <w:jc w:val="both"/>
+        <w:rPr>
+          <w:rFonts w:ascii="Garamond" w:hAnsi="Garamond"/>
+          <w:sz w:val="36"/>
+          <w:szCs w:val="36"/>
+        </w:rPr>
+      </w:pPr>
+      <w:r>
+        <w:rPr>
+          <w:rFonts w:ascii="Garamond" w:hAnsi="Garamond"/>
+          <w:sz w:val="36"/>
+          <w:szCs w:val="36"/>
+        </w:rPr>
+        <w:t>Isso não é por acaso. Maria é novamente destacada porque representa a fidelidade silenciosa que atravessa todas as fases da missão do Cristo: desde a anunciação, passando pelo calvário, até o nascimento da Igreja.</w:t>
+      </w:r>
+    </w:p>
+    <w:p>
+      <w:pPr>
+        <w:pStyle w:val="Normal"/>
+        <w:jc w:val="both"/>
+        <w:rPr>
+          <w:rFonts w:ascii="Garamond" w:hAnsi="Garamond"/>
+          <w:sz w:val="36"/>
+          <w:szCs w:val="36"/>
+        </w:rPr>
+      </w:pPr>
+      <w:r>
+        <w:rPr>
+          <w:rFonts w:ascii="Garamond" w:hAnsi="Garamond"/>
+          <w:sz w:val="36"/>
+          <w:szCs w:val="36"/>
+        </w:rPr>
+      </w:r>
+    </w:p>
+    <w:p>
+      <w:pPr>
+        <w:pStyle w:val="Normal"/>
+        <w:jc w:val="both"/>
+        <w:rPr>
+          <w:rFonts w:ascii="Garamond" w:hAnsi="Garamond"/>
+          <w:sz w:val="36"/>
+          <w:szCs w:val="36"/>
+        </w:rPr>
+      </w:pPr>
+      <w:r>
+        <w:rPr>
+          <w:rFonts w:eastAsia="Arial" w:cs="Arial" w:ascii="Garamond" w:hAnsi="Garamond"/>
+          <w:color w:val="auto"/>
+          <w:kern w:val="0"/>
+          <w:sz w:val="36"/>
+          <w:szCs w:val="36"/>
+          <w:lang w:val="en-US" w:eastAsia="zh-CN" w:bidi="hi-IN"/>
+        </w:rPr>
+        <w:t>A</w:t>
+      </w:r>
+      <w:r>
+        <w:rPr>
+          <w:rFonts w:ascii="Garamond" w:hAnsi="Garamond"/>
+          <w:sz w:val="36"/>
+          <w:szCs w:val="36"/>
+        </w:rPr>
+        <w:t xml:space="preserve"> presença de Maria  entre os apóstolos reforça seu papel como símbolo da perseverança, do amor e da disposição em servir. </w:t>
+      </w:r>
+      <w:r>
+        <w:rPr>
+          <w:rFonts w:eastAsia="Arial" w:cs="Arial" w:ascii="Garamond" w:hAnsi="Garamond"/>
+          <w:color w:val="auto"/>
+          <w:kern w:val="0"/>
+          <w:sz w:val="36"/>
+          <w:szCs w:val="36"/>
+          <w:lang w:val="en-US" w:eastAsia="zh-CN" w:bidi="hi-IN"/>
+        </w:rPr>
+        <w:t>E</w:t>
+      </w:r>
+      <w:r>
+        <w:rPr>
+          <w:rFonts w:ascii="Garamond" w:hAnsi="Garamond"/>
+          <w:sz w:val="36"/>
+          <w:szCs w:val="36"/>
+        </w:rPr>
+        <w:t>la permanece firme, orando e sustentando com sua autoridade moral e espiritual a comunidade cristã nascente.</w:t>
+      </w:r>
+    </w:p>
+    <w:p>
+      <w:pPr>
+        <w:pStyle w:val="Normal"/>
+        <w:jc w:val="both"/>
+        <w:rPr>
+          <w:rFonts w:ascii="Garamond" w:hAnsi="Garamond"/>
+          <w:sz w:val="36"/>
+          <w:szCs w:val="36"/>
+        </w:rPr>
+      </w:pPr>
+      <w:r>
+        <w:rPr>
+          <w:rFonts w:ascii="Garamond" w:hAnsi="Garamond"/>
+          <w:sz w:val="36"/>
+          <w:szCs w:val="36"/>
+        </w:rPr>
+      </w:r>
+    </w:p>
+    <w:p>
+      <w:pPr>
+        <w:pStyle w:val="Normal"/>
+        <w:jc w:val="both"/>
+        <w:rPr>
+          <w:rFonts w:ascii="Garamond" w:hAnsi="Garamond"/>
+          <w:sz w:val="36"/>
+          <w:szCs w:val="36"/>
+        </w:rPr>
+      </w:pPr>
+      <w:r>
+        <w:rPr>
+          <w:rFonts w:ascii="Garamond" w:hAnsi="Garamond"/>
+          <w:sz w:val="36"/>
+          <w:szCs w:val="36"/>
+        </w:rPr>
+        <w:t xml:space="preserve">Maria seguiu o curso de seus dias sem </w:t>
+      </w:r>
+      <w:r>
+        <w:rPr>
+          <w:rFonts w:eastAsia="Arial" w:cs="Arial" w:ascii="Garamond" w:hAnsi="Garamond"/>
+          <w:color w:val="auto"/>
+          <w:kern w:val="0"/>
+          <w:sz w:val="36"/>
+          <w:szCs w:val="36"/>
+          <w:lang w:val="en-US" w:eastAsia="zh-CN" w:bidi="hi-IN"/>
+        </w:rPr>
+        <w:t>jamais</w:t>
+      </w:r>
+      <w:r>
+        <w:rPr>
+          <w:rFonts w:ascii="Garamond" w:hAnsi="Garamond"/>
+          <w:sz w:val="36"/>
+          <w:szCs w:val="36"/>
+        </w:rPr>
+        <w:t xml:space="preserve"> deixar de servir no bem. </w:t>
       </w:r>
       <w:r>
         <w:rPr>
@@ -4598,29 +5022,7 @@
           <w:szCs w:val="36"/>
           <w:lang w:val="en-US" w:eastAsia="zh-CN" w:bidi="hi-IN"/>
         </w:rPr>
-        <w:t xml:space="preserve">Recorda-se frequentemente do dia em que Jesus nasceu naquele berço simples e improvisado. Recorda-se também das paisagens belas e alegres de Nazaré, entre as quais </w:t>
-      </w:r>
-      <w:r>
-        <w:rPr>
-          <w:rFonts w:eastAsia="Arial" w:cs="Arial" w:ascii="Garamond" w:hAnsi="Garamond"/>
-          <w:color w:val="auto"/>
-          <w:kern w:val="0"/>
-          <w:sz w:val="36"/>
-          <w:szCs w:val="36"/>
-          <w:lang w:val="en-US" w:eastAsia="zh-CN" w:bidi="hi-IN"/>
-        </w:rPr>
-        <w:t>sempre via</w:t>
-      </w:r>
-      <w:r>
-        <w:rPr>
-          <w:rFonts w:eastAsia="Arial" w:cs="Arial" w:ascii="Garamond" w:hAnsi="Garamond"/>
-          <w:color w:val="auto"/>
-          <w:kern w:val="0"/>
-          <w:sz w:val="36"/>
-          <w:szCs w:val="36"/>
-          <w:lang w:val="en-US" w:eastAsia="zh-CN" w:bidi="hi-IN"/>
-        </w:rPr>
-        <w:t xml:space="preserve"> o filho trabalhando e amando.</w:t>
+        <w:t>Recorda-se frequentemente do dia em que Jesus nasceu naquele berço simples e improvisado. Recorda-se também das paisagens belas e alegres de Nazaré, entre as quais sempre via o filho trabalhando e amando.</w:t>
       </w:r>
     </w:p>
     <w:p>
@@ -4704,98 +5106,25 @@
           <w:szCs w:val="36"/>
           <w:lang w:val="en-US" w:eastAsia="zh-CN" w:bidi="hi-IN"/>
         </w:rPr>
-        <w:t xml:space="preserve">João propõe a Maria levá-la consigo. Daria a ela o amor de um filho e sabia que receberia de Maria a ternura maternal. Explica que </w:t>
-      </w:r>
-      <w:r>
-        <w:rPr>
-          <w:rFonts w:eastAsia="Arial" w:cs="Arial" w:ascii="Garamond" w:hAnsi="Garamond"/>
-          <w:color w:val="auto"/>
-          <w:kern w:val="0"/>
-          <w:sz w:val="36"/>
-          <w:szCs w:val="36"/>
-          <w:lang w:val="en-US" w:eastAsia="zh-CN" w:bidi="hi-IN"/>
-        </w:rPr>
-        <w:t>não viera</w:t>
-      </w:r>
-      <w:r>
-        <w:rPr>
-          <w:rFonts w:eastAsia="Arial" w:cs="Arial" w:ascii="Garamond" w:hAnsi="Garamond"/>
-          <w:color w:val="auto"/>
-          <w:kern w:val="0"/>
-          <w:sz w:val="36"/>
-          <w:szCs w:val="36"/>
-          <w:lang w:val="en-US" w:eastAsia="zh-CN" w:bidi="hi-IN"/>
-        </w:rPr>
-        <w:t xml:space="preserve"> antes porque não tinha uma casa para abrigá-los. Porém, havia recebido de um </w:t>
-      </w:r>
-      <w:r>
-        <w:rPr>
-          <w:rFonts w:eastAsia="Arial" w:cs="Arial" w:ascii="Garamond" w:hAnsi="Garamond"/>
-          <w:color w:val="auto"/>
-          <w:kern w:val="0"/>
-          <w:sz w:val="36"/>
-          <w:szCs w:val="36"/>
-          <w:lang w:val="en-US" w:eastAsia="zh-CN" w:bidi="hi-IN"/>
-        </w:rPr>
-        <w:t>membro</w:t>
-      </w:r>
-      <w:r>
-        <w:rPr>
-          <w:rFonts w:eastAsia="Arial" w:cs="Arial" w:ascii="Garamond" w:hAnsi="Garamond"/>
-          <w:color w:val="auto"/>
-          <w:kern w:val="0"/>
-          <w:sz w:val="36"/>
-          <w:szCs w:val="36"/>
-          <w:lang w:val="en-US" w:eastAsia="zh-CN" w:bidi="hi-IN"/>
-        </w:rPr>
-        <w:t xml:space="preserve"> da família real, </w:t>
-      </w:r>
-      <w:r>
-        <w:rPr>
-          <w:rFonts w:eastAsia="Arial" w:cs="Arial" w:ascii="Garamond" w:hAnsi="Garamond"/>
-          <w:color w:val="auto"/>
-          <w:kern w:val="0"/>
-          <w:sz w:val="36"/>
-          <w:szCs w:val="36"/>
-          <w:lang w:val="en-US" w:eastAsia="zh-CN" w:bidi="hi-IN"/>
-        </w:rPr>
-        <w:t xml:space="preserve">recém convertido </w:t>
-      </w:r>
-      <w:r>
-        <w:rPr>
-          <w:rFonts w:eastAsia="Arial" w:cs="Arial" w:ascii="Garamond" w:hAnsi="Garamond"/>
-          <w:color w:val="auto"/>
-          <w:kern w:val="0"/>
-          <w:sz w:val="36"/>
-          <w:szCs w:val="36"/>
-          <w:lang w:val="en-US" w:eastAsia="zh-CN" w:bidi="hi-IN"/>
-        </w:rPr>
-        <w:t>ao cristianismo,</w:t>
-      </w:r>
-      <w:r>
-        <w:rPr>
-          <w:rFonts w:eastAsia="Arial" w:cs="Arial" w:ascii="Garamond" w:hAnsi="Garamond"/>
-          <w:color w:val="auto"/>
-          <w:kern w:val="0"/>
-          <w:sz w:val="36"/>
-          <w:szCs w:val="36"/>
-          <w:lang w:val="en-US" w:eastAsia="zh-CN" w:bidi="hi-IN"/>
-        </w:rPr>
-        <w:t xml:space="preserve"> uma casinha pobre onde poderiam morar.</w:t>
-      </w:r>
-    </w:p>
-    <w:p>
-      <w:pPr>
-        <w:pStyle w:val="Normal"/>
-        <w:jc w:val="both"/>
-        <w:rPr>
-          <w:rFonts w:ascii="Garamond" w:hAnsi="Garamond"/>
-          <w:sz w:val="36"/>
-          <w:szCs w:val="36"/>
-        </w:rPr>
-      </w:pPr>
-      <w:r>
-        <w:rPr/>
+        <w:t>João propõe a ela levá-la consigo. Daria a ela o amor de um filho e sabia que receberia de Maria a ternura maternal. Explica que não viera antes porque não tinha uma casa para abrigá-los. Porém, havia recebido de um membro da família real, recém convertido ao cristianismo, uma casinha pobre onde poderiam morar.</w:t>
+      </w:r>
+    </w:p>
+    <w:p>
+      <w:pPr>
+        <w:pStyle w:val="Normal"/>
+        <w:jc w:val="both"/>
+        <w:rPr>
+          <w:rFonts w:ascii="Garamond" w:hAnsi="Garamond"/>
+          <w:sz w:val="36"/>
+          <w:szCs w:val="36"/>
+        </w:rPr>
+      </w:pPr>
+      <w:r>
+        <w:rPr>
+          <w:rFonts w:ascii="Garamond" w:hAnsi="Garamond"/>
+          <w:sz w:val="36"/>
+          <w:szCs w:val="36"/>
+        </w:rPr>
       </w:r>
     </w:p>
     <w:p>
@@ -4831,7 +5160,11 @@
         </w:rPr>
       </w:pPr>
       <w:r>
-        <w:rPr/>
+        <w:rPr>
+          <w:rFonts w:ascii="Garamond" w:hAnsi="Garamond"/>
+          <w:sz w:val="36"/>
+          <w:szCs w:val="36"/>
+        </w:rPr>
       </w:r>
     </w:p>
     <w:p>
@@ -4867,54 +5200,51 @@
         </w:rPr>
       </w:pPr>
       <w:r>
-        <w:rPr/>
-      </w:r>
-    </w:p>
-    <w:p>
-      <w:pPr>
-        <w:pStyle w:val="Normal"/>
-        <w:jc w:val="both"/>
-        <w:rPr>
-          <w:rFonts w:ascii="Garamond" w:hAnsi="Garamond"/>
-          <w:sz w:val="36"/>
-          <w:szCs w:val="36"/>
-        </w:rPr>
-      </w:pPr>
-      <w:r>
-        <w:rPr>
-          <w:rFonts w:eastAsia="Arial" w:cs="Arial" w:ascii="Garamond" w:hAnsi="Garamond"/>
-          <w:color w:val="auto"/>
-          <w:kern w:val="0"/>
-          <w:sz w:val="36"/>
-          <w:szCs w:val="36"/>
-          <w:lang w:val="en-US" w:eastAsia="zh-CN" w:bidi="hi-IN"/>
-        </w:rPr>
-        <w:t xml:space="preserve">Dentro de poucos meses grandes fileiras de necessitados iam até aquela casa pois tomaram conhecimento de que Maria vivia ali. </w:t>
-      </w:r>
-      <w:r>
-        <w:rPr>
-          <w:rFonts w:eastAsia="Arial" w:cs="Arial" w:ascii="Garamond" w:hAnsi="Garamond"/>
-          <w:color w:val="auto"/>
-          <w:kern w:val="0"/>
-          <w:sz w:val="36"/>
-          <w:szCs w:val="36"/>
-          <w:lang w:val="en-US" w:eastAsia="zh-CN" w:bidi="hi-IN"/>
-        </w:rPr>
-        <w:t>Maria recebia e atendia a todos, enquanto João espalhava o Evangelho nas cidades próximas.</w:t>
-      </w:r>
-    </w:p>
-    <w:p>
-      <w:pPr>
-        <w:pStyle w:val="Normal"/>
-        <w:jc w:val="both"/>
-        <w:rPr>
-          <w:rFonts w:ascii="Garamond" w:hAnsi="Garamond"/>
-          <w:sz w:val="36"/>
-          <w:szCs w:val="36"/>
-        </w:rPr>
-      </w:pPr>
-      <w:r>
-        <w:rPr/>
+        <w:rPr>
+          <w:rFonts w:ascii="Garamond" w:hAnsi="Garamond"/>
+          <w:sz w:val="36"/>
+          <w:szCs w:val="36"/>
+        </w:rPr>
+      </w:r>
+    </w:p>
+    <w:p>
+      <w:pPr>
+        <w:pStyle w:val="Normal"/>
+        <w:jc w:val="both"/>
+        <w:rPr>
+          <w:rFonts w:ascii="Garamond" w:hAnsi="Garamond"/>
+          <w:sz w:val="36"/>
+          <w:szCs w:val="36"/>
+        </w:rPr>
+      </w:pPr>
+      <w:r>
+        <w:rPr>
+          <w:rFonts w:eastAsia="Arial" w:cs="Arial" w:ascii="Garamond" w:hAnsi="Garamond"/>
+          <w:color w:val="auto"/>
+          <w:kern w:val="0"/>
+          <w:sz w:val="36"/>
+          <w:szCs w:val="36"/>
+          <w:lang w:val="en-US" w:eastAsia="zh-CN" w:bidi="hi-IN"/>
+        </w:rPr>
+        <w:t>Dentro de poucos meses grandes fileiras de necessitados iam até aquela casa pois tomaram conhecimento de que Maria vivia ali. Maria recebia e atendia a todos, enquanto João espalhava o Evangelho nas cidades próximas.</w:t>
+      </w:r>
+    </w:p>
+    <w:p>
+      <w:pPr>
+        <w:pStyle w:val="Normal"/>
+        <w:jc w:val="both"/>
+        <w:rPr>
+          <w:rFonts w:ascii="Garamond" w:hAnsi="Garamond"/>
+          <w:sz w:val="36"/>
+          <w:szCs w:val="36"/>
+        </w:rPr>
+      </w:pPr>
+      <w:r>
+        <w:rPr>
+          <w:rFonts w:ascii="Garamond" w:hAnsi="Garamond"/>
+          <w:sz w:val="36"/>
+          <w:szCs w:val="36"/>
+        </w:rPr>
       </w:r>
     </w:p>
     <w:p>
@@ -4950,7 +5280,11 @@
         </w:rPr>
       </w:pPr>
       <w:r>
-        <w:rPr/>
+        <w:rPr>
+          <w:rFonts w:ascii="Garamond" w:hAnsi="Garamond"/>
+          <w:sz w:val="36"/>
+          <w:szCs w:val="36"/>
+        </w:rPr>
       </w:r>
     </w:p>
     <w:p>
@@ -5002,7 +5336,11 @@
         </w:rPr>
       </w:pPr>
       <w:r>
-        <w:rPr/>
+        <w:rPr>
+          <w:rFonts w:ascii="Garamond" w:hAnsi="Garamond"/>
+          <w:sz w:val="36"/>
+          <w:szCs w:val="36"/>
+        </w:rPr>
       </w:r>
     </w:p>
     <w:p>
@@ -5136,12 +5474,8 @@
       </w:pPr>
       <w:r>
         <w:rPr>
-          <w:rFonts w:eastAsia="Arial" w:cs="Arial" w:ascii="Garamond" w:hAnsi="Garamond"/>
-          <w:color w:val="auto"/>
-          <w:kern w:val="0"/>
-          <w:sz w:val="36"/>
-          <w:szCs w:val="36"/>
-          <w:lang w:val="en-US" w:eastAsia="zh-CN" w:bidi="hi-IN"/>
+          <w:sz w:val="36"/>
+          <w:szCs w:val="36"/>
         </w:rPr>
       </w:r>
     </w:p>
@@ -5179,7 +5513,12 @@
         </w:rPr>
       </w:pPr>
       <w:r>
-        <w:rPr/>
+        <w:rPr>
+          <w:rFonts w:eastAsia="Arial" w:cs="Arial"/>
+          <w:color w:val="auto"/>
+          <w:kern w:val="0"/>
+          <w:lang w:val="en-US" w:eastAsia="zh-CN" w:bidi="hi-IN"/>
+        </w:rPr>
       </w:r>
     </w:p>
     <w:p>
@@ -5215,6 +5554,22 @@
       </w:pPr>
       <w:r>
         <w:rPr>
+          <w:sz w:val="36"/>
+          <w:szCs w:val="36"/>
+        </w:rPr>
+      </w:r>
+    </w:p>
+    <w:p>
+      <w:pPr>
+        <w:pStyle w:val="Normal"/>
+        <w:jc w:val="both"/>
+        <w:rPr>
+          <w:sz w:val="36"/>
+          <w:szCs w:val="36"/>
+        </w:rPr>
+      </w:pPr>
+      <w:r>
+        <w:rPr>
           <w:rFonts w:eastAsia="Arial" w:cs="Arial" w:ascii="Garamond" w:hAnsi="Garamond"/>
           <w:color w:val="000000"/>
           <w:kern w:val="0"/>
@@ -5236,7 +5591,10 @@
         </w:rPr>
       </w:pPr>
       <w:r>
-        <w:rPr/>
+        <w:rPr>
+          <w:sz w:val="36"/>
+          <w:szCs w:val="36"/>
+        </w:rPr>
       </w:r>
     </w:p>
     <w:p>
@@ -5271,7 +5629,10 @@
         </w:rPr>
       </w:pPr>
       <w:r>
-        <w:rPr/>
+        <w:rPr>
+          <w:sz w:val="36"/>
+          <w:szCs w:val="36"/>
+        </w:rPr>
       </w:r>
     </w:p>
     <w:p>
@@ -5306,7 +5667,10 @@
         </w:rPr>
       </w:pPr>
       <w:r>
-        <w:rPr/>
+        <w:rPr>
+          <w:sz w:val="36"/>
+          <w:szCs w:val="36"/>
+        </w:rPr>
       </w:r>
     </w:p>
     <w:p>
@@ -5328,32 +5692,23 @@
           <w:shd w:fill="auto" w:val="clear"/>
           <w:lang w:val="en-US" w:eastAsia="zh-CN" w:bidi="hi-IN"/>
         </w:rPr>
-        <w:t>Aproxima-se especialmente de uma jovem prisioneira e</w:t>
-      </w:r>
-      <w:r>
-        <w:rPr>
-          <w:rFonts w:eastAsia="Arial" w:cs="Arial" w:ascii="Garamond" w:hAnsi="Garamond"/>
-          <w:color w:val="000000"/>
-          <w:kern w:val="0"/>
-          <w:sz w:val="36"/>
-          <w:szCs w:val="36"/>
-          <w:shd w:fill="auto" w:val="clear"/>
-          <w:lang w:val="en-US" w:eastAsia="zh-CN" w:bidi="hi-IN"/>
-        </w:rPr>
-        <w:t xml:space="preserve"> lhe diz ao ouvido:</w:t>
-      </w:r>
-    </w:p>
-    <w:p>
-      <w:pPr>
-        <w:pStyle w:val="Normal"/>
-        <w:jc w:val="both"/>
-        <w:rPr>
-          <w:sz w:val="36"/>
-          <w:szCs w:val="36"/>
-        </w:rPr>
-      </w:pPr>
-      <w:r>
-        <w:rPr/>
+        <w:t>Aproxima-se especialmente de uma jovem prisioneira e lhe diz ao ouvido:</w:t>
+      </w:r>
+    </w:p>
+    <w:p>
+      <w:pPr>
+        <w:pStyle w:val="Normal"/>
+        <w:jc w:val="both"/>
+        <w:rPr>
+          <w:sz w:val="36"/>
+          <w:szCs w:val="36"/>
+        </w:rPr>
+      </w:pPr>
+      <w:r>
+        <w:rPr>
+          <w:sz w:val="36"/>
+          <w:szCs w:val="36"/>
+        </w:rPr>
       </w:r>
     </w:p>
     <w:p>
@@ -5421,32 +5776,11 @@
         </w:rPr>
         <w:t>para o Céu!</w:t>
       </w:r>
-    </w:p>
-    <w:p>
-      <w:pPr>
-        <w:pStyle w:val="Normal"/>
-        <w:jc w:val="both"/>
-        <w:rPr>
-          <w:sz w:val="36"/>
-          <w:szCs w:val="36"/>
-        </w:rPr>
-      </w:pPr>
-      <w:r>
-        <w:rPr/>
-      </w:r>
-    </w:p>
-    <w:p>
-      <w:pPr>
-        <w:pStyle w:val="Normal"/>
-        <w:jc w:val="both"/>
-        <w:rPr>
-          <w:sz w:val="36"/>
-          <w:szCs w:val="36"/>
-        </w:rPr>
-      </w:pPr>
-      <w:r>
-        <w:rPr>
-          <w:rFonts w:eastAsia="Arial" w:cs="Arial" w:ascii="Garamond" w:hAnsi="Garamond"/>
+      <w:r>
+        <w:rPr>
+          <w:rFonts w:eastAsia="Arial" w:cs="Arial" w:ascii="Garamond" w:hAnsi="Garamond"/>
+          <w:i/>
+          <w:iCs/>
           <w:color w:val="000000"/>
           <w:kern w:val="0"/>
           <w:sz w:val="36"/>
@@ -5454,8 +5788,34 @@
           <w:shd w:fill="auto" w:val="clear"/>
           <w:lang w:val="en-US" w:eastAsia="zh-CN" w:bidi="hi-IN"/>
         </w:rPr>
-        <w:t>Maria então</w:t>
-      </w:r>
+        <w:t>"</w:t>
+      </w:r>
+    </w:p>
+    <w:p>
+      <w:pPr>
+        <w:pStyle w:val="Normal"/>
+        <w:jc w:val="both"/>
+        <w:rPr>
+          <w:sz w:val="36"/>
+          <w:szCs w:val="36"/>
+        </w:rPr>
+      </w:pPr>
+      <w:r>
+        <w:rPr>
+          <w:sz w:val="36"/>
+          <w:szCs w:val="36"/>
+        </w:rPr>
+      </w:r>
+    </w:p>
+    <w:p>
+      <w:pPr>
+        <w:pStyle w:val="Normal"/>
+        <w:jc w:val="both"/>
+        <w:rPr>
+          <w:sz w:val="36"/>
+          <w:szCs w:val="36"/>
+        </w:rPr>
+      </w:pPr>
       <w:r>
         <w:rPr>
           <w:rFonts w:eastAsia="Arial" w:cs="Arial" w:ascii="Garamond" w:hAnsi="Garamond"/>
@@ -5466,20 +5826,23 @@
           <w:shd w:fill="auto" w:val="clear"/>
           <w:lang w:val="en-US" w:eastAsia="zh-CN" w:bidi="hi-IN"/>
         </w:rPr>
-        <w:t xml:space="preserve"> vê nascer um canto doce e sereno, que se espalha entre os cativos como um sopro de paz. A canção transforma o ambiente, enchendo os corações aflitos de luz, como se a presença de Maria ali tivesse suavizado o sofrimento com o bálsamo do amor. </w:t>
-      </w:r>
-    </w:p>
-    <w:p>
-      <w:pPr>
-        <w:pStyle w:val="Normal"/>
-        <w:jc w:val="both"/>
-        <w:rPr>
-          <w:sz w:val="36"/>
-          <w:szCs w:val="36"/>
-        </w:rPr>
-      </w:pPr>
-      <w:r>
-        <w:rPr/>
+        <w:t xml:space="preserve">Maria então vê nascer um canto doce e sereno, que se espalha entre os cativos como um sopro de paz. A canção transforma o ambiente, enchendo os corações aflitos de luz, como se a presença de Maria ali tivesse suavizado o sofrimento com o bálsamo do amor. </w:t>
+      </w:r>
+    </w:p>
+    <w:p>
+      <w:pPr>
+        <w:pStyle w:val="Normal"/>
+        <w:jc w:val="both"/>
+        <w:rPr>
+          <w:sz w:val="36"/>
+          <w:szCs w:val="36"/>
+        </w:rPr>
+      </w:pPr>
+      <w:r>
+        <w:rPr>
+          <w:sz w:val="36"/>
+          <w:szCs w:val="36"/>
+        </w:rPr>
       </w:r>
     </w:p>
     <w:p>
@@ -5501,80 +5864,23 @@
           <w:shd w:fill="auto" w:val="clear"/>
           <w:lang w:val="en-US" w:eastAsia="zh-CN" w:bidi="hi-IN"/>
         </w:rPr>
-        <w:t xml:space="preserve">Em seguida a </w:t>
-      </w:r>
-      <w:r>
-        <w:rPr>
-          <w:rFonts w:eastAsia="Arial" w:cs="Arial" w:ascii="Garamond" w:hAnsi="Garamond"/>
-          <w:color w:val="000000"/>
-          <w:kern w:val="0"/>
-          <w:sz w:val="36"/>
-          <w:szCs w:val="36"/>
-          <w:shd w:fill="auto" w:val="clear"/>
-          <w:lang w:val="en-US" w:eastAsia="zh-CN" w:bidi="hi-IN"/>
-        </w:rPr>
-        <w:t xml:space="preserve"> caravana majestosa conduziu ao Reino do Mestre a bendita entre as mulheres e, desde esse</w:t>
-      </w:r>
-      <w:r>
-        <w:rPr>
-          <w:rFonts w:eastAsia="Arial" w:cs="Arial" w:ascii="Garamond" w:hAnsi="Garamond"/>
-          <w:color w:val="000000"/>
-          <w:kern w:val="0"/>
-          <w:sz w:val="36"/>
-          <w:szCs w:val="36"/>
-          <w:shd w:fill="auto" w:val="clear"/>
-          <w:lang w:val="en-US" w:eastAsia="zh-CN" w:bidi="hi-IN"/>
-        </w:rPr>
-        <w:t xml:space="preserve"> </w:t>
-      </w:r>
-      <w:r>
-        <w:rPr>
-          <w:rFonts w:eastAsia="Arial" w:cs="Arial" w:ascii="Garamond" w:hAnsi="Garamond"/>
-          <w:color w:val="000000"/>
-          <w:kern w:val="0"/>
-          <w:sz w:val="36"/>
-          <w:szCs w:val="36"/>
-          <w:shd w:fill="auto" w:val="clear"/>
-          <w:lang w:val="en-US" w:eastAsia="zh-CN" w:bidi="hi-IN"/>
-        </w:rPr>
-        <w:t>dia, nos tormentos mais duros, os discípulos de Jesus têm cantado na Terra, exprimindo o seu bom ânimo</w:t>
-      </w:r>
-      <w:r>
-        <w:rPr>
-          <w:rFonts w:eastAsia="Arial" w:cs="Arial" w:ascii="Garamond" w:hAnsi="Garamond"/>
-          <w:color w:val="000000"/>
-          <w:kern w:val="0"/>
-          <w:sz w:val="36"/>
-          <w:szCs w:val="36"/>
-          <w:shd w:fill="auto" w:val="clear"/>
-          <w:lang w:val="en-US" w:eastAsia="zh-CN" w:bidi="hi-IN"/>
-        </w:rPr>
-        <w:t xml:space="preserve"> </w:t>
-      </w:r>
-      <w:r>
-        <w:rPr>
-          <w:rFonts w:eastAsia="Arial" w:cs="Arial" w:ascii="Garamond" w:hAnsi="Garamond"/>
-          <w:color w:val="000000"/>
-          <w:kern w:val="0"/>
-          <w:sz w:val="36"/>
-          <w:szCs w:val="36"/>
-          <w:shd w:fill="auto" w:val="clear"/>
-          <w:lang w:val="en-US" w:eastAsia="zh-CN" w:bidi="hi-IN"/>
-        </w:rPr>
-        <w:t>e a sua alegria, guardando a suave herança de nossa Mãe Santíssima.</w:t>
-      </w:r>
-    </w:p>
-    <w:p>
-      <w:pPr>
-        <w:pStyle w:val="Normal"/>
-        <w:jc w:val="both"/>
-        <w:rPr>
-          <w:sz w:val="36"/>
-          <w:szCs w:val="36"/>
-        </w:rPr>
-      </w:pPr>
-      <w:r>
-        <w:rPr/>
+        <w:t>Em seguida a  caravana majestosa conduziu ao Reino do Mestre a bendita entre as mulheres e, desde esse dia, nos tormentos mais duros, os discípulos de Jesus têm cantado na Terra, exprimindo o seu bom ânimo e a sua alegria, guardando a suave herança de nossa Mãe Santíssima.</w:t>
+      </w:r>
+    </w:p>
+    <w:p>
+      <w:pPr>
+        <w:pStyle w:val="Normal"/>
+        <w:jc w:val="both"/>
+        <w:rPr>
+          <w:sz w:val="36"/>
+          <w:szCs w:val="36"/>
+        </w:rPr>
+      </w:pPr>
+      <w:r>
+        <w:rPr>
+          <w:sz w:val="36"/>
+          <w:szCs w:val="36"/>
+        </w:rPr>
       </w:r>
     </w:p>
     <w:p>
@@ -5639,16 +5945,158 @@
           <w:shd w:fill="auto" w:val="clear"/>
           <w:lang w:val="en-US" w:eastAsia="zh-CN" w:bidi="hi-IN"/>
         </w:rPr>
-        <w:t>&lt;&lt;&lt; Primeira opção de conclusão &gt;&gt;&gt;</w:t>
-      </w:r>
-    </w:p>
-    <w:p>
-      <w:pPr>
-        <w:pStyle w:val="Normal"/>
-        <w:jc w:val="both"/>
-        <w:rPr>
-          <w:sz w:val="36"/>
-          <w:szCs w:val="36"/>
+        <w:t>O</w:t>
+      </w:r>
+      <w:r>
+        <w:rPr>
+          <w:rFonts w:eastAsia="Arial" w:cs="Arial" w:ascii="Garamond" w:hAnsi="Garamond"/>
+          <w:color w:val="000000"/>
+          <w:kern w:val="0"/>
+          <w:sz w:val="36"/>
+          <w:szCs w:val="36"/>
+          <w:shd w:fill="auto" w:val="clear"/>
+          <w:lang w:val="en-US" w:eastAsia="zh-CN" w:bidi="hi-IN"/>
+        </w:rPr>
+        <w:t xml:space="preserve"> </w:t>
+      </w:r>
+      <w:r>
+        <w:rPr>
+          <w:rFonts w:eastAsia="Arial" w:cs="Arial" w:ascii="Garamond" w:hAnsi="Garamond"/>
+          <w:color w:val="000000"/>
+          <w:kern w:val="0"/>
+          <w:sz w:val="36"/>
+          <w:szCs w:val="36"/>
+          <w:shd w:fill="auto" w:val="clear"/>
+          <w:lang w:val="en-US" w:eastAsia="zh-CN" w:bidi="hi-IN"/>
+        </w:rPr>
+        <w:t>convite</w:t>
+      </w:r>
+      <w:r>
+        <w:rPr>
+          <w:rFonts w:eastAsia="Arial" w:cs="Arial" w:ascii="Garamond" w:hAnsi="Garamond"/>
+          <w:color w:val="000000"/>
+          <w:kern w:val="0"/>
+          <w:sz w:val="36"/>
+          <w:szCs w:val="36"/>
+          <w:shd w:fill="auto" w:val="clear"/>
+          <w:lang w:val="en-US" w:eastAsia="zh-CN" w:bidi="hi-IN"/>
+        </w:rPr>
+        <w:t xml:space="preserve"> de Maria à jovem encarcerada</w:t>
+      </w:r>
+      <w:r>
+        <w:rPr>
+          <w:rFonts w:eastAsia="Arial" w:cs="Arial" w:ascii="Garamond" w:hAnsi="Garamond"/>
+          <w:color w:val="000000"/>
+          <w:kern w:val="0"/>
+          <w:sz w:val="36"/>
+          <w:szCs w:val="36"/>
+          <w:shd w:fill="auto" w:val="clear"/>
+          <w:lang w:val="en-US" w:eastAsia="zh-CN" w:bidi="hi-IN"/>
+        </w:rPr>
+        <w:t xml:space="preserve"> para que ela cantasse</w:t>
+      </w:r>
+      <w:r>
+        <w:rPr>
+          <w:rFonts w:eastAsia="Arial" w:cs="Arial" w:ascii="Garamond" w:hAnsi="Garamond"/>
+          <w:color w:val="000000"/>
+          <w:kern w:val="0"/>
+          <w:sz w:val="36"/>
+          <w:szCs w:val="36"/>
+          <w:shd w:fill="auto" w:val="clear"/>
+          <w:lang w:val="en-US" w:eastAsia="zh-CN" w:bidi="hi-IN"/>
+        </w:rPr>
+        <w:t xml:space="preserve"> </w:t>
+      </w:r>
+      <w:r>
+        <w:rPr>
+          <w:rFonts w:eastAsia="Arial" w:cs="Arial" w:ascii="Garamond" w:hAnsi="Garamond"/>
+          <w:color w:val="000000"/>
+          <w:kern w:val="0"/>
+          <w:sz w:val="36"/>
+          <w:szCs w:val="36"/>
+          <w:shd w:fill="auto" w:val="clear"/>
+          <w:lang w:val="en-US" w:eastAsia="zh-CN" w:bidi="hi-IN"/>
+        </w:rPr>
+        <w:t>naqueles momentos que antecediam ao seu martírio é igualmente válido para nós nos dias de hoje.</w:t>
+      </w:r>
+    </w:p>
+    <w:p>
+      <w:pPr>
+        <w:pStyle w:val="Normal"/>
+        <w:jc w:val="both"/>
+        <w:rPr>
+          <w:rFonts w:ascii="Garamond" w:hAnsi="Garamond" w:eastAsia="Arial" w:cs="Arial"/>
+          <w:color w:val="000000"/>
+          <w:kern w:val="0"/>
+          <w:sz w:val="36"/>
+          <w:szCs w:val="36"/>
+          <w:shd w:fill="auto" w:val="clear"/>
+          <w:lang w:val="en-US" w:eastAsia="zh-CN" w:bidi="hi-IN"/>
+        </w:rPr>
+      </w:pPr>
+      <w:r>
+        <w:rPr>
+          <w:rFonts w:eastAsia="Arial" w:cs="Arial" w:ascii="Garamond" w:hAnsi="Garamond"/>
+          <w:color w:val="000000"/>
+          <w:kern w:val="0"/>
+          <w:sz w:val="36"/>
+          <w:szCs w:val="36"/>
+          <w:shd w:fill="auto" w:val="clear"/>
+          <w:lang w:val="en-US" w:eastAsia="zh-CN" w:bidi="hi-IN"/>
+        </w:rPr>
+      </w:r>
+    </w:p>
+    <w:p>
+      <w:pPr>
+        <w:pStyle w:val="Normal"/>
+        <w:jc w:val="both"/>
+        <w:rPr>
+          <w:rFonts w:ascii="Garamond" w:hAnsi="Garamond" w:eastAsia="Arial" w:cs="Arial"/>
+          <w:color w:val="000000"/>
+          <w:kern w:val="0"/>
+          <w:sz w:val="36"/>
+          <w:szCs w:val="36"/>
+          <w:shd w:fill="auto" w:val="clear"/>
+          <w:lang w:val="en-US" w:eastAsia="zh-CN" w:bidi="hi-IN"/>
+        </w:rPr>
+      </w:pPr>
+      <w:r>
+        <w:rPr>
+          <w:rFonts w:eastAsia="Arial" w:cs="Arial" w:ascii="Garamond" w:hAnsi="Garamond"/>
+          <w:color w:val="000000"/>
+          <w:kern w:val="0"/>
+          <w:sz w:val="36"/>
+          <w:szCs w:val="36"/>
+          <w:shd w:fill="auto" w:val="clear"/>
+          <w:lang w:val="en-US" w:eastAsia="zh-CN" w:bidi="hi-IN"/>
+        </w:rPr>
+        <w:t>Estamos vivendo tempos turbulentos</w:t>
+      </w:r>
+      <w:r>
+        <w:rPr>
+          <w:rFonts w:eastAsia="Arial" w:cs="Arial" w:ascii="Garamond" w:hAnsi="Garamond"/>
+          <w:color w:val="000000"/>
+          <w:kern w:val="0"/>
+          <w:sz w:val="36"/>
+          <w:szCs w:val="36"/>
+          <w:shd w:fill="auto" w:val="clear"/>
+          <w:lang w:val="en-US" w:eastAsia="zh-CN" w:bidi="hi-IN"/>
+        </w:rPr>
+        <w:t>. O homem ainda insiste em buscar a felicidade afastando-se de Deus.  Continuamos orgulhosos e egoístas, fazendo crescer a injustiça, a crueldade, a imoralidade e o materialismo.  A vitória aparente dos maus nos causa angústia e desesperança.</w:t>
+      </w:r>
+    </w:p>
+    <w:p>
+      <w:pPr>
+        <w:pStyle w:val="Normal"/>
+        <w:jc w:val="both"/>
+        <w:rPr>
+          <w:rFonts w:ascii="Garamond" w:hAnsi="Garamond" w:eastAsia="Arial" w:cs="Arial"/>
+          <w:color w:val="000000"/>
+          <w:kern w:val="0"/>
+          <w:sz w:val="36"/>
+          <w:szCs w:val="36"/>
+          <w:shd w:fill="auto" w:val="clear"/>
+          <w:lang w:val="en-US" w:eastAsia="zh-CN" w:bidi="hi-IN"/>
         </w:rPr>
       </w:pPr>
       <w:r>
@@ -5674,7 +6122,7 @@
           <w:shd w:fill="auto" w:val="clear"/>
           <w:lang w:val="en-US" w:eastAsia="zh-CN" w:bidi="hi-IN"/>
         </w:rPr>
-        <w:t xml:space="preserve">Ao longo da </w:t>
+        <w:t xml:space="preserve">Confesso que eu ainda </w:t>
       </w:r>
       <w:r>
         <w:rPr>
@@ -5686,7 +6134,7 @@
           <w:shd w:fill="auto" w:val="clear"/>
           <w:lang w:val="en-US" w:eastAsia="zh-CN" w:bidi="hi-IN"/>
         </w:rPr>
-        <w:t>elaboração do estudo apresentado aqui hoje</w:t>
+        <w:t>pergunto</w:t>
       </w:r>
       <w:r>
         <w:rPr>
@@ -5698,11 +6146,31 @@
           <w:shd w:fill="auto" w:val="clear"/>
           <w:lang w:val="en-US" w:eastAsia="zh-CN" w:bidi="hi-IN"/>
         </w:rPr>
-        <w:t xml:space="preserve">, minha visão sobre Maria de Nazaré </w:t>
-      </w:r>
-      <w:r>
-        <w:rPr>
-          <w:rFonts w:eastAsia="Arial" w:cs="Arial" w:ascii="Garamond" w:hAnsi="Garamond"/>
+        <w:t>: "Por quê Deus  permite que tais coisas aconteçam? Por quê Jesus Cristo não intercede em nosso favor?".</w:t>
+      </w:r>
+    </w:p>
+    <w:p>
+      <w:pPr>
+        <w:pStyle w:val="Normal"/>
+        <w:jc w:val="both"/>
+        <w:rPr>
+          <w:sz w:val="36"/>
+          <w:szCs w:val="36"/>
+        </w:rPr>
+      </w:pPr>
+      <w:r>
+        <w:rPr>
+          <w:sz w:val="36"/>
+          <w:szCs w:val="36"/>
+        </w:rPr>
+      </w:r>
+    </w:p>
+    <w:p>
+      <w:pPr>
+        <w:pStyle w:val="Normal"/>
+        <w:jc w:val="both"/>
+        <w:rPr>
+          <w:rFonts w:ascii="Garamond" w:hAnsi="Garamond" w:eastAsia="Arial" w:cs="Arial"/>
           <w:color w:val="000000"/>
           <w:kern w:val="0"/>
           <w:sz w:val="36"/>
@@ -5710,17 +6178,6 @@
           <w:shd w:fill="auto" w:val="clear"/>
           <w:lang w:val="en-US" w:eastAsia="zh-CN" w:bidi="hi-IN"/>
         </w:rPr>
-        <w:t xml:space="preserve">alterou-se consideravelmente. </w:t>
-      </w:r>
-    </w:p>
-    <w:p>
-      <w:pPr>
-        <w:pStyle w:val="Normal"/>
-        <w:jc w:val="both"/>
-        <w:rPr>
-          <w:sz w:val="36"/>
-          <w:szCs w:val="36"/>
-        </w:rPr>
       </w:pPr>
       <w:r>
         <w:rPr>
@@ -5732,11 +6189,15 @@
           <w:shd w:fill="auto" w:val="clear"/>
           <w:lang w:val="en-US" w:eastAsia="zh-CN" w:bidi="hi-IN"/>
         </w:rPr>
-        <w:t>Maria é reverenciada por bilhões de pessoas no mundo inteiro p</w:t>
-      </w:r>
-      <w:r>
-        <w:rPr>
-          <w:rFonts w:eastAsia="Arial" w:cs="Arial" w:ascii="Garamond" w:hAnsi="Garamond"/>
+        <w:t>Maria de Nazaré sob o nome de Nossa Senhora Aparecida é a padroeira do Brasil. E eu também já perguntei a ela: "Mãe Santíssima, a senhora não fará nada pela nossa nação?".</w:t>
+      </w:r>
+    </w:p>
+    <w:p>
+      <w:pPr>
+        <w:pStyle w:val="Normal"/>
+        <w:jc w:val="both"/>
+        <w:rPr>
+          <w:rFonts w:ascii="Garamond" w:hAnsi="Garamond" w:eastAsia="Arial" w:cs="Arial"/>
           <w:color w:val="000000"/>
           <w:kern w:val="0"/>
           <w:sz w:val="36"/>
@@ -5744,11 +6205,17 @@
           <w:shd w:fill="auto" w:val="clear"/>
           <w:lang w:val="en-US" w:eastAsia="zh-CN" w:bidi="hi-IN"/>
         </w:rPr>
-        <w:t>or ser a mãe d</w:t>
-      </w:r>
-      <w:r>
-        <w:rPr>
-          <w:rFonts w:eastAsia="Arial" w:cs="Arial" w:ascii="Garamond" w:hAnsi="Garamond"/>
+      </w:pPr>
+      <w:r>
+        <w:rPr/>
+      </w:r>
+    </w:p>
+    <w:p>
+      <w:pPr>
+        <w:pStyle w:val="Normal"/>
+        <w:jc w:val="both"/>
+        <w:rPr>
+          <w:rFonts w:ascii="Garamond" w:hAnsi="Garamond" w:eastAsia="Arial" w:cs="Arial"/>
           <w:color w:val="000000"/>
           <w:kern w:val="0"/>
           <w:sz w:val="36"/>
@@ -5756,8 +6223,7 @@
           <w:shd w:fill="auto" w:val="clear"/>
           <w:lang w:val="en-US" w:eastAsia="zh-CN" w:bidi="hi-IN"/>
         </w:rPr>
-        <w:t>o nosso divino Mestre</w:t>
-      </w:r>
+      </w:pPr>
       <w:r>
         <w:rPr>
           <w:rFonts w:eastAsia="Arial" w:cs="Arial" w:ascii="Garamond" w:hAnsi="Garamond"/>
@@ -5768,7 +6234,7 @@
           <w:shd w:fill="auto" w:val="clear"/>
           <w:lang w:val="en-US" w:eastAsia="zh-CN" w:bidi="hi-IN"/>
         </w:rPr>
-        <w:t xml:space="preserve"> Jesus</w:t>
+        <w:t>M</w:t>
       </w:r>
       <w:r>
         <w:rPr>
@@ -5780,37 +6246,15 @@
           <w:shd w:fill="auto" w:val="clear"/>
           <w:lang w:val="en-US" w:eastAsia="zh-CN" w:bidi="hi-IN"/>
         </w:rPr>
-        <w:t xml:space="preserve"> Cristo. Entretanto, ao pesquisar dados históricos sobre a vida de Maria, ao aprofundar em suas palavras, suas  atitudes e até mesmo em seu silêncio, compreendi que a grandeza de Maria vai muito além  do que eu imaginava. </w:t>
-      </w:r>
-    </w:p>
-    <w:p>
-      <w:pPr>
-        <w:pStyle w:val="Normal"/>
-        <w:jc w:val="both"/>
-        <w:rPr>
-          <w:sz w:val="36"/>
-          <w:szCs w:val="36"/>
-        </w:rPr>
-      </w:pPr>
-      <w:r>
-        <w:rPr>
-          <w:sz w:val="36"/>
-          <w:szCs w:val="36"/>
-        </w:rPr>
-      </w:r>
-    </w:p>
-    <w:p>
-      <w:pPr>
-        <w:pStyle w:val="Normal"/>
-        <w:jc w:val="both"/>
-        <w:rPr>
-          <w:sz w:val="36"/>
-          <w:szCs w:val="36"/>
-        </w:rPr>
-      </w:pPr>
-      <w:r>
-        <w:rPr>
-          <w:rFonts w:eastAsia="Arial" w:cs="Arial" w:ascii="Garamond" w:hAnsi="Garamond"/>
+        <w:t>as agora, conhecendo um pouco mais a grandeza desse Espírito de luz, eu compreendo que, assim como Maria diante de Jesus crucificado, é preciso ter resignação e confiança, sem jamais deixar de servir ao bem.</w:t>
+      </w:r>
+    </w:p>
+    <w:p>
+      <w:pPr>
+        <w:pStyle w:val="Normal"/>
+        <w:jc w:val="both"/>
+        <w:rPr>
+          <w:rFonts w:ascii="Garamond" w:hAnsi="Garamond" w:eastAsia="Arial" w:cs="Arial"/>
           <w:color w:val="000000"/>
           <w:kern w:val="0"/>
           <w:sz w:val="36"/>
@@ -5818,30 +6262,6 @@
           <w:shd w:fill="auto" w:val="clear"/>
           <w:lang w:val="en-US" w:eastAsia="zh-CN" w:bidi="hi-IN"/>
         </w:rPr>
-        <w:t>Dentre todas as virtudes de Maria, talvez aquelas que sejam mais necessárias para nós nos dias atuais sejam a resignação e a confiança em Jesus.</w:t>
-      </w:r>
-    </w:p>
-    <w:p>
-      <w:pPr>
-        <w:pStyle w:val="Normal"/>
-        <w:jc w:val="both"/>
-        <w:rPr>
-          <w:sz w:val="36"/>
-          <w:szCs w:val="36"/>
-        </w:rPr>
-      </w:pPr>
-      <w:r>
-        <w:rPr/>
-      </w:r>
-    </w:p>
-    <w:p>
-      <w:pPr>
-        <w:pStyle w:val="Normal"/>
-        <w:jc w:val="both"/>
-        <w:rPr>
-          <w:sz w:val="36"/>
-          <w:szCs w:val="36"/>
-        </w:rPr>
       </w:pPr>
       <w:r>
         <w:rPr>
@@ -5853,231 +6273,7 @@
           <w:shd w:fill="auto" w:val="clear"/>
           <w:lang w:val="en-US" w:eastAsia="zh-CN" w:bidi="hi-IN"/>
         </w:rPr>
-        <w:t>Estamos vivendo tempos turbulentos nos quais saltam aos nossos olhos injustiça, crueldade, imoralidade, corrupção. A vitória aparente dos maus nos causa angústia e desesperança.</w:t>
-      </w:r>
-    </w:p>
-    <w:p>
-      <w:pPr>
-        <w:pStyle w:val="Normal"/>
-        <w:jc w:val="both"/>
-        <w:rPr>
-          <w:sz w:val="36"/>
-          <w:szCs w:val="36"/>
-        </w:rPr>
-      </w:pPr>
-      <w:r>
-        <w:rPr/>
-      </w:r>
-    </w:p>
-    <w:p>
-      <w:pPr>
-        <w:pStyle w:val="Normal"/>
-        <w:jc w:val="both"/>
-        <w:rPr>
-          <w:sz w:val="36"/>
-          <w:szCs w:val="36"/>
-        </w:rPr>
-      </w:pPr>
-      <w:r>
-        <w:rPr>
-          <w:rFonts w:eastAsia="Arial" w:cs="Arial" w:ascii="Garamond" w:hAnsi="Garamond"/>
-          <w:color w:val="000000"/>
-          <w:kern w:val="0"/>
-          <w:sz w:val="36"/>
-          <w:szCs w:val="36"/>
-          <w:shd w:fill="auto" w:val="clear"/>
-          <w:lang w:val="en-US" w:eastAsia="zh-CN" w:bidi="hi-IN"/>
-        </w:rPr>
-        <w:t>Confesso que eu ainda me encontro perguntando: "Por quê Deus ainda permite que tais coisas aconteçam? Por quê Jesus Cristo não intercede em nosso favor?".</w:t>
-      </w:r>
-    </w:p>
-    <w:p>
-      <w:pPr>
-        <w:pStyle w:val="Normal"/>
-        <w:jc w:val="both"/>
-        <w:rPr>
-          <w:sz w:val="36"/>
-          <w:szCs w:val="36"/>
-        </w:rPr>
-      </w:pPr>
-      <w:r>
-        <w:rPr/>
-      </w:r>
-    </w:p>
-    <w:p>
-      <w:pPr>
-        <w:pStyle w:val="Normal"/>
-        <w:jc w:val="both"/>
-        <w:rPr>
-          <w:sz w:val="36"/>
-          <w:szCs w:val="36"/>
-        </w:rPr>
-      </w:pPr>
-      <w:r>
-        <w:rPr>
-          <w:rFonts w:eastAsia="Arial" w:cs="Arial" w:ascii="Garamond" w:hAnsi="Garamond"/>
-          <w:color w:val="000000"/>
-          <w:kern w:val="0"/>
-          <w:sz w:val="36"/>
-          <w:szCs w:val="36"/>
-          <w:shd w:fill="auto" w:val="clear"/>
-          <w:lang w:val="en-US" w:eastAsia="zh-CN" w:bidi="hi-IN"/>
-        </w:rPr>
-        <w:t>Maria de Nazaré sob o nome de Nossa Senhora Aparecida é a padroeira do Brasil. E eu também já perguntei a ela: "Mãe Santíssima, a senhora não fará nada pela nossa nação?".</w:t>
-      </w:r>
-    </w:p>
-    <w:p>
-      <w:pPr>
-        <w:pStyle w:val="Normal"/>
-        <w:jc w:val="both"/>
-        <w:rPr>
-          <w:sz w:val="36"/>
-          <w:szCs w:val="36"/>
-        </w:rPr>
-      </w:pPr>
-      <w:r>
-        <w:rPr/>
-      </w:r>
-    </w:p>
-    <w:p>
-      <w:pPr>
-        <w:pStyle w:val="Normal"/>
-        <w:jc w:val="both"/>
-        <w:rPr>
-          <w:sz w:val="36"/>
-          <w:szCs w:val="36"/>
-        </w:rPr>
-      </w:pPr>
-      <w:r>
-        <w:rPr>
-          <w:rFonts w:eastAsia="Arial" w:cs="Arial" w:ascii="Garamond" w:hAnsi="Garamond"/>
-          <w:color w:val="000000"/>
-          <w:kern w:val="0"/>
-          <w:sz w:val="36"/>
-          <w:szCs w:val="36"/>
-          <w:shd w:fill="auto" w:val="clear"/>
-          <w:lang w:val="en-US" w:eastAsia="zh-CN" w:bidi="hi-IN"/>
-        </w:rPr>
-        <w:t>[</w:t>
-      </w:r>
-      <w:r>
-        <w:rPr>
-          <w:rFonts w:eastAsia="Arial" w:cs="Arial" w:ascii="Garamond" w:hAnsi="Garamond"/>
-          <w:color w:val="000000"/>
-          <w:kern w:val="0"/>
-          <w:sz w:val="36"/>
-          <w:szCs w:val="36"/>
-          <w:shd w:fill="auto" w:val="clear"/>
-          <w:lang w:val="en-US" w:eastAsia="zh-CN" w:bidi="hi-IN"/>
-        </w:rPr>
-        <w:t xml:space="preserve"> Continuar a conclusão a partir desse ponto ]</w:t>
-      </w:r>
-    </w:p>
-    <w:p>
-      <w:pPr>
-        <w:pStyle w:val="Normal"/>
-        <w:jc w:val="both"/>
-        <w:rPr>
-          <w:sz w:val="36"/>
-          <w:szCs w:val="36"/>
-        </w:rPr>
-      </w:pPr>
-      <w:r>
-        <w:rPr/>
-      </w:r>
-    </w:p>
-    <w:p>
-      <w:pPr>
-        <w:pStyle w:val="Normal"/>
-        <w:jc w:val="both"/>
-        <w:rPr>
-          <w:sz w:val="36"/>
-          <w:szCs w:val="36"/>
-        </w:rPr>
-      </w:pPr>
-      <w:r>
-        <w:rPr>
-          <w:rFonts w:eastAsia="Arial" w:cs="Arial" w:ascii="Garamond" w:hAnsi="Garamond"/>
-          <w:color w:val="000000"/>
-          <w:kern w:val="0"/>
-          <w:sz w:val="36"/>
-          <w:szCs w:val="36"/>
-          <w:shd w:fill="auto" w:val="clear"/>
-          <w:lang w:val="en-US" w:eastAsia="zh-CN" w:bidi="hi-IN"/>
-        </w:rPr>
-        <w:t>Maria não é apenas uma figura histórica ou religiosa; ela é um exemplo vivo de humildade, coragem e fé inabalável. Sua presença discreta, sua entrega silenciosa e seu papel fundamental na missão de Jesus me ensinaram que, às vezes, é no silêncio e na simplicidade que se encontra a maior força.</w:t>
-      </w:r>
-    </w:p>
-    <w:p>
-      <w:pPr>
-        <w:pStyle w:val="Normal"/>
-        <w:jc w:val="both"/>
-        <w:rPr>
-          <w:sz w:val="36"/>
-          <w:szCs w:val="36"/>
-        </w:rPr>
-      </w:pPr>
-      <w:r>
-        <w:rPr>
-          <w:sz w:val="36"/>
-          <w:szCs w:val="36"/>
-        </w:rPr>
-      </w:r>
-    </w:p>
-    <w:p>
-      <w:pPr>
-        <w:pStyle w:val="Normal"/>
-        <w:jc w:val="both"/>
-        <w:rPr>
-          <w:sz w:val="36"/>
-          <w:szCs w:val="36"/>
-        </w:rPr>
-      </w:pPr>
-      <w:r>
-        <w:rPr>
-          <w:rFonts w:eastAsia="Arial" w:cs="Arial" w:ascii="Garamond" w:hAnsi="Garamond"/>
-          <w:color w:val="000000"/>
-          <w:kern w:val="0"/>
-          <w:sz w:val="36"/>
-          <w:szCs w:val="36"/>
-          <w:shd w:fill="auto" w:val="clear"/>
-          <w:lang w:val="en-US" w:eastAsia="zh-CN" w:bidi="hi-IN"/>
-        </w:rPr>
-        <w:t>Essa descoberta pessoal reforçou não só a minha admiração, mas também meu respeito e gratidão por Maria, que permanece um farol espiritual para todos nós, inspirando fé e esperança em meio às dificuldades da vida.</w:t>
-      </w:r>
-    </w:p>
-    <w:p>
-      <w:pPr>
-        <w:pStyle w:val="Normal"/>
-        <w:jc w:val="both"/>
-        <w:rPr>
-          <w:sz w:val="36"/>
-          <w:szCs w:val="36"/>
-        </w:rPr>
-      </w:pPr>
-      <w:r>
-        <w:rPr/>
-      </w:r>
-    </w:p>
-    <w:p>
-      <w:pPr>
-        <w:pStyle w:val="Normal"/>
-        <w:jc w:val="both"/>
-        <w:rPr>
-          <w:sz w:val="36"/>
-          <w:szCs w:val="36"/>
-        </w:rPr>
-      </w:pPr>
-      <w:r>
-        <w:rPr>
-          <w:rFonts w:eastAsia="Arial" w:cs="Arial" w:ascii="Garamond" w:hAnsi="Garamond"/>
-          <w:color w:val="000000"/>
-          <w:kern w:val="0"/>
-          <w:sz w:val="36"/>
-          <w:szCs w:val="36"/>
-          <w:shd w:fill="auto" w:val="clear"/>
-          <w:lang w:val="en-US" w:eastAsia="zh-CN" w:bidi="hi-IN"/>
-        </w:rPr>
+        <w:t>Sigamos firmes em nossa jornada evolutiva trabalhando na seara do Cristo. Apesar das pedras e dos espinhos ao longo do caminho, confiemos no amor e no amparo do nosso divino Mestre Jesus e de sua Mãe Santíssima, Maria de Nazaré.</w:t>
       </w:r>
     </w:p>
     <w:sectPr>
@@ -6149,7 +6345,7 @@
         <w:bCs/>
         <w:rFonts w:ascii="Garamond" w:hAnsi="Garamond"/>
       </w:rPr>
-      <w:t>27</w:t>
+      <w:t>28</w:t>
     </w:r>
     <w:r>
       <w:rPr>

</xml_diff>